<commit_message>
Fix trust name coverage gap, switch to realistic fake-data replacements matching assignment spec
</commit_message>
<xml_diff>
--- a/KSH_PII_Redacted_RHP.docx
+++ b/KSH_PII_Redacted_RHP.docx
@@ -12,7 +12,7 @@
     </w:p>
     <w:p>
       <w:r>
-        <w:t>(Please scan this QR Code to view this Red Herring Prospectus) RED HERRING PROSPECTUS Dated December 10, 2025 Please read section 32 of the Companies Act, 2013 100% Book Built Offer [COMPANY_001] CORPORATE IDENTITY NUMBER : U28129PN1979PLC141032 REGISTERED OFFICE C ORPORATE OFFICE CONTACT PERSON E-MAIL AND TELEPHONE WEBSITE [ADDRESS_001] Maharashtra, India 201, [ADDRESS_002] Maharashtra, India [PERSON_001] Company Secretary and Compliance Officer Email : [EMAIL_001] Telephone : [PHONE_001] www.kshinternational. com OUR PROMOTERS: [PERSON_002], [PERSON_003], [PERSON_004], [PERSON_005], [PERSON_006], DHAULAGIRI FAMILY TRUST, EVEREST FAMILY TRUST, MAKALU FAMILY TRUST, BROAD FAMILY TRUST, ANNAPURNA FAMILY TRUST, KANCHENJUNGA FAMILY TRUST AND [COMPANY_002] DETAILS OF THE OFFER TO PUBLIC TYPE SIZE OF THE FRESH ISSUE SIZE OF THE OFFER FOR SALE TOTAL OFFER SIZE ELIGIBILITY AND SHARE RESERVATION AMONG QIBs, NIIs AND RIIs Fresh Issue and Offer for Sale Up to [●] Equity Shares of face value of ₹ 5 each aggregating up to ₹ 4,200.00 million Up to [●] Equity Shares of face value of ₹ 5 each aggregating up to ₹ 2,900.00 million Up to [●] Equity Shares of face value of ₹ 5 each aggregating up to ₹ 7,100.00 million The Offer is being made pursuant to Regulation 6(1) of the Securities and Exchange Board of India (Issue of Capital and Disclosure Requirements) Regulations, 2018 (“ SEBI ICDR Regulations ”). For further details, see “ Other Regulatory and Statutory Disclosures – Eligibility for the Offer ” on page 398. For details of share reservation among Qualified Institutional Buyers, Non-Institutional Investors and Retail Individual Investors, see “ Offer Structure ” on page 417. DETAILS OF THE PROMOTER SELLING SHAREHOLDERS, OFFER FOR SALE AND WEIGHTED AVERAGE COST OF ACQUISITION PER EQUITY SHARE</w:t>
+        <w:t>(Please scan this QR Code to view this Red Herring Prospectus) RED HERRING PROSPECTUS Dated December 10, 2025 Please read section 32 of the Companies Act, 2013 100% Book Built Offer Acme Corp Ltd. CORPORATE IDENTITY NUMBER : U28129PN1979PLC141032 REGISTERED OFFICE C ORPORATE OFFICE CONTACT PERSON E-MAIL AND TELEPHONE WEBSITE 123, MG Road, Sector 5, New Delhi – 110 001 Maharashtra, India 201, 456, Park Street, Block B, Kolkata – 700 016 Maharashtra, India John Doe Company Secretary and Compliance Officer Email : john.doe@example.com Telephone : +91 90000 00001 www.kshinternational. com OUR PROMOTERS: Jane Smith, Peter Parker, Alex Morgan, Taylor Brown, Jordan Lee, Globex Industries Limited, Umbrella Holdings Private Limited, Initech Solutions Limited, Hooli Technologies Limited, Pied Piper Inc., Stark Industries Limited AND Wayne Enterprises Limited DETAILS OF THE OFFER TO PUBLIC TYPE SIZE OF THE FRESH ISSUE SIZE OF THE OFFER FOR SALE TOTAL OFFER SIZE ELIGIBILITY AND SHARE RESERVATION AMONG QIBs, NIIs AND RIIs Fresh Issue and Offer for Sale Up to [●] Equity Shares of face value of ₹ 5 each aggregating up to ₹ 4,200.00 million Up to [●] Equity Shares of face value of ₹ 5 each aggregating up to ₹ 2,900.00 million Up to [●] Equity Shares of face value of ₹ 5 each aggregating up to ₹ 7,100.00 million The Offer is being made pursuant to Regulation 6(1) of the Securities and Exchange Board of India (Issue of Capital and Disclosure Requirements) Regulations, 2018 (“ SEBI ICDR Regulations ”). For further details, see “ Other Regulatory and Statutory Disclosures – Eligibility for the Offer ” on page 398. For details of share reservation among Qualified Institutional Buyers, Non-Institutional Investors and Retail Individual Investors, see “ Offer Structure ” on page 417. DETAILS OF THE PROMOTER SELLING SHAREHOLDERS, OFFER FOR SALE AND WEIGHTED AVERAGE COST OF ACQUISITION PER EQUITY SHARE</w:t>
       </w:r>
     </w:p>
     <w:p>
@@ -30,7 +30,7 @@
     </w:p>
     <w:p>
       <w:r>
-        <w:t>NAME OF THE PROMOTER SELLING SHAREHOLDER TYPE AGGREGATE AMOUNT OF OFFER FOR SALE ( ₹ IN MILLION) WEIGHTED AVERAGE COST OF ACQUISITION PER EQUITY SHARE OF FACE VALUE OF ₹ 5 EACH (IN ₹ ) *# [PERSON_002] Promoter Selling Shareholder 1,528.00 1.36 [PERSON_003] Promoter Selling Shareholder 422.00 1.51 [PERSON_004] Promoter Selling Shar 475.00 1.41</w:t>
+        <w:t>NAME OF THE PROMOTER SELLING SHAREHOLDER TYPE AGGREGATE AMOUNT OF OFFER FOR SALE ( ₹ IN MILLION) WEIGHTED AVERAGE COST OF ACQUISITION PER EQUITY SHARE OF FACE VALUE OF ₹ 5 EACH (IN ₹ ) *# Jane Smith Promoter Selling Shareholder 1,528.00 1.36 Peter Parker Promoter Selling Shareholder 422.00 1.51 Alex Morgan Promoter Selling Shar 475.00 1.41</w:t>
       </w:r>
     </w:p>
     <w:p>
@@ -48,7 +48,7 @@
     </w:p>
     <w:p>
       <w:r>
-        <w:t>eholder [PERSON_005] Promoter Selling Shareholder 475.00 1.35 * As certified by [COMPANY_003], Chartered Accountants, our Statutory Auditors, by way of their certificate dated December 10, 2025. For further details, see “Summary of the Offer Document – Average cost of acquisition of Equity Shares by our Promoters and the Promoter Selling Shareholders” on page 26 . # As adjusted for Split of Equity Shares and Bonus Issue. RISKS IN RELATION TO THE FIRST OFFER This being the first public offering of equity shares of our Company, there has been no formal market for the Equity Shares. The face value of the Equity Shares is ₹ 5 each. The Floor Price, Cap Price and Offer Price (as determined by our Company, in consultation with the Book Running Lead Managers, in accordance with the SEBI ICDR Regulations) and on the basis of the assessment of market demand for the Equity Shares by way of the Book Building Process, as stated under “ Basis for the Offer Price ” on page 124, should not be considered to be indicative of the market price of the Equity Shares after the Equity Shares are listed. No assurance can be given regarding an active an d/or sustained trading in the Equity Shares nor regarding the price at which the Equity Shares will be traded after listing. GENERAL RISKS Investments in equity and equity-related securities involve a degree of risk and Bidders should not invest any funds in the Offer unless they can afford to take the risk of losing their entire investment. Bidders are advised to read the risk factors carefully before taking an investment decision in the Offer. For taking an investment decision, Bidders must rely on their own examination of our Company and the Offer, including the risks involved. The Equity Shares offered in the Offer have not been recommended or approved by the Securities and Exchange Board of India (“ SEBI ”), nor does SEBI guarantee the accuracy or adequacy of the contents of this Red Herring Prospectus. Specific attention of the investors is invited to “ Risk Factors ” on page 28. ISSUER’S AND PROMOTER SELLING SHAREHOLDERS’ ABSOLUTE RESPONSIBILITY Our Company, having made all reasonable inquiries, accepts responsibility for and confirms that this Red Herring Prospectus contains all information with regard to our Company and the Offer, which is material in the context of the Offer, that the information contained in this Red Herring Prospectus is true and correct in all material aspects and is not misleading in any material respect, that the opinions and intentions expressed herein are honestly held and that there are no other facts, the omission of which makes this Red Herring Prospectus as a whole or any of such information or the expression of any such opinions or intentions misleading in any material respect. Each of the Promoter Selling Shareholders, severally and not jointly, accepts responsibility for and confirms the statements specifically made or confirmed by them in this Red Herring Prospectus solely to the extent of information specifically pertaining to themselves and the Equity Shares offered by them in the Offer for Sale and assumes responsibility that such statements are true and correct in all material respects and are not misleading in any material respect. Each of the Promoter Selling Shareholders, severally and not jointly, assumes no responsibility for any other statements, including, inter alia, any and all of the statements made by or relating to our Company or its business or any other Promoter Selling Shareholder</w:t>
+        <w:t>eholder Taylor Brown Promoter Selling Shareholder 475.00 1.35 * As certified by Oscorp Limited, Chartered Accountants, our Statutory Auditors, by way of their certificate dated December 10, 2025. For further details, see “Summary of the Offer Document – Average cost of acquisition of Equity Shares by our Promoters and the Promoter Selling Shareholders” on page 26 . # As adjusted for Split of Equity Shares and Bonus Issue. RISKS IN RELATION TO THE FIRST OFFER This being the first public offering of equity shares of our Company, there has been no formal market for the Equity Shares. The face value of the Equity Shares is ₹ 5 each. The Floor Price, Cap Price and Offer Price (as determined by our Company, in consultation with the Book Running Lead Managers, in accordance with the SEBI ICDR Regulations) and on the basis of the assessment of market demand for the Equity Shares by way of the Book Building Process, as stated under “ Basis for the Offer Price ” on page 124, should not be considered to be indicative of the market price of the Equity Shares after the Equity Shares are listed. No assurance can be given regarding an active an d/or sustained trading in the Equity Shares nor regarding the price at which the Equity Shares will be traded after listing. GENERAL RISKS Investments in equity and equity-related securities involve a degree of risk and Bidders should not invest any funds in the Offer unless they can afford to take the risk of losing their entire investment. Bidders are advised to read the risk factors carefully before taking an investment decision in the Offer. For taking an investment decision, Bidders must rely on their own examination of our Company and the Offer, including the risks involved. The Equity Shares offered in the Offer have not been recommended or approved by the Securities and Exchange Board of India (“ SEBI ”), nor does SEBI guarantee the accuracy or adequacy of the contents of this Red Herring Prospectus. Specific attention of the investors is invited to “ Risk Factors ” on page 28. ISSUER’S AND PROMOTER SELLING SHAREHOLDERS’ ABSOLUTE RESPONSIBILITY Our Company, having made all reasonable inquiries, accepts responsibility for and confirms that this Red Herring Prospectus contains all information with regard to our Company and the Offer, which is material in the context of the Offer, that the information contained in this Red Herring Prospectus is true and correct in all material aspects and is not misleading in any material respect, that the opinions and intentions expressed herein are honestly held and that there are no other facts, the omission of which makes this Red Herring Prospectus as a whole or any of such information or the expression of any such opinions or intentions misleading in any material respect. Each of the Promoter Selling Shareholders, severally and not jointly, accepts responsibility for and confirms the statements specifically made or confirmed by them in this Red Herring Prospectus solely to the extent of information specifically pertaining to themselves and the Equity Shares offered by them in the Offer for Sale and assumes responsibility that such statements are true and correct in all material respects and are not misleading in any material respect. Each of the Promoter Selling Shareholders, severally and not jointly, assumes no responsibility for any other statements, including, inter alia, any and all of the statements made by or relating to our Company or its business or any other Promoter Selling Shareholder</w:t>
       </w:r>
     </w:p>
     <w:p>
@@ -66,7 +66,7 @@
     </w:p>
     <w:p>
       <w:r>
-        <w:t>or any other person, in this Red Herring Prospectus. LISTING The Equity Shares offered through this Red Herring Prospectus are proposed to be listed on the [COMPANY_004] (“ BSE ”) and National Stock Exchange of [COMPANY_005] (“ NSE ”, together with BSE, the “ Stock Exchanges ”). For the purposes of the Offer, the Designated Stock Exchange is BSE. BOOK RUNNING LEAD MANAGERS NAME AND LOGO OF THE BOOK RUNNING LEAD MANAGER [COMPANY_006] [PERSON_007]/ [PERSON_008] Email: [EMAIL_002] Telephone: [PHONE_002] [COMPANY_007] [PERSON_009]/ [PERSON_010] Email: [EMAIL_003] Telephone: [PHONE_003] REGISTRAR TO THE OFFER NAME OF THE REGISTRAR [COMPANY_008] ([COMPANY_009]) [PERSON_011] Telephone : [PHONE_004] E-mail : [EMAIL_004] BID/OFFER PERIOD ANCHOR INVESTOR BIDDING DATE (1) Monday, December 15, 2025 BID/OFFE R OPENS ON Tuesday, December 16, 2025 BID/OFFER CLOSES ON (2) Thursday, December 18, 2025 (1) Our Company, in consultation with the Book Running Lead Managers, may consider participation by Anchor Investors in accordance with the SEBI ICDR Regulations. (2) The UPI mandate end time and date shall be at 5:00 p.m. on Bid/Offer Closing Day.</w:t>
+        <w:t>or any other person, in this Red Herring Prospectus. LISTING The Equity Shares offered through this Red Herring Prospectus are proposed to be listed on the Vance Refrigeration LLC (“ BSE ”) and National Stock Exchange of Dunder Mifflin Private Limited (“ NSE ”, together with BSE, the “ Stock Exchanges ”). For the purposes of the Offer, the Designated Stock Exchange is BSE. BOOK RUNNING LEAD MANAGERS NAME AND LOGO OF THE BOOK RUNNING LEAD MANAGER Soylent Corp Limited Sam Wilson/ Chris Blake Email: jane.smith@example.com Telephone: +91 90000 00002 Tyrell Corporation Morgan Reed/ Casey Quinn Email: peter.parker@example.com Telephone: +91 90000 00003 REGISTRAR TO THE OFFER NAME OF THE REGISTRAR Cyberdyne Systems Limited (Massive Dynamic Inc.) Riley Adams Telephone : +91 90000 00004 E-mail : alex.morgan@example.com BID/OFFER PERIOD ANCHOR INVESTOR BIDDING DATE (1) Monday, December 15, 2025 BID/OFFE R OPENS ON Tuesday, December 16, 2025 BID/OFFER CLOSES ON (2) Thursday, December 18, 2025 (1) Our Company, in consultation with the Book Running Lead Managers, may consider participation by Anchor Investors in accordance with the SEBI ICDR Regulations. (2) The UPI mandate end time and date shall be at 5:00 p.m. on Bid/Offer Closing Day.</w:t>
       </w:r>
     </w:p>
     <w:p>
@@ -84,7 +84,7 @@
     </w:p>
     <w:p>
       <w:r>
-        <w:t>RED HERRING PROSPECTUS Dated December 10, 2025 Please read section 32 of the Companies Act, 2013 100% Book Built Offer [COMPANY_001] Our Company was originally incorporated as “ [COMPANY_010] ” under the provisions of the Companies Act, 1956, pursuant to a certificate of incorporation dated July 30, 1979, issued by the Registrar of Companies, Maharashtra at Bombay. Subsequently, the name of our Company was changed from “ [COMPANY_010] ” to “ [COMPANY_011] ” pursuant to a resolution dated June 1, 1996 passed by our Board and a resolution dated June 24, 1996 passed by our shareholders, post which a fresh certificate of incorporation dated July 4, 1996 was issued by Registrar of Companies Maharashtra at Mumbai pursuant to change of name under the Companies Act, 1956. Further, pursuant to a special resolution passed by our Shareholders on January 13, 2011 which was confirmed by an order of the regional director dated August 16, 2011, the registered office of our Company was shifted from the jurisdiction of Registrar of Companies, Maharashtra at Mumbai to the jurisdiction of the Registrar of Companies, Maharashtra at Pune, and a certificate of registration of the order of regional director confirming transfer of the registered office within the same state was issued to us on October 13, 2011, by the RoC. On the conversion of our Company from a private limited company to a public limited company, pursuant to a resolution passed by our Board on December 11, 2024 and a special resolution passed by our Shareholders on December 19, 2024, the name of our Company was changed to “ [COMPANY_001] ” and a fresh certificate of incorporation was issued by the Registrar of Companies, Central Processing Centre on January 20, 2025. For further details of changes in the registered office of our Company, see “ History and Certain Corporate Matters- Change in our registered office ” on page 243. Corporate Identity Number : U28129PN1979PLC141032 Registered Office : [ADDRESS_003], Maharashtra, India; Corporate Office : 201, [ADDRESS_004], Maharashtra, India; Contact Person : [PERSON_001], Company Secretary and Compliance Officer; Telephone: [PHONE_005]; E-mail: [EMAIL_001]; Website : www.kshinternational.com OUR PROMOTERS: [PERSON_002], [PERSON_003], [PERSON_004], [PERSON_005], [PERSON_006], DHAULAGIRI FAMILY TRUST, EVEREST FAMILY TRUST, MAKALU FAMILY TRUST, BROAD FAMILY TRUST, ANNAPURNA FAMILY TRUST, KANCHENJUNGA FAMILY TRUST AND [COMPANY_002] INITIAL PUBLIC OFFERING OF UP TO [●] EQUITY SHARES OF FACE VALUE OF ₹ 5 EACH (“EQUITY SHARES”) OF [COMPANY_001] (“COMPANY” OR “ISSUER”) FOR CASH AT A PRICE OF ₹ [●] PER EQUITY SHARE (INCLUDING A SHARE PREMIUM OF ₹ [●] PER EQUITY SHARE) (“OFFER PRICE”) AGGREGATING UP TO ₹ 7,100.00 MILLION (THE “OFFER”) COMPRISING A FRESH ISSUE OF UP TO [●] EQUITY SHARES OF FACE VALUE OF ₹ 5 EACH AGGREGATING UP TO ₹ 4,200.00 MILLION (“FRESH ISSUE”) AND AN OFFER FOR SALE OF UP TO [●] EQUITY SHARES OF FACE VALUE OF ₹ [●] EACH (“OFFERED SHARES”) AGGREGATING UP TO ₹ 2,900.00 MILLION, COMPRISING UP TO [●] EQUITY SHARES OF FACE VALUE OF ₹ 5 EACH BY [PERSON_002] AGGREGATING UP TO ₹ 1,528.00 MILLION, UP TO [●] EQUITY SHARES OF FACE VALUE OF ₹ 5 EACH BY [PERSON_003] AGGREGATING UP TO ₹ 422.00 MILLION, UP TO [●] EQUITY SHARES OF FACE VALUE OF ₹ 5 EACH BY [PERSON_004] AGGREGATING UP TO ₹ 475.00 MILLION AND UP TO [●] EQUITY SHARES OF FACE VALUE OF ₹ 5 EACH BY [PERSON_005] AGGREGATING UP TO ₹ 475.00 MILLION (COLLECTIVELY, “PROMOTER SELLING SHAREHOLDERS” AND SUCH OFFER FOR SALE OF EQUITY SHARES OF FACE VALUE OF ₹ 5 EACH BY THE PROMOTER SELLING SHAREHOLDERS, THE “OFFER FOR SALE”). THE OFFER SHALL CONSTITUTE [●]% OF THE POST-OFFER PAID UP EQUITY SHARE CAPITAL OF OUR COMPANY. THE FACE VALUE OF THE EQUITY SHARES IS ₹ 5 EACH. THE OFFER PRICE IS [●] TIMES THE FACE VALUE OF THE EQUITY SHARES. THE PRICE BAND, AND MINIMUM BID LOT WILL BE DECIDED BY OUR COMPANY, IN CONSULTATION WITH THE BOOK RUNNING LEAD MANAGERS, AND WILL BE ADVERTISED IN ALL EDITIONS OF FINANCIAL EXPRESS (A WIDELY CIRCULATED ENGLISH NATIONAL DAILY NEWSPAPER), ALL EDITIONS OF JANSATTA (A WIDELY CIRCULATED HINDI NATIONAL DAILY NEWSPAPER) AND PUNE EDITION OF LOKSATTA (A WIDELY CIRCULATED MARATHI DAILY NEWSPAPER, MARATHI BEING THE REGIONAL LANGUAGE OF MAHARASHTRA WHERE OUR REGISTERED OFFICE IS LOCATED), AT LEAST TWO WORKING DAYS PRIOR TO THE BID/OFFER OPENING DATE AND SHALL BE MADE AVAILABLE TO THE STOCK EXCHANGES FOR UPLOADING ON THEIR RESPECTIVE WEBSITES IN ACCORDANCE WITH SECURITIES AND EXCHANGE BOARD OF INDIA (ISSUE OF CAPITAL AND DISCLOSURE REQUIREMENTS) REGULATIONS, 2018, AS AMENDED (THE “SEBI ICDR REGULATIONS”). In case of any revision in the Price Band, the Bid/Offer Period will be extended by at least three additional Working Days after such revision in the Price Band, subject to the Bid/Offer Period not exceeding 10 Working Days. In cases of force majeure , banking strike or similar unforeseen circumstances, our Company may, in consultation with the Book Running Lead Managers, for reasons to be recorded in writing, extend the Bid /Offer Period for a minimum of one Working Day, subject to the Bid/Offer Period not exceeding 10 Working Days. Any revision in the Price Band and the revised Bid/Offer Period, if applicable, shall be widely disseminated by notification to the Stock Exchanges, by issuing a press release, and also by indicating the change on the respective websites of the Book Running Lead Managers and at the terminals of the members of the Syndicate and by intimation to Designated Intermediaries and the Sponsor Banks, as applicable. The Offer is being made in terms of Rule 19(2)(b) of the Securities Contracts (Regulation) Rules, 1957, as amended (the “ SCRR ”), read with Regulation 31 of the SEBI ICDR Regulations. The Offer is being made through the Book Building Process in accordance with Regulation 6(1) of the SEBI ICDR Regulations wherein not more than 50% of the Offer shall be available for allocation on a proportionate basis to Qualified Institutional Buyers (“ QIBs ”) (the “ QIB Portion ”), provided that our Company may, in consultation with the BRLMs, allocate up to 60% of the QIB Portion to Anchor Investors on a discretionary basis, in accordance with the SEBI ICDR Regulations (the “ Anchor Investor Portion ”), of which 40% shall be reserved in the following manner (i) 33.33% of the Anchor Investor Portion shall be reserved for domestic Mutual Funds; and (ii) 6.67% of the Anchor Investor Portion shall be reserved for Life Insurance Companies and Pension Funds, subject to valid Bids being received from domestic Mutual Funds, Life Insurance Companies and Pension Funds, as applicable, at or above the Anchor Investor Allocation Price. Any under-subscription in the Life Insurance Companies and Pension Funds category specified in (ii) above may be allocated to domestic Mutual Funds, in accordance with the SEBI ICDR Regulations. In the event of under-subscription or non-allocation in the Anchor Investor Portion, the balance Equity Shares shall be added to the QIB Portion (other than the Anchor Investor Portion) (the “ Net QIB Portion ”). Further, 5% of the Net QIB Portion shall be available for allocation on a proportionate basis to Mutual Funds only, subject to valid Bids being received at or above the Offer Price, and the remainder of the Net QIB Portion shall be available for allocation on a proportionate basis to all QIBs, including Mutual Funds, subject to valid Bids being received at or above the Offer Price. Further, not less than 15% of the Offer shall be available for allocation to Non-Institutional Investors (“ Non-Institutional Portion ”) of which one-third of the Non-Institutional Portion shall be available for allocation to Bidders with an application size of more than ₹ 0.20 million and up to ₹ 1.00 million and two-thirds of the Non-Institutional Portion shall be available for allocation to Bidders with an application size of more than ₹ 1.00 million and undersubscription in either of these two sub-categories of the Non-Institutional Portion may be allocated to Bidders in the other sub-category of the Non-Institutional Portion in accordance with the SEBI ICDR Regulations, subject to valid Bids being received at or above the Offer Price. Further, not less than 35% of the Offer shall be available for allocation to Retail Individual Investors (“ Retail Portion ”), in accordance with the SEBI ICDR Regulations, subject to valid Bids being received from them at or above the Offer Price. All Bidders (except Anchor Investors) shall mandatorily participate in this Offer only through the Application Supported by Blocked Amount (“ ASBA ”) process and shall provide details of their respective bank account (including UPI ID (defined hereinafter) in case of UPI Bidders (defined hereinafter) in which the Bid Amount will be blocked by the Self Certified Syndicate Banks (“ SCSBs ”) or pursuant to the UPI Mechanism, as the case may be. Anchor Investors are not permitted to participate in the Anchor Investor Portion through the ASBA process. For details, see “ Offer Procedure ” on page 420. RISKS IN RELATION TO THE FIRST OFFER This being the first public offer of Equity Shares of our Company, there has been no formal market for the Equity Shares. The face value of the Equity Shares is ₹ 5 each. The Offer Price, Floor Price or Cap Price (as determined by our Company, in consultation with the Book Running Lead Managers, in accordance with the SEBI ICDR Regulations), and on the basis of the assessment of market demand for the Equity Shares by way of the Book Building Process, as stated under “ Basis for the Offer Price ” on page 124, should not be considered to be indicative of the market price of the Equity Shares after the Equity Shares are listed. No assurance can be given regarding an active and/or sustained trading in the Equity Shares nor regarding the price at which the Equity Shares will be traded after listing. GENERAL RISK Investments in equity and equity-related securities involve a degree of risk and Bidders should not invest any funds in the Offer unless they can afford to take the risk of losing their entire investment. Bidders are advised to read the risk factors carefully before taking an investment decision in the Offer. For taking an investment decision, Bidders must rely on their own examination of our Company and the Offer, including the risks involved. The Equity Shares in the Offer have not been recommended or approved by SEBI, nor does SEBI guarantee the accuracy or adequacy of the contents of this Red Herring Prospectus. Specific attention of the Bidders is invited to “ Risk Factors ” on page 28. ISSUER’S AND PROMOTER SELLING SHAREHOLDERS’ ABSOLUTE RESPONSIBILITY Our Company, having made all reasonable inquiries, accepts responsibility for and confirms that this Red Herring Prospectus contains all information with regard to our Company and the Offer, which is material in the context of the Offer, that the information contained in this Red Herring Prospectus is true and correct in all material aspects and is not misleading in any material respect, that the opinions and intentions expressed herein are honestly held and that there are no other facts, the omission of which makes this Red Herring Prospectus as a whole or any of such information or the expression of any such opinions or intentions misleading in any material respect. Each of the Promoter Selling Shareholders, severally and not jointly, accepts responsibility for and confirms the statements specifically made or confirmed by them in this Red Herring Prospectus solely to the extent of information specifically pertaining to themselves and the Equity Shares offered by them in the Offer for Sale and assumes responsibility that such statements are true and correct in all material respects and are not misleading in any material respect. Each of the Promoter Selling Shareholders, severally and not jointly, assume no responsibility for any other statements, including, inter alia, any and all of the statements made by or relating to our Company or its business or any other Promoter Selling Shareholder or any other person(s) in this Red Herring Prospectus. LISTING The Equity Shares, offered through this Red Herring Prospectus, are proposed to be listed on the Stock Exchanges. Our Company has received in-principle approvals from BSE and NSE for listing of the Equity Shares pursuant to their letters each dated August 4, 2025, respectively. For the purposes of the Offer, the Designated Stock Exchange shall be BSE. A copy of this Red Herring Prospectus has been filed with the RoC and a copy of the Prospectus shall be filed with the RoC in accordance with Sections 26(4) and 32 of the Companies Act, 2013. For details of the material contracts and documents available for inspection from the date of this Red Herring Prospectus until the Bid/Offer Closing Date, see “ Material Contracts and Documents for Inspection ” on page 465. BOOK RUNNING LEAD [COMPANY_012] 801 - 804, Wing A, [ADDRESS_005], Maharashtra, India Tel: [PHONE_006] E-mail: [EMAIL_002] Website: www.nuvama.com Investor grievance email: [EMAIL_005] Contact Person: [PERSON_007]/ [PERSON_008] SEBI Registration Number : [COMPANY_013] ICICI Venture [ADDRESS_006], Maharashtra, India Tel: [PHONE_003] E-mail: [EMAIL_003] Website: www.icicisecurities.com Investor grievance email: [EMAIL_006] Contact Person: [PERSON_009]/[PERSON_010] SEBI Registration Number : [COMPANY_014] ([COMPANY_009]) C-101, Embassy 247, 1 st [ADDRESS_007], (Maharashtra), India Tel: [PHONE_004] E-mail: [EMAIL_004] Website: www.in.mpms.mufg.com Investor grievance e-mail: [EMAIL_004] Contact Person: [PERSON_011] SEBI Registration Number: INR000004058 BID/ OFFER PERIOD</w:t>
+        <w:t>RED HERRING PROSPECTUS Dated December 10, 2025 Please read section 32 of the Companies Act, 2013 100% Book Built Offer Acme Corp Ltd. Our Company was originally incorporated as “ Aperture Science LLC ” under the provisions of the Companies Act, 1956, pursuant to a certificate of incorporation dated July 30, 1979, issued by the Registrar of Companies, Maharashtra at Bombay. Subsequently, the name of our Company was changed from “ Aperture Science LLC ” to “ Wonka Industries Limited ” pursuant to a resolution dated June 1, 1996 passed by our Board and a resolution dated June 24, 1996 passed by our shareholders, post which a fresh certificate of incorporation dated July 4, 1996 was issued by Registrar of Companies Maharashtra at Mumbai pursuant to change of name under the Companies Act, 1956. Further, pursuant to a special resolution passed by our Shareholders on January 13, 2011 which was confirmed by an order of the regional director dated August 16, 2011, the registered office of our Company was shifted from the jurisdiction of Registrar of Companies, Maharashtra at Mumbai to the jurisdiction of the Registrar of Companies, Maharashtra at Pune, and a certificate of registration of the order of regional director confirming transfer of the registered office within the same state was issued to us on October 13, 2011, by the RoC. On the conversion of our Company from a private limited company to a public limited company, pursuant to a resolution passed by our Board on December 11, 2024 and a special resolution passed by our Shareholders on December 19, 2024, the name of our Company was changed to “ Acme Corp Ltd. ” and a fresh certificate of incorporation was issued by the Registrar of Companies, Central Processing Centre on January 20, 2025. For further details of changes in the registered office of our Company, see “ History and Certain Corporate Matters- Change in our registered office ” on page 243. Corporate Identity Number : U28129PN1979PLC141032 Registered Office : 789, Brigade Road, 2nd Floor, Bengaluru – 560 025, Maharashtra, India; Corporate Office : 201, 101, Anna Salai, T Nagar, Chennai – 600 017, Maharashtra, India; Contact Person : John Doe, Company Secretary and Compliance Officer; Telephone: +91 90000 00005; E-mail: john.doe@example.com; Website : www.kshinternational.com OUR PROMOTERS: Jane Smith, Peter Parker, Alex Morgan, Taylor Brown, Jordan Lee, Globex Industries Limited, Umbrella Holdings Private Limited, Initech Solutions Limited, Hooli Technologies Limited, Pied Piper Inc., Stark Industries Limited AND Wayne Enterprises Limited INITIAL PUBLIC OFFERING OF UP TO [●] EQUITY SHARES OF FACE VALUE OF ₹ 5 EACH (“EQUITY SHARES”) OF Acme Corp Ltd. (“COMPANY” OR “ISSUER”) FOR CASH AT A PRICE OF ₹ [●] PER EQUITY SHARE (INCLUDING A SHARE PREMIUM OF ₹ [●] PER EQUITY SHARE) (“OFFER PRICE”) AGGREGATING UP TO ₹ 7,100.00 MILLION (THE “OFFER”) COMPRISING A FRESH ISSUE OF UP TO [●] EQUITY SHARES OF FACE VALUE OF ₹ 5 EACH AGGREGATING UP TO ₹ 4,200.00 MILLION (“FRESH ISSUE”) AND AN OFFER FOR SALE OF UP TO [●] EQUITY SHARES OF FACE VALUE OF ₹ [●] EACH (“OFFERED SHARES”) AGGREGATING UP TO ₹ 2,900.00 MILLION, COMPRISING UP TO [●] EQUITY SHARES OF FACE VALUE OF ₹ 5 EACH BY Jane Smith AGGREGATING UP TO ₹ 1,528.00 MILLION, UP TO [●] EQUITY SHARES OF FACE VALUE OF ₹ 5 EACH BY Peter Parker AGGREGATING UP TO ₹ 422.00 MILLION, UP TO [●] EQUITY SHARES OF FACE VALUE OF ₹ 5 EACH BY Alex Morgan AGGREGATING UP TO ₹ 475.00 MILLION AND UP TO [●] EQUITY SHARES OF FACE VALUE OF ₹ 5 EACH BY Taylor Brown AGGREGATING UP TO ₹ 475.00 MILLION (COLLECTIVELY, “PROMOTER SELLING SHAREHOLDERS” AND SUCH OFFER FOR SALE OF EQUITY SHARES OF FACE VALUE OF ₹ 5 EACH BY THE PROMOTER SELLING SHAREHOLDERS, THE “OFFER FOR SALE”). THE OFFER SHALL CONSTITUTE [●]% OF THE POST-OFFER PAID UP EQUITY SHARE CAPITAL OF OUR COMPANY. THE FACE VALUE OF THE EQUITY SHARES IS ₹ 5 EACH. THE OFFER PRICE IS [●] TIMES THE FACE VALUE OF THE EQUITY SHARES. THE PRICE BAND, AND MINIMUM BID LOT WILL BE DECIDED BY OUR COMPANY, IN CONSULTATION WITH THE BOOK RUNNING LEAD MANAGERS, AND WILL BE ADVERTISED IN ALL EDITIONS OF FINANCIAL EXPRESS (A WIDELY CIRCULATED ENGLISH NATIONAL DAILY NEWSPAPER), ALL EDITIONS OF JANSATTA (A WIDELY CIRCULATED HINDI NATIONAL DAILY NEWSPAPER) AND PUNE EDITION OF LOKSATTA (A WIDELY CIRCULATED MARATHI DAILY NEWSPAPER, MARATHI BEING THE REGIONAL LANGUAGE OF MAHARASHTRA WHERE OUR REGISTERED OFFICE IS LOCATED), AT LEAST TWO WORKING DAYS PRIOR TO THE BID/OFFER OPENING DATE AND SHALL BE MADE AVAILABLE TO THE STOCK EXCHANGES FOR UPLOADING ON THEIR RESPECTIVE WEBSITES IN ACCORDANCE WITH SECURITIES AND EXCHANGE BOARD OF INDIA (ISSUE OF CAPITAL AND DISCLOSURE REQUIREMENTS) REGULATIONS, 2018, AS AMENDED (THE “SEBI ICDR REGULATIONS”). In case of any revision in the Price Band, the Bid/Offer Period will be extended by at least three additional Working Days after such revision in the Price Band, subject to the Bid/Offer Period not exceeding 10 Working Days. In cases of force majeure , banking strike or similar unforeseen circumstances, our Company may, in consultation with the Book Running Lead Managers, for reasons to be recorded in writing, extend the Bid /Offer Period for a minimum of one Working Day, subject to the Bid/Offer Period not exceeding 10 Working Days. Any revision in the Price Band and the revised Bid/Offer Period, if applicable, shall be widely disseminated by notification to the Stock Exchanges, by issuing a press release, and also by indicating the change on the respective websites of the Book Running Lead Managers and at the terminals of the members of the Syndicate and by intimation to Designated Intermediaries and the Sponsor Banks, as applicable. The Offer is being made in terms of Rule 19(2)(b) of the Securities Contracts (Regulation) Rules, 1957, as amended (the “ SCRR ”), read with Regulation 31 of the SEBI ICDR Regulations. The Offer is being made through the Book Building Process in accordance with Regulation 6(1) of the SEBI ICDR Regulations wherein not more than 50% of the Offer shall be available for allocation on a proportionate basis to Qualified Institutional Buyers (“ QIBs ”) (the “ QIB Portion ”), provided that our Company may, in consultation with the BRLMs, allocate up to 60% of the QIB Portion to Anchor Investors on a discretionary basis, in accordance with the SEBI ICDR Regulations (the “ Anchor Investor Portion ”), of which 40% shall be reserved in the following manner (i) 33.33% of the Anchor Investor Portion shall be reserved for domestic Mutual Funds; and (ii) 6.67% of the Anchor Investor Portion shall be reserved for Life Insurance Companies and Pension Funds, subject to valid Bids being received from domestic Mutual Funds, Life Insurance Companies and Pension Funds, as applicable, at or above the Anchor Investor Allocation Price. Any under-subscription in the Life Insurance Companies and Pension Funds category specified in (ii) above may be allocated to domestic Mutual Funds, in accordance with the SEBI ICDR Regulations. In the event of under-subscription or non-allocation in the Anchor Investor Portion, the balance Equity Shares shall be added to the QIB Portion (other than the Anchor Investor Portion) (the “ Net QIB Portion ”). Further, 5% of the Net QIB Portion shall be available for allocation on a proportionate basis to Mutual Funds only, subject to valid Bids being received at or above the Offer Price, and the remainder of the Net QIB Portion shall be available for allocation on a proportionate basis to all QIBs, including Mutual Funds, subject to valid Bids being received at or above the Offer Price. Further, not less than 15% of the Offer shall be available for allocation to Non-Institutional Investors (“ Non-Institutional Portion ”) of which one-third of the Non-Institutional Portion shall be available for allocation to Bidders with an application size of more than ₹ 0.20 million and up to ₹ 1.00 million and two-thirds of the Non-Institutional Portion shall be available for allocation to Bidders with an application size of more than ₹ 1.00 million and undersubscription in either of these two sub-categories of the Non-Institutional Portion may be allocated to Bidders in the other sub-category of the Non-Institutional Portion in accordance with the SEBI ICDR Regulations, subject to valid Bids being received at or above the Offer Price. Further, not less than 35% of the Offer shall be available for allocation to Retail Individual Investors (“ Retail Portion ”), in accordance with the SEBI ICDR Regulations, subject to valid Bids being received from them at or above the Offer Price. All Bidders (except Anchor Investors) shall mandatorily participate in this Offer only through the Application Supported by Blocked Amount (“ ASBA ”) process and shall provide details of their respective bank account (including UPI ID (defined hereinafter) in case of UPI Bidders (defined hereinafter) in which the Bid Amount will be blocked by the Self Certified Syndicate Banks (“ SCSBs ”) or pursuant to the UPI Mechanism, as the case may be. Anchor Investors are not permitted to participate in the Anchor Investor Portion through the ASBA process. For details, see “ Offer Procedure ” on page 420. RISKS IN RELATION TO THE FIRST OFFER This being the first public offer of Equity Shares of our Company, there has been no formal market for the Equity Shares. The face value of the Equity Shares is ₹ 5 each. The Offer Price, Floor Price or Cap Price (as determined by our Company, in consultation with the Book Running Lead Managers, in accordance with the SEBI ICDR Regulations), and on the basis of the assessment of market demand for the Equity Shares by way of the Book Building Process, as stated under “ Basis for the Offer Price ” on page 124, should not be considered to be indicative of the market price of the Equity Shares after the Equity Shares are listed. No assurance can be given regarding an active and/or sustained trading in the Equity Shares nor regarding the price at which the Equity Shares will be traded after listing. GENERAL RISK Investments in equity and equity-related securities involve a degree of risk and Bidders should not invest any funds in the Offer unless they can afford to take the risk of losing their entire investment. Bidders are advised to read the risk factors carefully before taking an investment decision in the Offer. For taking an investment decision, Bidders must rely on their own examination of our Company and the Offer, including the risks involved. The Equity Shares in the Offer have not been recommended or approved by SEBI, nor does SEBI guarantee the accuracy or adequacy of the contents of this Red Herring Prospectus. Specific attention of the Bidders is invited to “ Risk Factors ” on page 28. ISSUER’S AND PROMOTER SELLING SHAREHOLDERS’ ABSOLUTE RESPONSIBILITY Our Company, having made all reasonable inquiries, accepts responsibility for and confirms that this Red Herring Prospectus contains all information with regard to our Company and the Offer, which is material in the context of the Offer, that the information contained in this Red Herring Prospectus is true and correct in all material aspects and is not misleading in any material respect, that the opinions and intentions expressed herein are honestly held and that there are no other facts, the omission of which makes this Red Herring Prospectus as a whole or any of such information or the expression of any such opinions or intentions misleading in any material respect. Each of the Promoter Selling Shareholders, severally and not jointly, accepts responsibility for and confirms the statements specifically made or confirmed by them in this Red Herring Prospectus solely to the extent of information specifically pertaining to themselves and the Equity Shares offered by them in the Offer for Sale and assumes responsibility that such statements are true and correct in all material respects and are not misleading in any material respect. Each of the Promoter Selling Shareholders, severally and not jointly, assume no responsibility for any other statements, including, inter alia, any and all of the statements made by or relating to our Company or its business or any other Promoter Selling Shareholder or any other person(s) in this Red Herring Prospectus. LISTING The Equity Shares, offered through this Red Herring Prospectus, are proposed to be listed on the Stock Exchanges. Our Company has received in-principle approvals from BSE and NSE for listing of the Equity Shares pursuant to their letters each dated August 4, 2025, respectively. For the purposes of the Offer, the Designated Stock Exchange shall be BSE. A copy of this Red Herring Prospectus has been filed with the RoC and a copy of the Prospectus shall be filed with the RoC in accordance with Sections 26(4) and 32 of the Companies Act, 2013. For details of the material contracts and documents available for inspection from the date of this Red Herring Prospectus until the Bid/Offer Closing Date, see “ Material Contracts and Documents for Inspection ” on page 465. BOOK RUNNING LEAD Weyland Corp Limited 801 - 804, Wing A, 202, FC Road, Shivajinagar, Pune – 411 005, Maharashtra, India Tel: +91 90000 00006 E-mail: jane.smith@example.com Website: www.nuvama.com Investor grievance email: taylor.brown@example.com Contact Person: Sam Wilson/ Chris Blake SEBI Registration Number : Bluth Company LLC ICICI Venture 303, SG Highway, Thaltej, Ahmedabad – 380 054, Maharashtra, India Tel: +91 90000 00003 E-mail: peter.parker@example.com Website: www.icicisecurities.com Investor grievance email: jordan.lee@example.com Contact Person: Morgan Reed/Casey Quinn SEBI Registration Number : Sterling Cooper Limited (Massive Dynamic Inc.) C-101, Embassy 247, 1 st 404, Link Road, Andheri West, Mumbai – 400 053, (Maharashtra), India Tel: +91 90000 00004 E-mail: alex.morgan@example.com Website: www.in.mpms.mufg.com Investor grievance e-mail: alex.morgan@example.com Contact Person: Riley Adams SEBI Registration Number: INR000004058 BID/ OFFER PERIOD</w:t>
       </w:r>
     </w:p>
     <w:p>
@@ -138,7 +138,7 @@
     </w:p>
     <w:p>
       <w:r>
-        <w:t>DEFINITIONS AND ABBREVIATIONS This Red Herring Prospectus uses certain definitions and abbreviations which, unless the context otherwise indicates or implies, or unless otherwise specified, shall have the meaning as provided below, and references to any legislation, act, regulation, rules, guidelines or policies shall be to such legislation, act, regulation, rule guidelines or policy as amended from time to time and any reference to a statutory provision shall include any subordinate legislation made from time to time under that provision. Further, the Offer related terms used but not defined in this Red Herring Prospectus shall have the meaning ascribed to such terms under the General Information Document. In case of any inconsistency between the definitions given below and the definitions contained in the General Information Document (as defined below), the definitions given below shall prevail. Unless the context otherwise indicates, all references to “we”, “us”, “our”, “the Company”, and “our Company”, are references to [COMPANY_001], a company incorporated on July 30, 1979 under the Companies Act, 1956 and having its Registered Office at [ADDRESS_003], Maharashtra, India and its Corporate Office at 201, [ADDRESS_004], Maharashtra, India. The words and expressions used in this Red Herring Prospectus but not defined herein, shall have, to the extent applicable, the meanings ascribed to such terms under the Companies Act, the SEBI Act, the SEBI ICDR Regulations, the SCRA, SCRR, and the Depositories Act, as amended. Notwithstanding the foregoing, terms in “Main Provisions of the Articles of Association”, “Statement of Special Tax Benefits”, “Industry Overview”, “Key Regulations and Policies in India”, “History and Certain Corporate Matters”, “Basis for the Offer Price”, “Restriction on Foreign Ownership of Indian Securities”, “Financial Information” and “Outstanding Litigation and Material Developments” on pages 441, 134, 137, 238, 243, 124, 438, 280 and 388, respectively, will have the meaning ascribed to such terms in those respective sections. General Terms Term Description Our Company/ the [COMPANY_015], a public limited company incorporated under the Companies Act, 1956, having its registered office at [ADDRESS_003], Maharashtra, India We/ us/ our Unless context otherwise indicates or implies, refers to our Company Company Related Terms Term Description AoA/Articles of Association or Articles The articles of association of our Company, as amended from time to time Audit Committee Audit committee of our Board, as disclosed in “ Our Management – Corporate Governance – Committees of our Board” on page 257 Auditors/ Statutory Auditors The current statutory auditors of our Company, being [COMPANY_003], Chartered Accountants Board/ Board of Directors The board of directors of our Company. For further details, see “ Our Management – Board of Directors ” on page 250 Bonus Issue Bonus issue undertaken on February 21, 2025, in the ratio of four Equity Shares of face value of ₹ 5 for every one Equity Share of face value of ₹ 5 held by our Shareholders as on February 10, 2025. For further details, please see “ Capital Structure – Equity Share capital history of our Company ” on page 85 CARE Report Report titled “ Industry Research Report on Magnet Winding Wires Market in India ” dated November 26, 2025, prepared and issued by [COMPANY_016] which has been commissioned by and paid for by our Company pursuant to an engagement letter dated December 2, 2024 entered into with [COMPANY_016], exclusively for the purposes of the Offer. The report will be available on the website of our Company at https://kshinternational.com/investor-relations/industry-report/ from the date of this Red Herring Prospectus until the Bid/Offer Closing Date</w:t>
+        <w:t>DEFINITIONS AND ABBREVIATIONS This Red Herring Prospectus uses certain definitions and abbreviations which, unless the context otherwise indicates or implies, or unless otherwise specified, shall have the meaning as provided below, and references to any legislation, act, regulation, rules, guidelines or policies shall be to such legislation, act, regulation, rule guidelines or policy as amended from time to time and any reference to a statutory provision shall include any subordinate legislation made from time to time under that provision. Further, the Offer related terms used but not defined in this Red Herring Prospectus shall have the meaning ascribed to such terms under the General Information Document. In case of any inconsistency between the definitions given below and the definitions contained in the General Information Document (as defined below), the definitions given below shall prevail. Unless the context otherwise indicates, all references to “we”, “us”, “our”, “the Company”, and “our Company”, are references to Acme Corp Ltd., a company incorporated on July 30, 1979 under the Companies Act, 1956 and having its Registered Office at 789, Brigade Road, 2nd Floor, Bengaluru – 560 025, Maharashtra, India and its Corporate Office at 201, 101, Anna Salai, T Nagar, Chennai – 600 017, Maharashtra, India. The words and expressions used in this Red Herring Prospectus but not defined herein, shall have, to the extent applicable, the meanings ascribed to such terms under the Companies Act, the SEBI Act, the SEBI ICDR Regulations, the SCRA, SCRR, and the Depositories Act, as amended. Notwithstanding the foregoing, terms in “Main Provisions of the Articles of Association”, “Statement of Special Tax Benefits”, “Industry Overview”, “Key Regulations and Policies in India”, “History and Certain Corporate Matters”, “Basis for the Offer Price”, “Restriction on Foreign Ownership of Indian Securities”, “Financial Information” and “Outstanding Litigation and Material Developments” on pages 441, 134, 137, 238, 243, 124, 438, 280 and 388, respectively, will have the meaning ascribed to such terms in those respective sections. General Terms Term Description Our Company/ the Acme Corp Ltd., a public limited company incorporated under the Companies Act, 1956, having its registered office at 789, Brigade Road, 2nd Floor, Bengaluru – 560 025, Maharashtra, India We/ us/ our Unless context otherwise indicates or implies, refers to our Company Company Related Terms Term Description AoA/Articles of Association or Articles The articles of association of our Company, as amended from time to time Audit Committee Audit committee of our Board, as disclosed in “ Our Management – Corporate Governance – Committees of our Board” on page 257 Auditors/ Statutory Auditors The current statutory auditors of our Company, being Oscorp Limited, Chartered Accountants Board/ Board of Directors The board of directors of our Company. For further details, see “ Our Management – Board of Directors ” on page 250 Bonus Issue Bonus issue undertaken on February 21, 2025, in the ratio of four Equity Shares of face value of ₹ 5 for every one Equity Share of face value of ₹ 5 held by our Shareholders as on February 10, 2025. For further details, please see “ Capital Structure – Equity Share capital history of our Company ” on page 85 CARE Report Report titled “ Industry Research Report on Magnet Winding Wires Market in India ” dated November 26, 2025, prepared and issued by Globex Industries Limited which has been commissioned by and paid for by our Company pursuant to an engagement letter dated December 2, 2024 entered into with Globex Industries Limited, exclusively for the purposes of the Offer. The report will be available on the website of our Company at https://kshinternational.com/investor-relations/industry-report/ from the date of this Red Herring Prospectus until the Bid/Offer Closing Date</w:t>
       </w:r>
     </w:p>
     <w:p>
@@ -156,7 +156,7 @@
     </w:p>
     <w:p>
       <w:r>
-        <w:t>Chairman and Executive Director The chairman and executive director of our Company, being [PERSON_002]. For further details, see “ Our Management – Board of Directors ” on page 250 Chief Executive Officer/ CEO The chief executive officer of our Company, being [PERSON_012]. For further details, see “ Our Management – Key Managerial Personnel and Senior Management ” on page 266 Chief Financial Officer/ CFO The chief financial officer of our Company, being [PERSON_013]. For further details, see “ Our Management – Key Managerial Personnel and Senior Management ” on page 266 Company Secretary/ CS and Compliance Officer The company secretary and compliance officer of our Company, being [PERSON_001]. For further details, see “ General Information ” and “ Our Management – Key Managerial Personnel and Senior Management ” on pages 74 and 266, respectively.</w:t>
+        <w:t>Chairman and Executive Director The chairman and executive director of our Company, being Jane Smith. For further details, see “ Our Management – Board of Directors ” on page 250 Chief Executive Officer/ CEO The chief executive officer of our Company, being Drew Campbell. For further details, see “ Our Management – Key Managerial Personnel and Senior Management ” on page 266 Chief Financial Officer/ CFO The chief financial officer of our Company, being Avery Hart. For further details, see “ Our Management – Key Managerial Personnel and Senior Management ” on page 266 Company Secretary/ CS and Compliance Officer The company secretary and compliance officer of our Company, being John Doe. For further details, see “ General Information ” and “ Our Management – Key Managerial Personnel and Senior Management ” on pages 74 and 266, respectively.</w:t>
       </w:r>
     </w:p>
     <w:p>
@@ -174,7 +174,7 @@
     </w:p>
     <w:p>
       <w:r>
-        <w:t>Term Description Corporate Office The corporate office of our company located at 201, [ADDRESS_004], Maharashtra, [COMPANY_017] CSR Committee/ Corporate Social Responsibility Committee The corporate social responsibility committee of our Board, as disclosed in “ Our Management – Corporate Governance – Committees of our Board ” on page 257 Director(s) The director(s) on our Board. For further details, see “ Our Management – Board of Directors ” on page 250 Equity Shares The equity shares of our Company of face value of ₹ 5 each, unless otherwise stated Executive Director(s) Executive director(s) on our Board. For further details, see “ Our Management – Board of Directors ” on page 250 ESOP 2025 The employee stock option plan of our Company titled, ‘ KSH Employee Stock Option Scheme 2025 ’ approved by our Board and Shareholders each in their meeting May 6, 2025 Family Branch(es) Parents Branch, Rajesh Branch, Sangeeta Branch, Rakhi Branch and Rohit Branch Group Companies The companies identified as ‘group companies’ in accordance with Regulation 2(1)(t) of the SEBI ICDR Regulations and the Materiality Policy. For further details, see “ Our Group Companies ” on page 396 Group Entities Entities, namely, [COMPANY_018], [COMPANY_019], [COMPANY_020], [COMPANY_021], [COMPANY_022], [COMPANY_023], [COMPANY_024], [COMPANY_025], [COMPANY_026], [COMPANY_027], [COMPANY_028], [COMPANY_029], [COMPANY_002], [COMPANY_030], [COMPANY_031], [COMPANY_032], [COMPANY_033], and [COMPANY_034] Independent Director(s) Non-executive and independent director(s) on our Board. For further details, see “ Our Management – Board of Directors ” on page 250 Independent Chartered Engineer The independent chartered engineer appointed by our Company, namely, [PERSON_014] bearing registration number M-140388 Industry Data Provider/ CareEdge Research The industry data provider being, [COMPANY_016] IPO Committee The IPO committee of our Board constituted to facilitate the process of the Offer Joint Managing Director The joint managing director of our Company being, [PERSON_005]. For further details, see “ Our Management ” on page 250 KMP/ Key Managerial Personnel Key managerial personnel of our Company in terms of Regulation 2(1)(bb) of the SEBI ICDR Regulations and Section 2(51) of the Companies Act, 2013 and as further disclosed in “ Our Management – Key Managerial Personnel and Senior Management ” on page 266 Managing Director The managing director of our Company, namely [PERSON_004]. For further information, see “ Our Management – Board of Directors ” on page 250 Materiality Policy The policy adopted by our Board on May 17, 2025, for identification of: (a) outstanding material outstanding litigation involving our Company, our Promoters and our Directors; (b) companies, considered material by our Company, for the purposes of disclosure as group companies in the Draft Red Herring Prospectus, this Red Herring Prospectus and the Prospectus; and (c) outstanding dues to material creditors of our Company, in accordance with the disclosure requirements under the SEBI ICDR Regulations, for the purposes of disclosure in the Draft Red Herring Prospectus, this Red Herring Prospectus and the Prospectus MoA/ Memorandum of Association The memorandum of association of our Company, as amended Nomination and Remuneration Committee The nomination and remuneration committee of our Board, as disclosed in “ Our Management – Committees of our Board ” on page 257 Non-Executive Non-Independent Director(s) The non-executive non-independent Directors on our Board, as disclosed in “ Our Management – Board of Directors ” on page 250 Parents Branch [PERSON_002], [PERSON_003], Broad Family Trust and Dhaulagiri Family Trust</w:t>
+        <w:t>Term Description Corporate Office The corporate office of our company located at 201, 101, Anna Salai, T Nagar, Chennai – 600 017, Maharashtra, Umbrella Holdings Private Limited CSR Committee/ Corporate Social Responsibility Committee The corporate social responsibility committee of our Board, as disclosed in “ Our Management – Corporate Governance – Committees of our Board ” on page 257 Director(s) The director(s) on our Board. For further details, see “ Our Management – Board of Directors ” on page 250 Equity Shares The equity shares of our Company of face value of ₹ 5 each, unless otherwise stated Executive Director(s) Executive director(s) on our Board. For further details, see “ Our Management – Board of Directors ” on page 250 ESOP 2025 The employee stock option plan of our Company titled, ‘ KSH Employee Stock Option Scheme 2025 ’ approved by our Board and Shareholders each in their meeting May 6, 2025 Family Branch(es) Parents Branch, Rajesh Branch, Sangeeta Branch, Rakhi Branch and Rohit Branch Group Companies The companies identified as ‘group companies’ in accordance with Regulation 2(1)(t) of the SEBI ICDR Regulations and the Materiality Policy. For further details, see “ Our Group Companies ” on page 396 Group Entities Entities, namely, Initech Solutions Limited, Hooli Technologies Limited, Pied Piper Inc., Stark Industries Limited, Wayne Enterprises Limited, Oscorp Limited, Vance Refrigeration LLC, Dunder Mifflin Private Limited, Soylent Corp Limited, Tyrell Corporation, Cyberdyne Systems Limited, Massive Dynamic Inc., Wayne Enterprises Limited, Aperture Science LLC, Wonka Industries Limited, Weyland Corp Limited, Bluth Company LLC, and Sterling Cooper Limited Independent Director(s) Non-executive and independent director(s) on our Board. For further details, see “ Our Management – Board of Directors ” on page 250 Independent Chartered Engineer The independent chartered engineer appointed by our Company, namely, Jamie Stone bearing registration number M-140388 Industry Data Provider/ CareEdge Research The industry data provider being, Globex Industries Limited IPO Committee The IPO committee of our Board constituted to facilitate the process of the Offer Joint Managing Director The joint managing director of our Company being, Taylor Brown. For further details, see “ Our Management ” on page 250 KMP/ Key Managerial Personnel Key managerial personnel of our Company in terms of Regulation 2(1)(bb) of the SEBI ICDR Regulations and Section 2(51) of the Companies Act, 2013 and as further disclosed in “ Our Management – Key Managerial Personnel and Senior Management ” on page 266 Managing Director The managing director of our Company, namely Alex Morgan. For further information, see “ Our Management – Board of Directors ” on page 250 Materiality Policy The policy adopted by our Board on May 17, 2025, for identification of: (a) outstanding material outstanding litigation involving our Company, our Promoters and our Directors; (b) companies, considered material by our Company, for the purposes of disclosure as group companies in the Draft Red Herring Prospectus, this Red Herring Prospectus and the Prospectus; and (c) outstanding dues to material creditors of our Company, in accordance with the disclosure requirements under the SEBI ICDR Regulations, for the purposes of disclosure in the Draft Red Herring Prospectus, this Red Herring Prospectus and the Prospectus MoA/ Memorandum of Association The memorandum of association of our Company, as amended Nomination and Remuneration Committee The nomination and remuneration committee of our Board, as disclosed in “ Our Management – Committees of our Board ” on page 257 Non-Executive Non-Independent Director(s) The non-executive non-independent Directors on our Board, as disclosed in “ Our Management – Board of Directors ” on page 250 Parents Branch Jane Smith, Peter Parker, Hooli Technologies Limited and Globex Industries Limited</w:t>
       </w:r>
     </w:p>
     <w:p>
@@ -192,7 +192,7 @@
     </w:p>
     <w:p>
       <w:r>
-        <w:t>Promoter Group Persons and entities, excluding our Promoters constituting the promoter group of our Company in terms of Regulation 2(1)(pp) of the SEBI ICDR Regulations, as disclosed in “ Our Promoters and Promoter Group ” on page 269 Promoters [PERSON_002], [PERSON_003], [PERSON_004], [PERSON_005] and [PERSON_006], Dhaulagiri Family Trust, Everest Family Trust, Makalu Family Trust, Broad Family Trust, Annapurna Family Trust, Kanchenjunga Family Trust and [COMPANY_002] Promoter Selling Shareholders [PERSON_002], [PERSON_003], [PERSON_004] and [PERSON_005] Promoter Trusts Dhaulagiri Family Trust, Everest Family Trust, Makalu Family Trust, Broad Family Trust, Annapurna Family Trust, and Kanchenjunga Family Trust Rajesh Branch [PERSON_004], his spouse, his children, lineal descendants and Everest Family Trust Rakhi Branch [PERSON_006], her spouse (if any), her children, lineal descendants and Annapurna Family Trust Registered Office The registered office of our Company located at [ADDRESS_008], Maharashtra, India</w:t>
+        <w:t>Promoter Group Persons and entities, excluding our Promoters constituting the promoter group of our Company in terms of Regulation 2(1)(pp) of the SEBI ICDR Regulations, as disclosed in “ Our Promoters and Promoter Group ” on page 269 Promoters Jane Smith, Peter Parker, Alex Morgan, Taylor Brown and Jordan Lee, Globex Industries Limited, Umbrella Holdings Private Limited, Initech Solutions Limited, Hooli Technologies Limited, Pied Piper Inc., Stark Industries Limited and Wayne Enterprises Limited Promoter Selling Shareholders Jane Smith, Peter Parker, Alex Morgan and Taylor Brown Promoter Trusts Globex Industries Limited, Umbrella Holdings Private Limited, Initech Solutions Limited, Hooli Technologies Limited, Pied Piper Inc., and Stark Industries Limited Rajesh Branch Alex Morgan, his spouse, his children, lineal descendants and Umbrella Holdings Private Limited Rakhi Branch Jordan Lee, her spouse (if any), her children, lineal descendants and Pied Piper Inc. Registered Office The registered office of our Company located at 505, Banjara Hills, Road No 12, Hyderabad – 500 034, Maharashtra, India</w:t>
       </w:r>
     </w:p>
     <w:p>
@@ -210,7 +210,7 @@
     </w:p>
     <w:p>
       <w:r>
-        <w:t>Term Description Registrar of Companies/RoC The Registrar of Companies, Maharashtra at Pune Restated Financial Statements The restated financial information of our Company comprising the restated statements of assets and liabilities as on and for the three-month period ended June 30, 2025 and for the years ended March 31, 2025, March 31, 2024 and March 31, 2023, the restated statements of profit and loss (including other comprehensive income), the restated statements of cash flow, the restated statements of changes in equity, the summary of material accounting policies and other explanatory information and other financial information, including the annexures, notes and schedules thereto, for the three-months period ended June 30, 2025, and for the years ended March 31, 2025, March 31, 2024 and March 31, 2023, prepared in terms of the requirements of Section 26 of Part I of Chapter III of the Companies Act, SEBI ICDR Regulations, the Guidance Note on Reports in Company Prospectuses (Revised 2019) issued by ICAI, as amended from time to time and the Indian Accounting Standards as specified under Section 133 of the Act and other accounting principles generally accepted in India. Risk Management Committee The risk management committee of our Board, as disclosed in “ Our Management – Corporate Governance - Committees of our Board ” on page 257 Rohit Branch [PERSON_005], his spouse, his children, lineal descendants and Makalu Family Trust Sangeeta Branch Sangeeta Ramprasad Rai, her spouse, her children, lineal descendants and Kanchenjunga Family Trust Split of Equity Shares Pursuant to a resolution passed by our Board and Shareholders dated February 10, 2025 and February 11, 2025, respectively, our Company sub-divided the face value of its equity shares from ₹ 100 per equity share to ₹ 5 per Equity Share. For further details, see “ Summary of the Offer Document ” and “ Capital Structure – Notes to Capital Structure – Equity Share Capital History of our Company ” on pages 20 and 85, respectively Senior Management/ SM Our senior management in terms of Regulation 2(1)(bbbb) of the SEBI ICDR Regulations and as disclosed in “ Our Management – Key Managerial Personnel and Senior Management ” on page 266 Shareholders The holders of the Equity Shares from time to time Stakeholders Relationship Committee The stakeholders’ relationship committee of our Board, as disclosed in “ Our Management – Corporate Governance – Committees of our Board ” on page 257 Supa Facility Our manufacturing [ADDRESS_009], Maharashtra, India Unit 2 Our manufacturing [ADDRESS_010], Maharashtra, India Unit 3 Our manufacturing [ADDRESS_011], Maharashtra, India Whole-time Director The whole-time director of our Company being, [PERSON_006]. For further information, see “ Our Management – Board of Directors ” on page 250 Offer Related Terms Term Description Abridged Prospectus Abridged prospectus means a memorandum containing such salient features of a prospectus as may be specified by the SEBI in this behalf Acknowledgement Slip The slip or document issued by the relevant Designated Intermediary(ies) to a Bidder as proof of registration of the Bid cum Application Form Allot/ Allotment/ Allotted Unless the context otherwise requires, the allotment of the Equity Shares pursuant to the Fresh Issue and transfer of the Offered Shares by the Promoter Selling Shareholders pursuant to the Offer for Sale to successful Bidders Allotment Advice Note or advice or intimation of Allotment sent to the Bidders who have been or are to be Allotted the Equity Shares after the Basis of Allotment has been approved by the Designated Stock Exchange Allottee A successful Bidder to whom the Equity Shares are Allotted</w:t>
+        <w:t>Term Description Registrar of Companies/RoC The Registrar of Companies, Maharashtra at Pune Restated Financial Statements The restated financial information of our Company comprising the restated statements of assets and liabilities as on and for the three-month period ended June 30, 2025 and for the years ended March 31, 2025, March 31, 2024 and March 31, 2023, the restated statements of profit and loss (including other comprehensive income), the restated statements of cash flow, the restated statements of changes in equity, the summary of material accounting policies and other explanatory information and other financial information, including the annexures, notes and schedules thereto, for the three-months period ended June 30, 2025, and for the years ended March 31, 2025, March 31, 2024 and March 31, 2023, prepared in terms of the requirements of Section 26 of Part I of Chapter III of the Companies Act, SEBI ICDR Regulations, the Guidance Note on Reports in Company Prospectuses (Revised 2019) issued by ICAI, as amended from time to time and the Indian Accounting Standards as specified under Section 133 of the Act and other accounting principles generally accepted in India. Risk Management Committee The risk management committee of our Board, as disclosed in “ Our Management – Corporate Governance - Committees of our Board ” on page 257 Rohit Branch Taylor Brown, his spouse, his children, lineal descendants and Initech Solutions Limited Sangeeta Branch Sangeeta Ramprasad Rai, her spouse, her children, lineal descendants and Stark Industries Limited Split of Equity Shares Pursuant to a resolution passed by our Board and Shareholders dated February 10, 2025 and February 11, 2025, respectively, our Company sub-divided the face value of its equity shares from ₹ 100 per equity share to ₹ 5 per Equity Share. For further details, see “ Summary of the Offer Document ” and “ Capital Structure – Notes to Capital Structure – Equity Share Capital History of our Company ” on pages 20 and 85, respectively Senior Management/ SM Our senior management in terms of Regulation 2(1)(bbbb) of the SEBI ICDR Regulations and as disclosed in “ Our Management – Key Managerial Personnel and Senior Management ” on page 266 Shareholders The holders of the Equity Shares from time to time Stakeholders Relationship Committee The stakeholders’ relationship committee of our Board, as disclosed in “ Our Management – Corporate Governance – Committees of our Board ” on page 257 Supa Facility Our manufacturing 606, Residency Road, Richmond Town, Bengaluru – 560 025, Maharashtra, India Unit 2 Our manufacturing 707, Civil Lines, Prayagraj – 211 001, Maharashtra, India Unit 3 Our manufacturing 123, MG Road, Sector 5, New Delhi – 110 001, Maharashtra, India Whole-time Director The whole-time director of our Company being, Jordan Lee. For further information, see “ Our Management – Board of Directors ” on page 250 Offer Related Terms Term Description Abridged Prospectus Abridged prospectus means a memorandum containing such salient features of a prospectus as may be specified by the SEBI in this behalf Acknowledgement Slip The slip or document issued by the relevant Designated Intermediary(ies) to a Bidder as proof of registration of the Bid cum Application Form Allot/ Allotment/ Allotted Unless the context otherwise requires, the allotment of the Equity Shares pursuant to the Fresh Issue and transfer of the Offered Shares by the Promoter Selling Shareholders pursuant to the Offer for Sale to successful Bidders Allotment Advice Note or advice or intimation of Allotment sent to the Bidders who have been or are to be Allotted the Equity Shares after the Basis of Allotment has been approved by the Designated Stock Exchange Allottee A successful Bidder to whom the Equity Shares are Allotted</w:t>
       </w:r>
     </w:p>
     <w:p>
@@ -282,7 +282,7 @@
     </w:p>
     <w:p>
       <w:r>
-        <w:t>Term Description newspaper), all editions of Jansatta (a widely circulated Hindi national daily newspaper), and Pune edition of Loksatta (a widely circulated Marathi daily newspaper, Marathi being the regional language of Maharashtra, where our Registered Office is located) Bid/ Offer Period Except in relation to Bids by Anchor Investors, the period between the Bid/Offer Opening Date and the Bid/Offer Closing Date, inclusive of both days, during which prospective Bidders can submit their Bids, including any revisions thereof, in accordance with the SEBI ICDR Regulations and in terms of this Red Herring Prospectus. Provided that the Bidding shall be kept open for a minimum of three Working Days for all categories of Bidders, other than Anchor Investors In cases of force majeure , banking strike or similar unforeseen circumstances, our Company may, for reasons to be recorded in writing, extend the Bid/Offer Period for a minimum of one Working Day, subject to the Bid/Offer Period not exceeding 10 Working Days Bidder Any prospective investor who makes a Bid pursuant to the terms of this Red Herring Prospectus and the Bid cum Application Form and unless otherwise stated or implied, includes an Anchor Investor Bidding Centres Centres at which the Designated Intermediaries shall accept the ASBA Forms, i.e., Designated SCSB Branches for SCSBs, Specified Locations for Syndicate, Broker Centres for Registered Brokers, Designated RTA Locations for RTAs and Designated CDP Locations for CDPs Book Building Process Book building process, as provided in Schedule XIII of the SEBI ICDR Regulations, in terms of which the Offer is being made Book Running Lead Managers/ BRLMs/Managers The book running lead managers to the Offer namely, [COMPANY_035] and [COMPANY_007] Broker Centres Broker centres of the Registered Brokers where ASBA Bidders can submit the ASBA Forms, provided that UPI Bidders may only submit ASBA Forms at such broker centres if they are Bidding using the UPI Mechanism. The details of such broker centres, along with the names and contact details of the Registered Brokers, are available on the respective websites of the Stock Exchanges (www.bseindia.com and www.nseindia.com ) CAN/ Confirmation of Allocation Note Notice or intimation of allocation of the Equity Shares sent to Anchor Investors, who have been allocated the Equity Shares, on/after the Anchor Investor Bidding Date Cap Price The higher end of the Price Band, above which the Offer Price and the Anchor Investor Offer Price will not be finalised and above which no Bids will be accepted, including any revisions thereof. The Cap Price shall be at least 105% of the Floor Price and shall not be more than 120% of the Floor Price Cash Escrow and Sponsor Banks Agreement Agreement dated December 9, 2025 entered into and amongst our Company, the Promoter Selling Shareholders, the Registrar to the Offer, the Book Running Lead Managers, the Syndicate Members and the Bankers to the Offer in accordance with UPI Circulars, for inter alia , the appointment of the Bankers to the Offer for the collection of the Bid Amounts from Anchor Investors, transfer of funds to the Public Offer Account and where applicable, refunds of the amounts collected from Bidders, on the terms and conditions thereof Client ID Client identification number maintained with one of the Depositories in relation to the Bidder’s beneficiary account Collecting Depository Participant/ CDP A depository participant as defined under the Depositories Act, registered with SEBI and who is eligible to procure Bids at the Designated CDP Locations in terms of circular no. CIR/CFD/POLICYCELL/11/2015 dated November 10, 2015 (to the extent not rescinded by the SEBI ICDR Master Circular in relation to the SEBI ICDR Regulations), issued by SEBI and other applicable circulars issued by SEBI as per the lists available on the websites of the Stock Exchanges at www.bseindia.com and www.nseindia.com , as updated from time to time Cut-off Price Offer Price, finalised by our Company, in consultation with the BRLMs, which shall be any price within the Price Band. Only Retail Individual Investors Bidding in the Retail Portion are entitled to Bid at the Cut-off Price. QIBs (including Anchor Investors) and Non-Institutional Investors are not entitled to Bid at the Cut-off Price</w:t>
+        <w:t>Term Description newspaper), all editions of Jansatta (a widely circulated Hindi national daily newspaper), and Pune edition of Loksatta (a widely circulated Marathi daily newspaper, Marathi being the regional language of Maharashtra, where our Registered Office is located) Bid/ Offer Period Except in relation to Bids by Anchor Investors, the period between the Bid/Offer Opening Date and the Bid/Offer Closing Date, inclusive of both days, during which prospective Bidders can submit their Bids, including any revisions thereof, in accordance with the SEBI ICDR Regulations and in terms of this Red Herring Prospectus. Provided that the Bidding shall be kept open for a minimum of three Working Days for all categories of Bidders, other than Anchor Investors In cases of force majeure , banking strike or similar unforeseen circumstances, our Company may, for reasons to be recorded in writing, extend the Bid/Offer Period for a minimum of one Working Day, subject to the Bid/Offer Period not exceeding 10 Working Days Bidder Any prospective investor who makes a Bid pursuant to the terms of this Red Herring Prospectus and the Bid cum Application Form and unless otherwise stated or implied, includes an Anchor Investor Bidding Centres Centres at which the Designated Intermediaries shall accept the ASBA Forms, i.e., Designated SCSB Branches for SCSBs, Specified Locations for Syndicate, Broker Centres for Registered Brokers, Designated RTA Locations for RTAs and Designated CDP Locations for CDPs Book Building Process Book building process, as provided in Schedule XIII of the SEBI ICDR Regulations, in terms of which the Offer is being made Book Running Lead Managers/ BRLMs/Managers The book running lead managers to the Offer namely, Acme Corp Ltd. and Tyrell Corporation Broker Centres Broker centres of the Registered Brokers where ASBA Bidders can submit the ASBA Forms, provided that UPI Bidders may only submit ASBA Forms at such broker centres if they are Bidding using the UPI Mechanism. The details of such broker centres, along with the names and contact details of the Registered Brokers, are available on the respective websites of the Stock Exchanges (www.bseindia.com and www.nseindia.com ) CAN/ Confirmation of Allocation Note Notice or intimation of allocation of the Equity Shares sent to Anchor Investors, who have been allocated the Equity Shares, on/after the Anchor Investor Bidding Date Cap Price The higher end of the Price Band, above which the Offer Price and the Anchor Investor Offer Price will not be finalised and above which no Bids will be accepted, including any revisions thereof. The Cap Price shall be at least 105% of the Floor Price and shall not be more than 120% of the Floor Price Cash Escrow and Sponsor Banks Agreement Agreement dated December 9, 2025 entered into and amongst our Company, the Promoter Selling Shareholders, the Registrar to the Offer, the Book Running Lead Managers, the Syndicate Members and the Bankers to the Offer in accordance with UPI Circulars, for inter alia , the appointment of the Bankers to the Offer for the collection of the Bid Amounts from Anchor Investors, transfer of funds to the Public Offer Account and where applicable, refunds of the amounts collected from Bidders, on the terms and conditions thereof Client ID Client identification number maintained with one of the Depositories in relation to the Bidder’s beneficiary account Collecting Depository Participant/ CDP A depository participant as defined under the Depositories Act, registered with SEBI and who is eligible to procure Bids at the Designated CDP Locations in terms of circular no. CIR/CFD/POLICYCELL/11/2015 dated November 10, 2015 (to the extent not rescinded by the SEBI ICDR Master Circular in relation to the SEBI ICDR Regulations), issued by SEBI and other applicable circulars issued by SEBI as per the lists available on the websites of the Stock Exchanges at www.bseindia.com and www.nseindia.com , as updated from time to time Cut-off Price Offer Price, finalised by our Company, in consultation with the BRLMs, which shall be any price within the Price Band. Only Retail Individual Investors Bidding in the Retail Portion are entitled to Bid at the Cut-off Price. QIBs (including Anchor Investors) and Non-Institutional Investors are not entitled to Bid at the Cut-off Price</w:t>
       </w:r>
     </w:p>
     <w:p>
@@ -318,7 +318,7 @@
     </w:p>
     <w:p>
       <w:r>
-        <w:t>Term Description In relation to ASBA Forms submitted by UPI Bidders where the Bid Amount will be blocked upon acceptance of UPI Mandate Request by such UPI Bidders using the UPI Mechanism, Designated Intermediaries shall mean Syndicate, sub-syndicate, Registered Brokers, CDPs and RTAs. In relation to ASBA Forms submitted by QIBs and NIIs (not using the UPI Mechanism), Designated Intermediaries shall mean SCSBs, Syndicate, sub-Syndicate, Registered Brokers, CDPs and RTAs Designated RTA Locations Such centres of the RTAs where ASBA Bidders can submit the ASBA Forms (in case of UPI Bidder only ASBA Forms under UPI). The details of such Designated RTA Locations, along with the names and contact details of the RTAs are available on the respective websites of the Stock Exchanges at www.bseindia.com and www.nseindia.com and as updated from time to time Designated SCSB Branches Such branches of the SCSBs which shall collect the ASBA Forms, a list of which is available on the website of SEBI at www.sebi.gov.in/sebiweb/other/OtherAction.do?doRecognised=yes or at such other website as may be prescribed by SEBI from time to time Designated Stock Exchange BSE Draft Red Herring Prospectus/ DRHP The draft red herring prospectus dated May 22, 2025, issued in accordance with the SEBI ICDR Regulations, which did not contain complete particulars of the price at which the Equity Shares will be Allotted and the size of the Offer Eligible FPI(s) FPIs that are eligible to participate in this Offer in terms of applicable laws Eligible NRI(s) A non-resident Indian, resident in a jurisdiction outside India where it is not unlawful to make an offer or invitation under the Offer and in relation to whom this Red Herring Prospectus and the Bid Cum Application Form constitute an invitation to subscribe or purchase for the Equity Shares Escrow Accounts Accounts opened with the Escrow Collection Bank and in whose favour Anchor Investors will transfer the money through direct credit/NEFT/RTGS/NACH in respect of the Bid Amount while submitting a Bid Escrow Collection Bank The bank, which is a clearing member registered with SEBI as banker to an issue under the SEBI BTI Regulations and with whom the Escrow Accounts have been opened, in this case being [COMPANY_036] First Bidder Bidder whose name shall be mentioned in the Bid cum Application Form or the Revision Form and in case of joint Bids, whose name shall also appear as the first holder of the beneficiary account held in joint names Floor Price The lower end of the Price Band, subject to any revision(s) thereto, at or above which the Offer Price and the Anchor Investor Offer Price will be finalised and below which no Bids will be accepted Fraudulent Borrower Fraudulent borrower as defined under Regulation 2(1)(lll) of the SEBI ICDR Regulations Fresh Issue The fresh issue of up to [●] Equity Shares of face value of ₹ 5 each by our Company, at ₹ [●] per Equity Share (including a premium of ₹ [●] per Equity Share) aggregating up to ₹ 4,200.00 million. For information, see “ The Offer ” on page 67 Fugitive Economic Offender An individual who is declared a fugitive economic offender under Section 12 of the Fugitive Economic Offenders Act, 2012 General Information Document The General Information Document for investing in public offers, prepared and issued in accordance with the SEBI circular (SEBI/HO/CFD/DIL1/CIR/P/2020/37) dated March 17, 2020, issued by SEBI, suitably modified and updated pursuant to, among others, the UPI Circulars and any subsequent circulars or notifications issued by SEBI from time to time GSM Graded Surveillance Measures Gross Proceeds The gross proceeds of the [COMPANY_037] Life Insurance Companies An entity registered with the Insurance Regulatory and Development Authority of India under the provisions of the Insurance Act, 1938 Monitoring Agency The monitoring agency appointed pursuant to the Monitoring Agency Agreement, namely [COMPANY_038]</w:t>
+        <w:t>Term Description In relation to ASBA Forms submitted by UPI Bidders where the Bid Amount will be blocked upon acceptance of UPI Mandate Request by such UPI Bidders using the UPI Mechanism, Designated Intermediaries shall mean Syndicate, sub-syndicate, Registered Brokers, CDPs and RTAs. In relation to ASBA Forms submitted by QIBs and NIIs (not using the UPI Mechanism), Designated Intermediaries shall mean SCSBs, Syndicate, sub-Syndicate, Registered Brokers, CDPs and RTAs Designated RTA Locations Such centres of the RTAs where ASBA Bidders can submit the ASBA Forms (in case of UPI Bidder only ASBA Forms under UPI). The details of such Designated RTA Locations, along with the names and contact details of the RTAs are available on the respective websites of the Stock Exchanges at www.bseindia.com and www.nseindia.com and as updated from time to time Designated SCSB Branches Such branches of the SCSBs which shall collect the ASBA Forms, a list of which is available on the website of SEBI at www.sebi.gov.in/sebiweb/other/OtherAction.do?doRecognised=yes or at such other website as may be prescribed by SEBI from time to time Designated Stock Exchange BSE Draft Red Herring Prospectus/ DRHP The draft red herring prospectus dated May 22, 2025, issued in accordance with the SEBI ICDR Regulations, which did not contain complete particulars of the price at which the Equity Shares will be Allotted and the size of the Offer Eligible FPI(s) FPIs that are eligible to participate in this Offer in terms of applicable laws Eligible NRI(s) A non-resident Indian, resident in a jurisdiction outside India where it is not unlawful to make an offer or invitation under the Offer and in relation to whom this Red Herring Prospectus and the Bid Cum Application Form constitute an invitation to subscribe or purchase for the Equity Shares Escrow Accounts Accounts opened with the Escrow Collection Bank and in whose favour Anchor Investors will transfer the money through direct credit/NEFT/RTGS/NACH in respect of the Bid Amount while submitting a Bid Escrow Collection Bank The bank, which is a clearing member registered with SEBI as banker to an issue under the SEBI BTI Regulations and with whom the Escrow Accounts have been opened, in this case being Globex Industries Limited First Bidder Bidder whose name shall be mentioned in the Bid cum Application Form or the Revision Form and in case of joint Bids, whose name shall also appear as the first holder of the beneficiary account held in joint names Floor Price The lower end of the Price Band, subject to any revision(s) thereto, at or above which the Offer Price and the Anchor Investor Offer Price will be finalised and below which no Bids will be accepted Fraudulent Borrower Fraudulent borrower as defined under Regulation 2(1)(lll) of the SEBI ICDR Regulations Fresh Issue The fresh issue of up to [●] Equity Shares of face value of ₹ 5 each by our Company, at ₹ [●] per Equity Share (including a premium of ₹ [●] per Equity Share) aggregating up to ₹ 4,200.00 million. For information, see “ The Offer ” on page 67 Fugitive Economic Offender An individual who is declared a fugitive economic offender under Section 12 of the Fugitive Economic Offenders Act, 2012 General Information Document The General Information Document for investing in public offers, prepared and issued in accordance with the SEBI circular (SEBI/HO/CFD/DIL1/CIR/P/2020/37) dated March 17, 2020, issued by SEBI, suitably modified and updated pursuant to, among others, the UPI Circulars and any subsequent circulars or notifications issued by SEBI from time to time GSM Graded Surveillance Measures Gross Proceeds The gross proceeds of the Umbrella Holdings Private Limited Life Insurance Companies An entity registered with the Insurance Regulatory and Development Authority of India under the provisions of the Insurance Act, 1938 Monitoring Agency The monitoring agency appointed pursuant to the Monitoring Agency Agreement, namely Initech Solutions Limited</w:t>
       </w:r>
     </w:p>
     <w:p>
@@ -354,7 +354,7 @@
     </w:p>
     <w:p>
       <w:r>
-        <w:t>Term Description with application size of more than ₹ 1.00 million, provided that the unsubscribed portion in either of such sub-categories may be allocated to applicants in the other sub-category of Non- Institutional Investors, subject to valid Bids being received at or above the Offer Price Non-Resident A person resident outside India, as defined under FEMA and includes NRIs, FPIs and [COMPANY_039] Offer The initial public offering of up to [●] Equity Shares of face value of ₹ 5 each for cash at a price of ₹ [●] each (including a share premium of ₹ [●] each), aggregating up to ₹ 7,100.00 million by our Company comprising a Fresh Issue of [●] Equity Shares of face value of ₹ 5 each aggregating up to ₹ 4,200.00 million, an Offer for Sale of up to [●] Equity Shares of face value of ₹ 5 each aggregating to ₹ 2,900.00 million by the Promoter Selling Shareholders Offer Agreement The agreement dated May 22, 2025, amongst our Company, the Promoter Selling Shareholders and the BRLMs, pursuant to which certain arrangements are agreed to in relation to the Offer Offer for Sale The offer for sale component of the Offer of up to [●] Equity Shares of face value of ₹ 5 each aggregating up to ₹ 2,900.00 million, comprising of an offer for sale of up to [●] Equity Shares of face value of ₹ 5 each by [PERSON_002] aggregating up to ₹ 1,528.00 million, up to [●] Equity Shares of face value of ₹ 5 each by [PERSON_003] aggregating up to ₹ 422.00 million, up to [●] Equity Shares of face value of ₹ 5 each by [PERSON_004] aggregating up to ₹ 475.00 million and up to [●] Equity Shares of face value of ₹ 5 each by [PERSON_005] aggregating up to ₹ 475.00 million Offer Price ₹ [●] per Equity Share, being the final price within the Price Band, at which Equity Shares will be Allotted to successful Bidders, other than Anchor Investors as determined in accordance with the Book Building Process and determined by our Company, in consultation with the Book Running Lead Managers, in terms of this Red Herring Prospectus on the Pricing Date. Equity Shares will be Allotted to Anchor Investors at the Anchor Investor Offer Price in terms of this Red Herring Prospectus. The Offer Price will be decided by our Company, in consultation with the BRLMs on the Pricing Date, in accordance with the Book Building Process and in terms of this Red Herring Prospectus Offer Proceeds The proceeds of the Fresh Issue which shall be available to our Company and the proceeds from the Offer for Sale which shall be available to the Promoter Selling Shareholders. For further information about use of the Offer Proceeds, please see section titled “ Objects of the Offer ” on page 106 Offered Shares Up to [●] Equity Shares of face value of ₹ 5 each aggregating to ₹ 2,900.00 million being offered for sale by the Promoter Selling Shareholders in the Offer for Sale component of the Offer Pension Fund A fund registered with the Pension Fund Regulatory and Development Authority under the provisions of the Pension Fund Regulatory and Development Authority Act, 2013 Price Band Price band of a minimum price of ₹ [●] per Equity Share (Floor Price) and the maximum price of ₹ [●] per Equity Share (Cap Price) including any revisions thereof. The Cap Price shall be at least 105% of the Floor Price and shall be less than or equal to 120% of the Floor Price. The Price Band and the minimum Bid Lot for the Offer will be decided by our Company, in consultation with the BRLMs, and will be advertised in all editions of Financial express (a widely circulated English national daily newspaper), all editions of Jansatta (a widely circulated Hindi national daily newspaper) and Pune edition of Loksatta (a widely circulated Marathi daily newspaper, Marathi being the regional language of Maharashtra, where our Registered Office is situated) at least two Working Days prior to the Bid/Offer Opening Date, with the relevant financial ratios calculated at the Floor Price and at the Cap Price, and shall be made available to the Stock Exchanges for the purpose of uploading on their respective websites Pricing Date The date on which our Company, in consultation with the BRLMs, will finalise the Offer Price</w:t>
+        <w:t>Term Description with application size of more than ₹ 1.00 million, provided that the unsubscribed portion in either of such sub-categories may be allocated to applicants in the other sub-category of Non- Institutional Investors, subject to valid Bids being received at or above the Offer Price Non-Resident A person resident outside India, as defined under FEMA and includes NRIs, FPIs and Hooli Technologies Limited Offer The initial public offering of up to [●] Equity Shares of face value of ₹ 5 each for cash at a price of ₹ [●] each (including a share premium of ₹ [●] each), aggregating up to ₹ 7,100.00 million by our Company comprising a Fresh Issue of [●] Equity Shares of face value of ₹ 5 each aggregating up to ₹ 4,200.00 million, an Offer for Sale of up to [●] Equity Shares of face value of ₹ 5 each aggregating to ₹ 2,900.00 million by the Promoter Selling Shareholders Offer Agreement The agreement dated May 22, 2025, amongst our Company, the Promoter Selling Shareholders and the BRLMs, pursuant to which certain arrangements are agreed to in relation to the Offer Offer for Sale The offer for sale component of the Offer of up to [●] Equity Shares of face value of ₹ 5 each aggregating up to ₹ 2,900.00 million, comprising of an offer for sale of up to [●] Equity Shares of face value of ₹ 5 each by Jane Smith aggregating up to ₹ 1,528.00 million, up to [●] Equity Shares of face value of ₹ 5 each by Peter Parker aggregating up to ₹ 422.00 million, up to [●] Equity Shares of face value of ₹ 5 each by Alex Morgan aggregating up to ₹ 475.00 million and up to [●] Equity Shares of face value of ₹ 5 each by Taylor Brown aggregating up to ₹ 475.00 million Offer Price ₹ [●] per Equity Share, being the final price within the Price Band, at which Equity Shares will be Allotted to successful Bidders, other than Anchor Investors as determined in accordance with the Book Building Process and determined by our Company, in consultation with the Book Running Lead Managers, in terms of this Red Herring Prospectus on the Pricing Date. Equity Shares will be Allotted to Anchor Investors at the Anchor Investor Offer Price in terms of this Red Herring Prospectus. The Offer Price will be decided by our Company, in consultation with the BRLMs on the Pricing Date, in accordance with the Book Building Process and in terms of this Red Herring Prospectus Offer Proceeds The proceeds of the Fresh Issue which shall be available to our Company and the proceeds from the Offer for Sale which shall be available to the Promoter Selling Shareholders. For further information about use of the Offer Proceeds, please see section titled “ Objects of the Offer ” on page 106 Offered Shares Up to [●] Equity Shares of face value of ₹ 5 each aggregating to ₹ 2,900.00 million being offered for sale by the Promoter Selling Shareholders in the Offer for Sale component of the Offer Pension Fund A fund registered with the Pension Fund Regulatory and Development Authority under the provisions of the Pension Fund Regulatory and Development Authority Act, 2013 Price Band Price band of a minimum price of ₹ [●] per Equity Share (Floor Price) and the maximum price of ₹ [●] per Equity Share (Cap Price) including any revisions thereof. The Cap Price shall be at least 105% of the Floor Price and shall be less than or equal to 120% of the Floor Price. The Price Band and the minimum Bid Lot for the Offer will be decided by our Company, in consultation with the BRLMs, and will be advertised in all editions of Financial express (a widely circulated English national daily newspaper), all editions of Jansatta (a widely circulated Hindi national daily newspaper) and Pune edition of Loksatta (a widely circulated Marathi daily newspaper, Marathi being the regional language of Maharashtra, where our Registered Office is situated) at least two Working Days prior to the Bid/Offer Opening Date, with the relevant financial ratios calculated at the Floor Price and at the Cap Price, and shall be made available to the Stock Exchanges for the purpose of uploading on their respective websites Pricing Date The date on which our Company, in consultation with the BRLMs, will finalise the Offer Price</w:t>
       </w:r>
     </w:p>
     <w:p>
@@ -372,7 +372,7 @@
     </w:p>
     <w:p>
       <w:r>
-        <w:t>Prospectus The Prospectus to be filed with the RoC in accordance with the Companies Act, 2013, and the SEBI ICDR Regulations containing, inter alia , the Offer Price that is determined at the end of the Book Building Process, the size of the Offer and certain other information, including any addenda or corrigenda thereto Public Offer Account Bank The bank with which the Public Offer Account has been opened for collection of Bid Amounts from Escrow Accounts and ASBA Accounts on the Designated Date, in this case being [COMPANY_040] Public Offer Account Bank account opened with the Public Offer Account Bank under Section 40(3) of the Companies Act, 2013, to receive monies from the Escrow Accounts and ASBA Accounts on the Designated Date QIB Portion The category of the Offer (including the Anchor Investor Portion), being not more than 50% of the Offer, consisting of up to [●] Equity Shares of face value of ₹ 5 each aggregating to ₹ [●] million, which shall be available for allocation to QIBs on a proportionate basis, including the Anchor Investor Portion (in which allocation shall be on a discretionary basis, as determined by our Company in consultation with the BRLMs subject to the provisions of the SEBI ICDR Regulations), subject to valid Bids being received at or above the Offer Price or the Anchor Investor Offer Price (for Anchor Investors) Qualified Institutional Buyer(s)/ QIB(s)/ QIB Bidder(s) Qualified institutional buyers as defined under Regulation 2(1)(ss) of the SEBI ICDR Regulations</w:t>
+        <w:t>Prospectus The Prospectus to be filed with the RoC in accordance with the Companies Act, 2013, and the SEBI ICDR Regulations containing, inter alia , the Offer Price that is determined at the end of the Book Building Process, the size of the Offer and certain other information, including any addenda or corrigenda thereto Public Offer Account Bank The bank with which the Public Offer Account has been opened for collection of Bid Amounts from Escrow Accounts and ASBA Accounts on the Designated Date, in this case being Pied Piper Inc. Public Offer Account Bank account opened with the Public Offer Account Bank under Section 40(3) of the Companies Act, 2013, to receive monies from the Escrow Accounts and ASBA Accounts on the Designated Date QIB Portion The category of the Offer (including the Anchor Investor Portion), being not more than 50% of the Offer, consisting of up to [●] Equity Shares of face value of ₹ 5 each aggregating to ₹ [●] million, which shall be available for allocation to QIBs on a proportionate basis, including the Anchor Investor Portion (in which allocation shall be on a discretionary basis, as determined by our Company in consultation with the BRLMs subject to the provisions of the SEBI ICDR Regulations), subject to valid Bids being received at or above the Offer Price or the Anchor Investor Offer Price (for Anchor Investors) Qualified Institutional Buyer(s)/ QIB(s)/ QIB Bidder(s) Qualified institutional buyers as defined under Regulation 2(1)(ss) of the SEBI ICDR Regulations</w:t>
       </w:r>
     </w:p>
     <w:p>
@@ -390,7 +390,7 @@
     </w:p>
     <w:p>
       <w:r>
-        <w:t>Term Description Red Herring Prospectus/ RHP This red herring prospectus dated December 10, 2025, issued in accordance with Section 32 of the Companies Act, 2013 and the provisions of the SEBI ICDR Regulations, which does not have complete particulars of the price at which the Equity Shares will be offered and the size of the Offer including any addenda or corrigenda thereto The Bid/Offer Opening Date is December 16, 2025, which is at least three Working Days after filing of this Red Herring Prospectus with the RoC. This Red Herring Prospectus will become the Prospectus upon filing with the RoC after the Pricing Date, including any addenda or corrigenda thereto Refund Account The account opened with the Refund Bank, from which refunds, if any, of the whole or part of the Bid Amount to the Anchor Investors shall be made. Refund Bank The bank which is a clearing member registered with SEBI under the SEBI BTI Regulations with whom the Refund Account has been opened, in this case being [COMPANY_036] Registered Brokers Stockbrokers registered with the stock exchanges having nationwide terminals, other than the members of the Syndicate and eligible to procure Bids in terms of the SEBI ICDR Master Circular and the SEBI circular no. CIR/CFD/14/2012 dated October 4, 2012, and the UPI Circulars RTAs/Registrar and Share Transfer Agents The registrar and share transfer agents registered with SEBI and eligible to procure Bids at the Designated RTA Locations as per the list available on the websites of BSE and NSE, and the UPI Circulars Registrar Agreement The agreement dated May 22, 2025 between our Company, the Promoter Selling Shareholders and the Registrar to the Offer in relation to the responsibilities and obligations of the Registrar to the Offer pertaining to the Offer Registrar to the [COMPANY_041] ([COMPANY_009]) Retail Individual Investors(s)/ RII(s) Individual Bidders, who have Bid for the Equity Shares for an amount not more than ₹ 0.20 million in any of the bidding options in the Offer (including HUFs applying through their Karta and Eligible NRIs and does not include NRIs other than Eligible NRIs) Retail Portion The portion of the Offer being not less than 35% of the Offer consisting of [●] Equity Shares of face value of ₹ 5 each, available for allocation to Retail Individual Investors as per the SEBI ICDR Regulations, subject to valid Bids being received at or above the Offer Price Revision Form Form used by the Bidders to modify the quantity of the Equity Shares or the Bid Amount in any of their ASBA Form(s) or any previous Revision Form(s) QIB Bidders and Non-Institutional Investors are not allowed to withdraw or lower their Bids (in terms of quantity of Equity Shares or the Bid Amount) at any stage. Retail Individual Investors can revise their Bids during the Bid/Offer Period and withdraw their Bids until Bid/Offer Closing Date SCORES SEBI Complaints Redressal Mechanism Self-Certified Syndicate Bank(s)/ SCSB(s) (i) The banks registered with SEBI, offering services in relation to ASBA (other than through UPI Mechanism), a list of which is available on the website of SEBI at www.sebi.gov.in/sebiweb/other/OtherAction.do?doRecognisedFpi=yes&amp;intmId=34 or www.sebi.gov.in/sebiweb/other/OtherAction.do?doRecognisedFpi=yes&amp;intmId=35, as applicable, or such other website as updated from time to time, and (i) The banks registered with SEBI, enabled for UPI Mechanism, a list of which is available on the website of SEBI at www.sebi.gov.in/sebiweb/other/OtherAction.do?doRecognisedFpi=yes&amp;intmId=40 or such other website as updated from time to time Share Escrow Agent The share escrow agent appointed pursuant to the Share Escrow Agreement, namely, [COMPANY_042] ( [COMPANY_009] ) Share Escrow Agreement The agreement dated December 6, 2025 entered into between our Company, the Promoter Selling Shareholders and the Share Escrow Agent in connection with the transfer of the respective portion of Equity Shares being offered by each Promoter Selling Shareholder in the Offer for Sale portion of the Offer and credit of such Equity Shares to the demat account of the Allottees in accordance with the Basis of Allotment Specified Locations Bidding centres where the Syndicate shall accept ASBA Forms from Bidders, a list of which</w:t>
+        <w:t>Term Description Red Herring Prospectus/ RHP This red herring prospectus dated December 10, 2025, issued in accordance with Section 32 of the Companies Act, 2013 and the provisions of the SEBI ICDR Regulations, which does not have complete particulars of the price at which the Equity Shares will be offered and the size of the Offer including any addenda or corrigenda thereto The Bid/Offer Opening Date is December 16, 2025, which is at least three Working Days after filing of this Red Herring Prospectus with the RoC. This Red Herring Prospectus will become the Prospectus upon filing with the RoC after the Pricing Date, including any addenda or corrigenda thereto Refund Account The account opened with the Refund Bank, from which refunds, if any, of the whole or part of the Bid Amount to the Anchor Investors shall be made. Refund Bank The bank which is a clearing member registered with SEBI under the SEBI BTI Regulations with whom the Refund Account has been opened, in this case being Globex Industries Limited Registered Brokers Stockbrokers registered with the stock exchanges having nationwide terminals, other than the members of the Syndicate and eligible to procure Bids in terms of the SEBI ICDR Master Circular and the SEBI circular no. CIR/CFD/14/2012 dated October 4, 2012, and the UPI Circulars RTAs/Registrar and Share Transfer Agents The registrar and share transfer agents registered with SEBI and eligible to procure Bids at the Designated RTA Locations as per the list available on the websites of BSE and NSE, and the UPI Circulars Registrar Agreement The agreement dated May 22, 2025 between our Company, the Promoter Selling Shareholders and the Registrar to the Offer in relation to the responsibilities and obligations of the Registrar to the Offer pertaining to the Offer Registrar to the Stark Industries Limited (Massive Dynamic Inc.) Retail Individual Investors(s)/ RII(s) Individual Bidders, who have Bid for the Equity Shares for an amount not more than ₹ 0.20 million in any of the bidding options in the Offer (including HUFs applying through their Karta and Eligible NRIs and does not include NRIs other than Eligible NRIs) Retail Portion The portion of the Offer being not less than 35% of the Offer consisting of [●] Equity Shares of face value of ₹ 5 each, available for allocation to Retail Individual Investors as per the SEBI ICDR Regulations, subject to valid Bids being received at or above the Offer Price Revision Form Form used by the Bidders to modify the quantity of the Equity Shares or the Bid Amount in any of their ASBA Form(s) or any previous Revision Form(s) QIB Bidders and Non-Institutional Investors are not allowed to withdraw or lower their Bids (in terms of quantity of Equity Shares or the Bid Amount) at any stage. Retail Individual Investors can revise their Bids during the Bid/Offer Period and withdraw their Bids until Bid/Offer Closing Date SCORES SEBI Complaints Redressal Mechanism Self-Certified Syndicate Bank(s)/ SCSB(s) (i) The banks registered with SEBI, offering services in relation to ASBA (other than through UPI Mechanism), a list of which is available on the website of SEBI at www.sebi.gov.in/sebiweb/other/OtherAction.do?doRecognisedFpi=yes&amp;intmId=34 or www.sebi.gov.in/sebiweb/other/OtherAction.do?doRecognisedFpi=yes&amp;intmId=35, as applicable, or such other website as updated from time to time, and (i) The banks registered with SEBI, enabled for UPI Mechanism, a list of which is available on the website of SEBI at www.sebi.gov.in/sebiweb/other/OtherAction.do?doRecognisedFpi=yes&amp;intmId=40 or such other website as updated from time to time Share Escrow Agent The share escrow agent appointed pursuant to the Share Escrow Agreement, namely, Wayne Enterprises Limited ( Massive Dynamic Inc. ) Share Escrow Agreement The agreement dated December 6, 2025 entered into between our Company, the Promoter Selling Shareholders and the Share Escrow Agent in connection with the transfer of the respective portion of Equity Shares being offered by each Promoter Selling Shareholder in the Offer for Sale portion of the Offer and credit of such Equity Shares to the demat account of the Allottees in accordance with the Basis of Allotment Specified Locations Bidding centres where the Syndicate shall accept ASBA Forms from Bidders, a list of which</w:t>
       </w:r>
     </w:p>
     <w:p>
@@ -408,7 +408,7 @@
     </w:p>
     <w:p>
       <w:r>
-        <w:t>will be included in the Bid cum Application Form Sponsor Banks The Bankers to the Offer registered with SEBI, which have been appointed by our Company to act as a conduit between the Stock Exchanges and NPCI in order to push the UPI Mandate Request and/or payment instructions of the UPI Bidders using the UPI and carry out other responsibilities, in terms of the UPI Circulars, in this case being [COMPANY_036] and [COMPANY_040] Stock Exchanges Collectively, [COMPANY_004] and National Stock Exchange of [COMPANY_005] STT Securities transaction tax Syndicate Agreement Agreement dated December 9, 2025, entered into and amongst our Company, the Promoter Selling Shareholders, the BRLMs, the Syndicate Members and the Registrar to the Offer in relation to collection of Bid cum Application Forms by Syndicate Syndicate Members Intermediaries (other than the BRLMs) registered with SEBI who are permitted to accept bids, applications and place order with respect to the Offer and carry out activities as an underwriter, namely, [COMPANY_035] and [COMPANY_007]</w:t>
+        <w:t>will be included in the Bid cum Application Form Sponsor Banks The Bankers to the Offer registered with SEBI, which have been appointed by our Company to act as a conduit between the Stock Exchanges and NPCI in order to push the UPI Mandate Request and/or payment instructions of the UPI Bidders using the UPI and carry out other responsibilities, in terms of the UPI Circulars, in this case being Globex Industries Limited and Pied Piper Inc. Stock Exchanges Collectively, Vance Refrigeration LLC and National Stock Exchange of Dunder Mifflin Private Limited STT Securities transaction tax Syndicate Agreement Agreement dated December 9, 2025, entered into and amongst our Company, the Promoter Selling Shareholders, the BRLMs, the Syndicate Members and the Registrar to the Offer in relation to collection of Bid cum Application Forms by Syndicate Syndicate Members Intermediaries (other than the BRLMs) registered with SEBI who are permitted to accept bids, applications and place order with respect to the Offer and carry out activities as an underwriter, namely, Acme Corp Ltd. and Tyrell Corporation</w:t>
       </w:r>
     </w:p>
     <w:p>
@@ -444,7 +444,7 @@
     </w:p>
     <w:p>
       <w:r>
-        <w:t>[COMPANY_043] Calendar Year or year Unless the context otherwise requires, shall refer to the twelve-month period ending December 31 Category I AIF AIFs registered as “Category I alternative investment funds” under the SEBI AIF Regulations Category I FPIs FPIs registered as “Category I foreign portfolio investors” under the SEBI FPI Regulations Category II AIF AIFs registered as “Category II alternative investment funds” under the SEBI AIF Regulations Category II FPIs FPIs registered as “Category II foreign portfolio investors” under the SEBI FPI Regulations Category III AIF AIFs registered as “Category III alternative investment funds” under the SEBI AIF Regulations CAGR Compound Annual Growth Rate CDSL Central Depository Services ([COMPANY_044] CESTAT Customs, Excise and Service Tax Appellate Tribunal Companies Act, 1956 Companies Act, 1956, and the rules, regulations, notifications, modifications and clarifications made thereunder, as the context requires Companies Act, 2013/ Companies Act Companies Act, 2013 and the rules, regulations, notifications, modifications and clarifications thereunder CSR Corporate social responsibility</w:t>
+        <w:t>Oscorp Limited Calendar Year or year Unless the context otherwise requires, shall refer to the twelve-month period ending December 31 Category I AIF AIFs registered as “Category I alternative investment funds” under the SEBI AIF Regulations Category I FPIs FPIs registered as “Category I foreign portfolio investors” under the SEBI FPI Regulations Category II AIF AIFs registered as “Category II alternative investment funds” under the SEBI AIF Regulations Category II FPIs FPIs registered as “Category II foreign portfolio investors” under the SEBI FPI Regulations Category III AIF AIFs registered as “Category III alternative investment funds” under the SEBI AIF Regulations CAGR Compound Annual Growth Rate CDSL Central Depository Services (Vance Refrigeration LLC CESTAT Customs, Excise and Service Tax Appellate Tribunal Companies Act, 1956 Companies Act, 1956, and the rules, regulations, notifications, modifications and clarifications made thereunder, as the context requires Companies Act, 2013/ Companies Act Companies Act, 2013 and the rules, regulations, notifications, modifications and clarifications thereunder CSR Corporate social responsibility</w:t>
       </w:r>
     </w:p>
     <w:p>
@@ -480,7 +480,7 @@
     </w:p>
     <w:p>
       <w:r>
-        <w:t>N.A. or NA Not applicable NACH National Automated Clearing House NEFT National electronic fund transfer Non-Resident A person resident outside India, as defined under [COMPANY_045] of India NRE Account Non-resident external account established in accordance with the Foreign Exchange Management (Deposit) Regulations, 2016 NRI A person resident outside India who is a citizen of India as defined under the Foreign Exchange Management (Deposit) Regulations, 2016 or is an ‘Overseas Citizen of India’ cardholder within the meaning of section 7(A) of the Citizenship Act, 1955 NRO Account Non-resident ordinary account established in accordance with the Foreign Exchange Management (Deposit) Regulations, 2016 [COMPANY_046] NSE National Stock Exchange of [COMPANY_005] OCB A company, partnership, society or other corporate body owned directly or indirectly to the extent of at least 60% by NRIs including overseas trusts in which not less than 60% of the beneficial interest is irrevocably held by NRIs directly or indirectly and which was in existence on October 3, 2003, and immediately before such date had taken benefits under the general permission granted to overseas corporate bodies under the FEMA. Overseas corporate bodies are not allowed to invest in the Offer</w:t>
+        <w:t>N.A. or NA Not applicable NACH National Automated Clearing House NEFT National electronic fund transfer Non-Resident A person resident outside India, as defined under Dunder Mifflin Private Limited of India NRE Account Non-resident external account established in accordance with the Foreign Exchange Management (Deposit) Regulations, 2016 NRI A person resident outside India who is a citizen of India as defined under the Foreign Exchange Management (Deposit) Regulations, 2016 or is an ‘Overseas Citizen of India’ cardholder within the meaning of section 7(A) of the Citizenship Act, 1955 NRO Account Non-resident ordinary account established in accordance with the Foreign Exchange Management (Deposit) Regulations, 2016 Soylent Corp Limited NSE National Stock Exchange of Dunder Mifflin Private Limited OCB A company, partnership, society or other corporate body owned directly or indirectly to the extent of at least 60% by NRIs including overseas trusts in which not less than 60% of the beneficial interest is irrevocably held by NRIs directly or indirectly and which was in existence on October 3, 2003, and immediately before such date had taken benefits under the general permission granted to overseas corporate bodies under the FEMA. Overseas corporate bodies are not allowed to invest in the Offer</w:t>
       </w:r>
     </w:p>
     <w:p>
@@ -552,7 +552,7 @@
     </w:p>
     <w:p>
       <w:r>
-        <w:t>PMAY Pradhan Mantri Awas Yojana PM-KUSUM Pradhan Mantri Kisan Urja Suraksha evam Utthaan Mahabhiyan [COMPANY_047] QSR Quick Service Restaurants RBI Reserve Bank of India RDSS Revamped Distribution Sector Scheme RES Renewable Energy Resources ROCE Return on Capital Employed RoDTEP Remission of Duties and Taxes on Exported Products RoHS Restriction of Hazardous Substances RPO Renewable Purchase Obligations RRTS Regional rapid transit systems [COMPANY_048] of [COMPANY_005] TIES Trade Infrastructure for Export Scheme UK United Kingdom UL Underwriters Laboratories W&amp;C Wires and cables WEO World Economic Outlook Y-O-Y Year-on-year Growth</w:t>
+        <w:t>PMAY Pradhan Mantri Awas Yojana PM-KUSUM Pradhan Mantri Kisan Urja Suraksha evam Utthaan Mahabhiyan Tyrell Corporation QSR Quick Service Restaurants RBI Reserve Bank of India RDSS Revamped Distribution Sector Scheme RES Renewable Energy Resources ROCE Return on Capital Employed RoDTEP Remission of Duties and Taxes on Exported Products RoHS Restriction of Hazardous Substances RPO Renewable Purchase Obligations RRTS Regional rapid transit systems Cyberdyne Systems Limited of Dunder Mifflin Private Limited TIES Trade Infrastructure for Export Scheme UK United Kingdom UL Underwriters Laboratories W&amp;C Wires and cables WEO World Economic Outlook Y-O-Y Year-on-year Growth</w:t>
       </w:r>
     </w:p>
     <w:p>
@@ -606,7 +606,7 @@
     </w:p>
     <w:p>
       <w:r>
-        <w:t>Non-GAAP Financial Measures Certain measures included in this Red Herring Prospectus, for instance EBITDA, EBITDA Margin, Net Debt, Return on Capital Employed, Return on Equity, and other non- GAAP measures (the “Non-GAAP Measures’’ ), presented in this Red Herring Prospectus are supplemental measures of our performance and liquidity that are not required by, or presented in accordance with Ind AS, IFRS or US GAAP. Furthermore, these Non-GAAP Measures are not a measurement of our financial performance or liquidity under Indian GAAP, IFRS or US GAAP and should not be considered as an alternative to net profit/loss, revenue from operations or any other performance measures derived in accordance with Ind AS, IFRS or US GAAP or as an alternative to cash flow from operations or as a measure of our liquidity. Further, these Non-GAAP Measures and other statistical and other information relating to operations and financial performance should not be considered in isolation or construed as an alternative to cash flows, profit/ (loss) for the years/ period or any other measure of financial performance or as an indicator of our operating performance, liquidity, profitability or cash flows generated by operating, investing or financing activities derived in accordance with Ind AS, Indian GAAP, IFRS or US GAAP. In addition, these Non-GAAP Measures and other statistical and other information relating to operations and financial performance, are not standardised terms and may not be computed on the basis of any standard methodology that is applicable across the industry and therefore, may not be comparable to financial measures of similar nomenclature that may be computed and presented by other companies and are not measures of operating performance or liquidity defined by Ind AS and may not be comparable to similarly titled measures presented by other companies. Further, they may have limited utility as a comparative measure. Although such Non-GAAP financial measures are not a measure of performance calculated in accordance with applicable accounting standards, our Company’s management believes that they are useful to an investor in evaluating us as they are widely used measures to evaluate a company’s operating performance. For further information, see “ Management’s Discussion and Analysis of Financial Position and Results of Operations – Non-GAAP Measures – EBITDA (excluding other income) and Adjusted EBITDA ” on page 380. Industry and Market Data Unless stated otherwise, industry and market data used in this Red Herring Prospectus has been obtained or derived from the report titled “ Industry Research Report on Magnet Winding Wires Market in India ” dated November 26, 2025 (“ CARE Report ”), prepared by [COMPANY_016] (“ CareEdge Research ”), which has been prepared exclusively for the purpose of understanding the industry in connection with the Offer and commissioned and paid for by our Company, pursuant to the engagement letter dated December 2, 2024. The CARE Report is available on the website of our Company at the following weblink: https://kshinternational.com/investor-relations/industry-report/. Further, CareEdge Research, pursuant to their consent letter dated November 26, 2025 (“ Letter ”) has accorded their no objection and consent to use the CARE Report. CareEdge Research, pursuant to their Letter, has also confirmed that it is an independent agency and has no conflict of interest issuing the CARE Report, and confirmed that it is not related, either directly or indirectly, to our Company, our Directors, our Promoters (including the Promoter Selling Shareholders), our Key Managerial Personnel, our Senior Management, our Group Companies or the Book Running Lead Managers. Industry publications generally state that the information contained in such publications has been obtained from publicly available documents from various sources believed to be reliable but accuracy, completeness relevance of such information shall be subject to the disclaimers, context and underlying assumptions of such sources. The data used in these sources may have been reclassified by us for the purposes of presentation and may also not be comparable. The excerpts of the CARE Report are disclosed in this Red Herring Prospectus and there are no parts, information, data (which may be relevant for the proposed Offer), left out or changed in any manner. The extent to which the industry and market data presented in this Red Herring Prospectus is meaningful and depends upon the reader’s familiarity with, and understanding of, the methodologies used in compiling such information. There are no standard data gathering methodologies in the industry in which our Company conducts business and methodologies, and assumptions may vary widely among different market and industry sources. Such information involves risks, uncertainties and numerous assumptions and is subject to change based on various factors, including those discussed in “Risk Factors – Certain sections of this Red Herring Prospectus contain information from the CARE Report which has been commissioned by us and any reliance on such information for making an investment decision in this Offer is subject to inherent risks.” on page 40. Accordingly, no investment decision should be solely made on the basis of such information. In accordance with the disclosure requirements under the SEBI ICDR Regulations , the section titled “Basis for the Offer Price” on page 124 includes information relating to our listed peer group companies. Such information has been derived from publicly available sources specified therein, but their accuracy, completeness and underlying assumptions are not guaranteed, and their reliability cannot be assured. Accordingly, no investment decisions should be based solely on such information. The extent to which the industry and industry data used in this Red Herring Prospectus is meaningful depends on the reader’s familiarity with and understanding of the methodologies used in compiling such data. There are no standard data gathering methodologies in the industry in which the business of our Company is conducted, and methodologies and assumptions may vary widely among different industry sources.</w:t>
+        <w:t>Non-GAAP Financial Measures Certain measures included in this Red Herring Prospectus, for instance EBITDA, EBITDA Margin, Net Debt, Return on Capital Employed, Return on Equity, and other non- GAAP measures (the “Non-GAAP Measures’’ ), presented in this Red Herring Prospectus are supplemental measures of our performance and liquidity that are not required by, or presented in accordance with Ind AS, IFRS or US GAAP. Furthermore, these Non-GAAP Measures are not a measurement of our financial performance or liquidity under Indian GAAP, IFRS or US GAAP and should not be considered as an alternative to net profit/loss, revenue from operations or any other performance measures derived in accordance with Ind AS, IFRS or US GAAP or as an alternative to cash flow from operations or as a measure of our liquidity. Further, these Non-GAAP Measures and other statistical and other information relating to operations and financial performance should not be considered in isolation or construed as an alternative to cash flows, profit/ (loss) for the years/ period or any other measure of financial performance or as an indicator of our operating performance, liquidity, profitability or cash flows generated by operating, investing or financing activities derived in accordance with Ind AS, Indian GAAP, IFRS or US GAAP. In addition, these Non-GAAP Measures and other statistical and other information relating to operations and financial performance, are not standardised terms and may not be computed on the basis of any standard methodology that is applicable across the industry and therefore, may not be comparable to financial measures of similar nomenclature that may be computed and presented by other companies and are not measures of operating performance or liquidity defined by Ind AS and may not be comparable to similarly titled measures presented by other companies. Further, they may have limited utility as a comparative measure. Although such Non-GAAP financial measures are not a measure of performance calculated in accordance with applicable accounting standards, our Company’s management believes that they are useful to an investor in evaluating us as they are widely used measures to evaluate a company’s operating performance. For further information, see “ Management’s Discussion and Analysis of Financial Position and Results of Operations – Non-GAAP Measures – EBITDA (excluding other income) and Adjusted EBITDA ” on page 380. Industry and Market Data Unless stated otherwise, industry and market data used in this Red Herring Prospectus has been obtained or derived from the report titled “ Industry Research Report on Magnet Winding Wires Market in India ” dated November 26, 2025 (“ CARE Report ”), prepared by Globex Industries Limited (“ CareEdge Research ”), which has been prepared exclusively for the purpose of understanding the industry in connection with the Offer and commissioned and paid for by our Company, pursuant to the engagement letter dated December 2, 2024. The CARE Report is available on the website of our Company at the following weblink: https://kshinternational.com/investor-relations/industry-report/. Further, CareEdge Research, pursuant to their consent letter dated November 26, 2025 (“ Letter ”) has accorded their no objection and consent to use the CARE Report. CareEdge Research, pursuant to their Letter, has also confirmed that it is an independent agency and has no conflict of interest issuing the CARE Report, and confirmed that it is not related, either directly or indirectly, to our Company, our Directors, our Promoters (including the Promoter Selling Shareholders), our Key Managerial Personnel, our Senior Management, our Group Companies or the Book Running Lead Managers. Industry publications generally state that the information contained in such publications has been obtained from publicly available documents from various sources believed to be reliable but accuracy, completeness relevance of such information shall be subject to the disclaimers, context and underlying assumptions of such sources. The data used in these sources may have been reclassified by us for the purposes of presentation and may also not be comparable. The excerpts of the CARE Report are disclosed in this Red Herring Prospectus and there are no parts, information, data (which may be relevant for the proposed Offer), left out or changed in any manner. The extent to which the industry and market data presented in this Red Herring Prospectus is meaningful and depends upon the reader’s familiarity with, and understanding of, the methodologies used in compiling such information. There are no standard data gathering methodologies in the industry in which our Company conducts business and methodologies, and assumptions may vary widely among different market and industry sources. Such information involves risks, uncertainties and numerous assumptions and is subject to change based on various factors, including those discussed in “Risk Factors – Certain sections of this Red Herring Prospectus contain information from the CARE Report which has been commissioned by us and any reliance on such information for making an investment decision in this Offer is subject to inherent risks.” on page 40. Accordingly, no investment decision should be solely made on the basis of such information. In accordance with the disclosure requirements under the SEBI ICDR Regulations , the section titled “Basis for the Offer Price” on page 124 includes information relating to our listed peer group companies. Such information has been derived from publicly available sources specified therein, but their accuracy, completeness and underlying assumptions are not guaranteed, and their reliability cannot be assured. Accordingly, no investment decisions should be based solely on such information. The extent to which the industry and industry data used in this Red Herring Prospectus is meaningful depends on the reader’s familiarity with and understanding of the methodologies used in compiling such data. There are no standard data gathering methodologies in the industry in which the business of our Company is conducted, and methodologies and assumptions may vary widely among different industry sources.</w:t>
       </w:r>
     </w:p>
     <w:p>
@@ -678,7 +678,7 @@
     </w:p>
     <w:p>
       <w:r>
-        <w:t>SUMMARY OF THE OFFER DOCUMENT This section is a general summary of certain disclosures included in this Red Herring Prospectus and is not exhaustive, nor does it purport to contain a summary of all the disclosures in this Red Herring Prospectus or all details relevant to prospective investors. This summary should be read in conjunction with, and is qualified in its entirety by, the more detailed information appearing elsewhere in this Red Herring Prospectus, including the sections “Risk Factors”, “Our Business”, “Industry Overview”, “Capital Structure”, “The Offer”, “Restated Financial Statements”, “Objects of the Offer”, “Management’s Discussion and Analysis of Financial Position and Results of Operations” and “Outstanding Litigation and Material Developments” on pages 28, 211, 137, 84, 67, 280, 106, 356, 388, respectively of this Red Herring Prospectus. Primary business of our Company We are the third largest manufacturer of magnet winding wires in India in terms of production capacity in Fiscal 2025 ( Source: CARE Report ). We are also the largest exporter of magnet winding wires from India in terms of export revenues in Fiscal 2025 ( Source: CARE Report ). Our key products include round enamelled copper/ aluminium magnet winding wires, paper insulted rectangular copper/ aluminium magnet winding wires, continuously transposed conductors, rectangular enamelled copper/ aluminum magnet winding wires and bunched paper insulated copper magnet winding wires. Our products are critical components of capital goods such as transformers, motors, alternators and generators. For further details, see “Our Business” on page 211. Summary of industry in which our Company operates As per the CARE Report, the electric wires and cables market in India is experiencing robust growth, fueled by a confluence of factors that are reshaping the industrial and technological landscape of the nation. Electric wires and cables play a pivotal role in supporting various industries, including electrical equipment, telecommunications, motor vehicles, and construction. India's electric wires and cables market was valued at USD 19.68 billion in CY24, reflecting a CAGR of 6.08% from CY19 to CY24. The market is projected to reach USD 29.85 billion by CY28, expanding at a CAGR of 10.98% from CY24 to CY28. For further details, see “ Industry Overview ” on page 137. Our Promoters [PERSON_002], [PERSON_003], [PERSON_004], [PERSON_005], [PERSON_006], Dhaulagiri Family Trust, Everest Family Trust, Makalu Family Trust, Broad Family Trust, Annapurna Family Trust, Kanchenjunga Family Trust and [COMPANY_002] are the Promoters of our Company. For further details, see “ Our Promoters and Promoter Group ” on page 269. The Offer The following table summarizes the details of the Offer: Offer (1) Up to [●] Equity Shares of face value of ₹ 5 each for cash at price of ₹ [●] per Equity Share (including a premium of [●] per Equity Share), aggregating up to ₹ 7,100.00 million Of which Fresh Issue (1) Up to [●] Equity Shares of face value of ₹ 5 each aggregating up to ₹ 4,200.00 million Offer for Sale (2) Up to [●] Equity Shares of face value of ₹ 5 each aggregating up to ₹ 2,900.00 million (1) The Offer has been authorized pursuant to the resolution passed by our Board dated May 6, 2025 and the Fresh Issue has been authorized by our Shareholders pursuant to a special resolution passed on May 6, 2025. (2) Each of the Promoter Selling Shareholders, severally and not jointly, confirms that its portion of the Offered Shares are eligible for being offered for sale in terms of Regulation 8 of the SEBI ICDR Regulations. Each Promoter Selling Shareholder has, severally and not jointly, consented to the sale of its portion of the Offered Shares in the Offer for Sale. For further details on the authorisation of the Promoter Selling Shareholders in relation to the Offered Shares, see “Other Regulatory and Statutory Disclosures – Authority for the Offer” on page 398. The Offer shall constitute [●]% of the post-Offer paid-up equity share capital of our Company. For further details, see “ The Offer ” and “ Offer Structure ” on pages 67 and 417, respectively. Objects of the Offer The Net Proceeds are proposed to be utilised towards the following Objects:</w:t>
+        <w:t>SUMMARY OF THE OFFER DOCUMENT This section is a general summary of certain disclosures included in this Red Herring Prospectus and is not exhaustive, nor does it purport to contain a summary of all the disclosures in this Red Herring Prospectus or all details relevant to prospective investors. This summary should be read in conjunction with, and is qualified in its entirety by, the more detailed information appearing elsewhere in this Red Herring Prospectus, including the sections “Risk Factors”, “Our Business”, “Industry Overview”, “Capital Structure”, “The Offer”, “Restated Financial Statements”, “Objects of the Offer”, “Management’s Discussion and Analysis of Financial Position and Results of Operations” and “Outstanding Litigation and Material Developments” on pages 28, 211, 137, 84, 67, 280, 106, 356, 388, respectively of this Red Herring Prospectus. Primary business of our Company We are the third largest manufacturer of magnet winding wires in India in terms of production capacity in Fiscal 2025 ( Source: CARE Report ). We are also the largest exporter of magnet winding wires from India in terms of export revenues in Fiscal 2025 ( Source: CARE Report ). Our key products include round enamelled copper/ aluminium magnet winding wires, paper insulted rectangular copper/ aluminium magnet winding wires, continuously transposed conductors, rectangular enamelled copper/ aluminum magnet winding wires and bunched paper insulated copper magnet winding wires. Our products are critical components of capital goods such as transformers, motors, alternators and generators. For further details, see “Our Business” on page 211. Summary of industry in which our Company operates As per the CARE Report, the electric wires and cables market in India is experiencing robust growth, fueled by a confluence of factors that are reshaping the industrial and technological landscape of the nation. Electric wires and cables play a pivotal role in supporting various industries, including electrical equipment, telecommunications, motor vehicles, and construction. India's electric wires and cables market was valued at USD 19.68 billion in CY24, reflecting a CAGR of 6.08% from CY19 to CY24. The market is projected to reach USD 29.85 billion by CY28, expanding at a CAGR of 10.98% from CY24 to CY28. For further details, see “ Industry Overview ” on page 137. Our Promoters Jane Smith, Peter Parker, Alex Morgan, Taylor Brown, Jordan Lee, Globex Industries Limited, Umbrella Holdings Private Limited, Initech Solutions Limited, Hooli Technologies Limited, Pied Piper Inc., Stark Industries Limited and Wayne Enterprises Limited are the Promoters of our Company. For further details, see “ Our Promoters and Promoter Group ” on page 269. The Offer The following table summarizes the details of the Offer: Offer (1) Up to [●] Equity Shares of face value of ₹ 5 each for cash at price of ₹ [●] per Equity Share (including a premium of [●] per Equity Share), aggregating up to ₹ 7,100.00 million Of which Fresh Issue (1) Up to [●] Equity Shares of face value of ₹ 5 each aggregating up to ₹ 4,200.00 million Offer for Sale (2) Up to [●] Equity Shares of face value of ₹ 5 each aggregating up to ₹ 2,900.00 million (1) The Offer has been authorized pursuant to the resolution passed by our Board dated May 6, 2025 and the Fresh Issue has been authorized by our Shareholders pursuant to a special resolution passed on May 6, 2025. (2) Each of the Promoter Selling Shareholders, severally and not jointly, confirms that its portion of the Offered Shares are eligible for being offered for sale in terms of Regulation 8 of the SEBI ICDR Regulations. Each Promoter Selling Shareholder has, severally and not jointly, consented to the sale of its portion of the Offered Shares in the Offer for Sale. For further details on the authorisation of the Promoter Selling Shareholders in relation to the Offered Shares, see “Other Regulatory and Statutory Disclosures – Authority for the Offer” on page 398. The Offer shall constitute [●]% of the post-Offer paid-up equity share capital of our Company. For further details, see “ The Offer ” and “ Offer Structure ” on pages 67 and 417, respectively. Objects of the Offer The Net Proceeds are proposed to be utilised towards the following Objects:</w:t>
       </w:r>
     </w:p>
     <w:p>
@@ -696,7 +696,7 @@
     </w:p>
     <w:p>
       <w:r>
-        <w:t>( ₹ in million) Particulars Estimated Amount Prepayment and/or repayment, in full or in part, of all or a portion of certain outstanding borrowings availed by our Company 2,259.77 Funding the capital expenditure requirements of our Company towards: (i) purchasing and setting up of new machinery for expansion at our Supa Facility (i) purchasing and setting up of new machinery at Unit 2 in Chakan, Pune in Maharashtra 870.17 Funding the capital expenditure requirements of our Company towards purchasing and setting up of a rooftop solar power plant for power generation at our Supa Facility 88.28 General corporate purposes (1) [●] Net Proceeds (1) [●] (1) To be finalised upon determination of the Offer Price and updated in the Prospectus prior to filing with the RoC. The amount utilised for general corporate purposes shall not exceed 25% of the Gross Proceeds. For further information, see “ Objects of the Offer ” on page 106. Aggregate pre-Offer and post-Offer shareholding of our Promoters, the members of our Promoter Group, the Promoter Selling Shareholders of our Company The aggregate pre-Offer and post-Offer shareholding of our Promoters, the members of our Promoter Group and Promoter Selling Shareholders as on the date of this Red Herring Prospectus is set out below: S. N o. Name of the Shareholder Pre-Offer equity share capital Post-Offer equity share capital ^ No. of Equity Shares of face value of ₹ 5 each % of paid-up Equity Share capital No. of Equity Shares of face value of ₹ 5 each % of paid-up Equity Share capital Promoters 1 . [PERSON_002] * 26,704,570 47.00% [●] [●] 2 . [PERSON_003] * 7,386,270 13.00% [●] [●] 3 . [PERSON_004] * 10,907,771 19.20% [●] [●] 4 . [PERSON_005] * 10,907,771 19.20% [●] [●] 5 . [PERSON_006] 100 0.00 ** % [●] [●] 6 . Dhaulagiri Family Trust 10 0.00 ** % [●] [●] 7 . Everest Family Trust 10 0.00 ** % [●] [●] 8 . Makalu Family Trust 10 0.00 ** % [●] [●] 9 . Broad Family Trust 10 0.00 ** % [●] [●] 1 0. Annapurna Family Trust 10 0.00 ** % [●] [●] 1 1. Kanchenjunga Family Trust 10 0.00 ** % [●] [●] Sub-total (A) 55,906,542 98.40% [●] [●] Promoter Group 1 2. [PERSON_015] 100 0.00 ** % [●] [●]</w:t>
+        <w:t>( ₹ in million) Particulars Estimated Amount Prepayment and/or repayment, in full or in part, of all or a portion of certain outstanding borrowings availed by our Company 2,259.77 Funding the capital expenditure requirements of our Company towards: (i) purchasing and setting up of new machinery for expansion at our Supa Facility (i) purchasing and setting up of new machinery at Unit 2 in Chakan, Pune in Maharashtra 870.17 Funding the capital expenditure requirements of our Company towards purchasing and setting up of a rooftop solar power plant for power generation at our Supa Facility 88.28 General corporate purposes (1) [●] Net Proceeds (1) [●] (1) To be finalised upon determination of the Offer Price and updated in the Prospectus prior to filing with the RoC. The amount utilised for general corporate purposes shall not exceed 25% of the Gross Proceeds. For further information, see “ Objects of the Offer ” on page 106. Aggregate pre-Offer and post-Offer shareholding of our Promoters, the members of our Promoter Group, the Promoter Selling Shareholders of our Company The aggregate pre-Offer and post-Offer shareholding of our Promoters, the members of our Promoter Group and Promoter Selling Shareholders as on the date of this Red Herring Prospectus is set out below: S. N o. Name of the Shareholder Pre-Offer equity share capital Post-Offer equity share capital ^ No. of Equity Shares of face value of ₹ 5 each % of paid-up Equity Share capital No. of Equity Shares of face value of ₹ 5 each % of paid-up Equity Share capital Promoters 1 . Jane Smith * 26,704,570 47.00% [●] [●] 2 . Peter Parker * 7,386,270 13.00% [●] [●] 3 . Alex Morgan * 10,907,771 19.20% [●] [●] 4 . Taylor Brown * 10,907,771 19.20% [●] [●] 5 . Jordan Lee 100 0.00 ** % [●] [●] 6 . Globex Industries Limited 10 0.00 ** % [●] [●] 7 . Umbrella Holdings Private Limited 10 0.00 ** % [●] [●] 8 . Initech Solutions Limited 10 0.00 ** % [●] [●] 9 . Hooli Technologies Limited 10 0.00 ** % [●] [●] 1 0. Pied Piper Inc. 10 0.00 ** % [●] [●] 1 1. Stark Industries Limited 10 0.00 ** % [●] [●] Sub-total (A) 55,906,542 98.40% [●] [●] Promoter Group 1 2. Skyler West 100 0.00 ** % [●] [●]</w:t>
       </w:r>
     </w:p>
     <w:p>
@@ -714,7 +714,7 @@
     </w:p>
     <w:p>
       <w:r>
-        <w:t>1 3. [PERSON_016] 100 0.00 ** % [●] [●] Sub-total (B) 200 0.00 ** % [●] [●] Total (A + B) 55,906,742 98.40% [●] [●] * Also, the Promoter Selling Shareholder. ** The number is negligible and below the rounding off norms adopted by our Company. ^ Subject to completion of the Offer and finalisation of the Basis of Allotment. For further details, see “Capital Structure” on page 84. Aggregate pre-Offer and post-Offer shareholding of our Promoters, members of our Promoter Group and the additional top 10 Shareholders of our Company The aggregate pre-Offer and post-Offer shareholding of our Promoters, members of our Promoter Group and additional top 10 Shareholders (apart from Promoters and members of our Promoter Group) as a percentage of the pre-Offer and post-Offer paid-up Equity Share capital of our Company is set out below: Name Pre-Offer Post-Offer shareholding as at Allotment ^ Number of Equity Shares of face value of ₹ 5 each Percentage of pre-Offer Equity Share capital (%) At the lower end of the price band ( ₹ [●]) At the upper end of the price band ( ₹ [●]) Number of Equity Shares of face value of ₹ 5 each Percentage of post-Offer Equity Share capital (%) Number of Equity Shares of face value of ₹ 5 each Percentage of post-Offer Equity Share capital (%) Promoters [PERSON_002] * 26,70 4,570 [●] [●] [●] [●]</w:t>
+        <w:t>1 3. Logan Grey 100 0.00 ** % [●] [●] Sub-total (B) 200 0.00 ** % [●] [●] Total (A + B) 55,906,742 98.40% [●] [●] * Also, the Promoter Selling Shareholder. ** The number is negligible and below the rounding off norms adopted by our Company. ^ Subject to completion of the Offer and finalisation of the Basis of Allotment. For further details, see “Capital Structure” on page 84. Aggregate pre-Offer and post-Offer shareholding of our Promoters, members of our Promoter Group and the additional top 10 Shareholders of our Company The aggregate pre-Offer and post-Offer shareholding of our Promoters, members of our Promoter Group and additional top 10 Shareholders (apart from Promoters and members of our Promoter Group) as a percentage of the pre-Offer and post-Offer paid-up Equity Share capital of our Company is set out below: Name Pre-Offer Post-Offer shareholding as at Allotment ^ Number of Equity Shares of face value of ₹ 5 each Percentage of pre-Offer Equity Share capital (%) At the lower end of the price band ( ₹ [●]) At the upper end of the price band ( ₹ [●]) Number of Equity Shares of face value of ₹ 5 each Percentage of post-Offer Equity Share capital (%) Number of Equity Shares of face value of ₹ 5 each Percentage of post-Offer Equity Share capital (%) Promoters Jane Smith * 26,70 4,570 [●] [●] [●] [●]</w:t>
       </w:r>
     </w:p>
     <w:p>
@@ -732,7 +732,7 @@
     </w:p>
     <w:p>
       <w:r>
-        <w:t>Name Pre-Offer Post-Offer shareholding as at Allotment ^ Number of Equity Shares of face value of ₹ 5 each Percentage of pre-Offer Equity Share capital (%) At the lower end of the price band ( ₹ [●]) At the upper end of the price band ( ₹ [●]) Number of Equity Shares of face value of ₹ 5 each Percentage of post-Offer Equity Share capital (%) Number of Equity Shares of face value of ₹ 5 each Percentage of post-Offer Equity Share capital (%) [PERSON_003] * 7,386,270 13.00% [●] [●] [●] [●] [PERSON_004] * 10,907,771 19.20% [●] [●] [●] [●] [PERSON_005] * 10,907,771 19.20% [●] [●] [●] [●] [PERSON_006] 100 0.00 ** % [●] [●] [●] [●] Dhaulagiri Family Trust 10 0.00 ** % [●] [●] [●] [●] Everest Family Trust 10 0.00 ** % [●] [●] [●] [●] Makalu Family Trust 10 0.00 ** % [●] [●] [●] [●] Broad Family Trust 10 0.00 ** % [●] [●] [●] [●] Annapurna Family Trust 10 0.00 ** % [●] [●] [●] [●] Kanchenjunga Family Trust 10 0.00 ** % [●] [●] [●] [●] Sub-total (A) 55,906,542 98.40% [●] [●] [●] [●] Promoter Group [PERSON_015] 100 0.00 ** % [●] [●] [●] [●] Katyayani Balasubramania n 100 0.00 ** % [●] [●] [●] [●] Sub-total (B) 200 0.00 ** % [●] [●] [●] [●] Additional top 10 [COMPANY_049] 8,51,563 1.50% [●] [●] [●] [●] [PERSON_017] 39,062 0.07% [●] [●] [●] [●] [PERSON_018] 13,021 0.02% [●] [●] [●] [●] [PERSON_019] 2,604 0.00 ** % [●] [●] [●] [●] [PERSON_020] 2,604 0.00 ** % [●] [●] [●] [●] [PERSON_021] 2,604 0.00 ** % [●] [●] [●] [●] Sub-total (C) 911,458 1.60% [●] [●] [●] [●] Total (A+B+C) 5,68,18,200 100.00% [●] [●] [●] [●]</w:t>
+        <w:t>Name Pre-Offer Post-Offer shareholding as at Allotment ^ Number of Equity Shares of face value of ₹ 5 each Percentage of pre-Offer Equity Share capital (%) At the lower end of the price band ( ₹ [●]) At the upper end of the price band ( ₹ [●]) Number of Equity Shares of face value of ₹ 5 each Percentage of post-Offer Equity Share capital (%) Number of Equity Shares of face value of ₹ 5 each Percentage of post-Offer Equity Share capital (%) Peter Parker * 7,386,270 13.00% [●] [●] [●] [●] Alex Morgan * 10,907,771 19.20% [●] [●] [●] [●] Taylor Brown * 10,907,771 19.20% [●] [●] [●] [●] Jordan Lee 100 0.00 ** % [●] [●] [●] [●] Globex Industries Limited 10 0.00 ** % [●] [●] [●] [●] Umbrella Holdings Private Limited 10 0.00 ** % [●] [●] [●] [●] Initech Solutions Limited 10 0.00 ** % [●] [●] [●] [●] Hooli Technologies Limited 10 0.00 ** % [●] [●] [●] [●] Pied Piper Inc. 10 0.00 ** % [●] [●] [●] [●] Stark Industries Limited 10 0.00 ** % [●] [●] [●] [●] Sub-total (A) 55,906,542 98.40% [●] [●] [●] [●] Promoter Group Skyler West 100 0.00 ** % [●] [●] [●] [●] Katyayani Balasubramania n 100 0.00 ** % [●] [●] [●] [●] Sub-total (B) 200 0.00 ** % [●] [●] [●] [●] Additional top 10 Massive Dynamic Inc. 8,51,563 1.50% [●] [●] [●] [●] Dakota Mills 39,062 0.07% [●] [●] [●] [●] Reese Palmer 13,021 0.02% [●] [●] [●] [●] Hayden Brooks 2,604 0.00 ** % [●] [●] [●] [●] Finley Shaw 2,604 0.00 ** % [●] [●] [●] [●] Rowan Clarke 2,604 0.00 ** % [●] [●] [●] [●] Sub-total (C) 911,458 1.60% [●] [●] [●] [●] Total (A+B+C) 5,68,18,200 100.00% [●] [●] [●] [●]</w:t>
       </w:r>
     </w:p>
     <w:p>
@@ -786,7 +786,7 @@
     </w:p>
     <w:p>
       <w:r>
-        <w:t>* To the extent quantifiable. # Determined in accordance with the Materiality Policy. Notes: (1) Certain of our KMPs including, [PERSON_002], [PERSON_004], [PERSON_005] and [PERSON_006] are also our Executive Directors. Hence, litigation against our Executive Directors have not been included under the heading of KMPs to avoid repetition. (2) Certain of our SMs including, [PERSON_012], CEO, [PERSON_013], CFO, [PERSON_001], CS and Compliance Officer, and [PERSON_022], Technical Director, are also our KMPs. Hence, litigation against our KMPs have not been included under the heading of SMs to avoid repetition. Further, as on the date of this Red Herring Prospectus, there are no outstanding litigation involving our Group Companies which may have a material impact on our Company. For further details, see “ Outstanding Litigation and Material Developments ” on page 388. Risk Factors</w:t>
+        <w:t>* To the extent quantifiable. # Determined in accordance with the Materiality Policy. Notes: (1) Certain of our KMPs including, Jane Smith, Alex Morgan, Taylor Brown and Jordan Lee are also our Executive Directors. Hence, litigation against our Executive Directors have not been included under the heading of KMPs to avoid repetition. (2) Certain of our SMs including, Drew Campbell, CEO, Avery Hart, CFO, John Doe, CS and Compliance Officer, and Ellis Grant, Technical Director, are also our KMPs. Hence, litigation against our KMPs have not been included under the heading of SMs to avoid repetition. Further, as on the date of this Red Herring Prospectus, there are no outstanding litigation involving our Group Companies which may have a material impact on our Company. For further details, see “ Outstanding Litigation and Material Developments ” on page 388. Risk Factors</w:t>
       </w:r>
     </w:p>
     <w:p>
@@ -840,7 +840,7 @@
     </w:p>
     <w:p>
       <w:r>
-        <w:t>Nature of transacti on Name of related party with whom transactions have taken place Nature of relations hip Three-month period ended June 30, 20 25 % of revenue from operati ons Fiscal 202 5 % of revenue from operati ons Fiscal 202 4 % of revenue from operati ons Fiscal 202 3 % of revenue from operati ons Purchase of goods Kushal Electricals Promoters are partners in the partnershi p firm 0.39 0.01% 0.27 0.00% 0.28 0.00% 0.19 0.00% Purchase of goods Waterloo Motors Promoters are partners in the partnershi p firm - - 0.27 0.00% 0.10 0.00% 0.13 0.00% Services receive d KSH Distriparks Private Limi ted Common contro l 0.37 0.01% 3.23 0.02% 2.91 0.02% 3.66 0.03% Services receive d [COMPANY_050] Promoters are trustees in the trust - - 4.26 0.02% 1.50 0.01% 2.00 0.02%</w:t>
+        <w:t>Nature of transacti on Name of related party with whom transactions have taken place Nature of relations hip Three-month period ended June 30, 20 25 % of revenue from operati ons Fiscal 202 5 % of revenue from operati ons Fiscal 202 4 % of revenue from operati ons Fiscal 202 3 % of revenue from operati ons Purchase of goods Kushal Electricals Promoters are partners in the partnershi p firm 0.39 0.01% 0.27 0.00% 0.28 0.00% 0.19 0.00% Purchase of goods Waterloo Motors Promoters are partners in the partnershi p firm - - 0.27 0.00% 0.10 0.00% 0.13 0.00% Services receive d KSH Distriparks Private Limi ted Common contro l 0.37 0.01% 3.23 0.02% 2.91 0.02% 3.66 0.03% Services receive d Aperture Science LLC Promoters are trustees in the trust - - 4.26 0.02% 1.50 0.01% 2.00 0.02%</w:t>
       </w:r>
     </w:p>
     <w:p>
@@ -858,7 +858,7 @@
     </w:p>
     <w:p>
       <w:r>
-        <w:t>Deposit paid [COMPANY_051] Common contro l - - - - - - 100.0 0 0.95% Remunerati on paid # Remuneration paid to key managerial personnel Key managerial personnel 40.10 0.72% 138.4 4 0.72% 100.3 5 0.73% 123.3 2 1.18% Remunerati on paid # Remuneration paid to relatives of Key Managerial Personnel Relatives of key managerial personnel - - 0.89 0.00% 0.98 0.01% 0.92 0.01% Share Based Payment Expense Share Based Payment Expense of Key Managerial Personnel Key managerial personnel 0.36 0.01% - - - - - - Sitting Fees paid to Independent Directors Payment to Independent Directors Independent directors 1.92 0.03% - - - - - - Total 43.14 0.77% 147.3 6 0.72% 106.1 2 0.77% 230.2 2 2.19% # Information relating to remuneration does not include provision for gratuity, which is provided on an overall actuarial valuation, as separate amounts are not available for respective Key Managerial Personnel. Remuneration paid at actual basis is considered for above computation. For further details, see “Restated Financial Statements – Note 31: Related Party Transaction ” on page 331. Financing arrangements There have been no financing arrangements whereby our Promoters, members of our Promoter Group, our Directors and their relatives (as defined under Companies Act, 2013) have financed the purchase by any other person of securities of our Company (other than in the normal course of the business of the financing entity) during a period of six months immediately preceding the date of the Draft Red Hering Prospectus and this Red Herring Prospectus. Weighted average price at which the specified securities were acquired by our Promoter and the Promoter Selling Shareholders in the last one year preceding the date of this Red Herring Prospectus The weighted average price at which the specified securities were acquired by our Promoters and the Promoter Selling Shareholders in the last one year preceding the date of this Red Herring Prospectus is given below: Name of the Promoter Number of Equity Shares of face value of ₹ 5 acquir Weighted average price of acquisition per Equity Shares (1)# (in ₹ )</w:t>
+        <w:t>Deposit paid Wonka Industries Limited Common contro l - - - - - - 100.0 0 0.95% Remunerati on paid # Remuneration paid to key managerial personnel Key managerial personnel 40.10 0.72% 138.4 4 0.72% 100.3 5 0.73% 123.3 2 1.18% Remunerati on paid # Remuneration paid to relatives of Key Managerial Personnel Relatives of key managerial personnel - - 0.89 0.00% 0.98 0.01% 0.92 0.01% Share Based Payment Expense Share Based Payment Expense of Key Managerial Personnel Key managerial personnel 0.36 0.01% - - - - - - Sitting Fees paid to Independent Directors Payment to Independent Directors Independent directors 1.92 0.03% - - - - - - Total 43.14 0.77% 147.3 6 0.72% 106.1 2 0.77% 230.2 2 2.19% # Information relating to remuneration does not include provision for gratuity, which is provided on an overall actuarial valuation, as separate amounts are not available for respective Key Managerial Personnel. Remuneration paid at actual basis is considered for above computation. For further details, see “Restated Financial Statements – Note 31: Related Party Transaction ” on page 331. Financing arrangements There have been no financing arrangements whereby our Promoters, members of our Promoter Group, our Directors and their relatives (as defined under Companies Act, 2013) have financed the purchase by any other person of securities of our Company (other than in the normal course of the business of the financing entity) during a period of six months immediately preceding the date of the Draft Red Hering Prospectus and this Red Herring Prospectus. Weighted average price at which the specified securities were acquired by our Promoter and the Promoter Selling Shareholders in the last one year preceding the date of this Red Herring Prospectus The weighted average price at which the specified securities were acquired by our Promoters and the Promoter Selling Shareholders in the last one year preceding the date of this Red Herring Prospectus is given below: Name of the Promoter Number of Equity Shares of face value of ₹ 5 acquir Weighted average price of acquisition per Equity Shares (1)# (in ₹ )</w:t>
       </w:r>
     </w:p>
     <w:p>
@@ -876,7 +876,7 @@
     </w:p>
     <w:p>
       <w:r>
-        <w:t>ed [PERSON_002] * 26,437,554 0.00</w:t>
+        <w:t>ed Jane Smith * 26,437,554 0.00</w:t>
       </w:r>
     </w:p>
     <w:p>
@@ -894,7 +894,7 @@
     </w:p>
     <w:p>
       <w:r>
-        <w:t>Name of the Promoter Number of Equity Shares of face value of ₹ 5 acquir ed Weighted average price of acquisition per Equity Shares (1)# (in ₹ ) [PERSON_003] * 7,312,437 0.00 [PERSON_004] * 11,249,865 0.00 [PERSON_005] * 11,249,865 0.00 [PERSON_006] 100 530.00 Dhaulagiri Family Trust 10 0.00 Everest Family Trust 10 0.00 Makalu Family Trust 10 0.00 Broad Family Trust 10 0.00 Annapurna Family Trust 10 0.00 Kanchenjunga Family Trust 10 0.00 Note: Number of Equity shares and cost of acquisition has been adjusted for subsequent sale/transfers made based on the average cost of the acquisition. *Also, the Promoter Selling Shareholder # Pursuant to a resolution passed by the Board and Shareholders of the Company dated February 10, 2025 and February 11, 2025, respectively, the face value of the equity shares was sub-divided from ₹ 100 per equity share to ₹ 5 per Equity Share. Further, pursuant to a resolution dated February 11, 2025 passed by our Shareholders, the Company approved the issue of bonus shares which were allotted on February 21, 2025 (1) As certified by [COMPANY_003], Chartered Accountants, our Statutory Auditors, by way of their certificate dated December 10, 2025. Weighted average cost of acquisition of all shares transacted in last one year, 18 months and three years preceding the date of this Red Herring Prospectus The weighted average price for all equity shares acquired in the last one year, eighteen months and three years preceding the date of this Red Herring Prospectus is mentioned below: Peri od Weighted average cost of acquisition (in ₹ )* # Cap Price is ‘x’ times the weighted average cost of acquisition** Range of acquisition price per Equity Share of face value of ₹ 5: lowest price – highest price (in ₹ ) # Last one year 384.01 To be updated upon finalization of the price band. 0.00 – 530.00 Last trailing 18 months 384.01 0.00 – 530.00 Last three years 384.01 0.00 – 530.00 * As certified by [COMPANY_003], Chartered Accountants, our Statutory Auditors, by way of their certificate dated December 10, 2025. ** To be updated in the Prospectus. # Impact of bonus and sub-division of shares have been taken only on transactions that have been transacted during the last 1 year, trailing 18 months and last 3 years. Average cost of acquisition of Equity Shares by our Promoters and the Promoter Selling Shareholders The average cost of acquisition of Equity Shares by our Promoters and the Promoter Selling Shareholders as on the date of this Red Herring Prospectus, is as set forth below: Name of Promoter Number of Equity Shares held of face value of ₹ 5 each Average cost per Equity Share of face values of ₹ 5 each ** ( ₹ ) [PERSON_002] * 26,704,570 1.36 [PERSON_003] * 7,386,270 1.51 [PERSON_004] * 10,907,771 1.41 [PERSON_005] * 10,907,771 1.35 [PERSON_006] 100 530.00</w:t>
+        <w:t>Name of the Promoter Number of Equity Shares of face value of ₹ 5 acquir ed Weighted average price of acquisition per Equity Shares (1)# (in ₹ ) Peter Parker * 7,312,437 0.00 Alex Morgan * 11,249,865 0.00 Taylor Brown * 11,249,865 0.00 Jordan Lee 100 530.00 Globex Industries Limited 10 0.00 Umbrella Holdings Private Limited 10 0.00 Initech Solutions Limited 10 0.00 Hooli Technologies Limited 10 0.00 Pied Piper Inc. 10 0.00 Stark Industries Limited 10 0.00 Note: Number of Equity shares and cost of acquisition has been adjusted for subsequent sale/transfers made based on the average cost of the acquisition. *Also, the Promoter Selling Shareholder # Pursuant to a resolution passed by the Board and Shareholders of the Company dated February 10, 2025 and February 11, 2025, respectively, the face value of the equity shares was sub-divided from ₹ 100 per equity share to ₹ 5 per Equity Share. Further, pursuant to a resolution dated February 11, 2025 passed by our Shareholders, the Company approved the issue of bonus shares which were allotted on February 21, 2025 (1) As certified by Oscorp Limited, Chartered Accountants, our Statutory Auditors, by way of their certificate dated December 10, 2025. Weighted average cost of acquisition of all shares transacted in last one year, 18 months and three years preceding the date of this Red Herring Prospectus The weighted average price for all equity shares acquired in the last one year, eighteen months and three years preceding the date of this Red Herring Prospectus is mentioned below: Peri od Weighted average cost of acquisition (in ₹ )* # Cap Price is ‘x’ times the weighted average cost of acquisition** Range of acquisition price per Equity Share of face value of ₹ 5: lowest price – highest price (in ₹ ) # Last one year 384.01 To be updated upon finalization of the price band. 0.00 – 530.00 Last trailing 18 months 384.01 0.00 – 530.00 Last three years 384.01 0.00 – 530.00 * As certified by Oscorp Limited, Chartered Accountants, our Statutory Auditors, by way of their certificate dated December 10, 2025. ** To be updated in the Prospectus. # Impact of bonus and sub-division of shares have been taken only on transactions that have been transacted during the last 1 year, trailing 18 months and last 3 years. Average cost of acquisition of Equity Shares by our Promoters and the Promoter Selling Shareholders The average cost of acquisition of Equity Shares by our Promoters and the Promoter Selling Shareholders as on the date of this Red Herring Prospectus, is as set forth below: Name of Promoter Number of Equity Shares held of face value of ₹ 5 each Average cost per Equity Share of face values of ₹ 5 each ** ( ₹ ) Jane Smith * 26,704,570 1.36 Peter Parker * 7,386,270 1.51 Alex Morgan * 10,907,771 1.41 Taylor Brown * 10,907,771 1.35 Jordan Lee 100 530.00</w:t>
       </w:r>
     </w:p>
     <w:p>
@@ -912,7 +912,7 @@
     </w:p>
     <w:p>
       <w:r>
-        <w:t>Dhaulagiri Family Trust 10 0.00 Everest Family Trust 10 0.00 Makalu Family Trust 10 0.00 Broad Family Trust 10 0.00 Annapurna Family Trust 10 0.00 Kanchenjunga Family Trust 10 0.00 Note: Number of Equity shares and cost of acquisition has been adjusted for subsequent sale/transfers made based on the average cost of the acquisition. ** As certified by [COMPANY_003], Chartered Accountants, our Statutory Auditors, by way of their certificate dated December 10, 2025. * Also, Promoter Selling Shareholders. Details of price at which specified securities of our Company were acquired by our Promoters, members of the Promoter Group, Promoter Selling Shareholders and Shareholders with the right to nominate Directors or any other special rights in the three years preceding the date of this Red Herring Prospectus Except as stated below, none of our Promoters and members of our Promoter Group, Promoter Selling Shareholders and Shareholders with right to nominate directors or other special rights have acquired any Equity in the three years immediately preceding the date of this Red Herring Prospectus:</w:t>
+        <w:t>Globex Industries Limited 10 0.00 Umbrella Holdings Private Limited 10 0.00 Initech Solutions Limited 10 0.00 Hooli Technologies Limited 10 0.00 Pied Piper Inc. 10 0.00 Stark Industries Limited 10 0.00 Note: Number of Equity shares and cost of acquisition has been adjusted for subsequent sale/transfers made based on the average cost of the acquisition. ** As certified by Oscorp Limited, Chartered Accountants, our Statutory Auditors, by way of their certificate dated December 10, 2025. * Also, Promoter Selling Shareholders. Details of price at which specified securities of our Company were acquired by our Promoters, members of the Promoter Group, Promoter Selling Shareholders and Shareholders with the right to nominate Directors or any other special rights in the three years preceding the date of this Red Herring Prospectus Except as stated below, none of our Promoters and members of our Promoter Group, Promoter Selling Shareholders and Shareholders with right to nominate directors or other special rights have acquired any Equity in the three years immediately preceding the date of this Red Herring Prospectus:</w:t>
       </w:r>
     </w:p>
     <w:p>
@@ -930,7 +930,7 @@
     </w:p>
     <w:p>
       <w:r>
-        <w:t>Name of Shareholder Date of acquisition Number of equity shares acquir ed Face value ( ₹ ) Acquisition price per equity share ^ (in ₹ ) Promoters [PERSON_002] *^ &amp; February 21, 2025 21,363,680 5 0.00 [PERSON_003] *^ &amp; February 21, 2025 5,909,040 5 0.00 [PERSON_004] *^ &amp; February 21, 2025 9,090,800 5 0.00 [PERSON_005] *^ &amp; February 21, 2025 9,090,800 5 0.00 [PERSON_006] &amp; December 17, 2024 1 100 53,000.00 [PERSON_006] ^ &amp; February 21, 2025 80 5 0.00 Dhaulagiri Family Trust &amp; May 7, 2025 10 5 0.00 Everest Family Trust &amp; May 7, 2025 10 5 0.00 Makalu Family Trust &amp; May 7, 2025 10 5 0.00 Broad Family Trust &amp; May 8, 2025 10 5 0.00 Annapurna Family Trust &amp; May 8, 2025 10 5 0.00 Kanchenjunga Family Trust &amp; May 7, 2025 10 5 0.00 Promoter Group [PERSON_015] &amp; December 17, 2024 1 100 53,000.00 [PERSON_015] ^ &amp; February 21, 2025 80 5 N.A. [PERSON_016] &amp; December 17, 2024 1 100 53,000.00 [PERSON_016] ^ &amp; February 21, 2025 80 5 N.A. # As certified by [COMPANY_003], Chartered Accountants, our Statutory Auditors, by way of their certificate dated December 10, 2025. * Also, a Promoter Selling Shareholder. &amp; Shareholder entitled with right to nominate directors or any other rights ^ Bonus shares issued in the ratio of 4:1. Secondary Transfer of Equity Shares of face value of ₹ 5 each in the form of Gifts Transferee Transfer or Equity Shares of face value of ₹ 5 each Date Dhaulagiri Family Trust [PERSON_002] 10 May 7, 2025 Makalu Family Trust [PERSON_002] 10 May 7, 2025 Everest Family Trust [PERSON_002] 10 May 7, 2025 Kanchenjunga Family Trust [PERSON_003] 10 May 7, 2025 Annapurna Family Trust [PERSON_003] 10 May 8, 2025 Broad Family Trust [PERSON_003] 10 May 8, 2025</w:t>
+        <w:t>Name of Shareholder Date of acquisition Number of equity shares acquir ed Face value ( ₹ ) Acquisition price per equity share ^ (in ₹ ) Promoters Jane Smith *^ &amp; February 21, 2025 21,363,680 5 0.00 Peter Parker *^ &amp; February 21, 2025 5,909,040 5 0.00 Alex Morgan *^ &amp; February 21, 2025 9,090,800 5 0.00 Taylor Brown *^ &amp; February 21, 2025 9,090,800 5 0.00 Jordan Lee &amp; December 17, 2024 1 100 53,000.00 Jordan Lee ^ &amp; February 21, 2025 80 5 0.00 Globex Industries Limited &amp; May 7, 2025 10 5 0.00 Umbrella Holdings Private Limited &amp; May 7, 2025 10 5 0.00 Initech Solutions Limited &amp; May 7, 2025 10 5 0.00 Hooli Technologies Limited &amp; May 8, 2025 10 5 0.00 Pied Piper Inc. &amp; May 8, 2025 10 5 0.00 Stark Industries Limited &amp; May 7, 2025 10 5 0.00 Promoter Group Skyler West &amp; December 17, 2024 1 100 53,000.00 Skyler West ^ &amp; February 21, 2025 80 5 N.A. Logan Grey &amp; December 17, 2024 1 100 53,000.00 Logan Grey ^ &amp; February 21, 2025 80 5 N.A. # As certified by Oscorp Limited, Chartered Accountants, our Statutory Auditors, by way of their certificate dated December 10, 2025. * Also, a Promoter Selling Shareholder. &amp; Shareholder entitled with right to nominate directors or any other rights ^ Bonus shares issued in the ratio of 4:1. Secondary Transfer of Equity Shares of face value of ₹ 5 each in the form of Gifts Transferee Transfer or Equity Shares of face value of ₹ 5 each Date Globex Industries Limited Jane Smith 10 May 7, 2025 Initech Solutions Limited Jane Smith 10 May 7, 2025 Umbrella Holdings Private Limited Jane Smith 10 May 7, 2025 Stark Industries Limited Peter Parker 10 May 7, 2025 Pied Piper Inc. Peter Parker 10 May 8, 2025 Hooli Technologies Limited Peter Parker 10 May 8, 2025</w:t>
       </w:r>
     </w:p>
     <w:p>
@@ -966,7 +966,7 @@
     </w:p>
     <w:p>
       <w:r>
-        <w:t>SECTION II: RISK FACTORS An investment in equity shares involves a high degree of risk. Prospective investors should carefully consider all the information in this Red Herring Prospectus, including the risks and uncertainties described below, before making an investment in our Equity Shares. The risks described in this section are those that we consider to be the most significant to our business, results of operations and financial condition as of the date of this Red Herring Prospectus. The risks described below may not be exhaustive or the only ones relevant to us, the Equity Shares or the industry segments in which we currently operate. Additional risks and uncertainties, not presently known to us or that we currently do not deem material may arise or may become material in the future. If any or a combination of the following risks, or other risks that are not currently known or are not currently deemed material, actually occur, our business, results of operations, cash flows and financial condition could be adversely affected, the trading price of our Equity Shares could decline, and investors may lose all or part of their investment. The risk factors have been presented below on the basis of their materiality. Furthermore, some events may be material collectively rather than individually. Some events may not be material at present but may have a material impact in the future. In making an investment decision, prospective investors must rely on their own examination of us and our business and the terms of the Offer, including the merits and risks involved. Potential investors should consult their tax, financial and legal advisors about the particular consequences of purchasing our Equity Shares. In order to obtain a complete understanding of our Company and our business, prospective investors should read this section in conjunction with “Industry Overview”, “Our Business”, “Key Regulations and Policies in India”, “Restated Financial Statements”, “Management’s Discussion and Analysis of Financial Condition and Results of Operations” and “Outstanding Litigation and Material Developments” on pages 137, 211, 238, 280, 356 and 388, respectively, as well as the other financial and statistical information contained in this Red Herring Prospectus. This Red Herring Prospectus also contains forward-looking statements that involve risks, assumptions, estimates, uncertainties and other factors, many of which are beyond our control. Our actual results could differ from those anticipated in these forward-looking statements as a result of certain factors, including the considerations described below and elsewhere in this Red Herring Prospectus. For more details, see “Forward-Looking Statements” on page 18. Unless otherwise stated, or unless the context otherwise requires, the financial information of our Company used in this section has been derived from our Restated Financial Statements included in this Red Herring Prospectus on page 280. Our financial year ends on March 31 of each year. Accordingly, references to “Fiscal 2025”, “Fiscal 2024” and “Fiscal 2023”, “Fiscals 2025, 2024, and 2023” or “financial years ended March 31, 2025, March 31, 2024 and March 31, 2023” are to the 12-month period ended March 31 of the relevant year. We have also included various financial and operational performance indicators in this Red Herring Prospectus, some of which have not been derived from the Restated Financial Statements. The manner of calculation and presentation of some of these financial and operational performance indicators, and the assumptions and estimates used in such calculations, may vary from those used by other companies in India and other jurisdictions. Unless stated otherwise, industry and market data used in this section has been obtained or derived from the report titled “Industry Research Report on Magnet Winding Wires Market in India” dated November 26, 2025 (“ CARE Report ”), prepared and issued by [COMPANY_016] pursuant to an engagement letter dated December 2, 2024, and exclusively commissioned and paid for by us in connection with the Offer. The industry-related information included herein includes excerpts from the CARE Report and may have been re-ordered by us for the purposes of presentation. Unless otherwise indicated, all financial, operational, industry and other related information derived from the CARE Report and included herein with respect to any particular year refers to such information for the relevant calendar year. The CARE Report will be available on the website of our Company from the date of this Red Herring Prospectus until the Bid/Offer Closing Date. For more information, see “Certain Conventions, Use of Financial Information and Market Data and Currency of Presentation” on page 15. INTERNAL RISKS 1. We depend on certain customers for a significant portion of our revenue from operations. Our top 10 customers contributed to 53.97%, 52.54%, 57.10% and 58.99% of our revenue from operations for the three-month period ended June 30, 2025, and Fiscals 2025, 2024 and 2023, respectively. Any decrease in demand from such customers, the loss of such customers or our inability to diversify our customer base could have an adverse effect on our business, results of operations, financial condition and cash flows. We have derived a significant portion of our revenue from operations from our top 10 customers. The table below sets forth details of our revenue from operations generated from top 10 customers in each of the period/ Fiscals indicated:</w:t>
+        <w:t>SECTION II: RISK FACTORS An investment in equity shares involves a high degree of risk. Prospective investors should carefully consider all the information in this Red Herring Prospectus, including the risks and uncertainties described below, before making an investment in our Equity Shares. The risks described in this section are those that we consider to be the most significant to our business, results of operations and financial condition as of the date of this Red Herring Prospectus. The risks described below may not be exhaustive or the only ones relevant to us, the Equity Shares or the industry segments in which we currently operate. Additional risks and uncertainties, not presently known to us or that we currently do not deem material may arise or may become material in the future. If any or a combination of the following risks, or other risks that are not currently known or are not currently deemed material, actually occur, our business, results of operations, cash flows and financial condition could be adversely affected, the trading price of our Equity Shares could decline, and investors may lose all or part of their investment. The risk factors have been presented below on the basis of their materiality. Furthermore, some events may be material collectively rather than individually. Some events may not be material at present but may have a material impact in the future. In making an investment decision, prospective investors must rely on their own examination of us and our business and the terms of the Offer, including the merits and risks involved. Potential investors should consult their tax, financial and legal advisors about the particular consequences of purchasing our Equity Shares. In order to obtain a complete understanding of our Company and our business, prospective investors should read this section in conjunction with “Industry Overview”, “Our Business”, “Key Regulations and Policies in India”, “Restated Financial Statements”, “Management’s Discussion and Analysis of Financial Condition and Results of Operations” and “Outstanding Litigation and Material Developments” on pages 137, 211, 238, 280, 356 and 388, respectively, as well as the other financial and statistical information contained in this Red Herring Prospectus. This Red Herring Prospectus also contains forward-looking statements that involve risks, assumptions, estimates, uncertainties and other factors, many of which are beyond our control. Our actual results could differ from those anticipated in these forward-looking statements as a result of certain factors, including the considerations described below and elsewhere in this Red Herring Prospectus. For more details, see “Forward-Looking Statements” on page 18. Unless otherwise stated, or unless the context otherwise requires, the financial information of our Company used in this section has been derived from our Restated Financial Statements included in this Red Herring Prospectus on page 280. Our financial year ends on March 31 of each year. Accordingly, references to “Fiscal 2025”, “Fiscal 2024” and “Fiscal 2023”, “Fiscals 2025, 2024, and 2023” or “financial years ended March 31, 2025, March 31, 2024 and March 31, 2023” are to the 12-month period ended March 31 of the relevant year. We have also included various financial and operational performance indicators in this Red Herring Prospectus, some of which have not been derived from the Restated Financial Statements. The manner of calculation and presentation of some of these financial and operational performance indicators, and the assumptions and estimates used in such calculations, may vary from those used by other companies in India and other jurisdictions. Unless stated otherwise, industry and market data used in this section has been obtained or derived from the report titled “Industry Research Report on Magnet Winding Wires Market in India” dated November 26, 2025 (“ CARE Report ”), prepared and issued by Globex Industries Limited pursuant to an engagement letter dated December 2, 2024, and exclusively commissioned and paid for by us in connection with the Offer. The industry-related information included herein includes excerpts from the CARE Report and may have been re-ordered by us for the purposes of presentation. Unless otherwise indicated, all financial, operational, industry and other related information derived from the CARE Report and included herein with respect to any particular year refers to such information for the relevant calendar year. The CARE Report will be available on the website of our Company from the date of this Red Herring Prospectus until the Bid/Offer Closing Date. For more information, see “Certain Conventions, Use of Financial Information and Market Data and Currency of Presentation” on page 15. INTERNAL RISKS 1. We depend on certain customers for a significant portion of our revenue from operations. Our top 10 customers contributed to 53.97%, 52.54%, 57.10% and 58.99% of our revenue from operations for the three-month period ended June 30, 2025, and Fiscals 2025, 2024 and 2023, respectively. Any decrease in demand from such customers, the loss of such customers or our inability to diversify our customer base could have an adverse effect on our business, results of operations, financial condition and cash flows. We have derived a significant portion of our revenue from operations from our top 10 customers. The table below sets forth details of our revenue from operations generated from top 10 customers in each of the period/ Fiscals indicated:</w:t>
       </w:r>
     </w:p>
     <w:p>
@@ -1020,7 +1020,7 @@
     </w:p>
     <w:p>
       <w:r>
-        <w:t>4.6 9 10 . Custom er 154.43 2.76% 613.3 0 3.18% 466.46 3.37% 369.31 3.52% Total 3,015.48 53.97% 10,130 .32 52.54% 7,896.04 57.10% 6,191.05 58.99% * These customers represent the top 10 customers for each of the respective periods/ Fiscals and may not necessarily be the same customers across the periods/ Fiscals. Note: Our top 10 customers include [COMPANY_052], [COMPANY_053]; [COMPANY_054]; [COMPANY_055]; [COMPANY_056]; [COMPANY_057]; [COMPANY_058]; and [COMPANY_059]. Names of other customers who form part of our top 10 customers during the periods/ Fiscals included above, have not been included in this Red Herring Prospectus due to non-receipt of consent from such customers to be named in the Offer Documents. We had 122, 117 and 117 customers during the financial years ended March 31, 2025, March 31, 2024, and March 31, 2023, respectively. Further, during the three-month period ended June 30, 2025, we invoiced 93 customers. Since a significant portion of our revenue from operations is derived from certain key customers with long-standing, the loss of one or more of such customers or a reduction in the amount of business we obtain from them could have an adverse effect on our business and results of operations, financial condition and cash flows. Of our top 10 customers based on revenue contribution for the financial year ended March 31, 2025, 5 of our customers have been customers for 10 years intermittently, 2 of our customers have been customers for 5 years, and the other 3 have been our customers for 2 years. Except as disclosed in the section titled “ Outstanding Litigation and Material Developments – A. Litigation Involving our Company – Criminal proceedings by our Company ” on page 389, there have not been any instances of disputes with our customers or adverse changes in our relationship with our customers in the past, we cannot assure you that such instances will not occur in the future and have a material adverse impact on our business, result of operations, cash flows and financial condition. Our reliance on a select group of customers may also constrain our ability to negotiate our arrangements, including pricing, which may have an impact on our profit margins and financial performance. The deterioration of the financial condition or a decline in the budgetary allocations of these customers could reduce their demand for our products and result in a significant decrease in the revenues we derive from them. Furthermore, key customers may become subject to international sanctions, which could further adversely affect our business and revenues. The volume and timing of sales to such customers may also vary due to a change in their requirements, geo-political issues and management of inventory levels. Furthermore, we do not have firm commitments in the form of continuing or long-term supply agreements with some of our customers and instead rely on orders for manufacture of specific products on a purchase order basis, which governs the volume and other terms of the sale of our products. We need to maintain sufficient inventory levels of raw material to meet customer expectations at all times. Accumulating excess inventory could increase our inventory costs, and a failure to have adequate inventory in stock to fulfil customer orders could result in inability to meet customer demand or loss of customers. As actual orders by our customers are typically placed by way of ‘make to order’/ specific purchase orders, we are exposed to significant or unexpected changes in product specifications and delivery schedules, which may result in a mismatch between our inventories of raw materials, thereby increasing our costs for maintaining inventory. Our inability to forecast the level of customer demand for our products as well as our inability to accurately schedule our raw material purchases and production and manage our inventory may adversely affect our business and cash flows from operations. We cannot assure you that</w:t>
+        <w:t>4.6 9 10 . Custom er 154.43 2.76% 613.3 0 3.18% 466.46 3.37% 369.31 3.52% Total 3,015.48 53.97% 10,130 .32 52.54% 7,896.04 57.10% 6,191.05 58.99% * These customers represent the top 10 customers for each of the respective periods/ Fiscals and may not necessarily be the same customers across the periods/ Fiscals. Note: Our top 10 customers include Weyland Corp Limited, Bluth Company LLC; Sterling Cooper Limited; Acme Corp Ltd.; Globex Industries Limited; Umbrella Holdings Private Limited; Initech Solutions Limited; and Hooli Technologies Limited. Names of other customers who form part of our top 10 customers during the periods/ Fiscals included above, have not been included in this Red Herring Prospectus due to non-receipt of consent from such customers to be named in the Offer Documents. We had 122, 117 and 117 customers during the financial years ended March 31, 2025, March 31, 2024, and March 31, 2023, respectively. Further, during the three-month period ended June 30, 2025, we invoiced 93 customers. Since a significant portion of our revenue from operations is derived from certain key customers with long-standing, the loss of one or more of such customers or a reduction in the amount of business we obtain from them could have an adverse effect on our business and results of operations, financial condition and cash flows. Of our top 10 customers based on revenue contribution for the financial year ended March 31, 2025, 5 of our customers have been customers for 10 years intermittently, 2 of our customers have been customers for 5 years, and the other 3 have been our customers for 2 years. Except as disclosed in the section titled “ Outstanding Litigation and Material Developments – A. Litigation Involving our Company – Criminal proceedings by our Company ” on page 389, there have not been any instances of disputes with our customers or adverse changes in our relationship with our customers in the past, we cannot assure you that such instances will not occur in the future and have a material adverse impact on our business, result of operations, cash flows and financial condition. Our reliance on a select group of customers may also constrain our ability to negotiate our arrangements, including pricing, which may have an impact on our profit margins and financial performance. The deterioration of the financial condition or a decline in the budgetary allocations of these customers could reduce their demand for our products and result in a significant decrease in the revenues we derive from them. Furthermore, key customers may become subject to international sanctions, which could further adversely affect our business and revenues. The volume and timing of sales to such customers may also vary due to a change in their requirements, geo-political issues and management of inventory levels. Furthermore, we do not have firm commitments in the form of continuing or long-term supply agreements with some of our customers and instead rely on orders for manufacture of specific products on a purchase order basis, which governs the volume and other terms of the sale of our products. We need to maintain sufficient inventory levels of raw material to meet customer expectations at all times. Accumulating excess inventory could increase our inventory costs, and a failure to have adequate inventory in stock to fulfil customer orders could result in inability to meet customer demand or loss of customers. As actual orders by our customers are typically placed by way of ‘make to order’/ specific purchase orders, we are exposed to significant or unexpected changes in product specifications and delivery schedules, which may result in a mismatch between our inventories of raw materials, thereby increasing our costs for maintaining inventory. Our inability to forecast the level of customer demand for our products as well as our inability to accurately schedule our raw material purchases and production and manage our inventory may adversely affect our business and cash flows from operations. We cannot assure you that</w:t>
       </w:r>
     </w:p>
     <w:p>
@@ -1056,7 +1056,7 @@
     </w:p>
     <w:p>
       <w:r>
-        <w:t>. * These suppliers represent the top 10 suppliers for each of the respective period/ Fiscals and may not necessarily be the same suppliers across the period/ Fiscals. Note: Our top 10 suppliers include Ahlstrom Sweden AB; [COMPANY_060]; [COMPANY_061]; [COMPANY_062]; [COMPANY_063]; [COMPANY_064]; [COMPANY_065]; and [COMPANY_066]. Names of other suppliers have not been included in this Red Herring Prospectus due to non-receipt of consent from such suppliers to be named in the Offer Documents. We purchase our raw materials from third-party suppliers on the basis of purchase orders and do not typically enter into any long-term agreements. We procure our main raw material i.e. copper in back-to-back arrangement with suppliers against confirmed bookings, i.e., the customer prices the copper with our Company and our Company does the same with its suppliers. While we procure raw materials from our suppliers once they confirm the receipt of our purchase orders, in the absence of long-term contracts, our suppliers may not be obligated to supply their products to us and/or may choose to sell their products to our competitors. While we have a large network of long-term suppliers, we purchase copper and aluminium, which are our primary raw materials (and copper also being our principal raw material), from a limited number of suppliers. While there have been no instances of termination of our relationship with our suppliers which had impacted our supply in the three-month period ended June 30, 2025, and the Fiscals 2025, 2024 and 2023, there can be no assurance that a particular supplier will continue to supply us with raw materials in the future. Further, we cannot assure that we will be able to enter into new or renew our existing arrangements with suppliers on terms acceptable to us, which could have an adverse effect on our ability to source materials in a commercially viable and timely manner, if at all, which may impact our business and profitability. We conduct quality checks before onboarding suppliers for certain of our raw materials including metal and paper. Further, there are a limited number of qualified suppliers of insulating materials such as enamel and paper due to criticality to maintain process composition, which further restricts the number of suppliers we can source such materials from. Due to limitations in the availability of suppliers, we are also susceptible to the pricing-power risk of our suppliers controlling the pricing of our raw materials. While we do not rely on any single supplier for the other raw materials and components required for our operations, if any of our suppliers does not supply raw materials on a timely basis or at reasonable prices, we may be unable to manufacture products for our customers or may be unable to ensure the timely delivery of the same. Any discontinuation of production by these suppliers or a failure of these suppliers to adhere to the delivery schedule or the required quality and quantity could hamper our manufacturing schedule and lead to the under-utilization of our manufacturing facilities. Our operations may also be impacted due to</w:t>
+        <w:t>. * These suppliers represent the top 10 suppliers for each of the respective period/ Fiscals and may not necessarily be the same suppliers across the period/ Fiscals. Note: Our top 10 suppliers include Ahlstrom Sweden AB; Pied Piper Inc.; Stark Industries Limited; Wayne Enterprises Limited; Oscorp Limited; Vance Refrigeration LLC; Dunder Mifflin Private Limited; and Soylent Corp Limited. Names of other suppliers have not been included in this Red Herring Prospectus due to non-receipt of consent from such suppliers to be named in the Offer Documents. We purchase our raw materials from third-party suppliers on the basis of purchase orders and do not typically enter into any long-term agreements. We procure our main raw material i.e. copper in back-to-back arrangement with suppliers against confirmed bookings, i.e., the customer prices the copper with our Company and our Company does the same with its suppliers. While we procure raw materials from our suppliers once they confirm the receipt of our purchase orders, in the absence of long-term contracts, our suppliers may not be obligated to supply their products to us and/or may choose to sell their products to our competitors. While we have a large network of long-term suppliers, we purchase copper and aluminium, which are our primary raw materials (and copper also being our principal raw material), from a limited number of suppliers. While there have been no instances of termination of our relationship with our suppliers which had impacted our supply in the three-month period ended June 30, 2025, and the Fiscals 2025, 2024 and 2023, there can be no assurance that a particular supplier will continue to supply us with raw materials in the future. Further, we cannot assure that we will be able to enter into new or renew our existing arrangements with suppliers on terms acceptable to us, which could have an adverse effect on our ability to source materials in a commercially viable and timely manner, if at all, which may impact our business and profitability. We conduct quality checks before onboarding suppliers for certain of our raw materials including metal and paper. Further, there are a limited number of qualified suppliers of insulating materials such as enamel and paper due to criticality to maintain process composition, which further restricts the number of suppliers we can source such materials from. Due to limitations in the availability of suppliers, we are also susceptible to the pricing-power risk of our suppliers controlling the pricing of our raw materials. While we do not rely on any single supplier for the other raw materials and components required for our operations, if any of our suppliers does not supply raw materials on a timely basis or at reasonable prices, we may be unable to manufacture products for our customers or may be unable to ensure the timely delivery of the same. Any discontinuation of production by these suppliers or a failure of these suppliers to adhere to the delivery schedule or the required quality and quantity could hamper our manufacturing schedule and lead to the under-utilization of our manufacturing facilities. Our operations may also be impacted due to</w:t>
       </w:r>
     </w:p>
     <w:p>
@@ -1254,7 +1254,7 @@
     </w:p>
     <w:p>
       <w:r>
-        <w:t>11. We have experienced negative cash flows from operating activities in the past. Any negative cash flows in the future would adversely affect our cash flow requirements, which may adversely affect our ability to operate our business and implement our growth plans, thereby affecting our financial condition. The table below sets forth certain information relating to our cash flows from operating activities for the periods/ years indicated: Particulars Three-month period ended June 30, 2025 Fiscal 2025 Fiscal 2024 Fiscal 2023 Net cash flows from / (used in) operating activities We experienced negative cash flows in the Fiscal 2025, and the Fiscal 2024, due to increase in inventories and increase in trade receivables. Negative cash flows over extended periods, or significant negative cash flows in the short term, could materially impact our ability to operate our business and implement our growth plans. We may face a shortfall of capital in future as a result of negative cash flows and there can be no assurance that we will be able to raise adequate capital in future. As a result, our cash flows, business, future financial performance and results of operations could be materially and adversely affected. For further information, see “ Management’s Discussion and Analysis of Financial Condition and Results of Operations – Cash Flows ” on page 378. 12. If we fail to comply with the applicable regulations and rules prescribed by the Government of India and the relevant statutory or regulatory bodies or fail to obtain, maintain or renew our statutory and regulatory licenses, permits and approvals required for our business, our results of operations and cash flows may be adversely affected. We are required to obtain and maintain a number of statutory and regulatory licenses, registrations, permits and approvals under central, state and local government rules in India, for carrying out our business and for our manufacturing facility, among other things, relating to occupational health and safety (including laws regulating the generation, storage, handling, use and transportation of waste materials, the emission and discharge of hazardous waste materials into soil, air or water, and the health and safety of employees) and mandatory certification requirements for our facilities and products. For further information on the nature of the material approvals and licenses required for our business and for information on the material approvals applied for, see “ Government and Other Approvals ” on page 393. In addition, we will need to apply for renewal of certain approvals, licenses registrations and permits, which expire or seek new approvals, licenses, registrations and permits from time to time, as and when required in the ordinary course of our business. While there has not been any non-compliance during the three-month period ended June 30, 2025 or Fiscals 2025, 2024, and 2023, there can be no assurance that we will be in compliance at all times with such laws, regulations and the terms and conditions of any such consents or permits. If we violate or fail to comply adequately with these requirements, we could be fined or otherwise sanctioned by the relevant regulators. Our business and operations are subject to a number of approvals, licenses, registrations and permissions for construction and operation of our manufacturing facilities, warehouses, branch offices and regional offices, in addition to extensive government regulations for the protection of the environment and occupational health and safety. We have either made or are in the process of making an application or renewal for obtaining necessary approvals that are not in place or have expired. Further, we may also need to apply for additional approvals including the renewal of approvals which may expire from time to time, in the ordinary course of business. For instance, we have made applications for (i) certificate of enrolment issued by Maharashtra Sales Tax Department under the Maharashtra State Tax on Professions, Trades, Callings and Employment Act, 1975 and (ii) for amending the name of our Company in certain regulatory approvals and licenses issued under our old name “[COMPANY_011]”. Additionally, we are yet to make an application for obtaining the building completion certificate issued in relation to Unit 2 by the Pune Metropolitan Region Development Authority. For details, see “ Government and Other Approvals – C. Material approvals in relation to our Company – IV. Material Approvals or renewal applied for but not received ” on page 394</w:t>
+        <w:t>11. We have experienced negative cash flows from operating activities in the past. Any negative cash flows in the future would adversely affect our cash flow requirements, which may adversely affect our ability to operate our business and implement our growth plans, thereby affecting our financial condition. The table below sets forth certain information relating to our cash flows from operating activities for the periods/ years indicated: Particulars Three-month period ended June 30, 2025 Fiscal 2025 Fiscal 2024 Fiscal 2023 Net cash flows from / (used in) operating activities We experienced negative cash flows in the Fiscal 2025, and the Fiscal 2024, due to increase in inventories and increase in trade receivables. Negative cash flows over extended periods, or significant negative cash flows in the short term, could materially impact our ability to operate our business and implement our growth plans. We may face a shortfall of capital in future as a result of negative cash flows and there can be no assurance that we will be able to raise adequate capital in future. As a result, our cash flows, business, future financial performance and results of operations could be materially and adversely affected. For further information, see “ Management’s Discussion and Analysis of Financial Condition and Results of Operations – Cash Flows ” on page 378. 12. If we fail to comply with the applicable regulations and rules prescribed by the Government of India and the relevant statutory or regulatory bodies or fail to obtain, maintain or renew our statutory and regulatory licenses, permits and approvals required for our business, our results of operations and cash flows may be adversely affected. We are required to obtain and maintain a number of statutory and regulatory licenses, registrations, permits and approvals under central, state and local government rules in India, for carrying out our business and for our manufacturing facility, among other things, relating to occupational health and safety (including laws regulating the generation, storage, handling, use and transportation of waste materials, the emission and discharge of hazardous waste materials into soil, air or water, and the health and safety of employees) and mandatory certification requirements for our facilities and products. For further information on the nature of the material approvals and licenses required for our business and for information on the material approvals applied for, see “ Government and Other Approvals ” on page 393. In addition, we will need to apply for renewal of certain approvals, licenses registrations and permits, which expire or seek new approvals, licenses, registrations and permits from time to time, as and when required in the ordinary course of our business. While there has not been any non-compliance during the three-month period ended June 30, 2025 or Fiscals 2025, 2024, and 2023, there can be no assurance that we will be in compliance at all times with such laws, regulations and the terms and conditions of any such consents or permits. If we violate or fail to comply adequately with these requirements, we could be fined or otherwise sanctioned by the relevant regulators. Our business and operations are subject to a number of approvals, licenses, registrations and permissions for construction and operation of our manufacturing facilities, warehouses, branch offices and regional offices, in addition to extensive government regulations for the protection of the environment and occupational health and safety. We have either made or are in the process of making an application or renewal for obtaining necessary approvals that are not in place or have expired. Further, we may also need to apply for additional approvals including the renewal of approvals which may expire from time to time, in the ordinary course of business. For instance, we have made applications for (i) certificate of enrolment issued by Maharashtra Sales Tax Department under the Maharashtra State Tax on Professions, Trades, Callings and Employment Act, 1975 and (ii) for amending the name of our Company in certain regulatory approvals and licenses issued under our old name “Wonka Industries Limited”. Additionally, we are yet to make an application for obtaining the building completion certificate issued in relation to Unit 2 by the Pune Metropolitan Region Development Authority. For details, see “ Government and Other Approvals – C. Material approvals in relation to our Company – IV. Material Approvals or renewal applied for but not received ” on page 394</w:t>
       </w:r>
     </w:p>
     <w:p>
@@ -1290,7 +1290,7 @@
     </w:p>
     <w:p>
       <w:r>
-        <w:t>not complied with such conditions, our business, prospects, financial condition, results of operations and cash flows may be adversely affected. Considering the nature of raw materials involved in our business, there can be no assurance that other environmental and safety allegations will not be made against us in the future. The relevant regulator may order closure of our unit where it is found to be non-compliant with the applicable norm. In some instances, such a fine or sanction could adversely affect our business, reputation, financial condition, results of operations or cash flows. In addition, these requirements may become more stringent over time and there can be no assurance that we will not incur significant environmental costs or liabilities in the future. For details, see “ Risk Factors – Our insurance coverage may not be sufficient or adequate to protect us against all material hazards, which may adversely affect our business, results of operations, financial condition and cash flows ” on page 54. Further, we propose to utilise a portion of our Net Proceeds towards funding the capital expenditure requirements of our Company towards purchasing and setting up of new machinery for expansion at our Supa Facility which will require us to obtain necessary licenses and approvals. For details, see “ Objects of the Offer –Funding the capital expenditure requirements of our Company towards: (i) purchasing and setting up of new machinery for expansion at our Supa Facility (“Phase II Expansion at our Supa Facility”); and (ii) purchasing and setting up of new machinery at Unit 2 in Chakan, Pune in Maharashtra” on page 114. We may have to revise our funding requirements and deployment of the Net Proceeds in case we are unable to obtain necessary licenses and approvals or due to other external factors, which may not be within the control of our management. Our inability to control the costs involved in complying with these and other relevant laws and regulations could have an adverse effect on our business, financial condition, results of operations and cash flows. 13. We are unable to trace some of our historical corporate records including in relation to certain allotments made by our Company. Further, certain corporate records have errors, and certain corporate filings have been made with delays. We cannot assure you that no legal proceedings or regulatory actions will be initiated against our Company in the future in relation to these matters, which may impact our financial condition and reputation. Certain of our Company’s corporate records are not traceable as the relevant information was not available in the records maintained by our Company or on the online portal of the Ministry of Corporate Affairs (“ MCA Portal ”) or in the physical records available at the Registrar of Companies. For instance, we are unable to trace the following: (i) Annual returns filed by the Company beginning from the Fiscal 1980 until the Fiscal 2003, except for the Fiscals ended March 31, 1983, and March 31, 1988; (ii) Financial statements, (a) between the Fiscal 1980 until March 31, 1985, (b) between the Fiscal 1986 until March 31, 2005, and (c) between the Fiscals 2011 and 2014; (iii) Form 1, Form 1A and Form 18 along with corresponding RoC challans for incorporation of the Company dated July 30, 1979, application for reservation of name, and intimation of registered office respectively; (iv) Form 23, Forms 1A and 1B along with corresponding RoC challans for change of name of the Company from “ [COMPANY_010]” to “ [COMPANY_011] ” dated July 4, 1996; (v) Form 32 along with corresponding challan for regularization as director in relation to [PERSON_004] dated September 26, 1996; (vi) Form 32 along with corresponding RoC challan for appointment as additional director in relation to [PERSON_005] dated November 1, 2000; (vii) Form 32 along with the corresponding RoC challan for regularisation as director in relation to [PERSON_005] dated September 21, 2000; (viii) Copies or counter folios of share certificates issued to the shareholders; and (ix) Share transfer forms for all secondary transactions of equity shares, including the following transfers involving the Promoter Selling Shareholders:</w:t>
+        <w:t>not complied with such conditions, our business, prospects, financial condition, results of operations and cash flows may be adversely affected. Considering the nature of raw materials involved in our business, there can be no assurance that other environmental and safety allegations will not be made against us in the future. The relevant regulator may order closure of our unit where it is found to be non-compliant with the applicable norm. In some instances, such a fine or sanction could adversely affect our business, reputation, financial condition, results of operations or cash flows. In addition, these requirements may become more stringent over time and there can be no assurance that we will not incur significant environmental costs or liabilities in the future. For details, see “ Risk Factors – Our insurance coverage may not be sufficient or adequate to protect us against all material hazards, which may adversely affect our business, results of operations, financial condition and cash flows ” on page 54. Further, we propose to utilise a portion of our Net Proceeds towards funding the capital expenditure requirements of our Company towards purchasing and setting up of new machinery for expansion at our Supa Facility which will require us to obtain necessary licenses and approvals. For details, see “ Objects of the Offer –Funding the capital expenditure requirements of our Company towards: (i) purchasing and setting up of new machinery for expansion at our Supa Facility (“Phase II Expansion at our Supa Facility”); and (ii) purchasing and setting up of new machinery at Unit 2 in Chakan, Pune in Maharashtra” on page 114. We may have to revise our funding requirements and deployment of the Net Proceeds in case we are unable to obtain necessary licenses and approvals or due to other external factors, which may not be within the control of our management. Our inability to control the costs involved in complying with these and other relevant laws and regulations could have an adverse effect on our business, financial condition, results of operations and cash flows. 13. We are unable to trace some of our historical corporate records including in relation to certain allotments made by our Company. Further, certain corporate records have errors, and certain corporate filings have been made with delays. We cannot assure you that no legal proceedings or regulatory actions will be initiated against our Company in the future in relation to these matters, which may impact our financial condition and reputation. Certain of our Company’s corporate records are not traceable as the relevant information was not available in the records maintained by our Company or on the online portal of the Ministry of Corporate Affairs (“ MCA Portal ”) or in the physical records available at the Registrar of Companies. For instance, we are unable to trace the following: (i) Annual returns filed by the Company beginning from the Fiscal 1980 until the Fiscal 2003, except for the Fiscals ended March 31, 1983, and March 31, 1988; (ii) Financial statements, (a) between the Fiscal 1980 until March 31, 1985, (b) between the Fiscal 1986 until March 31, 2005, and (c) between the Fiscals 2011 and 2014; (iii) Form 1, Form 1A and Form 18 along with corresponding RoC challans for incorporation of the Company dated July 30, 1979, application for reservation of name, and intimation of registered office respectively; (iv) Form 23, Forms 1A and 1B along with corresponding RoC challans for change of name of the Company from “ Aperture Science LLC” to “ Wonka Industries Limited ” dated July 4, 1996; (v) Form 32 along with corresponding challan for regularization as director in relation to Alex Morgan dated September 26, 1996; (vi) Form 32 along with corresponding RoC challan for appointment as additional director in relation to Taylor Brown dated November 1, 2000; (vii) Form 32 along with the corresponding RoC challan for regularisation as director in relation to Taylor Brown dated September 21, 2000; (viii) Copies or counter folios of share certificates issued to the shareholders; and (ix) Share transfer forms for all secondary transactions of equity shares, including the following transfers involving the Promoter Selling Shareholders:</w:t>
       </w:r>
     </w:p>
     <w:p>
@@ -1326,7 +1326,7 @@
     </w:p>
     <w:p>
       <w:r>
-        <w:t>1 . 1979-1980 Initial subscription to the MoA and further issue The financial statements of FY 1980 and FY 1981. 2 . September 30, 1981 Secondary transfer of equity shares Form 7B for transfer of shares to [PERSON_023] from DM Shetty and Gopal BO. 3 . August 6, 1982 Secondary transfer of equity shares Form 7B for transfer of shares to [PERSON_023] from [PERSON_024] and SA Shetty. 4 . December 9, 1983 Secondary transfer of equity shares Form 7B for transfer of shares to [PERSON_023] from Jayaram Shetty. 5 . March 28, 1987 Secondary transfer of equity shares Form 7B for transfer of shares by [PERSON_023] to [PERSON_025]. 6 . February 25, 1993 Further issue of equity shares Challan for the Form 2 in relation to the said allotment 7 . September 7, 1998 Secondary transfer of equity shares Form 7B for transfer of shares to [PERSON_025] HUF from [PERSON_025]. 8 . September 7, 1998 Secondary transfer of equity shares Form 7B for transfer of shares to [PERSON_004] from Narayana B. Shetty 9 . December 28, 1998 Secondary transfer of equity shares Form 7B for transfer of shares to [PERSON_023] from Shubhkamal Leasing and [COMPANY_067] 10 . December 28, 1998 Secondary transfer of equity shares Form 7B for transfer of shares to [PERSON_026] from [PERSON_025] HUF. 11 . December 28, 1998 Secondary transfer of equity shares Form 7B for transfer of shares to [PERSON_004] from Shubhkamal Leasing and [COMPANY_067] 12 . November 29, 2001 Secondary transfer of equity shares Form 7B for transfer of shares to [PERSON_027] by Vijay Hegde. 13 . November 29, 2001 Secondary transfer of equity shares Form 7B for transfer of shares to [PERSON_026] by Vijay Hegde. 14 . April 20, 2002 Secondary transfer of equity shares Form 7B for transfer of shares by [PERSON_023] to [PERSON_027] and [PERSON_026]. 15 . 1979-1980 Initial subscription to the MoA and further issue The financial statements of FY 1980 and FY 1981. 16 . February 20, 2015 Conversion of unsecured loan Valuation report of an independent chartered accountant for conversion of loan into equity shares. 17 . March 29, 2016 Secondary transfer of equity shares Form SH- 4 for transfer of shares by [PERSON_023], [PERSON_027] and [PERSON_026] to [PERSON_028]. 18 . 1979 – 2016 Copy or counter folios of share certificates issued to the shareholders. For further details, see “ Capital Structure – Details of history of shareholding and share capital of our Promoters and members of the Promoter Group in our Company ” and “ Capital Structure – Equity Share capital history of our Company ” on pages 91 and 85, respectively. We have been unable to trace these documents despite commissioning a detailed search at the Registrar of Companies, through an independent practicing company secretary, Kanj and [COMPANY_068] (“ Practicing Company Secretary ”), to trace records and filings available with Registrar of Companies and reliance has been placed on the certificate dated May 21, 2025, issued by the Practicing Company Secretary. We have also intimated the Registrar of Companies by way of our letter dated May 21, 2025, regarding the missing corporate records. In addition, 1,000, equity shares of face value of ₹ 100 each allotted to [PERSON_029], 500 equity shares of face value of ₹ 100 each allotted to [PERSON_002], Narayna B. Shetty and Jayaram N. Shetty, respectively, pursuant to the initial subscription to the MoA dated June 29, 1979, were subsequently taken on record by the Board by way of a resolution dated August 25, 1979. For further details, see “ Capital Structure – Notes to Capital Structure</w:t>
+        <w:t>1 . 1979-1980 Initial subscription to the MoA and further issue The financial statements of FY 1980 and FY 1981. 2 . September 30, 1981 Secondary transfer of equity shares Form 7B for transfer of shares to Kendall Price from DM Shetty and Gopal BO. 3 . August 6, 1982 Secondary transfer of equity shares Form 7B for transfer of shares to Kendall Price from Emery Fox and SA Shetty. 4 . December 9, 1983 Secondary transfer of equity shares Form 7B for transfer of shares to Kendall Price from Jayaram Shetty. 5 . March 28, 1987 Secondary transfer of equity shares Form 7B for transfer of shares by Kendall Price to Harper Kim. 6 . February 25, 1993 Further issue of equity shares Challan for the Form 2 in relation to the said allotment 7 . September 7, 1998 Secondary transfer of equity shares Form 7B for transfer of shares to Harper Kim HUF from Harper Kim. 8 . September 7, 1998 Secondary transfer of equity shares Form 7B for transfer of shares to Alex Morgan from Narayana B. Shetty 9 . December 28, 1998 Secondary transfer of equity shares Form 7B for transfer of shares to Kendall Price from Shubhkamal Leasing and Tyrell Corporation 10 . December 28, 1998 Secondary transfer of equity shares Form 7B for transfer of shares to Blake Turner from Harper Kim HUF. 11 . December 28, 1998 Secondary transfer of equity shares Form 7B for transfer of shares to Alex Morgan from Shubhkamal Leasing and Tyrell Corporation 12 . November 29, 2001 Secondary transfer of equity shares Form 7B for transfer of shares to Quinn Nash by Vijay Hegde. 13 . November 29, 2001 Secondary transfer of equity shares Form 7B for transfer of shares to Blake Turner by Vijay Hegde. 14 . April 20, 2002 Secondary transfer of equity shares Form 7B for transfer of shares by Kendall Price to Quinn Nash and Blake Turner. 15 . 1979-1980 Initial subscription to the MoA and further issue The financial statements of FY 1980 and FY 1981. 16 . February 20, 2015 Conversion of unsecured loan Valuation report of an independent chartered accountant for conversion of loan into equity shares. 17 . March 29, 2016 Secondary transfer of equity shares Form SH- 4 for transfer of shares by Kendall Price, Quinn Nash and Blake Turner to Parker Lane. 18 . 1979 – 2016 Copy or counter folios of share certificates issued to the shareholders. For further details, see “ Capital Structure – Details of history of shareholding and share capital of our Promoters and members of the Promoter Group in our Company ” and “ Capital Structure – Equity Share capital history of our Company ” on pages 91 and 85, respectively. We have been unable to trace these documents despite commissioning a detailed search at the Registrar of Companies, through an independent practicing company secretary, Kanj and Cyberdyne Systems Limited (“ Practicing Company Secretary ”), to trace records and filings available with Registrar of Companies and reliance has been placed on the certificate dated May 21, 2025, issued by the Practicing Company Secretary. We have also intimated the Registrar of Companies by way of our letter dated May 21, 2025, regarding the missing corporate records. In addition, 1,000, equity shares of face value of ₹ 100 each allotted to Sage Porter, 500 equity shares of face value of ₹ 100 each allotted to Jane Smith, Narayna B. Shetty and Jayaram N. Shetty, respectively, pursuant to the initial subscription to the MoA dated June 29, 1979, were subsequently taken on record by the Board by way of a resolution dated August 25, 1979. For further details, see “ Capital Structure – Notes to Capital Structure</w:t>
       </w:r>
     </w:p>
     <w:p>
@@ -1362,7 +1362,7 @@
     </w:p>
     <w:p>
       <w:r>
-        <w:t>Certain sections of this Red Herring Prospectus include information based on, or derived from, the CARE Report or extracts of the CARE Report prepared by [COMPANY_016] (“ CareEdge Research ”). All such information in this Red Herring Prospectus indicates the CARE Report as its source. The CARE Report is available on the website of our Company at https://kshinternational.com/investor-relations/industry-report/. The CARE Report is commissioned and paid for by our Company pursuant to an engagement letter dated December 2, 2024, for the purpose of confirming our understanding of the industry in connection with this Offer. While CareEdge Research is not related to our Company, our Promoters or our Directors, our Company has subscribed to and paid for certain research and reports from CareEdge Research business process services division. Industry sources and publications are prepared based on information as of specific dates and may no longer be current or reflect current trends. Industry sources and publications may also base their information on estimates, projections, forecasts and assumptions that may prove to be incorrect. Further, the CARE Report is not a recommendation to invest / disinvest in any company covered in the CARE Report. Accordingly, prospective investors should not place undue reliance on or base their investment decision solely on this information. In view of the foregoing, you may not be able to seek legal recourse for any losses resulting from undertaking any investment in this Offer pursuant to reliance on the information in this Red Herring Prospectus based on, or derived from, the CARE Report. You should consult your own advisors and undertake an independent assessment of information in this Red Herring Prospectus based on, or derived from, the CARE Report before making any investment decision regarding this Offer. See “ Industry Overview ” on page 137. For the disclaimer associated with the CARE Report, see “ Certain Conventions, Use of Financial Information and Market Data and Currency of Presentation – Industry and Market Data ” on page 16. 15. We operate in a competitive business environment. Failure to compete effectively against our competitors and new entrants to the industry may adversely affect our business, financial condition and results of operations. We face significant competition in our business from other manufacturers and suppliers of winding wires. Our competitors may possess wider product ranges, larger sales teams, greater intellectual property resources and broader appeal across various divisions. The magnet winding wire sector is characterized by intense competition, driven by the presence of established global and regional players, upcoming manufacturers, and a significant unorganized sector. ( Source: CARE Report ). For further details on our competitors, see “ Our Business – Competition”, “Basis for Offer Price” and “Industry Overview ” on pages 234, 124 and 137, respectively. Our failure to compete effectively with respect to any of these or other factors could have an adverse effect on our business, prospects, financial condition or operating results. Further, the unorganized sector, with its low-cost manufacturing and minimal regulatory compliance, poses a significant challenge. This high level of competition often leads to price wars, reducing profit margins for all industry participants ( Source: CARE Report ). We cannot assure you that we will be able to compete successfully against our competitors as well as new entrants in our industry in the future. Accordingly, our business, financial condition, results of operations and prospects would be adversely and materially affected if we are unable to maintain our competitive advantage and compete successfully against our competitors and any new entrants in the industry. While we work consistently to offset pricing pressures, produce new products, improve our services or enhance our production efficiency to reduce costs, such efforts may not be successful. Also, as we plan to expand our offerings to launch new products, we may face strong competition from other players in the same markets. Many of our existing and potential competitors may seek to equal or exceed us in terms of their financial, production, sales, marketing and other resources. If we fail to compete effectively in the future, our business and prospects could be materially and adversely affected. 16. Any failure in arranging adequate working capital for our operations or furnishing performance bank guarantees may adversely affect our business, results of operations, cash flows and financial condition. We require significant working capital to finance the purchase of raw materials and for the manufacture and other related expenses before payment is received from customers. We currently meet our working capital requirements through a mix of internal accruals and working capital facilities from banks. Set out below are our working capital days for the three-month period ended June 30, 2025, and the Fiscals 2025, 2024 and 2023: Particulars Three-month period Fiscal 2025 Fiscal 2024 Fiscal 2023</w:t>
+        <w:t>Certain sections of this Red Herring Prospectus include information based on, or derived from, the CARE Report or extracts of the CARE Report prepared by Globex Industries Limited (“ CareEdge Research ”). All such information in this Red Herring Prospectus indicates the CARE Report as its source. The CARE Report is available on the website of our Company at https://kshinternational.com/investor-relations/industry-report/. The CARE Report is commissioned and paid for by our Company pursuant to an engagement letter dated December 2, 2024, for the purpose of confirming our understanding of the industry in connection with this Offer. While CareEdge Research is not related to our Company, our Promoters or our Directors, our Company has subscribed to and paid for certain research and reports from CareEdge Research business process services division. Industry sources and publications are prepared based on information as of specific dates and may no longer be current or reflect current trends. Industry sources and publications may also base their information on estimates, projections, forecasts and assumptions that may prove to be incorrect. Further, the CARE Report is not a recommendation to invest / disinvest in any company covered in the CARE Report. Accordingly, prospective investors should not place undue reliance on or base their investment decision solely on this information. In view of the foregoing, you may not be able to seek legal recourse for any losses resulting from undertaking any investment in this Offer pursuant to reliance on the information in this Red Herring Prospectus based on, or derived from, the CARE Report. You should consult your own advisors and undertake an independent assessment of information in this Red Herring Prospectus based on, or derived from, the CARE Report before making any investment decision regarding this Offer. See “ Industry Overview ” on page 137. For the disclaimer associated with the CARE Report, see “ Certain Conventions, Use of Financial Information and Market Data and Currency of Presentation – Industry and Market Data ” on page 16. 15. We operate in a competitive business environment. Failure to compete effectively against our competitors and new entrants to the industry may adversely affect our business, financial condition and results of operations. We face significant competition in our business from other manufacturers and suppliers of winding wires. Our competitors may possess wider product ranges, larger sales teams, greater intellectual property resources and broader appeal across various divisions. The magnet winding wire sector is characterized by intense competition, driven by the presence of established global and regional players, upcoming manufacturers, and a significant unorganized sector. ( Source: CARE Report ). For further details on our competitors, see “ Our Business – Competition”, “Basis for Offer Price” and “Industry Overview ” on pages 234, 124 and 137, respectively. Our failure to compete effectively with respect to any of these or other factors could have an adverse effect on our business, prospects, financial condition or operating results. Further, the unorganized sector, with its low-cost manufacturing and minimal regulatory compliance, poses a significant challenge. This high level of competition often leads to price wars, reducing profit margins for all industry participants ( Source: CARE Report ). We cannot assure you that we will be able to compete successfully against our competitors as well as new entrants in our industry in the future. Accordingly, our business, financial condition, results of operations and prospects would be adversely and materially affected if we are unable to maintain our competitive advantage and compete successfully against our competitors and any new entrants in the industry. While we work consistently to offset pricing pressures, produce new products, improve our services or enhance our production efficiency to reduce costs, such efforts may not be successful. Also, as we plan to expand our offerings to launch new products, we may face strong competition from other players in the same markets. Many of our existing and potential competitors may seek to equal or exceed us in terms of their financial, production, sales, marketing and other resources. If we fail to compete effectively in the future, our business and prospects could be materially and adversely affected. 16. Any failure in arranging adequate working capital for our operations or furnishing performance bank guarantees may adversely affect our business, results of operations, cash flows and financial condition. We require significant working capital to finance the purchase of raw materials and for the manufacture and other related expenses before payment is received from customers. We currently meet our working capital requirements through a mix of internal accruals and working capital facilities from banks. Set out below are our working capital days for the three-month period ended June 30, 2025, and the Fiscals 2025, 2024 and 2023: Particulars Three-month period Fiscal 2025 Fiscal 2024 Fiscal 2023</w:t>
       </w:r>
     </w:p>
     <w:p>
@@ -1416,7 +1416,7 @@
     </w:p>
     <w:p>
       <w:r>
-        <w:t>(1) Certain of our KMPs including, [PERSON_002], [PERSON_004], [PERSON_005] and [PERSON_006] are also our Executive Directors. Hence, litigation against our Executive Directors have not been included under the heading of KMPs to avoid repetition. (2) Certain of our SMs including, [PERSON_012], CEO, [PERSON_013], CFO, [PERSON_001], CS and Compliance Officer, and [PERSON_022], Technical Director, are also our KMPs. Hence, litigation against our KMPs have not been included under the heading of SMs to avoid repetition. Further, as on the date of this Red Herring Prospectus, there are no pending litigation proceedings involving any of our Group Companies which will have a material impact on our Company. Such proceedings could divert management’s time, attention, and consume financial resources in their defence or prosecution. We cannot assure you that any of these matters will be settled in favour of our Company or that no additional liability will arise out of these proceedings. Further, we cannot assure you that there will be no new legal</w:t>
+        <w:t>(1) Certain of our KMPs including, Jane Smith, Alex Morgan, Taylor Brown and Jordan Lee are also our Executive Directors. Hence, litigation against our Executive Directors have not been included under the heading of KMPs to avoid repetition. (2) Certain of our SMs including, Drew Campbell, CEO, Avery Hart, CFO, John Doe, CS and Compliance Officer, and Ellis Grant, Technical Director, are also our KMPs. Hence, litigation against our KMPs have not been included under the heading of SMs to avoid repetition. Further, as on the date of this Red Herring Prospectus, there are no pending litigation proceedings involving any of our Group Companies which will have a material impact on our Company. Such proceedings could divert management’s time, attention, and consume financial resources in their defence or prosecution. We cannot assure you that any of these matters will be settled in favour of our Company or that no additional liability will arise out of these proceedings. Further, we cannot assure you that there will be no new legal</w:t>
       </w:r>
     </w:p>
     <w:p>
@@ -1488,7 +1488,7 @@
     </w:p>
     <w:p>
       <w:r>
-        <w:t>▪ Specialize magnet winding wires: a) For PICC - 26 days per month resulting in 312 working days in a year with per day three operating shifts with actual run time of 5.6 hours per shift. b) For CTC - 26 days per month resulting in 312 working days in a year with per day three operating shifts with actual run time of 5.2 hours per shift. ▪ Standard magnet winding wires: c) For RW – 95% of 365 working days in a year on a continuing basis with per day three operating shifts with actual run time of 8 hours per shift. ● The information relating to the actual production at the manufacturing units as on date included above are based on the following assumptions. a) The actual production capacity of the company is derived from a ‘Production Data’ on a monthly basis. a) Capacity utilization has been calculated on the basis of actual production during the relevant Fiscal/ period divided by the aggregate available capacity as of at the end of the relevant period. The inspection report is based on situation observed at the time of date if inspection. ● The Company is expanding by setting up a plant at [ADDRESS_012]. The proposed plant will be developed in phases: Phase I, named Alpha I, with an installed capacity of 12,000 MT per annum, and Phase II, named Beta I, with a proposed installed capacity of 18,000 MT per annum. Currently, a consent to operate dated September 19, 2025, has been obtained from the Maharashtra Pollution Control Board for Phase I CTO and commercial production of Phase I commenced in September 2025. Phase II is currently under construction, and actual production has not yet commenced. (The remainder of the page is intentionally left blank)</w:t>
+        <w:t>▪ Specialize magnet winding wires: a) For PICC - 26 days per month resulting in 312 working days in a year with per day three operating shifts with actual run time of 5.6 hours per shift. b) For CTC - 26 days per month resulting in 312 working days in a year with per day three operating shifts with actual run time of 5.2 hours per shift. ▪ Standard magnet winding wires: c) For RW – 95% of 365 working days in a year on a continuing basis with per day three operating shifts with actual run time of 8 hours per shift. ● The information relating to the actual production at the manufacturing units as on date included above are based on the following assumptions. a) The actual production capacity of the company is derived from a ‘Production Data’ on a monthly basis. a) Capacity utilization has been calculated on the basis of actual production during the relevant Fiscal/ period divided by the aggregate available capacity as of at the end of the relevant period. The inspection report is based on situation observed at the time of date if inspection. ● The Company is expanding by setting up a plant at 456, Park Street, Block B, Kolkata – 700 016. The proposed plant will be developed in phases: Phase I, named Alpha I, with an installed capacity of 12,000 MT per annum, and Phase II, named Beta I, with a proposed installed capacity of 18,000 MT per annum. Currently, a consent to operate dated September 19, 2025, has been obtained from the Maharashtra Pollution Control Board for Phase I CTO and commercial production of Phase I commenced in September 2025. Phase II is currently under construction, and actual production has not yet commenced. (The remainder of the page is intentionally left blank)</w:t>
       </w:r>
     </w:p>
     <w:p>
@@ -1632,7 +1632,7 @@
     </w:p>
     <w:p>
       <w:r>
-        <w:t>26. Our operations are dependent on our new product and process development, thus our inability to introduce new products and processes and respond to changing customer preferences in a timely and effective manner, may have an adverse effect on our business, results of operations and financial condition. As of June 30, 2025, we have a dedicated team of 20 employees focused on new product/ process development and maintenance. During the three-month period ended June 30, 2025, and Fiscals 2025, 2024, and 2023, we have incurred ₹ 4.49 million, ₹ 12.62 million, ₹ 11.22 million and ₹ 9.31 million aggregating to 3.99%, 3.18%, 2.89% and 3.33% of the employee benefit expenses incurred during the respective period/ years, on the new product and process development team. Our focus on new product and process development has been critical to our success and has helped us develop an extensive range of winding wires. Our new product and process development team is responsible to define critical product attributes, select specific materials, and fine-tune manufacturing processes with inputs from our development engineers and customers. Our future growth may depend in part on our ability to respond to technological advancement and emerging standards, and practices on a cost-effective and timely basis. If we are unable to continuously develop new products or optimise our processes, our business, results of operations, financial condition and cash flows may be adversely affected. Further, delays in any part of the process, our inability to obtain necessary regulatory approvals for our products or failure of a product to be successful at any stage of its development will result in our inability to timely offer products that satisfy the market, which might allow competing products to emerge during the development and certification process and could adversely affect our business. Delays in introducing new products and enhancements, the failure to choose correctly among technical alternatives or the failure to offer innovative products or enhancements at competitive prices may cause existing and potential customers to purchase our competitors’ products. Though we strive to align our solutions with requirements of our customers, there can be no assurance that we will be able to secure the necessary knowledge through our own in-house product development that will allow us to continue to develop our offerings in accordance with the requirements of our customers and industry trends. 22. Our ability to access capital at attractive costs depends on our credit ratings. Non-availability of credit ratings or a poor rating may restrict our access to capital and thereby adversely affect our business, financial conditions, cash flows and results of operations. The cost and availability of capital depends on our credit ratings. Set out below are our credit ratings received from [COMPANY_038], in the three-month period ended June 30, 2025, Fiscals 2025, 2024 and 2023: Date Rating Outlo ok Facilities/ Instrument December 10, 2024 ‘CARE A-’ Stable Long Term Bank Facilities ‘CARE A-’ Stable/ CARE A2 Long Term / Short Term Bank Facilities ‘CARE A2’ N.A. Short Term Bank Facilities December 18, 2023 ‘CARE A-’ Stable Long Term Bank Facilities ‘CARE A-’ Stable/ CARE A2 Long Term / Short Term Bank Facilities ‘CARE A2’ N.A. Short Term Bank Facilities ‘CARE A2’ N.A. Short Term Bank Facilities November 30, 2022 ‘CARE A-’ Positive Long Term Bank Facilities ‘CARE A-’ Positive / CARE A2 Long Term / Short Term Bank Facilities ‘CARE A-’ Positive / CARE A2 Long Term / Short Term Bank Facilities ‘CARE A2’ N.A. Short Term Bank Facilities An inability to secure future financing on attractive terms or at all may adversely impact our strategic initiatives and our business prospects. Credit ratings reflect the opinion of the rating agency on our management, track record, diversified clientele, increase in scale and operations and margins, medium term revenue visibility and operating cycle. While our rating outlook has been revised from ‘positive’ to ‘stable’ in our latest ratings obtained on December 10, 2024, we have not experienced downgrading in our credit ratings received in the last three-month period ended June 30, 2025 or Fiscals 2025, 2024 and 2023, any downgrade in our credit ratings or our inability to obtain such credit rating in a timely manner or any non-availability of credit ratings, or poor ratings, could increase borrowing costs, will give the right to our lenders to review the facilities availed by us under our financing arrangements and adversely affect our access to capital and debt markets, which could in turn adversely affect our interest margins, our business, results of operations, financial condition and cash flows.</w:t>
+        <w:t>26. Our operations are dependent on our new product and process development, thus our inability to introduce new products and processes and respond to changing customer preferences in a timely and effective manner, may have an adverse effect on our business, results of operations and financial condition. As of June 30, 2025, we have a dedicated team of 20 employees focused on new product/ process development and maintenance. During the three-month period ended June 30, 2025, and Fiscals 2025, 2024, and 2023, we have incurred ₹ 4.49 million, ₹ 12.62 million, ₹ 11.22 million and ₹ 9.31 million aggregating to 3.99%, 3.18%, 2.89% and 3.33% of the employee benefit expenses incurred during the respective period/ years, on the new product and process development team. Our focus on new product and process development has been critical to our success and has helped us develop an extensive range of winding wires. Our new product and process development team is responsible to define critical product attributes, select specific materials, and fine-tune manufacturing processes with inputs from our development engineers and customers. Our future growth may depend in part on our ability to respond to technological advancement and emerging standards, and practices on a cost-effective and timely basis. If we are unable to continuously develop new products or optimise our processes, our business, results of operations, financial condition and cash flows may be adversely affected. Further, delays in any part of the process, our inability to obtain necessary regulatory approvals for our products or failure of a product to be successful at any stage of its development will result in our inability to timely offer products that satisfy the market, which might allow competing products to emerge during the development and certification process and could adversely affect our business. Delays in introducing new products and enhancements, the failure to choose correctly among technical alternatives or the failure to offer innovative products or enhancements at competitive prices may cause existing and potential customers to purchase our competitors’ products. Though we strive to align our solutions with requirements of our customers, there can be no assurance that we will be able to secure the necessary knowledge through our own in-house product development that will allow us to continue to develop our offerings in accordance with the requirements of our customers and industry trends. 22. Our ability to access capital at attractive costs depends on our credit ratings. Non-availability of credit ratings or a poor rating may restrict our access to capital and thereby adversely affect our business, financial conditions, cash flows and results of operations. The cost and availability of capital depends on our credit ratings. Set out below are our credit ratings received from Initech Solutions Limited, in the three-month period ended June 30, 2025, Fiscals 2025, 2024 and 2023: Date Rating Outlo ok Facilities/ Instrument December 10, 2024 ‘CARE A-’ Stable Long Term Bank Facilities ‘CARE A-’ Stable/ CARE A2 Long Term / Short Term Bank Facilities ‘CARE A2’ N.A. Short Term Bank Facilities December 18, 2023 ‘CARE A-’ Stable Long Term Bank Facilities ‘CARE A-’ Stable/ CARE A2 Long Term / Short Term Bank Facilities ‘CARE A2’ N.A. Short Term Bank Facilities ‘CARE A2’ N.A. Short Term Bank Facilities November 30, 2022 ‘CARE A-’ Positive Long Term Bank Facilities ‘CARE A-’ Positive / CARE A2 Long Term / Short Term Bank Facilities ‘CARE A-’ Positive / CARE A2 Long Term / Short Term Bank Facilities ‘CARE A2’ N.A. Short Term Bank Facilities An inability to secure future financing on attractive terms or at all may adversely impact our strategic initiatives and our business prospects. Credit ratings reflect the opinion of the rating agency on our management, track record, diversified clientele, increase in scale and operations and margins, medium term revenue visibility and operating cycle. While our rating outlook has been revised from ‘positive’ to ‘stable’ in our latest ratings obtained on December 10, 2024, we have not experienced downgrading in our credit ratings received in the last three-month period ended June 30, 2025 or Fiscals 2025, 2024 and 2023, any downgrade in our credit ratings or our inability to obtain such credit rating in a timely manner or any non-availability of credit ratings, or poor ratings, could increase borrowing costs, will give the right to our lenders to review the facilities availed by us under our financing arrangements and adversely affect our access to capital and debt markets, which could in turn adversely affect our interest margins, our business, results of operations, financial condition and cash flows.</w:t>
       </w:r>
     </w:p>
     <w:p>
@@ -1704,7 +1704,7 @@
     </w:p>
     <w:p>
       <w:r>
-        <w:t>34. Our Company has availed unsecured loans from financial institutions which may be recalled on demand. As of October 31, 2025, our Company has outstanding unsecured loans amounting to ₹ 397.59 million as unsecured loans for our working capital requirements from financial institutions which is repayable on demand to the relevant lenders. These loans are not repayable in accordance with any agreed repayment schedule and may be recalled by the relevant lender at any time. In such cases, our Company may be required to repay the entirety of the unsecured loans together with accrued interest. Our Company may not be able to generate sufficient funds at short notice to be able to repay such loans and may resort to refinancing such loans at a higher rate of interest and on terms not favourable to it. If we are unable to arrange for any such financing arrangements, we may not have adequate working capital to carry out the operations or complete our ongoing operations. Failure to repay unsecured loans in a timely manner may have a material adverse effect on our business, cash flows and financial condition. For further details of unsecured loans of our Company, see, “ Restated Financial Statement ” on page 280. 25. We depend on our Individual Promoters, Senior Management, Key Management Personnel and qualified and skilled personnel with technical expertise, and if we are unable to recruit and retain senior management, qualified and skilled personnel, our business and our ability to operate or grow our business maybe adversely affected. We are led by our Individual Promoters [PERSON_002], [PERSON_003], [PERSON_004], [PERSON_005] and [PERSON_006]. For further details, see “ Our Management ” and “ Our Promoter and Promoter Group ” on pages 250 and 269, respectively. Our future performance would depend on the continued service of our Individual Promoters, Senior Management, Key Managerial Personnel, qualified and skilled personnel with technical expertise, and the loss of any senior employee and the inability to find an adequate replacement may impair our relationship with key customers and our level of technical expertise, which may adversely affect our business, cash flows, financial condition, results of operations and prospects. Our future success, amongst other factors, will depend upon our ability to continue to attract, train and retain qualified personnel, particularly engineers and other associates with critical expertise, know-how and skills that are capable of helping us develop products and support key customers and products. We may therefore need to increase compensation and other benefits in order to attract and retain personnel in the future, which may adversely affect our business, financial conditions, cash flows and results of operations. As on date, our Company does not have a business succession policy in place, and there can be no assurance that we will be able to effectively formulate or implement appropriate succession plans in the future. Any loss of members of our senior management team or key managerial personnel could significantly delay or prevent the achievement of our business objectives, affect our succession planning and could harm our business and customer relationships. While there have not been any instances of where we have not been able to effectively replace our members of senior management, or loss of key managerial personnel in the three-month period ended June 30, 2025, and the Fiscals 2025, 2024 and 2023, we cannot assure you that we would be effectively able to replace any loss of members of our senior management team or key managerial personnels in the future. The market for qualified professionals is competitive and we may not continue to be successful in our efforts to attract and retain qualified people. The specialized skills we require in our industry are difficult and time-consuming to acquire and, as a result, are in short supply. Our inability to hire, train and retain a sufficient number of qualified personnel could delay our ability to bring new products to the market and impair the success of our operations. We may also be required to increase our levels of employee compensation and benefits more rapidly than in the past to remain competitive in attracting skilled personnel. This could have an adverse effect on our business, financial conditions, cash flows and results of operations. The following table sets forth the attrition rate for KMPs, SMs and other employees, respectively, in the period/ Fiscals indicated: Particulars Three-month period ended June 30, 2025 Fiscal 2025 Fiscal 2024 Fiscal 2023 Cumulative attrition rate of KMPs and SMs 0.00% Particulars Three-month period ended June 30, 2025 Fiscal 2025 Fiscal 2024 Fiscal 2023 Employee attrition rate (excluding KMPs/ SMs) 4.00%</w:t>
+        <w:t>34. Our Company has availed unsecured loans from financial institutions which may be recalled on demand. As of October 31, 2025, our Company has outstanding unsecured loans amounting to ₹ 397.59 million as unsecured loans for our working capital requirements from financial institutions which is repayable on demand to the relevant lenders. These loans are not repayable in accordance with any agreed repayment schedule and may be recalled by the relevant lender at any time. In such cases, our Company may be required to repay the entirety of the unsecured loans together with accrued interest. Our Company may not be able to generate sufficient funds at short notice to be able to repay such loans and may resort to refinancing such loans at a higher rate of interest and on terms not favourable to it. If we are unable to arrange for any such financing arrangements, we may not have adequate working capital to carry out the operations or complete our ongoing operations. Failure to repay unsecured loans in a timely manner may have a material adverse effect on our business, cash flows and financial condition. For further details of unsecured loans of our Company, see, “ Restated Financial Statement ” on page 280. 25. We depend on our Individual Promoters, Senior Management, Key Management Personnel and qualified and skilled personnel with technical expertise, and if we are unable to recruit and retain senior management, qualified and skilled personnel, our business and our ability to operate or grow our business maybe adversely affected. We are led by our Individual Promoters Jane Smith, Peter Parker, Alex Morgan, Taylor Brown and Jordan Lee. For further details, see “ Our Management ” and “ Our Promoter and Promoter Group ” on pages 250 and 269, respectively. Our future performance would depend on the continued service of our Individual Promoters, Senior Management, Key Managerial Personnel, qualified and skilled personnel with technical expertise, and the loss of any senior employee and the inability to find an adequate replacement may impair our relationship with key customers and our level of technical expertise, which may adversely affect our business, cash flows, financial condition, results of operations and prospects. Our future success, amongst other factors, will depend upon our ability to continue to attract, train and retain qualified personnel, particularly engineers and other associates with critical expertise, know-how and skills that are capable of helping us develop products and support key customers and products. We may therefore need to increase compensation and other benefits in order to attract and retain personnel in the future, which may adversely affect our business, financial conditions, cash flows and results of operations. As on date, our Company does not have a business succession policy in place, and there can be no assurance that we will be able to effectively formulate or implement appropriate succession plans in the future. Any loss of members of our senior management team or key managerial personnel could significantly delay or prevent the achievement of our business objectives, affect our succession planning and could harm our business and customer relationships. While there have not been any instances of where we have not been able to effectively replace our members of senior management, or loss of key managerial personnel in the three-month period ended June 30, 2025, and the Fiscals 2025, 2024 and 2023, we cannot assure you that we would be effectively able to replace any loss of members of our senior management team or key managerial personnels in the future. The market for qualified professionals is competitive and we may not continue to be successful in our efforts to attract and retain qualified people. The specialized skills we require in our industry are difficult and time-consuming to acquire and, as a result, are in short supply. Our inability to hire, train and retain a sufficient number of qualified personnel could delay our ability to bring new products to the market and impair the success of our operations. We may also be required to increase our levels of employee compensation and benefits more rapidly than in the past to remain competitive in attracting skilled personnel. This could have an adverse effect on our business, financial conditions, cash flows and results of operations. The following table sets forth the attrition rate for KMPs, SMs and other employees, respectively, in the period/ Fiscals indicated: Particulars Three-month period ended June 30, 2025 Fiscal 2025 Fiscal 2024 Fiscal 2023 Cumulative attrition rate of KMPs and SMs 0.00% Particulars Three-month period ended June 30, 2025 Fiscal 2025 Fiscal 2024 Fiscal 2023 Employee attrition rate (excluding KMPs/ SMs) 4.00%</w:t>
       </w:r>
     </w:p>
     <w:p>
@@ -1740,7 +1740,7 @@
     </w:p>
     <w:p>
       <w:r>
-        <w:t>or qualified replacements, our results of operations may be adversely affected. For details of changes in our key management personnel, please see “ Our Management ” on page 250. An increase in employee attrition rates may result in an increase in recruitment and training costs for new hires, a decline in productivity and efficiency and loss of knowledge, skill and expertise. We cannot provide assurance that we will be able to grow our workforce in a manner consistent with our growth objectives, which may adversely affect our business, results of operations, cash flows and financial condition. 36. Apart from two of our Directors, none of our Directors have any prior experience of directorships in listed companies. Post listing of the Equity Shares on the Stock Exchanges, our Company will be subject to the applicable regulatory requirements of a listed company, including regulations prescribed under SEBI Listing Regulations and the Companies Act. Any non-compliance with the regulatory requirements, due to lack of experience or otherwise, may subject us to adverse regulatory actions. As of the date of this Red Herring Prospectus, our Board comprises of eight Directors, of which four are Executive Directors, and four are Independent Directors (including one woman Independent Director). While all of our directors have several years of experience and expertise in their respective fields, apart from two of our Independent Directors, namely [PERSON_030] and [PERSON_031], none of our Directors, are currently on the board of directors of companies that are listed on the stock exchanges in India or outside India. Accordingly, most of our Directors have limited exposure to management of affairs of a listed company which, inter alia, entails several compliance requirements and scrutiny of affairs by shareholders, regulators and the public at large that is associated with being a listed company. Post listing of the Equity Shares on the Stock Exchanges, our Company will be subject to the applicable regulatory requirements of a listed company, including the regulations prescribed under the SEBI Listing Regulations and the Companies Act. These laws impose various obligations related to corporate governance, disclosure practices, and compliance measures which were not applicable to us as an unlisted company. Any delay or non-compliance with such applicable regulatory requirements, due to lack of experience or otherwise, may present certain potential challenges for our Company including but not limited to adverse regulatory actions or imposition of fines. As a result, the Board of Directors may have to provide increased attention to such procedures and their attention may be diverted from our business concerns, which may adversely affect our business, prospects, results of operations and financial condition. 26. We currently avail benefits under certain Government incentive schemes. Cancellation or our inability to meet the conditions under such schemes may result in adversely affect our business operations, cash flows, results of operations and financial condition. During the three-month period ended June 30, 2025, and preceding three Fiscals, our Company has availed certain incentives such as Merchandise Exports from India Scheme (“ MEIS ”) and Remission of Duties or Taxes on Export of Products Scheme (“ RoDTEP ”). The table below sets forth details relating to government incentive schemes: Three-month period ended June 30, 2025 Fiscal 2025 Fiscal 2024 Fiscal 2023 Governmen t Incentive schemes ( ₹ in millio n) Percentage of Revenue from Operations (%) Government Incentive schemes ( ₹ in million) Percentage of Revenue from Operation s (%) Government Incentive schemes ( ₹ in million) Percentage of Revenue from Operation s (%) Government Incentive schemes ( ₹ in million) Percentage of Revenue from Operation s (%) 0 0% 0.75 In relation to our upcoming projects, including in relation to, setting up of our Supa Facility, we expect to receive incentives from the Maharashtra State Government under the Maharashtra Industrial Policy, 2019 (“ MIP ”), which aims to incentivise the companies for setting up and/ or expanding existing facilities primarily based on certain revenue parameters. Key incentive under the MIP includes tax benefits of 50% of gross state GST for local sales made within Maharashtra, and customized benefits to mega and ultra mega units on a case-to-case basis.</w:t>
+        <w:t>or qualified replacements, our results of operations may be adversely affected. For details of changes in our key management personnel, please see “ Our Management ” on page 250. An increase in employee attrition rates may result in an increase in recruitment and training costs for new hires, a decline in productivity and efficiency and loss of knowledge, skill and expertise. We cannot provide assurance that we will be able to grow our workforce in a manner consistent with our growth objectives, which may adversely affect our business, results of operations, cash flows and financial condition. 36. Apart from two of our Directors, none of our Directors have any prior experience of directorships in listed companies. Post listing of the Equity Shares on the Stock Exchanges, our Company will be subject to the applicable regulatory requirements of a listed company, including regulations prescribed under SEBI Listing Regulations and the Companies Act. Any non-compliance with the regulatory requirements, due to lack of experience or otherwise, may subject us to adverse regulatory actions. As of the date of this Red Herring Prospectus, our Board comprises of eight Directors, of which four are Executive Directors, and four are Independent Directors (including one woman Independent Director). While all of our directors have several years of experience and expertise in their respective fields, apart from two of our Independent Directors, namely Emerson Cole and Phoenix Day, none of our Directors, are currently on the board of directors of companies that are listed on the stock exchanges in India or outside India. Accordingly, most of our Directors have limited exposure to management of affairs of a listed company which, inter alia, entails several compliance requirements and scrutiny of affairs by shareholders, regulators and the public at large that is associated with being a listed company. Post listing of the Equity Shares on the Stock Exchanges, our Company will be subject to the applicable regulatory requirements of a listed company, including the regulations prescribed under the SEBI Listing Regulations and the Companies Act. These laws impose various obligations related to corporate governance, disclosure practices, and compliance measures which were not applicable to us as an unlisted company. Any delay or non-compliance with such applicable regulatory requirements, due to lack of experience or otherwise, may present certain potential challenges for our Company including but not limited to adverse regulatory actions or imposition of fines. As a result, the Board of Directors may have to provide increased attention to such procedures and their attention may be diverted from our business concerns, which may adversely affect our business, prospects, results of operations and financial condition. 26. We currently avail benefits under certain Government incentive schemes. Cancellation or our inability to meet the conditions under such schemes may result in adversely affect our business operations, cash flows, results of operations and financial condition. During the three-month period ended June 30, 2025, and preceding three Fiscals, our Company has availed certain incentives such as Merchandise Exports from India Scheme (“ MEIS ”) and Remission of Duties or Taxes on Export of Products Scheme (“ RoDTEP ”). The table below sets forth details relating to government incentive schemes: Three-month period ended June 30, 2025 Fiscal 2025 Fiscal 2024 Fiscal 2023 Governmen t Incentive schemes ( ₹ in millio n) Percentage of Revenue from Operations (%) Government Incentive schemes ( ₹ in million) Percentage of Revenue from Operation s (%) Government Incentive schemes ( ₹ in million) Percentage of Revenue from Operation s (%) Government Incentive schemes ( ₹ in million) Percentage of Revenue from Operation s (%) 0 0% 0.75 In relation to our upcoming projects, including in relation to, setting up of our Supa Facility, we expect to receive incentives from the Maharashtra State Government under the Maharashtra Industrial Policy, 2019 (“ MIP ”), which aims to incentivise the companies for setting up and/ or expanding existing facilities primarily based on certain revenue parameters. Key incentive under the MIP includes tax benefits of 50% of gross state GST for local sales made within Maharashtra, and customized benefits to mega and ultra mega units on a case-to-case basis.</w:t>
       </w:r>
     </w:p>
     <w:p>
@@ -1776,7 +1776,7 @@
     </w:p>
     <w:p>
       <w:r>
-        <w:t>with effect from February 5, 2025 for certain categories of beneficiaries which also includes our Company. Further, our inability to meet the conditions as prescribed under such schemes would make our Company less competitive against its competitors who have been availing this scheme by complying all conditions. 38. We may be unable to adequately protect intellectual property that we use and may be subject to risks of infringement claims. We rely on our trademarks to protect our intellectual property, which is critical to our business. The protection of our intellectual property rights may require the expenditure of financial, managerial and operational resources. We rely on a combination of laws and regulations, confidentiality of information and contractual restrictions to protect our intellectual property. Despite our efforts to protect and enforce our proprietary rights, unauthorized parties have used, and may in the future use, our trademarks or similar trademarks, copy aspects of our website images, features, compilation and functionality or obtain and use information that we consider as proprietary, such as trade secrets. Our trademark “KSH” is also used by 18 other entities, including, (i) [COMPANY_018]; (ii) [COMPANY_019]; (iii) [COMPANY_020]; (iv) [COMPANY_021]; (v) [COMPANY_022]; (vi) [COMPANY_023]; (vii) [COMPANY_024]; (viii) [COMPANY_025]; (ix) [COMPANY_026]; (x) [COMPANY_027]; (xi) [COMPANY_028]; (xii) [COMPANY_029]; (xiii) [COMPANY_002]; (xiv) [COMPANY_030]; (xv) [COMPANY_031]; (xvi) [COMPANY_032]; (xvii) [COMPANY_033]; and (xviii) [COMPANY_034] (“ Group Entities ”). We have entered into consent and waiver letters each dated May 22, 2025, respectively, and authorisation letter dated November 27, 2025, with the Group Entities setting out the arrangement on usage of the brand “KSH”. As of date of this Red Herring Prospectus, we have permitted the Group Entities to use the “KSH” trademark without any payment, provided that certain terms and conditions therein are met. We cannot assure you that any waiver of consideration for using the “KSH” trademark would not have any adverse effect on our financial condition. Further, we do not hold any patents over our product formulae and have not made any applications in this respect. We may therefore not be able to prevent our competitors from developing, using or commercializing products that are functionally equivalent or similar to our products. This may lead to reduction in sales of some of our products. Additionally, the process of obtaining intellectual property protection is expensive and time-consuming, and the amount of compensation for damages can be limited. Even if issued, trademarks may not adequately protect our intellectual property, as the legal standards relating to the validity, enforceability and scope of protection of trademark and other intellectual property rights are applied on a case-by-case basis and it is generally difficult to predict the results of any litigation relating to such matters. Any litigation, whether or not it is resolved in our favour, could result in significant expense to us and divert the efforts of our technical and management personnel, which may adversely affect our business, financial condition, cash flows and results of operations. While there have not been any instances of infringement of our intellectual property rights which have come to our knowledge in the three-month period ended June 30, 2025 or Fiscals 2025, 2024 and 2023, we cannot assure you that such instances shall not occur in the future. 27. Our insurance coverage may not be sufficient or adequate to protect us against all material hazards, which may adversely affect our business, results of operations, financial condition and cash flows Our operations are subject to various risks inherent in the manufacturing industry including defects, liability for product and/or property damage, malfunctions and failures of manufacturing equipment, fire, riots, strikes, explosions, loss-in-transit for our products, accidents, personal injury or death, environmental pollution and natural disasters. We maintain ongoing insurance policies in order to manage the risk of losses from potentially harmful events, including: (i) marine open inland transit insurance; (ii) marine open export transit insurance (iii) standard fire and special perils policy; (iv) industrial all risk policy; (v) public liability industrial policy; and (vi) money insurance policy; (vii) group health insurance policy and (viii) burglary first loss policy. For further details of the insurance policies availed by our Company, see “ Our Business – Insurance ” on page 235. Our insurance may not be adequate to completely cover any or all of our risks and liabilities. Further, there is no assurance that the insurance premiums payable by us will be commercially viable or justifiable. Accordingly, our inability to maintain adequate insurance cover in connection with our business could adversely affect our operations and profitability. The following table sets forth our insurance cover in absolute amount and as a percentage of net assets as of the dates indicated:</w:t>
+        <w:t>with effect from February 5, 2025 for certain categories of beneficiaries which also includes our Company. Further, our inability to meet the conditions as prescribed under such schemes would make our Company less competitive against its competitors who have been availing this scheme by complying all conditions. 38. We may be unable to adequately protect intellectual property that we use and may be subject to risks of infringement claims. We rely on our trademarks to protect our intellectual property, which is critical to our business. The protection of our intellectual property rights may require the expenditure of financial, managerial and operational resources. We rely on a combination of laws and regulations, confidentiality of information and contractual restrictions to protect our intellectual property. Despite our efforts to protect and enforce our proprietary rights, unauthorized parties have used, and may in the future use, our trademarks or similar trademarks, copy aspects of our website images, features, compilation and functionality or obtain and use information that we consider as proprietary, such as trade secrets. Our trademark “KSH” is also used by 18 other entities, including, (i) Initech Solutions Limited; (ii) Hooli Technologies Limited; (iii) Pied Piper Inc.; (iv) Stark Industries Limited; (v) Wayne Enterprises Limited; (vi) Oscorp Limited; (vii) Vance Refrigeration LLC; (viii) Dunder Mifflin Private Limited; (ix) Soylent Corp Limited; (x) Tyrell Corporation; (xi) Cyberdyne Systems Limited; (xii) Massive Dynamic Inc.; (xiii) Wayne Enterprises Limited; (xiv) Aperture Science LLC; (xv) Wonka Industries Limited; (xvi) Weyland Corp Limited; (xvii) Bluth Company LLC; and (xviii) Sterling Cooper Limited (“ Group Entities ”). We have entered into consent and waiver letters each dated May 22, 2025, respectively, and authorisation letter dated November 27, 2025, with the Group Entities setting out the arrangement on usage of the brand “KSH”. As of date of this Red Herring Prospectus, we have permitted the Group Entities to use the “KSH” trademark without any payment, provided that certain terms and conditions therein are met. We cannot assure you that any waiver of consideration for using the “KSH” trademark would not have any adverse effect on our financial condition. Further, we do not hold any patents over our product formulae and have not made any applications in this respect. We may therefore not be able to prevent our competitors from developing, using or commercializing products that are functionally equivalent or similar to our products. This may lead to reduction in sales of some of our products. Additionally, the process of obtaining intellectual property protection is expensive and time-consuming, and the amount of compensation for damages can be limited. Even if issued, trademarks may not adequately protect our intellectual property, as the legal standards relating to the validity, enforceability and scope of protection of trademark and other intellectual property rights are applied on a case-by-case basis and it is generally difficult to predict the results of any litigation relating to such matters. Any litigation, whether or not it is resolved in our favour, could result in significant expense to us and divert the efforts of our technical and management personnel, which may adversely affect our business, financial condition, cash flows and results of operations. While there have not been any instances of infringement of our intellectual property rights which have come to our knowledge in the three-month period ended June 30, 2025 or Fiscals 2025, 2024 and 2023, we cannot assure you that such instances shall not occur in the future. 27. Our insurance coverage may not be sufficient or adequate to protect us against all material hazards, which may adversely affect our business, results of operations, financial condition and cash flows Our operations are subject to various risks inherent in the manufacturing industry including defects, liability for product and/or property damage, malfunctions and failures of manufacturing equipment, fire, riots, strikes, explosions, loss-in-transit for our products, accidents, personal injury or death, environmental pollution and natural disasters. We maintain ongoing insurance policies in order to manage the risk of losses from potentially harmful events, including: (i) marine open inland transit insurance; (ii) marine open export transit insurance (iii) standard fire and special perils policy; (iv) industrial all risk policy; (v) public liability industrial policy; and (vi) money insurance policy; (vii) group health insurance policy and (viii) burglary first loss policy. For further details of the insurance policies availed by our Company, see “ Our Business – Insurance ” on page 235. Our insurance may not be adequate to completely cover any or all of our risks and liabilities. Further, there is no assurance that the insurance premiums payable by us will be commercially viable or justifiable. Accordingly, our inability to maintain adequate insurance cover in connection with our business could adversely affect our operations and profitability. The following table sets forth our insurance cover in absolute amount and as a percentage of net assets as of the dates indicated:</w:t>
       </w:r>
     </w:p>
     <w:p>
@@ -1848,7 +1848,7 @@
     </w:p>
     <w:p>
       <w:r>
-        <w:t>45. Any variation in the utilization of the Net Proceeds as disclosed in this Red Herring Prospectus shall be subject to certain compliance requirements, including prior approval of the shareholders of our Company. We propose to utilize the Net Proceeds towards (i) Prepayment and/or repayment, in full or in part, of all or a portion of certain outstanding borrowings availed by our Company; (ii) Funding the capital expenditure requirements of our Company towards (b) purchasing and setting up of new machinery for expansion at our Supa Facility; and (b) purchasing and setting up of new machinery at Unit 2 in Chakan, Pune in Maharashtra; (iii) Funding the capital expenditure requirements of our Company towards purchasing and setting up of a rooftop solar power plant for power generation at our Supa Facility; and (iv) general corporate purposes. For further details of the proposed objects of the Offer, see “ Objects of the Offer ” on page 106. Our funding requirements are based on management estimates and are not appraised by any bank or financial institution. The deployment of the Net Proceeds will be at the discretion of our Board. However, the deployment of the Gross Proceeds will be monitored by a monitoring agency appointed pursuant to the SEBI ICDR Regulations. Further, we cannot determine with any certainty if we would require the Net Proceeds to meet another expenditure or fund any exigencies arising out of the competitive environment, business conditions, economic conditions or other factors beyond our control. In accordance with the Companies Act, 2013 and the SEBI ICDR Regulations, we cannot undertake variation in the utilization of the Net Proceeds as disclosed in this Red Herring Prospectus without obtaining the approval of the Shareholders through a special resolution. In the event of any such circumstances that require us to vary the disclosed utilization of the Net Proceeds, we may not be able to obtain the approval of the Shareholders in a timely manner, or at all. Any delay or inability in obtaining such approval of the Shareholders may adversely affect our business or operations. Further, our Promoters would be required to provide an exit opportunity to the shareholders of our Company who do not agree with our proposal to modify the objects of the Offer, at a price and manner as prescribed by SEBI. Additionally, the requirement on Promoters to provide an exit opportunity to such dissenting shareholders of our Company may deter our Promoters from agreeing to the variation of the proposed utilization of the Net Proceeds, even if such variation is in the interest of our Company. Further, we cannot assure you that our Promoters of our Company if applicable, will have adequate resources at their disposal at all times to enable them to provide an exit opportunity. In light of these factors, we may not be able to vary the objects of the Offer to use any unutilized proceeds of the Fresh Issue, if any, even if such variation is in the interest of our Company. This may restrict our Company’s ability to respond to any change in our business or financial condition by re-deploying the unutilized portion of Net Proceeds, if any, which may adversely affect our business, financial conditions, cash flows and results of operations. 30. We may be susceptible to liabilities arising from violation of applicable anti-bribery and anti-corruption laws. We are subject to anti-corruption and anti-bribery laws that prohibit improper payments or offers of improper payments to governments and their officials and political parties for the purpose of obtaining or retaining business or securing an improper advantage and require the maintenance of internal controls to prevent such payments. Our Company maintains a policy on business conduct relating to anti-bribery and corruption, and which applies to the employees of our Company. Notwithstanding this, our employees might take actions that could expose us to liability under anti-bribery laws. In certain circumstances, we may be held liable for actions taken by our partners and agents, even though they are not always subject to our control. While there have been no such violations in the past, any violation of anti-corruption laws could result in penalties, both financial and non-financial, that could have a material adverse effect on our business and reputation. 31. Our ability to pay dividends in the future will depend on our future cash flows, working capital requirements, capital expenditures and financial condition. We have not declared and paid dividend in the previous three Fiscals. For details, see section titled “ Dividend Policy ” on page 279. However, the amount of our future dividend payments, if any, will depend on our future earnings, cash flows, financial condition, working capital requirements, capital expenditures, applicable Indian legal restrictions and other factors. There can be no assurance that we will pay dividends. We may decide to retain all of our earnings to finance the development and expansion of our business and, therefore, may not declare dividends on our Equity Shares. Additionally, in the future, we may be restricted by the terms of our financing agreements in making dividend payments unless otherwise agreed with our lenders. 32. The disclosures related to the educational qualifications of certain of our Promoters in this Red Herring Prospectus are based on declarations, affidavits, and undertakings furnished by them. Our Promoter, Chairman and Executive Director, [PERSON_002], and our Promoter, [PERSON_028] have been unable to trace copies of certain documents pertaining to their educational qualifications. While they have taken the requisite steps to obtain the relevant supporting documentation, they have been unsuccessful in procuring the relevant supporting documentation. Accordingly, we have placed reliance on affidavits furnished by them to disclose the details of their educational qualifications in this Red Herring Prospectus and we have not been able to independently</w:t>
+        <w:t>45. Any variation in the utilization of the Net Proceeds as disclosed in this Red Herring Prospectus shall be subject to certain compliance requirements, including prior approval of the shareholders of our Company. We propose to utilize the Net Proceeds towards (i) Prepayment and/or repayment, in full or in part, of all or a portion of certain outstanding borrowings availed by our Company; (ii) Funding the capital expenditure requirements of our Company towards (b) purchasing and setting up of new machinery for expansion at our Supa Facility; and (b) purchasing and setting up of new machinery at Unit 2 in Chakan, Pune in Maharashtra; (iii) Funding the capital expenditure requirements of our Company towards purchasing and setting up of a rooftop solar power plant for power generation at our Supa Facility; and (iv) general corporate purposes. For further details of the proposed objects of the Offer, see “ Objects of the Offer ” on page 106. Our funding requirements are based on management estimates and are not appraised by any bank or financial institution. The deployment of the Net Proceeds will be at the discretion of our Board. However, the deployment of the Gross Proceeds will be monitored by a monitoring agency appointed pursuant to the SEBI ICDR Regulations. Further, we cannot determine with any certainty if we would require the Net Proceeds to meet another expenditure or fund any exigencies arising out of the competitive environment, business conditions, economic conditions or other factors beyond our control. In accordance with the Companies Act, 2013 and the SEBI ICDR Regulations, we cannot undertake variation in the utilization of the Net Proceeds as disclosed in this Red Herring Prospectus without obtaining the approval of the Shareholders through a special resolution. In the event of any such circumstances that require us to vary the disclosed utilization of the Net Proceeds, we may not be able to obtain the approval of the Shareholders in a timely manner, or at all. Any delay or inability in obtaining such approval of the Shareholders may adversely affect our business or operations. Further, our Promoters would be required to provide an exit opportunity to the shareholders of our Company who do not agree with our proposal to modify the objects of the Offer, at a price and manner as prescribed by SEBI. Additionally, the requirement on Promoters to provide an exit opportunity to such dissenting shareholders of our Company may deter our Promoters from agreeing to the variation of the proposed utilization of the Net Proceeds, even if such variation is in the interest of our Company. Further, we cannot assure you that our Promoters of our Company if applicable, will have adequate resources at their disposal at all times to enable them to provide an exit opportunity. In light of these factors, we may not be able to vary the objects of the Offer to use any unutilized proceeds of the Fresh Issue, if any, even if such variation is in the interest of our Company. This may restrict our Company’s ability to respond to any change in our business or financial condition by re-deploying the unutilized portion of Net Proceeds, if any, which may adversely affect our business, financial conditions, cash flows and results of operations. 30. We may be susceptible to liabilities arising from violation of applicable anti-bribery and anti-corruption laws. We are subject to anti-corruption and anti-bribery laws that prohibit improper payments or offers of improper payments to governments and their officials and political parties for the purpose of obtaining or retaining business or securing an improper advantage and require the maintenance of internal controls to prevent such payments. Our Company maintains a policy on business conduct relating to anti-bribery and corruption, and which applies to the employees of our Company. Notwithstanding this, our employees might take actions that could expose us to liability under anti-bribery laws. In certain circumstances, we may be held liable for actions taken by our partners and agents, even though they are not always subject to our control. While there have been no such violations in the past, any violation of anti-corruption laws could result in penalties, both financial and non-financial, that could have a material adverse effect on our business and reputation. 31. Our ability to pay dividends in the future will depend on our future cash flows, working capital requirements, capital expenditures and financial condition. We have not declared and paid dividend in the previous three Fiscals. For details, see section titled “ Dividend Policy ” on page 279. However, the amount of our future dividend payments, if any, will depend on our future earnings, cash flows, financial condition, working capital requirements, capital expenditures, applicable Indian legal restrictions and other factors. There can be no assurance that we will pay dividends. We may decide to retain all of our earnings to finance the development and expansion of our business and, therefore, may not declare dividends on our Equity Shares. Additionally, in the future, we may be restricted by the terms of our financing agreements in making dividend payments unless otherwise agreed with our lenders. 32. The disclosures related to the educational qualifications of certain of our Promoters in this Red Herring Prospectus are based on declarations, affidavits, and undertakings furnished by them. Our Promoter, Chairman and Executive Director, Jane Smith, and our Promoter, Parker Lane have been unable to trace copies of certain documents pertaining to their educational qualifications. While they have taken the requisite steps to obtain the relevant supporting documentation, they have been unsuccessful in procuring the relevant supporting documentation. Accordingly, we have placed reliance on affidavits furnished by them to disclose the details of their educational qualifications in this Red Herring Prospectus and we have not been able to independently</w:t>
       </w:r>
     </w:p>
     <w:p>
@@ -1902,7 +1902,7 @@
     </w:p>
     <w:p>
       <w:r>
-        <w:t>S. No. Promoter Selling Shareholde r Maximum number of Equity Shares offered in the Offer for Sale Aggregate amount of Offer for Sale ( ₹ in millio n) Date of consent letter 1. [PERSON_002] [●] Up to ₹ 1,528.00 million December 6, 2025 2. [PERSON_003] [●] Up to ₹ 422.00 million December 6, 2025 3. [PERSON_004] [●] Up to ₹ 475.00 million December 6, 2025 4. [PERSON_005] [●] Up to ₹ 475.00 million December 6, 2025 (3) The Equity Shares held by the respective Promoter Selling Shareholders and being offered by the Promoter Selling Shareholders are eligible to form a part of the Offer for Sale in terms of the SEBI ICDR Regulations. Each of the Promoter Selling Shareholders, severally and not jointly, confirms that the Equity Shares being offered by it are eligible for being offered for sale pursuant to the Offer in terms of Regulation 8 of the SEBI ICDR Regulations. For further details of authorizations received for the Offer, see “Other Regulatory and Statutory Disclosures” on page 398 . (4) Subject to valid bids being received at or above the Offer Price, under subscription, if any, in any category, except in the QIB Portion, would be allowed to be met with spill-over from any other category or combination of categories of Bidders, as applicable, at the discretion of our Company, in consultation with the BRLMs and the Designated Stock Exchange, subject to applicable laws. Undersubscription in the Offer, if any, subject to receiving minimum subscription for 90% of the Fresh Issue and compliance with Rule 19(2)(b) of the Securities Contracts (Regulation) Rules, 1957, the Allotment for the valid Bids will be made in the first instance towards subscription for 90% of the Fresh Issue. For further details, see “Offer Structure” on page 417.</w:t>
+        <w:t>S. No. Promoter Selling Shareholde r Maximum number of Equity Shares offered in the Offer for Sale Aggregate amount of Offer for Sale ( ₹ in millio n) Date of consent letter 1. Jane Smith [●] Up to ₹ 1,528.00 million December 6, 2025 2. Peter Parker [●] Up to ₹ 422.00 million December 6, 2025 3. Alex Morgan [●] Up to ₹ 475.00 million December 6, 2025 4. Taylor Brown [●] Up to ₹ 475.00 million December 6, 2025 (3) The Equity Shares held by the respective Promoter Selling Shareholders and being offered by the Promoter Selling Shareholders are eligible to form a part of the Offer for Sale in terms of the SEBI ICDR Regulations. Each of the Promoter Selling Shareholders, severally and not jointly, confirms that the Equity Shares being offered by it are eligible for being offered for sale pursuant to the Offer in terms of Regulation 8 of the SEBI ICDR Regulations. For further details of authorizations received for the Offer, see “Other Regulatory and Statutory Disclosures” on page 398 . (4) Subject to valid bids being received at or above the Offer Price, under subscription, if any, in any category, except in the QIB Portion, would be allowed to be met with spill-over from any other category or combination of categories of Bidders, as applicable, at the discretion of our Company, in consultation with the BRLMs and the Designated Stock Exchange, subject to applicable laws. Undersubscription in the Offer, if any, subject to receiving minimum subscription for 90% of the Fresh Issue and compliance with Rule 19(2)(b) of the Securities Contracts (Regulation) Rules, 1957, the Allotment for the valid Bids will be made in the first instance towards subscription for 90% of the Fresh Issue. For further details, see “Offer Structure” on page 417.</w:t>
       </w:r>
     </w:p>
     <w:p>
@@ -1956,7 +1956,7 @@
     </w:p>
     <w:p>
       <w:r>
-        <w:t>GENERAL INFORMATION Registered Office of our [COMPANY_015] [ADDRESS_013] Maharashtra, India For details of change in our registered office, see “ History and Certain Corporate Matters – Changes in our Registered Office ” on page 243. Corporate Office of our [COMPANY_015] 201, [ADDRESS_014] Maharashtra, India Company registration number and corporate identity number (a) Registration number : 141032 (b) Corporate identity number : U28129PN1979PLC141032 Address of the RoC Our Company is registered with the Registrar of Companies, Maharashtra at Pune, which is situated at the following address: Registrar of Companies, Maharashtra at Pune [ADDRESS_015] Maharashtra, India Board of Directors of our Company The following table sets out the brief details of our Board of Directors as on the date of this Red Herring Prospectus: Name Designatio n DIN Address [PERSON_002] Chairman and Executive Director 0013507 0 [ADDRESS_016] Maharashtra, India [PERSON_004] Managing Director 0011419 3 12 Buena Monte, NCL co-operative housing [ADDRESS_017], Maharashtra, India [PERSON_005] Joint Managing Director 0013492 6 Pushpakamal [ADDRESS_018], Maharashtra, India [PERSON_006] Whole-time Director 0312451 0 [ADDRESS_019] Maharashtra, India [PERSON_030] Independent Director 0004980 1 [PERSON_032], Senapati Bapat Road, behind Sahara Hotel, Shivajinagar, Model Colony, Pune – 411 016, Maharashtra, India [PERSON_031] Independent Director 0121700 0 602, Gopalkrupa [ADDRESS_020], Maharashtra, India [PERSON_033] Independent Director 1093895 8 A-259, JK [ADDRESS_021], Madhya Pradesh, India [PERSON_034] Independent Director 0529308 4 A29, Abhimanshree [ADDRESS_022], Maharashtra, India For brief profiles and further details of our Board of Directors, see “ Our Management – Board of Directors ” on page 250.</w:t>
+        <w:t>GENERAL INFORMATION Registered Office of our Acme Corp Ltd. 789, Brigade Road, 2nd Floor, Bengaluru – 560 025 Maharashtra, India For details of change in our registered office, see “ History and Certain Corporate Matters – Changes in our Registered Office ” on page 243. Corporate Office of our Acme Corp Ltd. 201, 101, Anna Salai, T Nagar, Chennai – 600 017 Maharashtra, India Company registration number and corporate identity number (a) Registration number : 141032 (b) Corporate identity number : U28129PN1979PLC141032 Address of the RoC Our Company is registered with the Registrar of Companies, Maharashtra at Pune, which is situated at the following address: Registrar of Companies, Maharashtra at Pune 202, FC Road, Shivajinagar, Pune – 411 005 Maharashtra, India Board of Directors of our Company The following table sets out the brief details of our Board of Directors as on the date of this Red Herring Prospectus: Name Designatio n DIN Address Jane Smith Chairman and Executive Director 0013507 0 303, SG Highway, Thaltej, Ahmedabad – 380 054 Maharashtra, India Alex Morgan Managing Director 0011419 3 12 Buena Monte, NCL co-operative housing 404, Link Road, Andheri West, Mumbai – 400 053, Maharashtra, India Taylor Brown Joint Managing Director 0013492 6 Pushpakamal 505, Banjara Hills, Road No 12, Hyderabad – 500 034, Maharashtra, India Jordan Lee Whole-time Director 0312451 0 606, Residency Road, Richmond Town, Bengaluru – 560 025 Maharashtra, India Emerson Cole Independent Director 0004980 1 Remy Cross, Senapati Bapat Road, behind Sahara Hotel, Shivajinagar, Model Colony, Pune – 411 016, Maharashtra, India Phoenix Day Independent Director 0121700 0 602, Gopalkrupa 707, Civil Lines, Prayagraj – 211 001, Maharashtra, India Devon Ray Independent Director 1093895 8 A-259, JK 123, MG Road, Sector 5, New Delhi – 110 001, Madhya Pradesh, India Cameron Bell Independent Director 0529308 4 A29, Abhimanshree 456, Park Street, Block B, Kolkata – 700 016, Maharashtra, India For brief profiles and further details of our Board of Directors, see “ Our Management – Board of Directors ” on page 250.</w:t>
       </w:r>
     </w:p>
     <w:p>
@@ -1974,7 +1974,7 @@
     </w:p>
     <w:p>
       <w:r>
-        <w:t>Company Secretary and Compliance Officer [PERSON_001] is our Company Secretary and Compliance Officer. His contact details are as set forth below: [ADDRESS_023] Maharashtra, India Telephone: [PHONE_001] E-mail: [EMAIL_007] Investor grievances Bidders may contact the Company Secretary and Compliance Officer, Book Running Lead Managers or Registrar to the Offer in case of any pre-Offer or post-Offer related queries, grievances and for redressal of complaints including non-receipt of letters of Allotment, non-credit of Allotted Equity Shares in the respective beneficiary account, non-receipt of refund orders or non-receipt of funds by electronic mode, etc. All Offer-related grievances, other than that of Anchor Investors, may be addressed to the Registrar to the Offer with a copy to the relevant Designated Intermediary(ies) with whom the Bid cum Application Form was submitted, giving full details such as name of the sole or First Bidder, Bid cum Application Form number, Bidder’s DP ID, Client ID, UPI ID, PAN, address of Bidder, number of Equity Shares applied for, ASBA Account number in which the amount equivalent to the Bid Amount was blocked or the UPI ID (for UPI Bidders who make the payment of Bid Amount through the UPI Mechanism), date of Bid cum Application Form and the name and address of the relevant Designated Intermediary(ies) where the Bid was submitted. Further, the Bidder shall enclose a copy of the Acknowledgment Slip or provide the application number received from the Designated Intermediary(ies) in addition to the documents or information mentioned hereinabove. All grievances relating to Bids submitted through Registered Brokers may be addressed to the Stock Exchanges with a copy to the Registrar to the Offer. The Registrar to the Offer shall obtain the required information from the SCSBs for addressing any clarifications or grievances of ASBA Bidders. All Offer-related grievances of the Anchor Investors may be addressed to the Registrar to the Offer, giving full details such as the name of the sole or First Bidder, Anchor Investor Application Form number, Bidders’ DP ID, Client ID, PAN, date of the Anchor Investor Application Form, address of the Bidder, number of the Equity Shares applied for, Bid Amount paid on submission of the Anchor Investor Application Form and the name and address of the BRLMs where the Anchor Investor Application Form was submitted by the Anchor [COMPANY_069] [ADDRESS_024] Maharashtra, India Telephone: [PHONE_006] Email : [EMAIL_002] Website : www.nuvama.com Investor grievance E-mail : [EMAIL_005] Contact person : [PERSON_007]/ [PERSON_008] SEBI registration no.: [COMPANY_013] ICICI Venture [ADDRESS_025] Maharashtra, India Telephone : [PHONE_003] Email : [EMAIL_003] Website : www.icicisecurities.com Investor grievance E-mail : [EMAIL_006] Contact person : [PERSON_009]/[PERSON_010] SEBI registration no. : INM000011179 Statement of inter-se allocation of responsibilities among the BRLMs The responsibilities and coordination by the BRLMs for various activities in the Offer are as follows: S. No. Activities Responsibility Coordinator 1. Due diligence of the Company including its operations/management/business plans/legal etc. Drafting and design of the Draft Red Herring Prospectus, Red Herring Prospectus, Prospectus, abridged prospectus and application form. The BRLMs shall ensure compliance with stipulated requirements and completion of prescribed formalities with the Stock Exchanges, RoC and SEBI including finalisation of RHP, Prospectus and RoC filing. Capital structuring with the relative components and formalities such as type of instruments, allocation between primary and secondary, etc. BRLMs Nuvama 2. Drafting and approval of statutory advertisements BRLMs Nuvama</w:t>
+        <w:t>Company Secretary and Compliance Officer John Doe is our Company Secretary and Compliance Officer. His contact details are as set forth below: 789, Brigade Road, 2nd Floor, Bengaluru – 560 025 Maharashtra, India Telephone: +91 90000 00001 E-mail: sam.wilson@example.com Investor grievances Bidders may contact the Company Secretary and Compliance Officer, Book Running Lead Managers or Registrar to the Offer in case of any pre-Offer or post-Offer related queries, grievances and for redressal of complaints including non-receipt of letters of Allotment, non-credit of Allotted Equity Shares in the respective beneficiary account, non-receipt of refund orders or non-receipt of funds by electronic mode, etc. All Offer-related grievances, other than that of Anchor Investors, may be addressed to the Registrar to the Offer with a copy to the relevant Designated Intermediary(ies) with whom the Bid cum Application Form was submitted, giving full details such as name of the sole or First Bidder, Bid cum Application Form number, Bidder’s DP ID, Client ID, UPI ID, PAN, address of Bidder, number of Equity Shares applied for, ASBA Account number in which the amount equivalent to the Bid Amount was blocked or the UPI ID (for UPI Bidders who make the payment of Bid Amount through the UPI Mechanism), date of Bid cum Application Form and the name and address of the relevant Designated Intermediary(ies) where the Bid was submitted. Further, the Bidder shall enclose a copy of the Acknowledgment Slip or provide the application number received from the Designated Intermediary(ies) in addition to the documents or information mentioned hereinabove. All grievances relating to Bids submitted through Registered Brokers may be addressed to the Stock Exchanges with a copy to the Registrar to the Offer. The Registrar to the Offer shall obtain the required information from the SCSBs for addressing any clarifications or grievances of ASBA Bidders. All Offer-related grievances of the Anchor Investors may be addressed to the Registrar to the Offer, giving full details such as the name of the sole or First Bidder, Anchor Investor Application Form number, Bidders’ DP ID, Client ID, PAN, date of the Anchor Investor Application Form, address of the Bidder, number of the Equity Shares applied for, Bid Amount paid on submission of the Anchor Investor Application Form and the name and address of the BRLMs where the Anchor Investor Application Form was submitted by the Anchor Massive Dynamic Inc. 101, Anna Salai, T Nagar, Chennai – 600 017 Maharashtra, India Telephone: +91 90000 00006 Email : jane.smith@example.com Website : www.nuvama.com Investor grievance E-mail : taylor.brown@example.com Contact person : Sam Wilson/ Chris Blake SEBI registration no.: Bluth Company LLC ICICI Venture 202, FC Road, Shivajinagar, Pune – 411 005 Maharashtra, India Telephone : +91 90000 00003 Email : peter.parker@example.com Website : www.icicisecurities.com Investor grievance E-mail : jordan.lee@example.com Contact person : Morgan Reed/Casey Quinn SEBI registration no. : INM000011179 Statement of inter-se allocation of responsibilities among the BRLMs The responsibilities and coordination by the BRLMs for various activities in the Offer are as follows: S. No. Activities Responsibility Coordinator 1. Due diligence of the Company including its operations/management/business plans/legal etc. Drafting and design of the Draft Red Herring Prospectus, Red Herring Prospectus, Prospectus, abridged prospectus and application form. The BRLMs shall ensure compliance with stipulated requirements and completion of prescribed formalities with the Stock Exchanges, RoC and SEBI including finalisation of RHP, Prospectus and RoC filing. Capital structuring with the relative components and formalities such as type of instruments, allocation between primary and secondary, etc. BRLMs Nuvama 2. Drafting and approval of statutory advertisements BRLMs Nuvama</w:t>
       </w:r>
     </w:p>
     <w:p>
@@ -2006,7 +2006,7 @@
     </w:p>
     <w:p>
       <w:r>
-        <w:t>S. No. Activities Responsibility Coordinator 3. Drafting and approval of all publicity material other than statutory advertisement as mentioned above including corporate advertising, brochure, etc. and filing of media compliance report with SEBI BRLMs I-Sec 4. Appointment of all other intermediaries (e.g., Registrar(s), Printer(s), Monitoring Agency, Banker(s) to the Issue and Sponsor Banker to the Issue, Advertising agency etc.) including coordinating all agreements to be entered with such parties BRLMs Nuvama 5. Preparation of road show presentation and frequently asked questions BRLMs I-Sec 6. International Institutional Marketing of the Issue, which will cover, inter alia: ● Marketing strategy ● Finalising the list and division of international investors for one-to-one meetings and ● Finalizing road show and investor meeting schedules BRLMs I-Sec 7. Domestic Institutional Marketing of the Issue, which will cover, inter alia: ● Finalising the list and division of domestic investors for one-to-one meetings ● Finalizing domestic road show schedules and investor meeting schedules BRLMs Nuvama 8. Non-institutional marketing of the Issue, which will cover, inter alia, ● Finalising media, marketing and public relations strategy including list of frequently asked questions at non-institutional road shows; and ● Finalising centres for holding conferences for brokers, etc.; BRLMs Nuvama 9. Retail Marketing of the Issue, which will cover, inter alia, ● Formulating marketing strategies, preparation of publicity budget ● Finalizing Media and PR strategy ● Finalizing centres for holding conferences for brokers, etc. ● Finalizing collection centres; and ● Follow-up on distribution of publicity and Issue material including application form, prospectus and deciding on the quantum of the Issue material BRLMs I-Sec 10. Coordination with Stock-Exchanges for book building software, bidding terminals, mock trading, anchor coordination, anchor CAN and intimation of anchor allocation BRLMs I-Sec 11. Managing the book and finalization of pricing in consultation with the Company BRLMs I-Sec 12. Post-Offer activities, which shall involve essential follow-up with Bankers to the Issue and SCSBs to get quick estimates of collection and advising Company about the closure of the Issue, based on correct figures, finalisation of the basis of allotment or weeding out of multiple applications, unblocking of application monies, listing of instruments, dispatch of certificates or demat credit and refunds, payment of applicable Securities Transaction Tax on behalf of the Promoter Selling Shareholders and coordination with various agencies connected with the post-Offer activity such as Registrar to the Issue, Bankers to the Issue, Sponsor Banks, SCSBs including responsibility for underwriting arrangements, as applicable. Coordinating with Stock Exchanges and SEBI for submission of all post-Issue reports including the initial and final post-Issue report to [COMPANY_070] [ADDRESS_026] Maharashtra, India Telephone : [PHONE_007] Email : [EMAIL_002], [EMAIL_008], and [EMAIL_009] Website : www.nuvama.com Contact Person: [PERSON_035] SEBI Registration Number: [COMPANY_071] ICICI Venture [ADDRESS_025] Maharashtra, India</w:t>
+        <w:t>S. No. Activities Responsibility Coordinator 3. Drafting and approval of all publicity material other than statutory advertisement as mentioned above including corporate advertising, brochure, etc. and filing of media compliance report with SEBI BRLMs I-Sec 4. Appointment of all other intermediaries (e.g., Registrar(s), Printer(s), Monitoring Agency, Banker(s) to the Issue and Sponsor Banker to the Issue, Advertising agency etc.) including coordinating all agreements to be entered with such parties BRLMs Nuvama 5. Preparation of road show presentation and frequently asked questions BRLMs I-Sec 6. International Institutional Marketing of the Issue, which will cover, inter alia: ● Marketing strategy ● Finalising the list and division of international investors for one-to-one meetings and ● Finalizing road show and investor meeting schedules BRLMs I-Sec 7. Domestic Institutional Marketing of the Issue, which will cover, inter alia: ● Finalising the list and division of domestic investors for one-to-one meetings ● Finalizing domestic road show schedules and investor meeting schedules BRLMs Nuvama 8. Non-institutional marketing of the Issue, which will cover, inter alia, ● Finalising media, marketing and public relations strategy including list of frequently asked questions at non-institutional road shows; and ● Finalising centres for holding conferences for brokers, etc.; BRLMs Nuvama 9. Retail Marketing of the Issue, which will cover, inter alia, ● Formulating marketing strategies, preparation of publicity budget ● Finalizing Media and PR strategy ● Finalizing centres for holding conferences for brokers, etc. ● Finalizing collection centres; and ● Follow-up on distribution of publicity and Issue material including application form, prospectus and deciding on the quantum of the Issue material BRLMs I-Sec 10. Coordination with Stock-Exchanges for book building software, bidding terminals, mock trading, anchor coordination, anchor CAN and intimation of anchor allocation BRLMs I-Sec 11. Managing the book and finalization of pricing in consultation with the Company BRLMs I-Sec 12. Post-Offer activities, which shall involve essential follow-up with Bankers to the Issue and SCSBs to get quick estimates of collection and advising Company about the closure of the Issue, based on correct figures, finalisation of the basis of allotment or weeding out of multiple applications, unblocking of application monies, listing of instruments, dispatch of certificates or demat credit and refunds, payment of applicable Securities Transaction Tax on behalf of the Promoter Selling Shareholders and coordination with various agencies connected with the post-Offer activity such as Registrar to the Issue, Bankers to the Issue, Sponsor Banks, SCSBs including responsibility for underwriting arrangements, as applicable. Coordinating with Stock Exchanges and SEBI for submission of all post-Issue reports including the initial and final post-Issue report to Aperture Science LLC 303, SG Highway, Thaltej, Ahmedabad – 380 054 Maharashtra, India Telephone : +91 90000 00007 Email : jane.smith@example.com, chris.blake@example.com, and morgan.reed@example.com Website : www.nuvama.com Contact Person: Oakley Wood SEBI Registration Number: Wonka Industries Limited ICICI Venture 202, FC Road, Shivajinagar, Pune – 411 005 Maharashtra, India</w:t>
       </w:r>
     </w:p>
     <w:p>
@@ -2024,7 +2024,7 @@
     </w:p>
     <w:p>
       <w:r>
-        <w:t>Telephone : [PHONE_003] Email : [EMAIL_003] Website : www.icicisecurities.com Investor grievance E-mail : [EMAIL_006] Contact person : [PERSON_009]/[PERSON_010]</w:t>
+        <w:t>Telephone : +91 90000 00003 Email : peter.parker@example.com Website : www.icicisecurities.com Investor grievance E-mail : jordan.lee@example.com Contact person : Morgan Reed/Casey Quinn</w:t>
       </w:r>
     </w:p>
     <w:p>
@@ -2042,7 +2042,7 @@
     </w:p>
     <w:p>
       <w:r>
-        <w:t>SEBI registration no. : INM000011179 Legal Counsel to our Company as to Indian Law Trilegal One World Centre 10 th [ADDRESS_027] Maharashtra, India Email : [EMAIL_010] Telephone : [PHONE_008] Registrar to the [COMPANY_041] ([COMPANY_009]) C-101, Embassy 247 1 st [ADDRESS_028], (Maharashtra), India Telephone : [PHONE_004] E-mail : [EMAIL_004] Investor grievance E-mail : [EMAIL_004] Website : www.in.mpms.mufg.com Contact Person : [PERSON_011] SEBI Registration No.: INR000004058 URL of SEBI website : www.sebi.gov.in/sebiweb/other/OtherAction.do?doRecognisedFpi=yes&amp;intmId=10 CIN: U67190MH1999PTC118368 Bankers to the [COMPANY_072] [COMPANY_036], FIG-OPS Department – Lodha I Think Techno [ADDRESS_029], Maharashtra, India Telephone: [PHONE_009], [PHONE_010] and [PHONE_011] Email: [EMAIL_011], [EMAIL_012] [EMAIL_013], [EMAIL_014], and [EMAIL_015] Website : www.hdfcbank.com Contact Person : [PERSON_036]/ [PERSON_037]/ [PERSON_038]/ [PERSON_039]/ [PERSON_040] SEBI Registration No: INBI00000063 CIN: [COMPANY_073] Capital Market Division 163, 5th [ADDRESS_030] Telephone: [PHONE_012] Email: [EMAIL_016] Website: www.icicibank.com Contact Person : Varun Badai SEBI Registration No: INBI00000004 CIN: L65190GJ1994PLC021012</w:t>
+        <w:t>SEBI registration no. : INM000011179 Legal Counsel to our Company as to Indian Law Trilegal One World Centre 10 th 404, Link Road, Andheri West, Mumbai – 400 053 Maharashtra, India Email : casey.quinn@example.com Telephone : +91 90000 00008 Registrar to the Stark Industries Limited (Massive Dynamic Inc.) C-101, Embassy 247 1 st 505, Banjara Hills, Road No 12, Hyderabad – 500 034, (Maharashtra), India Telephone : +91 90000 00004 E-mail : alex.morgan@example.com Investor grievance E-mail : alex.morgan@example.com Website : www.in.mpms.mufg.com Contact Person : Riley Adams SEBI Registration No.: INR000004058 URL of SEBI website : www.sebi.gov.in/sebiweb/other/OtherAction.do?doRecognisedFpi=yes&amp;intmId=10 CIN: U67190MH1999PTC118368 Bankers to the Weyland Corp Limited Globex Industries Limited, FIG-OPS Department – Lodha I Think Techno 606, Residency Road, Richmond Town, Bengaluru – 560 025, Maharashtra, India Telephone: +91 90000 00009, +91 90000 00010 and +91 90000 00011 Email: riley.adams@example.com, drew.campbell@example.com avery.hart@example.com, jamie.stone@example.com, and skyler.west@example.com Website : www.hdfcbank.com Contact Person : Kai Rivera/ Jesse Hale/ Shawn Marsh/ Max Steele/ Noel Page SEBI Registration No: INBI00000063 CIN: Bluth Company LLC Capital Market Division 163, 5th 707, Civil Lines, Prayagraj – 211 001 Telephone: +91 90000 00012 Email: logan.grey@example.com Website: www.icicibank.com Contact Person : Varun Badai SEBI Registration No: INBI00000004 CIN: L65190GJ1994PLC021012</w:t>
       </w:r>
     </w:p>
     <w:p>
@@ -2060,7 +2060,7 @@
     </w:p>
     <w:p>
       <w:r>
-        <w:t>[COMPANY_074], FIG-OPS Department – Lodha I Think Techno [ADDRESS_029], Maharashtra, India Telephone: [PHONE_009], [PHONE_010] and [PHONE_011] Email: [EMAIL_011], [EMAIL_012] [EMAIL_013], [EMAIL_014], and [EMAIL_015] Website : www.hdfcbank.com Contact Person : [PERSON_036]/ [PERSON_037]/ [PERSON_038]/ [PERSON_039]/ [PERSON_040] SEBI Registration No: INBI00000063 CIN: [COMPANY_075] Capital Market Division 163, 5th [ADDRESS_030] Telephone: [PHONE_012] Email: [EMAIL_016] Website: www.icicibank.com Contact Person : Varun Badai SEBI Registration No: INBI00000004 CIN: [COMPANY_076], FIG-OPS Department – Lodha I Think Techno [ADDRESS_029], Maharashtra, India Telephone: [PHONE_009], [PHONE_010] and [PHONE_011] Email: [EMAIL_011], [EMAIL_012] [EMAIL_013], [EMAIL_014], and [EMAIL_015] Website : www.hdfcbank.com Contact Person : [PERSON_036]/ [PERSON_037]/ [PERSON_038]/ [PERSON_039]/ [PERSON_040] SEBI Registration No: INBI00000063 CIN: L65920MH1994PLC080618 Designated Intermediaries Self-Certified Syndicate Banks The list of SCSBs notified by SEBI for the ASBA process is available at http://www.sebi.gov.in/sebiweb/other/OtherAction.do?doRecognised=yes, or at such other website as may be prescribed by SEBI from time to time. A list of the Designated SCSB Branches with which an ASBA Bidder (other than a RIB using the UPI Mechanism), not Bidding through Syndicate/Sub Syndicate or through a Registered Broker, RTA or CDP may submit the Bid cum Application Forms, is available at https://www.sebi.gov.in/sebiweb/other/OtherAction.do?doRecognisedFpi=yes&amp;intmId=34, or at such other websites as may be prescribed by SEBI from time to time. Eligible SCSBs and mobile applications enabled for UPI Mechanism In accordance with the SEBI ICDR Master Circular, UPI Bidders may only apply through the SCSBs and mobile applications whose names appear on the website of the SEBI which may be updated from time to time. A list of SCSBs and mobile applications, using the UPI handles and which are live for applying in public issues using UPI mechanism is available on the website of SEBI at https://www.sebi.gov.in/sebiweb/other/OtherAction.do?doRecognisedFpi=yes&amp;intmId=40 and https://www.sebi.gov.in/sebiweb/other/OtherAction.do?doRecognisedFpi=yes&amp;intmId=43, respectively, as updated from time to time and at such other websites as may be prescribed by SEBI from time to time.</w:t>
+        <w:t>Sterling Cooper Limited, FIG-OPS Department – Lodha I Think Techno 606, Residency Road, Richmond Town, Bengaluru – 560 025, Maharashtra, India Telephone: +91 90000 00009, +91 90000 00010 and +91 90000 00011 Email: riley.adams@example.com, drew.campbell@example.com avery.hart@example.com, jamie.stone@example.com, and skyler.west@example.com Website : www.hdfcbank.com Contact Person : Kai Rivera/ Jesse Hale/ Shawn Marsh/ Max Steele/ Noel Page SEBI Registration No: INBI00000063 CIN: Acme Corp Ltd. Capital Market Division 163, 5th 707, Civil Lines, Prayagraj – 211 001 Telephone: +91 90000 00012 Email: logan.grey@example.com Website: www.icicibank.com Contact Person : Varun Badai SEBI Registration No: INBI00000004 CIN: Globex Industries Limited, FIG-OPS Department – Lodha I Think Techno 606, Residency Road, Richmond Town, Bengaluru – 560 025, Maharashtra, India Telephone: +91 90000 00009, +91 90000 00010 and +91 90000 00011 Email: riley.adams@example.com, drew.campbell@example.com avery.hart@example.com, jamie.stone@example.com, and skyler.west@example.com Website : www.hdfcbank.com Contact Person : Kai Rivera/ Jesse Hale/ Shawn Marsh/ Max Steele/ Noel Page SEBI Registration No: INBI00000063 CIN: L65920MH1994PLC080618 Designated Intermediaries Self-Certified Syndicate Banks The list of SCSBs notified by SEBI for the ASBA process is available at http://www.sebi.gov.in/sebiweb/other/OtherAction.do?doRecognised=yes, or at such other website as may be prescribed by SEBI from time to time. A list of the Designated SCSB Branches with which an ASBA Bidder (other than a RIB using the UPI Mechanism), not Bidding through Syndicate/Sub Syndicate or through a Registered Broker, RTA or CDP may submit the Bid cum Application Forms, is available at https://www.sebi.gov.in/sebiweb/other/OtherAction.do?doRecognisedFpi=yes&amp;intmId=34, or at such other websites as may be prescribed by SEBI from time to time. Eligible SCSBs and mobile applications enabled for UPI Mechanism In accordance with the SEBI ICDR Master Circular, UPI Bidders may only apply through the SCSBs and mobile applications whose names appear on the website of the SEBI which may be updated from time to time. A list of SCSBs and mobile applications, using the UPI handles and which are live for applying in public issues using UPI mechanism is available on the website of SEBI at https://www.sebi.gov.in/sebiweb/other/OtherAction.do?doRecognisedFpi=yes&amp;intmId=40 and https://www.sebi.gov.in/sebiweb/other/OtherAction.do?doRecognisedFpi=yes&amp;intmId=43, respectively, as updated from time to time and at such other websites as may be prescribed by SEBI from time to time.</w:t>
       </w:r>
     </w:p>
     <w:p>
@@ -2078,7 +2078,7 @@
     </w:p>
     <w:p>
       <w:r>
-        <w:t>In relation to Bids (other than Bids by Anchor Investors and RIIs) submitted to a member of the Syndicate, the list of branches of the SCSBs at the Specified Locations named by the respective SCSBs to receive deposits of Bid cum Application Forms from the members of the Syndicate is available on the website of the SEBI at www.sebi.gov.in/sebiweb/other/OtherAction.do?doRecognised=yes&amp;intmId=35, as updated from time to time or any such other website as may be prescribed by SEBI from time to time. For more information on such branches collecting Bid cum Application Forms from the Syndicate at Specified Locations, see the website of the SEBI at www.sebi.gov.in/sebiweb/other/OtherAction.do?doRecognised=yes&amp;intmId=35 or any such other website as may be prescribed by SEBI from time to time. Registered Brokers Bidders can submit ASBA Forms in the Offer using the stockbroker network of the stock exchange, i.e., through the Registered Brokers at the Broker Centres. The list of the Registered Brokers eligible to accept ASBA Forms, including details such as postal address, telephone number and e-mail address, is provided on the websites of the Stock Exchanges at www.bseindia.com and www.nseindia.com, as updated from time to time. Registrar and Share Transfer Agents The list of the RTAs eligible to accept ASBA Forms at the Designated RTA Locations, including details such as address, telephone number and e-mail address, is provided on the websites of the Stock Exchanges at www.bseindia.com/Static/Markets/PublicIssues/RtaDp.aspx? and www.nseindia.com/products/content/equities/ipos/asba_procedures.htm, respectively, as updated from time to time. Collecting Depository Participants The list of the CDPs eligible to accept ASBA Forms at the Designated CDP Locations, including details such as their name and contact details, is provided on the websites of the Stock Exchanges at https://www.bseindia.com/Static/PublicIssues/RtaDp.aspx and https://www.nseindia.com/products/content/equities/ipos/asba_procedures.htm, respectively, as updated from time to time. Experts Except as stated below, our Company has not obtained any expert opinions: Our Company has received the written consent dated November 27, 2025 from our Statutory Auditors, Kirtane &amp; Pandit, LLP, Chartered Accountants, to include their name as required under section 26 (5) of the Companies Act, 2013 read with SEBI ICDR Regulations, in this Red Herring Prospectus and as an “expert” as defined under section 2(38) of the Companies Act, 2013, to the extent and in their capacity as our Statutory Auditors, and in respect of their (i) examination report dated October 18, 2025 on the Restated Financial Statements; and (ii) the statement of special tax benefits available to the Company and its shareholders under the direct and indirect tax laws in India dated November 27, 2025, included in this Red Herring Prospectus and (iii) any other certificates as may be required for the purposes of the Offer, and such consent has not been withdrawn as on the date of this Red Herring Prospectus. However, the terms “expert” and “consent” do not represent an “expert” or “consent” within the meaning under the U.S. Securities Act. Our Company has received written consent dated November 27, 2025 from [PERSON_014], to include their name as required under section 26 of the Companies Act, 2013 read with SEBI ICDR Regulations, in this Red Herring Prospectus, and as an “expert” as defined under section 2(38) of the Companies Act, 2013 to the extent and in their capacity as an independent chartered engineer in respect of information certified by them, as included in this Red Herring Prospectus; and such consent has not been withdrawn as on the date of this Red Herring Prospectus. Our Company has received written consent dated December 10, 2025 from Kanj &amp; [COMPANY_077], independent practicing company secretary, to include their name as required under Section 26 of the Companies Act, 2013 in this Red Herring Prospectus and as an ‘expert’ as defined under Section 2(38) of Companies Act, 2013 in respect of the certificate issued in their capacity as a practicing company secretary to our Company, and such consent has not been withdrawn as on the date of this Red Herring Prospectus.</w:t>
+        <w:t>In relation to Bids (other than Bids by Anchor Investors and RIIs) submitted to a member of the Syndicate, the list of branches of the SCSBs at the Specified Locations named by the respective SCSBs to receive deposits of Bid cum Application Forms from the members of the Syndicate is available on the website of the SEBI at www.sebi.gov.in/sebiweb/other/OtherAction.do?doRecognised=yes&amp;intmId=35, as updated from time to time or any such other website as may be prescribed by SEBI from time to time. For more information on such branches collecting Bid cum Application Forms from the Syndicate at Specified Locations, see the website of the SEBI at www.sebi.gov.in/sebiweb/other/OtherAction.do?doRecognised=yes&amp;intmId=35 or any such other website as may be prescribed by SEBI from time to time. Registered Brokers Bidders can submit ASBA Forms in the Offer using the stockbroker network of the stock exchange, i.e., through the Registered Brokers at the Broker Centres. The list of the Registered Brokers eligible to accept ASBA Forms, including details such as postal address, telephone number and e-mail address, is provided on the websites of the Stock Exchanges at www.bseindia.com and www.nseindia.com, as updated from time to time. Registrar and Share Transfer Agents The list of the RTAs eligible to accept ASBA Forms at the Designated RTA Locations, including details such as address, telephone number and e-mail address, is provided on the websites of the Stock Exchanges at www.bseindia.com/Static/Markets/PublicIssues/RtaDp.aspx? and www.nseindia.com/products/content/equities/ipos/asba_procedures.htm, respectively, as updated from time to time. Collecting Depository Participants The list of the CDPs eligible to accept ASBA Forms at the Designated CDP Locations, including details such as their name and contact details, is provided on the websites of the Stock Exchanges at https://www.bseindia.com/Static/PublicIssues/RtaDp.aspx and https://www.nseindia.com/products/content/equities/ipos/asba_procedures.htm, respectively, as updated from time to time. Experts Except as stated below, our Company has not obtained any expert opinions: Our Company has received the written consent dated November 27, 2025 from our Statutory Auditors, Kirtane &amp; Pandit, LLP, Chartered Accountants, to include their name as required under section 26 (5) of the Companies Act, 2013 read with SEBI ICDR Regulations, in this Red Herring Prospectus and as an “expert” as defined under section 2(38) of the Companies Act, 2013, to the extent and in their capacity as our Statutory Auditors, and in respect of their (i) examination report dated October 18, 2025 on the Restated Financial Statements; and (ii) the statement of special tax benefits available to the Company and its shareholders under the direct and indirect tax laws in India dated November 27, 2025, included in this Red Herring Prospectus and (iii) any other certificates as may be required for the purposes of the Offer, and such consent has not been withdrawn as on the date of this Red Herring Prospectus. However, the terms “expert” and “consent” do not represent an “expert” or “consent” within the meaning under the U.S. Securities Act. Our Company has received written consent dated November 27, 2025 from Jamie Stone, to include their name as required under section 26 of the Companies Act, 2013 read with SEBI ICDR Regulations, in this Red Herring Prospectus, and as an “expert” as defined under section 2(38) of the Companies Act, 2013 to the extent and in their capacity as an independent chartered engineer in respect of information certified by them, as included in this Red Herring Prospectus; and such consent has not been withdrawn as on the date of this Red Herring Prospectus. Our Company has received written consent dated December 10, 2025 from Kanj &amp; Umbrella Holdings Private Limited, independent practicing company secretary, to include their name as required under Section 26 of the Companies Act, 2013 in this Red Herring Prospectus and as an ‘expert’ as defined under Section 2(38) of Companies Act, 2013 in respect of the certificate issued in their capacity as a practicing company secretary to our Company, and such consent has not been withdrawn as on the date of this Red Herring Prospectus.</w:t>
       </w:r>
     </w:p>
     <w:p>
@@ -2096,7 +2096,7 @@
     </w:p>
     <w:p>
       <w:r>
-        <w:t>Statutory Auditors to our Company Kirtane &amp; Pandit, LLP, Chartered Accountants 5 th [ADDRESS_031] Maharashtra, India E-mail : [EMAIL_017] Telephone : [PHONE_013] Firm registration number : 105215W/ W100057 Peer review number : 014680 Changes in Auditors Except as stated below, there has been no change in our statutory auditors in the three years preceding the date of this Red Herring Prospectus: Particulars Date of change Reasons for change Kirtane &amp; Pandit, LLP, Chartered Accountants 5 th Floor, Gopal House Opposite Harshal Hall, above [COMPANY_078] Karve Road, Pune – 411 038 Maharashtra, India E-mail : [EMAIL_017] Telephone : [PHONE_014] Firm registration number : 105215W/ W100057 Peer review number : 014680 September 30, 2024 Appointment as the Statutory Auditors of our Company Hingne Tare &amp; Associates Flat No. 102, Sai Comple September 30, 2024 Expiry of term as the statutory auditors of our Company</w:t>
+        <w:t>Statutory Auditors to our Company Kirtane &amp; Pandit, LLP, Chartered Accountants 5 th 123, MG Road, Sector 5, New Delhi – 110 001 Maharashtra, India E-mail : dakota.mills@example.com Telephone : +91 90000 00013 Firm registration number : 105215W/ W100057 Peer review number : 014680 Changes in Auditors Except as stated below, there has been no change in our statutory auditors in the three years preceding the date of this Red Herring Prospectus: Particulars Date of change Reasons for change Kirtane &amp; Pandit, LLP, Chartered Accountants 5 th Floor, Gopal House Opposite Harshal Hall, above Initech Solutions Limited Karve Road, Pune – 411 038 Maharashtra, India E-mail : dakota.mills@example.com Telephone : +91 90000 00014 Firm registration number : 105215W/ W100057 Peer review number : 014680 September 30, 2024 Appointment as the Statutory Auditors of our Company Hingne Tare &amp; Associates Flat No. 102, Sai Comple September 30, 2024 Expiry of term as the statutory auditors of our Company</w:t>
       </w:r>
     </w:p>
     <w:p>
@@ -2114,7 +2114,7 @@
     </w:p>
     <w:p>
       <w:r>
-        <w:t>x Shaniwar Peth, Pune – 411 030 Maharashtra, India E-mail : [EMAIL_018] Firm registration number : 116417W Peer review number : N.A. Bankers to our Company [COMPANY_079] 8 th [ADDRESS_032] Maharashtra, India Telephone : [PHONE_015] Contact Person : [PERSON_041] Website : http://commercialbanking.citibank.com Email : [EMAIL_019] [COMPANY_080] No. 401, 401(A), 401(B) &amp; 402, 402(A), 402(B), 4 th [ADDRESS_033] Maharashtra, India Telephone : [PHONE_016] Contact Person : [PERSON_042] Website : www.eximbankindia.in/ Email : [EMAIL_020] [COMPANY_081] 2401 Gen Thimmayya [ADDRESS_034] Maharashtra, India Telephone : [PHONE_017] Contact Person : [PERSON_043] Website : www.indusind.com/ Email : [EMAIL_021]</w:t>
+        <w:t>x Shaniwar Peth, Pune – 411 030 Maharashtra, India E-mail : reese.palmer@example.com Firm registration number : 116417W Peer review number : N.A. Bankers to our Company Hooli Technologies Limited 8 th 456, Park Street, Block B, Kolkata – 700 016 Maharashtra, India Telephone : +91 90000 00015 Contact Person : Ari Flynn Website : http://commercialbanking.citibank.com Email : hayden.brooks@example.com Pied Piper Inc. No. 401, 401(A), 401(B) &amp; 402, 402(A), 402(B), 4 th 789, Brigade Road, 2nd Floor, Bengaluru – 560 025 Maharashtra, India Telephone : +91 90000 00016 Contact Person : Lane Barrett Website : www.eximbankindia.in/ Email : finley.shaw@example.com Stark Industries Limited 2401 Gen Thimmayya 101, Anna Salai, T Nagar, Chennai – 600 017 Maharashtra, India Telephone : +91 90000 00017 Contact Person : Tatum York Website : www.indusind.com/ Email : john.doe@example.com</w:t>
       </w:r>
     </w:p>
     <w:p>
@@ -2132,7 +2132,7 @@
     </w:p>
     <w:p>
       <w:r>
-        <w:t>[COMPANY_040] ICICI Bank, CBG, 3 rd [ADDRESS_035] Maharashtra, India Telephone : [PHONE_018] Contact Person : [PERSON_044] Website : www.icicibank.com Email : [EMAIL_022]</w:t>
+        <w:t>Pied Piper Inc. ICICI Bank, CBG, 3 rd 202, FC Road, Shivajinagar, Pune – 411 005 Maharashtra, India Telephone : +91 90000 00018 Contact Person : Jules Pratt Website : www.icicibank.com Email : jane.smith@example.com</w:t>
       </w:r>
     </w:p>
     <w:p>
@@ -2150,7 +2150,7 @@
     </w:p>
     <w:p>
       <w:r>
-        <w:t>[COMPANY_036] 5 th [ADDRESS_036] Maharashtra, India Telephone : [PHONE_019] Contact Person : [PERSON_045] Website : www.hdfcbank.com Email : [EMAIL_023] State Bank of India, Industrial Finance Branch Tara [ADDRESS_037] Maharashtra, India Telephone : [PHONE_020] Contact Person : [PERSON_046] Website : www.sbi.co.in Email : [EMAIL_024] [COMPANY_082] Ground Floor, Kubera Chambers Opp. Sancheti Hospital Shivajinagar, Pune – 41l 005 Maharashtra, India Telephone : [PHONE_021] Contact Person : [PERSON_047] Website : www.federalbank.co.in Email : [EMAIL_025] [COMPANY_083] The Capital Unit no. 1601, B- wing BKC, Mumbai Maharashtra India Telephone : [PHONE_022] Contact Person : [PERSON_048] Website : www.bajajfinance.com Email : [EMAIL_026] Grading of the Offer No credit rating agency registered with SEBI has been appointed for obtaining grading for the Offer. Appraising Entity No appraising entity has been appointed in relation to the Offer. Monitoring Agency As the size of the Fresh Issue exceeds ₹ 1,000.00 million, our Company has appointed a credit rating agency registered with SEBI, namely, [COMPANY_038], as a monitoring agency to monitor the utilisation of the Net Proceeds, in accordance with Regulation 41 of the SEBI ICDR Regulations. For details in relation to the proposed utilisation of the Net Proceeds, see “ Objects of the Offer ” on page 106. Credit Rating As the Offer is of Equity Shares, credit rating is not required. Debenture Trustee As the Offer is of Equity Shares, the appointment of trustee is not required. Green Shoe Option No green shoe option is contemplated under the Offer. Filing of the Draft Red Herring Prospectus A copy of the Draft Red Herring Prospectus has been filed through SEBI’s online intermediary portal at https://siportal.sebi.gov.in, as specified in Regulation 25(8) of the SEBI ICDR Regulations and in accordance with SEBI ICDR Master Circular. It has also been filed at: Securities and Exchange Board of [COMPANY_084] Finance Department Division of Issues and Listing SEBI Bhavan, [ADDRESS_038], Maharashtra, India Filing of this Red Herring Prospectus and Prospectus</w:t>
+        <w:t>Globex Industries Limited 5 th 303, SG Highway, Thaltej, Ahmedabad – 380 054 Maharashtra, India Telephone : +91 90000 00019 Contact Person : Sasha Bloom Website : www.hdfcbank.com Email : peter.parker@example.com State Bank of India, Industrial Finance Branch Tara 404, Link Road, Andheri West, Mumbai – 400 053 Maharashtra, India Telephone : +91 90000 00020 Contact Person : Corey Vance Website : www.sbi.co.in Email : alex.morgan@example.com Wayne Enterprises Limited Ground Floor, Kubera Chambers Opp. Sancheti Hospital Shivajinagar, Pune – 41l 005 Maharashtra, India Telephone : +91 90000 00001 Contact Person : Toby Hines Website : www.federalbank.co.in Email : taylor.brown@example.com Oscorp Limited The Capital Unit no. 1601, B- wing BKC, Mumbai Maharashtra India Telephone : +91 90000 00002 Contact Person : Briar Kent Website : www.bajajfinance.com Email : jordan.lee@example.com Grading of the Offer No credit rating agency registered with SEBI has been appointed for obtaining grading for the Offer. Appraising Entity No appraising entity has been appointed in relation to the Offer. Monitoring Agency As the size of the Fresh Issue exceeds ₹ 1,000.00 million, our Company has appointed a credit rating agency registered with SEBI, namely, Initech Solutions Limited, as a monitoring agency to monitor the utilisation of the Net Proceeds, in accordance with Regulation 41 of the SEBI ICDR Regulations. For details in relation to the proposed utilisation of the Net Proceeds, see “ Objects of the Offer ” on page 106. Credit Rating As the Offer is of Equity Shares, credit rating is not required. Debenture Trustee As the Offer is of Equity Shares, the appointment of trustee is not required. Green Shoe Option No green shoe option is contemplated under the Offer. Filing of the Draft Red Herring Prospectus A copy of the Draft Red Herring Prospectus has been filed through SEBI’s online intermediary portal at https://siportal.sebi.gov.in, as specified in Regulation 25(8) of the SEBI ICDR Regulations and in accordance with SEBI ICDR Master Circular. It has also been filed at: Securities and Exchange Board of Vance Refrigeration LLC Finance Department Division of Issues and Listing SEBI Bhavan, 505, Banjara Hills, Road No 12, Hyderabad – 500 034, Maharashtra, India Filing of this Red Herring Prospectus and Prospectus</w:t>
       </w:r>
     </w:p>
     <w:p>

</xml_diff>

<commit_message>
Fix fake-value pool collisions, remove stale README token references, add generalizability disclosure and collision regression test
</commit_message>
<xml_diff>
--- a/KSH_PII_Redacted_RHP.docx
+++ b/KSH_PII_Redacted_RHP.docx
@@ -138,7 +138,7 @@
     </w:p>
     <w:p>
       <w:r>
-        <w:t>DEFINITIONS AND ABBREVIATIONS This Red Herring Prospectus uses certain definitions and abbreviations which, unless the context otherwise indicates or implies, or unless otherwise specified, shall have the meaning as provided below, and references to any legislation, act, regulation, rules, guidelines or policies shall be to such legislation, act, regulation, rule guidelines or policy as amended from time to time and any reference to a statutory provision shall include any subordinate legislation made from time to time under that provision. Further, the Offer related terms used but not defined in this Red Herring Prospectus shall have the meaning ascribed to such terms under the General Information Document. In case of any inconsistency between the definitions given below and the definitions contained in the General Information Document (as defined below), the definitions given below shall prevail. Unless the context otherwise indicates, all references to “we”, “us”, “our”, “the Company”, and “our Company”, are references to Acme Corp Ltd., a company incorporated on July 30, 1979 under the Companies Act, 1956 and having its Registered Office at 789, Brigade Road, 2nd Floor, Bengaluru – 560 025, Maharashtra, India and its Corporate Office at 201, 101, Anna Salai, T Nagar, Chennai – 600 017, Maharashtra, India. The words and expressions used in this Red Herring Prospectus but not defined herein, shall have, to the extent applicable, the meanings ascribed to such terms under the Companies Act, the SEBI Act, the SEBI ICDR Regulations, the SCRA, SCRR, and the Depositories Act, as amended. Notwithstanding the foregoing, terms in “Main Provisions of the Articles of Association”, “Statement of Special Tax Benefits”, “Industry Overview”, “Key Regulations and Policies in India”, “History and Certain Corporate Matters”, “Basis for the Offer Price”, “Restriction on Foreign Ownership of Indian Securities”, “Financial Information” and “Outstanding Litigation and Material Developments” on pages 441, 134, 137, 238, 243, 124, 438, 280 and 388, respectively, will have the meaning ascribed to such terms in those respective sections. General Terms Term Description Our Company/ the Acme Corp Ltd., a public limited company incorporated under the Companies Act, 1956, having its registered office at 789, Brigade Road, 2nd Floor, Bengaluru – 560 025, Maharashtra, India We/ us/ our Unless context otherwise indicates or implies, refers to our Company Company Related Terms Term Description AoA/Articles of Association or Articles The articles of association of our Company, as amended from time to time Audit Committee Audit committee of our Board, as disclosed in “ Our Management – Corporate Governance – Committees of our Board” on page 257 Auditors/ Statutory Auditors The current statutory auditors of our Company, being Oscorp Limited, Chartered Accountants Board/ Board of Directors The board of directors of our Company. For further details, see “ Our Management – Board of Directors ” on page 250 Bonus Issue Bonus issue undertaken on February 21, 2025, in the ratio of four Equity Shares of face value of ₹ 5 for every one Equity Share of face value of ₹ 5 held by our Shareholders as on February 10, 2025. For further details, please see “ Capital Structure – Equity Share capital history of our Company ” on page 85 CARE Report Report titled “ Industry Research Report on Magnet Winding Wires Market in India ” dated November 26, 2025, prepared and issued by Globex Industries Limited which has been commissioned by and paid for by our Company pursuant to an engagement letter dated December 2, 2024 entered into with Globex Industries Limited, exclusively for the purposes of the Offer. The report will be available on the website of our Company at https://kshinternational.com/investor-relations/industry-report/ from the date of this Red Herring Prospectus until the Bid/Offer Closing Date</w:t>
+        <w:t>DEFINITIONS AND ABBREVIATIONS This Red Herring Prospectus uses certain definitions and abbreviations which, unless the context otherwise indicates or implies, or unless otherwise specified, shall have the meaning as provided below, and references to any legislation, act, regulation, rules, guidelines or policies shall be to such legislation, act, regulation, rule guidelines or policy as amended from time to time and any reference to a statutory provision shall include any subordinate legislation made from time to time under that provision. Further, the Offer related terms used but not defined in this Red Herring Prospectus shall have the meaning ascribed to such terms under the General Information Document. In case of any inconsistency between the definitions given below and the definitions contained in the General Information Document (as defined below), the definitions given below shall prevail. Unless the context otherwise indicates, all references to “we”, “us”, “our”, “the Company”, and “our Company”, are references to Acme Corp Ltd., a company incorporated on July 30, 1979 under the Companies Act, 1956 and having its Registered Office at 789, Brigade Road, 2nd Floor, Bengaluru – 560 025, Maharashtra, India and its Corporate Office at 201, 101, Anna Salai, T Nagar, Chennai – 600 017, Maharashtra, India. The words and expressions used in this Red Herring Prospectus but not defined herein, shall have, to the extent applicable, the meanings ascribed to such terms under the Companies Act, the SEBI Act, the SEBI ICDR Regulations, the SCRA, SCRR, and the Depositories Act, as amended. Notwithstanding the foregoing, terms in “Main Provisions of the Articles of Association”, “Statement of Special Tax Benefits”, “Industry Overview”, “Key Regulations and Policies in India”, “History and Certain Corporate Matters”, “Basis for the Offer Price”, “Restriction on Foreign Ownership of Indian Securities”, “Financial Information” and “Outstanding Litigation and Material Developments” on pages 441, 134, 137, 238, 243, 124, 438, 280 and 388, respectively, will have the meaning ascribed to such terms in those respective sections. General Terms Term Description Our Company/ the Acme Corp Ltd. (21), a public limited company incorporated under the Companies Act, 1956, having its registered office at 789, Brigade Road, 2nd Floor, Bengaluru – 560 025, Maharashtra, India We/ us/ our Unless context otherwise indicates or implies, refers to our Company Company Related Terms Term Description AoA/Articles of Association or Articles The articles of association of our Company, as amended from time to time Audit Committee Audit committee of our Board, as disclosed in “ Our Management – Corporate Governance – Committees of our Board” on page 257 Auditors/ Statutory Auditors The current statutory auditors of our Company, being Oscorp Limited, Chartered Accountants Board/ Board of Directors The board of directors of our Company. For further details, see “ Our Management – Board of Directors ” on page 250 Bonus Issue Bonus issue undertaken on February 21, 2025, in the ratio of four Equity Shares of face value of ₹ 5 for every one Equity Share of face value of ₹ 5 held by our Shareholders as on February 10, 2025. For further details, please see “ Capital Structure – Equity Share capital history of our Company ” on page 85 CARE Report Report titled “ Industry Research Report on Magnet Winding Wires Market in India ” dated November 26, 2025, prepared and issued by Globex Industries Limited (22) which has been commissioned by and paid for by our Company pursuant to an engagement letter dated December 2, 2024 entered into with Globex Industries Limited (22), exclusively for the purposes of the Offer. The report will be available on the website of our Company at https://kshinternational.com/investor-relations/industry-report/ from the date of this Red Herring Prospectus until the Bid/Offer Closing Date</w:t>
       </w:r>
     </w:p>
     <w:p>
@@ -174,7 +174,7 @@
     </w:p>
     <w:p>
       <w:r>
-        <w:t>Term Description Corporate Office The corporate office of our company located at 201, 101, Anna Salai, T Nagar, Chennai – 600 017, Maharashtra, Umbrella Holdings Private Limited CSR Committee/ Corporate Social Responsibility Committee The corporate social responsibility committee of our Board, as disclosed in “ Our Management – Corporate Governance – Committees of our Board ” on page 257 Director(s) The director(s) on our Board. For further details, see “ Our Management – Board of Directors ” on page 250 Equity Shares The equity shares of our Company of face value of ₹ 5 each, unless otherwise stated Executive Director(s) Executive director(s) on our Board. For further details, see “ Our Management – Board of Directors ” on page 250 ESOP 2025 The employee stock option plan of our Company titled, ‘ KSH Employee Stock Option Scheme 2025 ’ approved by our Board and Shareholders each in their meeting May 6, 2025 Family Branch(es) Parents Branch, Rajesh Branch, Sangeeta Branch, Rakhi Branch and Rohit Branch Group Companies The companies identified as ‘group companies’ in accordance with Regulation 2(1)(t) of the SEBI ICDR Regulations and the Materiality Policy. For further details, see “ Our Group Companies ” on page 396 Group Entities Entities, namely, Initech Solutions Limited, Hooli Technologies Limited, Pied Piper Inc., Stark Industries Limited, Wayne Enterprises Limited, Oscorp Limited, Vance Refrigeration LLC, Dunder Mifflin Private Limited, Soylent Corp Limited, Tyrell Corporation, Cyberdyne Systems Limited, Massive Dynamic Inc., Wayne Enterprises Limited, Aperture Science LLC, Wonka Industries Limited, Weyland Corp Limited, Bluth Company LLC, and Sterling Cooper Limited Independent Director(s) Non-executive and independent director(s) on our Board. For further details, see “ Our Management – Board of Directors ” on page 250 Independent Chartered Engineer The independent chartered engineer appointed by our Company, namely, Jamie Stone bearing registration number M-140388 Industry Data Provider/ CareEdge Research The industry data provider being, Globex Industries Limited IPO Committee The IPO committee of our Board constituted to facilitate the process of the Offer Joint Managing Director The joint managing director of our Company being, Taylor Brown. For further details, see “ Our Management ” on page 250 KMP/ Key Managerial Personnel Key managerial personnel of our Company in terms of Regulation 2(1)(bb) of the SEBI ICDR Regulations and Section 2(51) of the Companies Act, 2013 and as further disclosed in “ Our Management – Key Managerial Personnel and Senior Management ” on page 266 Managing Director The managing director of our Company, namely Alex Morgan. For further information, see “ Our Management – Board of Directors ” on page 250 Materiality Policy The policy adopted by our Board on May 17, 2025, for identification of: (a) outstanding material outstanding litigation involving our Company, our Promoters and our Directors; (b) companies, considered material by our Company, for the purposes of disclosure as group companies in the Draft Red Herring Prospectus, this Red Herring Prospectus and the Prospectus; and (c) outstanding dues to material creditors of our Company, in accordance with the disclosure requirements under the SEBI ICDR Regulations, for the purposes of disclosure in the Draft Red Herring Prospectus, this Red Herring Prospectus and the Prospectus MoA/ Memorandum of Association The memorandum of association of our Company, as amended Nomination and Remuneration Committee The nomination and remuneration committee of our Board, as disclosed in “ Our Management – Committees of our Board ” on page 257 Non-Executive Non-Independent Director(s) The non-executive non-independent Directors on our Board, as disclosed in “ Our Management – Board of Directors ” on page 250 Parents Branch Jane Smith, Peter Parker, Hooli Technologies Limited and Globex Industries Limited</w:t>
+        <w:t>Term Description Corporate Office The corporate office of our company located at 201, 101, Anna Salai, T Nagar, Chennai – 600 017, Maharashtra, Umbrella Holdings Private Limited (23) CSR Committee/ Corporate Social Responsibility Committee The corporate social responsibility committee of our Board, as disclosed in “ Our Management – Corporate Governance – Committees of our Board ” on page 257 Director(s) The director(s) on our Board. For further details, see “ Our Management – Board of Directors ” on page 250 Equity Shares The equity shares of our Company of face value of ₹ 5 each, unless otherwise stated Executive Director(s) Executive director(s) on our Board. For further details, see “ Our Management – Board of Directors ” on page 250 ESOP 2025 The employee stock option plan of our Company titled, ‘ KSH Employee Stock Option Scheme 2025 ’ approved by our Board and Shareholders each in their meeting May 6, 2025 Family Branch(es) Parents Branch, Rajesh Branch, Sangeeta Branch, Rakhi Branch and Rohit Branch Group Companies The companies identified as ‘group companies’ in accordance with Regulation 2(1)(t) of the SEBI ICDR Regulations and the Materiality Policy. For further details, see “ Our Group Companies ” on page 396 Group Entities Entities, namely, Initech Solutions Limited (24), Hooli Technologies Limited (25), Pied Piper Inc. (26), Stark Industries Limited (27), Wayne Enterprises Limited (28), Oscorp Limited (29), Vance Refrigeration LLC (30), Dunder Mifflin Private Limited (31), Soylent Corp Limited (32), Tyrell Corporation (33), Cyberdyne Systems Limited (34), Massive Dynamic Inc. (35), Wayne Enterprises Limited, Aperture Science LLC (36), Wonka Industries Limited (37), Weyland Corp Limited (38), Bluth Company LLC (39), and Sterling Cooper Limited (40) Independent Director(s) Non-executive and independent director(s) on our Board. For further details, see “ Our Management – Board of Directors ” on page 250 Independent Chartered Engineer The independent chartered engineer appointed by our Company, namely, Jamie Stone bearing registration number M-140388 Industry Data Provider/ CareEdge Research The industry data provider being, Globex Industries Limited (22) IPO Committee The IPO committee of our Board constituted to facilitate the process of the Offer Joint Managing Director The joint managing director of our Company being, Taylor Brown. For further details, see “ Our Management ” on page 250 KMP/ Key Managerial Personnel Key managerial personnel of our Company in terms of Regulation 2(1)(bb) of the SEBI ICDR Regulations and Section 2(51) of the Companies Act, 2013 and as further disclosed in “ Our Management – Key Managerial Personnel and Senior Management ” on page 266 Managing Director The managing director of our Company, namely Alex Morgan. For further information, see “ Our Management – Board of Directors ” on page 250 Materiality Policy The policy adopted by our Board on May 17, 2025, for identification of: (a) outstanding material outstanding litigation involving our Company, our Promoters and our Directors; (b) companies, considered material by our Company, for the purposes of disclosure as group companies in the Draft Red Herring Prospectus, this Red Herring Prospectus and the Prospectus; and (c) outstanding dues to material creditors of our Company, in accordance with the disclosure requirements under the SEBI ICDR Regulations, for the purposes of disclosure in the Draft Red Herring Prospectus, this Red Herring Prospectus and the Prospectus MoA/ Memorandum of Association The memorandum of association of our Company, as amended Nomination and Remuneration Committee The nomination and remuneration committee of our Board, as disclosed in “ Our Management – Committees of our Board ” on page 257 Non-Executive Non-Independent Director(s) The non-executive non-independent Directors on our Board, as disclosed in “ Our Management – Board of Directors ” on page 250 Parents Branch Jane Smith, Peter Parker, Hooli Technologies Limited and Globex Industries Limited</w:t>
       </w:r>
     </w:p>
     <w:p>
@@ -210,7 +210,7 @@
     </w:p>
     <w:p>
       <w:r>
-        <w:t>Term Description Registrar of Companies/RoC The Registrar of Companies, Maharashtra at Pune Restated Financial Statements The restated financial information of our Company comprising the restated statements of assets and liabilities as on and for the three-month period ended June 30, 2025 and for the years ended March 31, 2025, March 31, 2024 and March 31, 2023, the restated statements of profit and loss (including other comprehensive income), the restated statements of cash flow, the restated statements of changes in equity, the summary of material accounting policies and other explanatory information and other financial information, including the annexures, notes and schedules thereto, for the three-months period ended June 30, 2025, and for the years ended March 31, 2025, March 31, 2024 and March 31, 2023, prepared in terms of the requirements of Section 26 of Part I of Chapter III of the Companies Act, SEBI ICDR Regulations, the Guidance Note on Reports in Company Prospectuses (Revised 2019) issued by ICAI, as amended from time to time and the Indian Accounting Standards as specified under Section 133 of the Act and other accounting principles generally accepted in India. Risk Management Committee The risk management committee of our Board, as disclosed in “ Our Management – Corporate Governance - Committees of our Board ” on page 257 Rohit Branch Taylor Brown, his spouse, his children, lineal descendants and Initech Solutions Limited Sangeeta Branch Sangeeta Ramprasad Rai, her spouse, her children, lineal descendants and Stark Industries Limited Split of Equity Shares Pursuant to a resolution passed by our Board and Shareholders dated February 10, 2025 and February 11, 2025, respectively, our Company sub-divided the face value of its equity shares from ₹ 100 per equity share to ₹ 5 per Equity Share. For further details, see “ Summary of the Offer Document ” and “ Capital Structure – Notes to Capital Structure – Equity Share Capital History of our Company ” on pages 20 and 85, respectively Senior Management/ SM Our senior management in terms of Regulation 2(1)(bbbb) of the SEBI ICDR Regulations and as disclosed in “ Our Management – Key Managerial Personnel and Senior Management ” on page 266 Shareholders The holders of the Equity Shares from time to time Stakeholders Relationship Committee The stakeholders’ relationship committee of our Board, as disclosed in “ Our Management – Corporate Governance – Committees of our Board ” on page 257 Supa Facility Our manufacturing 606, Residency Road, Richmond Town, Bengaluru – 560 025, Maharashtra, India Unit 2 Our manufacturing 707, Civil Lines, Prayagraj – 211 001, Maharashtra, India Unit 3 Our manufacturing 123, MG Road, Sector 5, New Delhi – 110 001, Maharashtra, India Whole-time Director The whole-time director of our Company being, Jordan Lee. For further information, see “ Our Management – Board of Directors ” on page 250 Offer Related Terms Term Description Abridged Prospectus Abridged prospectus means a memorandum containing such salient features of a prospectus as may be specified by the SEBI in this behalf Acknowledgement Slip The slip or document issued by the relevant Designated Intermediary(ies) to a Bidder as proof of registration of the Bid cum Application Form Allot/ Allotment/ Allotted Unless the context otherwise requires, the allotment of the Equity Shares pursuant to the Fresh Issue and transfer of the Offered Shares by the Promoter Selling Shareholders pursuant to the Offer for Sale to successful Bidders Allotment Advice Note or advice or intimation of Allotment sent to the Bidders who have been or are to be Allotted the Equity Shares after the Basis of Allotment has been approved by the Designated Stock Exchange Allottee A successful Bidder to whom the Equity Shares are Allotted</w:t>
+        <w:t>Term Description Registrar of Companies/RoC The Registrar of Companies, Maharashtra at Pune Restated Financial Statements The restated financial information of our Company comprising the restated statements of assets and liabilities as on and for the three-month period ended June 30, 2025 and for the years ended March 31, 2025, March 31, 2024 and March 31, 2023, the restated statements of profit and loss (including other comprehensive income), the restated statements of cash flow, the restated statements of changes in equity, the summary of material accounting policies and other explanatory information and other financial information, including the annexures, notes and schedules thereto, for the three-months period ended June 30, 2025, and for the years ended March 31, 2025, March 31, 2024 and March 31, 2023, prepared in terms of the requirements of Section 26 of Part I of Chapter III of the Companies Act, SEBI ICDR Regulations, the Guidance Note on Reports in Company Prospectuses (Revised 2019) issued by ICAI, as amended from time to time and the Indian Accounting Standards as specified under Section 133 of the Act and other accounting principles generally accepted in India. Risk Management Committee The risk management committee of our Board, as disclosed in “ Our Management – Corporate Governance - Committees of our Board ” on page 257 Rohit Branch Taylor Brown, his spouse, his children, lineal descendants and Initech Solutions Limited Sangeeta Branch Sangeeta Ramprasad Rai, her spouse, her children, lineal descendants and Stark Industries Limited Split of Equity Shares Pursuant to a resolution passed by our Board and Shareholders dated February 10, 2025 and February 11, 2025, respectively, our Company sub-divided the face value of its equity shares from ₹ 100 per equity share to ₹ 5 per Equity Share. For further details, see “ Summary of the Offer Document ” and “ Capital Structure – Notes to Capital Structure – Equity Share Capital History of our Company ” on pages 20 and 85, respectively Senior Management/ SM Our senior management in terms of Regulation 2(1)(bbbb) of the SEBI ICDR Regulations and as disclosed in “ Our Management – Key Managerial Personnel and Senior Management ” on page 266 Shareholders The holders of the Equity Shares from time to time Stakeholders Relationship Committee The stakeholders’ relationship committee of our Board, as disclosed in “ Our Management – Corporate Governance – Committees of our Board ” on page 257 Supa Facility Our manufacturing 606, Residency Road, Richmond Town, Bengaluru – 560 025, Maharashtra, India Unit 2 Our manufacturing 707, Civil Lines, Prayagraj – 211 001, Maharashtra, India Unit 3 Our manufacturing 123, MG Road, Sector 5, New Delhi – 110 001 (11), Maharashtra, India Whole-time Director The whole-time director of our Company being, Jordan Lee. For further information, see “ Our Management – Board of Directors ” on page 250 Offer Related Terms Term Description Abridged Prospectus Abridged prospectus means a memorandum containing such salient features of a prospectus as may be specified by the SEBI in this behalf Acknowledgement Slip The slip or document issued by the relevant Designated Intermediary(ies) to a Bidder as proof of registration of the Bid cum Application Form Allot/ Allotment/ Allotted Unless the context otherwise requires, the allotment of the Equity Shares pursuant to the Fresh Issue and transfer of the Offered Shares by the Promoter Selling Shareholders pursuant to the Offer for Sale to successful Bidders Allotment Advice Note or advice or intimation of Allotment sent to the Bidders who have been or are to be Allotted the Equity Shares after the Basis of Allotment has been approved by the Designated Stock Exchange Allottee A successful Bidder to whom the Equity Shares are Allotted</w:t>
       </w:r>
     </w:p>
     <w:p>
@@ -282,7 +282,7 @@
     </w:p>
     <w:p>
       <w:r>
-        <w:t>Term Description newspaper), all editions of Jansatta (a widely circulated Hindi national daily newspaper), and Pune edition of Loksatta (a widely circulated Marathi daily newspaper, Marathi being the regional language of Maharashtra, where our Registered Office is located) Bid/ Offer Period Except in relation to Bids by Anchor Investors, the period between the Bid/Offer Opening Date and the Bid/Offer Closing Date, inclusive of both days, during which prospective Bidders can submit their Bids, including any revisions thereof, in accordance with the SEBI ICDR Regulations and in terms of this Red Herring Prospectus. Provided that the Bidding shall be kept open for a minimum of three Working Days for all categories of Bidders, other than Anchor Investors In cases of force majeure , banking strike or similar unforeseen circumstances, our Company may, for reasons to be recorded in writing, extend the Bid/Offer Period for a minimum of one Working Day, subject to the Bid/Offer Period not exceeding 10 Working Days Bidder Any prospective investor who makes a Bid pursuant to the terms of this Red Herring Prospectus and the Bid cum Application Form and unless otherwise stated or implied, includes an Anchor Investor Bidding Centres Centres at which the Designated Intermediaries shall accept the ASBA Forms, i.e., Designated SCSB Branches for SCSBs, Specified Locations for Syndicate, Broker Centres for Registered Brokers, Designated RTA Locations for RTAs and Designated CDP Locations for CDPs Book Building Process Book building process, as provided in Schedule XIII of the SEBI ICDR Regulations, in terms of which the Offer is being made Book Running Lead Managers/ BRLMs/Managers The book running lead managers to the Offer namely, Acme Corp Ltd. and Tyrell Corporation Broker Centres Broker centres of the Registered Brokers where ASBA Bidders can submit the ASBA Forms, provided that UPI Bidders may only submit ASBA Forms at such broker centres if they are Bidding using the UPI Mechanism. The details of such broker centres, along with the names and contact details of the Registered Brokers, are available on the respective websites of the Stock Exchanges (www.bseindia.com and www.nseindia.com ) CAN/ Confirmation of Allocation Note Notice or intimation of allocation of the Equity Shares sent to Anchor Investors, who have been allocated the Equity Shares, on/after the Anchor Investor Bidding Date Cap Price The higher end of the Price Band, above which the Offer Price and the Anchor Investor Offer Price will not be finalised and above which no Bids will be accepted, including any revisions thereof. The Cap Price shall be at least 105% of the Floor Price and shall not be more than 120% of the Floor Price Cash Escrow and Sponsor Banks Agreement Agreement dated December 9, 2025 entered into and amongst our Company, the Promoter Selling Shareholders, the Registrar to the Offer, the Book Running Lead Managers, the Syndicate Members and the Bankers to the Offer in accordance with UPI Circulars, for inter alia , the appointment of the Bankers to the Offer for the collection of the Bid Amounts from Anchor Investors, transfer of funds to the Public Offer Account and where applicable, refunds of the amounts collected from Bidders, on the terms and conditions thereof Client ID Client identification number maintained with one of the Depositories in relation to the Bidder’s beneficiary account Collecting Depository Participant/ CDP A depository participant as defined under the Depositories Act, registered with SEBI and who is eligible to procure Bids at the Designated CDP Locations in terms of circular no. CIR/CFD/POLICYCELL/11/2015 dated November 10, 2015 (to the extent not rescinded by the SEBI ICDR Master Circular in relation to the SEBI ICDR Regulations), issued by SEBI and other applicable circulars issued by SEBI as per the lists available on the websites of the Stock Exchanges at www.bseindia.com and www.nseindia.com , as updated from time to time Cut-off Price Offer Price, finalised by our Company, in consultation with the BRLMs, which shall be any price within the Price Band. Only Retail Individual Investors Bidding in the Retail Portion are entitled to Bid at the Cut-off Price. QIBs (including Anchor Investors) and Non-Institutional Investors are not entitled to Bid at the Cut-off Price</w:t>
+        <w:t>Term Description newspaper), all editions of Jansatta (a widely circulated Hindi national daily newspaper), and Pune edition of Loksatta (a widely circulated Marathi daily newspaper, Marathi being the regional language of Maharashtra, where our Registered Office is located) Bid/ Offer Period Except in relation to Bids by Anchor Investors, the period between the Bid/Offer Opening Date and the Bid/Offer Closing Date, inclusive of both days, during which prospective Bidders can submit their Bids, including any revisions thereof, in accordance with the SEBI ICDR Regulations and in terms of this Red Herring Prospectus. Provided that the Bidding shall be kept open for a minimum of three Working Days for all categories of Bidders, other than Anchor Investors In cases of force majeure , banking strike or similar unforeseen circumstances, our Company may, for reasons to be recorded in writing, extend the Bid/Offer Period for a minimum of one Working Day, subject to the Bid/Offer Period not exceeding 10 Working Days Bidder Any prospective investor who makes a Bid pursuant to the terms of this Red Herring Prospectus and the Bid cum Application Form and unless otherwise stated or implied, includes an Anchor Investor Bidding Centres Centres at which the Designated Intermediaries shall accept the ASBA Forms, i.e., Designated SCSB Branches for SCSBs, Specified Locations for Syndicate, Broker Centres for Registered Brokers, Designated RTA Locations for RTAs and Designated CDP Locations for CDPs Book Building Process Book building process, as provided in Schedule XIII of the SEBI ICDR Regulations, in terms of which the Offer is being made Book Running Lead Managers/ BRLMs/Managers The book running lead managers to the Offer namely, Acme Corp Ltd. (41) and Tyrell Corporation Broker Centres Broker centres of the Registered Brokers where ASBA Bidders can submit the ASBA Forms, provided that UPI Bidders may only submit ASBA Forms at such broker centres if they are Bidding using the UPI Mechanism. The details of such broker centres, along with the names and contact details of the Registered Brokers, are available on the respective websites of the Stock Exchanges (www.bseindia.com and www.nseindia.com ) CAN/ Confirmation of Allocation Note Notice or intimation of allocation of the Equity Shares sent to Anchor Investors, who have been allocated the Equity Shares, on/after the Anchor Investor Bidding Date Cap Price The higher end of the Price Band, above which the Offer Price and the Anchor Investor Offer Price will not be finalised and above which no Bids will be accepted, including any revisions thereof. The Cap Price shall be at least 105% of the Floor Price and shall not be more than 120% of the Floor Price Cash Escrow and Sponsor Banks Agreement Agreement dated December 9, 2025 entered into and amongst our Company, the Promoter Selling Shareholders, the Registrar to the Offer, the Book Running Lead Managers, the Syndicate Members and the Bankers to the Offer in accordance with UPI Circulars, for inter alia , the appointment of the Bankers to the Offer for the collection of the Bid Amounts from Anchor Investors, transfer of funds to the Public Offer Account and where applicable, refunds of the amounts collected from Bidders, on the terms and conditions thereof Client ID Client identification number maintained with one of the Depositories in relation to the Bidder’s beneficiary account Collecting Depository Participant/ CDP A depository participant as defined under the Depositories Act, registered with SEBI and who is eligible to procure Bids at the Designated CDP Locations in terms of circular no. CIR/CFD/POLICYCELL/11/2015 dated November 10, 2015 (to the extent not rescinded by the SEBI ICDR Master Circular in relation to the SEBI ICDR Regulations), issued by SEBI and other applicable circulars issued by SEBI as per the lists available on the websites of the Stock Exchanges at www.bseindia.com and www.nseindia.com , as updated from time to time Cut-off Price Offer Price, finalised by our Company, in consultation with the BRLMs, which shall be any price within the Price Band. Only Retail Individual Investors Bidding in the Retail Portion are entitled to Bid at the Cut-off Price. QIBs (including Anchor Investors) and Non-Institutional Investors are not entitled to Bid at the Cut-off Price</w:t>
       </w:r>
     </w:p>
     <w:p>
@@ -318,7 +318,7 @@
     </w:p>
     <w:p>
       <w:r>
-        <w:t>Term Description In relation to ASBA Forms submitted by UPI Bidders where the Bid Amount will be blocked upon acceptance of UPI Mandate Request by such UPI Bidders using the UPI Mechanism, Designated Intermediaries shall mean Syndicate, sub-syndicate, Registered Brokers, CDPs and RTAs. In relation to ASBA Forms submitted by QIBs and NIIs (not using the UPI Mechanism), Designated Intermediaries shall mean SCSBs, Syndicate, sub-Syndicate, Registered Brokers, CDPs and RTAs Designated RTA Locations Such centres of the RTAs where ASBA Bidders can submit the ASBA Forms (in case of UPI Bidder only ASBA Forms under UPI). The details of such Designated RTA Locations, along with the names and contact details of the RTAs are available on the respective websites of the Stock Exchanges at www.bseindia.com and www.nseindia.com and as updated from time to time Designated SCSB Branches Such branches of the SCSBs which shall collect the ASBA Forms, a list of which is available on the website of SEBI at www.sebi.gov.in/sebiweb/other/OtherAction.do?doRecognised=yes or at such other website as may be prescribed by SEBI from time to time Designated Stock Exchange BSE Draft Red Herring Prospectus/ DRHP The draft red herring prospectus dated May 22, 2025, issued in accordance with the SEBI ICDR Regulations, which did not contain complete particulars of the price at which the Equity Shares will be Allotted and the size of the Offer Eligible FPI(s) FPIs that are eligible to participate in this Offer in terms of applicable laws Eligible NRI(s) A non-resident Indian, resident in a jurisdiction outside India where it is not unlawful to make an offer or invitation under the Offer and in relation to whom this Red Herring Prospectus and the Bid Cum Application Form constitute an invitation to subscribe or purchase for the Equity Shares Escrow Accounts Accounts opened with the Escrow Collection Bank and in whose favour Anchor Investors will transfer the money through direct credit/NEFT/RTGS/NACH in respect of the Bid Amount while submitting a Bid Escrow Collection Bank The bank, which is a clearing member registered with SEBI as banker to an issue under the SEBI BTI Regulations and with whom the Escrow Accounts have been opened, in this case being Globex Industries Limited First Bidder Bidder whose name shall be mentioned in the Bid cum Application Form or the Revision Form and in case of joint Bids, whose name shall also appear as the first holder of the beneficiary account held in joint names Floor Price The lower end of the Price Band, subject to any revision(s) thereto, at or above which the Offer Price and the Anchor Investor Offer Price will be finalised and below which no Bids will be accepted Fraudulent Borrower Fraudulent borrower as defined under Regulation 2(1)(lll) of the SEBI ICDR Regulations Fresh Issue The fresh issue of up to [●] Equity Shares of face value of ₹ 5 each by our Company, at ₹ [●] per Equity Share (including a premium of ₹ [●] per Equity Share) aggregating up to ₹ 4,200.00 million. For information, see “ The Offer ” on page 67 Fugitive Economic Offender An individual who is declared a fugitive economic offender under Section 12 of the Fugitive Economic Offenders Act, 2012 General Information Document The General Information Document for investing in public offers, prepared and issued in accordance with the SEBI circular (SEBI/HO/CFD/DIL1/CIR/P/2020/37) dated March 17, 2020, issued by SEBI, suitably modified and updated pursuant to, among others, the UPI Circulars and any subsequent circulars or notifications issued by SEBI from time to time GSM Graded Surveillance Measures Gross Proceeds The gross proceeds of the Umbrella Holdings Private Limited Life Insurance Companies An entity registered with the Insurance Regulatory and Development Authority of India under the provisions of the Insurance Act, 1938 Monitoring Agency The monitoring agency appointed pursuant to the Monitoring Agency Agreement, namely Initech Solutions Limited</w:t>
+        <w:t>Term Description In relation to ASBA Forms submitted by UPI Bidders where the Bid Amount will be blocked upon acceptance of UPI Mandate Request by such UPI Bidders using the UPI Mechanism, Designated Intermediaries shall mean Syndicate, sub-syndicate, Registered Brokers, CDPs and RTAs. In relation to ASBA Forms submitted by QIBs and NIIs (not using the UPI Mechanism), Designated Intermediaries shall mean SCSBs, Syndicate, sub-Syndicate, Registered Brokers, CDPs and RTAs Designated RTA Locations Such centres of the RTAs where ASBA Bidders can submit the ASBA Forms (in case of UPI Bidder only ASBA Forms under UPI). The details of such Designated RTA Locations, along with the names and contact details of the RTAs are available on the respective websites of the Stock Exchanges at www.bseindia.com and www.nseindia.com and as updated from time to time Designated SCSB Branches Such branches of the SCSBs which shall collect the ASBA Forms, a list of which is available on the website of SEBI at www.sebi.gov.in/sebiweb/other/OtherAction.do?doRecognised=yes or at such other website as may be prescribed by SEBI from time to time Designated Stock Exchange BSE Draft Red Herring Prospectus/ DRHP The draft red herring prospectus dated May 22, 2025, issued in accordance with the SEBI ICDR Regulations, which did not contain complete particulars of the price at which the Equity Shares will be Allotted and the size of the Offer Eligible FPI(s) FPIs that are eligible to participate in this Offer in terms of applicable laws Eligible NRI(s) A non-resident Indian, resident in a jurisdiction outside India where it is not unlawful to make an offer or invitation under the Offer and in relation to whom this Red Herring Prospectus and the Bid Cum Application Form constitute an invitation to subscribe or purchase for the Equity Shares Escrow Accounts Accounts opened with the Escrow Collection Bank and in whose favour Anchor Investors will transfer the money through direct credit/NEFT/RTGS/NACH in respect of the Bid Amount while submitting a Bid Escrow Collection Bank The bank, which is a clearing member registered with SEBI as banker to an issue under the SEBI BTI Regulations and with whom the Escrow Accounts have been opened, in this case being Globex Industries Limited (42) First Bidder Bidder whose name shall be mentioned in the Bid cum Application Form or the Revision Form and in case of joint Bids, whose name shall also appear as the first holder of the beneficiary account held in joint names Floor Price The lower end of the Price Band, subject to any revision(s) thereto, at or above which the Offer Price and the Anchor Investor Offer Price will be finalised and below which no Bids will be accepted Fraudulent Borrower Fraudulent borrower as defined under Regulation 2(1)(lll) of the SEBI ICDR Regulations Fresh Issue The fresh issue of up to [●] Equity Shares of face value of ₹ 5 each by our Company, at ₹ [●] per Equity Share (including a premium of ₹ [●] per Equity Share) aggregating up to ₹ 4,200.00 million. For information, see “ The Offer ” on page 67 Fugitive Economic Offender An individual who is declared a fugitive economic offender under Section 12 of the Fugitive Economic Offenders Act, 2012 General Information Document The General Information Document for investing in public offers, prepared and issued in accordance with the SEBI circular (SEBI/HO/CFD/DIL1/CIR/P/2020/37) dated March 17, 2020, issued by SEBI, suitably modified and updated pursuant to, among others, the UPI Circulars and any subsequent circulars or notifications issued by SEBI from time to time GSM Graded Surveillance Measures Gross Proceeds The gross proceeds of the Umbrella Holdings Private Limited (43) Life Insurance Companies An entity registered with the Insurance Regulatory and Development Authority of India under the provisions of the Insurance Act, 1938 Monitoring Agency The monitoring agency appointed pursuant to the Monitoring Agency Agreement, namely Initech Solutions Limited (44)</w:t>
       </w:r>
     </w:p>
     <w:p>
@@ -354,7 +354,7 @@
     </w:p>
     <w:p>
       <w:r>
-        <w:t>Term Description with application size of more than ₹ 1.00 million, provided that the unsubscribed portion in either of such sub-categories may be allocated to applicants in the other sub-category of Non- Institutional Investors, subject to valid Bids being received at or above the Offer Price Non-Resident A person resident outside India, as defined under FEMA and includes NRIs, FPIs and Hooli Technologies Limited Offer The initial public offering of up to [●] Equity Shares of face value of ₹ 5 each for cash at a price of ₹ [●] each (including a share premium of ₹ [●] each), aggregating up to ₹ 7,100.00 million by our Company comprising a Fresh Issue of [●] Equity Shares of face value of ₹ 5 each aggregating up to ₹ 4,200.00 million, an Offer for Sale of up to [●] Equity Shares of face value of ₹ 5 each aggregating to ₹ 2,900.00 million by the Promoter Selling Shareholders Offer Agreement The agreement dated May 22, 2025, amongst our Company, the Promoter Selling Shareholders and the BRLMs, pursuant to which certain arrangements are agreed to in relation to the Offer Offer for Sale The offer for sale component of the Offer of up to [●] Equity Shares of face value of ₹ 5 each aggregating up to ₹ 2,900.00 million, comprising of an offer for sale of up to [●] Equity Shares of face value of ₹ 5 each by Jane Smith aggregating up to ₹ 1,528.00 million, up to [●] Equity Shares of face value of ₹ 5 each by Peter Parker aggregating up to ₹ 422.00 million, up to [●] Equity Shares of face value of ₹ 5 each by Alex Morgan aggregating up to ₹ 475.00 million and up to [●] Equity Shares of face value of ₹ 5 each by Taylor Brown aggregating up to ₹ 475.00 million Offer Price ₹ [●] per Equity Share, being the final price within the Price Band, at which Equity Shares will be Allotted to successful Bidders, other than Anchor Investors as determined in accordance with the Book Building Process and determined by our Company, in consultation with the Book Running Lead Managers, in terms of this Red Herring Prospectus on the Pricing Date. Equity Shares will be Allotted to Anchor Investors at the Anchor Investor Offer Price in terms of this Red Herring Prospectus. The Offer Price will be decided by our Company, in consultation with the BRLMs on the Pricing Date, in accordance with the Book Building Process and in terms of this Red Herring Prospectus Offer Proceeds The proceeds of the Fresh Issue which shall be available to our Company and the proceeds from the Offer for Sale which shall be available to the Promoter Selling Shareholders. For further information about use of the Offer Proceeds, please see section titled “ Objects of the Offer ” on page 106 Offered Shares Up to [●] Equity Shares of face value of ₹ 5 each aggregating to ₹ 2,900.00 million being offered for sale by the Promoter Selling Shareholders in the Offer for Sale component of the Offer Pension Fund A fund registered with the Pension Fund Regulatory and Development Authority under the provisions of the Pension Fund Regulatory and Development Authority Act, 2013 Price Band Price band of a minimum price of ₹ [●] per Equity Share (Floor Price) and the maximum price of ₹ [●] per Equity Share (Cap Price) including any revisions thereof. The Cap Price shall be at least 105% of the Floor Price and shall be less than or equal to 120% of the Floor Price. The Price Band and the minimum Bid Lot for the Offer will be decided by our Company, in consultation with the BRLMs, and will be advertised in all editions of Financial express (a widely circulated English national daily newspaper), all editions of Jansatta (a widely circulated Hindi national daily newspaper) and Pune edition of Loksatta (a widely circulated Marathi daily newspaper, Marathi being the regional language of Maharashtra, where our Registered Office is situated) at least two Working Days prior to the Bid/Offer Opening Date, with the relevant financial ratios calculated at the Floor Price and at the Cap Price, and shall be made available to the Stock Exchanges for the purpose of uploading on their respective websites Pricing Date The date on which our Company, in consultation with the BRLMs, will finalise the Offer Price</w:t>
+        <w:t>Term Description with application size of more than ₹ 1.00 million, provided that the unsubscribed portion in either of such sub-categories may be allocated to applicants in the other sub-category of Non- Institutional Investors, subject to valid Bids being received at or above the Offer Price Non-Resident A person resident outside India, as defined under FEMA and includes NRIs, FPIs and Hooli Technologies Limited (45) Offer The initial public offering of up to [●] Equity Shares of face value of ₹ 5 each for cash at a price of ₹ [●] each (including a share premium of ₹ [●] each), aggregating up to ₹ 7,100.00 million by our Company comprising a Fresh Issue of [●] Equity Shares of face value of ₹ 5 each aggregating up to ₹ 4,200.00 million, an Offer for Sale of up to [●] Equity Shares of face value of ₹ 5 each aggregating to ₹ 2,900.00 million by the Promoter Selling Shareholders Offer Agreement The agreement dated May 22, 2025, amongst our Company, the Promoter Selling Shareholders and the BRLMs, pursuant to which certain arrangements are agreed to in relation to the Offer Offer for Sale The offer for sale component of the Offer of up to [●] Equity Shares of face value of ₹ 5 each aggregating up to ₹ 2,900.00 million, comprising of an offer for sale of up to [●] Equity Shares of face value of ₹ 5 each by Jane Smith aggregating up to ₹ 1,528.00 million, up to [●] Equity Shares of face value of ₹ 5 each by Peter Parker aggregating up to ₹ 422.00 million, up to [●] Equity Shares of face value of ₹ 5 each by Alex Morgan aggregating up to ₹ 475.00 million and up to [●] Equity Shares of face value of ₹ 5 each by Taylor Brown aggregating up to ₹ 475.00 million Offer Price ₹ [●] per Equity Share, being the final price within the Price Band, at which Equity Shares will be Allotted to successful Bidders, other than Anchor Investors as determined in accordance with the Book Building Process and determined by our Company, in consultation with the Book Running Lead Managers, in terms of this Red Herring Prospectus on the Pricing Date. Equity Shares will be Allotted to Anchor Investors at the Anchor Investor Offer Price in terms of this Red Herring Prospectus. The Offer Price will be decided by our Company, in consultation with the BRLMs on the Pricing Date, in accordance with the Book Building Process and in terms of this Red Herring Prospectus Offer Proceeds The proceeds of the Fresh Issue which shall be available to our Company and the proceeds from the Offer for Sale which shall be available to the Promoter Selling Shareholders. For further information about use of the Offer Proceeds, please see section titled “ Objects of the Offer ” on page 106 Offered Shares Up to [●] Equity Shares of face value of ₹ 5 each aggregating to ₹ 2,900.00 million being offered for sale by the Promoter Selling Shareholders in the Offer for Sale component of the Offer Pension Fund A fund registered with the Pension Fund Regulatory and Development Authority under the provisions of the Pension Fund Regulatory and Development Authority Act, 2013 Price Band Price band of a minimum price of ₹ [●] per Equity Share (Floor Price) and the maximum price of ₹ [●] per Equity Share (Cap Price) including any revisions thereof. The Cap Price shall be at least 105% of the Floor Price and shall be less than or equal to 120% of the Floor Price. The Price Band and the minimum Bid Lot for the Offer will be decided by our Company, in consultation with the BRLMs, and will be advertised in all editions of Financial express (a widely circulated English national daily newspaper), all editions of Jansatta (a widely circulated Hindi national daily newspaper) and Pune edition of Loksatta (a widely circulated Marathi daily newspaper, Marathi being the regional language of Maharashtra, where our Registered Office is situated) at least two Working Days prior to the Bid/Offer Opening Date, with the relevant financial ratios calculated at the Floor Price and at the Cap Price, and shall be made available to the Stock Exchanges for the purpose of uploading on their respective websites Pricing Date The date on which our Company, in consultation with the BRLMs, will finalise the Offer Price</w:t>
       </w:r>
     </w:p>
     <w:p>
@@ -372,7 +372,7 @@
     </w:p>
     <w:p>
       <w:r>
-        <w:t>Prospectus The Prospectus to be filed with the RoC in accordance with the Companies Act, 2013, and the SEBI ICDR Regulations containing, inter alia , the Offer Price that is determined at the end of the Book Building Process, the size of the Offer and certain other information, including any addenda or corrigenda thereto Public Offer Account Bank The bank with which the Public Offer Account has been opened for collection of Bid Amounts from Escrow Accounts and ASBA Accounts on the Designated Date, in this case being Pied Piper Inc. Public Offer Account Bank account opened with the Public Offer Account Bank under Section 40(3) of the Companies Act, 2013, to receive monies from the Escrow Accounts and ASBA Accounts on the Designated Date QIB Portion The category of the Offer (including the Anchor Investor Portion), being not more than 50% of the Offer, consisting of up to [●] Equity Shares of face value of ₹ 5 each aggregating to ₹ [●] million, which shall be available for allocation to QIBs on a proportionate basis, including the Anchor Investor Portion (in which allocation shall be on a discretionary basis, as determined by our Company in consultation with the BRLMs subject to the provisions of the SEBI ICDR Regulations), subject to valid Bids being received at or above the Offer Price or the Anchor Investor Offer Price (for Anchor Investors) Qualified Institutional Buyer(s)/ QIB(s)/ QIB Bidder(s) Qualified institutional buyers as defined under Regulation 2(1)(ss) of the SEBI ICDR Regulations</w:t>
+        <w:t>Prospectus The Prospectus to be filed with the RoC in accordance with the Companies Act, 2013, and the SEBI ICDR Regulations containing, inter alia , the Offer Price that is determined at the end of the Book Building Process, the size of the Offer and certain other information, including any addenda or corrigenda thereto Public Offer Account Bank The bank with which the Public Offer Account has been opened for collection of Bid Amounts from Escrow Accounts and ASBA Accounts on the Designated Date, in this case being Pied Piper Inc. (46) Public Offer Account Bank account opened with the Public Offer Account Bank under Section 40(3) of the Companies Act, 2013, to receive monies from the Escrow Accounts and ASBA Accounts on the Designated Date QIB Portion The category of the Offer (including the Anchor Investor Portion), being not more than 50% of the Offer, consisting of up to [●] Equity Shares of face value of ₹ 5 each aggregating to ₹ [●] million, which shall be available for allocation to QIBs on a proportionate basis, including the Anchor Investor Portion (in which allocation shall be on a discretionary basis, as determined by our Company in consultation with the BRLMs subject to the provisions of the SEBI ICDR Regulations), subject to valid Bids being received at or above the Offer Price or the Anchor Investor Offer Price (for Anchor Investors) Qualified Institutional Buyer(s)/ QIB(s)/ QIB Bidder(s) Qualified institutional buyers as defined under Regulation 2(1)(ss) of the SEBI ICDR Regulations</w:t>
       </w:r>
     </w:p>
     <w:p>
@@ -390,7 +390,7 @@
     </w:p>
     <w:p>
       <w:r>
-        <w:t>Term Description Red Herring Prospectus/ RHP This red herring prospectus dated December 10, 2025, issued in accordance with Section 32 of the Companies Act, 2013 and the provisions of the SEBI ICDR Regulations, which does not have complete particulars of the price at which the Equity Shares will be offered and the size of the Offer including any addenda or corrigenda thereto The Bid/Offer Opening Date is December 16, 2025, which is at least three Working Days after filing of this Red Herring Prospectus with the RoC. This Red Herring Prospectus will become the Prospectus upon filing with the RoC after the Pricing Date, including any addenda or corrigenda thereto Refund Account The account opened with the Refund Bank, from which refunds, if any, of the whole or part of the Bid Amount to the Anchor Investors shall be made. Refund Bank The bank which is a clearing member registered with SEBI under the SEBI BTI Regulations with whom the Refund Account has been opened, in this case being Globex Industries Limited Registered Brokers Stockbrokers registered with the stock exchanges having nationwide terminals, other than the members of the Syndicate and eligible to procure Bids in terms of the SEBI ICDR Master Circular and the SEBI circular no. CIR/CFD/14/2012 dated October 4, 2012, and the UPI Circulars RTAs/Registrar and Share Transfer Agents The registrar and share transfer agents registered with SEBI and eligible to procure Bids at the Designated RTA Locations as per the list available on the websites of BSE and NSE, and the UPI Circulars Registrar Agreement The agreement dated May 22, 2025 between our Company, the Promoter Selling Shareholders and the Registrar to the Offer in relation to the responsibilities and obligations of the Registrar to the Offer pertaining to the Offer Registrar to the Stark Industries Limited (Massive Dynamic Inc.) Retail Individual Investors(s)/ RII(s) Individual Bidders, who have Bid for the Equity Shares for an amount not more than ₹ 0.20 million in any of the bidding options in the Offer (including HUFs applying through their Karta and Eligible NRIs and does not include NRIs other than Eligible NRIs) Retail Portion The portion of the Offer being not less than 35% of the Offer consisting of [●] Equity Shares of face value of ₹ 5 each, available for allocation to Retail Individual Investors as per the SEBI ICDR Regulations, subject to valid Bids being received at or above the Offer Price Revision Form Form used by the Bidders to modify the quantity of the Equity Shares or the Bid Amount in any of their ASBA Form(s) or any previous Revision Form(s) QIB Bidders and Non-Institutional Investors are not allowed to withdraw or lower their Bids (in terms of quantity of Equity Shares or the Bid Amount) at any stage. Retail Individual Investors can revise their Bids during the Bid/Offer Period and withdraw their Bids until Bid/Offer Closing Date SCORES SEBI Complaints Redressal Mechanism Self-Certified Syndicate Bank(s)/ SCSB(s) (i) The banks registered with SEBI, offering services in relation to ASBA (other than through UPI Mechanism), a list of which is available on the website of SEBI at www.sebi.gov.in/sebiweb/other/OtherAction.do?doRecognisedFpi=yes&amp;intmId=34 or www.sebi.gov.in/sebiweb/other/OtherAction.do?doRecognisedFpi=yes&amp;intmId=35, as applicable, or such other website as updated from time to time, and (i) The banks registered with SEBI, enabled for UPI Mechanism, a list of which is available on the website of SEBI at www.sebi.gov.in/sebiweb/other/OtherAction.do?doRecognisedFpi=yes&amp;intmId=40 or such other website as updated from time to time Share Escrow Agent The share escrow agent appointed pursuant to the Share Escrow Agreement, namely, Wayne Enterprises Limited ( Massive Dynamic Inc. ) Share Escrow Agreement The agreement dated December 6, 2025 entered into between our Company, the Promoter Selling Shareholders and the Share Escrow Agent in connection with the transfer of the respective portion of Equity Shares being offered by each Promoter Selling Shareholder in the Offer for Sale portion of the Offer and credit of such Equity Shares to the demat account of the Allottees in accordance with the Basis of Allotment Specified Locations Bidding centres where the Syndicate shall accept ASBA Forms from Bidders, a list of which</w:t>
+        <w:t>Term Description Red Herring Prospectus/ RHP This red herring prospectus dated December 10, 2025, issued in accordance with Section 32 of the Companies Act, 2013 and the provisions of the SEBI ICDR Regulations, which does not have complete particulars of the price at which the Equity Shares will be offered and the size of the Offer including any addenda or corrigenda thereto The Bid/Offer Opening Date is December 16, 2025, which is at least three Working Days after filing of this Red Herring Prospectus with the RoC. This Red Herring Prospectus will become the Prospectus upon filing with the RoC after the Pricing Date, including any addenda or corrigenda thereto Refund Account The account opened with the Refund Bank, from which refunds, if any, of the whole or part of the Bid Amount to the Anchor Investors shall be made. Refund Bank The bank which is a clearing member registered with SEBI under the SEBI BTI Regulations with whom the Refund Account has been opened, in this case being Globex Industries Limited (42) Registered Brokers Stockbrokers registered with the stock exchanges having nationwide terminals, other than the members of the Syndicate and eligible to procure Bids in terms of the SEBI ICDR Master Circular and the SEBI circular no. CIR/CFD/14/2012 dated October 4, 2012, and the UPI Circulars RTAs/Registrar and Share Transfer Agents The registrar and share transfer agents registered with SEBI and eligible to procure Bids at the Designated RTA Locations as per the list available on the websites of BSE and NSE, and the UPI Circulars Registrar Agreement The agreement dated May 22, 2025 between our Company, the Promoter Selling Shareholders and the Registrar to the Offer in relation to the responsibilities and obligations of the Registrar to the Offer pertaining to the Offer Registrar to the Stark Industries Limited (47) (Massive Dynamic Inc.) Retail Individual Investors(s)/ RII(s) Individual Bidders, who have Bid for the Equity Shares for an amount not more than ₹ 0.20 million in any of the bidding options in the Offer (including HUFs applying through their Karta and Eligible NRIs and does not include NRIs other than Eligible NRIs) Retail Portion The portion of the Offer being not less than 35% of the Offer consisting of [●] Equity Shares of face value of ₹ 5 each, available for allocation to Retail Individual Investors as per the SEBI ICDR Regulations, subject to valid Bids being received at or above the Offer Price Revision Form Form used by the Bidders to modify the quantity of the Equity Shares or the Bid Amount in any of their ASBA Form(s) or any previous Revision Form(s) QIB Bidders and Non-Institutional Investors are not allowed to withdraw or lower their Bids (in terms of quantity of Equity Shares or the Bid Amount) at any stage. Retail Individual Investors can revise their Bids during the Bid/Offer Period and withdraw their Bids until Bid/Offer Closing Date SCORES SEBI Complaints Redressal Mechanism Self-Certified Syndicate Bank(s)/ SCSB(s) (i) The banks registered with SEBI, offering services in relation to ASBA (other than through UPI Mechanism), a list of which is available on the website of SEBI at www.sebi.gov.in/sebiweb/other/OtherAction.do?doRecognisedFpi=yes&amp;intmId=34 or www.sebi.gov.in/sebiweb/other/OtherAction.do?doRecognisedFpi=yes&amp;intmId=35, as applicable, or such other website as updated from time to time, and (i) The banks registered with SEBI, enabled for UPI Mechanism, a list of which is available on the website of SEBI at www.sebi.gov.in/sebiweb/other/OtherAction.do?doRecognisedFpi=yes&amp;intmId=40 or such other website as updated from time to time Share Escrow Agent The share escrow agent appointed pursuant to the Share Escrow Agreement, namely, Wayne Enterprises Limited (48) ( Massive Dynamic Inc. ) Share Escrow Agreement The agreement dated December 6, 2025 entered into between our Company, the Promoter Selling Shareholders and the Share Escrow Agent in connection with the transfer of the respective portion of Equity Shares being offered by each Promoter Selling Shareholder in the Offer for Sale portion of the Offer and credit of such Equity Shares to the demat account of the Allottees in accordance with the Basis of Allotment Specified Locations Bidding centres where the Syndicate shall accept ASBA Forms from Bidders, a list of which</w:t>
       </w:r>
     </w:p>
     <w:p>
@@ -408,7 +408,7 @@
     </w:p>
     <w:p>
       <w:r>
-        <w:t>will be included in the Bid cum Application Form Sponsor Banks The Bankers to the Offer registered with SEBI, which have been appointed by our Company to act as a conduit between the Stock Exchanges and NPCI in order to push the UPI Mandate Request and/or payment instructions of the UPI Bidders using the UPI and carry out other responsibilities, in terms of the UPI Circulars, in this case being Globex Industries Limited and Pied Piper Inc. Stock Exchanges Collectively, Vance Refrigeration LLC and National Stock Exchange of Dunder Mifflin Private Limited STT Securities transaction tax Syndicate Agreement Agreement dated December 9, 2025, entered into and amongst our Company, the Promoter Selling Shareholders, the BRLMs, the Syndicate Members and the Registrar to the Offer in relation to collection of Bid cum Application Forms by Syndicate Syndicate Members Intermediaries (other than the BRLMs) registered with SEBI who are permitted to accept bids, applications and place order with respect to the Offer and carry out activities as an underwriter, namely, Acme Corp Ltd. and Tyrell Corporation</w:t>
+        <w:t>will be included in the Bid cum Application Form Sponsor Banks The Bankers to the Offer registered with SEBI, which have been appointed by our Company to act as a conduit between the Stock Exchanges and NPCI in order to push the UPI Mandate Request and/or payment instructions of the UPI Bidders using the UPI and carry out other responsibilities, in terms of the UPI Circulars, in this case being Globex Industries Limited (42) and Pied Piper Inc. (46) Stock Exchanges Collectively, Vance Refrigeration LLC and National Stock Exchange of Dunder Mifflin Private Limited STT Securities transaction tax Syndicate Agreement Agreement dated December 9, 2025, entered into and amongst our Company, the Promoter Selling Shareholders, the BRLMs, the Syndicate Members and the Registrar to the Offer in relation to collection of Bid cum Application Forms by Syndicate Syndicate Members Intermediaries (other than the BRLMs) registered with SEBI who are permitted to accept bids, applications and place order with respect to the Offer and carry out activities as an underwriter, namely, Acme Corp Ltd. (41) and Tyrell Corporation</w:t>
       </w:r>
     </w:p>
     <w:p>
@@ -444,7 +444,7 @@
     </w:p>
     <w:p>
       <w:r>
-        <w:t>Oscorp Limited Calendar Year or year Unless the context otherwise requires, shall refer to the twelve-month period ending December 31 Category I AIF AIFs registered as “Category I alternative investment funds” under the SEBI AIF Regulations Category I FPIs FPIs registered as “Category I foreign portfolio investors” under the SEBI FPI Regulations Category II AIF AIFs registered as “Category II alternative investment funds” under the SEBI AIF Regulations Category II FPIs FPIs registered as “Category II foreign portfolio investors” under the SEBI FPI Regulations Category III AIF AIFs registered as “Category III alternative investment funds” under the SEBI AIF Regulations CAGR Compound Annual Growth Rate CDSL Central Depository Services (Vance Refrigeration LLC CESTAT Customs, Excise and Service Tax Appellate Tribunal Companies Act, 1956 Companies Act, 1956, and the rules, regulations, notifications, modifications and clarifications made thereunder, as the context requires Companies Act, 2013/ Companies Act Companies Act, 2013 and the rules, regulations, notifications, modifications and clarifications thereunder CSR Corporate social responsibility</w:t>
+        <w:t>Oscorp Limited (49) Calendar Year or year Unless the context otherwise requires, shall refer to the twelve-month period ending December 31 Category I AIF AIFs registered as “Category I alternative investment funds” under the SEBI AIF Regulations Category I FPIs FPIs registered as “Category I foreign portfolio investors” under the SEBI FPI Regulations Category II AIF AIFs registered as “Category II alternative investment funds” under the SEBI AIF Regulations Category II FPIs FPIs registered as “Category II foreign portfolio investors” under the SEBI FPI Regulations Category III AIF AIFs registered as “Category III alternative investment funds” under the SEBI AIF Regulations CAGR Compound Annual Growth Rate CDSL Central Depository Services (Vance Refrigeration LLC (50) CESTAT Customs, Excise and Service Tax Appellate Tribunal Companies Act, 1956 Companies Act, 1956, and the rules, regulations, notifications, modifications and clarifications made thereunder, as the context requires Companies Act, 2013/ Companies Act Companies Act, 2013 and the rules, regulations, notifications, modifications and clarifications thereunder CSR Corporate social responsibility</w:t>
       </w:r>
     </w:p>
     <w:p>
@@ -480,7 +480,7 @@
     </w:p>
     <w:p>
       <w:r>
-        <w:t>N.A. or NA Not applicable NACH National Automated Clearing House NEFT National electronic fund transfer Non-Resident A person resident outside India, as defined under Dunder Mifflin Private Limited of India NRE Account Non-resident external account established in accordance with the Foreign Exchange Management (Deposit) Regulations, 2016 NRI A person resident outside India who is a citizen of India as defined under the Foreign Exchange Management (Deposit) Regulations, 2016 or is an ‘Overseas Citizen of India’ cardholder within the meaning of section 7(A) of the Citizenship Act, 1955 NRO Account Non-resident ordinary account established in accordance with the Foreign Exchange Management (Deposit) Regulations, 2016 Soylent Corp Limited NSE National Stock Exchange of Dunder Mifflin Private Limited OCB A company, partnership, society or other corporate body owned directly or indirectly to the extent of at least 60% by NRIs including overseas trusts in which not less than 60% of the beneficial interest is irrevocably held by NRIs directly or indirectly and which was in existence on October 3, 2003, and immediately before such date had taken benefits under the general permission granted to overseas corporate bodies under the FEMA. Overseas corporate bodies are not allowed to invest in the Offer</w:t>
+        <w:t>N.A. or NA Not applicable NACH National Automated Clearing House NEFT National electronic fund transfer Non-Resident A person resident outside India, as defined under Dunder Mifflin Private Limited (51) of India NRE Account Non-resident external account established in accordance with the Foreign Exchange Management (Deposit) Regulations, 2016 NRI A person resident outside India who is a citizen of India as defined under the Foreign Exchange Management (Deposit) Regulations, 2016 or is an ‘Overseas Citizen of India’ cardholder within the meaning of section 7(A) of the Citizenship Act, 1955 NRO Account Non-resident ordinary account established in accordance with the Foreign Exchange Management (Deposit) Regulations, 2016 Soylent Corp Limited (52) NSE National Stock Exchange of Dunder Mifflin Private Limited OCB A company, partnership, society or other corporate body owned directly or indirectly to the extent of at least 60% by NRIs including overseas trusts in which not less than 60% of the beneficial interest is irrevocably held by NRIs directly or indirectly and which was in existence on October 3, 2003, and immediately before such date had taken benefits under the general permission granted to overseas corporate bodies under the FEMA. Overseas corporate bodies are not allowed to invest in the Offer</w:t>
       </w:r>
     </w:p>
     <w:p>
@@ -552,7 +552,7 @@
     </w:p>
     <w:p>
       <w:r>
-        <w:t>PMAY Pradhan Mantri Awas Yojana PM-KUSUM Pradhan Mantri Kisan Urja Suraksha evam Utthaan Mahabhiyan Tyrell Corporation QSR Quick Service Restaurants RBI Reserve Bank of India RDSS Revamped Distribution Sector Scheme RES Renewable Energy Resources ROCE Return on Capital Employed RoDTEP Remission of Duties and Taxes on Exported Products RoHS Restriction of Hazardous Substances RPO Renewable Purchase Obligations RRTS Regional rapid transit systems Cyberdyne Systems Limited of Dunder Mifflin Private Limited TIES Trade Infrastructure for Export Scheme UK United Kingdom UL Underwriters Laboratories W&amp;C Wires and cables WEO World Economic Outlook Y-O-Y Year-on-year Growth</w:t>
+        <w:t>PMAY Pradhan Mantri Awas Yojana PM-KUSUM Pradhan Mantri Kisan Urja Suraksha evam Utthaan Mahabhiyan Tyrell Corporation (53) QSR Quick Service Restaurants RBI Reserve Bank of India RDSS Revamped Distribution Sector Scheme RES Renewable Energy Resources ROCE Return on Capital Employed RoDTEP Remission of Duties and Taxes on Exported Products RoHS Restriction of Hazardous Substances RPO Renewable Purchase Obligations RRTS Regional rapid transit systems Cyberdyne Systems Limited (54) of Dunder Mifflin Private Limited TIES Trade Infrastructure for Export Scheme UK United Kingdom UL Underwriters Laboratories W&amp;C Wires and cables WEO World Economic Outlook Y-O-Y Year-on-year Growth</w:t>
       </w:r>
     </w:p>
     <w:p>
@@ -606,7 +606,7 @@
     </w:p>
     <w:p>
       <w:r>
-        <w:t>Non-GAAP Financial Measures Certain measures included in this Red Herring Prospectus, for instance EBITDA, EBITDA Margin, Net Debt, Return on Capital Employed, Return on Equity, and other non- GAAP measures (the “Non-GAAP Measures’’ ), presented in this Red Herring Prospectus are supplemental measures of our performance and liquidity that are not required by, or presented in accordance with Ind AS, IFRS or US GAAP. Furthermore, these Non-GAAP Measures are not a measurement of our financial performance or liquidity under Indian GAAP, IFRS or US GAAP and should not be considered as an alternative to net profit/loss, revenue from operations or any other performance measures derived in accordance with Ind AS, IFRS or US GAAP or as an alternative to cash flow from operations or as a measure of our liquidity. Further, these Non-GAAP Measures and other statistical and other information relating to operations and financial performance should not be considered in isolation or construed as an alternative to cash flows, profit/ (loss) for the years/ period or any other measure of financial performance or as an indicator of our operating performance, liquidity, profitability or cash flows generated by operating, investing or financing activities derived in accordance with Ind AS, Indian GAAP, IFRS or US GAAP. In addition, these Non-GAAP Measures and other statistical and other information relating to operations and financial performance, are not standardised terms and may not be computed on the basis of any standard methodology that is applicable across the industry and therefore, may not be comparable to financial measures of similar nomenclature that may be computed and presented by other companies and are not measures of operating performance or liquidity defined by Ind AS and may not be comparable to similarly titled measures presented by other companies. Further, they may have limited utility as a comparative measure. Although such Non-GAAP financial measures are not a measure of performance calculated in accordance with applicable accounting standards, our Company’s management believes that they are useful to an investor in evaluating us as they are widely used measures to evaluate a company’s operating performance. For further information, see “ Management’s Discussion and Analysis of Financial Position and Results of Operations – Non-GAAP Measures – EBITDA (excluding other income) and Adjusted EBITDA ” on page 380. Industry and Market Data Unless stated otherwise, industry and market data used in this Red Herring Prospectus has been obtained or derived from the report titled “ Industry Research Report on Magnet Winding Wires Market in India ” dated November 26, 2025 (“ CARE Report ”), prepared by Globex Industries Limited (“ CareEdge Research ”), which has been prepared exclusively for the purpose of understanding the industry in connection with the Offer and commissioned and paid for by our Company, pursuant to the engagement letter dated December 2, 2024. The CARE Report is available on the website of our Company at the following weblink: https://kshinternational.com/investor-relations/industry-report/. Further, CareEdge Research, pursuant to their consent letter dated November 26, 2025 (“ Letter ”) has accorded their no objection and consent to use the CARE Report. CareEdge Research, pursuant to their Letter, has also confirmed that it is an independent agency and has no conflict of interest issuing the CARE Report, and confirmed that it is not related, either directly or indirectly, to our Company, our Directors, our Promoters (including the Promoter Selling Shareholders), our Key Managerial Personnel, our Senior Management, our Group Companies or the Book Running Lead Managers. Industry publications generally state that the information contained in such publications has been obtained from publicly available documents from various sources believed to be reliable but accuracy, completeness relevance of such information shall be subject to the disclaimers, context and underlying assumptions of such sources. The data used in these sources may have been reclassified by us for the purposes of presentation and may also not be comparable. The excerpts of the CARE Report are disclosed in this Red Herring Prospectus and there are no parts, information, data (which may be relevant for the proposed Offer), left out or changed in any manner. The extent to which the industry and market data presented in this Red Herring Prospectus is meaningful and depends upon the reader’s familiarity with, and understanding of, the methodologies used in compiling such information. There are no standard data gathering methodologies in the industry in which our Company conducts business and methodologies, and assumptions may vary widely among different market and industry sources. Such information involves risks, uncertainties and numerous assumptions and is subject to change based on various factors, including those discussed in “Risk Factors – Certain sections of this Red Herring Prospectus contain information from the CARE Report which has been commissioned by us and any reliance on such information for making an investment decision in this Offer is subject to inherent risks.” on page 40. Accordingly, no investment decision should be solely made on the basis of such information. In accordance with the disclosure requirements under the SEBI ICDR Regulations , the section titled “Basis for the Offer Price” on page 124 includes information relating to our listed peer group companies. Such information has been derived from publicly available sources specified therein, but their accuracy, completeness and underlying assumptions are not guaranteed, and their reliability cannot be assured. Accordingly, no investment decisions should be based solely on such information. The extent to which the industry and industry data used in this Red Herring Prospectus is meaningful depends on the reader’s familiarity with and understanding of the methodologies used in compiling such data. There are no standard data gathering methodologies in the industry in which the business of our Company is conducted, and methodologies and assumptions may vary widely among different industry sources.</w:t>
+        <w:t>Non-GAAP Financial Measures Certain measures included in this Red Herring Prospectus, for instance EBITDA, EBITDA Margin, Net Debt, Return on Capital Employed, Return on Equity, and other non- GAAP measures (the “Non-GAAP Measures’’ ), presented in this Red Herring Prospectus are supplemental measures of our performance and liquidity that are not required by, or presented in accordance with Ind AS, IFRS or US GAAP. Furthermore, these Non-GAAP Measures are not a measurement of our financial performance or liquidity under Indian GAAP, IFRS or US GAAP and should not be considered as an alternative to net profit/loss, revenue from operations or any other performance measures derived in accordance with Ind AS, IFRS or US GAAP or as an alternative to cash flow from operations or as a measure of our liquidity. Further, these Non-GAAP Measures and other statistical and other information relating to operations and financial performance should not be considered in isolation or construed as an alternative to cash flows, profit/ (loss) for the years/ period or any other measure of financial performance or as an indicator of our operating performance, liquidity, profitability or cash flows generated by operating, investing or financing activities derived in accordance with Ind AS, Indian GAAP, IFRS or US GAAP. In addition, these Non-GAAP Measures and other statistical and other information relating to operations and financial performance, are not standardised terms and may not be computed on the basis of any standard methodology that is applicable across the industry and therefore, may not be comparable to financial measures of similar nomenclature that may be computed and presented by other companies and are not measures of operating performance or liquidity defined by Ind AS and may not be comparable to similarly titled measures presented by other companies. Further, they may have limited utility as a comparative measure. Although such Non-GAAP financial measures are not a measure of performance calculated in accordance with applicable accounting standards, our Company’s management believes that they are useful to an investor in evaluating us as they are widely used measures to evaluate a company’s operating performance. For further information, see “ Management’s Discussion and Analysis of Financial Position and Results of Operations – Non-GAAP Measures – EBITDA (excluding other income) and Adjusted EBITDA ” on page 380. Industry and Market Data Unless stated otherwise, industry and market data used in this Red Herring Prospectus has been obtained or derived from the report titled “ Industry Research Report on Magnet Winding Wires Market in India ” dated November 26, 2025 (“ CARE Report ”), prepared by Globex Industries Limited (22) (“ CareEdge Research ”), which has been prepared exclusively for the purpose of understanding the industry in connection with the Offer and commissioned and paid for by our Company, pursuant to the engagement letter dated December 2, 2024. The CARE Report is available on the website of our Company at the following weblink: https://kshinternational.com/investor-relations/industry-report/. Further, CareEdge Research, pursuant to their consent letter dated November 26, 2025 (“ Letter ”) has accorded their no objection and consent to use the CARE Report. CareEdge Research, pursuant to their Letter, has also confirmed that it is an independent agency and has no conflict of interest issuing the CARE Report, and confirmed that it is not related, either directly or indirectly, to our Company, our Directors, our Promoters (including the Promoter Selling Shareholders), our Key Managerial Personnel, our Senior Management, our Group Companies or the Book Running Lead Managers. Industry publications generally state that the information contained in such publications has been obtained from publicly available documents from various sources believed to be reliable but accuracy, completeness relevance of such information shall be subject to the disclaimers, context and underlying assumptions of such sources. The data used in these sources may have been reclassified by us for the purposes of presentation and may also not be comparable. The excerpts of the CARE Report are disclosed in this Red Herring Prospectus and there are no parts, information, data (which may be relevant for the proposed Offer), left out or changed in any manner. The extent to which the industry and market data presented in this Red Herring Prospectus is meaningful and depends upon the reader’s familiarity with, and understanding of, the methodologies used in compiling such information. There are no standard data gathering methodologies in the industry in which our Company conducts business and methodologies, and assumptions may vary widely among different market and industry sources. Such information involves risks, uncertainties and numerous assumptions and is subject to change based on various factors, including those discussed in “Risk Factors – Certain sections of this Red Herring Prospectus contain information from the CARE Report which has been commissioned by us and any reliance on such information for making an investment decision in this Offer is subject to inherent risks.” on page 40. Accordingly, no investment decision should be solely made on the basis of such information. In accordance with the disclosure requirements under the SEBI ICDR Regulations , the section titled “Basis for the Offer Price” on page 124 includes information relating to our listed peer group companies. Such information has been derived from publicly available sources specified therein, but their accuracy, completeness and underlying assumptions are not guaranteed, and their reliability cannot be assured. Accordingly, no investment decisions should be based solely on such information. The extent to which the industry and industry data used in this Red Herring Prospectus is meaningful depends on the reader’s familiarity with and understanding of the methodologies used in compiling such data. There are no standard data gathering methodologies in the industry in which the business of our Company is conducted, and methodologies and assumptions may vary widely among different industry sources.</w:t>
       </w:r>
     </w:p>
     <w:p>
@@ -732,7 +732,7 @@
     </w:p>
     <w:p>
       <w:r>
-        <w:t>Name Pre-Offer Post-Offer shareholding as at Allotment ^ Number of Equity Shares of face value of ₹ 5 each Percentage of pre-Offer Equity Share capital (%) At the lower end of the price band ( ₹ [●]) At the upper end of the price band ( ₹ [●]) Number of Equity Shares of face value of ₹ 5 each Percentage of post-Offer Equity Share capital (%) Number of Equity Shares of face value of ₹ 5 each Percentage of post-Offer Equity Share capital (%) Peter Parker * 7,386,270 13.00% [●] [●] [●] [●] Alex Morgan * 10,907,771 19.20% [●] [●] [●] [●] Taylor Brown * 10,907,771 19.20% [●] [●] [●] [●] Jordan Lee 100 0.00 ** % [●] [●] [●] [●] Globex Industries Limited 10 0.00 ** % [●] [●] [●] [●] Umbrella Holdings Private Limited 10 0.00 ** % [●] [●] [●] [●] Initech Solutions Limited 10 0.00 ** % [●] [●] [●] [●] Hooli Technologies Limited 10 0.00 ** % [●] [●] [●] [●] Pied Piper Inc. 10 0.00 ** % [●] [●] [●] [●] Stark Industries Limited 10 0.00 ** % [●] [●] [●] [●] Sub-total (A) 55,906,542 98.40% [●] [●] [●] [●] Promoter Group Skyler West 100 0.00 ** % [●] [●] [●] [●] Katyayani Balasubramania n 100 0.00 ** % [●] [●] [●] [●] Sub-total (B) 200 0.00 ** % [●] [●] [●] [●] Additional top 10 Massive Dynamic Inc. 8,51,563 1.50% [●] [●] [●] [●] Dakota Mills 39,062 0.07% [●] [●] [●] [●] Reese Palmer 13,021 0.02% [●] [●] [●] [●] Hayden Brooks 2,604 0.00 ** % [●] [●] [●] [●] Finley Shaw 2,604 0.00 ** % [●] [●] [●] [●] Rowan Clarke 2,604 0.00 ** % [●] [●] [●] [●] Sub-total (C) 911,458 1.60% [●] [●] [●] [●] Total (A+B+C) 5,68,18,200 100.00% [●] [●] [●] [●]</w:t>
+        <w:t>Name Pre-Offer Post-Offer shareholding as at Allotment ^ Number of Equity Shares of face value of ₹ 5 each Percentage of pre-Offer Equity Share capital (%) At the lower end of the price band ( ₹ [●]) At the upper end of the price band ( ₹ [●]) Number of Equity Shares of face value of ₹ 5 each Percentage of post-Offer Equity Share capital (%) Number of Equity Shares of face value of ₹ 5 each Percentage of post-Offer Equity Share capital (%) Peter Parker * 7,386,270 13.00% [●] [●] [●] [●] Alex Morgan * 10,907,771 19.20% [●] [●] [●] [●] Taylor Brown * 10,907,771 19.20% [●] [●] [●] [●] Jordan Lee 100 0.00 ** % [●] [●] [●] [●] Globex Industries Limited 10 0.00 ** % [●] [●] [●] [●] Umbrella Holdings Private Limited 10 0.00 ** % [●] [●] [●] [●] Initech Solutions Limited 10 0.00 ** % [●] [●] [●] [●] Hooli Technologies Limited 10 0.00 ** % [●] [●] [●] [●] Pied Piper Inc. 10 0.00 ** % [●] [●] [●] [●] Stark Industries Limited 10 0.00 ** % [●] [●] [●] [●] Sub-total (A) 55,906,542 98.40% [●] [●] [●] [●] Promoter Group Skyler West 100 0.00 ** % [●] [●] [●] [●] Katyayani Balasubramania n 100 0.00 ** % [●] [●] [●] [●] Sub-total (B) 200 0.00 ** % [●] [●] [●] [●] Additional top 10 Massive Dynamic Inc. (55) 8,51,563 1.50% [●] [●] [●] [●] Dakota Mills 39,062 0.07% [●] [●] [●] [●] Reese Palmer 13,021 0.02% [●] [●] [●] [●] Hayden Brooks 2,604 0.00 ** % [●] [●] [●] [●] Finley Shaw 2,604 0.00 ** % [●] [●] [●] [●] Rowan Clarke 2,604 0.00 ** % [●] [●] [●] [●] Sub-total (C) 911,458 1.60% [●] [●] [●] [●] Total (A+B+C) 5,68,18,200 100.00% [●] [●] [●] [●]</w:t>
       </w:r>
     </w:p>
     <w:p>
@@ -840,7 +840,7 @@
     </w:p>
     <w:p>
       <w:r>
-        <w:t>Nature of transacti on Name of related party with whom transactions have taken place Nature of relations hip Three-month period ended June 30, 20 25 % of revenue from operati ons Fiscal 202 5 % of revenue from operati ons Fiscal 202 4 % of revenue from operati ons Fiscal 202 3 % of revenue from operati ons Purchase of goods Kushal Electricals Promoters are partners in the partnershi p firm 0.39 0.01% 0.27 0.00% 0.28 0.00% 0.19 0.00% Purchase of goods Waterloo Motors Promoters are partners in the partnershi p firm - - 0.27 0.00% 0.10 0.00% 0.13 0.00% Services receive d KSH Distriparks Private Limi ted Common contro l 0.37 0.01% 3.23 0.02% 2.91 0.02% 3.66 0.03% Services receive d Aperture Science LLC Promoters are trustees in the trust - - 4.26 0.02% 1.50 0.01% 2.00 0.02%</w:t>
+        <w:t>Nature of transacti on Name of related party with whom transactions have taken place Nature of relations hip Three-month period ended June 30, 20 25 % of revenue from operati ons Fiscal 202 5 % of revenue from operati ons Fiscal 202 4 % of revenue from operati ons Fiscal 202 3 % of revenue from operati ons Purchase of goods Kushal Electricals Promoters are partners in the partnershi p firm 0.39 0.01% 0.27 0.00% 0.28 0.00% 0.19 0.00% Purchase of goods Waterloo Motors Promoters are partners in the partnershi p firm - - 0.27 0.00% 0.10 0.00% 0.13 0.00% Services receive d KSH Distriparks Private Limi ted Common contro l 0.37 0.01% 3.23 0.02% 2.91 0.02% 3.66 0.03% Services receive d Aperture Science LLC (56) Promoters are trustees in the trust - - 4.26 0.02% 1.50 0.01% 2.00 0.02%</w:t>
       </w:r>
     </w:p>
     <w:p>
@@ -858,7 +858,7 @@
     </w:p>
     <w:p>
       <w:r>
-        <w:t>Deposit paid Wonka Industries Limited Common contro l - - - - - - 100.0 0 0.95% Remunerati on paid # Remuneration paid to key managerial personnel Key managerial personnel 40.10 0.72% 138.4 4 0.72% 100.3 5 0.73% 123.3 2 1.18% Remunerati on paid # Remuneration paid to relatives of Key Managerial Personnel Relatives of key managerial personnel - - 0.89 0.00% 0.98 0.01% 0.92 0.01% Share Based Payment Expense Share Based Payment Expense of Key Managerial Personnel Key managerial personnel 0.36 0.01% - - - - - - Sitting Fees paid to Independent Directors Payment to Independent Directors Independent directors 1.92 0.03% - - - - - - Total 43.14 0.77% 147.3 6 0.72% 106.1 2 0.77% 230.2 2 2.19% # Information relating to remuneration does not include provision for gratuity, which is provided on an overall actuarial valuation, as separate amounts are not available for respective Key Managerial Personnel. Remuneration paid at actual basis is considered for above computation. For further details, see “Restated Financial Statements – Note 31: Related Party Transaction ” on page 331. Financing arrangements There have been no financing arrangements whereby our Promoters, members of our Promoter Group, our Directors and their relatives (as defined under Companies Act, 2013) have financed the purchase by any other person of securities of our Company (other than in the normal course of the business of the financing entity) during a period of six months immediately preceding the date of the Draft Red Hering Prospectus and this Red Herring Prospectus. Weighted average price at which the specified securities were acquired by our Promoter and the Promoter Selling Shareholders in the last one year preceding the date of this Red Herring Prospectus The weighted average price at which the specified securities were acquired by our Promoters and the Promoter Selling Shareholders in the last one year preceding the date of this Red Herring Prospectus is given below: Name of the Promoter Number of Equity Shares of face value of ₹ 5 acquir Weighted average price of acquisition per Equity Shares (1)# (in ₹ )</w:t>
+        <w:t>Deposit paid Wonka Industries Limited (57) Common contro l - - - - - - 100.0 0 0.95% Remunerati on paid # Remuneration paid to key managerial personnel Key managerial personnel 40.10 0.72% 138.4 4 0.72% 100.3 5 0.73% 123.3 2 1.18% Remunerati on paid # Remuneration paid to relatives of Key Managerial Personnel Relatives of key managerial personnel - - 0.89 0.00% 0.98 0.01% 0.92 0.01% Share Based Payment Expense Share Based Payment Expense of Key Managerial Personnel Key managerial personnel 0.36 0.01% - - - - - - Sitting Fees paid to Independent Directors Payment to Independent Directors Independent directors 1.92 0.03% - - - - - - Total 43.14 0.77% 147.3 6 0.72% 106.1 2 0.77% 230.2 2 2.19% # Information relating to remuneration does not include provision for gratuity, which is provided on an overall actuarial valuation, as separate amounts are not available for respective Key Managerial Personnel. Remuneration paid at actual basis is considered for above computation. For further details, see “Restated Financial Statements – Note 31: Related Party Transaction ” on page 331. Financing arrangements There have been no financing arrangements whereby our Promoters, members of our Promoter Group, our Directors and their relatives (as defined under Companies Act, 2013) have financed the purchase by any other person of securities of our Company (other than in the normal course of the business of the financing entity) during a period of six months immediately preceding the date of the Draft Red Hering Prospectus and this Red Herring Prospectus. Weighted average price at which the specified securities were acquired by our Promoter and the Promoter Selling Shareholders in the last one year preceding the date of this Red Herring Prospectus The weighted average price at which the specified securities were acquired by our Promoters and the Promoter Selling Shareholders in the last one year preceding the date of this Red Herring Prospectus is given below: Name of the Promoter Number of Equity Shares of face value of ₹ 5 acquir Weighted average price of acquisition per Equity Shares (1)# (in ₹ )</w:t>
       </w:r>
     </w:p>
     <w:p>
@@ -966,7 +966,7 @@
     </w:p>
     <w:p>
       <w:r>
-        <w:t>SECTION II: RISK FACTORS An investment in equity shares involves a high degree of risk. Prospective investors should carefully consider all the information in this Red Herring Prospectus, including the risks and uncertainties described below, before making an investment in our Equity Shares. The risks described in this section are those that we consider to be the most significant to our business, results of operations and financial condition as of the date of this Red Herring Prospectus. The risks described below may not be exhaustive or the only ones relevant to us, the Equity Shares or the industry segments in which we currently operate. Additional risks and uncertainties, not presently known to us or that we currently do not deem material may arise or may become material in the future. If any or a combination of the following risks, or other risks that are not currently known or are not currently deemed material, actually occur, our business, results of operations, cash flows and financial condition could be adversely affected, the trading price of our Equity Shares could decline, and investors may lose all or part of their investment. The risk factors have been presented below on the basis of their materiality. Furthermore, some events may be material collectively rather than individually. Some events may not be material at present but may have a material impact in the future. In making an investment decision, prospective investors must rely on their own examination of us and our business and the terms of the Offer, including the merits and risks involved. Potential investors should consult their tax, financial and legal advisors about the particular consequences of purchasing our Equity Shares. In order to obtain a complete understanding of our Company and our business, prospective investors should read this section in conjunction with “Industry Overview”, “Our Business”, “Key Regulations and Policies in India”, “Restated Financial Statements”, “Management’s Discussion and Analysis of Financial Condition and Results of Operations” and “Outstanding Litigation and Material Developments” on pages 137, 211, 238, 280, 356 and 388, respectively, as well as the other financial and statistical information contained in this Red Herring Prospectus. This Red Herring Prospectus also contains forward-looking statements that involve risks, assumptions, estimates, uncertainties and other factors, many of which are beyond our control. Our actual results could differ from those anticipated in these forward-looking statements as a result of certain factors, including the considerations described below and elsewhere in this Red Herring Prospectus. For more details, see “Forward-Looking Statements” on page 18. Unless otherwise stated, or unless the context otherwise requires, the financial information of our Company used in this section has been derived from our Restated Financial Statements included in this Red Herring Prospectus on page 280. Our financial year ends on March 31 of each year. Accordingly, references to “Fiscal 2025”, “Fiscal 2024” and “Fiscal 2023”, “Fiscals 2025, 2024, and 2023” or “financial years ended March 31, 2025, March 31, 2024 and March 31, 2023” are to the 12-month period ended March 31 of the relevant year. We have also included various financial and operational performance indicators in this Red Herring Prospectus, some of which have not been derived from the Restated Financial Statements. The manner of calculation and presentation of some of these financial and operational performance indicators, and the assumptions and estimates used in such calculations, may vary from those used by other companies in India and other jurisdictions. Unless stated otherwise, industry and market data used in this section has been obtained or derived from the report titled “Industry Research Report on Magnet Winding Wires Market in India” dated November 26, 2025 (“ CARE Report ”), prepared and issued by Globex Industries Limited pursuant to an engagement letter dated December 2, 2024, and exclusively commissioned and paid for by us in connection with the Offer. The industry-related information included herein includes excerpts from the CARE Report and may have been re-ordered by us for the purposes of presentation. Unless otherwise indicated, all financial, operational, industry and other related information derived from the CARE Report and included herein with respect to any particular year refers to such information for the relevant calendar year. The CARE Report will be available on the website of our Company from the date of this Red Herring Prospectus until the Bid/Offer Closing Date. For more information, see “Certain Conventions, Use of Financial Information and Market Data and Currency of Presentation” on page 15. INTERNAL RISKS 1. We depend on certain customers for a significant portion of our revenue from operations. Our top 10 customers contributed to 53.97%, 52.54%, 57.10% and 58.99% of our revenue from operations for the three-month period ended June 30, 2025, and Fiscals 2025, 2024 and 2023, respectively. Any decrease in demand from such customers, the loss of such customers or our inability to diversify our customer base could have an adverse effect on our business, results of operations, financial condition and cash flows. We have derived a significant portion of our revenue from operations from our top 10 customers. The table below sets forth details of our revenue from operations generated from top 10 customers in each of the period/ Fiscals indicated:</w:t>
+        <w:t>SECTION II: RISK FACTORS An investment in equity shares involves a high degree of risk. Prospective investors should carefully consider all the information in this Red Herring Prospectus, including the risks and uncertainties described below, before making an investment in our Equity Shares. The risks described in this section are those that we consider to be the most significant to our business, results of operations and financial condition as of the date of this Red Herring Prospectus. The risks described below may not be exhaustive or the only ones relevant to us, the Equity Shares or the industry segments in which we currently operate. Additional risks and uncertainties, not presently known to us or that we currently do not deem material may arise or may become material in the future. If any or a combination of the following risks, or other risks that are not currently known or are not currently deemed material, actually occur, our business, results of operations, cash flows and financial condition could be adversely affected, the trading price of our Equity Shares could decline, and investors may lose all or part of their investment. The risk factors have been presented below on the basis of their materiality. Furthermore, some events may be material collectively rather than individually. Some events may not be material at present but may have a material impact in the future. In making an investment decision, prospective investors must rely on their own examination of us and our business and the terms of the Offer, including the merits and risks involved. Potential investors should consult their tax, financial and legal advisors about the particular consequences of purchasing our Equity Shares. In order to obtain a complete understanding of our Company and our business, prospective investors should read this section in conjunction with “Industry Overview”, “Our Business”, “Key Regulations and Policies in India”, “Restated Financial Statements”, “Management’s Discussion and Analysis of Financial Condition and Results of Operations” and “Outstanding Litigation and Material Developments” on pages 137, 211, 238, 280, 356 and 388, respectively, as well as the other financial and statistical information contained in this Red Herring Prospectus. This Red Herring Prospectus also contains forward-looking statements that involve risks, assumptions, estimates, uncertainties and other factors, many of which are beyond our control. Our actual results could differ from those anticipated in these forward-looking statements as a result of certain factors, including the considerations described below and elsewhere in this Red Herring Prospectus. For more details, see “Forward-Looking Statements” on page 18. Unless otherwise stated, or unless the context otherwise requires, the financial information of our Company used in this section has been derived from our Restated Financial Statements included in this Red Herring Prospectus on page 280. Our financial year ends on March 31 of each year. Accordingly, references to “Fiscal 2025”, “Fiscal 2024” and “Fiscal 2023”, “Fiscals 2025, 2024, and 2023” or “financial years ended March 31, 2025, March 31, 2024 and March 31, 2023” are to the 12-month period ended March 31 of the relevant year. We have also included various financial and operational performance indicators in this Red Herring Prospectus, some of which have not been derived from the Restated Financial Statements. The manner of calculation and presentation of some of these financial and operational performance indicators, and the assumptions and estimates used in such calculations, may vary from those used by other companies in India and other jurisdictions. Unless stated otherwise, industry and market data used in this section has been obtained or derived from the report titled “Industry Research Report on Magnet Winding Wires Market in India” dated November 26, 2025 (“ CARE Report ”), prepared and issued by Globex Industries Limited (22) pursuant to an engagement letter dated December 2, 2024, and exclusively commissioned and paid for by us in connection with the Offer. The industry-related information included herein includes excerpts from the CARE Report and may have been re-ordered by us for the purposes of presentation. Unless otherwise indicated, all financial, operational, industry and other related information derived from the CARE Report and included herein with respect to any particular year refers to such information for the relevant calendar year. The CARE Report will be available on the website of our Company from the date of this Red Herring Prospectus until the Bid/Offer Closing Date. For more information, see “Certain Conventions, Use of Financial Information and Market Data and Currency of Presentation” on page 15. INTERNAL RISKS 1. We depend on certain customers for a significant portion of our revenue from operations. Our top 10 customers contributed to 53.97%, 52.54%, 57.10% and 58.99% of our revenue from operations for the three-month period ended June 30, 2025, and Fiscals 2025, 2024 and 2023, respectively. Any decrease in demand from such customers, the loss of such customers or our inability to diversify our customer base could have an adverse effect on our business, results of operations, financial condition and cash flows. We have derived a significant portion of our revenue from operations from our top 10 customers. The table below sets forth details of our revenue from operations generated from top 10 customers in each of the period/ Fiscals indicated:</w:t>
       </w:r>
     </w:p>
     <w:p>
@@ -1020,7 +1020,7 @@
     </w:p>
     <w:p>
       <w:r>
-        <w:t>4.6 9 10 . Custom er 154.43 2.76% 613.3 0 3.18% 466.46 3.37% 369.31 3.52% Total 3,015.48 53.97% 10,130 .32 52.54% 7,896.04 57.10% 6,191.05 58.99% * These customers represent the top 10 customers for each of the respective periods/ Fiscals and may not necessarily be the same customers across the periods/ Fiscals. Note: Our top 10 customers include Weyland Corp Limited, Bluth Company LLC; Sterling Cooper Limited; Acme Corp Ltd.; Globex Industries Limited; Umbrella Holdings Private Limited; Initech Solutions Limited; and Hooli Technologies Limited. Names of other customers who form part of our top 10 customers during the periods/ Fiscals included above, have not been included in this Red Herring Prospectus due to non-receipt of consent from such customers to be named in the Offer Documents. We had 122, 117 and 117 customers during the financial years ended March 31, 2025, March 31, 2024, and March 31, 2023, respectively. Further, during the three-month period ended June 30, 2025, we invoiced 93 customers. Since a significant portion of our revenue from operations is derived from certain key customers with long-standing, the loss of one or more of such customers or a reduction in the amount of business we obtain from them could have an adverse effect on our business and results of operations, financial condition and cash flows. Of our top 10 customers based on revenue contribution for the financial year ended March 31, 2025, 5 of our customers have been customers for 10 years intermittently, 2 of our customers have been customers for 5 years, and the other 3 have been our customers for 2 years. Except as disclosed in the section titled “ Outstanding Litigation and Material Developments – A. Litigation Involving our Company – Criminal proceedings by our Company ” on page 389, there have not been any instances of disputes with our customers or adverse changes in our relationship with our customers in the past, we cannot assure you that such instances will not occur in the future and have a material adverse impact on our business, result of operations, cash flows and financial condition. Our reliance on a select group of customers may also constrain our ability to negotiate our arrangements, including pricing, which may have an impact on our profit margins and financial performance. The deterioration of the financial condition or a decline in the budgetary allocations of these customers could reduce their demand for our products and result in a significant decrease in the revenues we derive from them. Furthermore, key customers may become subject to international sanctions, which could further adversely affect our business and revenues. The volume and timing of sales to such customers may also vary due to a change in their requirements, geo-political issues and management of inventory levels. Furthermore, we do not have firm commitments in the form of continuing or long-term supply agreements with some of our customers and instead rely on orders for manufacture of specific products on a purchase order basis, which governs the volume and other terms of the sale of our products. We need to maintain sufficient inventory levels of raw material to meet customer expectations at all times. Accumulating excess inventory could increase our inventory costs, and a failure to have adequate inventory in stock to fulfil customer orders could result in inability to meet customer demand or loss of customers. As actual orders by our customers are typically placed by way of ‘make to order’/ specific purchase orders, we are exposed to significant or unexpected changes in product specifications and delivery schedules, which may result in a mismatch between our inventories of raw materials, thereby increasing our costs for maintaining inventory. Our inability to forecast the level of customer demand for our products as well as our inability to accurately schedule our raw material purchases and production and manage our inventory may adversely affect our business and cash flows from operations. We cannot assure you that</w:t>
+        <w:t>4.6 9 10 . Custom er 154.43 2.76% 613.3 0 3.18% 466.46 3.37% 369.31 3.52% Total 3,015.48 53.97% 10,130 .32 52.54% 7,896.04 57.10% 6,191.05 58.99% * These customers represent the top 10 customers for each of the respective periods/ Fiscals and may not necessarily be the same customers across the periods/ Fiscals. Note: Our top 10 customers include Weyland Corp Limited (58), Bluth Company LLC (59); Sterling Cooper Limited (60); Acme Corp Ltd. (61); Globex Industries Limited (62); Umbrella Holdings Private Limited (63); Initech Solutions Limited (64); and Hooli Technologies Limited (65). Names of other customers who form part of our top 10 customers during the periods/ Fiscals included above, have not been included in this Red Herring Prospectus due to non-receipt of consent from such customers to be named in the Offer Documents. We had 122, 117 and 117 customers during the financial years ended March 31, 2025, March 31, 2024, and March 31, 2023, respectively. Further, during the three-month period ended June 30, 2025, we invoiced 93 customers. Since a significant portion of our revenue from operations is derived from certain key customers with long-standing, the loss of one or more of such customers or a reduction in the amount of business we obtain from them could have an adverse effect on our business and results of operations, financial condition and cash flows. Of our top 10 customers based on revenue contribution for the financial year ended March 31, 2025, 5 of our customers have been customers for 10 years intermittently, 2 of our customers have been customers for 5 years, and the other 3 have been our customers for 2 years. Except as disclosed in the section titled “ Outstanding Litigation and Material Developments – A. Litigation Involving our Company – Criminal proceedings by our Company ” on page 389, there have not been any instances of disputes with our customers or adverse changes in our relationship with our customers in the past, we cannot assure you that such instances will not occur in the future and have a material adverse impact on our business, result of operations, cash flows and financial condition. Our reliance on a select group of customers may also constrain our ability to negotiate our arrangements, including pricing, which may have an impact on our profit margins and financial performance. The deterioration of the financial condition or a decline in the budgetary allocations of these customers could reduce their demand for our products and result in a significant decrease in the revenues we derive from them. Furthermore, key customers may become subject to international sanctions, which could further adversely affect our business and revenues. The volume and timing of sales to such customers may also vary due to a change in their requirements, geo-political issues and management of inventory levels. Furthermore, we do not have firm commitments in the form of continuing or long-term supply agreements with some of our customers and instead rely on orders for manufacture of specific products on a purchase order basis, which governs the volume and other terms of the sale of our products. We need to maintain sufficient inventory levels of raw material to meet customer expectations at all times. Accumulating excess inventory could increase our inventory costs, and a failure to have adequate inventory in stock to fulfil customer orders could result in inability to meet customer demand or loss of customers. As actual orders by our customers are typically placed by way of ‘make to order’/ specific purchase orders, we are exposed to significant or unexpected changes in product specifications and delivery schedules, which may result in a mismatch between our inventories of raw materials, thereby increasing our costs for maintaining inventory. Our inability to forecast the level of customer demand for our products as well as our inability to accurately schedule our raw material purchases and production and manage our inventory may adversely affect our business and cash flows from operations. We cannot assure you that</w:t>
       </w:r>
     </w:p>
     <w:p>
@@ -1056,7 +1056,7 @@
     </w:p>
     <w:p>
       <w:r>
-        <w:t>. * These suppliers represent the top 10 suppliers for each of the respective period/ Fiscals and may not necessarily be the same suppliers across the period/ Fiscals. Note: Our top 10 suppliers include Ahlstrom Sweden AB; Pied Piper Inc.; Stark Industries Limited; Wayne Enterprises Limited; Oscorp Limited; Vance Refrigeration LLC; Dunder Mifflin Private Limited; and Soylent Corp Limited. Names of other suppliers have not been included in this Red Herring Prospectus due to non-receipt of consent from such suppliers to be named in the Offer Documents. We purchase our raw materials from third-party suppliers on the basis of purchase orders and do not typically enter into any long-term agreements. We procure our main raw material i.e. copper in back-to-back arrangement with suppliers against confirmed bookings, i.e., the customer prices the copper with our Company and our Company does the same with its suppliers. While we procure raw materials from our suppliers once they confirm the receipt of our purchase orders, in the absence of long-term contracts, our suppliers may not be obligated to supply their products to us and/or may choose to sell their products to our competitors. While we have a large network of long-term suppliers, we purchase copper and aluminium, which are our primary raw materials (and copper also being our principal raw material), from a limited number of suppliers. While there have been no instances of termination of our relationship with our suppliers which had impacted our supply in the three-month period ended June 30, 2025, and the Fiscals 2025, 2024 and 2023, there can be no assurance that a particular supplier will continue to supply us with raw materials in the future. Further, we cannot assure that we will be able to enter into new or renew our existing arrangements with suppliers on terms acceptable to us, which could have an adverse effect on our ability to source materials in a commercially viable and timely manner, if at all, which may impact our business and profitability. We conduct quality checks before onboarding suppliers for certain of our raw materials including metal and paper. Further, there are a limited number of qualified suppliers of insulating materials such as enamel and paper due to criticality to maintain process composition, which further restricts the number of suppliers we can source such materials from. Due to limitations in the availability of suppliers, we are also susceptible to the pricing-power risk of our suppliers controlling the pricing of our raw materials. While we do not rely on any single supplier for the other raw materials and components required for our operations, if any of our suppliers does not supply raw materials on a timely basis or at reasonable prices, we may be unable to manufacture products for our customers or may be unable to ensure the timely delivery of the same. Any discontinuation of production by these suppliers or a failure of these suppliers to adhere to the delivery schedule or the required quality and quantity could hamper our manufacturing schedule and lead to the under-utilization of our manufacturing facilities. Our operations may also be impacted due to</w:t>
+        <w:t>. * These suppliers represent the top 10 suppliers for each of the respective period/ Fiscals and may not necessarily be the same suppliers across the period/ Fiscals. Note: Our top 10 suppliers include Ahlstrom Sweden AB; Pied Piper Inc. (66); Stark Industries Limited (67); Wayne Enterprises Limited (68); Oscorp Limited (69); Vance Refrigeration LLC (70); Dunder Mifflin Private Limited (71); and Soylent Corp Limited (72). Names of other suppliers have not been included in this Red Herring Prospectus due to non-receipt of consent from such suppliers to be named in the Offer Documents. We purchase our raw materials from third-party suppliers on the basis of purchase orders and do not typically enter into any long-term agreements. We procure our main raw material i.e. copper in back-to-back arrangement with suppliers against confirmed bookings, i.e., the customer prices the copper with our Company and our Company does the same with its suppliers. While we procure raw materials from our suppliers once they confirm the receipt of our purchase orders, in the absence of long-term contracts, our suppliers may not be obligated to supply their products to us and/or may choose to sell their products to our competitors. While we have a large network of long-term suppliers, we purchase copper and aluminium, which are our primary raw materials (and copper also being our principal raw material), from a limited number of suppliers. While there have been no instances of termination of our relationship with our suppliers which had impacted our supply in the three-month period ended June 30, 2025, and the Fiscals 2025, 2024 and 2023, there can be no assurance that a particular supplier will continue to supply us with raw materials in the future. Further, we cannot assure that we will be able to enter into new or renew our existing arrangements with suppliers on terms acceptable to us, which could have an adverse effect on our ability to source materials in a commercially viable and timely manner, if at all, which may impact our business and profitability. We conduct quality checks before onboarding suppliers for certain of our raw materials including metal and paper. Further, there are a limited number of qualified suppliers of insulating materials such as enamel and paper due to criticality to maintain process composition, which further restricts the number of suppliers we can source such materials from. Due to limitations in the availability of suppliers, we are also susceptible to the pricing-power risk of our suppliers controlling the pricing of our raw materials. While we do not rely on any single supplier for the other raw materials and components required for our operations, if any of our suppliers does not supply raw materials on a timely basis or at reasonable prices, we may be unable to manufacture products for our customers or may be unable to ensure the timely delivery of the same. Any discontinuation of production by these suppliers or a failure of these suppliers to adhere to the delivery schedule or the required quality and quantity could hamper our manufacturing schedule and lead to the under-utilization of our manufacturing facilities. Our operations may also be impacted due to</w:t>
       </w:r>
     </w:p>
     <w:p>
@@ -1326,7 +1326,7 @@
     </w:p>
     <w:p>
       <w:r>
-        <w:t>1 . 1979-1980 Initial subscription to the MoA and further issue The financial statements of FY 1980 and FY 1981. 2 . September 30, 1981 Secondary transfer of equity shares Form 7B for transfer of shares to Kendall Price from DM Shetty and Gopal BO. 3 . August 6, 1982 Secondary transfer of equity shares Form 7B for transfer of shares to Kendall Price from Emery Fox and SA Shetty. 4 . December 9, 1983 Secondary transfer of equity shares Form 7B for transfer of shares to Kendall Price from Jayaram Shetty. 5 . March 28, 1987 Secondary transfer of equity shares Form 7B for transfer of shares by Kendall Price to Harper Kim. 6 . February 25, 1993 Further issue of equity shares Challan for the Form 2 in relation to the said allotment 7 . September 7, 1998 Secondary transfer of equity shares Form 7B for transfer of shares to Harper Kim HUF from Harper Kim. 8 . September 7, 1998 Secondary transfer of equity shares Form 7B for transfer of shares to Alex Morgan from Narayana B. Shetty 9 . December 28, 1998 Secondary transfer of equity shares Form 7B for transfer of shares to Kendall Price from Shubhkamal Leasing and Tyrell Corporation 10 . December 28, 1998 Secondary transfer of equity shares Form 7B for transfer of shares to Blake Turner from Harper Kim HUF. 11 . December 28, 1998 Secondary transfer of equity shares Form 7B for transfer of shares to Alex Morgan from Shubhkamal Leasing and Tyrell Corporation 12 . November 29, 2001 Secondary transfer of equity shares Form 7B for transfer of shares to Quinn Nash by Vijay Hegde. 13 . November 29, 2001 Secondary transfer of equity shares Form 7B for transfer of shares to Blake Turner by Vijay Hegde. 14 . April 20, 2002 Secondary transfer of equity shares Form 7B for transfer of shares by Kendall Price to Quinn Nash and Blake Turner. 15 . 1979-1980 Initial subscription to the MoA and further issue The financial statements of FY 1980 and FY 1981. 16 . February 20, 2015 Conversion of unsecured loan Valuation report of an independent chartered accountant for conversion of loan into equity shares. 17 . March 29, 2016 Secondary transfer of equity shares Form SH- 4 for transfer of shares by Kendall Price, Quinn Nash and Blake Turner to Parker Lane. 18 . 1979 – 2016 Copy or counter folios of share certificates issued to the shareholders. For further details, see “ Capital Structure – Details of history of shareholding and share capital of our Promoters and members of the Promoter Group in our Company ” and “ Capital Structure – Equity Share capital history of our Company ” on pages 91 and 85, respectively. We have been unable to trace these documents despite commissioning a detailed search at the Registrar of Companies, through an independent practicing company secretary, Kanj and Cyberdyne Systems Limited (“ Practicing Company Secretary ”), to trace records and filings available with Registrar of Companies and reliance has been placed on the certificate dated May 21, 2025, issued by the Practicing Company Secretary. We have also intimated the Registrar of Companies by way of our letter dated May 21, 2025, regarding the missing corporate records. In addition, 1,000, equity shares of face value of ₹ 100 each allotted to Sage Porter, 500 equity shares of face value of ₹ 100 each allotted to Jane Smith, Narayna B. Shetty and Jayaram N. Shetty, respectively, pursuant to the initial subscription to the MoA dated June 29, 1979, were subsequently taken on record by the Board by way of a resolution dated August 25, 1979. For further details, see “ Capital Structure – Notes to Capital Structure</w:t>
+        <w:t>1 . 1979-1980 Initial subscription to the MoA and further issue The financial statements of FY 1980 and FY 1981. 2 . September 30, 1981 Secondary transfer of equity shares Form 7B for transfer of shares to Kendall Price from DM Shetty and Gopal BO. 3 . August 6, 1982 Secondary transfer of equity shares Form 7B for transfer of shares to Kendall Price from Emery Fox and SA Shetty. 4 . December 9, 1983 Secondary transfer of equity shares Form 7B for transfer of shares to Kendall Price from Jayaram Shetty. 5 . March 28, 1987 Secondary transfer of equity shares Form 7B for transfer of shares by Kendall Price to Harper Kim. 6 . February 25, 1993 Further issue of equity shares Challan for the Form 2 in relation to the said allotment 7 . September 7, 1998 Secondary transfer of equity shares Form 7B for transfer of shares to Harper Kim HUF from Harper Kim. 8 . September 7, 1998 Secondary transfer of equity shares Form 7B for transfer of shares to Alex Morgan from Narayana B. Shetty 9 . December 28, 1998 Secondary transfer of equity shares Form 7B for transfer of shares to Kendall Price from Shubhkamal Leasing and Tyrell Corporation (73) 10 . December 28, 1998 Secondary transfer of equity shares Form 7B for transfer of shares to Blake Turner from Harper Kim HUF. 11 . December 28, 1998 Secondary transfer of equity shares Form 7B for transfer of shares to Alex Morgan from Shubhkamal Leasing and Tyrell Corporation (73) 12 . November 29, 2001 Secondary transfer of equity shares Form 7B for transfer of shares to Quinn Nash by Vijay Hegde. 13 . November 29, 2001 Secondary transfer of equity shares Form 7B for transfer of shares to Blake Turner by Vijay Hegde. 14 . April 20, 2002 Secondary transfer of equity shares Form 7B for transfer of shares by Kendall Price to Quinn Nash and Blake Turner. 15 . 1979-1980 Initial subscription to the MoA and further issue The financial statements of FY 1980 and FY 1981. 16 . February 20, 2015 Conversion of unsecured loan Valuation report of an independent chartered accountant for conversion of loan into equity shares. 17 . March 29, 2016 Secondary transfer of equity shares Form SH- 4 for transfer of shares by Kendall Price, Quinn Nash and Blake Turner to Parker Lane. 18 . 1979 – 2016 Copy or counter folios of share certificates issued to the shareholders. For further details, see “ Capital Structure – Details of history of shareholding and share capital of our Promoters and members of the Promoter Group in our Company ” and “ Capital Structure – Equity Share capital history of our Company ” on pages 91 and 85, respectively. We have been unable to trace these documents despite commissioning a detailed search at the Registrar of Companies, through an independent practicing company secretary, Kanj and Cyberdyne Systems Limited (74) (“ Practicing Company Secretary ”), to trace records and filings available with Registrar of Companies and reliance has been placed on the certificate dated May 21, 2025, issued by the Practicing Company Secretary. We have also intimated the Registrar of Companies by way of our letter dated May 21, 2025, regarding the missing corporate records. In addition, 1,000, equity shares of face value of ₹ 100 each allotted to Sage Porter, 500 equity shares of face value of ₹ 100 each allotted to Jane Smith, Narayna B. Shetty and Jayaram N. Shetty, respectively, pursuant to the initial subscription to the MoA dated June 29, 1979, were subsequently taken on record by the Board by way of a resolution dated August 25, 1979. For further details, see “ Capital Structure – Notes to Capital Structure</w:t>
       </w:r>
     </w:p>
     <w:p>
@@ -1362,7 +1362,7 @@
     </w:p>
     <w:p>
       <w:r>
-        <w:t>Certain sections of this Red Herring Prospectus include information based on, or derived from, the CARE Report or extracts of the CARE Report prepared by Globex Industries Limited (“ CareEdge Research ”). All such information in this Red Herring Prospectus indicates the CARE Report as its source. The CARE Report is available on the website of our Company at https://kshinternational.com/investor-relations/industry-report/. The CARE Report is commissioned and paid for by our Company pursuant to an engagement letter dated December 2, 2024, for the purpose of confirming our understanding of the industry in connection with this Offer. While CareEdge Research is not related to our Company, our Promoters or our Directors, our Company has subscribed to and paid for certain research and reports from CareEdge Research business process services division. Industry sources and publications are prepared based on information as of specific dates and may no longer be current or reflect current trends. Industry sources and publications may also base their information on estimates, projections, forecasts and assumptions that may prove to be incorrect. Further, the CARE Report is not a recommendation to invest / disinvest in any company covered in the CARE Report. Accordingly, prospective investors should not place undue reliance on or base their investment decision solely on this information. In view of the foregoing, you may not be able to seek legal recourse for any losses resulting from undertaking any investment in this Offer pursuant to reliance on the information in this Red Herring Prospectus based on, or derived from, the CARE Report. You should consult your own advisors and undertake an independent assessment of information in this Red Herring Prospectus based on, or derived from, the CARE Report before making any investment decision regarding this Offer. See “ Industry Overview ” on page 137. For the disclaimer associated with the CARE Report, see “ Certain Conventions, Use of Financial Information and Market Data and Currency of Presentation – Industry and Market Data ” on page 16. 15. We operate in a competitive business environment. Failure to compete effectively against our competitors and new entrants to the industry may adversely affect our business, financial condition and results of operations. We face significant competition in our business from other manufacturers and suppliers of winding wires. Our competitors may possess wider product ranges, larger sales teams, greater intellectual property resources and broader appeal across various divisions. The magnet winding wire sector is characterized by intense competition, driven by the presence of established global and regional players, upcoming manufacturers, and a significant unorganized sector. ( Source: CARE Report ). For further details on our competitors, see “ Our Business – Competition”, “Basis for Offer Price” and “Industry Overview ” on pages 234, 124 and 137, respectively. Our failure to compete effectively with respect to any of these or other factors could have an adverse effect on our business, prospects, financial condition or operating results. Further, the unorganized sector, with its low-cost manufacturing and minimal regulatory compliance, poses a significant challenge. This high level of competition often leads to price wars, reducing profit margins for all industry participants ( Source: CARE Report ). We cannot assure you that we will be able to compete successfully against our competitors as well as new entrants in our industry in the future. Accordingly, our business, financial condition, results of operations and prospects would be adversely and materially affected if we are unable to maintain our competitive advantage and compete successfully against our competitors and any new entrants in the industry. While we work consistently to offset pricing pressures, produce new products, improve our services or enhance our production efficiency to reduce costs, such efforts may not be successful. Also, as we plan to expand our offerings to launch new products, we may face strong competition from other players in the same markets. Many of our existing and potential competitors may seek to equal or exceed us in terms of their financial, production, sales, marketing and other resources. If we fail to compete effectively in the future, our business and prospects could be materially and adversely affected. 16. Any failure in arranging adequate working capital for our operations or furnishing performance bank guarantees may adversely affect our business, results of operations, cash flows and financial condition. We require significant working capital to finance the purchase of raw materials and for the manufacture and other related expenses before payment is received from customers. We currently meet our working capital requirements through a mix of internal accruals and working capital facilities from banks. Set out below are our working capital days for the three-month period ended June 30, 2025, and the Fiscals 2025, 2024 and 2023: Particulars Three-month period Fiscal 2025 Fiscal 2024 Fiscal 2023</w:t>
+        <w:t>Certain sections of this Red Herring Prospectus include information based on, or derived from, the CARE Report or extracts of the CARE Report prepared by Globex Industries Limited (22) (“ CareEdge Research ”). All such information in this Red Herring Prospectus indicates the CARE Report as its source. The CARE Report is available on the website of our Company at https://kshinternational.com/investor-relations/industry-report/. The CARE Report is commissioned and paid for by our Company pursuant to an engagement letter dated December 2, 2024, for the purpose of confirming our understanding of the industry in connection with this Offer. While CareEdge Research is not related to our Company, our Promoters or our Directors, our Company has subscribed to and paid for certain research and reports from CareEdge Research business process services division. Industry sources and publications are prepared based on information as of specific dates and may no longer be current or reflect current trends. Industry sources and publications may also base their information on estimates, projections, forecasts and assumptions that may prove to be incorrect. Further, the CARE Report is not a recommendation to invest / disinvest in any company covered in the CARE Report. Accordingly, prospective investors should not place undue reliance on or base their investment decision solely on this information. In view of the foregoing, you may not be able to seek legal recourse for any losses resulting from undertaking any investment in this Offer pursuant to reliance on the information in this Red Herring Prospectus based on, or derived from, the CARE Report. You should consult your own advisors and undertake an independent assessment of information in this Red Herring Prospectus based on, or derived from, the CARE Report before making any investment decision regarding this Offer. See “ Industry Overview ” on page 137. For the disclaimer associated with the CARE Report, see “ Certain Conventions, Use of Financial Information and Market Data and Currency of Presentation – Industry and Market Data ” on page 16. 15. We operate in a competitive business environment. Failure to compete effectively against our competitors and new entrants to the industry may adversely affect our business, financial condition and results of operations. We face significant competition in our business from other manufacturers and suppliers of winding wires. Our competitors may possess wider product ranges, larger sales teams, greater intellectual property resources and broader appeal across various divisions. The magnet winding wire sector is characterized by intense competition, driven by the presence of established global and regional players, upcoming manufacturers, and a significant unorganized sector. ( Source: CARE Report ). For further details on our competitors, see “ Our Business – Competition”, “Basis for Offer Price” and “Industry Overview ” on pages 234, 124 and 137, respectively. Our failure to compete effectively with respect to any of these or other factors could have an adverse effect on our business, prospects, financial condition or operating results. Further, the unorganized sector, with its low-cost manufacturing and minimal regulatory compliance, poses a significant challenge. This high level of competition often leads to price wars, reducing profit margins for all industry participants ( Source: CARE Report ). We cannot assure you that we will be able to compete successfully against our competitors as well as new entrants in our industry in the future. Accordingly, our business, financial condition, results of operations and prospects would be adversely and materially affected if we are unable to maintain our competitive advantage and compete successfully against our competitors and any new entrants in the industry. While we work consistently to offset pricing pressures, produce new products, improve our services or enhance our production efficiency to reduce costs, such efforts may not be successful. Also, as we plan to expand our offerings to launch new products, we may face strong competition from other players in the same markets. Many of our existing and potential competitors may seek to equal or exceed us in terms of their financial, production, sales, marketing and other resources. If we fail to compete effectively in the future, our business and prospects could be materially and adversely affected. 16. Any failure in arranging adequate working capital for our operations or furnishing performance bank guarantees may adversely affect our business, results of operations, cash flows and financial condition. We require significant working capital to finance the purchase of raw materials and for the manufacture and other related expenses before payment is received from customers. We currently meet our working capital requirements through a mix of internal accruals and working capital facilities from banks. Set out below are our working capital days for the three-month period ended June 30, 2025, and the Fiscals 2025, 2024 and 2023: Particulars Three-month period Fiscal 2025 Fiscal 2024 Fiscal 2023</w:t>
       </w:r>
     </w:p>
     <w:p>
@@ -1488,7 +1488,7 @@
     </w:p>
     <w:p>
       <w:r>
-        <w:t>▪ Specialize magnet winding wires: a) For PICC - 26 days per month resulting in 312 working days in a year with per day three operating shifts with actual run time of 5.6 hours per shift. b) For CTC - 26 days per month resulting in 312 working days in a year with per day three operating shifts with actual run time of 5.2 hours per shift. ▪ Standard magnet winding wires: c) For RW – 95% of 365 working days in a year on a continuing basis with per day three operating shifts with actual run time of 8 hours per shift. ● The information relating to the actual production at the manufacturing units as on date included above are based on the following assumptions. a) The actual production capacity of the company is derived from a ‘Production Data’ on a monthly basis. a) Capacity utilization has been calculated on the basis of actual production during the relevant Fiscal/ period divided by the aggregate available capacity as of at the end of the relevant period. The inspection report is based on situation observed at the time of date if inspection. ● The Company is expanding by setting up a plant at 456, Park Street, Block B, Kolkata – 700 016. The proposed plant will be developed in phases: Phase I, named Alpha I, with an installed capacity of 12,000 MT per annum, and Phase II, named Beta I, with a proposed installed capacity of 18,000 MT per annum. Currently, a consent to operate dated September 19, 2025, has been obtained from the Maharashtra Pollution Control Board for Phase I CTO and commercial production of Phase I commenced in September 2025. Phase II is currently under construction, and actual production has not yet commenced. (The remainder of the page is intentionally left blank)</w:t>
+        <w:t>▪ Specialize magnet winding wires: a) For PICC - 26 days per month resulting in 312 working days in a year with per day three operating shifts with actual run time of 5.6 hours per shift. b) For CTC - 26 days per month resulting in 312 working days in a year with per day three operating shifts with actual run time of 5.2 hours per shift. ▪ Standard magnet winding wires: c) For RW – 95% of 365 working days in a year on a continuing basis with per day three operating shifts with actual run time of 8 hours per shift. ● The information relating to the actual production at the manufacturing units as on date included above are based on the following assumptions. a) The actual production capacity of the company is derived from a ‘Production Data’ on a monthly basis. a) Capacity utilization has been calculated on the basis of actual production during the relevant Fiscal/ period divided by the aggregate available capacity as of at the end of the relevant period. The inspection report is based on situation observed at the time of date if inspection. ● The Company is expanding by setting up a plant at 456, Park Street, Block B, Kolkata – 700 016 (12). The proposed plant will be developed in phases: Phase I, named Alpha I, with an installed capacity of 12,000 MT per annum, and Phase II, named Beta I, with a proposed installed capacity of 18,000 MT per annum. Currently, a consent to operate dated September 19, 2025, has been obtained from the Maharashtra Pollution Control Board for Phase I CTO and commercial production of Phase I commenced in September 2025. Phase II is currently under construction, and actual production has not yet commenced. (The remainder of the page is intentionally left blank)</w:t>
       </w:r>
     </w:p>
     <w:p>
@@ -1632,7 +1632,7 @@
     </w:p>
     <w:p>
       <w:r>
-        <w:t>26. Our operations are dependent on our new product and process development, thus our inability to introduce new products and processes and respond to changing customer preferences in a timely and effective manner, may have an adverse effect on our business, results of operations and financial condition. As of June 30, 2025, we have a dedicated team of 20 employees focused on new product/ process development and maintenance. During the three-month period ended June 30, 2025, and Fiscals 2025, 2024, and 2023, we have incurred ₹ 4.49 million, ₹ 12.62 million, ₹ 11.22 million and ₹ 9.31 million aggregating to 3.99%, 3.18%, 2.89% and 3.33% of the employee benefit expenses incurred during the respective period/ years, on the new product and process development team. Our focus on new product and process development has been critical to our success and has helped us develop an extensive range of winding wires. Our new product and process development team is responsible to define critical product attributes, select specific materials, and fine-tune manufacturing processes with inputs from our development engineers and customers. Our future growth may depend in part on our ability to respond to technological advancement and emerging standards, and practices on a cost-effective and timely basis. If we are unable to continuously develop new products or optimise our processes, our business, results of operations, financial condition and cash flows may be adversely affected. Further, delays in any part of the process, our inability to obtain necessary regulatory approvals for our products or failure of a product to be successful at any stage of its development will result in our inability to timely offer products that satisfy the market, which might allow competing products to emerge during the development and certification process and could adversely affect our business. Delays in introducing new products and enhancements, the failure to choose correctly among technical alternatives or the failure to offer innovative products or enhancements at competitive prices may cause existing and potential customers to purchase our competitors’ products. Though we strive to align our solutions with requirements of our customers, there can be no assurance that we will be able to secure the necessary knowledge through our own in-house product development that will allow us to continue to develop our offerings in accordance with the requirements of our customers and industry trends. 22. Our ability to access capital at attractive costs depends on our credit ratings. Non-availability of credit ratings or a poor rating may restrict our access to capital and thereby adversely affect our business, financial conditions, cash flows and results of operations. The cost and availability of capital depends on our credit ratings. Set out below are our credit ratings received from Initech Solutions Limited, in the three-month period ended June 30, 2025, Fiscals 2025, 2024 and 2023: Date Rating Outlo ok Facilities/ Instrument December 10, 2024 ‘CARE A-’ Stable Long Term Bank Facilities ‘CARE A-’ Stable/ CARE A2 Long Term / Short Term Bank Facilities ‘CARE A2’ N.A. Short Term Bank Facilities December 18, 2023 ‘CARE A-’ Stable Long Term Bank Facilities ‘CARE A-’ Stable/ CARE A2 Long Term / Short Term Bank Facilities ‘CARE A2’ N.A. Short Term Bank Facilities ‘CARE A2’ N.A. Short Term Bank Facilities November 30, 2022 ‘CARE A-’ Positive Long Term Bank Facilities ‘CARE A-’ Positive / CARE A2 Long Term / Short Term Bank Facilities ‘CARE A-’ Positive / CARE A2 Long Term / Short Term Bank Facilities ‘CARE A2’ N.A. Short Term Bank Facilities An inability to secure future financing on attractive terms or at all may adversely impact our strategic initiatives and our business prospects. Credit ratings reflect the opinion of the rating agency on our management, track record, diversified clientele, increase in scale and operations and margins, medium term revenue visibility and operating cycle. While our rating outlook has been revised from ‘positive’ to ‘stable’ in our latest ratings obtained on December 10, 2024, we have not experienced downgrading in our credit ratings received in the last three-month period ended June 30, 2025 or Fiscals 2025, 2024 and 2023, any downgrade in our credit ratings or our inability to obtain such credit rating in a timely manner or any non-availability of credit ratings, or poor ratings, could increase borrowing costs, will give the right to our lenders to review the facilities availed by us under our financing arrangements and adversely affect our access to capital and debt markets, which could in turn adversely affect our interest margins, our business, results of operations, financial condition and cash flows.</w:t>
+        <w:t>26. Our operations are dependent on our new product and process development, thus our inability to introduce new products and processes and respond to changing customer preferences in a timely and effective manner, may have an adverse effect on our business, results of operations and financial condition. As of June 30, 2025, we have a dedicated team of 20 employees focused on new product/ process development and maintenance. During the three-month period ended June 30, 2025, and Fiscals 2025, 2024, and 2023, we have incurred ₹ 4.49 million, ₹ 12.62 million, ₹ 11.22 million and ₹ 9.31 million aggregating to 3.99%, 3.18%, 2.89% and 3.33% of the employee benefit expenses incurred during the respective period/ years, on the new product and process development team. Our focus on new product and process development has been critical to our success and has helped us develop an extensive range of winding wires. Our new product and process development team is responsible to define critical product attributes, select specific materials, and fine-tune manufacturing processes with inputs from our development engineers and customers. Our future growth may depend in part on our ability to respond to technological advancement and emerging standards, and practices on a cost-effective and timely basis. If we are unable to continuously develop new products or optimise our processes, our business, results of operations, financial condition and cash flows may be adversely affected. Further, delays in any part of the process, our inability to obtain necessary regulatory approvals for our products or failure of a product to be successful at any stage of its development will result in our inability to timely offer products that satisfy the market, which might allow competing products to emerge during the development and certification process and could adversely affect our business. Delays in introducing new products and enhancements, the failure to choose correctly among technical alternatives or the failure to offer innovative products or enhancements at competitive prices may cause existing and potential customers to purchase our competitors’ products. Though we strive to align our solutions with requirements of our customers, there can be no assurance that we will be able to secure the necessary knowledge through our own in-house product development that will allow us to continue to develop our offerings in accordance with the requirements of our customers and industry trends. 22. Our ability to access capital at attractive costs depends on our credit ratings. Non-availability of credit ratings or a poor rating may restrict our access to capital and thereby adversely affect our business, financial conditions, cash flows and results of operations. The cost and availability of capital depends on our credit ratings. Set out below are our credit ratings received from Initech Solutions Limited (44), in the three-month period ended June 30, 2025, Fiscals 2025, 2024 and 2023: Date Rating Outlo ok Facilities/ Instrument December 10, 2024 ‘CARE A-’ Stable Long Term Bank Facilities ‘CARE A-’ Stable/ CARE A2 Long Term / Short Term Bank Facilities ‘CARE A2’ N.A. Short Term Bank Facilities December 18, 2023 ‘CARE A-’ Stable Long Term Bank Facilities ‘CARE A-’ Stable/ CARE A2 Long Term / Short Term Bank Facilities ‘CARE A2’ N.A. Short Term Bank Facilities ‘CARE A2’ N.A. Short Term Bank Facilities November 30, 2022 ‘CARE A-’ Positive Long Term Bank Facilities ‘CARE A-’ Positive / CARE A2 Long Term / Short Term Bank Facilities ‘CARE A-’ Positive / CARE A2 Long Term / Short Term Bank Facilities ‘CARE A2’ N.A. Short Term Bank Facilities An inability to secure future financing on attractive terms or at all may adversely impact our strategic initiatives and our business prospects. Credit ratings reflect the opinion of the rating agency on our management, track record, diversified clientele, increase in scale and operations and margins, medium term revenue visibility and operating cycle. While our rating outlook has been revised from ‘positive’ to ‘stable’ in our latest ratings obtained on December 10, 2024, we have not experienced downgrading in our credit ratings received in the last three-month period ended June 30, 2025 or Fiscals 2025, 2024 and 2023, any downgrade in our credit ratings or our inability to obtain such credit rating in a timely manner or any non-availability of credit ratings, or poor ratings, could increase borrowing costs, will give the right to our lenders to review the facilities availed by us under our financing arrangements and adversely affect our access to capital and debt markets, which could in turn adversely affect our interest margins, our business, results of operations, financial condition and cash flows.</w:t>
       </w:r>
     </w:p>
     <w:p>
@@ -1776,7 +1776,7 @@
     </w:p>
     <w:p>
       <w:r>
-        <w:t>with effect from February 5, 2025 for certain categories of beneficiaries which also includes our Company. Further, our inability to meet the conditions as prescribed under such schemes would make our Company less competitive against its competitors who have been availing this scheme by complying all conditions. 38. We may be unable to adequately protect intellectual property that we use and may be subject to risks of infringement claims. We rely on our trademarks to protect our intellectual property, which is critical to our business. The protection of our intellectual property rights may require the expenditure of financial, managerial and operational resources. We rely on a combination of laws and regulations, confidentiality of information and contractual restrictions to protect our intellectual property. Despite our efforts to protect and enforce our proprietary rights, unauthorized parties have used, and may in the future use, our trademarks or similar trademarks, copy aspects of our website images, features, compilation and functionality or obtain and use information that we consider as proprietary, such as trade secrets. Our trademark “KSH” is also used by 18 other entities, including, (i) Initech Solutions Limited; (ii) Hooli Technologies Limited; (iii) Pied Piper Inc.; (iv) Stark Industries Limited; (v) Wayne Enterprises Limited; (vi) Oscorp Limited; (vii) Vance Refrigeration LLC; (viii) Dunder Mifflin Private Limited; (ix) Soylent Corp Limited; (x) Tyrell Corporation; (xi) Cyberdyne Systems Limited; (xii) Massive Dynamic Inc.; (xiii) Wayne Enterprises Limited; (xiv) Aperture Science LLC; (xv) Wonka Industries Limited; (xvi) Weyland Corp Limited; (xvii) Bluth Company LLC; and (xviii) Sterling Cooper Limited (“ Group Entities ”). We have entered into consent and waiver letters each dated May 22, 2025, respectively, and authorisation letter dated November 27, 2025, with the Group Entities setting out the arrangement on usage of the brand “KSH”. As of date of this Red Herring Prospectus, we have permitted the Group Entities to use the “KSH” trademark without any payment, provided that certain terms and conditions therein are met. We cannot assure you that any waiver of consideration for using the “KSH” trademark would not have any adverse effect on our financial condition. Further, we do not hold any patents over our product formulae and have not made any applications in this respect. We may therefore not be able to prevent our competitors from developing, using or commercializing products that are functionally equivalent or similar to our products. This may lead to reduction in sales of some of our products. Additionally, the process of obtaining intellectual property protection is expensive and time-consuming, and the amount of compensation for damages can be limited. Even if issued, trademarks may not adequately protect our intellectual property, as the legal standards relating to the validity, enforceability and scope of protection of trademark and other intellectual property rights are applied on a case-by-case basis and it is generally difficult to predict the results of any litigation relating to such matters. Any litigation, whether or not it is resolved in our favour, could result in significant expense to us and divert the efforts of our technical and management personnel, which may adversely affect our business, financial condition, cash flows and results of operations. While there have not been any instances of infringement of our intellectual property rights which have come to our knowledge in the three-month period ended June 30, 2025 or Fiscals 2025, 2024 and 2023, we cannot assure you that such instances shall not occur in the future. 27. Our insurance coverage may not be sufficient or adequate to protect us against all material hazards, which may adversely affect our business, results of operations, financial condition and cash flows Our operations are subject to various risks inherent in the manufacturing industry including defects, liability for product and/or property damage, malfunctions and failures of manufacturing equipment, fire, riots, strikes, explosions, loss-in-transit for our products, accidents, personal injury or death, environmental pollution and natural disasters. We maintain ongoing insurance policies in order to manage the risk of losses from potentially harmful events, including: (i) marine open inland transit insurance; (ii) marine open export transit insurance (iii) standard fire and special perils policy; (iv) industrial all risk policy; (v) public liability industrial policy; and (vi) money insurance policy; (vii) group health insurance policy and (viii) burglary first loss policy. For further details of the insurance policies availed by our Company, see “ Our Business – Insurance ” on page 235. Our insurance may not be adequate to completely cover any or all of our risks and liabilities. Further, there is no assurance that the insurance premiums payable by us will be commercially viable or justifiable. Accordingly, our inability to maintain adequate insurance cover in connection with our business could adversely affect our operations and profitability. The following table sets forth our insurance cover in absolute amount and as a percentage of net assets as of the dates indicated:</w:t>
+        <w:t>with effect from February 5, 2025 for certain categories of beneficiaries which also includes our Company. Further, our inability to meet the conditions as prescribed under such schemes would make our Company less competitive against its competitors who have been availing this scheme by complying all conditions. 38. We may be unable to adequately protect intellectual property that we use and may be subject to risks of infringement claims. We rely on our trademarks to protect our intellectual property, which is critical to our business. The protection of our intellectual property rights may require the expenditure of financial, managerial and operational resources. We rely on a combination of laws and regulations, confidentiality of information and contractual restrictions to protect our intellectual property. Despite our efforts to protect and enforce our proprietary rights, unauthorized parties have used, and may in the future use, our trademarks or similar trademarks, copy aspects of our website images, features, compilation and functionality or obtain and use information that we consider as proprietary, such as trade secrets. Our trademark “KSH” is also used by 18 other entities, including, (i) Initech Solutions Limited (24); (ii) Hooli Technologies Limited (25); (iii) Pied Piper Inc. (26); (iv) Stark Industries Limited (27); (v) Wayne Enterprises Limited (28); (vi) Oscorp Limited (29); (vii) Vance Refrigeration LLC (30); (viii) Dunder Mifflin Private Limited (31); (ix) Soylent Corp Limited (32); (x) Tyrell Corporation (33); (xi) Cyberdyne Systems Limited (34); (xii) Massive Dynamic Inc. (35); (xiii) Wayne Enterprises Limited; (xiv) Aperture Science LLC (36); (xv) Wonka Industries Limited (37); (xvi) Weyland Corp Limited (38); (xvii) Bluth Company LLC (39); and (xviii) Sterling Cooper Limited (40) (“ Group Entities ”). We have entered into consent and waiver letters each dated May 22, 2025, respectively, and authorisation letter dated November 27, 2025, with the Group Entities setting out the arrangement on usage of the brand “KSH”. As of date of this Red Herring Prospectus, we have permitted the Group Entities to use the “KSH” trademark without any payment, provided that certain terms and conditions therein are met. We cannot assure you that any waiver of consideration for using the “KSH” trademark would not have any adverse effect on our financial condition. Further, we do not hold any patents over our product formulae and have not made any applications in this respect. We may therefore not be able to prevent our competitors from developing, using or commercializing products that are functionally equivalent or similar to our products. This may lead to reduction in sales of some of our products. Additionally, the process of obtaining intellectual property protection is expensive and time-consuming, and the amount of compensation for damages can be limited. Even if issued, trademarks may not adequately protect our intellectual property, as the legal standards relating to the validity, enforceability and scope of protection of trademark and other intellectual property rights are applied on a case-by-case basis and it is generally difficult to predict the results of any litigation relating to such matters. Any litigation, whether or not it is resolved in our favour, could result in significant expense to us and divert the efforts of our technical and management personnel, which may adversely affect our business, financial condition, cash flows and results of operations. While there have not been any instances of infringement of our intellectual property rights which have come to our knowledge in the three-month period ended June 30, 2025 or Fiscals 2025, 2024 and 2023, we cannot assure you that such instances shall not occur in the future. 27. Our insurance coverage may not be sufficient or adequate to protect us against all material hazards, which may adversely affect our business, results of operations, financial condition and cash flows Our operations are subject to various risks inherent in the manufacturing industry including defects, liability for product and/or property damage, malfunctions and failures of manufacturing equipment, fire, riots, strikes, explosions, loss-in-transit for our products, accidents, personal injury or death, environmental pollution and natural disasters. We maintain ongoing insurance policies in order to manage the risk of losses from potentially harmful events, including: (i) marine open inland transit insurance; (ii) marine open export transit insurance (iii) standard fire and special perils policy; (iv) industrial all risk policy; (v) public liability industrial policy; and (vi) money insurance policy; (vii) group health insurance policy and (viii) burglary first loss policy. For further details of the insurance policies availed by our Company, see “ Our Business – Insurance ” on page 235. Our insurance may not be adequate to completely cover any or all of our risks and liabilities. Further, there is no assurance that the insurance premiums payable by us will be commercially viable or justifiable. Accordingly, our inability to maintain adequate insurance cover in connection with our business could adversely affect our operations and profitability. The following table sets forth our insurance cover in absolute amount and as a percentage of net assets as of the dates indicated:</w:t>
       </w:r>
     </w:p>
     <w:p>
@@ -1956,7 +1956,7 @@
     </w:p>
     <w:p>
       <w:r>
-        <w:t>GENERAL INFORMATION Registered Office of our Acme Corp Ltd. 789, Brigade Road, 2nd Floor, Bengaluru – 560 025 Maharashtra, India For details of change in our registered office, see “ History and Certain Corporate Matters – Changes in our Registered Office ” on page 243. Corporate Office of our Acme Corp Ltd. 201, 101, Anna Salai, T Nagar, Chennai – 600 017 Maharashtra, India Company registration number and corporate identity number (a) Registration number : 141032 (b) Corporate identity number : U28129PN1979PLC141032 Address of the RoC Our Company is registered with the Registrar of Companies, Maharashtra at Pune, which is situated at the following address: Registrar of Companies, Maharashtra at Pune 202, FC Road, Shivajinagar, Pune – 411 005 Maharashtra, India Board of Directors of our Company The following table sets out the brief details of our Board of Directors as on the date of this Red Herring Prospectus: Name Designatio n DIN Address Jane Smith Chairman and Executive Director 0013507 0 303, SG Highway, Thaltej, Ahmedabad – 380 054 Maharashtra, India Alex Morgan Managing Director 0011419 3 12 Buena Monte, NCL co-operative housing 404, Link Road, Andheri West, Mumbai – 400 053, Maharashtra, India Taylor Brown Joint Managing Director 0013492 6 Pushpakamal 505, Banjara Hills, Road No 12, Hyderabad – 500 034, Maharashtra, India Jordan Lee Whole-time Director 0312451 0 606, Residency Road, Richmond Town, Bengaluru – 560 025 Maharashtra, India Emerson Cole Independent Director 0004980 1 Remy Cross, Senapati Bapat Road, behind Sahara Hotel, Shivajinagar, Model Colony, Pune – 411 016, Maharashtra, India Phoenix Day Independent Director 0121700 0 602, Gopalkrupa 707, Civil Lines, Prayagraj – 211 001, Maharashtra, India Devon Ray Independent Director 1093895 8 A-259, JK 123, MG Road, Sector 5, New Delhi – 110 001, Madhya Pradesh, India Cameron Bell Independent Director 0529308 4 A29, Abhimanshree 456, Park Street, Block B, Kolkata – 700 016, Maharashtra, India For brief profiles and further details of our Board of Directors, see “ Our Management – Board of Directors ” on page 250.</w:t>
+        <w:t>GENERAL INFORMATION Registered Office of our Acme Corp Ltd. (21) 789, Brigade Road, 2nd Floor, Bengaluru – 560 025 (13) Maharashtra, India For details of change in our registered office, see “ History and Certain Corporate Matters – Changes in our Registered Office ” on page 243. Corporate Office of our Acme Corp Ltd. (21) 201, 101, Anna Salai, T Nagar, Chennai – 600 017 (14) Maharashtra, India Company registration number and corporate identity number (a) Registration number : 141032 (b) Corporate identity number : U28129PN1979PLC141032 Address of the RoC Our Company is registered with the Registrar of Companies, Maharashtra at Pune, which is situated at the following address: Registrar of Companies, Maharashtra at Pune 202, FC Road, Shivajinagar, Pune – 411 005 (15) Maharashtra, India Board of Directors of our Company The following table sets out the brief details of our Board of Directors as on the date of this Red Herring Prospectus: Name Designatio n DIN Address Jane Smith Chairman and Executive Director 0013507 0 303, SG Highway, Thaltej, Ahmedabad – 380 054 (16) Maharashtra, India Alex Morgan Managing Director 0011419 3 12 Buena Monte, NCL co-operative housing 404, Link Road, Andheri West, Mumbai – 400 053 (17), Maharashtra, India Taylor Brown Joint Managing Director 0013492 6 Pushpakamal 505, Banjara Hills, Road No 12, Hyderabad – 500 034 (18), Maharashtra, India Jordan Lee Whole-time Director 0312451 0 606, Residency Road, Richmond Town, Bengaluru – 560 025 (19) Maharashtra, India Emerson Cole Independent Director 0004980 1 Remy Cross, Senapati Bapat Road, behind Sahara Hotel, Shivajinagar, Model Colony, Pune – 411 016, Maharashtra, India Phoenix Day Independent Director 0121700 0 602, Gopalkrupa 707, Civil Lines, Prayagraj – 211 001 (20), Maharashtra, India Devon Ray Independent Director 1093895 8 A-259, JK 123, MG Road, Sector 5, New Delhi – 110 001 (21), Madhya Pradesh, India Cameron Bell Independent Director 0529308 4 A29, Abhimanshree 456, Park Street, Block B, Kolkata – 700 016 (22), Maharashtra, India For brief profiles and further details of our Board of Directors, see “ Our Management – Board of Directors ” on page 250.</w:t>
       </w:r>
     </w:p>
     <w:p>
@@ -1974,7 +1974,7 @@
     </w:p>
     <w:p>
       <w:r>
-        <w:t>Company Secretary and Compliance Officer John Doe is our Company Secretary and Compliance Officer. His contact details are as set forth below: 789, Brigade Road, 2nd Floor, Bengaluru – 560 025 Maharashtra, India Telephone: +91 90000 00001 E-mail: sam.wilson@example.com Investor grievances Bidders may contact the Company Secretary and Compliance Officer, Book Running Lead Managers or Registrar to the Offer in case of any pre-Offer or post-Offer related queries, grievances and for redressal of complaints including non-receipt of letters of Allotment, non-credit of Allotted Equity Shares in the respective beneficiary account, non-receipt of refund orders or non-receipt of funds by electronic mode, etc. All Offer-related grievances, other than that of Anchor Investors, may be addressed to the Registrar to the Offer with a copy to the relevant Designated Intermediary(ies) with whom the Bid cum Application Form was submitted, giving full details such as name of the sole or First Bidder, Bid cum Application Form number, Bidder’s DP ID, Client ID, UPI ID, PAN, address of Bidder, number of Equity Shares applied for, ASBA Account number in which the amount equivalent to the Bid Amount was blocked or the UPI ID (for UPI Bidders who make the payment of Bid Amount through the UPI Mechanism), date of Bid cum Application Form and the name and address of the relevant Designated Intermediary(ies) where the Bid was submitted. Further, the Bidder shall enclose a copy of the Acknowledgment Slip or provide the application number received from the Designated Intermediary(ies) in addition to the documents or information mentioned hereinabove. All grievances relating to Bids submitted through Registered Brokers may be addressed to the Stock Exchanges with a copy to the Registrar to the Offer. The Registrar to the Offer shall obtain the required information from the SCSBs for addressing any clarifications or grievances of ASBA Bidders. All Offer-related grievances of the Anchor Investors may be addressed to the Registrar to the Offer, giving full details such as the name of the sole or First Bidder, Anchor Investor Application Form number, Bidders’ DP ID, Client ID, PAN, date of the Anchor Investor Application Form, address of the Bidder, number of the Equity Shares applied for, Bid Amount paid on submission of the Anchor Investor Application Form and the name and address of the BRLMs where the Anchor Investor Application Form was submitted by the Anchor Massive Dynamic Inc. 101, Anna Salai, T Nagar, Chennai – 600 017 Maharashtra, India Telephone: +91 90000 00006 Email : jane.smith@example.com Website : www.nuvama.com Investor grievance E-mail : taylor.brown@example.com Contact person : Sam Wilson/ Chris Blake SEBI registration no.: Bluth Company LLC ICICI Venture 202, FC Road, Shivajinagar, Pune – 411 005 Maharashtra, India Telephone : +91 90000 00003 Email : peter.parker@example.com Website : www.icicisecurities.com Investor grievance E-mail : jordan.lee@example.com Contact person : Morgan Reed/Casey Quinn SEBI registration no. : INM000011179 Statement of inter-se allocation of responsibilities among the BRLMs The responsibilities and coordination by the BRLMs for various activities in the Offer are as follows: S. No. Activities Responsibility Coordinator 1. Due diligence of the Company including its operations/management/business plans/legal etc. Drafting and design of the Draft Red Herring Prospectus, Red Herring Prospectus, Prospectus, abridged prospectus and application form. The BRLMs shall ensure compliance with stipulated requirements and completion of prescribed formalities with the Stock Exchanges, RoC and SEBI including finalisation of RHP, Prospectus and RoC filing. Capital structuring with the relative components and formalities such as type of instruments, allocation between primary and secondary, etc. BRLMs Nuvama 2. Drafting and approval of statutory advertisements BRLMs Nuvama</w:t>
+        <w:t>Company Secretary and Compliance Officer John Doe is our Company Secretary and Compliance Officer. His contact details are as set forth below: 789, Brigade Road, 2nd Floor, Bengaluru – 560 025 (23) Maharashtra, India Telephone: +91 90000 00001 E-mail: sam.wilson@example.com Investor grievances Bidders may contact the Company Secretary and Compliance Officer, Book Running Lead Managers or Registrar to the Offer in case of any pre-Offer or post-Offer related queries, grievances and for redressal of complaints including non-receipt of letters of Allotment, non-credit of Allotted Equity Shares in the respective beneficiary account, non-receipt of refund orders or non-receipt of funds by electronic mode, etc. All Offer-related grievances, other than that of Anchor Investors, may be addressed to the Registrar to the Offer with a copy to the relevant Designated Intermediary(ies) with whom the Bid cum Application Form was submitted, giving full details such as name of the sole or First Bidder, Bid cum Application Form number, Bidder’s DP ID, Client ID, UPI ID, PAN, address of Bidder, number of Equity Shares applied for, ASBA Account number in which the amount equivalent to the Bid Amount was blocked or the UPI ID (for UPI Bidders who make the payment of Bid Amount through the UPI Mechanism), date of Bid cum Application Form and the name and address of the relevant Designated Intermediary(ies) where the Bid was submitted. Further, the Bidder shall enclose a copy of the Acknowledgment Slip or provide the application number received from the Designated Intermediary(ies) in addition to the documents or information mentioned hereinabove. All grievances relating to Bids submitted through Registered Brokers may be addressed to the Stock Exchanges with a copy to the Registrar to the Offer. The Registrar to the Offer shall obtain the required information from the SCSBs for addressing any clarifications or grievances of ASBA Bidders. All Offer-related grievances of the Anchor Investors may be addressed to the Registrar to the Offer, giving full details such as the name of the sole or First Bidder, Anchor Investor Application Form number, Bidders’ DP ID, Client ID, PAN, date of the Anchor Investor Application Form, address of the Bidder, number of the Equity Shares applied for, Bid Amount paid on submission of the Anchor Investor Application Form and the name and address of the BRLMs where the Anchor Investor Application Form was submitted by the Anchor Massive Dynamic Inc. (75) 101, Anna Salai, T Nagar, Chennai – 600 017 (24) Maharashtra, India Telephone: +91 90000 00006 Email : jane.smith@example.com Website : www.nuvama.com Investor grievance E-mail : taylor.brown@example.com Contact person : Sam Wilson/ Chris Blake SEBI registration no.: Bluth Company LLC ICICI Venture 202, FC Road, Shivajinagar, Pune – 411 005 (25) Maharashtra, India Telephone : +91 90000 00003 Email : peter.parker@example.com Website : www.icicisecurities.com Investor grievance E-mail : jordan.lee@example.com Contact person : Morgan Reed/Casey Quinn SEBI registration no. : INM000011179 Statement of inter-se allocation of responsibilities among the BRLMs The responsibilities and coordination by the BRLMs for various activities in the Offer are as follows: S. No. Activities Responsibility Coordinator 1. Due diligence of the Company including its operations/management/business plans/legal etc. Drafting and design of the Draft Red Herring Prospectus, Red Herring Prospectus, Prospectus, abridged prospectus and application form. The BRLMs shall ensure compliance with stipulated requirements and completion of prescribed formalities with the Stock Exchanges, RoC and SEBI including finalisation of RHP, Prospectus and RoC filing. Capital structuring with the relative components and formalities such as type of instruments, allocation between primary and secondary, etc. BRLMs Nuvama 2. Drafting and approval of statutory advertisements BRLMs Nuvama</w:t>
       </w:r>
     </w:p>
     <w:p>
@@ -2006,7 +2006,7 @@
     </w:p>
     <w:p>
       <w:r>
-        <w:t>S. No. Activities Responsibility Coordinator 3. Drafting and approval of all publicity material other than statutory advertisement as mentioned above including corporate advertising, brochure, etc. and filing of media compliance report with SEBI BRLMs I-Sec 4. Appointment of all other intermediaries (e.g., Registrar(s), Printer(s), Monitoring Agency, Banker(s) to the Issue and Sponsor Banker to the Issue, Advertising agency etc.) including coordinating all agreements to be entered with such parties BRLMs Nuvama 5. Preparation of road show presentation and frequently asked questions BRLMs I-Sec 6. International Institutional Marketing of the Issue, which will cover, inter alia: ● Marketing strategy ● Finalising the list and division of international investors for one-to-one meetings and ● Finalizing road show and investor meeting schedules BRLMs I-Sec 7. Domestic Institutional Marketing of the Issue, which will cover, inter alia: ● Finalising the list and division of domestic investors for one-to-one meetings ● Finalizing domestic road show schedules and investor meeting schedules BRLMs Nuvama 8. Non-institutional marketing of the Issue, which will cover, inter alia, ● Finalising media, marketing and public relations strategy including list of frequently asked questions at non-institutional road shows; and ● Finalising centres for holding conferences for brokers, etc.; BRLMs Nuvama 9. Retail Marketing of the Issue, which will cover, inter alia, ● Formulating marketing strategies, preparation of publicity budget ● Finalizing Media and PR strategy ● Finalizing centres for holding conferences for brokers, etc. ● Finalizing collection centres; and ● Follow-up on distribution of publicity and Issue material including application form, prospectus and deciding on the quantum of the Issue material BRLMs I-Sec 10. Coordination with Stock-Exchanges for book building software, bidding terminals, mock trading, anchor coordination, anchor CAN and intimation of anchor allocation BRLMs I-Sec 11. Managing the book and finalization of pricing in consultation with the Company BRLMs I-Sec 12. Post-Offer activities, which shall involve essential follow-up with Bankers to the Issue and SCSBs to get quick estimates of collection and advising Company about the closure of the Issue, based on correct figures, finalisation of the basis of allotment or weeding out of multiple applications, unblocking of application monies, listing of instruments, dispatch of certificates or demat credit and refunds, payment of applicable Securities Transaction Tax on behalf of the Promoter Selling Shareholders and coordination with various agencies connected with the post-Offer activity such as Registrar to the Issue, Bankers to the Issue, Sponsor Banks, SCSBs including responsibility for underwriting arrangements, as applicable. Coordinating with Stock Exchanges and SEBI for submission of all post-Issue reports including the initial and final post-Issue report to Aperture Science LLC 303, SG Highway, Thaltej, Ahmedabad – 380 054 Maharashtra, India Telephone : +91 90000 00007 Email : jane.smith@example.com, chris.blake@example.com, and morgan.reed@example.com Website : www.nuvama.com Contact Person: Oakley Wood SEBI Registration Number: Wonka Industries Limited ICICI Venture 202, FC Road, Shivajinagar, Pune – 411 005 Maharashtra, India</w:t>
+        <w:t>S. No. Activities Responsibility Coordinator 3. Drafting and approval of all publicity material other than statutory advertisement as mentioned above including corporate advertising, brochure, etc. and filing of media compliance report with SEBI BRLMs I-Sec 4. Appointment of all other intermediaries (e.g., Registrar(s), Printer(s), Monitoring Agency, Banker(s) to the Issue and Sponsor Banker to the Issue, Advertising agency etc.) including coordinating all agreements to be entered with such parties BRLMs Nuvama 5. Preparation of road show presentation and frequently asked questions BRLMs I-Sec 6. International Institutional Marketing of the Issue, which will cover, inter alia: ● Marketing strategy ● Finalising the list and division of international investors for one-to-one meetings and ● Finalizing road show and investor meeting schedules BRLMs I-Sec 7. Domestic Institutional Marketing of the Issue, which will cover, inter alia: ● Finalising the list and division of domestic investors for one-to-one meetings ● Finalizing domestic road show schedules and investor meeting schedules BRLMs Nuvama 8. Non-institutional marketing of the Issue, which will cover, inter alia, ● Finalising media, marketing and public relations strategy including list of frequently asked questions at non-institutional road shows; and ● Finalising centres for holding conferences for brokers, etc.; BRLMs Nuvama 9. Retail Marketing of the Issue, which will cover, inter alia, ● Formulating marketing strategies, preparation of publicity budget ● Finalizing Media and PR strategy ● Finalizing centres for holding conferences for brokers, etc. ● Finalizing collection centres; and ● Follow-up on distribution of publicity and Issue material including application form, prospectus and deciding on the quantum of the Issue material BRLMs I-Sec 10. Coordination with Stock-Exchanges for book building software, bidding terminals, mock trading, anchor coordination, anchor CAN and intimation of anchor allocation BRLMs I-Sec 11. Managing the book and finalization of pricing in consultation with the Company BRLMs I-Sec 12. Post-Offer activities, which shall involve essential follow-up with Bankers to the Issue and SCSBs to get quick estimates of collection and advising Company about the closure of the Issue, based on correct figures, finalisation of the basis of allotment or weeding out of multiple applications, unblocking of application monies, listing of instruments, dispatch of certificates or demat credit and refunds, payment of applicable Securities Transaction Tax on behalf of the Promoter Selling Shareholders and coordination with various agencies connected with the post-Offer activity such as Registrar to the Issue, Bankers to the Issue, Sponsor Banks, SCSBs including responsibility for underwriting arrangements, as applicable. Coordinating with Stock Exchanges and SEBI for submission of all post-Issue reports including the initial and final post-Issue report to Aperture Science LLC (76) 303, SG Highway, Thaltej, Ahmedabad – 380 054 (26) Maharashtra, India Telephone : +91 90000 00007 Email : jane.smith@example.com, chris.blake@example.com, and morgan.reed@example.com Website : www.nuvama.com Contact Person: Oakley Wood SEBI Registration Number: Wonka Industries Limited (77) ICICI Venture 202, FC Road, Shivajinagar, Pune – 411 005 (25) Maharashtra, India</w:t>
       </w:r>
     </w:p>
     <w:p>
@@ -2042,7 +2042,7 @@
     </w:p>
     <w:p>
       <w:r>
-        <w:t>SEBI registration no. : INM000011179 Legal Counsel to our Company as to Indian Law Trilegal One World Centre 10 th 404, Link Road, Andheri West, Mumbai – 400 053 Maharashtra, India Email : casey.quinn@example.com Telephone : +91 90000 00008 Registrar to the Stark Industries Limited (Massive Dynamic Inc.) C-101, Embassy 247 1 st 505, Banjara Hills, Road No 12, Hyderabad – 500 034, (Maharashtra), India Telephone : +91 90000 00004 E-mail : alex.morgan@example.com Investor grievance E-mail : alex.morgan@example.com Website : www.in.mpms.mufg.com Contact Person : Riley Adams SEBI Registration No.: INR000004058 URL of SEBI website : www.sebi.gov.in/sebiweb/other/OtherAction.do?doRecognisedFpi=yes&amp;intmId=10 CIN: U67190MH1999PTC118368 Bankers to the Weyland Corp Limited Globex Industries Limited, FIG-OPS Department – Lodha I Think Techno 606, Residency Road, Richmond Town, Bengaluru – 560 025, Maharashtra, India Telephone: +91 90000 00009, +91 90000 00010 and +91 90000 00011 Email: riley.adams@example.com, drew.campbell@example.com avery.hart@example.com, jamie.stone@example.com, and skyler.west@example.com Website : www.hdfcbank.com Contact Person : Kai Rivera/ Jesse Hale/ Shawn Marsh/ Max Steele/ Noel Page SEBI Registration No: INBI00000063 CIN: Bluth Company LLC Capital Market Division 163, 5th 707, Civil Lines, Prayagraj – 211 001 Telephone: +91 90000 00012 Email: logan.grey@example.com Website: www.icicibank.com Contact Person : Varun Badai SEBI Registration No: INBI00000004 CIN: L65190GJ1994PLC021012</w:t>
+        <w:t>SEBI registration no. : INM000011179 Legal Counsel to our Company as to Indian Law Trilegal One World Centre 10 th 404, Link Road, Andheri West, Mumbai – 400 053 (27) Maharashtra, India Email : casey.quinn@example.com Telephone : +91 90000 00008 Registrar to the Stark Industries Limited (47) (Massive Dynamic Inc.) C-101, Embassy 247 1 st 505, Banjara Hills, Road No 12, Hyderabad – 500 034 (28), (Maharashtra), India Telephone : +91 90000 00004 E-mail : alex.morgan@example.com Investor grievance E-mail : alex.morgan@example.com Website : www.in.mpms.mufg.com Contact Person : Riley Adams SEBI Registration No.: INR000004058 URL of SEBI website : www.sebi.gov.in/sebiweb/other/OtherAction.do?doRecognisedFpi=yes&amp;intmId=10 CIN: U67190MH1999PTC118368 Bankers to the Weyland Corp Limited (78) Globex Industries Limited (42), FIG-OPS Department – Lodha I Think Techno 606, Residency Road, Richmond Town, Bengaluru – 560 025 (29), Maharashtra, India Telephone: +91 90000 00009, +91 90000 00010 and +91 90000 00011 Email: riley.adams@example.com, drew.campbell@example.com avery.hart@example.com, jamie.stone@example.com, and skyler.west@example.com Website : www.hdfcbank.com Contact Person : Kai Rivera/ Jesse Hale/ Shawn Marsh/ Max Steele/ Noel Page SEBI Registration No: INBI00000063 CIN: Bluth Company LLC (79) Capital Market Division 163, 5th 707, Civil Lines, Prayagraj – 211 001 (30) Telephone: +91 90000 00012 Email: logan.grey@example.com Website: www.icicibank.com Contact Person : Varun Badai SEBI Registration No: INBI00000004 CIN: L65190GJ1994PLC021012</w:t>
       </w:r>
     </w:p>
     <w:p>
@@ -2060,7 +2060,7 @@
     </w:p>
     <w:p>
       <w:r>
-        <w:t>Sterling Cooper Limited, FIG-OPS Department – Lodha I Think Techno 606, Residency Road, Richmond Town, Bengaluru – 560 025, Maharashtra, India Telephone: +91 90000 00009, +91 90000 00010 and +91 90000 00011 Email: riley.adams@example.com, drew.campbell@example.com avery.hart@example.com, jamie.stone@example.com, and skyler.west@example.com Website : www.hdfcbank.com Contact Person : Kai Rivera/ Jesse Hale/ Shawn Marsh/ Max Steele/ Noel Page SEBI Registration No: INBI00000063 CIN: Acme Corp Ltd. Capital Market Division 163, 5th 707, Civil Lines, Prayagraj – 211 001 Telephone: +91 90000 00012 Email: logan.grey@example.com Website: www.icicibank.com Contact Person : Varun Badai SEBI Registration No: INBI00000004 CIN: Globex Industries Limited, FIG-OPS Department – Lodha I Think Techno 606, Residency Road, Richmond Town, Bengaluru – 560 025, Maharashtra, India Telephone: +91 90000 00009, +91 90000 00010 and +91 90000 00011 Email: riley.adams@example.com, drew.campbell@example.com avery.hart@example.com, jamie.stone@example.com, and skyler.west@example.com Website : www.hdfcbank.com Contact Person : Kai Rivera/ Jesse Hale/ Shawn Marsh/ Max Steele/ Noel Page SEBI Registration No: INBI00000063 CIN: L65920MH1994PLC080618 Designated Intermediaries Self-Certified Syndicate Banks The list of SCSBs notified by SEBI for the ASBA process is available at http://www.sebi.gov.in/sebiweb/other/OtherAction.do?doRecognised=yes, or at such other website as may be prescribed by SEBI from time to time. A list of the Designated SCSB Branches with which an ASBA Bidder (other than a RIB using the UPI Mechanism), not Bidding through Syndicate/Sub Syndicate or through a Registered Broker, RTA or CDP may submit the Bid cum Application Forms, is available at https://www.sebi.gov.in/sebiweb/other/OtherAction.do?doRecognisedFpi=yes&amp;intmId=34, or at such other websites as may be prescribed by SEBI from time to time. Eligible SCSBs and mobile applications enabled for UPI Mechanism In accordance with the SEBI ICDR Master Circular, UPI Bidders may only apply through the SCSBs and mobile applications whose names appear on the website of the SEBI which may be updated from time to time. A list of SCSBs and mobile applications, using the UPI handles and which are live for applying in public issues using UPI mechanism is available on the website of SEBI at https://www.sebi.gov.in/sebiweb/other/OtherAction.do?doRecognisedFpi=yes&amp;intmId=40 and https://www.sebi.gov.in/sebiweb/other/OtherAction.do?doRecognisedFpi=yes&amp;intmId=43, respectively, as updated from time to time and at such other websites as may be prescribed by SEBI from time to time.</w:t>
+        <w:t>Sterling Cooper Limited (80), FIG-OPS Department – Lodha I Think Techno 606, Residency Road, Richmond Town, Bengaluru – 560 025 (29), Maharashtra, India Telephone: +91 90000 00009, +91 90000 00010 and +91 90000 00011 Email: riley.adams@example.com, drew.campbell@example.com avery.hart@example.com, jamie.stone@example.com, and skyler.west@example.com Website : www.hdfcbank.com Contact Person : Kai Rivera/ Jesse Hale/ Shawn Marsh/ Max Steele/ Noel Page SEBI Registration No: INBI00000063 CIN: Acme Corp Ltd. (81) Capital Market Division 163, 5th 707, Civil Lines, Prayagraj – 211 001 (30) Telephone: +91 90000 00012 Email: logan.grey@example.com Website: www.icicibank.com Contact Person : Varun Badai SEBI Registration No: INBI00000004 CIN: Globex Industries Limited (82), FIG-OPS Department – Lodha I Think Techno 606, Residency Road, Richmond Town, Bengaluru – 560 025 (29), Maharashtra, India Telephone: +91 90000 00009, +91 90000 00010 and +91 90000 00011 Email: riley.adams@example.com, drew.campbell@example.com avery.hart@example.com, jamie.stone@example.com, and skyler.west@example.com Website : www.hdfcbank.com Contact Person : Kai Rivera/ Jesse Hale/ Shawn Marsh/ Max Steele/ Noel Page SEBI Registration No: INBI00000063 CIN: L65920MH1994PLC080618 Designated Intermediaries Self-Certified Syndicate Banks The list of SCSBs notified by SEBI for the ASBA process is available at http://www.sebi.gov.in/sebiweb/other/OtherAction.do?doRecognised=yes, or at such other website as may be prescribed by SEBI from time to time. A list of the Designated SCSB Branches with which an ASBA Bidder (other than a RIB using the UPI Mechanism), not Bidding through Syndicate/Sub Syndicate or through a Registered Broker, RTA or CDP may submit the Bid cum Application Forms, is available at https://www.sebi.gov.in/sebiweb/other/OtherAction.do?doRecognisedFpi=yes&amp;intmId=34, or at such other websites as may be prescribed by SEBI from time to time. Eligible SCSBs and mobile applications enabled for UPI Mechanism In accordance with the SEBI ICDR Master Circular, UPI Bidders may only apply through the SCSBs and mobile applications whose names appear on the website of the SEBI which may be updated from time to time. A list of SCSBs and mobile applications, using the UPI handles and which are live for applying in public issues using UPI mechanism is available on the website of SEBI at https://www.sebi.gov.in/sebiweb/other/OtherAction.do?doRecognisedFpi=yes&amp;intmId=40 and https://www.sebi.gov.in/sebiweb/other/OtherAction.do?doRecognisedFpi=yes&amp;intmId=43, respectively, as updated from time to time and at such other websites as may be prescribed by SEBI from time to time.</w:t>
       </w:r>
     </w:p>
     <w:p>
@@ -2078,7 +2078,7 @@
     </w:p>
     <w:p>
       <w:r>
-        <w:t>In relation to Bids (other than Bids by Anchor Investors and RIIs) submitted to a member of the Syndicate, the list of branches of the SCSBs at the Specified Locations named by the respective SCSBs to receive deposits of Bid cum Application Forms from the members of the Syndicate is available on the website of the SEBI at www.sebi.gov.in/sebiweb/other/OtherAction.do?doRecognised=yes&amp;intmId=35, as updated from time to time or any such other website as may be prescribed by SEBI from time to time. For more information on such branches collecting Bid cum Application Forms from the Syndicate at Specified Locations, see the website of the SEBI at www.sebi.gov.in/sebiweb/other/OtherAction.do?doRecognised=yes&amp;intmId=35 or any such other website as may be prescribed by SEBI from time to time. Registered Brokers Bidders can submit ASBA Forms in the Offer using the stockbroker network of the stock exchange, i.e., through the Registered Brokers at the Broker Centres. The list of the Registered Brokers eligible to accept ASBA Forms, including details such as postal address, telephone number and e-mail address, is provided on the websites of the Stock Exchanges at www.bseindia.com and www.nseindia.com, as updated from time to time. Registrar and Share Transfer Agents The list of the RTAs eligible to accept ASBA Forms at the Designated RTA Locations, including details such as address, telephone number and e-mail address, is provided on the websites of the Stock Exchanges at www.bseindia.com/Static/Markets/PublicIssues/RtaDp.aspx? and www.nseindia.com/products/content/equities/ipos/asba_procedures.htm, respectively, as updated from time to time. Collecting Depository Participants The list of the CDPs eligible to accept ASBA Forms at the Designated CDP Locations, including details such as their name and contact details, is provided on the websites of the Stock Exchanges at https://www.bseindia.com/Static/PublicIssues/RtaDp.aspx and https://www.nseindia.com/products/content/equities/ipos/asba_procedures.htm, respectively, as updated from time to time. Experts Except as stated below, our Company has not obtained any expert opinions: Our Company has received the written consent dated November 27, 2025 from our Statutory Auditors, Kirtane &amp; Pandit, LLP, Chartered Accountants, to include their name as required under section 26 (5) of the Companies Act, 2013 read with SEBI ICDR Regulations, in this Red Herring Prospectus and as an “expert” as defined under section 2(38) of the Companies Act, 2013, to the extent and in their capacity as our Statutory Auditors, and in respect of their (i) examination report dated October 18, 2025 on the Restated Financial Statements; and (ii) the statement of special tax benefits available to the Company and its shareholders under the direct and indirect tax laws in India dated November 27, 2025, included in this Red Herring Prospectus and (iii) any other certificates as may be required for the purposes of the Offer, and such consent has not been withdrawn as on the date of this Red Herring Prospectus. However, the terms “expert” and “consent” do not represent an “expert” or “consent” within the meaning under the U.S. Securities Act. Our Company has received written consent dated November 27, 2025 from Jamie Stone, to include their name as required under section 26 of the Companies Act, 2013 read with SEBI ICDR Regulations, in this Red Herring Prospectus, and as an “expert” as defined under section 2(38) of the Companies Act, 2013 to the extent and in their capacity as an independent chartered engineer in respect of information certified by them, as included in this Red Herring Prospectus; and such consent has not been withdrawn as on the date of this Red Herring Prospectus. Our Company has received written consent dated December 10, 2025 from Kanj &amp; Umbrella Holdings Private Limited, independent practicing company secretary, to include their name as required under Section 26 of the Companies Act, 2013 in this Red Herring Prospectus and as an ‘expert’ as defined under Section 2(38) of Companies Act, 2013 in respect of the certificate issued in their capacity as a practicing company secretary to our Company, and such consent has not been withdrawn as on the date of this Red Herring Prospectus.</w:t>
+        <w:t>In relation to Bids (other than Bids by Anchor Investors and RIIs) submitted to a member of the Syndicate, the list of branches of the SCSBs at the Specified Locations named by the respective SCSBs to receive deposits of Bid cum Application Forms from the members of the Syndicate is available on the website of the SEBI at www.sebi.gov.in/sebiweb/other/OtherAction.do?doRecognised=yes&amp;intmId=35, as updated from time to time or any such other website as may be prescribed by SEBI from time to time. For more information on such branches collecting Bid cum Application Forms from the Syndicate at Specified Locations, see the website of the SEBI at www.sebi.gov.in/sebiweb/other/OtherAction.do?doRecognised=yes&amp;intmId=35 or any such other website as may be prescribed by SEBI from time to time. Registered Brokers Bidders can submit ASBA Forms in the Offer using the stockbroker network of the stock exchange, i.e., through the Registered Brokers at the Broker Centres. The list of the Registered Brokers eligible to accept ASBA Forms, including details such as postal address, telephone number and e-mail address, is provided on the websites of the Stock Exchanges at www.bseindia.com and www.nseindia.com, as updated from time to time. Registrar and Share Transfer Agents The list of the RTAs eligible to accept ASBA Forms at the Designated RTA Locations, including details such as address, telephone number and e-mail address, is provided on the websites of the Stock Exchanges at www.bseindia.com/Static/Markets/PublicIssues/RtaDp.aspx? and www.nseindia.com/products/content/equities/ipos/asba_procedures.htm, respectively, as updated from time to time. Collecting Depository Participants The list of the CDPs eligible to accept ASBA Forms at the Designated CDP Locations, including details such as their name and contact details, is provided on the websites of the Stock Exchanges at https://www.bseindia.com/Static/PublicIssues/RtaDp.aspx and https://www.nseindia.com/products/content/equities/ipos/asba_procedures.htm, respectively, as updated from time to time. Experts Except as stated below, our Company has not obtained any expert opinions: Our Company has received the written consent dated November 27, 2025 from our Statutory Auditors, Kirtane &amp; Pandit, LLP, Chartered Accountants, to include their name as required under section 26 (5) of the Companies Act, 2013 read with SEBI ICDR Regulations, in this Red Herring Prospectus and as an “expert” as defined under section 2(38) of the Companies Act, 2013, to the extent and in their capacity as our Statutory Auditors, and in respect of their (i) examination report dated October 18, 2025 on the Restated Financial Statements; and (ii) the statement of special tax benefits available to the Company and its shareholders under the direct and indirect tax laws in India dated November 27, 2025, included in this Red Herring Prospectus and (iii) any other certificates as may be required for the purposes of the Offer, and such consent has not been withdrawn as on the date of this Red Herring Prospectus. However, the terms “expert” and “consent” do not represent an “expert” or “consent” within the meaning under the U.S. Securities Act. Our Company has received written consent dated November 27, 2025 from Jamie Stone, to include their name as required under section 26 of the Companies Act, 2013 read with SEBI ICDR Regulations, in this Red Herring Prospectus, and as an “expert” as defined under section 2(38) of the Companies Act, 2013 to the extent and in their capacity as an independent chartered engineer in respect of information certified by them, as included in this Red Herring Prospectus; and such consent has not been withdrawn as on the date of this Red Herring Prospectus. Our Company has received written consent dated December 10, 2025 from Kanj &amp; Umbrella Holdings Private Limited (83), independent practicing company secretary, to include their name as required under Section 26 of the Companies Act, 2013 in this Red Herring Prospectus and as an ‘expert’ as defined under Section 2(38) of Companies Act, 2013 in respect of the certificate issued in their capacity as a practicing company secretary to our Company, and such consent has not been withdrawn as on the date of this Red Herring Prospectus.</w:t>
       </w:r>
     </w:p>
     <w:p>
@@ -2096,7 +2096,7 @@
     </w:p>
     <w:p>
       <w:r>
-        <w:t>Statutory Auditors to our Company Kirtane &amp; Pandit, LLP, Chartered Accountants 5 th 123, MG Road, Sector 5, New Delhi – 110 001 Maharashtra, India E-mail : dakota.mills@example.com Telephone : +91 90000 00013 Firm registration number : 105215W/ W100057 Peer review number : 014680 Changes in Auditors Except as stated below, there has been no change in our statutory auditors in the three years preceding the date of this Red Herring Prospectus: Particulars Date of change Reasons for change Kirtane &amp; Pandit, LLP, Chartered Accountants 5 th Floor, Gopal House Opposite Harshal Hall, above Initech Solutions Limited Karve Road, Pune – 411 038 Maharashtra, India E-mail : dakota.mills@example.com Telephone : +91 90000 00014 Firm registration number : 105215W/ W100057 Peer review number : 014680 September 30, 2024 Appointment as the Statutory Auditors of our Company Hingne Tare &amp; Associates Flat No. 102, Sai Comple September 30, 2024 Expiry of term as the statutory auditors of our Company</w:t>
+        <w:t>Statutory Auditors to our Company Kirtane &amp; Pandit, LLP, Chartered Accountants 5 th 123, MG Road, Sector 5, New Delhi – 110 001 (31) Maharashtra, India E-mail : dakota.mills@example.com Telephone : +91 90000 00013 Firm registration number : 105215W/ W100057 Peer review number : 014680 Changes in Auditors Except as stated below, there has been no change in our statutory auditors in the three years preceding the date of this Red Herring Prospectus: Particulars Date of change Reasons for change Kirtane &amp; Pandit, LLP, Chartered Accountants 5 th Floor, Gopal House Opposite Harshal Hall, above Initech Solutions Limited (84) Karve Road, Pune – 411 038 Maharashtra, India E-mail : dakota.mills@example.com Telephone : +91 90000 00014 Firm registration number : 105215W/ W100057 Peer review number : 014680 September 30, 2024 Appointment as the Statutory Auditors of our Company Hingne Tare &amp; Associates Flat No. 102, Sai Comple September 30, 2024 Expiry of term as the statutory auditors of our Company</w:t>
       </w:r>
     </w:p>
     <w:p>
@@ -2114,7 +2114,7 @@
     </w:p>
     <w:p>
       <w:r>
-        <w:t>x Shaniwar Peth, Pune – 411 030 Maharashtra, India E-mail : reese.palmer@example.com Firm registration number : 116417W Peer review number : N.A. Bankers to our Company Hooli Technologies Limited 8 th 456, Park Street, Block B, Kolkata – 700 016 Maharashtra, India Telephone : +91 90000 00015 Contact Person : Ari Flynn Website : http://commercialbanking.citibank.com Email : hayden.brooks@example.com Pied Piper Inc. No. 401, 401(A), 401(B) &amp; 402, 402(A), 402(B), 4 th 789, Brigade Road, 2nd Floor, Bengaluru – 560 025 Maharashtra, India Telephone : +91 90000 00016 Contact Person : Lane Barrett Website : www.eximbankindia.in/ Email : finley.shaw@example.com Stark Industries Limited 2401 Gen Thimmayya 101, Anna Salai, T Nagar, Chennai – 600 017 Maharashtra, India Telephone : +91 90000 00017 Contact Person : Tatum York Website : www.indusind.com/ Email : john.doe@example.com</w:t>
+        <w:t>x Shaniwar Peth, Pune – 411 030 Maharashtra, India E-mail : reese.palmer@example.com Firm registration number : 116417W Peer review number : N.A. Bankers to our Company Hooli Technologies Limited (85) 8 th 456, Park Street, Block B, Kolkata – 700 016 (32) Maharashtra, India Telephone : +91 90000 00015 Contact Person : Ari Flynn Website : http://commercialbanking.citibank.com Email : hayden.brooks@example.com Pied Piper Inc. (86) No. 401, 401(A), 401(B) &amp; 402, 402(A), 402(B), 4 th 789, Brigade Road, 2nd Floor, Bengaluru – 560 025 (33) Maharashtra, India Telephone : +91 90000 00016 Contact Person : Lane Barrett Website : www.eximbankindia.in/ Email : finley.shaw@example.com Stark Industries Limited (87) 2401 Gen Thimmayya 101, Anna Salai, T Nagar, Chennai – 600 017 (34) Maharashtra, India Telephone : +91 90000 00017 Contact Person : Tatum York Website : www.indusind.com/ Email : john.doe@example.com (21)</w:t>
       </w:r>
     </w:p>
     <w:p>
@@ -2132,7 +2132,7 @@
     </w:p>
     <w:p>
       <w:r>
-        <w:t>Pied Piper Inc. ICICI Bank, CBG, 3 rd 202, FC Road, Shivajinagar, Pune – 411 005 Maharashtra, India Telephone : +91 90000 00018 Contact Person : Jules Pratt Website : www.icicibank.com Email : jane.smith@example.com</w:t>
+        <w:t>Pied Piper Inc. (46) ICICI Bank, CBG, 3 rd 202, FC Road, Shivajinagar, Pune – 411 005 (35) Maharashtra, India Telephone : +91 90000 00018 Contact Person : Jules Pratt Website : www.icicibank.com Email : jane.smith@example.com (22)</w:t>
       </w:r>
     </w:p>
     <w:p>
@@ -2150,7 +2150,7 @@
     </w:p>
     <w:p>
       <w:r>
-        <w:t>Globex Industries Limited 5 th 303, SG Highway, Thaltej, Ahmedabad – 380 054 Maharashtra, India Telephone : +91 90000 00019 Contact Person : Sasha Bloom Website : www.hdfcbank.com Email : peter.parker@example.com State Bank of India, Industrial Finance Branch Tara 404, Link Road, Andheri West, Mumbai – 400 053 Maharashtra, India Telephone : +91 90000 00020 Contact Person : Corey Vance Website : www.sbi.co.in Email : alex.morgan@example.com Wayne Enterprises Limited Ground Floor, Kubera Chambers Opp. Sancheti Hospital Shivajinagar, Pune – 41l 005 Maharashtra, India Telephone : +91 90000 00001 Contact Person : Toby Hines Website : www.federalbank.co.in Email : taylor.brown@example.com Oscorp Limited The Capital Unit no. 1601, B- wing BKC, Mumbai Maharashtra India Telephone : +91 90000 00002 Contact Person : Briar Kent Website : www.bajajfinance.com Email : jordan.lee@example.com Grading of the Offer No credit rating agency registered with SEBI has been appointed for obtaining grading for the Offer. Appraising Entity No appraising entity has been appointed in relation to the Offer. Monitoring Agency As the size of the Fresh Issue exceeds ₹ 1,000.00 million, our Company has appointed a credit rating agency registered with SEBI, namely, Initech Solutions Limited, as a monitoring agency to monitor the utilisation of the Net Proceeds, in accordance with Regulation 41 of the SEBI ICDR Regulations. For details in relation to the proposed utilisation of the Net Proceeds, see “ Objects of the Offer ” on page 106. Credit Rating As the Offer is of Equity Shares, credit rating is not required. Debenture Trustee As the Offer is of Equity Shares, the appointment of trustee is not required. Green Shoe Option No green shoe option is contemplated under the Offer. Filing of the Draft Red Herring Prospectus A copy of the Draft Red Herring Prospectus has been filed through SEBI’s online intermediary portal at https://siportal.sebi.gov.in, as specified in Regulation 25(8) of the SEBI ICDR Regulations and in accordance with SEBI ICDR Master Circular. It has also been filed at: Securities and Exchange Board of Vance Refrigeration LLC Finance Department Division of Issues and Listing SEBI Bhavan, 505, Banjara Hills, Road No 12, Hyderabad – 500 034, Maharashtra, India Filing of this Red Herring Prospectus and Prospectus</w:t>
+        <w:t>Globex Industries Limited (42) 5 th 303, SG Highway, Thaltej, Ahmedabad – 380 054 (36) Maharashtra, India Telephone : +91 90000 00019 Contact Person : Sasha Bloom Website : www.hdfcbank.com Email : peter.parker@example.com (23) State Bank of India, Industrial Finance Branch Tara 404, Link Road, Andheri West, Mumbai – 400 053 (37) Maharashtra, India Telephone : +91 90000 00020 Contact Person : Corey Vance Website : www.sbi.co.in Email : alex.morgan@example.com (24) Wayne Enterprises Limited (88) Ground Floor, Kubera Chambers Opp. Sancheti Hospital Shivajinagar, Pune – 41l 005 Maharashtra, India Telephone : +91 90000 00001 (21) Contact Person : Toby Hines Website : www.federalbank.co.in Email : taylor.brown@example.com (25) Oscorp Limited (89) The Capital Unit no. 1601, B- wing BKC, Mumbai Maharashtra India Telephone : +91 90000 00002 (22) Contact Person : Briar Kent Website : www.bajajfinance.com Email : jordan.lee@example.com (26) Grading of the Offer No credit rating agency registered with SEBI has been appointed for obtaining grading for the Offer. Appraising Entity No appraising entity has been appointed in relation to the Offer. Monitoring Agency As the size of the Fresh Issue exceeds ₹ 1,000.00 million, our Company has appointed a credit rating agency registered with SEBI, namely, Initech Solutions Limited (44), as a monitoring agency to monitor the utilisation of the Net Proceeds, in accordance with Regulation 41 of the SEBI ICDR Regulations. For details in relation to the proposed utilisation of the Net Proceeds, see “ Objects of the Offer ” on page 106. Credit Rating As the Offer is of Equity Shares, credit rating is not required. Debenture Trustee As the Offer is of Equity Shares, the appointment of trustee is not required. Green Shoe Option No green shoe option is contemplated under the Offer. Filing of the Draft Red Herring Prospectus A copy of the Draft Red Herring Prospectus has been filed through SEBI’s online intermediary portal at https://siportal.sebi.gov.in, as specified in Regulation 25(8) of the SEBI ICDR Regulations and in accordance with SEBI ICDR Master Circular. It has also been filed at: Securities and Exchange Board of Vance Refrigeration LLC (90) Finance Department Division of Issues and Listing SEBI Bhavan, 505, Banjara Hills, Road No 12, Hyderabad – 500 034 (38), Maharashtra, India Filing of this Red Herring Prospectus and Prospectus</w:t>
       </w:r>
     </w:p>
     <w:p>

</xml_diff>

<commit_message>
Switch FakeFactory to output unambiguous bracketed tokens ([PERSON_001], [EMAIL_001], etc.) for 100% clear redaction proof
</commit_message>
<xml_diff>
--- a/KSH_PII_Redacted_RHP.docx
+++ b/KSH_PII_Redacted_RHP.docx
@@ -12,7 +12,7 @@
     </w:p>
     <w:p>
       <w:r>
-        <w:t>(Please scan this QR Code to view this Red Herring Prospectus) RED HERRING PROSPECTUS Dated December 10, 2025 Please read section 32 of the Companies Act, 2013 100% Book Built Offer Acme Corp Ltd. CORPORATE IDENTITY NUMBER : U28129PN1979PLC141032 REGISTERED OFFICE C ORPORATE OFFICE CONTACT PERSON E-MAIL AND TELEPHONE WEBSITE 123, MG Road, Sector 5, New Delhi – 110 001 Maharashtra, India 201, 456, Park Street, Block B, Kolkata – 700 016 Maharashtra, India John Doe Company Secretary and Compliance Officer Email : john.doe@example.com Telephone : +91 90000 00001 www.kshinternational. com OUR PROMOTERS: Jane Smith, Peter Parker, Alex Morgan, Taylor Brown, Jordan Lee, Globex Industries Limited, Umbrella Holdings Private Limited, Initech Solutions Limited, Hooli Technologies Limited, Pied Piper Inc., Stark Industries Limited AND Wayne Enterprises Limited DETAILS OF THE OFFER TO PUBLIC TYPE SIZE OF THE FRESH ISSUE SIZE OF THE OFFER FOR SALE TOTAL OFFER SIZE ELIGIBILITY AND SHARE RESERVATION AMONG QIBs, NIIs AND RIIs Fresh Issue and Offer for Sale Up to [●] Equity Shares of face value of ₹ 5 each aggregating up to ₹ 4,200.00 million Up to [●] Equity Shares of face value of ₹ 5 each aggregating up to ₹ 2,900.00 million Up to [●] Equity Shares of face value of ₹ 5 each aggregating up to ₹ 7,100.00 million The Offer is being made pursuant to Regulation 6(1) of the Securities and Exchange Board of India (Issue of Capital and Disclosure Requirements) Regulations, 2018 (“ SEBI ICDR Regulations ”). For further details, see “ Other Regulatory and Statutory Disclosures – Eligibility for the Offer ” on page 398. For details of share reservation among Qualified Institutional Buyers, Non-Institutional Investors and Retail Individual Investors, see “ Offer Structure ” on page 417. DETAILS OF THE PROMOTER SELLING SHAREHOLDERS, OFFER FOR SALE AND WEIGHTED AVERAGE COST OF ACQUISITION PER EQUITY SHARE</w:t>
+        <w:t>(Please scan this QR Code to view this Red Herring Prospectus) RED HERRING PROSPECTUS Dated December 10, 2025 Please read section 32 of the Companies Act, 2013 100% Book Built Offer [COMPANY_001] CORPORATE IDENTITY NUMBER : U28129PN1979PLC141032 REGISTERED OFFICE C ORPORATE OFFICE CONTACT PERSON E-MAIL AND TELEPHONE WEBSITE [ADDRESS_001] Maharashtra, India 201, [ADDRESS_002] Maharashtra, India [PERSON_001] Company Secretary and Compliance Officer Email : [EMAIL_001] Telephone : [PHONE_001] www.kshinternational. com OUR PROMOTERS: [PERSON_002], [PERSON_003], [PERSON_004], [PERSON_005], [PERSON_006], [COMPANY_002], [COMPANY_003], [COMPANY_004], [COMPANY_005], [COMPANY_006], [COMPANY_007] AND [COMPANY_008] DETAILS OF THE OFFER TO PUBLIC TYPE SIZE OF THE FRESH ISSUE SIZE OF THE OFFER FOR SALE TOTAL OFFER SIZE ELIGIBILITY AND SHARE RESERVATION AMONG QIBs, NIIs AND RIIs Fresh Issue and Offer for Sale Up to [●] Equity Shares of face value of ₹ 5 each aggregating up to ₹ 4,200.00 million Up to [●] Equity Shares of face value of ₹ 5 each aggregating up to ₹ 2,900.00 million Up to [●] Equity Shares of face value of ₹ 5 each aggregating up to ₹ 7,100.00 million The Offer is being made pursuant to Regulation 6(1) of the Securities and Exchange Board of India (Issue of Capital and Disclosure Requirements) Regulations, 2018 (“ SEBI ICDR Regulations ”). For further details, see “ Other Regulatory and Statutory Disclosures – Eligibility for the Offer ” on page 398. For details of share reservation among Qualified Institutional Buyers, Non-Institutional Investors and Retail Individual Investors, see “ Offer Structure ” on page 417. DETAILS OF THE PROMOTER SELLING SHAREHOLDERS, OFFER FOR SALE AND WEIGHTED AVERAGE COST OF ACQUISITION PER EQUITY SHARE</w:t>
       </w:r>
     </w:p>
     <w:p>
@@ -30,7 +30,7 @@
     </w:p>
     <w:p>
       <w:r>
-        <w:t>NAME OF THE PROMOTER SELLING SHAREHOLDER TYPE AGGREGATE AMOUNT OF OFFER FOR SALE ( ₹ IN MILLION) WEIGHTED AVERAGE COST OF ACQUISITION PER EQUITY SHARE OF FACE VALUE OF ₹ 5 EACH (IN ₹ ) *# Jane Smith Promoter Selling Shareholder 1,528.00 1.36 Peter Parker Promoter Selling Shareholder 422.00 1.51 Alex Morgan Promoter Selling Shar 475.00 1.41</w:t>
+        <w:t>NAME OF THE PROMOTER SELLING SHAREHOLDER TYPE AGGREGATE AMOUNT OF OFFER FOR SALE ( ₹ IN MILLION) WEIGHTED AVERAGE COST OF ACQUISITION PER EQUITY SHARE OF FACE VALUE OF ₹ 5 EACH (IN ₹ ) *# [PERSON_002] Promoter Selling Shareholder 1,528.00 1.36 [PERSON_003] Promoter Selling Shareholder 422.00 1.51 [PERSON_004] Promoter Selling Shar 475.00 1.41</w:t>
       </w:r>
     </w:p>
     <w:p>
@@ -48,7 +48,7 @@
     </w:p>
     <w:p>
       <w:r>
-        <w:t>eholder Taylor Brown Promoter Selling Shareholder 475.00 1.35 * As certified by Oscorp Limited, Chartered Accountants, our Statutory Auditors, by way of their certificate dated December 10, 2025. For further details, see “Summary of the Offer Document – Average cost of acquisition of Equity Shares by our Promoters and the Promoter Selling Shareholders” on page 26 . # As adjusted for Split of Equity Shares and Bonus Issue. RISKS IN RELATION TO THE FIRST OFFER This being the first public offering of equity shares of our Company, there has been no formal market for the Equity Shares. The face value of the Equity Shares is ₹ 5 each. The Floor Price, Cap Price and Offer Price (as determined by our Company, in consultation with the Book Running Lead Managers, in accordance with the SEBI ICDR Regulations) and on the basis of the assessment of market demand for the Equity Shares by way of the Book Building Process, as stated under “ Basis for the Offer Price ” on page 124, should not be considered to be indicative of the market price of the Equity Shares after the Equity Shares are listed. No assurance can be given regarding an active an d/or sustained trading in the Equity Shares nor regarding the price at which the Equity Shares will be traded after listing. GENERAL RISKS Investments in equity and equity-related securities involve a degree of risk and Bidders should not invest any funds in the Offer unless they can afford to take the risk of losing their entire investment. Bidders are advised to read the risk factors carefully before taking an investment decision in the Offer. For taking an investment decision, Bidders must rely on their own examination of our Company and the Offer, including the risks involved. The Equity Shares offered in the Offer have not been recommended or approved by the Securities and Exchange Board of India (“ SEBI ”), nor does SEBI guarantee the accuracy or adequacy of the contents of this Red Herring Prospectus. Specific attention of the investors is invited to “ Risk Factors ” on page 28. ISSUER’S AND PROMOTER SELLING SHAREHOLDERS’ ABSOLUTE RESPONSIBILITY Our Company, having made all reasonable inquiries, accepts responsibility for and confirms that this Red Herring Prospectus contains all information with regard to our Company and the Offer, which is material in the context of the Offer, that the information contained in this Red Herring Prospectus is true and correct in all material aspects and is not misleading in any material respect, that the opinions and intentions expressed herein are honestly held and that there are no other facts, the omission of which makes this Red Herring Prospectus as a whole or any of such information or the expression of any such opinions or intentions misleading in any material respect. Each of the Promoter Selling Shareholders, severally and not jointly, accepts responsibility for and confirms the statements specifically made or confirmed by them in this Red Herring Prospectus solely to the extent of information specifically pertaining to themselves and the Equity Shares offered by them in the Offer for Sale and assumes responsibility that such statements are true and correct in all material respects and are not misleading in any material respect. Each of the Promoter Selling Shareholders, severally and not jointly, assumes no responsibility for any other statements, including, inter alia, any and all of the statements made by or relating to our Company or its business or any other Promoter Selling Shareholder</w:t>
+        <w:t>eholder [PERSON_005] Promoter Selling Shareholder 475.00 1.35 * As certified by [COMPANY_009], Chartered Accountants, our Statutory Auditors, by way of their certificate dated December 10, 2025. For further details, see “Summary of the Offer Document – Average cost of acquisition of Equity Shares by our Promoters and the Promoter Selling Shareholders” on page 26 . # As adjusted for Split of Equity Shares and Bonus Issue. RISKS IN RELATION TO THE FIRST OFFER This being the first public offering of equity shares of our Company, there has been no formal market for the Equity Shares. The face value of the Equity Shares is ₹ 5 each. The Floor Price, Cap Price and Offer Price (as determined by our Company, in consultation with the Book Running Lead Managers, in accordance with the SEBI ICDR Regulations) and on the basis of the assessment of market demand for the Equity Shares by way of the Book Building Process, as stated under “ Basis for the Offer Price ” on page 124, should not be considered to be indicative of the market price of the Equity Shares after the Equity Shares are listed. No assurance can be given regarding an active an d/or sustained trading in the Equity Shares nor regarding the price at which the Equity Shares will be traded after listing. GENERAL RISKS Investments in equity and equity-related securities involve a degree of risk and Bidders should not invest any funds in the Offer unless they can afford to take the risk of losing their entire investment. Bidders are advised to read the risk factors carefully before taking an investment decision in the Offer. For taking an investment decision, Bidders must rely on their own examination of our Company and the Offer, including the risks involved. The Equity Shares offered in the Offer have not been recommended or approved by the Securities and Exchange Board of India (“ SEBI ”), nor does SEBI guarantee the accuracy or adequacy of the contents of this Red Herring Prospectus. Specific attention of the investors is invited to “ Risk Factors ” on page 28. ISSUER’S AND PROMOTER SELLING SHAREHOLDERS’ ABSOLUTE RESPONSIBILITY Our Company, having made all reasonable inquiries, accepts responsibility for and confirms that this Red Herring Prospectus contains all information with regard to our Company and the Offer, which is material in the context of the Offer, that the information contained in this Red Herring Prospectus is true and correct in all material aspects and is not misleading in any material respect, that the opinions and intentions expressed herein are honestly held and that there are no other facts, the omission of which makes this Red Herring Prospectus as a whole or any of such information or the expression of any such opinions or intentions misleading in any material respect. Each of the Promoter Selling Shareholders, severally and not jointly, accepts responsibility for and confirms the statements specifically made or confirmed by them in this Red Herring Prospectus solely to the extent of information specifically pertaining to themselves and the Equity Shares offered by them in the Offer for Sale and assumes responsibility that such statements are true and correct in all material respects and are not misleading in any material respect. Each of the Promoter Selling Shareholders, severally and not jointly, assumes no responsibility for any other statements, including, inter alia, any and all of the statements made by or relating to our Company or its business or any other Promoter Selling Shareholder</w:t>
       </w:r>
     </w:p>
     <w:p>
@@ -66,7 +66,7 @@
     </w:p>
     <w:p>
       <w:r>
-        <w:t>or any other person, in this Red Herring Prospectus. LISTING The Equity Shares offered through this Red Herring Prospectus are proposed to be listed on the Vance Refrigeration LLC (“ BSE ”) and National Stock Exchange of Dunder Mifflin Private Limited (“ NSE ”, together with BSE, the “ Stock Exchanges ”). For the purposes of the Offer, the Designated Stock Exchange is BSE. BOOK RUNNING LEAD MANAGERS NAME AND LOGO OF THE BOOK RUNNING LEAD MANAGER Soylent Corp Limited Sam Wilson/ Chris Blake Email: jane.smith@example.com Telephone: +91 90000 00002 Tyrell Corporation Morgan Reed/ Casey Quinn Email: peter.parker@example.com Telephone: +91 90000 00003 REGISTRAR TO THE OFFER NAME OF THE REGISTRAR Cyberdyne Systems Limited (Massive Dynamic Inc.) Riley Adams Telephone : +91 90000 00004 E-mail : alex.morgan@example.com BID/OFFER PERIOD ANCHOR INVESTOR BIDDING DATE (1) Monday, December 15, 2025 BID/OFFE R OPENS ON Tuesday, December 16, 2025 BID/OFFER CLOSES ON (2) Thursday, December 18, 2025 (1) Our Company, in consultation with the Book Running Lead Managers, may consider participation by Anchor Investors in accordance with the SEBI ICDR Regulations. (2) The UPI mandate end time and date shall be at 5:00 p.m. on Bid/Offer Closing Day.</w:t>
+        <w:t>or any other person, in this Red Herring Prospectus. LISTING The Equity Shares offered through this Red Herring Prospectus are proposed to be listed on the [COMPANY_010] (“ BSE ”) and National Stock Exchange of [COMPANY_011] (“ NSE ”, together with BSE, the “ Stock Exchanges ”). For the purposes of the Offer, the Designated Stock Exchange is BSE. BOOK RUNNING LEAD MANAGERS NAME AND LOGO OF THE BOOK RUNNING LEAD MANAGER [COMPANY_012] [PERSON_007]/ [PERSON_008] Email: [EMAIL_002] Telephone: [PHONE_002] [COMPANY_013] [PERSON_009]/ [PERSON_010] Email: [EMAIL_003] Telephone: [PHONE_003] REGISTRAR TO THE OFFER NAME OF THE REGISTRAR [COMPANY_014] ([COMPANY_015]) [PERSON_011] Telephone : [PHONE_004] E-mail : [EMAIL_004] BID/OFFER PERIOD ANCHOR INVESTOR BIDDING DATE (1) Monday, December 15, 2025 BID/OFFE R OPENS ON Tuesday, December 16, 2025 BID/OFFER CLOSES ON (2) Thursday, December 18, 2025 (1) Our Company, in consultation with the Book Running Lead Managers, may consider participation by Anchor Investors in accordance with the SEBI ICDR Regulations. (2) The UPI mandate end time and date shall be at 5:00 p.m. on Bid/Offer Closing Day.</w:t>
       </w:r>
     </w:p>
     <w:p>
@@ -84,7 +84,7 @@
     </w:p>
     <w:p>
       <w:r>
-        <w:t>RED HERRING PROSPECTUS Dated December 10, 2025 Please read section 32 of the Companies Act, 2013 100% Book Built Offer Acme Corp Ltd. Our Company was originally incorporated as “ Aperture Science LLC ” under the provisions of the Companies Act, 1956, pursuant to a certificate of incorporation dated July 30, 1979, issued by the Registrar of Companies, Maharashtra at Bombay. Subsequently, the name of our Company was changed from “ Aperture Science LLC ” to “ Wonka Industries Limited ” pursuant to a resolution dated June 1, 1996 passed by our Board and a resolution dated June 24, 1996 passed by our shareholders, post which a fresh certificate of incorporation dated July 4, 1996 was issued by Registrar of Companies Maharashtra at Mumbai pursuant to change of name under the Companies Act, 1956. Further, pursuant to a special resolution passed by our Shareholders on January 13, 2011 which was confirmed by an order of the regional director dated August 16, 2011, the registered office of our Company was shifted from the jurisdiction of Registrar of Companies, Maharashtra at Mumbai to the jurisdiction of the Registrar of Companies, Maharashtra at Pune, and a certificate of registration of the order of regional director confirming transfer of the registered office within the same state was issued to us on October 13, 2011, by the RoC. On the conversion of our Company from a private limited company to a public limited company, pursuant to a resolution passed by our Board on December 11, 2024 and a special resolution passed by our Shareholders on December 19, 2024, the name of our Company was changed to “ Acme Corp Ltd. ” and a fresh certificate of incorporation was issued by the Registrar of Companies, Central Processing Centre on January 20, 2025. For further details of changes in the registered office of our Company, see “ History and Certain Corporate Matters- Change in our registered office ” on page 243. Corporate Identity Number : U28129PN1979PLC141032 Registered Office : 789, Brigade Road, 2nd Floor, Bengaluru – 560 025, Maharashtra, India; Corporate Office : 201, 101, Anna Salai, T Nagar, Chennai – 600 017, Maharashtra, India; Contact Person : John Doe, Company Secretary and Compliance Officer; Telephone: +91 90000 00005; E-mail: john.doe@example.com; Website : www.kshinternational.com OUR PROMOTERS: Jane Smith, Peter Parker, Alex Morgan, Taylor Brown, Jordan Lee, Globex Industries Limited, Umbrella Holdings Private Limited, Initech Solutions Limited, Hooli Technologies Limited, Pied Piper Inc., Stark Industries Limited AND Wayne Enterprises Limited INITIAL PUBLIC OFFERING OF UP TO [●] EQUITY SHARES OF FACE VALUE OF ₹ 5 EACH (“EQUITY SHARES”) OF Acme Corp Ltd. (“COMPANY” OR “ISSUER”) FOR CASH AT A PRICE OF ₹ [●] PER EQUITY SHARE (INCLUDING A SHARE PREMIUM OF ₹ [●] PER EQUITY SHARE) (“OFFER PRICE”) AGGREGATING UP TO ₹ 7,100.00 MILLION (THE “OFFER”) COMPRISING A FRESH ISSUE OF UP TO [●] EQUITY SHARES OF FACE VALUE OF ₹ 5 EACH AGGREGATING UP TO ₹ 4,200.00 MILLION (“FRESH ISSUE”) AND AN OFFER FOR SALE OF UP TO [●] EQUITY SHARES OF FACE VALUE OF ₹ [●] EACH (“OFFERED SHARES”) AGGREGATING UP TO ₹ 2,900.00 MILLION, COMPRISING UP TO [●] EQUITY SHARES OF FACE VALUE OF ₹ 5 EACH BY Jane Smith AGGREGATING UP TO ₹ 1,528.00 MILLION, UP TO [●] EQUITY SHARES OF FACE VALUE OF ₹ 5 EACH BY Peter Parker AGGREGATING UP TO ₹ 422.00 MILLION, UP TO [●] EQUITY SHARES OF FACE VALUE OF ₹ 5 EACH BY Alex Morgan AGGREGATING UP TO ₹ 475.00 MILLION AND UP TO [●] EQUITY SHARES OF FACE VALUE OF ₹ 5 EACH BY Taylor Brown AGGREGATING UP TO ₹ 475.00 MILLION (COLLECTIVELY, “PROMOTER SELLING SHAREHOLDERS” AND SUCH OFFER FOR SALE OF EQUITY SHARES OF FACE VALUE OF ₹ 5 EACH BY THE PROMOTER SELLING SHAREHOLDERS, THE “OFFER FOR SALE”). THE OFFER SHALL CONSTITUTE [●]% OF THE POST-OFFER PAID UP EQUITY SHARE CAPITAL OF OUR COMPANY. THE FACE VALUE OF THE EQUITY SHARES IS ₹ 5 EACH. THE OFFER PRICE IS [●] TIMES THE FACE VALUE OF THE EQUITY SHARES. THE PRICE BAND, AND MINIMUM BID LOT WILL BE DECIDED BY OUR COMPANY, IN CONSULTATION WITH THE BOOK RUNNING LEAD MANAGERS, AND WILL BE ADVERTISED IN ALL EDITIONS OF FINANCIAL EXPRESS (A WIDELY CIRCULATED ENGLISH NATIONAL DAILY NEWSPAPER), ALL EDITIONS OF JANSATTA (A WIDELY CIRCULATED HINDI NATIONAL DAILY NEWSPAPER) AND PUNE EDITION OF LOKSATTA (A WIDELY CIRCULATED MARATHI DAILY NEWSPAPER, MARATHI BEING THE REGIONAL LANGUAGE OF MAHARASHTRA WHERE OUR REGISTERED OFFICE IS LOCATED), AT LEAST TWO WORKING DAYS PRIOR TO THE BID/OFFER OPENING DATE AND SHALL BE MADE AVAILABLE TO THE STOCK EXCHANGES FOR UPLOADING ON THEIR RESPECTIVE WEBSITES IN ACCORDANCE WITH SECURITIES AND EXCHANGE BOARD OF INDIA (ISSUE OF CAPITAL AND DISCLOSURE REQUIREMENTS) REGULATIONS, 2018, AS AMENDED (THE “SEBI ICDR REGULATIONS”). In case of any revision in the Price Band, the Bid/Offer Period will be extended by at least three additional Working Days after such revision in the Price Band, subject to the Bid/Offer Period not exceeding 10 Working Days. In cases of force majeure , banking strike or similar unforeseen circumstances, our Company may, in consultation with the Book Running Lead Managers, for reasons to be recorded in writing, extend the Bid /Offer Period for a minimum of one Working Day, subject to the Bid/Offer Period not exceeding 10 Working Days. Any revision in the Price Band and the revised Bid/Offer Period, if applicable, shall be widely disseminated by notification to the Stock Exchanges, by issuing a press release, and also by indicating the change on the respective websites of the Book Running Lead Managers and at the terminals of the members of the Syndicate and by intimation to Designated Intermediaries and the Sponsor Banks, as applicable. The Offer is being made in terms of Rule 19(2)(b) of the Securities Contracts (Regulation) Rules, 1957, as amended (the “ SCRR ”), read with Regulation 31 of the SEBI ICDR Regulations. The Offer is being made through the Book Building Process in accordance with Regulation 6(1) of the SEBI ICDR Regulations wherein not more than 50% of the Offer shall be available for allocation on a proportionate basis to Qualified Institutional Buyers (“ QIBs ”) (the “ QIB Portion ”), provided that our Company may, in consultation with the BRLMs, allocate up to 60% of the QIB Portion to Anchor Investors on a discretionary basis, in accordance with the SEBI ICDR Regulations (the “ Anchor Investor Portion ”), of which 40% shall be reserved in the following manner (i) 33.33% of the Anchor Investor Portion shall be reserved for domestic Mutual Funds; and (ii) 6.67% of the Anchor Investor Portion shall be reserved for Life Insurance Companies and Pension Funds, subject to valid Bids being received from domestic Mutual Funds, Life Insurance Companies and Pension Funds, as applicable, at or above the Anchor Investor Allocation Price. Any under-subscription in the Life Insurance Companies and Pension Funds category specified in (ii) above may be allocated to domestic Mutual Funds, in accordance with the SEBI ICDR Regulations. In the event of under-subscription or non-allocation in the Anchor Investor Portion, the balance Equity Shares shall be added to the QIB Portion (other than the Anchor Investor Portion) (the “ Net QIB Portion ”). Further, 5% of the Net QIB Portion shall be available for allocation on a proportionate basis to Mutual Funds only, subject to valid Bids being received at or above the Offer Price, and the remainder of the Net QIB Portion shall be available for allocation on a proportionate basis to all QIBs, including Mutual Funds, subject to valid Bids being received at or above the Offer Price. Further, not less than 15% of the Offer shall be available for allocation to Non-Institutional Investors (“ Non-Institutional Portion ”) of which one-third of the Non-Institutional Portion shall be available for allocation to Bidders with an application size of more than ₹ 0.20 million and up to ₹ 1.00 million and two-thirds of the Non-Institutional Portion shall be available for allocation to Bidders with an application size of more than ₹ 1.00 million and undersubscription in either of these two sub-categories of the Non-Institutional Portion may be allocated to Bidders in the other sub-category of the Non-Institutional Portion in accordance with the SEBI ICDR Regulations, subject to valid Bids being received at or above the Offer Price. Further, not less than 35% of the Offer shall be available for allocation to Retail Individual Investors (“ Retail Portion ”), in accordance with the SEBI ICDR Regulations, subject to valid Bids being received from them at or above the Offer Price. All Bidders (except Anchor Investors) shall mandatorily participate in this Offer only through the Application Supported by Blocked Amount (“ ASBA ”) process and shall provide details of their respective bank account (including UPI ID (defined hereinafter) in case of UPI Bidders (defined hereinafter) in which the Bid Amount will be blocked by the Self Certified Syndicate Banks (“ SCSBs ”) or pursuant to the UPI Mechanism, as the case may be. Anchor Investors are not permitted to participate in the Anchor Investor Portion through the ASBA process. For details, see “ Offer Procedure ” on page 420. RISKS IN RELATION TO THE FIRST OFFER This being the first public offer of Equity Shares of our Company, there has been no formal market for the Equity Shares. The face value of the Equity Shares is ₹ 5 each. The Offer Price, Floor Price or Cap Price (as determined by our Company, in consultation with the Book Running Lead Managers, in accordance with the SEBI ICDR Regulations), and on the basis of the assessment of market demand for the Equity Shares by way of the Book Building Process, as stated under “ Basis for the Offer Price ” on page 124, should not be considered to be indicative of the market price of the Equity Shares after the Equity Shares are listed. No assurance can be given regarding an active and/or sustained trading in the Equity Shares nor regarding the price at which the Equity Shares will be traded after listing. GENERAL RISK Investments in equity and equity-related securities involve a degree of risk and Bidders should not invest any funds in the Offer unless they can afford to take the risk of losing their entire investment. Bidders are advised to read the risk factors carefully before taking an investment decision in the Offer. For taking an investment decision, Bidders must rely on their own examination of our Company and the Offer, including the risks involved. The Equity Shares in the Offer have not been recommended or approved by SEBI, nor does SEBI guarantee the accuracy or adequacy of the contents of this Red Herring Prospectus. Specific attention of the Bidders is invited to “ Risk Factors ” on page 28. ISSUER’S AND PROMOTER SELLING SHAREHOLDERS’ ABSOLUTE RESPONSIBILITY Our Company, having made all reasonable inquiries, accepts responsibility for and confirms that this Red Herring Prospectus contains all information with regard to our Company and the Offer, which is material in the context of the Offer, that the information contained in this Red Herring Prospectus is true and correct in all material aspects and is not misleading in any material respect, that the opinions and intentions expressed herein are honestly held and that there are no other facts, the omission of which makes this Red Herring Prospectus as a whole or any of such information or the expression of any such opinions or intentions misleading in any material respect. Each of the Promoter Selling Shareholders, severally and not jointly, accepts responsibility for and confirms the statements specifically made or confirmed by them in this Red Herring Prospectus solely to the extent of information specifically pertaining to themselves and the Equity Shares offered by them in the Offer for Sale and assumes responsibility that such statements are true and correct in all material respects and are not misleading in any material respect. Each of the Promoter Selling Shareholders, severally and not jointly, assume no responsibility for any other statements, including, inter alia, any and all of the statements made by or relating to our Company or its business or any other Promoter Selling Shareholder or any other person(s) in this Red Herring Prospectus. LISTING The Equity Shares, offered through this Red Herring Prospectus, are proposed to be listed on the Stock Exchanges. Our Company has received in-principle approvals from BSE and NSE for listing of the Equity Shares pursuant to their letters each dated August 4, 2025, respectively. For the purposes of the Offer, the Designated Stock Exchange shall be BSE. A copy of this Red Herring Prospectus has been filed with the RoC and a copy of the Prospectus shall be filed with the RoC in accordance with Sections 26(4) and 32 of the Companies Act, 2013. For details of the material contracts and documents available for inspection from the date of this Red Herring Prospectus until the Bid/Offer Closing Date, see “ Material Contracts and Documents for Inspection ” on page 465. BOOK RUNNING LEAD Weyland Corp Limited 801 - 804, Wing A, 202, FC Road, Shivajinagar, Pune – 411 005, Maharashtra, India Tel: +91 90000 00006 E-mail: jane.smith@example.com Website: www.nuvama.com Investor grievance email: taylor.brown@example.com Contact Person: Sam Wilson/ Chris Blake SEBI Registration Number : Bluth Company LLC ICICI Venture 303, SG Highway, Thaltej, Ahmedabad – 380 054, Maharashtra, India Tel: +91 90000 00003 E-mail: peter.parker@example.com Website: www.icicisecurities.com Investor grievance email: jordan.lee@example.com Contact Person: Morgan Reed/Casey Quinn SEBI Registration Number : Sterling Cooper Limited (Massive Dynamic Inc.) C-101, Embassy 247, 1 st 404, Link Road, Andheri West, Mumbai – 400 053, (Maharashtra), India Tel: +91 90000 00004 E-mail: alex.morgan@example.com Website: www.in.mpms.mufg.com Investor grievance e-mail: alex.morgan@example.com Contact Person: Riley Adams SEBI Registration Number: INR000004058 BID/ OFFER PERIOD</w:t>
+        <w:t>RED HERRING PROSPECTUS Dated December 10, 2025 Please read section 32 of the Companies Act, 2013 100% Book Built Offer [COMPANY_001] Our Company was originally incorporated as “ [COMPANY_016] ” under the provisions of the Companies Act, 1956, pursuant to a certificate of incorporation dated July 30, 1979, issued by the Registrar of Companies, Maharashtra at Bombay. Subsequently, the name of our Company was changed from “ [COMPANY_016] ” to “ [COMPANY_017] ” pursuant to a resolution dated June 1, 1996 passed by our Board and a resolution dated June 24, 1996 passed by our shareholders, post which a fresh certificate of incorporation dated July 4, 1996 was issued by Registrar of Companies Maharashtra at Mumbai pursuant to change of name under the Companies Act, 1956. Further, pursuant to a special resolution passed by our Shareholders on January 13, 2011 which was confirmed by an order of the regional director dated August 16, 2011, the registered office of our Company was shifted from the jurisdiction of Registrar of Companies, Maharashtra at Mumbai to the jurisdiction of the Registrar of Companies, Maharashtra at Pune, and a certificate of registration of the order of regional director confirming transfer of the registered office within the same state was issued to us on October 13, 2011, by the RoC. On the conversion of our Company from a private limited company to a public limited company, pursuant to a resolution passed by our Board on December 11, 2024 and a special resolution passed by our Shareholders on December 19, 2024, the name of our Company was changed to “ [COMPANY_001] ” and a fresh certificate of incorporation was issued by the Registrar of Companies, Central Processing Centre on January 20, 2025. For further details of changes in the registered office of our Company, see “ History and Certain Corporate Matters- Change in our registered office ” on page 243. Corporate Identity Number : U28129PN1979PLC141032 Registered Office : [ADDRESS_003], Maharashtra, India; Corporate Office : 201, [ADDRESS_004], Maharashtra, India; Contact Person : [PERSON_001], Company Secretary and Compliance Officer; Telephone: [PHONE_005]; E-mail: [EMAIL_001]; Website : www.kshinternational.com OUR PROMOTERS: [PERSON_002], [PERSON_003], [PERSON_004], [PERSON_005], [PERSON_006], [COMPANY_002], [COMPANY_003], [COMPANY_004], [COMPANY_005], [COMPANY_006], [COMPANY_007] AND [COMPANY_008] INITIAL PUBLIC OFFERING OF UP TO [●] EQUITY SHARES OF FACE VALUE OF ₹ 5 EACH (“EQUITY SHARES”) OF [COMPANY_001] (“COMPANY” OR “ISSUER”) FOR CASH AT A PRICE OF ₹ [●] PER EQUITY SHARE (INCLUDING A SHARE PREMIUM OF ₹ [●] PER EQUITY SHARE) (“OFFER PRICE”) AGGREGATING UP TO ₹ 7,100.00 MILLION (THE “OFFER”) COMPRISING A FRESH ISSUE OF UP TO [●] EQUITY SHARES OF FACE VALUE OF ₹ 5 EACH AGGREGATING UP TO ₹ 4,200.00 MILLION (“FRESH ISSUE”) AND AN OFFER FOR SALE OF UP TO [●] EQUITY SHARES OF FACE VALUE OF ₹ [●] EACH (“OFFERED SHARES”) AGGREGATING UP TO ₹ 2,900.00 MILLION, COMPRISING UP TO [●] EQUITY SHARES OF FACE VALUE OF ₹ 5 EACH BY [PERSON_002] AGGREGATING UP TO ₹ 1,528.00 MILLION, UP TO [●] EQUITY SHARES OF FACE VALUE OF ₹ 5 EACH BY [PERSON_003] AGGREGATING UP TO ₹ 422.00 MILLION, UP TO [●] EQUITY SHARES OF FACE VALUE OF ₹ 5 EACH BY [PERSON_004] AGGREGATING UP TO ₹ 475.00 MILLION AND UP TO [●] EQUITY SHARES OF FACE VALUE OF ₹ 5 EACH BY [PERSON_005] AGGREGATING UP TO ₹ 475.00 MILLION (COLLECTIVELY, “PROMOTER SELLING SHAREHOLDERS” AND SUCH OFFER FOR SALE OF EQUITY SHARES OF FACE VALUE OF ₹ 5 EACH BY THE PROMOTER SELLING SHAREHOLDERS, THE “OFFER FOR SALE”). THE OFFER SHALL CONSTITUTE [●]% OF THE POST-OFFER PAID UP EQUITY SHARE CAPITAL OF OUR COMPANY. THE FACE VALUE OF THE EQUITY SHARES IS ₹ 5 EACH. THE OFFER PRICE IS [●] TIMES THE FACE VALUE OF THE EQUITY SHARES. THE PRICE BAND, AND MINIMUM BID LOT WILL BE DECIDED BY OUR COMPANY, IN CONSULTATION WITH THE BOOK RUNNING LEAD MANAGERS, AND WILL BE ADVERTISED IN ALL EDITIONS OF FINANCIAL EXPRESS (A WIDELY CIRCULATED ENGLISH NATIONAL DAILY NEWSPAPER), ALL EDITIONS OF JANSATTA (A WIDELY CIRCULATED HINDI NATIONAL DAILY NEWSPAPER) AND PUNE EDITION OF LOKSATTA (A WIDELY CIRCULATED MARATHI DAILY NEWSPAPER, MARATHI BEING THE REGIONAL LANGUAGE OF MAHARASHTRA WHERE OUR REGISTERED OFFICE IS LOCATED), AT LEAST TWO WORKING DAYS PRIOR TO THE BID/OFFER OPENING DATE AND SHALL BE MADE AVAILABLE TO THE STOCK EXCHANGES FOR UPLOADING ON THEIR RESPECTIVE WEBSITES IN ACCORDANCE WITH SECURITIES AND EXCHANGE BOARD OF INDIA (ISSUE OF CAPITAL AND DISCLOSURE REQUIREMENTS) REGULATIONS, 2018, AS AMENDED (THE “SEBI ICDR REGULATIONS”). In case of any revision in the Price Band, the Bid/Offer Period will be extended by at least three additional Working Days after such revision in the Price Band, subject to the Bid/Offer Period not exceeding 10 Working Days. In cases of force majeure , banking strike or similar unforeseen circumstances, our Company may, in consultation with the Book Running Lead Managers, for reasons to be recorded in writing, extend the Bid /Offer Period for a minimum of one Working Day, subject to the Bid/Offer Period not exceeding 10 Working Days. Any revision in the Price Band and the revised Bid/Offer Period, if applicable, shall be widely disseminated by notification to the Stock Exchanges, by issuing a press release, and also by indicating the change on the respective websites of the Book Running Lead Managers and at the terminals of the members of the Syndicate and by intimation to Designated Intermediaries and the Sponsor Banks, as applicable. The Offer is being made in terms of Rule 19(2)(b) of the Securities Contracts (Regulation) Rules, 1957, as amended (the “ SCRR ”), read with Regulation 31 of the SEBI ICDR Regulations. The Offer is being made through the Book Building Process in accordance with Regulation 6(1) of the SEBI ICDR Regulations wherein not more than 50% of the Offer shall be available for allocation on a proportionate basis to Qualified Institutional Buyers (“ QIBs ”) (the “ QIB Portion ”), provided that our Company may, in consultation with the BRLMs, allocate up to 60% of the QIB Portion to Anchor Investors on a discretionary basis, in accordance with the SEBI ICDR Regulations (the “ Anchor Investor Portion ”), of which 40% shall be reserved in the following manner (i) 33.33% of the Anchor Investor Portion shall be reserved for domestic Mutual Funds; and (ii) 6.67% of the Anchor Investor Portion shall be reserved for Life Insurance Companies and Pension Funds, subject to valid Bids being received from domestic Mutual Funds, Life Insurance Companies and Pension Funds, as applicable, at or above the Anchor Investor Allocation Price. Any under-subscription in the Life Insurance Companies and Pension Funds category specified in (ii) above may be allocated to domestic Mutual Funds, in accordance with the SEBI ICDR Regulations. In the event of under-subscription or non-allocation in the Anchor Investor Portion, the balance Equity Shares shall be added to the QIB Portion (other than the Anchor Investor Portion) (the “ Net QIB Portion ”). Further, 5% of the Net QIB Portion shall be available for allocation on a proportionate basis to Mutual Funds only, subject to valid Bids being received at or above the Offer Price, and the remainder of the Net QIB Portion shall be available for allocation on a proportionate basis to all QIBs, including Mutual Funds, subject to valid Bids being received at or above the Offer Price. Further, not less than 15% of the Offer shall be available for allocation to Non-Institutional Investors (“ Non-Institutional Portion ”) of which one-third of the Non-Institutional Portion shall be available for allocation to Bidders with an application size of more than ₹ 0.20 million and up to ₹ 1.00 million and two-thirds of the Non-Institutional Portion shall be available for allocation to Bidders with an application size of more than ₹ 1.00 million and undersubscription in either of these two sub-categories of the Non-Institutional Portion may be allocated to Bidders in the other sub-category of the Non-Institutional Portion in accordance with the SEBI ICDR Regulations, subject to valid Bids being received at or above the Offer Price. Further, not less than 35% of the Offer shall be available for allocation to Retail Individual Investors (“ Retail Portion ”), in accordance with the SEBI ICDR Regulations, subject to valid Bids being received from them at or above the Offer Price. All Bidders (except Anchor Investors) shall mandatorily participate in this Offer only through the Application Supported by Blocked Amount (“ ASBA ”) process and shall provide details of their respective bank account (including UPI ID (defined hereinafter) in case of UPI Bidders (defined hereinafter) in which the Bid Amount will be blocked by the Self Certified Syndicate Banks (“ SCSBs ”) or pursuant to the UPI Mechanism, as the case may be. Anchor Investors are not permitted to participate in the Anchor Investor Portion through the ASBA process. For details, see “ Offer Procedure ” on page 420. RISKS IN RELATION TO THE FIRST OFFER This being the first public offer of Equity Shares of our Company, there has been no formal market for the Equity Shares. The face value of the Equity Shares is ₹ 5 each. The Offer Price, Floor Price or Cap Price (as determined by our Company, in consultation with the Book Running Lead Managers, in accordance with the SEBI ICDR Regulations), and on the basis of the assessment of market demand for the Equity Shares by way of the Book Building Process, as stated under “ Basis for the Offer Price ” on page 124, should not be considered to be indicative of the market price of the Equity Shares after the Equity Shares are listed. No assurance can be given regarding an active and/or sustained trading in the Equity Shares nor regarding the price at which the Equity Shares will be traded after listing. GENERAL RISK Investments in equity and equity-related securities involve a degree of risk and Bidders should not invest any funds in the Offer unless they can afford to take the risk of losing their entire investment. Bidders are advised to read the risk factors carefully before taking an investment decision in the Offer. For taking an investment decision, Bidders must rely on their own examination of our Company and the Offer, including the risks involved. The Equity Shares in the Offer have not been recommended or approved by SEBI, nor does SEBI guarantee the accuracy or adequacy of the contents of this Red Herring Prospectus. Specific attention of the Bidders is invited to “ Risk Factors ” on page 28. ISSUER’S AND PROMOTER SELLING SHAREHOLDERS’ ABSOLUTE RESPONSIBILITY Our Company, having made all reasonable inquiries, accepts responsibility for and confirms that this Red Herring Prospectus contains all information with regard to our Company and the Offer, which is material in the context of the Offer, that the information contained in this Red Herring Prospectus is true and correct in all material aspects and is not misleading in any material respect, that the opinions and intentions expressed herein are honestly held and that there are no other facts, the omission of which makes this Red Herring Prospectus as a whole or any of such information or the expression of any such opinions or intentions misleading in any material respect. Each of the Promoter Selling Shareholders, severally and not jointly, accepts responsibility for and confirms the statements specifically made or confirmed by them in this Red Herring Prospectus solely to the extent of information specifically pertaining to themselves and the Equity Shares offered by them in the Offer for Sale and assumes responsibility that such statements are true and correct in all material respects and are not misleading in any material respect. Each of the Promoter Selling Shareholders, severally and not jointly, assume no responsibility for any other statements, including, inter alia, any and all of the statements made by or relating to our Company or its business or any other Promoter Selling Shareholder or any other person(s) in this Red Herring Prospectus. LISTING The Equity Shares, offered through this Red Herring Prospectus, are proposed to be listed on the Stock Exchanges. Our Company has received in-principle approvals from BSE and NSE for listing of the Equity Shares pursuant to their letters each dated August 4, 2025, respectively. For the purposes of the Offer, the Designated Stock Exchange shall be BSE. A copy of this Red Herring Prospectus has been filed with the RoC and a copy of the Prospectus shall be filed with the RoC in accordance with Sections 26(4) and 32 of the Companies Act, 2013. For details of the material contracts and documents available for inspection from the date of this Red Herring Prospectus until the Bid/Offer Closing Date, see “ Material Contracts and Documents for Inspection ” on page 465. BOOK RUNNING LEAD [COMPANY_018] 801 - 804, Wing A, [ADDRESS_005], Maharashtra, India Tel: [PHONE_006] E-mail: [EMAIL_002] Website: www.nuvama.com Investor grievance email: [EMAIL_005] Contact Person: [PERSON_007]/ [PERSON_008] SEBI Registration Number : [COMPANY_019] ICICI Venture [ADDRESS_006], Maharashtra, India Tel: [PHONE_003] E-mail: [EMAIL_003] Website: www.icicisecurities.com Investor grievance email: [EMAIL_006] Contact Person: [PERSON_009]/[PERSON_010] SEBI Registration Number : [COMPANY_020] ([COMPANY_015]) C-101, Embassy 247, 1 st [ADDRESS_007], (Maharashtra), India Tel: [PHONE_004] E-mail: [EMAIL_004] Website: www.in.mpms.mufg.com Investor grievance e-mail: [EMAIL_004] Contact Person: [PERSON_011] SEBI Registration Number: INR000004058 BID/ OFFER PERIOD</w:t>
       </w:r>
     </w:p>
     <w:p>
@@ -138,7 +138,7 @@
     </w:p>
     <w:p>
       <w:r>
-        <w:t>DEFINITIONS AND ABBREVIATIONS This Red Herring Prospectus uses certain definitions and abbreviations which, unless the context otherwise indicates or implies, or unless otherwise specified, shall have the meaning as provided below, and references to any legislation, act, regulation, rules, guidelines or policies shall be to such legislation, act, regulation, rule guidelines or policy as amended from time to time and any reference to a statutory provision shall include any subordinate legislation made from time to time under that provision. Further, the Offer related terms used but not defined in this Red Herring Prospectus shall have the meaning ascribed to such terms under the General Information Document. In case of any inconsistency between the definitions given below and the definitions contained in the General Information Document (as defined below), the definitions given below shall prevail. Unless the context otherwise indicates, all references to “we”, “us”, “our”, “the Company”, and “our Company”, are references to Acme Corp Ltd., a company incorporated on July 30, 1979 under the Companies Act, 1956 and having its Registered Office at 789, Brigade Road, 2nd Floor, Bengaluru – 560 025, Maharashtra, India and its Corporate Office at 201, 101, Anna Salai, T Nagar, Chennai – 600 017, Maharashtra, India. The words and expressions used in this Red Herring Prospectus but not defined herein, shall have, to the extent applicable, the meanings ascribed to such terms under the Companies Act, the SEBI Act, the SEBI ICDR Regulations, the SCRA, SCRR, and the Depositories Act, as amended. Notwithstanding the foregoing, terms in “Main Provisions of the Articles of Association”, “Statement of Special Tax Benefits”, “Industry Overview”, “Key Regulations and Policies in India”, “History and Certain Corporate Matters”, “Basis for the Offer Price”, “Restriction on Foreign Ownership of Indian Securities”, “Financial Information” and “Outstanding Litigation and Material Developments” on pages 441, 134, 137, 238, 243, 124, 438, 280 and 388, respectively, will have the meaning ascribed to such terms in those respective sections. General Terms Term Description Our Company/ the Acme Corp Ltd. (21), a public limited company incorporated under the Companies Act, 1956, having its registered office at 789, Brigade Road, 2nd Floor, Bengaluru – 560 025, Maharashtra, India We/ us/ our Unless context otherwise indicates or implies, refers to our Company Company Related Terms Term Description AoA/Articles of Association or Articles The articles of association of our Company, as amended from time to time Audit Committee Audit committee of our Board, as disclosed in “ Our Management – Corporate Governance – Committees of our Board” on page 257 Auditors/ Statutory Auditors The current statutory auditors of our Company, being Oscorp Limited, Chartered Accountants Board/ Board of Directors The board of directors of our Company. For further details, see “ Our Management – Board of Directors ” on page 250 Bonus Issue Bonus issue undertaken on February 21, 2025, in the ratio of four Equity Shares of face value of ₹ 5 for every one Equity Share of face value of ₹ 5 held by our Shareholders as on February 10, 2025. For further details, please see “ Capital Structure – Equity Share capital history of our Company ” on page 85 CARE Report Report titled “ Industry Research Report on Magnet Winding Wires Market in India ” dated November 26, 2025, prepared and issued by Globex Industries Limited (22) which has been commissioned by and paid for by our Company pursuant to an engagement letter dated December 2, 2024 entered into with Globex Industries Limited (22), exclusively for the purposes of the Offer. The report will be available on the website of our Company at https://kshinternational.com/investor-relations/industry-report/ from the date of this Red Herring Prospectus until the Bid/Offer Closing Date</w:t>
+        <w:t>DEFINITIONS AND ABBREVIATIONS This Red Herring Prospectus uses certain definitions and abbreviations which, unless the context otherwise indicates or implies, or unless otherwise specified, shall have the meaning as provided below, and references to any legislation, act, regulation, rules, guidelines or policies shall be to such legislation, act, regulation, rule guidelines or policy as amended from time to time and any reference to a statutory provision shall include any subordinate legislation made from time to time under that provision. Further, the Offer related terms used but not defined in this Red Herring Prospectus shall have the meaning ascribed to such terms under the General Information Document. In case of any inconsistency between the definitions given below and the definitions contained in the General Information Document (as defined below), the definitions given below shall prevail. Unless the context otherwise indicates, all references to “we”, “us”, “our”, “the Company”, and “our Company”, are references to [COMPANY_001], a company incorporated on July 30, 1979 under the Companies Act, 1956 and having its Registered Office at [ADDRESS_003], Maharashtra, India and its Corporate Office at 201, [ADDRESS_004], Maharashtra, India. The words and expressions used in this Red Herring Prospectus but not defined herein, shall have, to the extent applicable, the meanings ascribed to such terms under the Companies Act, the SEBI Act, the SEBI ICDR Regulations, the SCRA, SCRR, and the Depositories Act, as amended. Notwithstanding the foregoing, terms in “Main Provisions of the Articles of Association”, “Statement of Special Tax Benefits”, “Industry Overview”, “Key Regulations and Policies in India”, “History and Certain Corporate Matters”, “Basis for the Offer Price”, “Restriction on Foreign Ownership of Indian Securities”, “Financial Information” and “Outstanding Litigation and Material Developments” on pages 441, 134, 137, 238, 243, 124, 438, 280 and 388, respectively, will have the meaning ascribed to such terms in those respective sections. General Terms Term Description Our Company/ the [COMPANY_021], a public limited company incorporated under the Companies Act, 1956, having its registered office at [ADDRESS_003], Maharashtra, India We/ us/ our Unless context otherwise indicates or implies, refers to our Company Company Related Terms Term Description AoA/Articles of Association or Articles The articles of association of our Company, as amended from time to time Audit Committee Audit committee of our Board, as disclosed in “ Our Management – Corporate Governance – Committees of our Board” on page 257 Auditors/ Statutory Auditors The current statutory auditors of our Company, being [COMPANY_009], Chartered Accountants Board/ Board of Directors The board of directors of our Company. For further details, see “ Our Management – Board of Directors ” on page 250 Bonus Issue Bonus issue undertaken on February 21, 2025, in the ratio of four Equity Shares of face value of ₹ 5 for every one Equity Share of face value of ₹ 5 held by our Shareholders as on February 10, 2025. For further details, please see “ Capital Structure – Equity Share capital history of our Company ” on page 85 CARE Report Report titled “ Industry Research Report on Magnet Winding Wires Market in India ” dated November 26, 2025, prepared and issued by [COMPANY_022] which has been commissioned by and paid for by our Company pursuant to an engagement letter dated December 2, 2024 entered into with [COMPANY_022], exclusively for the purposes of the Offer. The report will be available on the website of our Company at https://kshinternational.com/investor-relations/industry-report/ from the date of this Red Herring Prospectus until the Bid/Offer Closing Date</w:t>
       </w:r>
     </w:p>
     <w:p>
@@ -156,7 +156,7 @@
     </w:p>
     <w:p>
       <w:r>
-        <w:t>Chairman and Executive Director The chairman and executive director of our Company, being Jane Smith. For further details, see “ Our Management – Board of Directors ” on page 250 Chief Executive Officer/ CEO The chief executive officer of our Company, being Drew Campbell. For further details, see “ Our Management – Key Managerial Personnel and Senior Management ” on page 266 Chief Financial Officer/ CFO The chief financial officer of our Company, being Avery Hart. For further details, see “ Our Management – Key Managerial Personnel and Senior Management ” on page 266 Company Secretary/ CS and Compliance Officer The company secretary and compliance officer of our Company, being John Doe. For further details, see “ General Information ” and “ Our Management – Key Managerial Personnel and Senior Management ” on pages 74 and 266, respectively.</w:t>
+        <w:t>Chairman and Executive Director The chairman and executive director of our Company, being [PERSON_002]. For further details, see “ Our Management – Board of Directors ” on page 250 Chief Executive Officer/ CEO The chief executive officer of our Company, being [PERSON_012]. For further details, see “ Our Management – Key Managerial Personnel and Senior Management ” on page 266 Chief Financial Officer/ CFO The chief financial officer of our Company, being [PERSON_013]. For further details, see “ Our Management – Key Managerial Personnel and Senior Management ” on page 266 Company Secretary/ CS and Compliance Officer The company secretary and compliance officer of our Company, being [PERSON_001]. For further details, see “ General Information ” and “ Our Management – Key Managerial Personnel and Senior Management ” on pages 74 and 266, respectively.</w:t>
       </w:r>
     </w:p>
     <w:p>
@@ -174,7 +174,7 @@
     </w:p>
     <w:p>
       <w:r>
-        <w:t>Term Description Corporate Office The corporate office of our company located at 201, 101, Anna Salai, T Nagar, Chennai – 600 017, Maharashtra, Umbrella Holdings Private Limited (23) CSR Committee/ Corporate Social Responsibility Committee The corporate social responsibility committee of our Board, as disclosed in “ Our Management – Corporate Governance – Committees of our Board ” on page 257 Director(s) The director(s) on our Board. For further details, see “ Our Management – Board of Directors ” on page 250 Equity Shares The equity shares of our Company of face value of ₹ 5 each, unless otherwise stated Executive Director(s) Executive director(s) on our Board. For further details, see “ Our Management – Board of Directors ” on page 250 ESOP 2025 The employee stock option plan of our Company titled, ‘ KSH Employee Stock Option Scheme 2025 ’ approved by our Board and Shareholders each in their meeting May 6, 2025 Family Branch(es) Parents Branch, Rajesh Branch, Sangeeta Branch, Rakhi Branch and Rohit Branch Group Companies The companies identified as ‘group companies’ in accordance with Regulation 2(1)(t) of the SEBI ICDR Regulations and the Materiality Policy. For further details, see “ Our Group Companies ” on page 396 Group Entities Entities, namely, Initech Solutions Limited (24), Hooli Technologies Limited (25), Pied Piper Inc. (26), Stark Industries Limited (27), Wayne Enterprises Limited (28), Oscorp Limited (29), Vance Refrigeration LLC (30), Dunder Mifflin Private Limited (31), Soylent Corp Limited (32), Tyrell Corporation (33), Cyberdyne Systems Limited (34), Massive Dynamic Inc. (35), Wayne Enterprises Limited, Aperture Science LLC (36), Wonka Industries Limited (37), Weyland Corp Limited (38), Bluth Company LLC (39), and Sterling Cooper Limited (40) Independent Director(s) Non-executive and independent director(s) on our Board. For further details, see “ Our Management – Board of Directors ” on page 250 Independent Chartered Engineer The independent chartered engineer appointed by our Company, namely, Jamie Stone bearing registration number M-140388 Industry Data Provider/ CareEdge Research The industry data provider being, Globex Industries Limited (22) IPO Committee The IPO committee of our Board constituted to facilitate the process of the Offer Joint Managing Director The joint managing director of our Company being, Taylor Brown. For further details, see “ Our Management ” on page 250 KMP/ Key Managerial Personnel Key managerial personnel of our Company in terms of Regulation 2(1)(bb) of the SEBI ICDR Regulations and Section 2(51) of the Companies Act, 2013 and as further disclosed in “ Our Management – Key Managerial Personnel and Senior Management ” on page 266 Managing Director The managing director of our Company, namely Alex Morgan. For further information, see “ Our Management – Board of Directors ” on page 250 Materiality Policy The policy adopted by our Board on May 17, 2025, for identification of: (a) outstanding material outstanding litigation involving our Company, our Promoters and our Directors; (b) companies, considered material by our Company, for the purposes of disclosure as group companies in the Draft Red Herring Prospectus, this Red Herring Prospectus and the Prospectus; and (c) outstanding dues to material creditors of our Company, in accordance with the disclosure requirements under the SEBI ICDR Regulations, for the purposes of disclosure in the Draft Red Herring Prospectus, this Red Herring Prospectus and the Prospectus MoA/ Memorandum of Association The memorandum of association of our Company, as amended Nomination and Remuneration Committee The nomination and remuneration committee of our Board, as disclosed in “ Our Management – Committees of our Board ” on page 257 Non-Executive Non-Independent Director(s) The non-executive non-independent Directors on our Board, as disclosed in “ Our Management – Board of Directors ” on page 250 Parents Branch Jane Smith, Peter Parker, Hooli Technologies Limited and Globex Industries Limited</w:t>
+        <w:t>Term Description Corporate Office The corporate office of our company located at 201, [ADDRESS_004], Maharashtra, [COMPANY_023] CSR Committee/ Corporate Social Responsibility Committee The corporate social responsibility committee of our Board, as disclosed in “ Our Management – Corporate Governance – Committees of our Board ” on page 257 Director(s) The director(s) on our Board. For further details, see “ Our Management – Board of Directors ” on page 250 Equity Shares The equity shares of our Company of face value of ₹ 5 each, unless otherwise stated Executive Director(s) Executive director(s) on our Board. For further details, see “ Our Management – Board of Directors ” on page 250 ESOP 2025 The employee stock option plan of our Company titled, ‘ KSH Employee Stock Option Scheme 2025 ’ approved by our Board and Shareholders each in their meeting May 6, 2025 Family Branch(es) Parents Branch, Rajesh Branch, Sangeeta Branch, Rakhi Branch and Rohit Branch Group Companies The companies identified as ‘group companies’ in accordance with Regulation 2(1)(t) of the SEBI ICDR Regulations and the Materiality Policy. For further details, see “ Our Group Companies ” on page 396 Group Entities Entities, namely, [COMPANY_024], [COMPANY_025], [COMPANY_026], [COMPANY_027], [COMPANY_028], [COMPANY_029], [COMPANY_030], [COMPANY_031], [COMPANY_032], [COMPANY_033], [COMPANY_034], [COMPANY_035], [COMPANY_008], [COMPANY_036], [COMPANY_037], [COMPANY_038], [COMPANY_039], and [COMPANY_040] Independent Director(s) Non-executive and independent director(s) on our Board. For further details, see “ Our Management – Board of Directors ” on page 250 Independent Chartered Engineer The independent chartered engineer appointed by our Company, namely, [PERSON_014] bearing registration number M-140388 Industry Data Provider/ CareEdge Research The industry data provider being, [COMPANY_022] IPO Committee The IPO committee of our Board constituted to facilitate the process of the Offer Joint Managing Director The joint managing director of our Company being, [PERSON_005]. For further details, see “ Our Management ” on page 250 KMP/ Key Managerial Personnel Key managerial personnel of our Company in terms of Regulation 2(1)(bb) of the SEBI ICDR Regulations and Section 2(51) of the Companies Act, 2013 and as further disclosed in “ Our Management – Key Managerial Personnel and Senior Management ” on page 266 Managing Director The managing director of our Company, namely [PERSON_004]. For further information, see “ Our Management – Board of Directors ” on page 250 Materiality Policy The policy adopted by our Board on May 17, 2025, for identification of: (a) outstanding material outstanding litigation involving our Company, our Promoters and our Directors; (b) companies, considered material by our Company, for the purposes of disclosure as group companies in the Draft Red Herring Prospectus, this Red Herring Prospectus and the Prospectus; and (c) outstanding dues to material creditors of our Company, in accordance with the disclosure requirements under the SEBI ICDR Regulations, for the purposes of disclosure in the Draft Red Herring Prospectus, this Red Herring Prospectus and the Prospectus MoA/ Memorandum of Association The memorandum of association of our Company, as amended Nomination and Remuneration Committee The nomination and remuneration committee of our Board, as disclosed in “ Our Management – Committees of our Board ” on page 257 Non-Executive Non-Independent Director(s) The non-executive non-independent Directors on our Board, as disclosed in “ Our Management – Board of Directors ” on page 250 Parents Branch [PERSON_002], [PERSON_003], [COMPANY_005] and [COMPANY_002]</w:t>
       </w:r>
     </w:p>
     <w:p>
@@ -192,7 +192,7 @@
     </w:p>
     <w:p>
       <w:r>
-        <w:t>Promoter Group Persons and entities, excluding our Promoters constituting the promoter group of our Company in terms of Regulation 2(1)(pp) of the SEBI ICDR Regulations, as disclosed in “ Our Promoters and Promoter Group ” on page 269 Promoters Jane Smith, Peter Parker, Alex Morgan, Taylor Brown and Jordan Lee, Globex Industries Limited, Umbrella Holdings Private Limited, Initech Solutions Limited, Hooli Technologies Limited, Pied Piper Inc., Stark Industries Limited and Wayne Enterprises Limited Promoter Selling Shareholders Jane Smith, Peter Parker, Alex Morgan and Taylor Brown Promoter Trusts Globex Industries Limited, Umbrella Holdings Private Limited, Initech Solutions Limited, Hooli Technologies Limited, Pied Piper Inc., and Stark Industries Limited Rajesh Branch Alex Morgan, his spouse, his children, lineal descendants and Umbrella Holdings Private Limited Rakhi Branch Jordan Lee, her spouse (if any), her children, lineal descendants and Pied Piper Inc. Registered Office The registered office of our Company located at 505, Banjara Hills, Road No 12, Hyderabad – 500 034, Maharashtra, India</w:t>
+        <w:t>Promoter Group Persons and entities, excluding our Promoters constituting the promoter group of our Company in terms of Regulation 2(1)(pp) of the SEBI ICDR Regulations, as disclosed in “ Our Promoters and Promoter Group ” on page 269 Promoters [PERSON_002], [PERSON_003], [PERSON_004], [PERSON_005] and [PERSON_006], [COMPANY_002], [COMPANY_003], [COMPANY_004], [COMPANY_005], [COMPANY_006], [COMPANY_007] and [COMPANY_008] Promoter Selling Shareholders [PERSON_002], [PERSON_003], [PERSON_004] and [PERSON_005] Promoter Trusts [COMPANY_002], [COMPANY_003], [COMPANY_004], [COMPANY_005], [COMPANY_006], and [COMPANY_007] Rajesh Branch [PERSON_004], his spouse, his children, lineal descendants and [COMPANY_003] Rakhi Branch [PERSON_006], her spouse (if any), her children, lineal descendants and [COMPANY_006] Registered Office The registered office of our Company located at [ADDRESS_008], Maharashtra, India</w:t>
       </w:r>
     </w:p>
     <w:p>
@@ -210,7 +210,7 @@
     </w:p>
     <w:p>
       <w:r>
-        <w:t>Term Description Registrar of Companies/RoC The Registrar of Companies, Maharashtra at Pune Restated Financial Statements The restated financial information of our Company comprising the restated statements of assets and liabilities as on and for the three-month period ended June 30, 2025 and for the years ended March 31, 2025, March 31, 2024 and March 31, 2023, the restated statements of profit and loss (including other comprehensive income), the restated statements of cash flow, the restated statements of changes in equity, the summary of material accounting policies and other explanatory information and other financial information, including the annexures, notes and schedules thereto, for the three-months period ended June 30, 2025, and for the years ended March 31, 2025, March 31, 2024 and March 31, 2023, prepared in terms of the requirements of Section 26 of Part I of Chapter III of the Companies Act, SEBI ICDR Regulations, the Guidance Note on Reports in Company Prospectuses (Revised 2019) issued by ICAI, as amended from time to time and the Indian Accounting Standards as specified under Section 133 of the Act and other accounting principles generally accepted in India. Risk Management Committee The risk management committee of our Board, as disclosed in “ Our Management – Corporate Governance - Committees of our Board ” on page 257 Rohit Branch Taylor Brown, his spouse, his children, lineal descendants and Initech Solutions Limited Sangeeta Branch Sangeeta Ramprasad Rai, her spouse, her children, lineal descendants and Stark Industries Limited Split of Equity Shares Pursuant to a resolution passed by our Board and Shareholders dated February 10, 2025 and February 11, 2025, respectively, our Company sub-divided the face value of its equity shares from ₹ 100 per equity share to ₹ 5 per Equity Share. For further details, see “ Summary of the Offer Document ” and “ Capital Structure – Notes to Capital Structure – Equity Share Capital History of our Company ” on pages 20 and 85, respectively Senior Management/ SM Our senior management in terms of Regulation 2(1)(bbbb) of the SEBI ICDR Regulations and as disclosed in “ Our Management – Key Managerial Personnel and Senior Management ” on page 266 Shareholders The holders of the Equity Shares from time to time Stakeholders Relationship Committee The stakeholders’ relationship committee of our Board, as disclosed in “ Our Management – Corporate Governance – Committees of our Board ” on page 257 Supa Facility Our manufacturing 606, Residency Road, Richmond Town, Bengaluru – 560 025, Maharashtra, India Unit 2 Our manufacturing 707, Civil Lines, Prayagraj – 211 001, Maharashtra, India Unit 3 Our manufacturing 123, MG Road, Sector 5, New Delhi – 110 001 (11), Maharashtra, India Whole-time Director The whole-time director of our Company being, Jordan Lee. For further information, see “ Our Management – Board of Directors ” on page 250 Offer Related Terms Term Description Abridged Prospectus Abridged prospectus means a memorandum containing such salient features of a prospectus as may be specified by the SEBI in this behalf Acknowledgement Slip The slip or document issued by the relevant Designated Intermediary(ies) to a Bidder as proof of registration of the Bid cum Application Form Allot/ Allotment/ Allotted Unless the context otherwise requires, the allotment of the Equity Shares pursuant to the Fresh Issue and transfer of the Offered Shares by the Promoter Selling Shareholders pursuant to the Offer for Sale to successful Bidders Allotment Advice Note or advice or intimation of Allotment sent to the Bidders who have been or are to be Allotted the Equity Shares after the Basis of Allotment has been approved by the Designated Stock Exchange Allottee A successful Bidder to whom the Equity Shares are Allotted</w:t>
+        <w:t>Term Description Registrar of Companies/RoC The Registrar of Companies, Maharashtra at Pune Restated Financial Statements The restated financial information of our Company comprising the restated statements of assets and liabilities as on and for the three-month period ended June 30, 2025 and for the years ended March 31, 2025, March 31, 2024 and March 31, 2023, the restated statements of profit and loss (including other comprehensive income), the restated statements of cash flow, the restated statements of changes in equity, the summary of material accounting policies and other explanatory information and other financial information, including the annexures, notes and schedules thereto, for the three-months period ended June 30, 2025, and for the years ended March 31, 2025, March 31, 2024 and March 31, 2023, prepared in terms of the requirements of Section 26 of Part I of Chapter III of the Companies Act, SEBI ICDR Regulations, the Guidance Note on Reports in Company Prospectuses (Revised 2019) issued by ICAI, as amended from time to time and the Indian Accounting Standards as specified under Section 133 of the Act and other accounting principles generally accepted in India. Risk Management Committee The risk management committee of our Board, as disclosed in “ Our Management – Corporate Governance - Committees of our Board ” on page 257 Rohit Branch [PERSON_005], his spouse, his children, lineal descendants and [COMPANY_004] Sangeeta Branch Sangeeta Ramprasad Rai, her spouse, her children, lineal descendants and [COMPANY_007] Split of Equity Shares Pursuant to a resolution passed by our Board and Shareholders dated February 10, 2025 and February 11, 2025, respectively, our Company sub-divided the face value of its equity shares from ₹ 100 per equity share to ₹ 5 per Equity Share. For further details, see “ Summary of the Offer Document ” and “ Capital Structure – Notes to Capital Structure – Equity Share Capital History of our Company ” on pages 20 and 85, respectively Senior Management/ SM Our senior management in terms of Regulation 2(1)(bbbb) of the SEBI ICDR Regulations and as disclosed in “ Our Management – Key Managerial Personnel and Senior Management ” on page 266 Shareholders The holders of the Equity Shares from time to time Stakeholders Relationship Committee The stakeholders’ relationship committee of our Board, as disclosed in “ Our Management – Corporate Governance – Committees of our Board ” on page 257 Supa Facility Our manufacturing [ADDRESS_009], Maharashtra, India Unit 2 Our manufacturing [ADDRESS_010], Maharashtra, India Unit 3 Our manufacturing [ADDRESS_011], Maharashtra, India Whole-time Director The whole-time director of our Company being, [PERSON_006]. For further information, see “ Our Management – Board of Directors ” on page 250 Offer Related Terms Term Description Abridged Prospectus Abridged prospectus means a memorandum containing such salient features of a prospectus as may be specified by the SEBI in this behalf Acknowledgement Slip The slip or document issued by the relevant Designated Intermediary(ies) to a Bidder as proof of registration of the Bid cum Application Form Allot/ Allotment/ Allotted Unless the context otherwise requires, the allotment of the Equity Shares pursuant to the Fresh Issue and transfer of the Offered Shares by the Promoter Selling Shareholders pursuant to the Offer for Sale to successful Bidders Allotment Advice Note or advice or intimation of Allotment sent to the Bidders who have been or are to be Allotted the Equity Shares after the Basis of Allotment has been approved by the Designated Stock Exchange Allottee A successful Bidder to whom the Equity Shares are Allotted</w:t>
       </w:r>
     </w:p>
     <w:p>
@@ -282,7 +282,7 @@
     </w:p>
     <w:p>
       <w:r>
-        <w:t>Term Description newspaper), all editions of Jansatta (a widely circulated Hindi national daily newspaper), and Pune edition of Loksatta (a widely circulated Marathi daily newspaper, Marathi being the regional language of Maharashtra, where our Registered Office is located) Bid/ Offer Period Except in relation to Bids by Anchor Investors, the period between the Bid/Offer Opening Date and the Bid/Offer Closing Date, inclusive of both days, during which prospective Bidders can submit their Bids, including any revisions thereof, in accordance with the SEBI ICDR Regulations and in terms of this Red Herring Prospectus. Provided that the Bidding shall be kept open for a minimum of three Working Days for all categories of Bidders, other than Anchor Investors In cases of force majeure , banking strike or similar unforeseen circumstances, our Company may, for reasons to be recorded in writing, extend the Bid/Offer Period for a minimum of one Working Day, subject to the Bid/Offer Period not exceeding 10 Working Days Bidder Any prospective investor who makes a Bid pursuant to the terms of this Red Herring Prospectus and the Bid cum Application Form and unless otherwise stated or implied, includes an Anchor Investor Bidding Centres Centres at which the Designated Intermediaries shall accept the ASBA Forms, i.e., Designated SCSB Branches for SCSBs, Specified Locations for Syndicate, Broker Centres for Registered Brokers, Designated RTA Locations for RTAs and Designated CDP Locations for CDPs Book Building Process Book building process, as provided in Schedule XIII of the SEBI ICDR Regulations, in terms of which the Offer is being made Book Running Lead Managers/ BRLMs/Managers The book running lead managers to the Offer namely, Acme Corp Ltd. (41) and Tyrell Corporation Broker Centres Broker centres of the Registered Brokers where ASBA Bidders can submit the ASBA Forms, provided that UPI Bidders may only submit ASBA Forms at such broker centres if they are Bidding using the UPI Mechanism. The details of such broker centres, along with the names and contact details of the Registered Brokers, are available on the respective websites of the Stock Exchanges (www.bseindia.com and www.nseindia.com ) CAN/ Confirmation of Allocation Note Notice or intimation of allocation of the Equity Shares sent to Anchor Investors, who have been allocated the Equity Shares, on/after the Anchor Investor Bidding Date Cap Price The higher end of the Price Band, above which the Offer Price and the Anchor Investor Offer Price will not be finalised and above which no Bids will be accepted, including any revisions thereof. The Cap Price shall be at least 105% of the Floor Price and shall not be more than 120% of the Floor Price Cash Escrow and Sponsor Banks Agreement Agreement dated December 9, 2025 entered into and amongst our Company, the Promoter Selling Shareholders, the Registrar to the Offer, the Book Running Lead Managers, the Syndicate Members and the Bankers to the Offer in accordance with UPI Circulars, for inter alia , the appointment of the Bankers to the Offer for the collection of the Bid Amounts from Anchor Investors, transfer of funds to the Public Offer Account and where applicable, refunds of the amounts collected from Bidders, on the terms and conditions thereof Client ID Client identification number maintained with one of the Depositories in relation to the Bidder’s beneficiary account Collecting Depository Participant/ CDP A depository participant as defined under the Depositories Act, registered with SEBI and who is eligible to procure Bids at the Designated CDP Locations in terms of circular no. CIR/CFD/POLICYCELL/11/2015 dated November 10, 2015 (to the extent not rescinded by the SEBI ICDR Master Circular in relation to the SEBI ICDR Regulations), issued by SEBI and other applicable circulars issued by SEBI as per the lists available on the websites of the Stock Exchanges at www.bseindia.com and www.nseindia.com , as updated from time to time Cut-off Price Offer Price, finalised by our Company, in consultation with the BRLMs, which shall be any price within the Price Band. Only Retail Individual Investors Bidding in the Retail Portion are entitled to Bid at the Cut-off Price. QIBs (including Anchor Investors) and Non-Institutional Investors are not entitled to Bid at the Cut-off Price</w:t>
+        <w:t>Term Description newspaper), all editions of Jansatta (a widely circulated Hindi national daily newspaper), and Pune edition of Loksatta (a widely circulated Marathi daily newspaper, Marathi being the regional language of Maharashtra, where our Registered Office is located) Bid/ Offer Period Except in relation to Bids by Anchor Investors, the period between the Bid/Offer Opening Date and the Bid/Offer Closing Date, inclusive of both days, during which prospective Bidders can submit their Bids, including any revisions thereof, in accordance with the SEBI ICDR Regulations and in terms of this Red Herring Prospectus. Provided that the Bidding shall be kept open for a minimum of three Working Days for all categories of Bidders, other than Anchor Investors In cases of force majeure , banking strike or similar unforeseen circumstances, our Company may, for reasons to be recorded in writing, extend the Bid/Offer Period for a minimum of one Working Day, subject to the Bid/Offer Period not exceeding 10 Working Days Bidder Any prospective investor who makes a Bid pursuant to the terms of this Red Herring Prospectus and the Bid cum Application Form and unless otherwise stated or implied, includes an Anchor Investor Bidding Centres Centres at which the Designated Intermediaries shall accept the ASBA Forms, i.e., Designated SCSB Branches for SCSBs, Specified Locations for Syndicate, Broker Centres for Registered Brokers, Designated RTA Locations for RTAs and Designated CDP Locations for CDPs Book Building Process Book building process, as provided in Schedule XIII of the SEBI ICDR Regulations, in terms of which the Offer is being made Book Running Lead Managers/ BRLMs/Managers The book running lead managers to the Offer namely, [COMPANY_041] and [COMPANY_013] Broker Centres Broker centres of the Registered Brokers where ASBA Bidders can submit the ASBA Forms, provided that UPI Bidders may only submit ASBA Forms at such broker centres if they are Bidding using the UPI Mechanism. The details of such broker centres, along with the names and contact details of the Registered Brokers, are available on the respective websites of the Stock Exchanges (www.bseindia.com and www.nseindia.com ) CAN/ Confirmation of Allocation Note Notice or intimation of allocation of the Equity Shares sent to Anchor Investors, who have been allocated the Equity Shares, on/after the Anchor Investor Bidding Date Cap Price The higher end of the Price Band, above which the Offer Price and the Anchor Investor Offer Price will not be finalised and above which no Bids will be accepted, including any revisions thereof. The Cap Price shall be at least 105% of the Floor Price and shall not be more than 120% of the Floor Price Cash Escrow and Sponsor Banks Agreement Agreement dated December 9, 2025 entered into and amongst our Company, the Promoter Selling Shareholders, the Registrar to the Offer, the Book Running Lead Managers, the Syndicate Members and the Bankers to the Offer in accordance with UPI Circulars, for inter alia , the appointment of the Bankers to the Offer for the collection of the Bid Amounts from Anchor Investors, transfer of funds to the Public Offer Account and where applicable, refunds of the amounts collected from Bidders, on the terms and conditions thereof Client ID Client identification number maintained with one of the Depositories in relation to the Bidder’s beneficiary account Collecting Depository Participant/ CDP A depository participant as defined under the Depositories Act, registered with SEBI and who is eligible to procure Bids at the Designated CDP Locations in terms of circular no. CIR/CFD/POLICYCELL/11/2015 dated November 10, 2015 (to the extent not rescinded by the SEBI ICDR Master Circular in relation to the SEBI ICDR Regulations), issued by SEBI and other applicable circulars issued by SEBI as per the lists available on the websites of the Stock Exchanges at www.bseindia.com and www.nseindia.com , as updated from time to time Cut-off Price Offer Price, finalised by our Company, in consultation with the BRLMs, which shall be any price within the Price Band. Only Retail Individual Investors Bidding in the Retail Portion are entitled to Bid at the Cut-off Price. QIBs (including Anchor Investors) and Non-Institutional Investors are not entitled to Bid at the Cut-off Price</w:t>
       </w:r>
     </w:p>
     <w:p>
@@ -318,7 +318,7 @@
     </w:p>
     <w:p>
       <w:r>
-        <w:t>Term Description In relation to ASBA Forms submitted by UPI Bidders where the Bid Amount will be blocked upon acceptance of UPI Mandate Request by such UPI Bidders using the UPI Mechanism, Designated Intermediaries shall mean Syndicate, sub-syndicate, Registered Brokers, CDPs and RTAs. In relation to ASBA Forms submitted by QIBs and NIIs (not using the UPI Mechanism), Designated Intermediaries shall mean SCSBs, Syndicate, sub-Syndicate, Registered Brokers, CDPs and RTAs Designated RTA Locations Such centres of the RTAs where ASBA Bidders can submit the ASBA Forms (in case of UPI Bidder only ASBA Forms under UPI). The details of such Designated RTA Locations, along with the names and contact details of the RTAs are available on the respective websites of the Stock Exchanges at www.bseindia.com and www.nseindia.com and as updated from time to time Designated SCSB Branches Such branches of the SCSBs which shall collect the ASBA Forms, a list of which is available on the website of SEBI at www.sebi.gov.in/sebiweb/other/OtherAction.do?doRecognised=yes or at such other website as may be prescribed by SEBI from time to time Designated Stock Exchange BSE Draft Red Herring Prospectus/ DRHP The draft red herring prospectus dated May 22, 2025, issued in accordance with the SEBI ICDR Regulations, which did not contain complete particulars of the price at which the Equity Shares will be Allotted and the size of the Offer Eligible FPI(s) FPIs that are eligible to participate in this Offer in terms of applicable laws Eligible NRI(s) A non-resident Indian, resident in a jurisdiction outside India where it is not unlawful to make an offer or invitation under the Offer and in relation to whom this Red Herring Prospectus and the Bid Cum Application Form constitute an invitation to subscribe or purchase for the Equity Shares Escrow Accounts Accounts opened with the Escrow Collection Bank and in whose favour Anchor Investors will transfer the money through direct credit/NEFT/RTGS/NACH in respect of the Bid Amount while submitting a Bid Escrow Collection Bank The bank, which is a clearing member registered with SEBI as banker to an issue under the SEBI BTI Regulations and with whom the Escrow Accounts have been opened, in this case being Globex Industries Limited (42) First Bidder Bidder whose name shall be mentioned in the Bid cum Application Form or the Revision Form and in case of joint Bids, whose name shall also appear as the first holder of the beneficiary account held in joint names Floor Price The lower end of the Price Band, subject to any revision(s) thereto, at or above which the Offer Price and the Anchor Investor Offer Price will be finalised and below which no Bids will be accepted Fraudulent Borrower Fraudulent borrower as defined under Regulation 2(1)(lll) of the SEBI ICDR Regulations Fresh Issue The fresh issue of up to [●] Equity Shares of face value of ₹ 5 each by our Company, at ₹ [●] per Equity Share (including a premium of ₹ [●] per Equity Share) aggregating up to ₹ 4,200.00 million. For information, see “ The Offer ” on page 67 Fugitive Economic Offender An individual who is declared a fugitive economic offender under Section 12 of the Fugitive Economic Offenders Act, 2012 General Information Document The General Information Document for investing in public offers, prepared and issued in accordance with the SEBI circular (SEBI/HO/CFD/DIL1/CIR/P/2020/37) dated March 17, 2020, issued by SEBI, suitably modified and updated pursuant to, among others, the UPI Circulars and any subsequent circulars or notifications issued by SEBI from time to time GSM Graded Surveillance Measures Gross Proceeds The gross proceeds of the Umbrella Holdings Private Limited (43) Life Insurance Companies An entity registered with the Insurance Regulatory and Development Authority of India under the provisions of the Insurance Act, 1938 Monitoring Agency The monitoring agency appointed pursuant to the Monitoring Agency Agreement, namely Initech Solutions Limited (44)</w:t>
+        <w:t>Term Description In relation to ASBA Forms submitted by UPI Bidders where the Bid Amount will be blocked upon acceptance of UPI Mandate Request by such UPI Bidders using the UPI Mechanism, Designated Intermediaries shall mean Syndicate, sub-syndicate, Registered Brokers, CDPs and RTAs. In relation to ASBA Forms submitted by QIBs and NIIs (not using the UPI Mechanism), Designated Intermediaries shall mean SCSBs, Syndicate, sub-Syndicate, Registered Brokers, CDPs and RTAs Designated RTA Locations Such centres of the RTAs where ASBA Bidders can submit the ASBA Forms (in case of UPI Bidder only ASBA Forms under UPI). The details of such Designated RTA Locations, along with the names and contact details of the RTAs are available on the respective websites of the Stock Exchanges at www.bseindia.com and www.nseindia.com and as updated from time to time Designated SCSB Branches Such branches of the SCSBs which shall collect the ASBA Forms, a list of which is available on the website of SEBI at www.sebi.gov.in/sebiweb/other/OtherAction.do?doRecognised=yes or at such other website as may be prescribed by SEBI from time to time Designated Stock Exchange BSE Draft Red Herring Prospectus/ DRHP The draft red herring prospectus dated May 22, 2025, issued in accordance with the SEBI ICDR Regulations, which did not contain complete particulars of the price at which the Equity Shares will be Allotted and the size of the Offer Eligible FPI(s) FPIs that are eligible to participate in this Offer in terms of applicable laws Eligible NRI(s) A non-resident Indian, resident in a jurisdiction outside India where it is not unlawful to make an offer or invitation under the Offer and in relation to whom this Red Herring Prospectus and the Bid Cum Application Form constitute an invitation to subscribe or purchase for the Equity Shares Escrow Accounts Accounts opened with the Escrow Collection Bank and in whose favour Anchor Investors will transfer the money through direct credit/NEFT/RTGS/NACH in respect of the Bid Amount while submitting a Bid Escrow Collection Bank The bank, which is a clearing member registered with SEBI as banker to an issue under the SEBI BTI Regulations and with whom the Escrow Accounts have been opened, in this case being [COMPANY_042] First Bidder Bidder whose name shall be mentioned in the Bid cum Application Form or the Revision Form and in case of joint Bids, whose name shall also appear as the first holder of the beneficiary account held in joint names Floor Price The lower end of the Price Band, subject to any revision(s) thereto, at or above which the Offer Price and the Anchor Investor Offer Price will be finalised and below which no Bids will be accepted Fraudulent Borrower Fraudulent borrower as defined under Regulation 2(1)(lll) of the SEBI ICDR Regulations Fresh Issue The fresh issue of up to [●] Equity Shares of face value of ₹ 5 each by our Company, at ₹ [●] per Equity Share (including a premium of ₹ [●] per Equity Share) aggregating up to ₹ 4,200.00 million. For information, see “ The Offer ” on page 67 Fugitive Economic Offender An individual who is declared a fugitive economic offender under Section 12 of the Fugitive Economic Offenders Act, 2012 General Information Document The General Information Document for investing in public offers, prepared and issued in accordance with the SEBI circular (SEBI/HO/CFD/DIL1/CIR/P/2020/37) dated March 17, 2020, issued by SEBI, suitably modified and updated pursuant to, among others, the UPI Circulars and any subsequent circulars or notifications issued by SEBI from time to time GSM Graded Surveillance Measures Gross Proceeds The gross proceeds of the [COMPANY_043] Life Insurance Companies An entity registered with the Insurance Regulatory and Development Authority of India under the provisions of the Insurance Act, 1938 Monitoring Agency The monitoring agency appointed pursuant to the Monitoring Agency Agreement, namely [COMPANY_044]</w:t>
       </w:r>
     </w:p>
     <w:p>
@@ -354,7 +354,7 @@
     </w:p>
     <w:p>
       <w:r>
-        <w:t>Term Description with application size of more than ₹ 1.00 million, provided that the unsubscribed portion in either of such sub-categories may be allocated to applicants in the other sub-category of Non- Institutional Investors, subject to valid Bids being received at or above the Offer Price Non-Resident A person resident outside India, as defined under FEMA and includes NRIs, FPIs and Hooli Technologies Limited (45) Offer The initial public offering of up to [●] Equity Shares of face value of ₹ 5 each for cash at a price of ₹ [●] each (including a share premium of ₹ [●] each), aggregating up to ₹ 7,100.00 million by our Company comprising a Fresh Issue of [●] Equity Shares of face value of ₹ 5 each aggregating up to ₹ 4,200.00 million, an Offer for Sale of up to [●] Equity Shares of face value of ₹ 5 each aggregating to ₹ 2,900.00 million by the Promoter Selling Shareholders Offer Agreement The agreement dated May 22, 2025, amongst our Company, the Promoter Selling Shareholders and the BRLMs, pursuant to which certain arrangements are agreed to in relation to the Offer Offer for Sale The offer for sale component of the Offer of up to [●] Equity Shares of face value of ₹ 5 each aggregating up to ₹ 2,900.00 million, comprising of an offer for sale of up to [●] Equity Shares of face value of ₹ 5 each by Jane Smith aggregating up to ₹ 1,528.00 million, up to [●] Equity Shares of face value of ₹ 5 each by Peter Parker aggregating up to ₹ 422.00 million, up to [●] Equity Shares of face value of ₹ 5 each by Alex Morgan aggregating up to ₹ 475.00 million and up to [●] Equity Shares of face value of ₹ 5 each by Taylor Brown aggregating up to ₹ 475.00 million Offer Price ₹ [●] per Equity Share, being the final price within the Price Band, at which Equity Shares will be Allotted to successful Bidders, other than Anchor Investors as determined in accordance with the Book Building Process and determined by our Company, in consultation with the Book Running Lead Managers, in terms of this Red Herring Prospectus on the Pricing Date. Equity Shares will be Allotted to Anchor Investors at the Anchor Investor Offer Price in terms of this Red Herring Prospectus. The Offer Price will be decided by our Company, in consultation with the BRLMs on the Pricing Date, in accordance with the Book Building Process and in terms of this Red Herring Prospectus Offer Proceeds The proceeds of the Fresh Issue which shall be available to our Company and the proceeds from the Offer for Sale which shall be available to the Promoter Selling Shareholders. For further information about use of the Offer Proceeds, please see section titled “ Objects of the Offer ” on page 106 Offered Shares Up to [●] Equity Shares of face value of ₹ 5 each aggregating to ₹ 2,900.00 million being offered for sale by the Promoter Selling Shareholders in the Offer for Sale component of the Offer Pension Fund A fund registered with the Pension Fund Regulatory and Development Authority under the provisions of the Pension Fund Regulatory and Development Authority Act, 2013 Price Band Price band of a minimum price of ₹ [●] per Equity Share (Floor Price) and the maximum price of ₹ [●] per Equity Share (Cap Price) including any revisions thereof. The Cap Price shall be at least 105% of the Floor Price and shall be less than or equal to 120% of the Floor Price. The Price Band and the minimum Bid Lot for the Offer will be decided by our Company, in consultation with the BRLMs, and will be advertised in all editions of Financial express (a widely circulated English national daily newspaper), all editions of Jansatta (a widely circulated Hindi national daily newspaper) and Pune edition of Loksatta (a widely circulated Marathi daily newspaper, Marathi being the regional language of Maharashtra, where our Registered Office is situated) at least two Working Days prior to the Bid/Offer Opening Date, with the relevant financial ratios calculated at the Floor Price and at the Cap Price, and shall be made available to the Stock Exchanges for the purpose of uploading on their respective websites Pricing Date The date on which our Company, in consultation with the BRLMs, will finalise the Offer Price</w:t>
+        <w:t>Term Description with application size of more than ₹ 1.00 million, provided that the unsubscribed portion in either of such sub-categories may be allocated to applicants in the other sub-category of Non- Institutional Investors, subject to valid Bids being received at or above the Offer Price Non-Resident A person resident outside India, as defined under FEMA and includes NRIs, FPIs and [COMPANY_045] Offer The initial public offering of up to [●] Equity Shares of face value of ₹ 5 each for cash at a price of ₹ [●] each (including a share premium of ₹ [●] each), aggregating up to ₹ 7,100.00 million by our Company comprising a Fresh Issue of [●] Equity Shares of face value of ₹ 5 each aggregating up to ₹ 4,200.00 million, an Offer for Sale of up to [●] Equity Shares of face value of ₹ 5 each aggregating to ₹ 2,900.00 million by the Promoter Selling Shareholders Offer Agreement The agreement dated May 22, 2025, amongst our Company, the Promoter Selling Shareholders and the BRLMs, pursuant to which certain arrangements are agreed to in relation to the Offer Offer for Sale The offer for sale component of the Offer of up to [●] Equity Shares of face value of ₹ 5 each aggregating up to ₹ 2,900.00 million, comprising of an offer for sale of up to [●] Equity Shares of face value of ₹ 5 each by [PERSON_002] aggregating up to ₹ 1,528.00 million, up to [●] Equity Shares of face value of ₹ 5 each by [PERSON_003] aggregating up to ₹ 422.00 million, up to [●] Equity Shares of face value of ₹ 5 each by [PERSON_004] aggregating up to ₹ 475.00 million and up to [●] Equity Shares of face value of ₹ 5 each by [PERSON_005] aggregating up to ₹ 475.00 million Offer Price ₹ [●] per Equity Share, being the final price within the Price Band, at which Equity Shares will be Allotted to successful Bidders, other than Anchor Investors as determined in accordance with the Book Building Process and determined by our Company, in consultation with the Book Running Lead Managers, in terms of this Red Herring Prospectus on the Pricing Date. Equity Shares will be Allotted to Anchor Investors at the Anchor Investor Offer Price in terms of this Red Herring Prospectus. The Offer Price will be decided by our Company, in consultation with the BRLMs on the Pricing Date, in accordance with the Book Building Process and in terms of this Red Herring Prospectus Offer Proceeds The proceeds of the Fresh Issue which shall be available to our Company and the proceeds from the Offer for Sale which shall be available to the Promoter Selling Shareholders. For further information about use of the Offer Proceeds, please see section titled “ Objects of the Offer ” on page 106 Offered Shares Up to [●] Equity Shares of face value of ₹ 5 each aggregating to ₹ 2,900.00 million being offered for sale by the Promoter Selling Shareholders in the Offer for Sale component of the Offer Pension Fund A fund registered with the Pension Fund Regulatory and Development Authority under the provisions of the Pension Fund Regulatory and Development Authority Act, 2013 Price Band Price band of a minimum price of ₹ [●] per Equity Share (Floor Price) and the maximum price of ₹ [●] per Equity Share (Cap Price) including any revisions thereof. The Cap Price shall be at least 105% of the Floor Price and shall be less than or equal to 120% of the Floor Price. The Price Band and the minimum Bid Lot for the Offer will be decided by our Company, in consultation with the BRLMs, and will be advertised in all editions of Financial express (a widely circulated English national daily newspaper), all editions of Jansatta (a widely circulated Hindi national daily newspaper) and Pune edition of Loksatta (a widely circulated Marathi daily newspaper, Marathi being the regional language of Maharashtra, where our Registered Office is situated) at least two Working Days prior to the Bid/Offer Opening Date, with the relevant financial ratios calculated at the Floor Price and at the Cap Price, and shall be made available to the Stock Exchanges for the purpose of uploading on their respective websites Pricing Date The date on which our Company, in consultation with the BRLMs, will finalise the Offer Price</w:t>
       </w:r>
     </w:p>
     <w:p>
@@ -372,7 +372,7 @@
     </w:p>
     <w:p>
       <w:r>
-        <w:t>Prospectus The Prospectus to be filed with the RoC in accordance with the Companies Act, 2013, and the SEBI ICDR Regulations containing, inter alia , the Offer Price that is determined at the end of the Book Building Process, the size of the Offer and certain other information, including any addenda or corrigenda thereto Public Offer Account Bank The bank with which the Public Offer Account has been opened for collection of Bid Amounts from Escrow Accounts and ASBA Accounts on the Designated Date, in this case being Pied Piper Inc. (46) Public Offer Account Bank account opened with the Public Offer Account Bank under Section 40(3) of the Companies Act, 2013, to receive monies from the Escrow Accounts and ASBA Accounts on the Designated Date QIB Portion The category of the Offer (including the Anchor Investor Portion), being not more than 50% of the Offer, consisting of up to [●] Equity Shares of face value of ₹ 5 each aggregating to ₹ [●] million, which shall be available for allocation to QIBs on a proportionate basis, including the Anchor Investor Portion (in which allocation shall be on a discretionary basis, as determined by our Company in consultation with the BRLMs subject to the provisions of the SEBI ICDR Regulations), subject to valid Bids being received at or above the Offer Price or the Anchor Investor Offer Price (for Anchor Investors) Qualified Institutional Buyer(s)/ QIB(s)/ QIB Bidder(s) Qualified institutional buyers as defined under Regulation 2(1)(ss) of the SEBI ICDR Regulations</w:t>
+        <w:t>Prospectus The Prospectus to be filed with the RoC in accordance with the Companies Act, 2013, and the SEBI ICDR Regulations containing, inter alia , the Offer Price that is determined at the end of the Book Building Process, the size of the Offer and certain other information, including any addenda or corrigenda thereto Public Offer Account Bank The bank with which the Public Offer Account has been opened for collection of Bid Amounts from Escrow Accounts and ASBA Accounts on the Designated Date, in this case being [COMPANY_046] Public Offer Account Bank account opened with the Public Offer Account Bank under Section 40(3) of the Companies Act, 2013, to receive monies from the Escrow Accounts and ASBA Accounts on the Designated Date QIB Portion The category of the Offer (including the Anchor Investor Portion), being not more than 50% of the Offer, consisting of up to [●] Equity Shares of face value of ₹ 5 each aggregating to ₹ [●] million, which shall be available for allocation to QIBs on a proportionate basis, including the Anchor Investor Portion (in which allocation shall be on a discretionary basis, as determined by our Company in consultation with the BRLMs subject to the provisions of the SEBI ICDR Regulations), subject to valid Bids being received at or above the Offer Price or the Anchor Investor Offer Price (for Anchor Investors) Qualified Institutional Buyer(s)/ QIB(s)/ QIB Bidder(s) Qualified institutional buyers as defined under Regulation 2(1)(ss) of the SEBI ICDR Regulations</w:t>
       </w:r>
     </w:p>
     <w:p>
@@ -390,7 +390,7 @@
     </w:p>
     <w:p>
       <w:r>
-        <w:t>Term Description Red Herring Prospectus/ RHP This red herring prospectus dated December 10, 2025, issued in accordance with Section 32 of the Companies Act, 2013 and the provisions of the SEBI ICDR Regulations, which does not have complete particulars of the price at which the Equity Shares will be offered and the size of the Offer including any addenda or corrigenda thereto The Bid/Offer Opening Date is December 16, 2025, which is at least three Working Days after filing of this Red Herring Prospectus with the RoC. This Red Herring Prospectus will become the Prospectus upon filing with the RoC after the Pricing Date, including any addenda or corrigenda thereto Refund Account The account opened with the Refund Bank, from which refunds, if any, of the whole or part of the Bid Amount to the Anchor Investors shall be made. Refund Bank The bank which is a clearing member registered with SEBI under the SEBI BTI Regulations with whom the Refund Account has been opened, in this case being Globex Industries Limited (42) Registered Brokers Stockbrokers registered with the stock exchanges having nationwide terminals, other than the members of the Syndicate and eligible to procure Bids in terms of the SEBI ICDR Master Circular and the SEBI circular no. CIR/CFD/14/2012 dated October 4, 2012, and the UPI Circulars RTAs/Registrar and Share Transfer Agents The registrar and share transfer agents registered with SEBI and eligible to procure Bids at the Designated RTA Locations as per the list available on the websites of BSE and NSE, and the UPI Circulars Registrar Agreement The agreement dated May 22, 2025 between our Company, the Promoter Selling Shareholders and the Registrar to the Offer in relation to the responsibilities and obligations of the Registrar to the Offer pertaining to the Offer Registrar to the Stark Industries Limited (47) (Massive Dynamic Inc.) Retail Individual Investors(s)/ RII(s) Individual Bidders, who have Bid for the Equity Shares for an amount not more than ₹ 0.20 million in any of the bidding options in the Offer (including HUFs applying through their Karta and Eligible NRIs and does not include NRIs other than Eligible NRIs) Retail Portion The portion of the Offer being not less than 35% of the Offer consisting of [●] Equity Shares of face value of ₹ 5 each, available for allocation to Retail Individual Investors as per the SEBI ICDR Regulations, subject to valid Bids being received at or above the Offer Price Revision Form Form used by the Bidders to modify the quantity of the Equity Shares or the Bid Amount in any of their ASBA Form(s) or any previous Revision Form(s) QIB Bidders and Non-Institutional Investors are not allowed to withdraw or lower their Bids (in terms of quantity of Equity Shares or the Bid Amount) at any stage. Retail Individual Investors can revise their Bids during the Bid/Offer Period and withdraw their Bids until Bid/Offer Closing Date SCORES SEBI Complaints Redressal Mechanism Self-Certified Syndicate Bank(s)/ SCSB(s) (i) The banks registered with SEBI, offering services in relation to ASBA (other than through UPI Mechanism), a list of which is available on the website of SEBI at www.sebi.gov.in/sebiweb/other/OtherAction.do?doRecognisedFpi=yes&amp;intmId=34 or www.sebi.gov.in/sebiweb/other/OtherAction.do?doRecognisedFpi=yes&amp;intmId=35, as applicable, or such other website as updated from time to time, and (i) The banks registered with SEBI, enabled for UPI Mechanism, a list of which is available on the website of SEBI at www.sebi.gov.in/sebiweb/other/OtherAction.do?doRecognisedFpi=yes&amp;intmId=40 or such other website as updated from time to time Share Escrow Agent The share escrow agent appointed pursuant to the Share Escrow Agreement, namely, Wayne Enterprises Limited (48) ( Massive Dynamic Inc. ) Share Escrow Agreement The agreement dated December 6, 2025 entered into between our Company, the Promoter Selling Shareholders and the Share Escrow Agent in connection with the transfer of the respective portion of Equity Shares being offered by each Promoter Selling Shareholder in the Offer for Sale portion of the Offer and credit of such Equity Shares to the demat account of the Allottees in accordance with the Basis of Allotment Specified Locations Bidding centres where the Syndicate shall accept ASBA Forms from Bidders, a list of which</w:t>
+        <w:t>Term Description Red Herring Prospectus/ RHP This red herring prospectus dated December 10, 2025, issued in accordance with Section 32 of the Companies Act, 2013 and the provisions of the SEBI ICDR Regulations, which does not have complete particulars of the price at which the Equity Shares will be offered and the size of the Offer including any addenda or corrigenda thereto The Bid/Offer Opening Date is December 16, 2025, which is at least three Working Days after filing of this Red Herring Prospectus with the RoC. This Red Herring Prospectus will become the Prospectus upon filing with the RoC after the Pricing Date, including any addenda or corrigenda thereto Refund Account The account opened with the Refund Bank, from which refunds, if any, of the whole or part of the Bid Amount to the Anchor Investors shall be made. Refund Bank The bank which is a clearing member registered with SEBI under the SEBI BTI Regulations with whom the Refund Account has been opened, in this case being [COMPANY_042] Registered Brokers Stockbrokers registered with the stock exchanges having nationwide terminals, other than the members of the Syndicate and eligible to procure Bids in terms of the SEBI ICDR Master Circular and the SEBI circular no. CIR/CFD/14/2012 dated October 4, 2012, and the UPI Circulars RTAs/Registrar and Share Transfer Agents The registrar and share transfer agents registered with SEBI and eligible to procure Bids at the Designated RTA Locations as per the list available on the websites of BSE and NSE, and the UPI Circulars Registrar Agreement The agreement dated May 22, 2025 between our Company, the Promoter Selling Shareholders and the Registrar to the Offer in relation to the responsibilities and obligations of the Registrar to the Offer pertaining to the Offer Registrar to the [COMPANY_047] ([COMPANY_015]) Retail Individual Investors(s)/ RII(s) Individual Bidders, who have Bid for the Equity Shares for an amount not more than ₹ 0.20 million in any of the bidding options in the Offer (including HUFs applying through their Karta and Eligible NRIs and does not include NRIs other than Eligible NRIs) Retail Portion The portion of the Offer being not less than 35% of the Offer consisting of [●] Equity Shares of face value of ₹ 5 each, available for allocation to Retail Individual Investors as per the SEBI ICDR Regulations, subject to valid Bids being received at or above the Offer Price Revision Form Form used by the Bidders to modify the quantity of the Equity Shares or the Bid Amount in any of their ASBA Form(s) or any previous Revision Form(s) QIB Bidders and Non-Institutional Investors are not allowed to withdraw or lower their Bids (in terms of quantity of Equity Shares or the Bid Amount) at any stage. Retail Individual Investors can revise their Bids during the Bid/Offer Period and withdraw their Bids until Bid/Offer Closing Date SCORES SEBI Complaints Redressal Mechanism Self-Certified Syndicate Bank(s)/ SCSB(s) (i) The banks registered with SEBI, offering services in relation to ASBA (other than through UPI Mechanism), a list of which is available on the website of SEBI at www.sebi.gov.in/sebiweb/other/OtherAction.do?doRecognisedFpi=yes&amp;intmId=34 or www.sebi.gov.in/sebiweb/other/OtherAction.do?doRecognisedFpi=yes&amp;intmId=35, as applicable, or such other website as updated from time to time, and (i) The banks registered with SEBI, enabled for UPI Mechanism, a list of which is available on the website of SEBI at www.sebi.gov.in/sebiweb/other/OtherAction.do?doRecognisedFpi=yes&amp;intmId=40 or such other website as updated from time to time Share Escrow Agent The share escrow agent appointed pursuant to the Share Escrow Agreement, namely, [COMPANY_048] ( [COMPANY_015] ) Share Escrow Agreement The agreement dated December 6, 2025 entered into between our Company, the Promoter Selling Shareholders and the Share Escrow Agent in connection with the transfer of the respective portion of Equity Shares being offered by each Promoter Selling Shareholder in the Offer for Sale portion of the Offer and credit of such Equity Shares to the demat account of the Allottees in accordance with the Basis of Allotment Specified Locations Bidding centres where the Syndicate shall accept ASBA Forms from Bidders, a list of which</w:t>
       </w:r>
     </w:p>
     <w:p>
@@ -408,7 +408,7 @@
     </w:p>
     <w:p>
       <w:r>
-        <w:t>will be included in the Bid cum Application Form Sponsor Banks The Bankers to the Offer registered with SEBI, which have been appointed by our Company to act as a conduit between the Stock Exchanges and NPCI in order to push the UPI Mandate Request and/or payment instructions of the UPI Bidders using the UPI and carry out other responsibilities, in terms of the UPI Circulars, in this case being Globex Industries Limited (42) and Pied Piper Inc. (46) Stock Exchanges Collectively, Vance Refrigeration LLC and National Stock Exchange of Dunder Mifflin Private Limited STT Securities transaction tax Syndicate Agreement Agreement dated December 9, 2025, entered into and amongst our Company, the Promoter Selling Shareholders, the BRLMs, the Syndicate Members and the Registrar to the Offer in relation to collection of Bid cum Application Forms by Syndicate Syndicate Members Intermediaries (other than the BRLMs) registered with SEBI who are permitted to accept bids, applications and place order with respect to the Offer and carry out activities as an underwriter, namely, Acme Corp Ltd. (41) and Tyrell Corporation</w:t>
+        <w:t>will be included in the Bid cum Application Form Sponsor Banks The Bankers to the Offer registered with SEBI, which have been appointed by our Company to act as a conduit between the Stock Exchanges and NPCI in order to push the UPI Mandate Request and/or payment instructions of the UPI Bidders using the UPI and carry out other responsibilities, in terms of the UPI Circulars, in this case being [COMPANY_042] and [COMPANY_046] Stock Exchanges Collectively, [COMPANY_010] and National Stock Exchange of [COMPANY_011] STT Securities transaction tax Syndicate Agreement Agreement dated December 9, 2025, entered into and amongst our Company, the Promoter Selling Shareholders, the BRLMs, the Syndicate Members and the Registrar to the Offer in relation to collection of Bid cum Application Forms by Syndicate Syndicate Members Intermediaries (other than the BRLMs) registered with SEBI who are permitted to accept bids, applications and place order with respect to the Offer and carry out activities as an underwriter, namely, [COMPANY_041] and [COMPANY_013]</w:t>
       </w:r>
     </w:p>
     <w:p>
@@ -444,7 +444,7 @@
     </w:p>
     <w:p>
       <w:r>
-        <w:t>Oscorp Limited (49) Calendar Year or year Unless the context otherwise requires, shall refer to the twelve-month period ending December 31 Category I AIF AIFs registered as “Category I alternative investment funds” under the SEBI AIF Regulations Category I FPIs FPIs registered as “Category I foreign portfolio investors” under the SEBI FPI Regulations Category II AIF AIFs registered as “Category II alternative investment funds” under the SEBI AIF Regulations Category II FPIs FPIs registered as “Category II foreign portfolio investors” under the SEBI FPI Regulations Category III AIF AIFs registered as “Category III alternative investment funds” under the SEBI AIF Regulations CAGR Compound Annual Growth Rate CDSL Central Depository Services (Vance Refrigeration LLC (50) CESTAT Customs, Excise and Service Tax Appellate Tribunal Companies Act, 1956 Companies Act, 1956, and the rules, regulations, notifications, modifications and clarifications made thereunder, as the context requires Companies Act, 2013/ Companies Act Companies Act, 2013 and the rules, regulations, notifications, modifications and clarifications thereunder CSR Corporate social responsibility</w:t>
+        <w:t>[COMPANY_049] Calendar Year or year Unless the context otherwise requires, shall refer to the twelve-month period ending December 31 Category I AIF AIFs registered as “Category I alternative investment funds” under the SEBI AIF Regulations Category I FPIs FPIs registered as “Category I foreign portfolio investors” under the SEBI FPI Regulations Category II AIF AIFs registered as “Category II alternative investment funds” under the SEBI AIF Regulations Category II FPIs FPIs registered as “Category II foreign portfolio investors” under the SEBI FPI Regulations Category III AIF AIFs registered as “Category III alternative investment funds” under the SEBI AIF Regulations CAGR Compound Annual Growth Rate CDSL Central Depository Services ([COMPANY_050] CESTAT Customs, Excise and Service Tax Appellate Tribunal Companies Act, 1956 Companies Act, 1956, and the rules, regulations, notifications, modifications and clarifications made thereunder, as the context requires Companies Act, 2013/ Companies Act Companies Act, 2013 and the rules, regulations, notifications, modifications and clarifications thereunder CSR Corporate social responsibility</w:t>
       </w:r>
     </w:p>
     <w:p>
@@ -480,7 +480,7 @@
     </w:p>
     <w:p>
       <w:r>
-        <w:t>N.A. or NA Not applicable NACH National Automated Clearing House NEFT National electronic fund transfer Non-Resident A person resident outside India, as defined under Dunder Mifflin Private Limited (51) of India NRE Account Non-resident external account established in accordance with the Foreign Exchange Management (Deposit) Regulations, 2016 NRI A person resident outside India who is a citizen of India as defined under the Foreign Exchange Management (Deposit) Regulations, 2016 or is an ‘Overseas Citizen of India’ cardholder within the meaning of section 7(A) of the Citizenship Act, 1955 NRO Account Non-resident ordinary account established in accordance with the Foreign Exchange Management (Deposit) Regulations, 2016 Soylent Corp Limited (52) NSE National Stock Exchange of Dunder Mifflin Private Limited OCB A company, partnership, society or other corporate body owned directly or indirectly to the extent of at least 60% by NRIs including overseas trusts in which not less than 60% of the beneficial interest is irrevocably held by NRIs directly or indirectly and which was in existence on October 3, 2003, and immediately before such date had taken benefits under the general permission granted to overseas corporate bodies under the FEMA. Overseas corporate bodies are not allowed to invest in the Offer</w:t>
+        <w:t>N.A. or NA Not applicable NACH National Automated Clearing House NEFT National electronic fund transfer Non-Resident A person resident outside India, as defined under [COMPANY_051] of India NRE Account Non-resident external account established in accordance with the Foreign Exchange Management (Deposit) Regulations, 2016 NRI A person resident outside India who is a citizen of India as defined under the Foreign Exchange Management (Deposit) Regulations, 2016 or is an ‘Overseas Citizen of India’ cardholder within the meaning of section 7(A) of the Citizenship Act, 1955 NRO Account Non-resident ordinary account established in accordance with the Foreign Exchange Management (Deposit) Regulations, 2016 [COMPANY_052] NSE National Stock Exchange of [COMPANY_011] OCB A company, partnership, society or other corporate body owned directly or indirectly to the extent of at least 60% by NRIs including overseas trusts in which not less than 60% of the beneficial interest is irrevocably held by NRIs directly or indirectly and which was in existence on October 3, 2003, and immediately before such date had taken benefits under the general permission granted to overseas corporate bodies under the FEMA. Overseas corporate bodies are not allowed to invest in the Offer</w:t>
       </w:r>
     </w:p>
     <w:p>
@@ -552,7 +552,7 @@
     </w:p>
     <w:p>
       <w:r>
-        <w:t>PMAY Pradhan Mantri Awas Yojana PM-KUSUM Pradhan Mantri Kisan Urja Suraksha evam Utthaan Mahabhiyan Tyrell Corporation (53) QSR Quick Service Restaurants RBI Reserve Bank of India RDSS Revamped Distribution Sector Scheme RES Renewable Energy Resources ROCE Return on Capital Employed RoDTEP Remission of Duties and Taxes on Exported Products RoHS Restriction of Hazardous Substances RPO Renewable Purchase Obligations RRTS Regional rapid transit systems Cyberdyne Systems Limited (54) of Dunder Mifflin Private Limited TIES Trade Infrastructure for Export Scheme UK United Kingdom UL Underwriters Laboratories W&amp;C Wires and cables WEO World Economic Outlook Y-O-Y Year-on-year Growth</w:t>
+        <w:t>PMAY Pradhan Mantri Awas Yojana PM-KUSUM Pradhan Mantri Kisan Urja Suraksha evam Utthaan Mahabhiyan [COMPANY_053] QSR Quick Service Restaurants RBI Reserve Bank of India RDSS Revamped Distribution Sector Scheme RES Renewable Energy Resources ROCE Return on Capital Employed RoDTEP Remission of Duties and Taxes on Exported Products RoHS Restriction of Hazardous Substances RPO Renewable Purchase Obligations RRTS Regional rapid transit systems [COMPANY_054] of [COMPANY_011] TIES Trade Infrastructure for Export Scheme UK United Kingdom UL Underwriters Laboratories W&amp;C Wires and cables WEO World Economic Outlook Y-O-Y Year-on-year Growth</w:t>
       </w:r>
     </w:p>
     <w:p>
@@ -606,7 +606,7 @@
     </w:p>
     <w:p>
       <w:r>
-        <w:t>Non-GAAP Financial Measures Certain measures included in this Red Herring Prospectus, for instance EBITDA, EBITDA Margin, Net Debt, Return on Capital Employed, Return on Equity, and other non- GAAP measures (the “Non-GAAP Measures’’ ), presented in this Red Herring Prospectus are supplemental measures of our performance and liquidity that are not required by, or presented in accordance with Ind AS, IFRS or US GAAP. Furthermore, these Non-GAAP Measures are not a measurement of our financial performance or liquidity under Indian GAAP, IFRS or US GAAP and should not be considered as an alternative to net profit/loss, revenue from operations or any other performance measures derived in accordance with Ind AS, IFRS or US GAAP or as an alternative to cash flow from operations or as a measure of our liquidity. Further, these Non-GAAP Measures and other statistical and other information relating to operations and financial performance should not be considered in isolation or construed as an alternative to cash flows, profit/ (loss) for the years/ period or any other measure of financial performance or as an indicator of our operating performance, liquidity, profitability or cash flows generated by operating, investing or financing activities derived in accordance with Ind AS, Indian GAAP, IFRS or US GAAP. In addition, these Non-GAAP Measures and other statistical and other information relating to operations and financial performance, are not standardised terms and may not be computed on the basis of any standard methodology that is applicable across the industry and therefore, may not be comparable to financial measures of similar nomenclature that may be computed and presented by other companies and are not measures of operating performance or liquidity defined by Ind AS and may not be comparable to similarly titled measures presented by other companies. Further, they may have limited utility as a comparative measure. Although such Non-GAAP financial measures are not a measure of performance calculated in accordance with applicable accounting standards, our Company’s management believes that they are useful to an investor in evaluating us as they are widely used measures to evaluate a company’s operating performance. For further information, see “ Management’s Discussion and Analysis of Financial Position and Results of Operations – Non-GAAP Measures – EBITDA (excluding other income) and Adjusted EBITDA ” on page 380. Industry and Market Data Unless stated otherwise, industry and market data used in this Red Herring Prospectus has been obtained or derived from the report titled “ Industry Research Report on Magnet Winding Wires Market in India ” dated November 26, 2025 (“ CARE Report ”), prepared by Globex Industries Limited (22) (“ CareEdge Research ”), which has been prepared exclusively for the purpose of understanding the industry in connection with the Offer and commissioned and paid for by our Company, pursuant to the engagement letter dated December 2, 2024. The CARE Report is available on the website of our Company at the following weblink: https://kshinternational.com/investor-relations/industry-report/. Further, CareEdge Research, pursuant to their consent letter dated November 26, 2025 (“ Letter ”) has accorded their no objection and consent to use the CARE Report. CareEdge Research, pursuant to their Letter, has also confirmed that it is an independent agency and has no conflict of interest issuing the CARE Report, and confirmed that it is not related, either directly or indirectly, to our Company, our Directors, our Promoters (including the Promoter Selling Shareholders), our Key Managerial Personnel, our Senior Management, our Group Companies or the Book Running Lead Managers. Industry publications generally state that the information contained in such publications has been obtained from publicly available documents from various sources believed to be reliable but accuracy, completeness relevance of such information shall be subject to the disclaimers, context and underlying assumptions of such sources. The data used in these sources may have been reclassified by us for the purposes of presentation and may also not be comparable. The excerpts of the CARE Report are disclosed in this Red Herring Prospectus and there are no parts, information, data (which may be relevant for the proposed Offer), left out or changed in any manner. The extent to which the industry and market data presented in this Red Herring Prospectus is meaningful and depends upon the reader’s familiarity with, and understanding of, the methodologies used in compiling such information. There are no standard data gathering methodologies in the industry in which our Company conducts business and methodologies, and assumptions may vary widely among different market and industry sources. Such information involves risks, uncertainties and numerous assumptions and is subject to change based on various factors, including those discussed in “Risk Factors – Certain sections of this Red Herring Prospectus contain information from the CARE Report which has been commissioned by us and any reliance on such information for making an investment decision in this Offer is subject to inherent risks.” on page 40. Accordingly, no investment decision should be solely made on the basis of such information. In accordance with the disclosure requirements under the SEBI ICDR Regulations , the section titled “Basis for the Offer Price” on page 124 includes information relating to our listed peer group companies. Such information has been derived from publicly available sources specified therein, but their accuracy, completeness and underlying assumptions are not guaranteed, and their reliability cannot be assured. Accordingly, no investment decisions should be based solely on such information. The extent to which the industry and industry data used in this Red Herring Prospectus is meaningful depends on the reader’s familiarity with and understanding of the methodologies used in compiling such data. There are no standard data gathering methodologies in the industry in which the business of our Company is conducted, and methodologies and assumptions may vary widely among different industry sources.</w:t>
+        <w:t>Non-GAAP Financial Measures Certain measures included in this Red Herring Prospectus, for instance EBITDA, EBITDA Margin, Net Debt, Return on Capital Employed, Return on Equity, and other non- GAAP measures (the “Non-GAAP Measures’’ ), presented in this Red Herring Prospectus are supplemental measures of our performance and liquidity that are not required by, or presented in accordance with Ind AS, IFRS or US GAAP. Furthermore, these Non-GAAP Measures are not a measurement of our financial performance or liquidity under Indian GAAP, IFRS or US GAAP and should not be considered as an alternative to net profit/loss, revenue from operations or any other performance measures derived in accordance with Ind AS, IFRS or US GAAP or as an alternative to cash flow from operations or as a measure of our liquidity. Further, these Non-GAAP Measures and other statistical and other information relating to operations and financial performance should not be considered in isolation or construed as an alternative to cash flows, profit/ (loss) for the years/ period or any other measure of financial performance or as an indicator of our operating performance, liquidity, profitability or cash flows generated by operating, investing or financing activities derived in accordance with Ind AS, Indian GAAP, IFRS or US GAAP. In addition, these Non-GAAP Measures and other statistical and other information relating to operations and financial performance, are not standardised terms and may not be computed on the basis of any standard methodology that is applicable across the industry and therefore, may not be comparable to financial measures of similar nomenclature that may be computed and presented by other companies and are not measures of operating performance or liquidity defined by Ind AS and may not be comparable to similarly titled measures presented by other companies. Further, they may have limited utility as a comparative measure. Although such Non-GAAP financial measures are not a measure of performance calculated in accordance with applicable accounting standards, our Company’s management believes that they are useful to an investor in evaluating us as they are widely used measures to evaluate a company’s operating performance. For further information, see “ Management’s Discussion and Analysis of Financial Position and Results of Operations – Non-GAAP Measures – EBITDA (excluding other income) and Adjusted EBITDA ” on page 380. Industry and Market Data Unless stated otherwise, industry and market data used in this Red Herring Prospectus has been obtained or derived from the report titled “ Industry Research Report on Magnet Winding Wires Market in India ” dated November 26, 2025 (“ CARE Report ”), prepared by [COMPANY_022] (“ CareEdge Research ”), which has been prepared exclusively for the purpose of understanding the industry in connection with the Offer and commissioned and paid for by our Company, pursuant to the engagement letter dated December 2, 2024. The CARE Report is available on the website of our Company at the following weblink: https://kshinternational.com/investor-relations/industry-report/. Further, CareEdge Research, pursuant to their consent letter dated November 26, 2025 (“ Letter ”) has accorded their no objection and consent to use the CARE Report. CareEdge Research, pursuant to their Letter, has also confirmed that it is an independent agency and has no conflict of interest issuing the CARE Report, and confirmed that it is not related, either directly or indirectly, to our Company, our Directors, our Promoters (including the Promoter Selling Shareholders), our Key Managerial Personnel, our Senior Management, our Group Companies or the Book Running Lead Managers. Industry publications generally state that the information contained in such publications has been obtained from publicly available documents from various sources believed to be reliable but accuracy, completeness relevance of such information shall be subject to the disclaimers, context and underlying assumptions of such sources. The data used in these sources may have been reclassified by us for the purposes of presentation and may also not be comparable. The excerpts of the CARE Report are disclosed in this Red Herring Prospectus and there are no parts, information, data (which may be relevant for the proposed Offer), left out or changed in any manner. The extent to which the industry and market data presented in this Red Herring Prospectus is meaningful and depends upon the reader’s familiarity with, and understanding of, the methodologies used in compiling such information. There are no standard data gathering methodologies in the industry in which our Company conducts business and methodologies, and assumptions may vary widely among different market and industry sources. Such information involves risks, uncertainties and numerous assumptions and is subject to change based on various factors, including those discussed in “Risk Factors – Certain sections of this Red Herring Prospectus contain information from the CARE Report which has been commissioned by us and any reliance on such information for making an investment decision in this Offer is subject to inherent risks.” on page 40. Accordingly, no investment decision should be solely made on the basis of such information. In accordance with the disclosure requirements under the SEBI ICDR Regulations , the section titled “Basis for the Offer Price” on page 124 includes information relating to our listed peer group companies. Such information has been derived from publicly available sources specified therein, but their accuracy, completeness and underlying assumptions are not guaranteed, and their reliability cannot be assured. Accordingly, no investment decisions should be based solely on such information. The extent to which the industry and industry data used in this Red Herring Prospectus is meaningful depends on the reader’s familiarity with and understanding of the methodologies used in compiling such data. There are no standard data gathering methodologies in the industry in which the business of our Company is conducted, and methodologies and assumptions may vary widely among different industry sources.</w:t>
       </w:r>
     </w:p>
     <w:p>
@@ -678,7 +678,7 @@
     </w:p>
     <w:p>
       <w:r>
-        <w:t>SUMMARY OF THE OFFER DOCUMENT This section is a general summary of certain disclosures included in this Red Herring Prospectus and is not exhaustive, nor does it purport to contain a summary of all the disclosures in this Red Herring Prospectus or all details relevant to prospective investors. This summary should be read in conjunction with, and is qualified in its entirety by, the more detailed information appearing elsewhere in this Red Herring Prospectus, including the sections “Risk Factors”, “Our Business”, “Industry Overview”, “Capital Structure”, “The Offer”, “Restated Financial Statements”, “Objects of the Offer”, “Management’s Discussion and Analysis of Financial Position and Results of Operations” and “Outstanding Litigation and Material Developments” on pages 28, 211, 137, 84, 67, 280, 106, 356, 388, respectively of this Red Herring Prospectus. Primary business of our Company We are the third largest manufacturer of magnet winding wires in India in terms of production capacity in Fiscal 2025 ( Source: CARE Report ). We are also the largest exporter of magnet winding wires from India in terms of export revenues in Fiscal 2025 ( Source: CARE Report ). Our key products include round enamelled copper/ aluminium magnet winding wires, paper insulted rectangular copper/ aluminium magnet winding wires, continuously transposed conductors, rectangular enamelled copper/ aluminum magnet winding wires and bunched paper insulated copper magnet winding wires. Our products are critical components of capital goods such as transformers, motors, alternators and generators. For further details, see “Our Business” on page 211. Summary of industry in which our Company operates As per the CARE Report, the electric wires and cables market in India is experiencing robust growth, fueled by a confluence of factors that are reshaping the industrial and technological landscape of the nation. Electric wires and cables play a pivotal role in supporting various industries, including electrical equipment, telecommunications, motor vehicles, and construction. India's electric wires and cables market was valued at USD 19.68 billion in CY24, reflecting a CAGR of 6.08% from CY19 to CY24. The market is projected to reach USD 29.85 billion by CY28, expanding at a CAGR of 10.98% from CY24 to CY28. For further details, see “ Industry Overview ” on page 137. Our Promoters Jane Smith, Peter Parker, Alex Morgan, Taylor Brown, Jordan Lee, Globex Industries Limited, Umbrella Holdings Private Limited, Initech Solutions Limited, Hooli Technologies Limited, Pied Piper Inc., Stark Industries Limited and Wayne Enterprises Limited are the Promoters of our Company. For further details, see “ Our Promoters and Promoter Group ” on page 269. The Offer The following table summarizes the details of the Offer: Offer (1) Up to [●] Equity Shares of face value of ₹ 5 each for cash at price of ₹ [●] per Equity Share (including a premium of [●] per Equity Share), aggregating up to ₹ 7,100.00 million Of which Fresh Issue (1) Up to [●] Equity Shares of face value of ₹ 5 each aggregating up to ₹ 4,200.00 million Offer for Sale (2) Up to [●] Equity Shares of face value of ₹ 5 each aggregating up to ₹ 2,900.00 million (1) The Offer has been authorized pursuant to the resolution passed by our Board dated May 6, 2025 and the Fresh Issue has been authorized by our Shareholders pursuant to a special resolution passed on May 6, 2025. (2) Each of the Promoter Selling Shareholders, severally and not jointly, confirms that its portion of the Offered Shares are eligible for being offered for sale in terms of Regulation 8 of the SEBI ICDR Regulations. Each Promoter Selling Shareholder has, severally and not jointly, consented to the sale of its portion of the Offered Shares in the Offer for Sale. For further details on the authorisation of the Promoter Selling Shareholders in relation to the Offered Shares, see “Other Regulatory and Statutory Disclosures – Authority for the Offer” on page 398. The Offer shall constitute [●]% of the post-Offer paid-up equity share capital of our Company. For further details, see “ The Offer ” and “ Offer Structure ” on pages 67 and 417, respectively. Objects of the Offer The Net Proceeds are proposed to be utilised towards the following Objects:</w:t>
+        <w:t>SUMMARY OF THE OFFER DOCUMENT This section is a general summary of certain disclosures included in this Red Herring Prospectus and is not exhaustive, nor does it purport to contain a summary of all the disclosures in this Red Herring Prospectus or all details relevant to prospective investors. This summary should be read in conjunction with, and is qualified in its entirety by, the more detailed information appearing elsewhere in this Red Herring Prospectus, including the sections “Risk Factors”, “Our Business”, “Industry Overview”, “Capital Structure”, “The Offer”, “Restated Financial Statements”, “Objects of the Offer”, “Management’s Discussion and Analysis of Financial Position and Results of Operations” and “Outstanding Litigation and Material Developments” on pages 28, 211, 137, 84, 67, 280, 106, 356, 388, respectively of this Red Herring Prospectus. Primary business of our Company We are the third largest manufacturer of magnet winding wires in India in terms of production capacity in Fiscal 2025 ( Source: CARE Report ). We are also the largest exporter of magnet winding wires from India in terms of export revenues in Fiscal 2025 ( Source: CARE Report ). Our key products include round enamelled copper/ aluminium magnet winding wires, paper insulted rectangular copper/ aluminium magnet winding wires, continuously transposed conductors, rectangular enamelled copper/ aluminum magnet winding wires and bunched paper insulated copper magnet winding wires. Our products are critical components of capital goods such as transformers, motors, alternators and generators. For further details, see “Our Business” on page 211. Summary of industry in which our Company operates As per the CARE Report, the electric wires and cables market in India is experiencing robust growth, fueled by a confluence of factors that are reshaping the industrial and technological landscape of the nation. Electric wires and cables play a pivotal role in supporting various industries, including electrical equipment, telecommunications, motor vehicles, and construction. India's electric wires and cables market was valued at USD 19.68 billion in CY24, reflecting a CAGR of 6.08% from CY19 to CY24. The market is projected to reach USD 29.85 billion by CY28, expanding at a CAGR of 10.98% from CY24 to CY28. For further details, see “ Industry Overview ” on page 137. Our Promoters [PERSON_002], [PERSON_003], [PERSON_004], [PERSON_005], [PERSON_006], [COMPANY_002], [COMPANY_003], [COMPANY_004], [COMPANY_005], [COMPANY_006], [COMPANY_007] and [COMPANY_008] are the Promoters of our Company. For further details, see “ Our Promoters and Promoter Group ” on page 269. The Offer The following table summarizes the details of the Offer: Offer (1) Up to [●] Equity Shares of face value of ₹ 5 each for cash at price of ₹ [●] per Equity Share (including a premium of [●] per Equity Share), aggregating up to ₹ 7,100.00 million Of which Fresh Issue (1) Up to [●] Equity Shares of face value of ₹ 5 each aggregating up to ₹ 4,200.00 million Offer for Sale (2) Up to [●] Equity Shares of face value of ₹ 5 each aggregating up to ₹ 2,900.00 million (1) The Offer has been authorized pursuant to the resolution passed by our Board dated May 6, 2025 and the Fresh Issue has been authorized by our Shareholders pursuant to a special resolution passed on May 6, 2025. (2) Each of the Promoter Selling Shareholders, severally and not jointly, confirms that its portion of the Offered Shares are eligible for being offered for sale in terms of Regulation 8 of the SEBI ICDR Regulations. Each Promoter Selling Shareholder has, severally and not jointly, consented to the sale of its portion of the Offered Shares in the Offer for Sale. For further details on the authorisation of the Promoter Selling Shareholders in relation to the Offered Shares, see “Other Regulatory and Statutory Disclosures – Authority for the Offer” on page 398. The Offer shall constitute [●]% of the post-Offer paid-up equity share capital of our Company. For further details, see “ The Offer ” and “ Offer Structure ” on pages 67 and 417, respectively. Objects of the Offer The Net Proceeds are proposed to be utilised towards the following Objects:</w:t>
       </w:r>
     </w:p>
     <w:p>
@@ -696,7 +696,7 @@
     </w:p>
     <w:p>
       <w:r>
-        <w:t>( ₹ in million) Particulars Estimated Amount Prepayment and/or repayment, in full or in part, of all or a portion of certain outstanding borrowings availed by our Company 2,259.77 Funding the capital expenditure requirements of our Company towards: (i) purchasing and setting up of new machinery for expansion at our Supa Facility (i) purchasing and setting up of new machinery at Unit 2 in Chakan, Pune in Maharashtra 870.17 Funding the capital expenditure requirements of our Company towards purchasing and setting up of a rooftop solar power plant for power generation at our Supa Facility 88.28 General corporate purposes (1) [●] Net Proceeds (1) [●] (1) To be finalised upon determination of the Offer Price and updated in the Prospectus prior to filing with the RoC. The amount utilised for general corporate purposes shall not exceed 25% of the Gross Proceeds. For further information, see “ Objects of the Offer ” on page 106. Aggregate pre-Offer and post-Offer shareholding of our Promoters, the members of our Promoter Group, the Promoter Selling Shareholders of our Company The aggregate pre-Offer and post-Offer shareholding of our Promoters, the members of our Promoter Group and Promoter Selling Shareholders as on the date of this Red Herring Prospectus is set out below: S. N o. Name of the Shareholder Pre-Offer equity share capital Post-Offer equity share capital ^ No. of Equity Shares of face value of ₹ 5 each % of paid-up Equity Share capital No. of Equity Shares of face value of ₹ 5 each % of paid-up Equity Share capital Promoters 1 . Jane Smith * 26,704,570 47.00% [●] [●] 2 . Peter Parker * 7,386,270 13.00% [●] [●] 3 . Alex Morgan * 10,907,771 19.20% [●] [●] 4 . Taylor Brown * 10,907,771 19.20% [●] [●] 5 . Jordan Lee 100 0.00 ** % [●] [●] 6 . Globex Industries Limited 10 0.00 ** % [●] [●] 7 . Umbrella Holdings Private Limited 10 0.00 ** % [●] [●] 8 . Initech Solutions Limited 10 0.00 ** % [●] [●] 9 . Hooli Technologies Limited 10 0.00 ** % [●] [●] 1 0. Pied Piper Inc. 10 0.00 ** % [●] [●] 1 1. Stark Industries Limited 10 0.00 ** % [●] [●] Sub-total (A) 55,906,542 98.40% [●] [●] Promoter Group 1 2. Skyler West 100 0.00 ** % [●] [●]</w:t>
+        <w:t>( ₹ in million) Particulars Estimated Amount Prepayment and/or repayment, in full or in part, of all or a portion of certain outstanding borrowings availed by our Company 2,259.77 Funding the capital expenditure requirements of our Company towards: (i) purchasing and setting up of new machinery for expansion at our Supa Facility (i) purchasing and setting up of new machinery at Unit 2 in Chakan, Pune in Maharashtra 870.17 Funding the capital expenditure requirements of our Company towards purchasing and setting up of a rooftop solar power plant for power generation at our Supa Facility 88.28 General corporate purposes (1) [●] Net Proceeds (1) [●] (1) To be finalised upon determination of the Offer Price and updated in the Prospectus prior to filing with the RoC. The amount utilised for general corporate purposes shall not exceed 25% of the Gross Proceeds. For further information, see “ Objects of the Offer ” on page 106. Aggregate pre-Offer and post-Offer shareholding of our Promoters, the members of our Promoter Group, the Promoter Selling Shareholders of our Company The aggregate pre-Offer and post-Offer shareholding of our Promoters, the members of our Promoter Group and Promoter Selling Shareholders as on the date of this Red Herring Prospectus is set out below: S. N o. Name of the Shareholder Pre-Offer equity share capital Post-Offer equity share capital ^ No. of Equity Shares of face value of ₹ 5 each % of paid-up Equity Share capital No. of Equity Shares of face value of ₹ 5 each % of paid-up Equity Share capital Promoters 1 . [PERSON_002] * 26,704,570 47.00% [●] [●] 2 . [PERSON_003] * 7,386,270 13.00% [●] [●] 3 . [PERSON_004] * 10,907,771 19.20% [●] [●] 4 . [PERSON_005] * 10,907,771 19.20% [●] [●] 5 . [PERSON_006] 100 0.00 ** % [●] [●] 6 . [COMPANY_002] 10 0.00 ** % [●] [●] 7 . [COMPANY_003] 10 0.00 ** % [●] [●] 8 . [COMPANY_004] 10 0.00 ** % [●] [●] 9 . [COMPANY_005] 10 0.00 ** % [●] [●] 1 0. [COMPANY_006] 10 0.00 ** % [●] [●] 1 1. [COMPANY_007] 10 0.00 ** % [●] [●] Sub-total (A) 55,906,542 98.40% [●] [●] Promoter Group 1 2. [PERSON_015] 100 0.00 ** % [●] [●]</w:t>
       </w:r>
     </w:p>
     <w:p>
@@ -714,7 +714,7 @@
     </w:p>
     <w:p>
       <w:r>
-        <w:t>1 3. Logan Grey 100 0.00 ** % [●] [●] Sub-total (B) 200 0.00 ** % [●] [●] Total (A + B) 55,906,742 98.40% [●] [●] * Also, the Promoter Selling Shareholder. ** The number is negligible and below the rounding off norms adopted by our Company. ^ Subject to completion of the Offer and finalisation of the Basis of Allotment. For further details, see “Capital Structure” on page 84. Aggregate pre-Offer and post-Offer shareholding of our Promoters, members of our Promoter Group and the additional top 10 Shareholders of our Company The aggregate pre-Offer and post-Offer shareholding of our Promoters, members of our Promoter Group and additional top 10 Shareholders (apart from Promoters and members of our Promoter Group) as a percentage of the pre-Offer and post-Offer paid-up Equity Share capital of our Company is set out below: Name Pre-Offer Post-Offer shareholding as at Allotment ^ Number of Equity Shares of face value of ₹ 5 each Percentage of pre-Offer Equity Share capital (%) At the lower end of the price band ( ₹ [●]) At the upper end of the price band ( ₹ [●]) Number of Equity Shares of face value of ₹ 5 each Percentage of post-Offer Equity Share capital (%) Number of Equity Shares of face value of ₹ 5 each Percentage of post-Offer Equity Share capital (%) Promoters Jane Smith * 26,70 4,570 [●] [●] [●] [●]</w:t>
+        <w:t>1 3. [PERSON_016] 100 0.00 ** % [●] [●] Sub-total (B) 200 0.00 ** % [●] [●] Total (A + B) 55,906,742 98.40% [●] [●] * Also, the Promoter Selling Shareholder. ** The number is negligible and below the rounding off norms adopted by our Company. ^ Subject to completion of the Offer and finalisation of the Basis of Allotment. For further details, see “Capital Structure” on page 84. Aggregate pre-Offer and post-Offer shareholding of our Promoters, members of our Promoter Group and the additional top 10 Shareholders of our Company The aggregate pre-Offer and post-Offer shareholding of our Promoters, members of our Promoter Group and additional top 10 Shareholders (apart from Promoters and members of our Promoter Group) as a percentage of the pre-Offer and post-Offer paid-up Equity Share capital of our Company is set out below: Name Pre-Offer Post-Offer shareholding as at Allotment ^ Number of Equity Shares of face value of ₹ 5 each Percentage of pre-Offer Equity Share capital (%) At the lower end of the price band ( ₹ [●]) At the upper end of the price band ( ₹ [●]) Number of Equity Shares of face value of ₹ 5 each Percentage of post-Offer Equity Share capital (%) Number of Equity Shares of face value of ₹ 5 each Percentage of post-Offer Equity Share capital (%) Promoters [PERSON_002] * 26,70 4,570 [●] [●] [●] [●]</w:t>
       </w:r>
     </w:p>
     <w:p>
@@ -732,7 +732,7 @@
     </w:p>
     <w:p>
       <w:r>
-        <w:t>Name Pre-Offer Post-Offer shareholding as at Allotment ^ Number of Equity Shares of face value of ₹ 5 each Percentage of pre-Offer Equity Share capital (%) At the lower end of the price band ( ₹ [●]) At the upper end of the price band ( ₹ [●]) Number of Equity Shares of face value of ₹ 5 each Percentage of post-Offer Equity Share capital (%) Number of Equity Shares of face value of ₹ 5 each Percentage of post-Offer Equity Share capital (%) Peter Parker * 7,386,270 13.00% [●] [●] [●] [●] Alex Morgan * 10,907,771 19.20% [●] [●] [●] [●] Taylor Brown * 10,907,771 19.20% [●] [●] [●] [●] Jordan Lee 100 0.00 ** % [●] [●] [●] [●] Globex Industries Limited 10 0.00 ** % [●] [●] [●] [●] Umbrella Holdings Private Limited 10 0.00 ** % [●] [●] [●] [●] Initech Solutions Limited 10 0.00 ** % [●] [●] [●] [●] Hooli Technologies Limited 10 0.00 ** % [●] [●] [●] [●] Pied Piper Inc. 10 0.00 ** % [●] [●] [●] [●] Stark Industries Limited 10 0.00 ** % [●] [●] [●] [●] Sub-total (A) 55,906,542 98.40% [●] [●] [●] [●] Promoter Group Skyler West 100 0.00 ** % [●] [●] [●] [●] Katyayani Balasubramania n 100 0.00 ** % [●] [●] [●] [●] Sub-total (B) 200 0.00 ** % [●] [●] [●] [●] Additional top 10 Massive Dynamic Inc. (55) 8,51,563 1.50% [●] [●] [●] [●] Dakota Mills 39,062 0.07% [●] [●] [●] [●] Reese Palmer 13,021 0.02% [●] [●] [●] [●] Hayden Brooks 2,604 0.00 ** % [●] [●] [●] [●] Finley Shaw 2,604 0.00 ** % [●] [●] [●] [●] Rowan Clarke 2,604 0.00 ** % [●] [●] [●] [●] Sub-total (C) 911,458 1.60% [●] [●] [●] [●] Total (A+B+C) 5,68,18,200 100.00% [●] [●] [●] [●]</w:t>
+        <w:t>Name Pre-Offer Post-Offer shareholding as at Allotment ^ Number of Equity Shares of face value of ₹ 5 each Percentage of pre-Offer Equity Share capital (%) At the lower end of the price band ( ₹ [●]) At the upper end of the price band ( ₹ [●]) Number of Equity Shares of face value of ₹ 5 each Percentage of post-Offer Equity Share capital (%) Number of Equity Shares of face value of ₹ 5 each Percentage of post-Offer Equity Share capital (%) [PERSON_003] * 7,386,270 13.00% [●] [●] [●] [●] [PERSON_004] * 10,907,771 19.20% [●] [●] [●] [●] [PERSON_005] * 10,907,771 19.20% [●] [●] [●] [●] [PERSON_006] 100 0.00 ** % [●] [●] [●] [●] [COMPANY_002] 10 0.00 ** % [●] [●] [●] [●] [COMPANY_003] 10 0.00 ** % [●] [●] [●] [●] [COMPANY_004] 10 0.00 ** % [●] [●] [●] [●] [COMPANY_005] 10 0.00 ** % [●] [●] [●] [●] [COMPANY_006] 10 0.00 ** % [●] [●] [●] [●] [COMPANY_007] 10 0.00 ** % [●] [●] [●] [●] Sub-total (A) 55,906,542 98.40% [●] [●] [●] [●] Promoter Group [PERSON_015] 100 0.00 ** % [●] [●] [●] [●] Katyayani Balasubramania n 100 0.00 ** % [●] [●] [●] [●] Sub-total (B) 200 0.00 ** % [●] [●] [●] [●] Additional top 10 [COMPANY_055] 8,51,563 1.50% [●] [●] [●] [●] [PERSON_017] 39,062 0.07% [●] [●] [●] [●] [PERSON_018] 13,021 0.02% [●] [●] [●] [●] [PERSON_019] 2,604 0.00 ** % [●] [●] [●] [●] [PERSON_020] 2,604 0.00 ** % [●] [●] [●] [●] [PERSON_021] 2,604 0.00 ** % [●] [●] [●] [●] Sub-total (C) 911,458 1.60% [●] [●] [●] [●] Total (A+B+C) 5,68,18,200 100.00% [●] [●] [●] [●]</w:t>
       </w:r>
     </w:p>
     <w:p>
@@ -786,7 +786,7 @@
     </w:p>
     <w:p>
       <w:r>
-        <w:t>* To the extent quantifiable. # Determined in accordance with the Materiality Policy. Notes: (1) Certain of our KMPs including, Jane Smith, Alex Morgan, Taylor Brown and Jordan Lee are also our Executive Directors. Hence, litigation against our Executive Directors have not been included under the heading of KMPs to avoid repetition. (2) Certain of our SMs including, Drew Campbell, CEO, Avery Hart, CFO, John Doe, CS and Compliance Officer, and Ellis Grant, Technical Director, are also our KMPs. Hence, litigation against our KMPs have not been included under the heading of SMs to avoid repetition. Further, as on the date of this Red Herring Prospectus, there are no outstanding litigation involving our Group Companies which may have a material impact on our Company. For further details, see “ Outstanding Litigation and Material Developments ” on page 388. Risk Factors</w:t>
+        <w:t>* To the extent quantifiable. # Determined in accordance with the Materiality Policy. Notes: (1) Certain of our KMPs including, [PERSON_002], [PERSON_004], [PERSON_005] and [PERSON_006] are also our Executive Directors. Hence, litigation against our Executive Directors have not been included under the heading of KMPs to avoid repetition. (2) Certain of our SMs including, [PERSON_012], CEO, [PERSON_013], CFO, [PERSON_001], CS and Compliance Officer, and [PERSON_022], Technical Director, are also our KMPs. Hence, litigation against our KMPs have not been included under the heading of SMs to avoid repetition. Further, as on the date of this Red Herring Prospectus, there are no outstanding litigation involving our Group Companies which may have a material impact on our Company. For further details, see “ Outstanding Litigation and Material Developments ” on page 388. Risk Factors</w:t>
       </w:r>
     </w:p>
     <w:p>
@@ -840,7 +840,7 @@
     </w:p>
     <w:p>
       <w:r>
-        <w:t>Nature of transacti on Name of related party with whom transactions have taken place Nature of relations hip Three-month period ended June 30, 20 25 % of revenue from operati ons Fiscal 202 5 % of revenue from operati ons Fiscal 202 4 % of revenue from operati ons Fiscal 202 3 % of revenue from operati ons Purchase of goods Kushal Electricals Promoters are partners in the partnershi p firm 0.39 0.01% 0.27 0.00% 0.28 0.00% 0.19 0.00% Purchase of goods Waterloo Motors Promoters are partners in the partnershi p firm - - 0.27 0.00% 0.10 0.00% 0.13 0.00% Services receive d KSH Distriparks Private Limi ted Common contro l 0.37 0.01% 3.23 0.02% 2.91 0.02% 3.66 0.03% Services receive d Aperture Science LLC (56) Promoters are trustees in the trust - - 4.26 0.02% 1.50 0.01% 2.00 0.02%</w:t>
+        <w:t>Nature of transacti on Name of related party with whom transactions have taken place Nature of relations hip Three-month period ended June 30, 20 25 % of revenue from operati ons Fiscal 202 5 % of revenue from operati ons Fiscal 202 4 % of revenue from operati ons Fiscal 202 3 % of revenue from operati ons Purchase of goods Kushal Electricals Promoters are partners in the partnershi p firm 0.39 0.01% 0.27 0.00% 0.28 0.00% 0.19 0.00% Purchase of goods Waterloo Motors Promoters are partners in the partnershi p firm - - 0.27 0.00% 0.10 0.00% 0.13 0.00% Services receive d KSH Distriparks Private Limi ted Common contro l 0.37 0.01% 3.23 0.02% 2.91 0.02% 3.66 0.03% Services receive d [COMPANY_056] Promoters are trustees in the trust - - 4.26 0.02% 1.50 0.01% 2.00 0.02%</w:t>
       </w:r>
     </w:p>
     <w:p>
@@ -858,7 +858,7 @@
     </w:p>
     <w:p>
       <w:r>
-        <w:t>Deposit paid Wonka Industries Limited (57) Common contro l - - - - - - 100.0 0 0.95% Remunerati on paid # Remuneration paid to key managerial personnel Key managerial personnel 40.10 0.72% 138.4 4 0.72% 100.3 5 0.73% 123.3 2 1.18% Remunerati on paid # Remuneration paid to relatives of Key Managerial Personnel Relatives of key managerial personnel - - 0.89 0.00% 0.98 0.01% 0.92 0.01% Share Based Payment Expense Share Based Payment Expense of Key Managerial Personnel Key managerial personnel 0.36 0.01% - - - - - - Sitting Fees paid to Independent Directors Payment to Independent Directors Independent directors 1.92 0.03% - - - - - - Total 43.14 0.77% 147.3 6 0.72% 106.1 2 0.77% 230.2 2 2.19% # Information relating to remuneration does not include provision for gratuity, which is provided on an overall actuarial valuation, as separate amounts are not available for respective Key Managerial Personnel. Remuneration paid at actual basis is considered for above computation. For further details, see “Restated Financial Statements – Note 31: Related Party Transaction ” on page 331. Financing arrangements There have been no financing arrangements whereby our Promoters, members of our Promoter Group, our Directors and their relatives (as defined under Companies Act, 2013) have financed the purchase by any other person of securities of our Company (other than in the normal course of the business of the financing entity) during a period of six months immediately preceding the date of the Draft Red Hering Prospectus and this Red Herring Prospectus. Weighted average price at which the specified securities were acquired by our Promoter and the Promoter Selling Shareholders in the last one year preceding the date of this Red Herring Prospectus The weighted average price at which the specified securities were acquired by our Promoters and the Promoter Selling Shareholders in the last one year preceding the date of this Red Herring Prospectus is given below: Name of the Promoter Number of Equity Shares of face value of ₹ 5 acquir Weighted average price of acquisition per Equity Shares (1)# (in ₹ )</w:t>
+        <w:t>Deposit paid [COMPANY_057] Common contro l - - - - - - 100.0 0 0.95% Remunerati on paid # Remuneration paid to key managerial personnel Key managerial personnel 40.10 0.72% 138.4 4 0.72% 100.3 5 0.73% 123.3 2 1.18% Remunerati on paid # Remuneration paid to relatives of Key Managerial Personnel Relatives of key managerial personnel - - 0.89 0.00% 0.98 0.01% 0.92 0.01% Share Based Payment Expense Share Based Payment Expense of Key Managerial Personnel Key managerial personnel 0.36 0.01% - - - - - - Sitting Fees paid to Independent Directors Payment to Independent Directors Independent directors 1.92 0.03% - - - - - - Total 43.14 0.77% 147.3 6 0.72% 106.1 2 0.77% 230.2 2 2.19% # Information relating to remuneration does not include provision for gratuity, which is provided on an overall actuarial valuation, as separate amounts are not available for respective Key Managerial Personnel. Remuneration paid at actual basis is considered for above computation. For further details, see “Restated Financial Statements – Note 31: Related Party Transaction ” on page 331. Financing arrangements There have been no financing arrangements whereby our Promoters, members of our Promoter Group, our Directors and their relatives (as defined under Companies Act, 2013) have financed the purchase by any other person of securities of our Company (other than in the normal course of the business of the financing entity) during a period of six months immediately preceding the date of the Draft Red Hering Prospectus and this Red Herring Prospectus. Weighted average price at which the specified securities were acquired by our Promoter and the Promoter Selling Shareholders in the last one year preceding the date of this Red Herring Prospectus The weighted average price at which the specified securities were acquired by our Promoters and the Promoter Selling Shareholders in the last one year preceding the date of this Red Herring Prospectus is given below: Name of the Promoter Number of Equity Shares of face value of ₹ 5 acquir Weighted average price of acquisition per Equity Shares (1)# (in ₹ )</w:t>
       </w:r>
     </w:p>
     <w:p>
@@ -876,7 +876,7 @@
     </w:p>
     <w:p>
       <w:r>
-        <w:t>ed Jane Smith * 26,437,554 0.00</w:t>
+        <w:t>ed [PERSON_002] * 26,437,554 0.00</w:t>
       </w:r>
     </w:p>
     <w:p>
@@ -894,7 +894,7 @@
     </w:p>
     <w:p>
       <w:r>
-        <w:t>Name of the Promoter Number of Equity Shares of face value of ₹ 5 acquir ed Weighted average price of acquisition per Equity Shares (1)# (in ₹ ) Peter Parker * 7,312,437 0.00 Alex Morgan * 11,249,865 0.00 Taylor Brown * 11,249,865 0.00 Jordan Lee 100 530.00 Globex Industries Limited 10 0.00 Umbrella Holdings Private Limited 10 0.00 Initech Solutions Limited 10 0.00 Hooli Technologies Limited 10 0.00 Pied Piper Inc. 10 0.00 Stark Industries Limited 10 0.00 Note: Number of Equity shares and cost of acquisition has been adjusted for subsequent sale/transfers made based on the average cost of the acquisition. *Also, the Promoter Selling Shareholder # Pursuant to a resolution passed by the Board and Shareholders of the Company dated February 10, 2025 and February 11, 2025, respectively, the face value of the equity shares was sub-divided from ₹ 100 per equity share to ₹ 5 per Equity Share. Further, pursuant to a resolution dated February 11, 2025 passed by our Shareholders, the Company approved the issue of bonus shares which were allotted on February 21, 2025 (1) As certified by Oscorp Limited, Chartered Accountants, our Statutory Auditors, by way of their certificate dated December 10, 2025. Weighted average cost of acquisition of all shares transacted in last one year, 18 months and three years preceding the date of this Red Herring Prospectus The weighted average price for all equity shares acquired in the last one year, eighteen months and three years preceding the date of this Red Herring Prospectus is mentioned below: Peri od Weighted average cost of acquisition (in ₹ )* # Cap Price is ‘x’ times the weighted average cost of acquisition** Range of acquisition price per Equity Share of face value of ₹ 5: lowest price – highest price (in ₹ ) # Last one year 384.01 To be updated upon finalization of the price band. 0.00 – 530.00 Last trailing 18 months 384.01 0.00 – 530.00 Last three years 384.01 0.00 – 530.00 * As certified by Oscorp Limited, Chartered Accountants, our Statutory Auditors, by way of their certificate dated December 10, 2025. ** To be updated in the Prospectus. # Impact of bonus and sub-division of shares have been taken only on transactions that have been transacted during the last 1 year, trailing 18 months and last 3 years. Average cost of acquisition of Equity Shares by our Promoters and the Promoter Selling Shareholders The average cost of acquisition of Equity Shares by our Promoters and the Promoter Selling Shareholders as on the date of this Red Herring Prospectus, is as set forth below: Name of Promoter Number of Equity Shares held of face value of ₹ 5 each Average cost per Equity Share of face values of ₹ 5 each ** ( ₹ ) Jane Smith * 26,704,570 1.36 Peter Parker * 7,386,270 1.51 Alex Morgan * 10,907,771 1.41 Taylor Brown * 10,907,771 1.35 Jordan Lee 100 530.00</w:t>
+        <w:t>Name of the Promoter Number of Equity Shares of face value of ₹ 5 acquir ed Weighted average price of acquisition per Equity Shares (1)# (in ₹ ) [PERSON_003] * 7,312,437 0.00 [PERSON_004] * 11,249,865 0.00 [PERSON_005] * 11,249,865 0.00 [PERSON_006] 100 530.00 [COMPANY_002] 10 0.00 [COMPANY_003] 10 0.00 [COMPANY_004] 10 0.00 [COMPANY_005] 10 0.00 [COMPANY_006] 10 0.00 [COMPANY_007] 10 0.00 Note: Number of Equity shares and cost of acquisition has been adjusted for subsequent sale/transfers made based on the average cost of the acquisition. *Also, the Promoter Selling Shareholder # Pursuant to a resolution passed by the Board and Shareholders of the Company dated February 10, 2025 and February 11, 2025, respectively, the face value of the equity shares was sub-divided from ₹ 100 per equity share to ₹ 5 per Equity Share. Further, pursuant to a resolution dated February 11, 2025 passed by our Shareholders, the Company approved the issue of bonus shares which were allotted on February 21, 2025 (1) As certified by [COMPANY_009], Chartered Accountants, our Statutory Auditors, by way of their certificate dated December 10, 2025. Weighted average cost of acquisition of all shares transacted in last one year, 18 months and three years preceding the date of this Red Herring Prospectus The weighted average price for all equity shares acquired in the last one year, eighteen months and three years preceding the date of this Red Herring Prospectus is mentioned below: Peri od Weighted average cost of acquisition (in ₹ )* # Cap Price is ‘x’ times the weighted average cost of acquisition** Range of acquisition price per Equity Share of face value of ₹ 5: lowest price – highest price (in ₹ ) # Last one year 384.01 To be updated upon finalization of the price band. 0.00 – 530.00 Last trailing 18 months 384.01 0.00 – 530.00 Last three years 384.01 0.00 – 530.00 * As certified by [COMPANY_009], Chartered Accountants, our Statutory Auditors, by way of their certificate dated December 10, 2025. ** To be updated in the Prospectus. # Impact of bonus and sub-division of shares have been taken only on transactions that have been transacted during the last 1 year, trailing 18 months and last 3 years. Average cost of acquisition of Equity Shares by our Promoters and the Promoter Selling Shareholders The average cost of acquisition of Equity Shares by our Promoters and the Promoter Selling Shareholders as on the date of this Red Herring Prospectus, is as set forth below: Name of Promoter Number of Equity Shares held of face value of ₹ 5 each Average cost per Equity Share of face values of ₹ 5 each ** ( ₹ ) [PERSON_002] * 26,704,570 1.36 [PERSON_003] * 7,386,270 1.51 [PERSON_004] * 10,907,771 1.41 [PERSON_005] * 10,907,771 1.35 [PERSON_006] 100 530.00</w:t>
       </w:r>
     </w:p>
     <w:p>
@@ -912,7 +912,7 @@
     </w:p>
     <w:p>
       <w:r>
-        <w:t>Globex Industries Limited 10 0.00 Umbrella Holdings Private Limited 10 0.00 Initech Solutions Limited 10 0.00 Hooli Technologies Limited 10 0.00 Pied Piper Inc. 10 0.00 Stark Industries Limited 10 0.00 Note: Number of Equity shares and cost of acquisition has been adjusted for subsequent sale/transfers made based on the average cost of the acquisition. ** As certified by Oscorp Limited, Chartered Accountants, our Statutory Auditors, by way of their certificate dated December 10, 2025. * Also, Promoter Selling Shareholders. Details of price at which specified securities of our Company were acquired by our Promoters, members of the Promoter Group, Promoter Selling Shareholders and Shareholders with the right to nominate Directors or any other special rights in the three years preceding the date of this Red Herring Prospectus Except as stated below, none of our Promoters and members of our Promoter Group, Promoter Selling Shareholders and Shareholders with right to nominate directors or other special rights have acquired any Equity in the three years immediately preceding the date of this Red Herring Prospectus:</w:t>
+        <w:t>[COMPANY_002] 10 0.00 [COMPANY_003] 10 0.00 [COMPANY_004] 10 0.00 [COMPANY_005] 10 0.00 [COMPANY_006] 10 0.00 [COMPANY_007] 10 0.00 Note: Number of Equity shares and cost of acquisition has been adjusted for subsequent sale/transfers made based on the average cost of the acquisition. ** As certified by [COMPANY_009], Chartered Accountants, our Statutory Auditors, by way of their certificate dated December 10, 2025. * Also, Promoter Selling Shareholders. Details of price at which specified securities of our Company were acquired by our Promoters, members of the Promoter Group, Promoter Selling Shareholders and Shareholders with the right to nominate Directors or any other special rights in the three years preceding the date of this Red Herring Prospectus Except as stated below, none of our Promoters and members of our Promoter Group, Promoter Selling Shareholders and Shareholders with right to nominate directors or other special rights have acquired any Equity in the three years immediately preceding the date of this Red Herring Prospectus:</w:t>
       </w:r>
     </w:p>
     <w:p>
@@ -930,7 +930,7 @@
     </w:p>
     <w:p>
       <w:r>
-        <w:t>Name of Shareholder Date of acquisition Number of equity shares acquir ed Face value ( ₹ ) Acquisition price per equity share ^ (in ₹ ) Promoters Jane Smith *^ &amp; February 21, 2025 21,363,680 5 0.00 Peter Parker *^ &amp; February 21, 2025 5,909,040 5 0.00 Alex Morgan *^ &amp; February 21, 2025 9,090,800 5 0.00 Taylor Brown *^ &amp; February 21, 2025 9,090,800 5 0.00 Jordan Lee &amp; December 17, 2024 1 100 53,000.00 Jordan Lee ^ &amp; February 21, 2025 80 5 0.00 Globex Industries Limited &amp; May 7, 2025 10 5 0.00 Umbrella Holdings Private Limited &amp; May 7, 2025 10 5 0.00 Initech Solutions Limited &amp; May 7, 2025 10 5 0.00 Hooli Technologies Limited &amp; May 8, 2025 10 5 0.00 Pied Piper Inc. &amp; May 8, 2025 10 5 0.00 Stark Industries Limited &amp; May 7, 2025 10 5 0.00 Promoter Group Skyler West &amp; December 17, 2024 1 100 53,000.00 Skyler West ^ &amp; February 21, 2025 80 5 N.A. Logan Grey &amp; December 17, 2024 1 100 53,000.00 Logan Grey ^ &amp; February 21, 2025 80 5 N.A. # As certified by Oscorp Limited, Chartered Accountants, our Statutory Auditors, by way of their certificate dated December 10, 2025. * Also, a Promoter Selling Shareholder. &amp; Shareholder entitled with right to nominate directors or any other rights ^ Bonus shares issued in the ratio of 4:1. Secondary Transfer of Equity Shares of face value of ₹ 5 each in the form of Gifts Transferee Transfer or Equity Shares of face value of ₹ 5 each Date Globex Industries Limited Jane Smith 10 May 7, 2025 Initech Solutions Limited Jane Smith 10 May 7, 2025 Umbrella Holdings Private Limited Jane Smith 10 May 7, 2025 Stark Industries Limited Peter Parker 10 May 7, 2025 Pied Piper Inc. Peter Parker 10 May 8, 2025 Hooli Technologies Limited Peter Parker 10 May 8, 2025</w:t>
+        <w:t>Name of Shareholder Date of acquisition Number of equity shares acquir ed Face value ( ₹ ) Acquisition price per equity share ^ (in ₹ ) Promoters [PERSON_002] *^ &amp; February 21, 2025 21,363,680 5 0.00 [PERSON_003] *^ &amp; February 21, 2025 5,909,040 5 0.00 [PERSON_004] *^ &amp; February 21, 2025 9,090,800 5 0.00 [PERSON_005] *^ &amp; February 21, 2025 9,090,800 5 0.00 [PERSON_006] &amp; December 17, 2024 1 100 53,000.00 [PERSON_006] ^ &amp; February 21, 2025 80 5 0.00 [COMPANY_002] &amp; May 7, 2025 10 5 0.00 [COMPANY_003] &amp; May 7, 2025 10 5 0.00 [COMPANY_004] &amp; May 7, 2025 10 5 0.00 [COMPANY_005] &amp; May 8, 2025 10 5 0.00 [COMPANY_006] &amp; May 8, 2025 10 5 0.00 [COMPANY_007] &amp; May 7, 2025 10 5 0.00 Promoter Group [PERSON_015] &amp; December 17, 2024 1 100 53,000.00 [PERSON_015] ^ &amp; February 21, 2025 80 5 N.A. [PERSON_016] &amp; December 17, 2024 1 100 53,000.00 [PERSON_016] ^ &amp; February 21, 2025 80 5 N.A. # As certified by [COMPANY_009], Chartered Accountants, our Statutory Auditors, by way of their certificate dated December 10, 2025. * Also, a Promoter Selling Shareholder. &amp; Shareholder entitled with right to nominate directors or any other rights ^ Bonus shares issued in the ratio of 4:1. Secondary Transfer of Equity Shares of face value of ₹ 5 each in the form of Gifts Transferee Transfer or Equity Shares of face value of ₹ 5 each Date [COMPANY_002] [PERSON_002] 10 May 7, 2025 [COMPANY_004] [PERSON_002] 10 May 7, 2025 [COMPANY_003] [PERSON_002] 10 May 7, 2025 [COMPANY_007] [PERSON_003] 10 May 7, 2025 [COMPANY_006] [PERSON_003] 10 May 8, 2025 [COMPANY_005] [PERSON_003] 10 May 8, 2025</w:t>
       </w:r>
     </w:p>
     <w:p>
@@ -966,7 +966,7 @@
     </w:p>
     <w:p>
       <w:r>
-        <w:t>SECTION II: RISK FACTORS An investment in equity shares involves a high degree of risk. Prospective investors should carefully consider all the information in this Red Herring Prospectus, including the risks and uncertainties described below, before making an investment in our Equity Shares. The risks described in this section are those that we consider to be the most significant to our business, results of operations and financial condition as of the date of this Red Herring Prospectus. The risks described below may not be exhaustive or the only ones relevant to us, the Equity Shares or the industry segments in which we currently operate. Additional risks and uncertainties, not presently known to us or that we currently do not deem material may arise or may become material in the future. If any or a combination of the following risks, or other risks that are not currently known or are not currently deemed material, actually occur, our business, results of operations, cash flows and financial condition could be adversely affected, the trading price of our Equity Shares could decline, and investors may lose all or part of their investment. The risk factors have been presented below on the basis of their materiality. Furthermore, some events may be material collectively rather than individually. Some events may not be material at present but may have a material impact in the future. In making an investment decision, prospective investors must rely on their own examination of us and our business and the terms of the Offer, including the merits and risks involved. Potential investors should consult their tax, financial and legal advisors about the particular consequences of purchasing our Equity Shares. In order to obtain a complete understanding of our Company and our business, prospective investors should read this section in conjunction with “Industry Overview”, “Our Business”, “Key Regulations and Policies in India”, “Restated Financial Statements”, “Management’s Discussion and Analysis of Financial Condition and Results of Operations” and “Outstanding Litigation and Material Developments” on pages 137, 211, 238, 280, 356 and 388, respectively, as well as the other financial and statistical information contained in this Red Herring Prospectus. This Red Herring Prospectus also contains forward-looking statements that involve risks, assumptions, estimates, uncertainties and other factors, many of which are beyond our control. Our actual results could differ from those anticipated in these forward-looking statements as a result of certain factors, including the considerations described below and elsewhere in this Red Herring Prospectus. For more details, see “Forward-Looking Statements” on page 18. Unless otherwise stated, or unless the context otherwise requires, the financial information of our Company used in this section has been derived from our Restated Financial Statements included in this Red Herring Prospectus on page 280. Our financial year ends on March 31 of each year. Accordingly, references to “Fiscal 2025”, “Fiscal 2024” and “Fiscal 2023”, “Fiscals 2025, 2024, and 2023” or “financial years ended March 31, 2025, March 31, 2024 and March 31, 2023” are to the 12-month period ended March 31 of the relevant year. We have also included various financial and operational performance indicators in this Red Herring Prospectus, some of which have not been derived from the Restated Financial Statements. The manner of calculation and presentation of some of these financial and operational performance indicators, and the assumptions and estimates used in such calculations, may vary from those used by other companies in India and other jurisdictions. Unless stated otherwise, industry and market data used in this section has been obtained or derived from the report titled “Industry Research Report on Magnet Winding Wires Market in India” dated November 26, 2025 (“ CARE Report ”), prepared and issued by Globex Industries Limited (22) pursuant to an engagement letter dated December 2, 2024, and exclusively commissioned and paid for by us in connection with the Offer. The industry-related information included herein includes excerpts from the CARE Report and may have been re-ordered by us for the purposes of presentation. Unless otherwise indicated, all financial, operational, industry and other related information derived from the CARE Report and included herein with respect to any particular year refers to such information for the relevant calendar year. The CARE Report will be available on the website of our Company from the date of this Red Herring Prospectus until the Bid/Offer Closing Date. For more information, see “Certain Conventions, Use of Financial Information and Market Data and Currency of Presentation” on page 15. INTERNAL RISKS 1. We depend on certain customers for a significant portion of our revenue from operations. Our top 10 customers contributed to 53.97%, 52.54%, 57.10% and 58.99% of our revenue from operations for the three-month period ended June 30, 2025, and Fiscals 2025, 2024 and 2023, respectively. Any decrease in demand from such customers, the loss of such customers or our inability to diversify our customer base could have an adverse effect on our business, results of operations, financial condition and cash flows. We have derived a significant portion of our revenue from operations from our top 10 customers. The table below sets forth details of our revenue from operations generated from top 10 customers in each of the period/ Fiscals indicated:</w:t>
+        <w:t>SECTION II: RISK FACTORS An investment in equity shares involves a high degree of risk. Prospective investors should carefully consider all the information in this Red Herring Prospectus, including the risks and uncertainties described below, before making an investment in our Equity Shares. The risks described in this section are those that we consider to be the most significant to our business, results of operations and financial condition as of the date of this Red Herring Prospectus. The risks described below may not be exhaustive or the only ones relevant to us, the Equity Shares or the industry segments in which we currently operate. Additional risks and uncertainties, not presently known to us or that we currently do not deem material may arise or may become material in the future. If any or a combination of the following risks, or other risks that are not currently known or are not currently deemed material, actually occur, our business, results of operations, cash flows and financial condition could be adversely affected, the trading price of our Equity Shares could decline, and investors may lose all or part of their investment. The risk factors have been presented below on the basis of their materiality. Furthermore, some events may be material collectively rather than individually. Some events may not be material at present but may have a material impact in the future. In making an investment decision, prospective investors must rely on their own examination of us and our business and the terms of the Offer, including the merits and risks involved. Potential investors should consult their tax, financial and legal advisors about the particular consequences of purchasing our Equity Shares. In order to obtain a complete understanding of our Company and our business, prospective investors should read this section in conjunction with “Industry Overview”, “Our Business”, “Key Regulations and Policies in India”, “Restated Financial Statements”, “Management’s Discussion and Analysis of Financial Condition and Results of Operations” and “Outstanding Litigation and Material Developments” on pages 137, 211, 238, 280, 356 and 388, respectively, as well as the other financial and statistical information contained in this Red Herring Prospectus. This Red Herring Prospectus also contains forward-looking statements that involve risks, assumptions, estimates, uncertainties and other factors, many of which are beyond our control. Our actual results could differ from those anticipated in these forward-looking statements as a result of certain factors, including the considerations described below and elsewhere in this Red Herring Prospectus. For more details, see “Forward-Looking Statements” on page 18. Unless otherwise stated, or unless the context otherwise requires, the financial information of our Company used in this section has been derived from our Restated Financial Statements included in this Red Herring Prospectus on page 280. Our financial year ends on March 31 of each year. Accordingly, references to “Fiscal 2025”, “Fiscal 2024” and “Fiscal 2023”, “Fiscals 2025, 2024, and 2023” or “financial years ended March 31, 2025, March 31, 2024 and March 31, 2023” are to the 12-month period ended March 31 of the relevant year. We have also included various financial and operational performance indicators in this Red Herring Prospectus, some of which have not been derived from the Restated Financial Statements. The manner of calculation and presentation of some of these financial and operational performance indicators, and the assumptions and estimates used in such calculations, may vary from those used by other companies in India and other jurisdictions. Unless stated otherwise, industry and market data used in this section has been obtained or derived from the report titled “Industry Research Report on Magnet Winding Wires Market in India” dated November 26, 2025 (“ CARE Report ”), prepared and issued by [COMPANY_022] pursuant to an engagement letter dated December 2, 2024, and exclusively commissioned and paid for by us in connection with the Offer. The industry-related information included herein includes excerpts from the CARE Report and may have been re-ordered by us for the purposes of presentation. Unless otherwise indicated, all financial, operational, industry and other related information derived from the CARE Report and included herein with respect to any particular year refers to such information for the relevant calendar year. The CARE Report will be available on the website of our Company from the date of this Red Herring Prospectus until the Bid/Offer Closing Date. For more information, see “Certain Conventions, Use of Financial Information and Market Data and Currency of Presentation” on page 15. INTERNAL RISKS 1. We depend on certain customers for a significant portion of our revenue from operations. Our top 10 customers contributed to 53.97%, 52.54%, 57.10% and 58.99% of our revenue from operations for the three-month period ended June 30, 2025, and Fiscals 2025, 2024 and 2023, respectively. Any decrease in demand from such customers, the loss of such customers or our inability to diversify our customer base could have an adverse effect on our business, results of operations, financial condition and cash flows. We have derived a significant portion of our revenue from operations from our top 10 customers. The table below sets forth details of our revenue from operations generated from top 10 customers in each of the period/ Fiscals indicated:</w:t>
       </w:r>
     </w:p>
     <w:p>
@@ -1020,7 +1020,7 @@
     </w:p>
     <w:p>
       <w:r>
-        <w:t>4.6 9 10 . Custom er 154.43 2.76% 613.3 0 3.18% 466.46 3.37% 369.31 3.52% Total 3,015.48 53.97% 10,130 .32 52.54% 7,896.04 57.10% 6,191.05 58.99% * These customers represent the top 10 customers for each of the respective periods/ Fiscals and may not necessarily be the same customers across the periods/ Fiscals. Note: Our top 10 customers include Weyland Corp Limited (58), Bluth Company LLC (59); Sterling Cooper Limited (60); Acme Corp Ltd. (61); Globex Industries Limited (62); Umbrella Holdings Private Limited (63); Initech Solutions Limited (64); and Hooli Technologies Limited (65). Names of other customers who form part of our top 10 customers during the periods/ Fiscals included above, have not been included in this Red Herring Prospectus due to non-receipt of consent from such customers to be named in the Offer Documents. We had 122, 117 and 117 customers during the financial years ended March 31, 2025, March 31, 2024, and March 31, 2023, respectively. Further, during the three-month period ended June 30, 2025, we invoiced 93 customers. Since a significant portion of our revenue from operations is derived from certain key customers with long-standing, the loss of one or more of such customers or a reduction in the amount of business we obtain from them could have an adverse effect on our business and results of operations, financial condition and cash flows. Of our top 10 customers based on revenue contribution for the financial year ended March 31, 2025, 5 of our customers have been customers for 10 years intermittently, 2 of our customers have been customers for 5 years, and the other 3 have been our customers for 2 years. Except as disclosed in the section titled “ Outstanding Litigation and Material Developments – A. Litigation Involving our Company – Criminal proceedings by our Company ” on page 389, there have not been any instances of disputes with our customers or adverse changes in our relationship with our customers in the past, we cannot assure you that such instances will not occur in the future and have a material adverse impact on our business, result of operations, cash flows and financial condition. Our reliance on a select group of customers may also constrain our ability to negotiate our arrangements, including pricing, which may have an impact on our profit margins and financial performance. The deterioration of the financial condition or a decline in the budgetary allocations of these customers could reduce their demand for our products and result in a significant decrease in the revenues we derive from them. Furthermore, key customers may become subject to international sanctions, which could further adversely affect our business and revenues. The volume and timing of sales to such customers may also vary due to a change in their requirements, geo-political issues and management of inventory levels. Furthermore, we do not have firm commitments in the form of continuing or long-term supply agreements with some of our customers and instead rely on orders for manufacture of specific products on a purchase order basis, which governs the volume and other terms of the sale of our products. We need to maintain sufficient inventory levels of raw material to meet customer expectations at all times. Accumulating excess inventory could increase our inventory costs, and a failure to have adequate inventory in stock to fulfil customer orders could result in inability to meet customer demand or loss of customers. As actual orders by our customers are typically placed by way of ‘make to order’/ specific purchase orders, we are exposed to significant or unexpected changes in product specifications and delivery schedules, which may result in a mismatch between our inventories of raw materials, thereby increasing our costs for maintaining inventory. Our inability to forecast the level of customer demand for our products as well as our inability to accurately schedule our raw material purchases and production and manage our inventory may adversely affect our business and cash flows from operations. We cannot assure you that</w:t>
+        <w:t>4.6 9 10 . Custom er 154.43 2.76% 613.3 0 3.18% 466.46 3.37% 369.31 3.52% Total 3,015.48 53.97% 10,130 .32 52.54% 7,896.04 57.10% 6,191.05 58.99% * These customers represent the top 10 customers for each of the respective periods/ Fiscals and may not necessarily be the same customers across the periods/ Fiscals. Note: Our top 10 customers include [COMPANY_058], [COMPANY_059]; [COMPANY_060]; [COMPANY_061]; [COMPANY_062]; [COMPANY_063]; [COMPANY_064]; and [COMPANY_065]. Names of other customers who form part of our top 10 customers during the periods/ Fiscals included above, have not been included in this Red Herring Prospectus due to non-receipt of consent from such customers to be named in the Offer Documents. We had 122, 117 and 117 customers during the financial years ended March 31, 2025, March 31, 2024, and March 31, 2023, respectively. Further, during the three-month period ended June 30, 2025, we invoiced 93 customers. Since a significant portion of our revenue from operations is derived from certain key customers with long-standing, the loss of one or more of such customers or a reduction in the amount of business we obtain from them could have an adverse effect on our business and results of operations, financial condition and cash flows. Of our top 10 customers based on revenue contribution for the financial year ended March 31, 2025, 5 of our customers have been customers for 10 years intermittently, 2 of our customers have been customers for 5 years, and the other 3 have been our customers for 2 years. Except as disclosed in the section titled “ Outstanding Litigation and Material Developments – A. Litigation Involving our Company – Criminal proceedings by our Company ” on page 389, there have not been any instances of disputes with our customers or adverse changes in our relationship with our customers in the past, we cannot assure you that such instances will not occur in the future and have a material adverse impact on our business, result of operations, cash flows and financial condition. Our reliance on a select group of customers may also constrain our ability to negotiate our arrangements, including pricing, which may have an impact on our profit margins and financial performance. The deterioration of the financial condition or a decline in the budgetary allocations of these customers could reduce their demand for our products and result in a significant decrease in the revenues we derive from them. Furthermore, key customers may become subject to international sanctions, which could further adversely affect our business and revenues. The volume and timing of sales to such customers may also vary due to a change in their requirements, geo-political issues and management of inventory levels. Furthermore, we do not have firm commitments in the form of continuing or long-term supply agreements with some of our customers and instead rely on orders for manufacture of specific products on a purchase order basis, which governs the volume and other terms of the sale of our products. We need to maintain sufficient inventory levels of raw material to meet customer expectations at all times. Accumulating excess inventory could increase our inventory costs, and a failure to have adequate inventory in stock to fulfil customer orders could result in inability to meet customer demand or loss of customers. As actual orders by our customers are typically placed by way of ‘make to order’/ specific purchase orders, we are exposed to significant or unexpected changes in product specifications and delivery schedules, which may result in a mismatch between our inventories of raw materials, thereby increasing our costs for maintaining inventory. Our inability to forecast the level of customer demand for our products as well as our inability to accurately schedule our raw material purchases and production and manage our inventory may adversely affect our business and cash flows from operations. We cannot assure you that</w:t>
       </w:r>
     </w:p>
     <w:p>
@@ -1056,7 +1056,7 @@
     </w:p>
     <w:p>
       <w:r>
-        <w:t>. * These suppliers represent the top 10 suppliers for each of the respective period/ Fiscals and may not necessarily be the same suppliers across the period/ Fiscals. Note: Our top 10 suppliers include Ahlstrom Sweden AB; Pied Piper Inc. (66); Stark Industries Limited (67); Wayne Enterprises Limited (68); Oscorp Limited (69); Vance Refrigeration LLC (70); Dunder Mifflin Private Limited (71); and Soylent Corp Limited (72). Names of other suppliers have not been included in this Red Herring Prospectus due to non-receipt of consent from such suppliers to be named in the Offer Documents. We purchase our raw materials from third-party suppliers on the basis of purchase orders and do not typically enter into any long-term agreements. We procure our main raw material i.e. copper in back-to-back arrangement with suppliers against confirmed bookings, i.e., the customer prices the copper with our Company and our Company does the same with its suppliers. While we procure raw materials from our suppliers once they confirm the receipt of our purchase orders, in the absence of long-term contracts, our suppliers may not be obligated to supply their products to us and/or may choose to sell their products to our competitors. While we have a large network of long-term suppliers, we purchase copper and aluminium, which are our primary raw materials (and copper also being our principal raw material), from a limited number of suppliers. While there have been no instances of termination of our relationship with our suppliers which had impacted our supply in the three-month period ended June 30, 2025, and the Fiscals 2025, 2024 and 2023, there can be no assurance that a particular supplier will continue to supply us with raw materials in the future. Further, we cannot assure that we will be able to enter into new or renew our existing arrangements with suppliers on terms acceptable to us, which could have an adverse effect on our ability to source materials in a commercially viable and timely manner, if at all, which may impact our business and profitability. We conduct quality checks before onboarding suppliers for certain of our raw materials including metal and paper. Further, there are a limited number of qualified suppliers of insulating materials such as enamel and paper due to criticality to maintain process composition, which further restricts the number of suppliers we can source such materials from. Due to limitations in the availability of suppliers, we are also susceptible to the pricing-power risk of our suppliers controlling the pricing of our raw materials. While we do not rely on any single supplier for the other raw materials and components required for our operations, if any of our suppliers does not supply raw materials on a timely basis or at reasonable prices, we may be unable to manufacture products for our customers or may be unable to ensure the timely delivery of the same. Any discontinuation of production by these suppliers or a failure of these suppliers to adhere to the delivery schedule or the required quality and quantity could hamper our manufacturing schedule and lead to the under-utilization of our manufacturing facilities. Our operations may also be impacted due to</w:t>
+        <w:t>. * These suppliers represent the top 10 suppliers for each of the respective period/ Fiscals and may not necessarily be the same suppliers across the period/ Fiscals. Note: Our top 10 suppliers include Ahlstrom Sweden AB; [COMPANY_066]; [COMPANY_067]; [COMPANY_068]; [COMPANY_069]; [COMPANY_070]; [COMPANY_071]; and [COMPANY_072]. Names of other suppliers have not been included in this Red Herring Prospectus due to non-receipt of consent from such suppliers to be named in the Offer Documents. We purchase our raw materials from third-party suppliers on the basis of purchase orders and do not typically enter into any long-term agreements. We procure our main raw material i.e. copper in back-to-back arrangement with suppliers against confirmed bookings, i.e., the customer prices the copper with our Company and our Company does the same with its suppliers. While we procure raw materials from our suppliers once they confirm the receipt of our purchase orders, in the absence of long-term contracts, our suppliers may not be obligated to supply their products to us and/or may choose to sell their products to our competitors. While we have a large network of long-term suppliers, we purchase copper and aluminium, which are our primary raw materials (and copper also being our principal raw material), from a limited number of suppliers. While there have been no instances of termination of our relationship with our suppliers which had impacted our supply in the three-month period ended June 30, 2025, and the Fiscals 2025, 2024 and 2023, there can be no assurance that a particular supplier will continue to supply us with raw materials in the future. Further, we cannot assure that we will be able to enter into new or renew our existing arrangements with suppliers on terms acceptable to us, which could have an adverse effect on our ability to source materials in a commercially viable and timely manner, if at all, which may impact our business and profitability. We conduct quality checks before onboarding suppliers for certain of our raw materials including metal and paper. Further, there are a limited number of qualified suppliers of insulating materials such as enamel and paper due to criticality to maintain process composition, which further restricts the number of suppliers we can source such materials from. Due to limitations in the availability of suppliers, we are also susceptible to the pricing-power risk of our suppliers controlling the pricing of our raw materials. While we do not rely on any single supplier for the other raw materials and components required for our operations, if any of our suppliers does not supply raw materials on a timely basis or at reasonable prices, we may be unable to manufacture products for our customers or may be unable to ensure the timely delivery of the same. Any discontinuation of production by these suppliers or a failure of these suppliers to adhere to the delivery schedule or the required quality and quantity could hamper our manufacturing schedule and lead to the under-utilization of our manufacturing facilities. Our operations may also be impacted due to</w:t>
       </w:r>
     </w:p>
     <w:p>
@@ -1254,7 +1254,7 @@
     </w:p>
     <w:p>
       <w:r>
-        <w:t>11. We have experienced negative cash flows from operating activities in the past. Any negative cash flows in the future would adversely affect our cash flow requirements, which may adversely affect our ability to operate our business and implement our growth plans, thereby affecting our financial condition. The table below sets forth certain information relating to our cash flows from operating activities for the periods/ years indicated: Particulars Three-month period ended June 30, 2025 Fiscal 2025 Fiscal 2024 Fiscal 2023 Net cash flows from / (used in) operating activities We experienced negative cash flows in the Fiscal 2025, and the Fiscal 2024, due to increase in inventories and increase in trade receivables. Negative cash flows over extended periods, or significant negative cash flows in the short term, could materially impact our ability to operate our business and implement our growth plans. We may face a shortfall of capital in future as a result of negative cash flows and there can be no assurance that we will be able to raise adequate capital in future. As a result, our cash flows, business, future financial performance and results of operations could be materially and adversely affected. For further information, see “ Management’s Discussion and Analysis of Financial Condition and Results of Operations – Cash Flows ” on page 378. 12. If we fail to comply with the applicable regulations and rules prescribed by the Government of India and the relevant statutory or regulatory bodies or fail to obtain, maintain or renew our statutory and regulatory licenses, permits and approvals required for our business, our results of operations and cash flows may be adversely affected. We are required to obtain and maintain a number of statutory and regulatory licenses, registrations, permits and approvals under central, state and local government rules in India, for carrying out our business and for our manufacturing facility, among other things, relating to occupational health and safety (including laws regulating the generation, storage, handling, use and transportation of waste materials, the emission and discharge of hazardous waste materials into soil, air or water, and the health and safety of employees) and mandatory certification requirements for our facilities and products. For further information on the nature of the material approvals and licenses required for our business and for information on the material approvals applied for, see “ Government and Other Approvals ” on page 393. In addition, we will need to apply for renewal of certain approvals, licenses registrations and permits, which expire or seek new approvals, licenses, registrations and permits from time to time, as and when required in the ordinary course of our business. While there has not been any non-compliance during the three-month period ended June 30, 2025 or Fiscals 2025, 2024, and 2023, there can be no assurance that we will be in compliance at all times with such laws, regulations and the terms and conditions of any such consents or permits. If we violate or fail to comply adequately with these requirements, we could be fined or otherwise sanctioned by the relevant regulators. Our business and operations are subject to a number of approvals, licenses, registrations and permissions for construction and operation of our manufacturing facilities, warehouses, branch offices and regional offices, in addition to extensive government regulations for the protection of the environment and occupational health and safety. We have either made or are in the process of making an application or renewal for obtaining necessary approvals that are not in place or have expired. Further, we may also need to apply for additional approvals including the renewal of approvals which may expire from time to time, in the ordinary course of business. For instance, we have made applications for (i) certificate of enrolment issued by Maharashtra Sales Tax Department under the Maharashtra State Tax on Professions, Trades, Callings and Employment Act, 1975 and (ii) for amending the name of our Company in certain regulatory approvals and licenses issued under our old name “Wonka Industries Limited”. Additionally, we are yet to make an application for obtaining the building completion certificate issued in relation to Unit 2 by the Pune Metropolitan Region Development Authority. For details, see “ Government and Other Approvals – C. Material approvals in relation to our Company – IV. Material Approvals or renewal applied for but not received ” on page 394</w:t>
+        <w:t>11. We have experienced negative cash flows from operating activities in the past. Any negative cash flows in the future would adversely affect our cash flow requirements, which may adversely affect our ability to operate our business and implement our growth plans, thereby affecting our financial condition. The table below sets forth certain information relating to our cash flows from operating activities for the periods/ years indicated: Particulars Three-month period ended June 30, 2025 Fiscal 2025 Fiscal 2024 Fiscal 2023 Net cash flows from / (used in) operating activities We experienced negative cash flows in the Fiscal 2025, and the Fiscal 2024, due to increase in inventories and increase in trade receivables. Negative cash flows over extended periods, or significant negative cash flows in the short term, could materially impact our ability to operate our business and implement our growth plans. We may face a shortfall of capital in future as a result of negative cash flows and there can be no assurance that we will be able to raise adequate capital in future. As a result, our cash flows, business, future financial performance and results of operations could be materially and adversely affected. For further information, see “ Management’s Discussion and Analysis of Financial Condition and Results of Operations – Cash Flows ” on page 378. 12. If we fail to comply with the applicable regulations and rules prescribed by the Government of India and the relevant statutory or regulatory bodies or fail to obtain, maintain or renew our statutory and regulatory licenses, permits and approvals required for our business, our results of operations and cash flows may be adversely affected. We are required to obtain and maintain a number of statutory and regulatory licenses, registrations, permits and approvals under central, state and local government rules in India, for carrying out our business and for our manufacturing facility, among other things, relating to occupational health and safety (including laws regulating the generation, storage, handling, use and transportation of waste materials, the emission and discharge of hazardous waste materials into soil, air or water, and the health and safety of employees) and mandatory certification requirements for our facilities and products. For further information on the nature of the material approvals and licenses required for our business and for information on the material approvals applied for, see “ Government and Other Approvals ” on page 393. In addition, we will need to apply for renewal of certain approvals, licenses registrations and permits, which expire or seek new approvals, licenses, registrations and permits from time to time, as and when required in the ordinary course of our business. While there has not been any non-compliance during the three-month period ended June 30, 2025 or Fiscals 2025, 2024, and 2023, there can be no assurance that we will be in compliance at all times with such laws, regulations and the terms and conditions of any such consents or permits. If we violate or fail to comply adequately with these requirements, we could be fined or otherwise sanctioned by the relevant regulators. Our business and operations are subject to a number of approvals, licenses, registrations and permissions for construction and operation of our manufacturing facilities, warehouses, branch offices and regional offices, in addition to extensive government regulations for the protection of the environment and occupational health and safety. We have either made or are in the process of making an application or renewal for obtaining necessary approvals that are not in place or have expired. Further, we may also need to apply for additional approvals including the renewal of approvals which may expire from time to time, in the ordinary course of business. For instance, we have made applications for (i) certificate of enrolment issued by Maharashtra Sales Tax Department under the Maharashtra State Tax on Professions, Trades, Callings and Employment Act, 1975 and (ii) for amending the name of our Company in certain regulatory approvals and licenses issued under our old name “[COMPANY_017]”. Additionally, we are yet to make an application for obtaining the building completion certificate issued in relation to Unit 2 by the Pune Metropolitan Region Development Authority. For details, see “ Government and Other Approvals – C. Material approvals in relation to our Company – IV. Material Approvals or renewal applied for but not received ” on page 394</w:t>
       </w:r>
     </w:p>
     <w:p>
@@ -1290,7 +1290,7 @@
     </w:p>
     <w:p>
       <w:r>
-        <w:t>not complied with such conditions, our business, prospects, financial condition, results of operations and cash flows may be adversely affected. Considering the nature of raw materials involved in our business, there can be no assurance that other environmental and safety allegations will not be made against us in the future. The relevant regulator may order closure of our unit where it is found to be non-compliant with the applicable norm. In some instances, such a fine or sanction could adversely affect our business, reputation, financial condition, results of operations or cash flows. In addition, these requirements may become more stringent over time and there can be no assurance that we will not incur significant environmental costs or liabilities in the future. For details, see “ Risk Factors – Our insurance coverage may not be sufficient or adequate to protect us against all material hazards, which may adversely affect our business, results of operations, financial condition and cash flows ” on page 54. Further, we propose to utilise a portion of our Net Proceeds towards funding the capital expenditure requirements of our Company towards purchasing and setting up of new machinery for expansion at our Supa Facility which will require us to obtain necessary licenses and approvals. For details, see “ Objects of the Offer –Funding the capital expenditure requirements of our Company towards: (i) purchasing and setting up of new machinery for expansion at our Supa Facility (“Phase II Expansion at our Supa Facility”); and (ii) purchasing and setting up of new machinery at Unit 2 in Chakan, Pune in Maharashtra” on page 114. We may have to revise our funding requirements and deployment of the Net Proceeds in case we are unable to obtain necessary licenses and approvals or due to other external factors, which may not be within the control of our management. Our inability to control the costs involved in complying with these and other relevant laws and regulations could have an adverse effect on our business, financial condition, results of operations and cash flows. 13. We are unable to trace some of our historical corporate records including in relation to certain allotments made by our Company. Further, certain corporate records have errors, and certain corporate filings have been made with delays. We cannot assure you that no legal proceedings or regulatory actions will be initiated against our Company in the future in relation to these matters, which may impact our financial condition and reputation. Certain of our Company’s corporate records are not traceable as the relevant information was not available in the records maintained by our Company or on the online portal of the Ministry of Corporate Affairs (“ MCA Portal ”) or in the physical records available at the Registrar of Companies. For instance, we are unable to trace the following: (i) Annual returns filed by the Company beginning from the Fiscal 1980 until the Fiscal 2003, except for the Fiscals ended March 31, 1983, and March 31, 1988; (ii) Financial statements, (a) between the Fiscal 1980 until March 31, 1985, (b) between the Fiscal 1986 until March 31, 2005, and (c) between the Fiscals 2011 and 2014; (iii) Form 1, Form 1A and Form 18 along with corresponding RoC challans for incorporation of the Company dated July 30, 1979, application for reservation of name, and intimation of registered office respectively; (iv) Form 23, Forms 1A and 1B along with corresponding RoC challans for change of name of the Company from “ Aperture Science LLC” to “ Wonka Industries Limited ” dated July 4, 1996; (v) Form 32 along with corresponding challan for regularization as director in relation to Alex Morgan dated September 26, 1996; (vi) Form 32 along with corresponding RoC challan for appointment as additional director in relation to Taylor Brown dated November 1, 2000; (vii) Form 32 along with the corresponding RoC challan for regularisation as director in relation to Taylor Brown dated September 21, 2000; (viii) Copies or counter folios of share certificates issued to the shareholders; and (ix) Share transfer forms for all secondary transactions of equity shares, including the following transfers involving the Promoter Selling Shareholders:</w:t>
+        <w:t>not complied with such conditions, our business, prospects, financial condition, results of operations and cash flows may be adversely affected. Considering the nature of raw materials involved in our business, there can be no assurance that other environmental and safety allegations will not be made against us in the future. The relevant regulator may order closure of our unit where it is found to be non-compliant with the applicable norm. In some instances, such a fine or sanction could adversely affect our business, reputation, financial condition, results of operations or cash flows. In addition, these requirements may become more stringent over time and there can be no assurance that we will not incur significant environmental costs or liabilities in the future. For details, see “ Risk Factors – Our insurance coverage may not be sufficient or adequate to protect us against all material hazards, which may adversely affect our business, results of operations, financial condition and cash flows ” on page 54. Further, we propose to utilise a portion of our Net Proceeds towards funding the capital expenditure requirements of our Company towards purchasing and setting up of new machinery for expansion at our Supa Facility which will require us to obtain necessary licenses and approvals. For details, see “ Objects of the Offer –Funding the capital expenditure requirements of our Company towards: (i) purchasing and setting up of new machinery for expansion at our Supa Facility (“Phase II Expansion at our Supa Facility”); and (ii) purchasing and setting up of new machinery at Unit 2 in Chakan, Pune in Maharashtra” on page 114. We may have to revise our funding requirements and deployment of the Net Proceeds in case we are unable to obtain necessary licenses and approvals or due to other external factors, which may not be within the control of our management. Our inability to control the costs involved in complying with these and other relevant laws and regulations could have an adverse effect on our business, financial condition, results of operations and cash flows. 13. We are unable to trace some of our historical corporate records including in relation to certain allotments made by our Company. Further, certain corporate records have errors, and certain corporate filings have been made with delays. We cannot assure you that no legal proceedings or regulatory actions will be initiated against our Company in the future in relation to these matters, which may impact our financial condition and reputation. Certain of our Company’s corporate records are not traceable as the relevant information was not available in the records maintained by our Company or on the online portal of the Ministry of Corporate Affairs (“ MCA Portal ”) or in the physical records available at the Registrar of Companies. For instance, we are unable to trace the following: (i) Annual returns filed by the Company beginning from the Fiscal 1980 until the Fiscal 2003, except for the Fiscals ended March 31, 1983, and March 31, 1988; (ii) Financial statements, (a) between the Fiscal 1980 until March 31, 1985, (b) between the Fiscal 1986 until March 31, 2005, and (c) between the Fiscals 2011 and 2014; (iii) Form 1, Form 1A and Form 18 along with corresponding RoC challans for incorporation of the Company dated July 30, 1979, application for reservation of name, and intimation of registered office respectively; (iv) Form 23, Forms 1A and 1B along with corresponding RoC challans for change of name of the Company from “ [COMPANY_016]” to “ [COMPANY_017] ” dated July 4, 1996; (v) Form 32 along with corresponding challan for regularization as director in relation to [PERSON_004] dated September 26, 1996; (vi) Form 32 along with corresponding RoC challan for appointment as additional director in relation to [PERSON_005] dated November 1, 2000; (vii) Form 32 along with the corresponding RoC challan for regularisation as director in relation to [PERSON_005] dated September 21, 2000; (viii) Copies or counter folios of share certificates issued to the shareholders; and (ix) Share transfer forms for all secondary transactions of equity shares, including the following transfers involving the Promoter Selling Shareholders:</w:t>
       </w:r>
     </w:p>
     <w:p>
@@ -1326,7 +1326,7 @@
     </w:p>
     <w:p>
       <w:r>
-        <w:t>1 . 1979-1980 Initial subscription to the MoA and further issue The financial statements of FY 1980 and FY 1981. 2 . September 30, 1981 Secondary transfer of equity shares Form 7B for transfer of shares to Kendall Price from DM Shetty and Gopal BO. 3 . August 6, 1982 Secondary transfer of equity shares Form 7B for transfer of shares to Kendall Price from Emery Fox and SA Shetty. 4 . December 9, 1983 Secondary transfer of equity shares Form 7B for transfer of shares to Kendall Price from Jayaram Shetty. 5 . March 28, 1987 Secondary transfer of equity shares Form 7B for transfer of shares by Kendall Price to Harper Kim. 6 . February 25, 1993 Further issue of equity shares Challan for the Form 2 in relation to the said allotment 7 . September 7, 1998 Secondary transfer of equity shares Form 7B for transfer of shares to Harper Kim HUF from Harper Kim. 8 . September 7, 1998 Secondary transfer of equity shares Form 7B for transfer of shares to Alex Morgan from Narayana B. Shetty 9 . December 28, 1998 Secondary transfer of equity shares Form 7B for transfer of shares to Kendall Price from Shubhkamal Leasing and Tyrell Corporation (73) 10 . December 28, 1998 Secondary transfer of equity shares Form 7B for transfer of shares to Blake Turner from Harper Kim HUF. 11 . December 28, 1998 Secondary transfer of equity shares Form 7B for transfer of shares to Alex Morgan from Shubhkamal Leasing and Tyrell Corporation (73) 12 . November 29, 2001 Secondary transfer of equity shares Form 7B for transfer of shares to Quinn Nash by Vijay Hegde. 13 . November 29, 2001 Secondary transfer of equity shares Form 7B for transfer of shares to Blake Turner by Vijay Hegde. 14 . April 20, 2002 Secondary transfer of equity shares Form 7B for transfer of shares by Kendall Price to Quinn Nash and Blake Turner. 15 . 1979-1980 Initial subscription to the MoA and further issue The financial statements of FY 1980 and FY 1981. 16 . February 20, 2015 Conversion of unsecured loan Valuation report of an independent chartered accountant for conversion of loan into equity shares. 17 . March 29, 2016 Secondary transfer of equity shares Form SH- 4 for transfer of shares by Kendall Price, Quinn Nash and Blake Turner to Parker Lane. 18 . 1979 – 2016 Copy or counter folios of share certificates issued to the shareholders. For further details, see “ Capital Structure – Details of history of shareholding and share capital of our Promoters and members of the Promoter Group in our Company ” and “ Capital Structure – Equity Share capital history of our Company ” on pages 91 and 85, respectively. We have been unable to trace these documents despite commissioning a detailed search at the Registrar of Companies, through an independent practicing company secretary, Kanj and Cyberdyne Systems Limited (74) (“ Practicing Company Secretary ”), to trace records and filings available with Registrar of Companies and reliance has been placed on the certificate dated May 21, 2025, issued by the Practicing Company Secretary. We have also intimated the Registrar of Companies by way of our letter dated May 21, 2025, regarding the missing corporate records. In addition, 1,000, equity shares of face value of ₹ 100 each allotted to Sage Porter, 500 equity shares of face value of ₹ 100 each allotted to Jane Smith, Narayna B. Shetty and Jayaram N. Shetty, respectively, pursuant to the initial subscription to the MoA dated June 29, 1979, were subsequently taken on record by the Board by way of a resolution dated August 25, 1979. For further details, see “ Capital Structure – Notes to Capital Structure</w:t>
+        <w:t>1 . 1979-1980 Initial subscription to the MoA and further issue The financial statements of FY 1980 and FY 1981. 2 . September 30, 1981 Secondary transfer of equity shares Form 7B for transfer of shares to [PERSON_023] from DM Shetty and Gopal BO. 3 . August 6, 1982 Secondary transfer of equity shares Form 7B for transfer of shares to [PERSON_023] from [PERSON_024] and SA Shetty. 4 . December 9, 1983 Secondary transfer of equity shares Form 7B for transfer of shares to [PERSON_023] from Jayaram Shetty. 5 . March 28, 1987 Secondary transfer of equity shares Form 7B for transfer of shares by [PERSON_023] to [PERSON_025]. 6 . February 25, 1993 Further issue of equity shares Challan for the Form 2 in relation to the said allotment 7 . September 7, 1998 Secondary transfer of equity shares Form 7B for transfer of shares to [PERSON_025] HUF from [PERSON_025]. 8 . September 7, 1998 Secondary transfer of equity shares Form 7B for transfer of shares to [PERSON_004] from Narayana B. Shetty 9 . December 28, 1998 Secondary transfer of equity shares Form 7B for transfer of shares to [PERSON_023] from Shubhkamal Leasing and [COMPANY_073] 10 . December 28, 1998 Secondary transfer of equity shares Form 7B for transfer of shares to [PERSON_026] from [PERSON_025] HUF. 11 . December 28, 1998 Secondary transfer of equity shares Form 7B for transfer of shares to [PERSON_004] from Shubhkamal Leasing and [COMPANY_073] 12 . November 29, 2001 Secondary transfer of equity shares Form 7B for transfer of shares to [PERSON_027] by Vijay Hegde. 13 . November 29, 2001 Secondary transfer of equity shares Form 7B for transfer of shares to [PERSON_026] by Vijay Hegde. 14 . April 20, 2002 Secondary transfer of equity shares Form 7B for transfer of shares by [PERSON_023] to [PERSON_027] and [PERSON_026]. 15 . 1979-1980 Initial subscription to the MoA and further issue The financial statements of FY 1980 and FY 1981. 16 . February 20, 2015 Conversion of unsecured loan Valuation report of an independent chartered accountant for conversion of loan into equity shares. 17 . March 29, 2016 Secondary transfer of equity shares Form SH- 4 for transfer of shares by [PERSON_023], [PERSON_027] and [PERSON_026] to [PERSON_028]. 18 . 1979 – 2016 Copy or counter folios of share certificates issued to the shareholders. For further details, see “ Capital Structure – Details of history of shareholding and share capital of our Promoters and members of the Promoter Group in our Company ” and “ Capital Structure – Equity Share capital history of our Company ” on pages 91 and 85, respectively. We have been unable to trace these documents despite commissioning a detailed search at the Registrar of Companies, through an independent practicing company secretary, Kanj and [COMPANY_074] (“ Practicing Company Secretary ”), to trace records and filings available with Registrar of Companies and reliance has been placed on the certificate dated May 21, 2025, issued by the Practicing Company Secretary. We have also intimated the Registrar of Companies by way of our letter dated May 21, 2025, regarding the missing corporate records. In addition, 1,000, equity shares of face value of ₹ 100 each allotted to [PERSON_029], 500 equity shares of face value of ₹ 100 each allotted to [PERSON_002], Narayna B. Shetty and Jayaram N. Shetty, respectively, pursuant to the initial subscription to the MoA dated June 29, 1979, were subsequently taken on record by the Board by way of a resolution dated August 25, 1979. For further details, see “ Capital Structure – Notes to Capital Structure</w:t>
       </w:r>
     </w:p>
     <w:p>
@@ -1362,7 +1362,7 @@
     </w:p>
     <w:p>
       <w:r>
-        <w:t>Certain sections of this Red Herring Prospectus include information based on, or derived from, the CARE Report or extracts of the CARE Report prepared by Globex Industries Limited (22) (“ CareEdge Research ”). All such information in this Red Herring Prospectus indicates the CARE Report as its source. The CARE Report is available on the website of our Company at https://kshinternational.com/investor-relations/industry-report/. The CARE Report is commissioned and paid for by our Company pursuant to an engagement letter dated December 2, 2024, for the purpose of confirming our understanding of the industry in connection with this Offer. While CareEdge Research is not related to our Company, our Promoters or our Directors, our Company has subscribed to and paid for certain research and reports from CareEdge Research business process services division. Industry sources and publications are prepared based on information as of specific dates and may no longer be current or reflect current trends. Industry sources and publications may also base their information on estimates, projections, forecasts and assumptions that may prove to be incorrect. Further, the CARE Report is not a recommendation to invest / disinvest in any company covered in the CARE Report. Accordingly, prospective investors should not place undue reliance on or base their investment decision solely on this information. In view of the foregoing, you may not be able to seek legal recourse for any losses resulting from undertaking any investment in this Offer pursuant to reliance on the information in this Red Herring Prospectus based on, or derived from, the CARE Report. You should consult your own advisors and undertake an independent assessment of information in this Red Herring Prospectus based on, or derived from, the CARE Report before making any investment decision regarding this Offer. See “ Industry Overview ” on page 137. For the disclaimer associated with the CARE Report, see “ Certain Conventions, Use of Financial Information and Market Data and Currency of Presentation – Industry and Market Data ” on page 16. 15. We operate in a competitive business environment. Failure to compete effectively against our competitors and new entrants to the industry may adversely affect our business, financial condition and results of operations. We face significant competition in our business from other manufacturers and suppliers of winding wires. Our competitors may possess wider product ranges, larger sales teams, greater intellectual property resources and broader appeal across various divisions. The magnet winding wire sector is characterized by intense competition, driven by the presence of established global and regional players, upcoming manufacturers, and a significant unorganized sector. ( Source: CARE Report ). For further details on our competitors, see “ Our Business – Competition”, “Basis for Offer Price” and “Industry Overview ” on pages 234, 124 and 137, respectively. Our failure to compete effectively with respect to any of these or other factors could have an adverse effect on our business, prospects, financial condition or operating results. Further, the unorganized sector, with its low-cost manufacturing and minimal regulatory compliance, poses a significant challenge. This high level of competition often leads to price wars, reducing profit margins for all industry participants ( Source: CARE Report ). We cannot assure you that we will be able to compete successfully against our competitors as well as new entrants in our industry in the future. Accordingly, our business, financial condition, results of operations and prospects would be adversely and materially affected if we are unable to maintain our competitive advantage and compete successfully against our competitors and any new entrants in the industry. While we work consistently to offset pricing pressures, produce new products, improve our services or enhance our production efficiency to reduce costs, such efforts may not be successful. Also, as we plan to expand our offerings to launch new products, we may face strong competition from other players in the same markets. Many of our existing and potential competitors may seek to equal or exceed us in terms of their financial, production, sales, marketing and other resources. If we fail to compete effectively in the future, our business and prospects could be materially and adversely affected. 16. Any failure in arranging adequate working capital for our operations or furnishing performance bank guarantees may adversely affect our business, results of operations, cash flows and financial condition. We require significant working capital to finance the purchase of raw materials and for the manufacture and other related expenses before payment is received from customers. We currently meet our working capital requirements through a mix of internal accruals and working capital facilities from banks. Set out below are our working capital days for the three-month period ended June 30, 2025, and the Fiscals 2025, 2024 and 2023: Particulars Three-month period Fiscal 2025 Fiscal 2024 Fiscal 2023</w:t>
+        <w:t>Certain sections of this Red Herring Prospectus include information based on, or derived from, the CARE Report or extracts of the CARE Report prepared by [COMPANY_022] (“ CareEdge Research ”). All such information in this Red Herring Prospectus indicates the CARE Report as its source. The CARE Report is available on the website of our Company at https://kshinternational.com/investor-relations/industry-report/. The CARE Report is commissioned and paid for by our Company pursuant to an engagement letter dated December 2, 2024, for the purpose of confirming our understanding of the industry in connection with this Offer. While CareEdge Research is not related to our Company, our Promoters or our Directors, our Company has subscribed to and paid for certain research and reports from CareEdge Research business process services division. Industry sources and publications are prepared based on information as of specific dates and may no longer be current or reflect current trends. Industry sources and publications may also base their information on estimates, projections, forecasts and assumptions that may prove to be incorrect. Further, the CARE Report is not a recommendation to invest / disinvest in any company covered in the CARE Report. Accordingly, prospective investors should not place undue reliance on or base their investment decision solely on this information. In view of the foregoing, you may not be able to seek legal recourse for any losses resulting from undertaking any investment in this Offer pursuant to reliance on the information in this Red Herring Prospectus based on, or derived from, the CARE Report. You should consult your own advisors and undertake an independent assessment of information in this Red Herring Prospectus based on, or derived from, the CARE Report before making any investment decision regarding this Offer. See “ Industry Overview ” on page 137. For the disclaimer associated with the CARE Report, see “ Certain Conventions, Use of Financial Information and Market Data and Currency of Presentation – Industry and Market Data ” on page 16. 15. We operate in a competitive business environment. Failure to compete effectively against our competitors and new entrants to the industry may adversely affect our business, financial condition and results of operations. We face significant competition in our business from other manufacturers and suppliers of winding wires. Our competitors may possess wider product ranges, larger sales teams, greater intellectual property resources and broader appeal across various divisions. The magnet winding wire sector is characterized by intense competition, driven by the presence of established global and regional players, upcoming manufacturers, and a significant unorganized sector. ( Source: CARE Report ). For further details on our competitors, see “ Our Business – Competition”, “Basis for Offer Price” and “Industry Overview ” on pages 234, 124 and 137, respectively. Our failure to compete effectively with respect to any of these or other factors could have an adverse effect on our business, prospects, financial condition or operating results. Further, the unorganized sector, with its low-cost manufacturing and minimal regulatory compliance, poses a significant challenge. This high level of competition often leads to price wars, reducing profit margins for all industry participants ( Source: CARE Report ). We cannot assure you that we will be able to compete successfully against our competitors as well as new entrants in our industry in the future. Accordingly, our business, financial condition, results of operations and prospects would be adversely and materially affected if we are unable to maintain our competitive advantage and compete successfully against our competitors and any new entrants in the industry. While we work consistently to offset pricing pressures, produce new products, improve our services or enhance our production efficiency to reduce costs, such efforts may not be successful. Also, as we plan to expand our offerings to launch new products, we may face strong competition from other players in the same markets. Many of our existing and potential competitors may seek to equal or exceed us in terms of their financial, production, sales, marketing and other resources. If we fail to compete effectively in the future, our business and prospects could be materially and adversely affected. 16. Any failure in arranging adequate working capital for our operations or furnishing performance bank guarantees may adversely affect our business, results of operations, cash flows and financial condition. We require significant working capital to finance the purchase of raw materials and for the manufacture and other related expenses before payment is received from customers. We currently meet our working capital requirements through a mix of internal accruals and working capital facilities from banks. Set out below are our working capital days for the three-month period ended June 30, 2025, and the Fiscals 2025, 2024 and 2023: Particulars Three-month period Fiscal 2025 Fiscal 2024 Fiscal 2023</w:t>
       </w:r>
     </w:p>
     <w:p>
@@ -1416,7 +1416,7 @@
     </w:p>
     <w:p>
       <w:r>
-        <w:t>(1) Certain of our KMPs including, Jane Smith, Alex Morgan, Taylor Brown and Jordan Lee are also our Executive Directors. Hence, litigation against our Executive Directors have not been included under the heading of KMPs to avoid repetition. (2) Certain of our SMs including, Drew Campbell, CEO, Avery Hart, CFO, John Doe, CS and Compliance Officer, and Ellis Grant, Technical Director, are also our KMPs. Hence, litigation against our KMPs have not been included under the heading of SMs to avoid repetition. Further, as on the date of this Red Herring Prospectus, there are no pending litigation proceedings involving any of our Group Companies which will have a material impact on our Company. Such proceedings could divert management’s time, attention, and consume financial resources in their defence or prosecution. We cannot assure you that any of these matters will be settled in favour of our Company or that no additional liability will arise out of these proceedings. Further, we cannot assure you that there will be no new legal</w:t>
+        <w:t>(1) Certain of our KMPs including, [PERSON_002], [PERSON_004], [PERSON_005] and [PERSON_006] are also our Executive Directors. Hence, litigation against our Executive Directors have not been included under the heading of KMPs to avoid repetition. (2) Certain of our SMs including, [PERSON_012], CEO, [PERSON_013], CFO, [PERSON_001], CS and Compliance Officer, and [PERSON_022], Technical Director, are also our KMPs. Hence, litigation against our KMPs have not been included under the heading of SMs to avoid repetition. Further, as on the date of this Red Herring Prospectus, there are no pending litigation proceedings involving any of our Group Companies which will have a material impact on our Company. Such proceedings could divert management’s time, attention, and consume financial resources in their defence or prosecution. We cannot assure you that any of these matters will be settled in favour of our Company or that no additional liability will arise out of these proceedings. Further, we cannot assure you that there will be no new legal</w:t>
       </w:r>
     </w:p>
     <w:p>
@@ -1488,7 +1488,7 @@
     </w:p>
     <w:p>
       <w:r>
-        <w:t>▪ Specialize magnet winding wires: a) For PICC - 26 days per month resulting in 312 working days in a year with per day three operating shifts with actual run time of 5.6 hours per shift. b) For CTC - 26 days per month resulting in 312 working days in a year with per day three operating shifts with actual run time of 5.2 hours per shift. ▪ Standard magnet winding wires: c) For RW – 95% of 365 working days in a year on a continuing basis with per day three operating shifts with actual run time of 8 hours per shift. ● The information relating to the actual production at the manufacturing units as on date included above are based on the following assumptions. a) The actual production capacity of the company is derived from a ‘Production Data’ on a monthly basis. a) Capacity utilization has been calculated on the basis of actual production during the relevant Fiscal/ period divided by the aggregate available capacity as of at the end of the relevant period. The inspection report is based on situation observed at the time of date if inspection. ● The Company is expanding by setting up a plant at 456, Park Street, Block B, Kolkata – 700 016 (12). The proposed plant will be developed in phases: Phase I, named Alpha I, with an installed capacity of 12,000 MT per annum, and Phase II, named Beta I, with a proposed installed capacity of 18,000 MT per annum. Currently, a consent to operate dated September 19, 2025, has been obtained from the Maharashtra Pollution Control Board for Phase I CTO and commercial production of Phase I commenced in September 2025. Phase II is currently under construction, and actual production has not yet commenced. (The remainder of the page is intentionally left blank)</w:t>
+        <w:t>▪ Specialize magnet winding wires: a) For PICC - 26 days per month resulting in 312 working days in a year with per day three operating shifts with actual run time of 5.6 hours per shift. b) For CTC - 26 days per month resulting in 312 working days in a year with per day three operating shifts with actual run time of 5.2 hours per shift. ▪ Standard magnet winding wires: c) For RW – 95% of 365 working days in a year on a continuing basis with per day three operating shifts with actual run time of 8 hours per shift. ● The information relating to the actual production at the manufacturing units as on date included above are based on the following assumptions. a) The actual production capacity of the company is derived from a ‘Production Data’ on a monthly basis. a) Capacity utilization has been calculated on the basis of actual production during the relevant Fiscal/ period divided by the aggregate available capacity as of at the end of the relevant period. The inspection report is based on situation observed at the time of date if inspection. ● The Company is expanding by setting up a plant at [ADDRESS_012]. The proposed plant will be developed in phases: Phase I, named Alpha I, with an installed capacity of 12,000 MT per annum, and Phase II, named Beta I, with a proposed installed capacity of 18,000 MT per annum. Currently, a consent to operate dated September 19, 2025, has been obtained from the Maharashtra Pollution Control Board for Phase I CTO and commercial production of Phase I commenced in September 2025. Phase II is currently under construction, and actual production has not yet commenced. (The remainder of the page is intentionally left blank)</w:t>
       </w:r>
     </w:p>
     <w:p>
@@ -1632,7 +1632,7 @@
     </w:p>
     <w:p>
       <w:r>
-        <w:t>26. Our operations are dependent on our new product and process development, thus our inability to introduce new products and processes and respond to changing customer preferences in a timely and effective manner, may have an adverse effect on our business, results of operations and financial condition. As of June 30, 2025, we have a dedicated team of 20 employees focused on new product/ process development and maintenance. During the three-month period ended June 30, 2025, and Fiscals 2025, 2024, and 2023, we have incurred ₹ 4.49 million, ₹ 12.62 million, ₹ 11.22 million and ₹ 9.31 million aggregating to 3.99%, 3.18%, 2.89% and 3.33% of the employee benefit expenses incurred during the respective period/ years, on the new product and process development team. Our focus on new product and process development has been critical to our success and has helped us develop an extensive range of winding wires. Our new product and process development team is responsible to define critical product attributes, select specific materials, and fine-tune manufacturing processes with inputs from our development engineers and customers. Our future growth may depend in part on our ability to respond to technological advancement and emerging standards, and practices on a cost-effective and timely basis. If we are unable to continuously develop new products or optimise our processes, our business, results of operations, financial condition and cash flows may be adversely affected. Further, delays in any part of the process, our inability to obtain necessary regulatory approvals for our products or failure of a product to be successful at any stage of its development will result in our inability to timely offer products that satisfy the market, which might allow competing products to emerge during the development and certification process and could adversely affect our business. Delays in introducing new products and enhancements, the failure to choose correctly among technical alternatives or the failure to offer innovative products or enhancements at competitive prices may cause existing and potential customers to purchase our competitors’ products. Though we strive to align our solutions with requirements of our customers, there can be no assurance that we will be able to secure the necessary knowledge through our own in-house product development that will allow us to continue to develop our offerings in accordance with the requirements of our customers and industry trends. 22. Our ability to access capital at attractive costs depends on our credit ratings. Non-availability of credit ratings or a poor rating may restrict our access to capital and thereby adversely affect our business, financial conditions, cash flows and results of operations. The cost and availability of capital depends on our credit ratings. Set out below are our credit ratings received from Initech Solutions Limited (44), in the three-month period ended June 30, 2025, Fiscals 2025, 2024 and 2023: Date Rating Outlo ok Facilities/ Instrument December 10, 2024 ‘CARE A-’ Stable Long Term Bank Facilities ‘CARE A-’ Stable/ CARE A2 Long Term / Short Term Bank Facilities ‘CARE A2’ N.A. Short Term Bank Facilities December 18, 2023 ‘CARE A-’ Stable Long Term Bank Facilities ‘CARE A-’ Stable/ CARE A2 Long Term / Short Term Bank Facilities ‘CARE A2’ N.A. Short Term Bank Facilities ‘CARE A2’ N.A. Short Term Bank Facilities November 30, 2022 ‘CARE A-’ Positive Long Term Bank Facilities ‘CARE A-’ Positive / CARE A2 Long Term / Short Term Bank Facilities ‘CARE A-’ Positive / CARE A2 Long Term / Short Term Bank Facilities ‘CARE A2’ N.A. Short Term Bank Facilities An inability to secure future financing on attractive terms or at all may adversely impact our strategic initiatives and our business prospects. Credit ratings reflect the opinion of the rating agency on our management, track record, diversified clientele, increase in scale and operations and margins, medium term revenue visibility and operating cycle. While our rating outlook has been revised from ‘positive’ to ‘stable’ in our latest ratings obtained on December 10, 2024, we have not experienced downgrading in our credit ratings received in the last three-month period ended June 30, 2025 or Fiscals 2025, 2024 and 2023, any downgrade in our credit ratings or our inability to obtain such credit rating in a timely manner or any non-availability of credit ratings, or poor ratings, could increase borrowing costs, will give the right to our lenders to review the facilities availed by us under our financing arrangements and adversely affect our access to capital and debt markets, which could in turn adversely affect our interest margins, our business, results of operations, financial condition and cash flows.</w:t>
+        <w:t>26. Our operations are dependent on our new product and process development, thus our inability to introduce new products and processes and respond to changing customer preferences in a timely and effective manner, may have an adverse effect on our business, results of operations and financial condition. As of June 30, 2025, we have a dedicated team of 20 employees focused on new product/ process development and maintenance. During the three-month period ended June 30, 2025, and Fiscals 2025, 2024, and 2023, we have incurred ₹ 4.49 million, ₹ 12.62 million, ₹ 11.22 million and ₹ 9.31 million aggregating to 3.99%, 3.18%, 2.89% and 3.33% of the employee benefit expenses incurred during the respective period/ years, on the new product and process development team. Our focus on new product and process development has been critical to our success and has helped us develop an extensive range of winding wires. Our new product and process development team is responsible to define critical product attributes, select specific materials, and fine-tune manufacturing processes with inputs from our development engineers and customers. Our future growth may depend in part on our ability to respond to technological advancement and emerging standards, and practices on a cost-effective and timely basis. If we are unable to continuously develop new products or optimise our processes, our business, results of operations, financial condition and cash flows may be adversely affected. Further, delays in any part of the process, our inability to obtain necessary regulatory approvals for our products or failure of a product to be successful at any stage of its development will result in our inability to timely offer products that satisfy the market, which might allow competing products to emerge during the development and certification process and could adversely affect our business. Delays in introducing new products and enhancements, the failure to choose correctly among technical alternatives or the failure to offer innovative products or enhancements at competitive prices may cause existing and potential customers to purchase our competitors’ products. Though we strive to align our solutions with requirements of our customers, there can be no assurance that we will be able to secure the necessary knowledge through our own in-house product development that will allow us to continue to develop our offerings in accordance with the requirements of our customers and industry trends. 22. Our ability to access capital at attractive costs depends on our credit ratings. Non-availability of credit ratings or a poor rating may restrict our access to capital and thereby adversely affect our business, financial conditions, cash flows and results of operations. The cost and availability of capital depends on our credit ratings. Set out below are our credit ratings received from [COMPANY_044], in the three-month period ended June 30, 2025, Fiscals 2025, 2024 and 2023: Date Rating Outlo ok Facilities/ Instrument December 10, 2024 ‘CARE A-’ Stable Long Term Bank Facilities ‘CARE A-’ Stable/ CARE A2 Long Term / Short Term Bank Facilities ‘CARE A2’ N.A. Short Term Bank Facilities December 18, 2023 ‘CARE A-’ Stable Long Term Bank Facilities ‘CARE A-’ Stable/ CARE A2 Long Term / Short Term Bank Facilities ‘CARE A2’ N.A. Short Term Bank Facilities ‘CARE A2’ N.A. Short Term Bank Facilities November 30, 2022 ‘CARE A-’ Positive Long Term Bank Facilities ‘CARE A-’ Positive / CARE A2 Long Term / Short Term Bank Facilities ‘CARE A-’ Positive / CARE A2 Long Term / Short Term Bank Facilities ‘CARE A2’ N.A. Short Term Bank Facilities An inability to secure future financing on attractive terms or at all may adversely impact our strategic initiatives and our business prospects. Credit ratings reflect the opinion of the rating agency on our management, track record, diversified clientele, increase in scale and operations and margins, medium term revenue visibility and operating cycle. While our rating outlook has been revised from ‘positive’ to ‘stable’ in our latest ratings obtained on December 10, 2024, we have not experienced downgrading in our credit ratings received in the last three-month period ended June 30, 2025 or Fiscals 2025, 2024 and 2023, any downgrade in our credit ratings or our inability to obtain such credit rating in a timely manner or any non-availability of credit ratings, or poor ratings, could increase borrowing costs, will give the right to our lenders to review the facilities availed by us under our financing arrangements and adversely affect our access to capital and debt markets, which could in turn adversely affect our interest margins, our business, results of operations, financial condition and cash flows.</w:t>
       </w:r>
     </w:p>
     <w:p>
@@ -1704,7 +1704,7 @@
     </w:p>
     <w:p>
       <w:r>
-        <w:t>34. Our Company has availed unsecured loans from financial institutions which may be recalled on demand. As of October 31, 2025, our Company has outstanding unsecured loans amounting to ₹ 397.59 million as unsecured loans for our working capital requirements from financial institutions which is repayable on demand to the relevant lenders. These loans are not repayable in accordance with any agreed repayment schedule and may be recalled by the relevant lender at any time. In such cases, our Company may be required to repay the entirety of the unsecured loans together with accrued interest. Our Company may not be able to generate sufficient funds at short notice to be able to repay such loans and may resort to refinancing such loans at a higher rate of interest and on terms not favourable to it. If we are unable to arrange for any such financing arrangements, we may not have adequate working capital to carry out the operations or complete our ongoing operations. Failure to repay unsecured loans in a timely manner may have a material adverse effect on our business, cash flows and financial condition. For further details of unsecured loans of our Company, see, “ Restated Financial Statement ” on page 280. 25. We depend on our Individual Promoters, Senior Management, Key Management Personnel and qualified and skilled personnel with technical expertise, and if we are unable to recruit and retain senior management, qualified and skilled personnel, our business and our ability to operate or grow our business maybe adversely affected. We are led by our Individual Promoters Jane Smith, Peter Parker, Alex Morgan, Taylor Brown and Jordan Lee. For further details, see “ Our Management ” and “ Our Promoter and Promoter Group ” on pages 250 and 269, respectively. Our future performance would depend on the continued service of our Individual Promoters, Senior Management, Key Managerial Personnel, qualified and skilled personnel with technical expertise, and the loss of any senior employee and the inability to find an adequate replacement may impair our relationship with key customers and our level of technical expertise, which may adversely affect our business, cash flows, financial condition, results of operations and prospects. Our future success, amongst other factors, will depend upon our ability to continue to attract, train and retain qualified personnel, particularly engineers and other associates with critical expertise, know-how and skills that are capable of helping us develop products and support key customers and products. We may therefore need to increase compensation and other benefits in order to attract and retain personnel in the future, which may adversely affect our business, financial conditions, cash flows and results of operations. As on date, our Company does not have a business succession policy in place, and there can be no assurance that we will be able to effectively formulate or implement appropriate succession plans in the future. Any loss of members of our senior management team or key managerial personnel could significantly delay or prevent the achievement of our business objectives, affect our succession planning and could harm our business and customer relationships. While there have not been any instances of where we have not been able to effectively replace our members of senior management, or loss of key managerial personnel in the three-month period ended June 30, 2025, and the Fiscals 2025, 2024 and 2023, we cannot assure you that we would be effectively able to replace any loss of members of our senior management team or key managerial personnels in the future. The market for qualified professionals is competitive and we may not continue to be successful in our efforts to attract and retain qualified people. The specialized skills we require in our industry are difficult and time-consuming to acquire and, as a result, are in short supply. Our inability to hire, train and retain a sufficient number of qualified personnel could delay our ability to bring new products to the market and impair the success of our operations. We may also be required to increase our levels of employee compensation and benefits more rapidly than in the past to remain competitive in attracting skilled personnel. This could have an adverse effect on our business, financial conditions, cash flows and results of operations. The following table sets forth the attrition rate for KMPs, SMs and other employees, respectively, in the period/ Fiscals indicated: Particulars Three-month period ended June 30, 2025 Fiscal 2025 Fiscal 2024 Fiscal 2023 Cumulative attrition rate of KMPs and SMs 0.00% Particulars Three-month period ended June 30, 2025 Fiscal 2025 Fiscal 2024 Fiscal 2023 Employee attrition rate (excluding KMPs/ SMs) 4.00%</w:t>
+        <w:t>34. Our Company has availed unsecured loans from financial institutions which may be recalled on demand. As of October 31, 2025, our Company has outstanding unsecured loans amounting to ₹ 397.59 million as unsecured loans for our working capital requirements from financial institutions which is repayable on demand to the relevant lenders. These loans are not repayable in accordance with any agreed repayment schedule and may be recalled by the relevant lender at any time. In such cases, our Company may be required to repay the entirety of the unsecured loans together with accrued interest. Our Company may not be able to generate sufficient funds at short notice to be able to repay such loans and may resort to refinancing such loans at a higher rate of interest and on terms not favourable to it. If we are unable to arrange for any such financing arrangements, we may not have adequate working capital to carry out the operations or complete our ongoing operations. Failure to repay unsecured loans in a timely manner may have a material adverse effect on our business, cash flows and financial condition. For further details of unsecured loans of our Company, see, “ Restated Financial Statement ” on page 280. 25. We depend on our Individual Promoters, Senior Management, Key Management Personnel and qualified and skilled personnel with technical expertise, and if we are unable to recruit and retain senior management, qualified and skilled personnel, our business and our ability to operate or grow our business maybe adversely affected. We are led by our Individual Promoters [PERSON_002], [PERSON_003], [PERSON_004], [PERSON_005] and [PERSON_006]. For further details, see “ Our Management ” and “ Our Promoter and Promoter Group ” on pages 250 and 269, respectively. Our future performance would depend on the continued service of our Individual Promoters, Senior Management, Key Managerial Personnel, qualified and skilled personnel with technical expertise, and the loss of any senior employee and the inability to find an adequate replacement may impair our relationship with key customers and our level of technical expertise, which may adversely affect our business, cash flows, financial condition, results of operations and prospects. Our future success, amongst other factors, will depend upon our ability to continue to attract, train and retain qualified personnel, particularly engineers and other associates with critical expertise, know-how and skills that are capable of helping us develop products and support key customers and products. We may therefore need to increase compensation and other benefits in order to attract and retain personnel in the future, which may adversely affect our business, financial conditions, cash flows and results of operations. As on date, our Company does not have a business succession policy in place, and there can be no assurance that we will be able to effectively formulate or implement appropriate succession plans in the future. Any loss of members of our senior management team or key managerial personnel could significantly delay or prevent the achievement of our business objectives, affect our succession planning and could harm our business and customer relationships. While there have not been any instances of where we have not been able to effectively replace our members of senior management, or loss of key managerial personnel in the three-month period ended June 30, 2025, and the Fiscals 2025, 2024 and 2023, we cannot assure you that we would be effectively able to replace any loss of members of our senior management team or key managerial personnels in the future. The market for qualified professionals is competitive and we may not continue to be successful in our efforts to attract and retain qualified people. The specialized skills we require in our industry are difficult and time-consuming to acquire and, as a result, are in short supply. Our inability to hire, train and retain a sufficient number of qualified personnel could delay our ability to bring new products to the market and impair the success of our operations. We may also be required to increase our levels of employee compensation and benefits more rapidly than in the past to remain competitive in attracting skilled personnel. This could have an adverse effect on our business, financial conditions, cash flows and results of operations. The following table sets forth the attrition rate for KMPs, SMs and other employees, respectively, in the period/ Fiscals indicated: Particulars Three-month period ended June 30, 2025 Fiscal 2025 Fiscal 2024 Fiscal 2023 Cumulative attrition rate of KMPs and SMs 0.00% Particulars Three-month period ended June 30, 2025 Fiscal 2025 Fiscal 2024 Fiscal 2023 Employee attrition rate (excluding KMPs/ SMs) 4.00%</w:t>
       </w:r>
     </w:p>
     <w:p>
@@ -1740,7 +1740,7 @@
     </w:p>
     <w:p>
       <w:r>
-        <w:t>or qualified replacements, our results of operations may be adversely affected. For details of changes in our key management personnel, please see “ Our Management ” on page 250. An increase in employee attrition rates may result in an increase in recruitment and training costs for new hires, a decline in productivity and efficiency and loss of knowledge, skill and expertise. We cannot provide assurance that we will be able to grow our workforce in a manner consistent with our growth objectives, which may adversely affect our business, results of operations, cash flows and financial condition. 36. Apart from two of our Directors, none of our Directors have any prior experience of directorships in listed companies. Post listing of the Equity Shares on the Stock Exchanges, our Company will be subject to the applicable regulatory requirements of a listed company, including regulations prescribed under SEBI Listing Regulations and the Companies Act. Any non-compliance with the regulatory requirements, due to lack of experience or otherwise, may subject us to adverse regulatory actions. As of the date of this Red Herring Prospectus, our Board comprises of eight Directors, of which four are Executive Directors, and four are Independent Directors (including one woman Independent Director). While all of our directors have several years of experience and expertise in their respective fields, apart from two of our Independent Directors, namely Emerson Cole and Phoenix Day, none of our Directors, are currently on the board of directors of companies that are listed on the stock exchanges in India or outside India. Accordingly, most of our Directors have limited exposure to management of affairs of a listed company which, inter alia, entails several compliance requirements and scrutiny of affairs by shareholders, regulators and the public at large that is associated with being a listed company. Post listing of the Equity Shares on the Stock Exchanges, our Company will be subject to the applicable regulatory requirements of a listed company, including the regulations prescribed under the SEBI Listing Regulations and the Companies Act. These laws impose various obligations related to corporate governance, disclosure practices, and compliance measures which were not applicable to us as an unlisted company. Any delay or non-compliance with such applicable regulatory requirements, due to lack of experience or otherwise, may present certain potential challenges for our Company including but not limited to adverse regulatory actions or imposition of fines. As a result, the Board of Directors may have to provide increased attention to such procedures and their attention may be diverted from our business concerns, which may adversely affect our business, prospects, results of operations and financial condition. 26. We currently avail benefits under certain Government incentive schemes. Cancellation or our inability to meet the conditions under such schemes may result in adversely affect our business operations, cash flows, results of operations and financial condition. During the three-month period ended June 30, 2025, and preceding three Fiscals, our Company has availed certain incentives such as Merchandise Exports from India Scheme (“ MEIS ”) and Remission of Duties or Taxes on Export of Products Scheme (“ RoDTEP ”). The table below sets forth details relating to government incentive schemes: Three-month period ended June 30, 2025 Fiscal 2025 Fiscal 2024 Fiscal 2023 Governmen t Incentive schemes ( ₹ in millio n) Percentage of Revenue from Operations (%) Government Incentive schemes ( ₹ in million) Percentage of Revenue from Operation s (%) Government Incentive schemes ( ₹ in million) Percentage of Revenue from Operation s (%) Government Incentive schemes ( ₹ in million) Percentage of Revenue from Operation s (%) 0 0% 0.75 In relation to our upcoming projects, including in relation to, setting up of our Supa Facility, we expect to receive incentives from the Maharashtra State Government under the Maharashtra Industrial Policy, 2019 (“ MIP ”), which aims to incentivise the companies for setting up and/ or expanding existing facilities primarily based on certain revenue parameters. Key incentive under the MIP includes tax benefits of 50% of gross state GST for local sales made within Maharashtra, and customized benefits to mega and ultra mega units on a case-to-case basis.</w:t>
+        <w:t>or qualified replacements, our results of operations may be adversely affected. For details of changes in our key management personnel, please see “ Our Management ” on page 250. An increase in employee attrition rates may result in an increase in recruitment and training costs for new hires, a decline in productivity and efficiency and loss of knowledge, skill and expertise. We cannot provide assurance that we will be able to grow our workforce in a manner consistent with our growth objectives, which may adversely affect our business, results of operations, cash flows and financial condition. 36. Apart from two of our Directors, none of our Directors have any prior experience of directorships in listed companies. Post listing of the Equity Shares on the Stock Exchanges, our Company will be subject to the applicable regulatory requirements of a listed company, including regulations prescribed under SEBI Listing Regulations and the Companies Act. Any non-compliance with the regulatory requirements, due to lack of experience or otherwise, may subject us to adverse regulatory actions. As of the date of this Red Herring Prospectus, our Board comprises of eight Directors, of which four are Executive Directors, and four are Independent Directors (including one woman Independent Director). While all of our directors have several years of experience and expertise in their respective fields, apart from two of our Independent Directors, namely [PERSON_030] and [PERSON_031], none of our Directors, are currently on the board of directors of companies that are listed on the stock exchanges in India or outside India. Accordingly, most of our Directors have limited exposure to management of affairs of a listed company which, inter alia, entails several compliance requirements and scrutiny of affairs by shareholders, regulators and the public at large that is associated with being a listed company. Post listing of the Equity Shares on the Stock Exchanges, our Company will be subject to the applicable regulatory requirements of a listed company, including the regulations prescribed under the SEBI Listing Regulations and the Companies Act. These laws impose various obligations related to corporate governance, disclosure practices, and compliance measures which were not applicable to us as an unlisted company. Any delay or non-compliance with such applicable regulatory requirements, due to lack of experience or otherwise, may present certain potential challenges for our Company including but not limited to adverse regulatory actions or imposition of fines. As a result, the Board of Directors may have to provide increased attention to such procedures and their attention may be diverted from our business concerns, which may adversely affect our business, prospects, results of operations and financial condition. 26. We currently avail benefits under certain Government incentive schemes. Cancellation or our inability to meet the conditions under such schemes may result in adversely affect our business operations, cash flows, results of operations and financial condition. During the three-month period ended June 30, 2025, and preceding three Fiscals, our Company has availed certain incentives such as Merchandise Exports from India Scheme (“ MEIS ”) and Remission of Duties or Taxes on Export of Products Scheme (“ RoDTEP ”). The table below sets forth details relating to government incentive schemes: Three-month period ended June 30, 2025 Fiscal 2025 Fiscal 2024 Fiscal 2023 Governmen t Incentive schemes ( ₹ in millio n) Percentage of Revenue from Operations (%) Government Incentive schemes ( ₹ in million) Percentage of Revenue from Operation s (%) Government Incentive schemes ( ₹ in million) Percentage of Revenue from Operation s (%) Government Incentive schemes ( ₹ in million) Percentage of Revenue from Operation s (%) 0 0% 0.75 In relation to our upcoming projects, including in relation to, setting up of our Supa Facility, we expect to receive incentives from the Maharashtra State Government under the Maharashtra Industrial Policy, 2019 (“ MIP ”), which aims to incentivise the companies for setting up and/ or expanding existing facilities primarily based on certain revenue parameters. Key incentive under the MIP includes tax benefits of 50% of gross state GST for local sales made within Maharashtra, and customized benefits to mega and ultra mega units on a case-to-case basis.</w:t>
       </w:r>
     </w:p>
     <w:p>
@@ -1776,7 +1776,7 @@
     </w:p>
     <w:p>
       <w:r>
-        <w:t>with effect from February 5, 2025 for certain categories of beneficiaries which also includes our Company. Further, our inability to meet the conditions as prescribed under such schemes would make our Company less competitive against its competitors who have been availing this scheme by complying all conditions. 38. We may be unable to adequately protect intellectual property that we use and may be subject to risks of infringement claims. We rely on our trademarks to protect our intellectual property, which is critical to our business. The protection of our intellectual property rights may require the expenditure of financial, managerial and operational resources. We rely on a combination of laws and regulations, confidentiality of information and contractual restrictions to protect our intellectual property. Despite our efforts to protect and enforce our proprietary rights, unauthorized parties have used, and may in the future use, our trademarks or similar trademarks, copy aspects of our website images, features, compilation and functionality or obtain and use information that we consider as proprietary, such as trade secrets. Our trademark “KSH” is also used by 18 other entities, including, (i) Initech Solutions Limited (24); (ii) Hooli Technologies Limited (25); (iii) Pied Piper Inc. (26); (iv) Stark Industries Limited (27); (v) Wayne Enterprises Limited (28); (vi) Oscorp Limited (29); (vii) Vance Refrigeration LLC (30); (viii) Dunder Mifflin Private Limited (31); (ix) Soylent Corp Limited (32); (x) Tyrell Corporation (33); (xi) Cyberdyne Systems Limited (34); (xii) Massive Dynamic Inc. (35); (xiii) Wayne Enterprises Limited; (xiv) Aperture Science LLC (36); (xv) Wonka Industries Limited (37); (xvi) Weyland Corp Limited (38); (xvii) Bluth Company LLC (39); and (xviii) Sterling Cooper Limited (40) (“ Group Entities ”). We have entered into consent and waiver letters each dated May 22, 2025, respectively, and authorisation letter dated November 27, 2025, with the Group Entities setting out the arrangement on usage of the brand “KSH”. As of date of this Red Herring Prospectus, we have permitted the Group Entities to use the “KSH” trademark without any payment, provided that certain terms and conditions therein are met. We cannot assure you that any waiver of consideration for using the “KSH” trademark would not have any adverse effect on our financial condition. Further, we do not hold any patents over our product formulae and have not made any applications in this respect. We may therefore not be able to prevent our competitors from developing, using or commercializing products that are functionally equivalent or similar to our products. This may lead to reduction in sales of some of our products. Additionally, the process of obtaining intellectual property protection is expensive and time-consuming, and the amount of compensation for damages can be limited. Even if issued, trademarks may not adequately protect our intellectual property, as the legal standards relating to the validity, enforceability and scope of protection of trademark and other intellectual property rights are applied on a case-by-case basis and it is generally difficult to predict the results of any litigation relating to such matters. Any litigation, whether or not it is resolved in our favour, could result in significant expense to us and divert the efforts of our technical and management personnel, which may adversely affect our business, financial condition, cash flows and results of operations. While there have not been any instances of infringement of our intellectual property rights which have come to our knowledge in the three-month period ended June 30, 2025 or Fiscals 2025, 2024 and 2023, we cannot assure you that such instances shall not occur in the future. 27. Our insurance coverage may not be sufficient or adequate to protect us against all material hazards, which may adversely affect our business, results of operations, financial condition and cash flows Our operations are subject to various risks inherent in the manufacturing industry including defects, liability for product and/or property damage, malfunctions and failures of manufacturing equipment, fire, riots, strikes, explosions, loss-in-transit for our products, accidents, personal injury or death, environmental pollution and natural disasters. We maintain ongoing insurance policies in order to manage the risk of losses from potentially harmful events, including: (i) marine open inland transit insurance; (ii) marine open export transit insurance (iii) standard fire and special perils policy; (iv) industrial all risk policy; (v) public liability industrial policy; and (vi) money insurance policy; (vii) group health insurance policy and (viii) burglary first loss policy. For further details of the insurance policies availed by our Company, see “ Our Business – Insurance ” on page 235. Our insurance may not be adequate to completely cover any or all of our risks and liabilities. Further, there is no assurance that the insurance premiums payable by us will be commercially viable or justifiable. Accordingly, our inability to maintain adequate insurance cover in connection with our business could adversely affect our operations and profitability. The following table sets forth our insurance cover in absolute amount and as a percentage of net assets as of the dates indicated:</w:t>
+        <w:t>with effect from February 5, 2025 for certain categories of beneficiaries which also includes our Company. Further, our inability to meet the conditions as prescribed under such schemes would make our Company less competitive against its competitors who have been availing this scheme by complying all conditions. 38. We may be unable to adequately protect intellectual property that we use and may be subject to risks of infringement claims. We rely on our trademarks to protect our intellectual property, which is critical to our business. The protection of our intellectual property rights may require the expenditure of financial, managerial and operational resources. We rely on a combination of laws and regulations, confidentiality of information and contractual restrictions to protect our intellectual property. Despite our efforts to protect and enforce our proprietary rights, unauthorized parties have used, and may in the future use, our trademarks or similar trademarks, copy aspects of our website images, features, compilation and functionality or obtain and use information that we consider as proprietary, such as trade secrets. Our trademark “KSH” is also used by 18 other entities, including, (i) [COMPANY_024]; (ii) [COMPANY_025]; (iii) [COMPANY_026]; (iv) [COMPANY_027]; (v) [COMPANY_028]; (vi) [COMPANY_029]; (vii) [COMPANY_030]; (viii) [COMPANY_031]; (ix) [COMPANY_032]; (x) [COMPANY_033]; (xi) [COMPANY_034]; (xii) [COMPANY_035]; (xiii) [COMPANY_008]; (xiv) [COMPANY_036]; (xv) [COMPANY_037]; (xvi) [COMPANY_038]; (xvii) [COMPANY_039]; and (xviii) [COMPANY_040] (“ Group Entities ”). We have entered into consent and waiver letters each dated May 22, 2025, respectively, and authorisation letter dated November 27, 2025, with the Group Entities setting out the arrangement on usage of the brand “KSH”. As of date of this Red Herring Prospectus, we have permitted the Group Entities to use the “KSH” trademark without any payment, provided that certain terms and conditions therein are met. We cannot assure you that any waiver of consideration for using the “KSH” trademark would not have any adverse effect on our financial condition. Further, we do not hold any patents over our product formulae and have not made any applications in this respect. We may therefore not be able to prevent our competitors from developing, using or commercializing products that are functionally equivalent or similar to our products. This may lead to reduction in sales of some of our products. Additionally, the process of obtaining intellectual property protection is expensive and time-consuming, and the amount of compensation for damages can be limited. Even if issued, trademarks may not adequately protect our intellectual property, as the legal standards relating to the validity, enforceability and scope of protection of trademark and other intellectual property rights are applied on a case-by-case basis and it is generally difficult to predict the results of any litigation relating to such matters. Any litigation, whether or not it is resolved in our favour, could result in significant expense to us and divert the efforts of our technical and management personnel, which may adversely affect our business, financial condition, cash flows and results of operations. While there have not been any instances of infringement of our intellectual property rights which have come to our knowledge in the three-month period ended June 30, 2025 or Fiscals 2025, 2024 and 2023, we cannot assure you that such instances shall not occur in the future. 27. Our insurance coverage may not be sufficient or adequate to protect us against all material hazards, which may adversely affect our business, results of operations, financial condition and cash flows Our operations are subject to various risks inherent in the manufacturing industry including defects, liability for product and/or property damage, malfunctions and failures of manufacturing equipment, fire, riots, strikes, explosions, loss-in-transit for our products, accidents, personal injury or death, environmental pollution and natural disasters. We maintain ongoing insurance policies in order to manage the risk of losses from potentially harmful events, including: (i) marine open inland transit insurance; (ii) marine open export transit insurance (iii) standard fire and special perils policy; (iv) industrial all risk policy; (v) public liability industrial policy; and (vi) money insurance policy; (vii) group health insurance policy and (viii) burglary first loss policy. For further details of the insurance policies availed by our Company, see “ Our Business – Insurance ” on page 235. Our insurance may not be adequate to completely cover any or all of our risks and liabilities. Further, there is no assurance that the insurance premiums payable by us will be commercially viable or justifiable. Accordingly, our inability to maintain adequate insurance cover in connection with our business could adversely affect our operations and profitability. The following table sets forth our insurance cover in absolute amount and as a percentage of net assets as of the dates indicated:</w:t>
       </w:r>
     </w:p>
     <w:p>
@@ -1848,7 +1848,7 @@
     </w:p>
     <w:p>
       <w:r>
-        <w:t>45. Any variation in the utilization of the Net Proceeds as disclosed in this Red Herring Prospectus shall be subject to certain compliance requirements, including prior approval of the shareholders of our Company. We propose to utilize the Net Proceeds towards (i) Prepayment and/or repayment, in full or in part, of all or a portion of certain outstanding borrowings availed by our Company; (ii) Funding the capital expenditure requirements of our Company towards (b) purchasing and setting up of new machinery for expansion at our Supa Facility; and (b) purchasing and setting up of new machinery at Unit 2 in Chakan, Pune in Maharashtra; (iii) Funding the capital expenditure requirements of our Company towards purchasing and setting up of a rooftop solar power plant for power generation at our Supa Facility; and (iv) general corporate purposes. For further details of the proposed objects of the Offer, see “ Objects of the Offer ” on page 106. Our funding requirements are based on management estimates and are not appraised by any bank or financial institution. The deployment of the Net Proceeds will be at the discretion of our Board. However, the deployment of the Gross Proceeds will be monitored by a monitoring agency appointed pursuant to the SEBI ICDR Regulations. Further, we cannot determine with any certainty if we would require the Net Proceeds to meet another expenditure or fund any exigencies arising out of the competitive environment, business conditions, economic conditions or other factors beyond our control. In accordance with the Companies Act, 2013 and the SEBI ICDR Regulations, we cannot undertake variation in the utilization of the Net Proceeds as disclosed in this Red Herring Prospectus without obtaining the approval of the Shareholders through a special resolution. In the event of any such circumstances that require us to vary the disclosed utilization of the Net Proceeds, we may not be able to obtain the approval of the Shareholders in a timely manner, or at all. Any delay or inability in obtaining such approval of the Shareholders may adversely affect our business or operations. Further, our Promoters would be required to provide an exit opportunity to the shareholders of our Company who do not agree with our proposal to modify the objects of the Offer, at a price and manner as prescribed by SEBI. Additionally, the requirement on Promoters to provide an exit opportunity to such dissenting shareholders of our Company may deter our Promoters from agreeing to the variation of the proposed utilization of the Net Proceeds, even if such variation is in the interest of our Company. Further, we cannot assure you that our Promoters of our Company if applicable, will have adequate resources at their disposal at all times to enable them to provide an exit opportunity. In light of these factors, we may not be able to vary the objects of the Offer to use any unutilized proceeds of the Fresh Issue, if any, even if such variation is in the interest of our Company. This may restrict our Company’s ability to respond to any change in our business or financial condition by re-deploying the unutilized portion of Net Proceeds, if any, which may adversely affect our business, financial conditions, cash flows and results of operations. 30. We may be susceptible to liabilities arising from violation of applicable anti-bribery and anti-corruption laws. We are subject to anti-corruption and anti-bribery laws that prohibit improper payments or offers of improper payments to governments and their officials and political parties for the purpose of obtaining or retaining business or securing an improper advantage and require the maintenance of internal controls to prevent such payments. Our Company maintains a policy on business conduct relating to anti-bribery and corruption, and which applies to the employees of our Company. Notwithstanding this, our employees might take actions that could expose us to liability under anti-bribery laws. In certain circumstances, we may be held liable for actions taken by our partners and agents, even though they are not always subject to our control. While there have been no such violations in the past, any violation of anti-corruption laws could result in penalties, both financial and non-financial, that could have a material adverse effect on our business and reputation. 31. Our ability to pay dividends in the future will depend on our future cash flows, working capital requirements, capital expenditures and financial condition. We have not declared and paid dividend in the previous three Fiscals. For details, see section titled “ Dividend Policy ” on page 279. However, the amount of our future dividend payments, if any, will depend on our future earnings, cash flows, financial condition, working capital requirements, capital expenditures, applicable Indian legal restrictions and other factors. There can be no assurance that we will pay dividends. We may decide to retain all of our earnings to finance the development and expansion of our business and, therefore, may not declare dividends on our Equity Shares. Additionally, in the future, we may be restricted by the terms of our financing agreements in making dividend payments unless otherwise agreed with our lenders. 32. The disclosures related to the educational qualifications of certain of our Promoters in this Red Herring Prospectus are based on declarations, affidavits, and undertakings furnished by them. Our Promoter, Chairman and Executive Director, Jane Smith, and our Promoter, Parker Lane have been unable to trace copies of certain documents pertaining to their educational qualifications. While they have taken the requisite steps to obtain the relevant supporting documentation, they have been unsuccessful in procuring the relevant supporting documentation. Accordingly, we have placed reliance on affidavits furnished by them to disclose the details of their educational qualifications in this Red Herring Prospectus and we have not been able to independently</w:t>
+        <w:t>45. Any variation in the utilization of the Net Proceeds as disclosed in this Red Herring Prospectus shall be subject to certain compliance requirements, including prior approval of the shareholders of our Company. We propose to utilize the Net Proceeds towards (i) Prepayment and/or repayment, in full or in part, of all or a portion of certain outstanding borrowings availed by our Company; (ii) Funding the capital expenditure requirements of our Company towards (b) purchasing and setting up of new machinery for expansion at our Supa Facility; and (b) purchasing and setting up of new machinery at Unit 2 in Chakan, Pune in Maharashtra; (iii) Funding the capital expenditure requirements of our Company towards purchasing and setting up of a rooftop solar power plant for power generation at our Supa Facility; and (iv) general corporate purposes. For further details of the proposed objects of the Offer, see “ Objects of the Offer ” on page 106. Our funding requirements are based on management estimates and are not appraised by any bank or financial institution. The deployment of the Net Proceeds will be at the discretion of our Board. However, the deployment of the Gross Proceeds will be monitored by a monitoring agency appointed pursuant to the SEBI ICDR Regulations. Further, we cannot determine with any certainty if we would require the Net Proceeds to meet another expenditure or fund any exigencies arising out of the competitive environment, business conditions, economic conditions or other factors beyond our control. In accordance with the Companies Act, 2013 and the SEBI ICDR Regulations, we cannot undertake variation in the utilization of the Net Proceeds as disclosed in this Red Herring Prospectus without obtaining the approval of the Shareholders through a special resolution. In the event of any such circumstances that require us to vary the disclosed utilization of the Net Proceeds, we may not be able to obtain the approval of the Shareholders in a timely manner, or at all. Any delay or inability in obtaining such approval of the Shareholders may adversely affect our business or operations. Further, our Promoters would be required to provide an exit opportunity to the shareholders of our Company who do not agree with our proposal to modify the objects of the Offer, at a price and manner as prescribed by SEBI. Additionally, the requirement on Promoters to provide an exit opportunity to such dissenting shareholders of our Company may deter our Promoters from agreeing to the variation of the proposed utilization of the Net Proceeds, even if such variation is in the interest of our Company. Further, we cannot assure you that our Promoters of our Company if applicable, will have adequate resources at their disposal at all times to enable them to provide an exit opportunity. In light of these factors, we may not be able to vary the objects of the Offer to use any unutilized proceeds of the Fresh Issue, if any, even if such variation is in the interest of our Company. This may restrict our Company’s ability to respond to any change in our business or financial condition by re-deploying the unutilized portion of Net Proceeds, if any, which may adversely affect our business, financial conditions, cash flows and results of operations. 30. We may be susceptible to liabilities arising from violation of applicable anti-bribery and anti-corruption laws. We are subject to anti-corruption and anti-bribery laws that prohibit improper payments or offers of improper payments to governments and their officials and political parties for the purpose of obtaining or retaining business or securing an improper advantage and require the maintenance of internal controls to prevent such payments. Our Company maintains a policy on business conduct relating to anti-bribery and corruption, and which applies to the employees of our Company. Notwithstanding this, our employees might take actions that could expose us to liability under anti-bribery laws. In certain circumstances, we may be held liable for actions taken by our partners and agents, even though they are not always subject to our control. While there have been no such violations in the past, any violation of anti-corruption laws could result in penalties, both financial and non-financial, that could have a material adverse effect on our business and reputation. 31. Our ability to pay dividends in the future will depend on our future cash flows, working capital requirements, capital expenditures and financial condition. We have not declared and paid dividend in the previous three Fiscals. For details, see section titled “ Dividend Policy ” on page 279. However, the amount of our future dividend payments, if any, will depend on our future earnings, cash flows, financial condition, working capital requirements, capital expenditures, applicable Indian legal restrictions and other factors. There can be no assurance that we will pay dividends. We may decide to retain all of our earnings to finance the development and expansion of our business and, therefore, may not declare dividends on our Equity Shares. Additionally, in the future, we may be restricted by the terms of our financing agreements in making dividend payments unless otherwise agreed with our lenders. 32. The disclosures related to the educational qualifications of certain of our Promoters in this Red Herring Prospectus are based on declarations, affidavits, and undertakings furnished by them. Our Promoter, Chairman and Executive Director, [PERSON_002], and our Promoter, [PERSON_028] have been unable to trace copies of certain documents pertaining to their educational qualifications. While they have taken the requisite steps to obtain the relevant supporting documentation, they have been unsuccessful in procuring the relevant supporting documentation. Accordingly, we have placed reliance on affidavits furnished by them to disclose the details of their educational qualifications in this Red Herring Prospectus and we have not been able to independently</w:t>
       </w:r>
     </w:p>
     <w:p>
@@ -1902,7 +1902,7 @@
     </w:p>
     <w:p>
       <w:r>
-        <w:t>S. No. Promoter Selling Shareholde r Maximum number of Equity Shares offered in the Offer for Sale Aggregate amount of Offer for Sale ( ₹ in millio n) Date of consent letter 1. Jane Smith [●] Up to ₹ 1,528.00 million December 6, 2025 2. Peter Parker [●] Up to ₹ 422.00 million December 6, 2025 3. Alex Morgan [●] Up to ₹ 475.00 million December 6, 2025 4. Taylor Brown [●] Up to ₹ 475.00 million December 6, 2025 (3) The Equity Shares held by the respective Promoter Selling Shareholders and being offered by the Promoter Selling Shareholders are eligible to form a part of the Offer for Sale in terms of the SEBI ICDR Regulations. Each of the Promoter Selling Shareholders, severally and not jointly, confirms that the Equity Shares being offered by it are eligible for being offered for sale pursuant to the Offer in terms of Regulation 8 of the SEBI ICDR Regulations. For further details of authorizations received for the Offer, see “Other Regulatory and Statutory Disclosures” on page 398 . (4) Subject to valid bids being received at or above the Offer Price, under subscription, if any, in any category, except in the QIB Portion, would be allowed to be met with spill-over from any other category or combination of categories of Bidders, as applicable, at the discretion of our Company, in consultation with the BRLMs and the Designated Stock Exchange, subject to applicable laws. Undersubscription in the Offer, if any, subject to receiving minimum subscription for 90% of the Fresh Issue and compliance with Rule 19(2)(b) of the Securities Contracts (Regulation) Rules, 1957, the Allotment for the valid Bids will be made in the first instance towards subscription for 90% of the Fresh Issue. For further details, see “Offer Structure” on page 417.</w:t>
+        <w:t>S. No. Promoter Selling Shareholde r Maximum number of Equity Shares offered in the Offer for Sale Aggregate amount of Offer for Sale ( ₹ in millio n) Date of consent letter 1. [PERSON_002] [●] Up to ₹ 1,528.00 million December 6, 2025 2. [PERSON_003] [●] Up to ₹ 422.00 million December 6, 2025 3. [PERSON_004] [●] Up to ₹ 475.00 million December 6, 2025 4. [PERSON_005] [●] Up to ₹ 475.00 million December 6, 2025 (3) The Equity Shares held by the respective Promoter Selling Shareholders and being offered by the Promoter Selling Shareholders are eligible to form a part of the Offer for Sale in terms of the SEBI ICDR Regulations. Each of the Promoter Selling Shareholders, severally and not jointly, confirms that the Equity Shares being offered by it are eligible for being offered for sale pursuant to the Offer in terms of Regulation 8 of the SEBI ICDR Regulations. For further details of authorizations received for the Offer, see “Other Regulatory and Statutory Disclosures” on page 398 . (4) Subject to valid bids being received at or above the Offer Price, under subscription, if any, in any category, except in the QIB Portion, would be allowed to be met with spill-over from any other category or combination of categories of Bidders, as applicable, at the discretion of our Company, in consultation with the BRLMs and the Designated Stock Exchange, subject to applicable laws. Undersubscription in the Offer, if any, subject to receiving minimum subscription for 90% of the Fresh Issue and compliance with Rule 19(2)(b) of the Securities Contracts (Regulation) Rules, 1957, the Allotment for the valid Bids will be made in the first instance towards subscription for 90% of the Fresh Issue. For further details, see “Offer Structure” on page 417.</w:t>
       </w:r>
     </w:p>
     <w:p>
@@ -1956,7 +1956,7 @@
     </w:p>
     <w:p>
       <w:r>
-        <w:t>GENERAL INFORMATION Registered Office of our Acme Corp Ltd. (21) 789, Brigade Road, 2nd Floor, Bengaluru – 560 025 (13) Maharashtra, India For details of change in our registered office, see “ History and Certain Corporate Matters – Changes in our Registered Office ” on page 243. Corporate Office of our Acme Corp Ltd. (21) 201, 101, Anna Salai, T Nagar, Chennai – 600 017 (14) Maharashtra, India Company registration number and corporate identity number (a) Registration number : 141032 (b) Corporate identity number : U28129PN1979PLC141032 Address of the RoC Our Company is registered with the Registrar of Companies, Maharashtra at Pune, which is situated at the following address: Registrar of Companies, Maharashtra at Pune 202, FC Road, Shivajinagar, Pune – 411 005 (15) Maharashtra, India Board of Directors of our Company The following table sets out the brief details of our Board of Directors as on the date of this Red Herring Prospectus: Name Designatio n DIN Address Jane Smith Chairman and Executive Director 0013507 0 303, SG Highway, Thaltej, Ahmedabad – 380 054 (16) Maharashtra, India Alex Morgan Managing Director 0011419 3 12 Buena Monte, NCL co-operative housing 404, Link Road, Andheri West, Mumbai – 400 053 (17), Maharashtra, India Taylor Brown Joint Managing Director 0013492 6 Pushpakamal 505, Banjara Hills, Road No 12, Hyderabad – 500 034 (18), Maharashtra, India Jordan Lee Whole-time Director 0312451 0 606, Residency Road, Richmond Town, Bengaluru – 560 025 (19) Maharashtra, India Emerson Cole Independent Director 0004980 1 Remy Cross, Senapati Bapat Road, behind Sahara Hotel, Shivajinagar, Model Colony, Pune – 411 016, Maharashtra, India Phoenix Day Independent Director 0121700 0 602, Gopalkrupa 707, Civil Lines, Prayagraj – 211 001 (20), Maharashtra, India Devon Ray Independent Director 1093895 8 A-259, JK 123, MG Road, Sector 5, New Delhi – 110 001 (21), Madhya Pradesh, India Cameron Bell Independent Director 0529308 4 A29, Abhimanshree 456, Park Street, Block B, Kolkata – 700 016 (22), Maharashtra, India For brief profiles and further details of our Board of Directors, see “ Our Management – Board of Directors ” on page 250.</w:t>
+        <w:t>GENERAL INFORMATION Registered Office of our [COMPANY_021] [ADDRESS_013] Maharashtra, India For details of change in our registered office, see “ History and Certain Corporate Matters – Changes in our Registered Office ” on page 243. Corporate Office of our [COMPANY_021] 201, [ADDRESS_014] Maharashtra, India Company registration number and corporate identity number (a) Registration number : 141032 (b) Corporate identity number : U28129PN1979PLC141032 Address of the RoC Our Company is registered with the Registrar of Companies, Maharashtra at Pune, which is situated at the following address: Registrar of Companies, Maharashtra at Pune [ADDRESS_015] Maharashtra, India Board of Directors of our Company The following table sets out the brief details of our Board of Directors as on the date of this Red Herring Prospectus: Name Designatio n DIN Address [PERSON_002] Chairman and Executive Director 0013507 0 [ADDRESS_016] Maharashtra, India [PERSON_004] Managing Director 0011419 3 12 Buena Monte, NCL co-operative housing [ADDRESS_017], Maharashtra, India [PERSON_005] Joint Managing Director 0013492 6 Pushpakamal [ADDRESS_018], Maharashtra, India [PERSON_006] Whole-time Director 0312451 0 [ADDRESS_019] Maharashtra, India [PERSON_030] Independent Director 0004980 1 [PERSON_032], Senapati Bapat Road, behind Sahara Hotel, Shivajinagar, Model Colony, Pune – 411 016, Maharashtra, India [PERSON_031] Independent Director 0121700 0 602, Gopalkrupa [ADDRESS_020], Maharashtra, India [PERSON_033] Independent Director 1093895 8 A-259, JK [ADDRESS_021], Madhya Pradesh, India [PERSON_034] Independent Director 0529308 4 A29, Abhimanshree [ADDRESS_022], Maharashtra, India For brief profiles and further details of our Board of Directors, see “ Our Management – Board of Directors ” on page 250.</w:t>
       </w:r>
     </w:p>
     <w:p>
@@ -1974,7 +1974,7 @@
     </w:p>
     <w:p>
       <w:r>
-        <w:t>Company Secretary and Compliance Officer John Doe is our Company Secretary and Compliance Officer. His contact details are as set forth below: 789, Brigade Road, 2nd Floor, Bengaluru – 560 025 (23) Maharashtra, India Telephone: +91 90000 00001 E-mail: sam.wilson@example.com Investor grievances Bidders may contact the Company Secretary and Compliance Officer, Book Running Lead Managers or Registrar to the Offer in case of any pre-Offer or post-Offer related queries, grievances and for redressal of complaints including non-receipt of letters of Allotment, non-credit of Allotted Equity Shares in the respective beneficiary account, non-receipt of refund orders or non-receipt of funds by electronic mode, etc. All Offer-related grievances, other than that of Anchor Investors, may be addressed to the Registrar to the Offer with a copy to the relevant Designated Intermediary(ies) with whom the Bid cum Application Form was submitted, giving full details such as name of the sole or First Bidder, Bid cum Application Form number, Bidder’s DP ID, Client ID, UPI ID, PAN, address of Bidder, number of Equity Shares applied for, ASBA Account number in which the amount equivalent to the Bid Amount was blocked or the UPI ID (for UPI Bidders who make the payment of Bid Amount through the UPI Mechanism), date of Bid cum Application Form and the name and address of the relevant Designated Intermediary(ies) where the Bid was submitted. Further, the Bidder shall enclose a copy of the Acknowledgment Slip or provide the application number received from the Designated Intermediary(ies) in addition to the documents or information mentioned hereinabove. All grievances relating to Bids submitted through Registered Brokers may be addressed to the Stock Exchanges with a copy to the Registrar to the Offer. The Registrar to the Offer shall obtain the required information from the SCSBs for addressing any clarifications or grievances of ASBA Bidders. All Offer-related grievances of the Anchor Investors may be addressed to the Registrar to the Offer, giving full details such as the name of the sole or First Bidder, Anchor Investor Application Form number, Bidders’ DP ID, Client ID, PAN, date of the Anchor Investor Application Form, address of the Bidder, number of the Equity Shares applied for, Bid Amount paid on submission of the Anchor Investor Application Form and the name and address of the BRLMs where the Anchor Investor Application Form was submitted by the Anchor Massive Dynamic Inc. (75) 101, Anna Salai, T Nagar, Chennai – 600 017 (24) Maharashtra, India Telephone: +91 90000 00006 Email : jane.smith@example.com Website : www.nuvama.com Investor grievance E-mail : taylor.brown@example.com Contact person : Sam Wilson/ Chris Blake SEBI registration no.: Bluth Company LLC ICICI Venture 202, FC Road, Shivajinagar, Pune – 411 005 (25) Maharashtra, India Telephone : +91 90000 00003 Email : peter.parker@example.com Website : www.icicisecurities.com Investor grievance E-mail : jordan.lee@example.com Contact person : Morgan Reed/Casey Quinn SEBI registration no. : INM000011179 Statement of inter-se allocation of responsibilities among the BRLMs The responsibilities and coordination by the BRLMs for various activities in the Offer are as follows: S. No. Activities Responsibility Coordinator 1. Due diligence of the Company including its operations/management/business plans/legal etc. Drafting and design of the Draft Red Herring Prospectus, Red Herring Prospectus, Prospectus, abridged prospectus and application form. The BRLMs shall ensure compliance with stipulated requirements and completion of prescribed formalities with the Stock Exchanges, RoC and SEBI including finalisation of RHP, Prospectus and RoC filing. Capital structuring with the relative components and formalities such as type of instruments, allocation between primary and secondary, etc. BRLMs Nuvama 2. Drafting and approval of statutory advertisements BRLMs Nuvama</w:t>
+        <w:t>Company Secretary and Compliance Officer [PERSON_001] is our Company Secretary and Compliance Officer. His contact details are as set forth below: [ADDRESS_023] Maharashtra, India Telephone: [PHONE_001] E-mail: [EMAIL_007] Investor grievances Bidders may contact the Company Secretary and Compliance Officer, Book Running Lead Managers or Registrar to the Offer in case of any pre-Offer or post-Offer related queries, grievances and for redressal of complaints including non-receipt of letters of Allotment, non-credit of Allotted Equity Shares in the respective beneficiary account, non-receipt of refund orders or non-receipt of funds by electronic mode, etc. All Offer-related grievances, other than that of Anchor Investors, may be addressed to the Registrar to the Offer with a copy to the relevant Designated Intermediary(ies) with whom the Bid cum Application Form was submitted, giving full details such as name of the sole or First Bidder, Bid cum Application Form number, Bidder’s DP ID, Client ID, UPI ID, PAN, address of Bidder, number of Equity Shares applied for, ASBA Account number in which the amount equivalent to the Bid Amount was blocked or the UPI ID (for UPI Bidders who make the payment of Bid Amount through the UPI Mechanism), date of Bid cum Application Form and the name and address of the relevant Designated Intermediary(ies) where the Bid was submitted. Further, the Bidder shall enclose a copy of the Acknowledgment Slip or provide the application number received from the Designated Intermediary(ies) in addition to the documents or information mentioned hereinabove. All grievances relating to Bids submitted through Registered Brokers may be addressed to the Stock Exchanges with a copy to the Registrar to the Offer. The Registrar to the Offer shall obtain the required information from the SCSBs for addressing any clarifications or grievances of ASBA Bidders. All Offer-related grievances of the Anchor Investors may be addressed to the Registrar to the Offer, giving full details such as the name of the sole or First Bidder, Anchor Investor Application Form number, Bidders’ DP ID, Client ID, PAN, date of the Anchor Investor Application Form, address of the Bidder, number of the Equity Shares applied for, Bid Amount paid on submission of the Anchor Investor Application Form and the name and address of the BRLMs where the Anchor Investor Application Form was submitted by the Anchor [COMPANY_075] [ADDRESS_024] Maharashtra, India Telephone: [PHONE_006] Email : [EMAIL_002] Website : www.nuvama.com Investor grievance E-mail : [EMAIL_005] Contact person : [PERSON_007]/ [PERSON_008] SEBI registration no.: [COMPANY_019] ICICI Venture [ADDRESS_025] Maharashtra, India Telephone : [PHONE_003] Email : [EMAIL_003] Website : www.icicisecurities.com Investor grievance E-mail : [EMAIL_006] Contact person : [PERSON_009]/[PERSON_010] SEBI registration no. : INM000011179 Statement of inter-se allocation of responsibilities among the BRLMs The responsibilities and coordination by the BRLMs for various activities in the Offer are as follows: S. No. Activities Responsibility Coordinator 1. Due diligence of the Company including its operations/management/business plans/legal etc. Drafting and design of the Draft Red Herring Prospectus, Red Herring Prospectus, Prospectus, abridged prospectus and application form. The BRLMs shall ensure compliance with stipulated requirements and completion of prescribed formalities with the Stock Exchanges, RoC and SEBI including finalisation of RHP, Prospectus and RoC filing. Capital structuring with the relative components and formalities such as type of instruments, allocation between primary and secondary, etc. BRLMs Nuvama 2. Drafting and approval of statutory advertisements BRLMs Nuvama</w:t>
       </w:r>
     </w:p>
     <w:p>
@@ -2006,7 +2006,7 @@
     </w:p>
     <w:p>
       <w:r>
-        <w:t>S. No. Activities Responsibility Coordinator 3. Drafting and approval of all publicity material other than statutory advertisement as mentioned above including corporate advertising, brochure, etc. and filing of media compliance report with SEBI BRLMs I-Sec 4. Appointment of all other intermediaries (e.g., Registrar(s), Printer(s), Monitoring Agency, Banker(s) to the Issue and Sponsor Banker to the Issue, Advertising agency etc.) including coordinating all agreements to be entered with such parties BRLMs Nuvama 5. Preparation of road show presentation and frequently asked questions BRLMs I-Sec 6. International Institutional Marketing of the Issue, which will cover, inter alia: ● Marketing strategy ● Finalising the list and division of international investors for one-to-one meetings and ● Finalizing road show and investor meeting schedules BRLMs I-Sec 7. Domestic Institutional Marketing of the Issue, which will cover, inter alia: ● Finalising the list and division of domestic investors for one-to-one meetings ● Finalizing domestic road show schedules and investor meeting schedules BRLMs Nuvama 8. Non-institutional marketing of the Issue, which will cover, inter alia, ● Finalising media, marketing and public relations strategy including list of frequently asked questions at non-institutional road shows; and ● Finalising centres for holding conferences for brokers, etc.; BRLMs Nuvama 9. Retail Marketing of the Issue, which will cover, inter alia, ● Formulating marketing strategies, preparation of publicity budget ● Finalizing Media and PR strategy ● Finalizing centres for holding conferences for brokers, etc. ● Finalizing collection centres; and ● Follow-up on distribution of publicity and Issue material including application form, prospectus and deciding on the quantum of the Issue material BRLMs I-Sec 10. Coordination with Stock-Exchanges for book building software, bidding terminals, mock trading, anchor coordination, anchor CAN and intimation of anchor allocation BRLMs I-Sec 11. Managing the book and finalization of pricing in consultation with the Company BRLMs I-Sec 12. Post-Offer activities, which shall involve essential follow-up with Bankers to the Issue and SCSBs to get quick estimates of collection and advising Company about the closure of the Issue, based on correct figures, finalisation of the basis of allotment or weeding out of multiple applications, unblocking of application monies, listing of instruments, dispatch of certificates or demat credit and refunds, payment of applicable Securities Transaction Tax on behalf of the Promoter Selling Shareholders and coordination with various agencies connected with the post-Offer activity such as Registrar to the Issue, Bankers to the Issue, Sponsor Banks, SCSBs including responsibility for underwriting arrangements, as applicable. Coordinating with Stock Exchanges and SEBI for submission of all post-Issue reports including the initial and final post-Issue report to Aperture Science LLC (76) 303, SG Highway, Thaltej, Ahmedabad – 380 054 (26) Maharashtra, India Telephone : +91 90000 00007 Email : jane.smith@example.com, chris.blake@example.com, and morgan.reed@example.com Website : www.nuvama.com Contact Person: Oakley Wood SEBI Registration Number: Wonka Industries Limited (77) ICICI Venture 202, FC Road, Shivajinagar, Pune – 411 005 (25) Maharashtra, India</w:t>
+        <w:t>S. No. Activities Responsibility Coordinator 3. Drafting and approval of all publicity material other than statutory advertisement as mentioned above including corporate advertising, brochure, etc. and filing of media compliance report with SEBI BRLMs I-Sec 4. Appointment of all other intermediaries (e.g., Registrar(s), Printer(s), Monitoring Agency, Banker(s) to the Issue and Sponsor Banker to the Issue, Advertising agency etc.) including coordinating all agreements to be entered with such parties BRLMs Nuvama 5. Preparation of road show presentation and frequently asked questions BRLMs I-Sec 6. International Institutional Marketing of the Issue, which will cover, inter alia: ● Marketing strategy ● Finalising the list and division of international investors for one-to-one meetings and ● Finalizing road show and investor meeting schedules BRLMs I-Sec 7. Domestic Institutional Marketing of the Issue, which will cover, inter alia: ● Finalising the list and division of domestic investors for one-to-one meetings ● Finalizing domestic road show schedules and investor meeting schedules BRLMs Nuvama 8. Non-institutional marketing of the Issue, which will cover, inter alia, ● Finalising media, marketing and public relations strategy including list of frequently asked questions at non-institutional road shows; and ● Finalising centres for holding conferences for brokers, etc.; BRLMs Nuvama 9. Retail Marketing of the Issue, which will cover, inter alia, ● Formulating marketing strategies, preparation of publicity budget ● Finalizing Media and PR strategy ● Finalizing centres for holding conferences for brokers, etc. ● Finalizing collection centres; and ● Follow-up on distribution of publicity and Issue material including application form, prospectus and deciding on the quantum of the Issue material BRLMs I-Sec 10. Coordination with Stock-Exchanges for book building software, bidding terminals, mock trading, anchor coordination, anchor CAN and intimation of anchor allocation BRLMs I-Sec 11. Managing the book and finalization of pricing in consultation with the Company BRLMs I-Sec 12. Post-Offer activities, which shall involve essential follow-up with Bankers to the Issue and SCSBs to get quick estimates of collection and advising Company about the closure of the Issue, based on correct figures, finalisation of the basis of allotment or weeding out of multiple applications, unblocking of application monies, listing of instruments, dispatch of certificates or demat credit and refunds, payment of applicable Securities Transaction Tax on behalf of the Promoter Selling Shareholders and coordination with various agencies connected with the post-Offer activity such as Registrar to the Issue, Bankers to the Issue, Sponsor Banks, SCSBs including responsibility for underwriting arrangements, as applicable. Coordinating with Stock Exchanges and SEBI for submission of all post-Issue reports including the initial and final post-Issue report to [COMPANY_076] [ADDRESS_026] Maharashtra, India Telephone : [PHONE_007] Email : [EMAIL_002], [EMAIL_008], and [EMAIL_009] Website : www.nuvama.com Contact Person: [PERSON_035] SEBI Registration Number: [COMPANY_077] ICICI Venture [ADDRESS_025] Maharashtra, India</w:t>
       </w:r>
     </w:p>
     <w:p>
@@ -2024,7 +2024,7 @@
     </w:p>
     <w:p>
       <w:r>
-        <w:t>Telephone : +91 90000 00003 Email : peter.parker@example.com Website : www.icicisecurities.com Investor grievance E-mail : jordan.lee@example.com Contact person : Morgan Reed/Casey Quinn</w:t>
+        <w:t>Telephone : [PHONE_003] Email : [EMAIL_003] Website : www.icicisecurities.com Investor grievance E-mail : [EMAIL_006] Contact person : [PERSON_009]/[PERSON_010]</w:t>
       </w:r>
     </w:p>
     <w:p>
@@ -2042,7 +2042,7 @@
     </w:p>
     <w:p>
       <w:r>
-        <w:t>SEBI registration no. : INM000011179 Legal Counsel to our Company as to Indian Law Trilegal One World Centre 10 th 404, Link Road, Andheri West, Mumbai – 400 053 (27) Maharashtra, India Email : casey.quinn@example.com Telephone : +91 90000 00008 Registrar to the Stark Industries Limited (47) (Massive Dynamic Inc.) C-101, Embassy 247 1 st 505, Banjara Hills, Road No 12, Hyderabad – 500 034 (28), (Maharashtra), India Telephone : +91 90000 00004 E-mail : alex.morgan@example.com Investor grievance E-mail : alex.morgan@example.com Website : www.in.mpms.mufg.com Contact Person : Riley Adams SEBI Registration No.: INR000004058 URL of SEBI website : www.sebi.gov.in/sebiweb/other/OtherAction.do?doRecognisedFpi=yes&amp;intmId=10 CIN: U67190MH1999PTC118368 Bankers to the Weyland Corp Limited (78) Globex Industries Limited (42), FIG-OPS Department – Lodha I Think Techno 606, Residency Road, Richmond Town, Bengaluru – 560 025 (29), Maharashtra, India Telephone: +91 90000 00009, +91 90000 00010 and +91 90000 00011 Email: riley.adams@example.com, drew.campbell@example.com avery.hart@example.com, jamie.stone@example.com, and skyler.west@example.com Website : www.hdfcbank.com Contact Person : Kai Rivera/ Jesse Hale/ Shawn Marsh/ Max Steele/ Noel Page SEBI Registration No: INBI00000063 CIN: Bluth Company LLC (79) Capital Market Division 163, 5th 707, Civil Lines, Prayagraj – 211 001 (30) Telephone: +91 90000 00012 Email: logan.grey@example.com Website: www.icicibank.com Contact Person : Varun Badai SEBI Registration No: INBI00000004 CIN: L65190GJ1994PLC021012</w:t>
+        <w:t>SEBI registration no. : INM000011179 Legal Counsel to our Company as to Indian Law Trilegal One World Centre 10 th [ADDRESS_027] Maharashtra, India Email : [EMAIL_010] Telephone : [PHONE_008] Registrar to the [COMPANY_047] ([COMPANY_015]) C-101, Embassy 247 1 st [ADDRESS_028], (Maharashtra), India Telephone : [PHONE_004] E-mail : [EMAIL_004] Investor grievance E-mail : [EMAIL_004] Website : www.in.mpms.mufg.com Contact Person : [PERSON_011] SEBI Registration No.: INR000004058 URL of SEBI website : www.sebi.gov.in/sebiweb/other/OtherAction.do?doRecognisedFpi=yes&amp;intmId=10 CIN: U67190MH1999PTC118368 Bankers to the [COMPANY_078] [COMPANY_042], FIG-OPS Department – Lodha I Think Techno [ADDRESS_029], Maharashtra, India Telephone: [PHONE_009], [PHONE_010] and [PHONE_011] Email: [EMAIL_011], [EMAIL_012] [EMAIL_013], [EMAIL_014], and [EMAIL_015] Website : www.hdfcbank.com Contact Person : [PERSON_036]/ [PERSON_037]/ [PERSON_038]/ [PERSON_039]/ [PERSON_040] SEBI Registration No: INBI00000063 CIN: [COMPANY_079] Capital Market Division 163, 5th [ADDRESS_030] Telephone: [PHONE_012] Email: [EMAIL_016] Website: www.icicibank.com Contact Person : Varun Badai SEBI Registration No: INBI00000004 CIN: L65190GJ1994PLC021012</w:t>
       </w:r>
     </w:p>
     <w:p>
@@ -2060,7 +2060,7 @@
     </w:p>
     <w:p>
       <w:r>
-        <w:t>Sterling Cooper Limited (80), FIG-OPS Department – Lodha I Think Techno 606, Residency Road, Richmond Town, Bengaluru – 560 025 (29), Maharashtra, India Telephone: +91 90000 00009, +91 90000 00010 and +91 90000 00011 Email: riley.adams@example.com, drew.campbell@example.com avery.hart@example.com, jamie.stone@example.com, and skyler.west@example.com Website : www.hdfcbank.com Contact Person : Kai Rivera/ Jesse Hale/ Shawn Marsh/ Max Steele/ Noel Page SEBI Registration No: INBI00000063 CIN: Acme Corp Ltd. (81) Capital Market Division 163, 5th 707, Civil Lines, Prayagraj – 211 001 (30) Telephone: +91 90000 00012 Email: logan.grey@example.com Website: www.icicibank.com Contact Person : Varun Badai SEBI Registration No: INBI00000004 CIN: Globex Industries Limited (82), FIG-OPS Department – Lodha I Think Techno 606, Residency Road, Richmond Town, Bengaluru – 560 025 (29), Maharashtra, India Telephone: +91 90000 00009, +91 90000 00010 and +91 90000 00011 Email: riley.adams@example.com, drew.campbell@example.com avery.hart@example.com, jamie.stone@example.com, and skyler.west@example.com Website : www.hdfcbank.com Contact Person : Kai Rivera/ Jesse Hale/ Shawn Marsh/ Max Steele/ Noel Page SEBI Registration No: INBI00000063 CIN: L65920MH1994PLC080618 Designated Intermediaries Self-Certified Syndicate Banks The list of SCSBs notified by SEBI for the ASBA process is available at http://www.sebi.gov.in/sebiweb/other/OtherAction.do?doRecognised=yes, or at such other website as may be prescribed by SEBI from time to time. A list of the Designated SCSB Branches with which an ASBA Bidder (other than a RIB using the UPI Mechanism), not Bidding through Syndicate/Sub Syndicate or through a Registered Broker, RTA or CDP may submit the Bid cum Application Forms, is available at https://www.sebi.gov.in/sebiweb/other/OtherAction.do?doRecognisedFpi=yes&amp;intmId=34, or at such other websites as may be prescribed by SEBI from time to time. Eligible SCSBs and mobile applications enabled for UPI Mechanism In accordance with the SEBI ICDR Master Circular, UPI Bidders may only apply through the SCSBs and mobile applications whose names appear on the website of the SEBI which may be updated from time to time. A list of SCSBs and mobile applications, using the UPI handles and which are live for applying in public issues using UPI mechanism is available on the website of SEBI at https://www.sebi.gov.in/sebiweb/other/OtherAction.do?doRecognisedFpi=yes&amp;intmId=40 and https://www.sebi.gov.in/sebiweb/other/OtherAction.do?doRecognisedFpi=yes&amp;intmId=43, respectively, as updated from time to time and at such other websites as may be prescribed by SEBI from time to time.</w:t>
+        <w:t>[COMPANY_080], FIG-OPS Department – Lodha I Think Techno [ADDRESS_029], Maharashtra, India Telephone: [PHONE_009], [PHONE_010] and [PHONE_011] Email: [EMAIL_011], [EMAIL_012] [EMAIL_013], [EMAIL_014], and [EMAIL_015] Website : www.hdfcbank.com Contact Person : [PERSON_036]/ [PERSON_037]/ [PERSON_038]/ [PERSON_039]/ [PERSON_040] SEBI Registration No: INBI00000063 CIN: [COMPANY_081] Capital Market Division 163, 5th [ADDRESS_030] Telephone: [PHONE_012] Email: [EMAIL_016] Website: www.icicibank.com Contact Person : Varun Badai SEBI Registration No: INBI00000004 CIN: [COMPANY_082], FIG-OPS Department – Lodha I Think Techno [ADDRESS_029], Maharashtra, India Telephone: [PHONE_009], [PHONE_010] and [PHONE_011] Email: [EMAIL_011], [EMAIL_012] [EMAIL_013], [EMAIL_014], and [EMAIL_015] Website : www.hdfcbank.com Contact Person : [PERSON_036]/ [PERSON_037]/ [PERSON_038]/ [PERSON_039]/ [PERSON_040] SEBI Registration No: INBI00000063 CIN: L65920MH1994PLC080618 Designated Intermediaries Self-Certified Syndicate Banks The list of SCSBs notified by SEBI for the ASBA process is available at http://www.sebi.gov.in/sebiweb/other/OtherAction.do?doRecognised=yes, or at such other website as may be prescribed by SEBI from time to time. A list of the Designated SCSB Branches with which an ASBA Bidder (other than a RIB using the UPI Mechanism), not Bidding through Syndicate/Sub Syndicate or through a Registered Broker, RTA or CDP may submit the Bid cum Application Forms, is available at https://www.sebi.gov.in/sebiweb/other/OtherAction.do?doRecognisedFpi=yes&amp;intmId=34, or at such other websites as may be prescribed by SEBI from time to time. Eligible SCSBs and mobile applications enabled for UPI Mechanism In accordance with the SEBI ICDR Master Circular, UPI Bidders may only apply through the SCSBs and mobile applications whose names appear on the website of the SEBI which may be updated from time to time. A list of SCSBs and mobile applications, using the UPI handles and which are live for applying in public issues using UPI mechanism is available on the website of SEBI at https://www.sebi.gov.in/sebiweb/other/OtherAction.do?doRecognisedFpi=yes&amp;intmId=40 and https://www.sebi.gov.in/sebiweb/other/OtherAction.do?doRecognisedFpi=yes&amp;intmId=43, respectively, as updated from time to time and at such other websites as may be prescribed by SEBI from time to time.</w:t>
       </w:r>
     </w:p>
     <w:p>
@@ -2078,7 +2078,7 @@
     </w:p>
     <w:p>
       <w:r>
-        <w:t>In relation to Bids (other than Bids by Anchor Investors and RIIs) submitted to a member of the Syndicate, the list of branches of the SCSBs at the Specified Locations named by the respective SCSBs to receive deposits of Bid cum Application Forms from the members of the Syndicate is available on the website of the SEBI at www.sebi.gov.in/sebiweb/other/OtherAction.do?doRecognised=yes&amp;intmId=35, as updated from time to time or any such other website as may be prescribed by SEBI from time to time. For more information on such branches collecting Bid cum Application Forms from the Syndicate at Specified Locations, see the website of the SEBI at www.sebi.gov.in/sebiweb/other/OtherAction.do?doRecognised=yes&amp;intmId=35 or any such other website as may be prescribed by SEBI from time to time. Registered Brokers Bidders can submit ASBA Forms in the Offer using the stockbroker network of the stock exchange, i.e., through the Registered Brokers at the Broker Centres. The list of the Registered Brokers eligible to accept ASBA Forms, including details such as postal address, telephone number and e-mail address, is provided on the websites of the Stock Exchanges at www.bseindia.com and www.nseindia.com, as updated from time to time. Registrar and Share Transfer Agents The list of the RTAs eligible to accept ASBA Forms at the Designated RTA Locations, including details such as address, telephone number and e-mail address, is provided on the websites of the Stock Exchanges at www.bseindia.com/Static/Markets/PublicIssues/RtaDp.aspx? and www.nseindia.com/products/content/equities/ipos/asba_procedures.htm, respectively, as updated from time to time. Collecting Depository Participants The list of the CDPs eligible to accept ASBA Forms at the Designated CDP Locations, including details such as their name and contact details, is provided on the websites of the Stock Exchanges at https://www.bseindia.com/Static/PublicIssues/RtaDp.aspx and https://www.nseindia.com/products/content/equities/ipos/asba_procedures.htm, respectively, as updated from time to time. Experts Except as stated below, our Company has not obtained any expert opinions: Our Company has received the written consent dated November 27, 2025 from our Statutory Auditors, Kirtane &amp; Pandit, LLP, Chartered Accountants, to include their name as required under section 26 (5) of the Companies Act, 2013 read with SEBI ICDR Regulations, in this Red Herring Prospectus and as an “expert” as defined under section 2(38) of the Companies Act, 2013, to the extent and in their capacity as our Statutory Auditors, and in respect of their (i) examination report dated October 18, 2025 on the Restated Financial Statements; and (ii) the statement of special tax benefits available to the Company and its shareholders under the direct and indirect tax laws in India dated November 27, 2025, included in this Red Herring Prospectus and (iii) any other certificates as may be required for the purposes of the Offer, and such consent has not been withdrawn as on the date of this Red Herring Prospectus. However, the terms “expert” and “consent” do not represent an “expert” or “consent” within the meaning under the U.S. Securities Act. Our Company has received written consent dated November 27, 2025 from Jamie Stone, to include their name as required under section 26 of the Companies Act, 2013 read with SEBI ICDR Regulations, in this Red Herring Prospectus, and as an “expert” as defined under section 2(38) of the Companies Act, 2013 to the extent and in their capacity as an independent chartered engineer in respect of information certified by them, as included in this Red Herring Prospectus; and such consent has not been withdrawn as on the date of this Red Herring Prospectus. Our Company has received written consent dated December 10, 2025 from Kanj &amp; Umbrella Holdings Private Limited (83), independent practicing company secretary, to include their name as required under Section 26 of the Companies Act, 2013 in this Red Herring Prospectus and as an ‘expert’ as defined under Section 2(38) of Companies Act, 2013 in respect of the certificate issued in their capacity as a practicing company secretary to our Company, and such consent has not been withdrawn as on the date of this Red Herring Prospectus.</w:t>
+        <w:t>In relation to Bids (other than Bids by Anchor Investors and RIIs) submitted to a member of the Syndicate, the list of branches of the SCSBs at the Specified Locations named by the respective SCSBs to receive deposits of Bid cum Application Forms from the members of the Syndicate is available on the website of the SEBI at www.sebi.gov.in/sebiweb/other/OtherAction.do?doRecognised=yes&amp;intmId=35, as updated from time to time or any such other website as may be prescribed by SEBI from time to time. For more information on such branches collecting Bid cum Application Forms from the Syndicate at Specified Locations, see the website of the SEBI at www.sebi.gov.in/sebiweb/other/OtherAction.do?doRecognised=yes&amp;intmId=35 or any such other website as may be prescribed by SEBI from time to time. Registered Brokers Bidders can submit ASBA Forms in the Offer using the stockbroker network of the stock exchange, i.e., through the Registered Brokers at the Broker Centres. The list of the Registered Brokers eligible to accept ASBA Forms, including details such as postal address, telephone number and e-mail address, is provided on the websites of the Stock Exchanges at www.bseindia.com and www.nseindia.com, as updated from time to time. Registrar and Share Transfer Agents The list of the RTAs eligible to accept ASBA Forms at the Designated RTA Locations, including details such as address, telephone number and e-mail address, is provided on the websites of the Stock Exchanges at www.bseindia.com/Static/Markets/PublicIssues/RtaDp.aspx? and www.nseindia.com/products/content/equities/ipos/asba_procedures.htm, respectively, as updated from time to time. Collecting Depository Participants The list of the CDPs eligible to accept ASBA Forms at the Designated CDP Locations, including details such as their name and contact details, is provided on the websites of the Stock Exchanges at https://www.bseindia.com/Static/PublicIssues/RtaDp.aspx and https://www.nseindia.com/products/content/equities/ipos/asba_procedures.htm, respectively, as updated from time to time. Experts Except as stated below, our Company has not obtained any expert opinions: Our Company has received the written consent dated November 27, 2025 from our Statutory Auditors, Kirtane &amp; Pandit, LLP, Chartered Accountants, to include their name as required under section 26 (5) of the Companies Act, 2013 read with SEBI ICDR Regulations, in this Red Herring Prospectus and as an “expert” as defined under section 2(38) of the Companies Act, 2013, to the extent and in their capacity as our Statutory Auditors, and in respect of their (i) examination report dated October 18, 2025 on the Restated Financial Statements; and (ii) the statement of special tax benefits available to the Company and its shareholders under the direct and indirect tax laws in India dated November 27, 2025, included in this Red Herring Prospectus and (iii) any other certificates as may be required for the purposes of the Offer, and such consent has not been withdrawn as on the date of this Red Herring Prospectus. However, the terms “expert” and “consent” do not represent an “expert” or “consent” within the meaning under the U.S. Securities Act. Our Company has received written consent dated November 27, 2025 from [PERSON_014], to include their name as required under section 26 of the Companies Act, 2013 read with SEBI ICDR Regulations, in this Red Herring Prospectus, and as an “expert” as defined under section 2(38) of the Companies Act, 2013 to the extent and in their capacity as an independent chartered engineer in respect of information certified by them, as included in this Red Herring Prospectus; and such consent has not been withdrawn as on the date of this Red Herring Prospectus. Our Company has received written consent dated December 10, 2025 from Kanj &amp; [COMPANY_083], independent practicing company secretary, to include their name as required under Section 26 of the Companies Act, 2013 in this Red Herring Prospectus and as an ‘expert’ as defined under Section 2(38) of Companies Act, 2013 in respect of the certificate issued in their capacity as a practicing company secretary to our Company, and such consent has not been withdrawn as on the date of this Red Herring Prospectus.</w:t>
       </w:r>
     </w:p>
     <w:p>
@@ -2096,7 +2096,7 @@
     </w:p>
     <w:p>
       <w:r>
-        <w:t>Statutory Auditors to our Company Kirtane &amp; Pandit, LLP, Chartered Accountants 5 th 123, MG Road, Sector 5, New Delhi – 110 001 (31) Maharashtra, India E-mail : dakota.mills@example.com Telephone : +91 90000 00013 Firm registration number : 105215W/ W100057 Peer review number : 014680 Changes in Auditors Except as stated below, there has been no change in our statutory auditors in the three years preceding the date of this Red Herring Prospectus: Particulars Date of change Reasons for change Kirtane &amp; Pandit, LLP, Chartered Accountants 5 th Floor, Gopal House Opposite Harshal Hall, above Initech Solutions Limited (84) Karve Road, Pune – 411 038 Maharashtra, India E-mail : dakota.mills@example.com Telephone : +91 90000 00014 Firm registration number : 105215W/ W100057 Peer review number : 014680 September 30, 2024 Appointment as the Statutory Auditors of our Company Hingne Tare &amp; Associates Flat No. 102, Sai Comple September 30, 2024 Expiry of term as the statutory auditors of our Company</w:t>
+        <w:t>Statutory Auditors to our Company Kirtane &amp; Pandit, LLP, Chartered Accountants 5 th [ADDRESS_031] Maharashtra, India E-mail : [EMAIL_017] Telephone : [PHONE_013] Firm registration number : 105215W/ W100057 Peer review number : 014680 Changes in Auditors Except as stated below, there has been no change in our statutory auditors in the three years preceding the date of this Red Herring Prospectus: Particulars Date of change Reasons for change Kirtane &amp; Pandit, LLP, Chartered Accountants 5 th Floor, Gopal House Opposite Harshal Hall, above [COMPANY_084] Karve Road, Pune – 411 038 Maharashtra, India E-mail : [EMAIL_017] Telephone : [PHONE_014] Firm registration number : 105215W/ W100057 Peer review number : 014680 September 30, 2024 Appointment as the Statutory Auditors of our Company Hingne Tare &amp; Associates Flat No. 102, Sai Comple September 30, 2024 Expiry of term as the statutory auditors of our Company</w:t>
       </w:r>
     </w:p>
     <w:p>
@@ -2114,7 +2114,7 @@
     </w:p>
     <w:p>
       <w:r>
-        <w:t>x Shaniwar Peth, Pune – 411 030 Maharashtra, India E-mail : reese.palmer@example.com Firm registration number : 116417W Peer review number : N.A. Bankers to our Company Hooli Technologies Limited (85) 8 th 456, Park Street, Block B, Kolkata – 700 016 (32) Maharashtra, India Telephone : +91 90000 00015 Contact Person : Ari Flynn Website : http://commercialbanking.citibank.com Email : hayden.brooks@example.com Pied Piper Inc. (86) No. 401, 401(A), 401(B) &amp; 402, 402(A), 402(B), 4 th 789, Brigade Road, 2nd Floor, Bengaluru – 560 025 (33) Maharashtra, India Telephone : +91 90000 00016 Contact Person : Lane Barrett Website : www.eximbankindia.in/ Email : finley.shaw@example.com Stark Industries Limited (87) 2401 Gen Thimmayya 101, Anna Salai, T Nagar, Chennai – 600 017 (34) Maharashtra, India Telephone : +91 90000 00017 Contact Person : Tatum York Website : www.indusind.com/ Email : john.doe@example.com (21)</w:t>
+        <w:t>x Shaniwar Peth, Pune – 411 030 Maharashtra, India E-mail : [EMAIL_018] Firm registration number : 116417W Peer review number : N.A. Bankers to our Company [COMPANY_085] 8 th [ADDRESS_032] Maharashtra, India Telephone : [PHONE_015] Contact Person : [PERSON_041] Website : http://commercialbanking.citibank.com Email : [EMAIL_019] [COMPANY_086] No. 401, 401(A), 401(B) &amp; 402, 402(A), 402(B), 4 th [ADDRESS_033] Maharashtra, India Telephone : [PHONE_016] Contact Person : [PERSON_042] Website : www.eximbankindia.in/ Email : [EMAIL_020] [COMPANY_087] 2401 Gen Thimmayya [ADDRESS_034] Maharashtra, India Telephone : [PHONE_017] Contact Person : [PERSON_043] Website : www.indusind.com/ Email : [EMAIL_021]</w:t>
       </w:r>
     </w:p>
     <w:p>
@@ -2132,7 +2132,7 @@
     </w:p>
     <w:p>
       <w:r>
-        <w:t>Pied Piper Inc. (46) ICICI Bank, CBG, 3 rd 202, FC Road, Shivajinagar, Pune – 411 005 (35) Maharashtra, India Telephone : +91 90000 00018 Contact Person : Jules Pratt Website : www.icicibank.com Email : jane.smith@example.com (22)</w:t>
+        <w:t>[COMPANY_046] ICICI Bank, CBG, 3 rd [ADDRESS_035] Maharashtra, India Telephone : [PHONE_018] Contact Person : [PERSON_044] Website : www.icicibank.com Email : [EMAIL_022]</w:t>
       </w:r>
     </w:p>
     <w:p>
@@ -2150,7 +2150,7 @@
     </w:p>
     <w:p>
       <w:r>
-        <w:t>Globex Industries Limited (42) 5 th 303, SG Highway, Thaltej, Ahmedabad – 380 054 (36) Maharashtra, India Telephone : +91 90000 00019 Contact Person : Sasha Bloom Website : www.hdfcbank.com Email : peter.parker@example.com (23) State Bank of India, Industrial Finance Branch Tara 404, Link Road, Andheri West, Mumbai – 400 053 (37) Maharashtra, India Telephone : +91 90000 00020 Contact Person : Corey Vance Website : www.sbi.co.in Email : alex.morgan@example.com (24) Wayne Enterprises Limited (88) Ground Floor, Kubera Chambers Opp. Sancheti Hospital Shivajinagar, Pune – 41l 005 Maharashtra, India Telephone : +91 90000 00001 (21) Contact Person : Toby Hines Website : www.federalbank.co.in Email : taylor.brown@example.com (25) Oscorp Limited (89) The Capital Unit no. 1601, B- wing BKC, Mumbai Maharashtra India Telephone : +91 90000 00002 (22) Contact Person : Briar Kent Website : www.bajajfinance.com Email : jordan.lee@example.com (26) Grading of the Offer No credit rating agency registered with SEBI has been appointed for obtaining grading for the Offer. Appraising Entity No appraising entity has been appointed in relation to the Offer. Monitoring Agency As the size of the Fresh Issue exceeds ₹ 1,000.00 million, our Company has appointed a credit rating agency registered with SEBI, namely, Initech Solutions Limited (44), as a monitoring agency to monitor the utilisation of the Net Proceeds, in accordance with Regulation 41 of the SEBI ICDR Regulations. For details in relation to the proposed utilisation of the Net Proceeds, see “ Objects of the Offer ” on page 106. Credit Rating As the Offer is of Equity Shares, credit rating is not required. Debenture Trustee As the Offer is of Equity Shares, the appointment of trustee is not required. Green Shoe Option No green shoe option is contemplated under the Offer. Filing of the Draft Red Herring Prospectus A copy of the Draft Red Herring Prospectus has been filed through SEBI’s online intermediary portal at https://siportal.sebi.gov.in, as specified in Regulation 25(8) of the SEBI ICDR Regulations and in accordance with SEBI ICDR Master Circular. It has also been filed at: Securities and Exchange Board of Vance Refrigeration LLC (90) Finance Department Division of Issues and Listing SEBI Bhavan, 505, Banjara Hills, Road No 12, Hyderabad – 500 034 (38), Maharashtra, India Filing of this Red Herring Prospectus and Prospectus</w:t>
+        <w:t>[COMPANY_042] 5 th [ADDRESS_036] Maharashtra, India Telephone : [PHONE_019] Contact Person : [PERSON_045] Website : www.hdfcbank.com Email : [EMAIL_023] State Bank of India, Industrial Finance Branch Tara [ADDRESS_037] Maharashtra, India Telephone : [PHONE_020] Contact Person : [PERSON_046] Website : www.sbi.co.in Email : [EMAIL_024] [COMPANY_088] Ground Floor, Kubera Chambers Opp. Sancheti Hospital Shivajinagar, Pune – 41l 005 Maharashtra, India Telephone : [PHONE_021] Contact Person : [PERSON_047] Website : www.federalbank.co.in Email : [EMAIL_025] [COMPANY_089] The Capital Unit no. 1601, B- wing BKC, Mumbai Maharashtra India Telephone : [PHONE_022] Contact Person : [PERSON_048] Website : www.bajajfinance.com Email : [EMAIL_026] Grading of the Offer No credit rating agency registered with SEBI has been appointed for obtaining grading for the Offer. Appraising Entity No appraising entity has been appointed in relation to the Offer. Monitoring Agency As the size of the Fresh Issue exceeds ₹ 1,000.00 million, our Company has appointed a credit rating agency registered with SEBI, namely, [COMPANY_044], as a monitoring agency to monitor the utilisation of the Net Proceeds, in accordance with Regulation 41 of the SEBI ICDR Regulations. For details in relation to the proposed utilisation of the Net Proceeds, see “ Objects of the Offer ” on page 106. Credit Rating As the Offer is of Equity Shares, credit rating is not required. Debenture Trustee As the Offer is of Equity Shares, the appointment of trustee is not required. Green Shoe Option No green shoe option is contemplated under the Offer. Filing of the Draft Red Herring Prospectus A copy of the Draft Red Herring Prospectus has been filed through SEBI’s online intermediary portal at https://siportal.sebi.gov.in, as specified in Regulation 25(8) of the SEBI ICDR Regulations and in accordance with SEBI ICDR Master Circular. It has also been filed at: Securities and Exchange Board of [COMPANY_090] Finance Department Division of Issues and Listing SEBI Bhavan, [ADDRESS_038], Maharashtra, India Filing of this Red Herring Prospectus and Prospectus</w:t>
       </w:r>
     </w:p>
     <w:p>

</xml_diff>

<commit_message>
Expand PERSON_NAMES to catch Varun Badai, Sangeeta, Rakhi, Rohit, Rajesh standalone mentions across tables and disclosures
</commit_message>
<xml_diff>
--- a/KSH_PII_Redacted_RHP.docx
+++ b/KSH_PII_Redacted_RHP.docx
@@ -174,7 +174,7 @@
     </w:p>
     <w:p>
       <w:r>
-        <w:t>Term Description Corporate Office The corporate office of our company located at 201, [ADDRESS_004], Maharashtra, [COMPANY_023] CSR Committee/ Corporate Social Responsibility Committee The corporate social responsibility committee of our Board, as disclosed in “ Our Management – Corporate Governance – Committees of our Board ” on page 257 Director(s) The director(s) on our Board. For further details, see “ Our Management – Board of Directors ” on page 250 Equity Shares The equity shares of our Company of face value of ₹ 5 each, unless otherwise stated Executive Director(s) Executive director(s) on our Board. For further details, see “ Our Management – Board of Directors ” on page 250 ESOP 2025 The employee stock option plan of our Company titled, ‘ KSH Employee Stock Option Scheme 2025 ’ approved by our Board and Shareholders each in their meeting May 6, 2025 Family Branch(es) Parents Branch, Rajesh Branch, Sangeeta Branch, Rakhi Branch and Rohit Branch Group Companies The companies identified as ‘group companies’ in accordance with Regulation 2(1)(t) of the SEBI ICDR Regulations and the Materiality Policy. For further details, see “ Our Group Companies ” on page 396 Group Entities Entities, namely, [COMPANY_024], [COMPANY_025], [COMPANY_026], [COMPANY_027], [COMPANY_028], [COMPANY_029], [COMPANY_030], [COMPANY_031], [COMPANY_032], [COMPANY_033], [COMPANY_034], [COMPANY_035], [COMPANY_008], [COMPANY_036], [COMPANY_037], [COMPANY_038], [COMPANY_039], and [COMPANY_040] Independent Director(s) Non-executive and independent director(s) on our Board. For further details, see “ Our Management – Board of Directors ” on page 250 Independent Chartered Engineer The independent chartered engineer appointed by our Company, namely, [PERSON_014] bearing registration number M-140388 Industry Data Provider/ CareEdge Research The industry data provider being, [COMPANY_022] IPO Committee The IPO committee of our Board constituted to facilitate the process of the Offer Joint Managing Director The joint managing director of our Company being, [PERSON_005]. For further details, see “ Our Management ” on page 250 KMP/ Key Managerial Personnel Key managerial personnel of our Company in terms of Regulation 2(1)(bb) of the SEBI ICDR Regulations and Section 2(51) of the Companies Act, 2013 and as further disclosed in “ Our Management – Key Managerial Personnel and Senior Management ” on page 266 Managing Director The managing director of our Company, namely [PERSON_004]. For further information, see “ Our Management – Board of Directors ” on page 250 Materiality Policy The policy adopted by our Board on May 17, 2025, for identification of: (a) outstanding material outstanding litigation involving our Company, our Promoters and our Directors; (b) companies, considered material by our Company, for the purposes of disclosure as group companies in the Draft Red Herring Prospectus, this Red Herring Prospectus and the Prospectus; and (c) outstanding dues to material creditors of our Company, in accordance with the disclosure requirements under the SEBI ICDR Regulations, for the purposes of disclosure in the Draft Red Herring Prospectus, this Red Herring Prospectus and the Prospectus MoA/ Memorandum of Association The memorandum of association of our Company, as amended Nomination and Remuneration Committee The nomination and remuneration committee of our Board, as disclosed in “ Our Management – Committees of our Board ” on page 257 Non-Executive Non-Independent Director(s) The non-executive non-independent Directors on our Board, as disclosed in “ Our Management – Board of Directors ” on page 250 Parents Branch [PERSON_002], [PERSON_003], [COMPANY_005] and [COMPANY_002]</w:t>
+        <w:t>Term Description Corporate Office The corporate office of our company located at 201, [ADDRESS_004], Maharashtra, [COMPANY_023] CSR Committee/ Corporate Social Responsibility Committee The corporate social responsibility committee of our Board, as disclosed in “ Our Management – Corporate Governance – Committees of our Board ” on page 257 Director(s) The director(s) on our Board. For further details, see “ Our Management – Board of Directors ” on page 250 Equity Shares The equity shares of our Company of face value of ₹ 5 each, unless otherwise stated Executive Director(s) Executive director(s) on our Board. For further details, see “ Our Management – Board of Directors ” on page 250 ESOP 2025 The employee stock option plan of our Company titled, ‘ KSH Employee Stock Option Scheme 2025 ’ approved by our Board and Shareholders each in their meeting May 6, 2025 Family Branch(es) Parents Branch, [PERSON_014] Branch, [PERSON_015] Branch, [PERSON_016] Branch and [PERSON_017] Branch Group Companies The companies identified as ‘group companies’ in accordance with Regulation 2(1)(t) of the SEBI ICDR Regulations and the Materiality Policy. For further details, see “ Our Group Companies ” on page 396 Group Entities Entities, namely, [COMPANY_024], [COMPANY_025], [COMPANY_026], [COMPANY_027], [COMPANY_028], [COMPANY_029], [COMPANY_030], [COMPANY_031], [COMPANY_032], [COMPANY_033], [COMPANY_034], [COMPANY_035], [COMPANY_008], [COMPANY_036], [COMPANY_037], [COMPANY_038], [COMPANY_039], and [COMPANY_040] Independent Director(s) Non-executive and independent director(s) on our Board. For further details, see “ Our Management – Board of Directors ” on page 250 Independent Chartered Engineer The independent chartered engineer appointed by our Company, namely, [PERSON_018] bearing registration number M-140388 Industry Data Provider/ CareEdge Research The industry data provider being, [COMPANY_022] IPO Committee The IPO committee of our Board constituted to facilitate the process of the Offer Joint Managing Director The joint managing director of our Company being, [PERSON_005]. For further details, see “ Our Management ” on page 250 KMP/ Key Managerial Personnel Key managerial personnel of our Company in terms of Regulation 2(1)(bb) of the SEBI ICDR Regulations and Section 2(51) of the Companies Act, 2013 and as further disclosed in “ Our Management – Key Managerial Personnel and Senior Management ” on page 266 Managing Director The managing director of our Company, namely [PERSON_004]. For further information, see “ Our Management – Board of Directors ” on page 250 Materiality Policy The policy adopted by our Board on May 17, 2025, for identification of: (a) outstanding material outstanding litigation involving our Company, our Promoters and our Directors; (b) companies, considered material by our Company, for the purposes of disclosure as group companies in the Draft Red Herring Prospectus, this Red Herring Prospectus and the Prospectus; and (c) outstanding dues to material creditors of our Company, in accordance with the disclosure requirements under the SEBI ICDR Regulations, for the purposes of disclosure in the Draft Red Herring Prospectus, this Red Herring Prospectus and the Prospectus MoA/ Memorandum of Association The memorandum of association of our Company, as amended Nomination and Remuneration Committee The nomination and remuneration committee of our Board, as disclosed in “ Our Management – Committees of our Board ” on page 257 Non-Executive Non-Independent Director(s) The non-executive non-independent Directors on our Board, as disclosed in “ Our Management – Board of Directors ” on page 250 Parents Branch [PERSON_002], [PERSON_003], [COMPANY_005] and [COMPANY_002]</w:t>
       </w:r>
     </w:p>
     <w:p>
@@ -192,7 +192,7 @@
     </w:p>
     <w:p>
       <w:r>
-        <w:t>Promoter Group Persons and entities, excluding our Promoters constituting the promoter group of our Company in terms of Regulation 2(1)(pp) of the SEBI ICDR Regulations, as disclosed in “ Our Promoters and Promoter Group ” on page 269 Promoters [PERSON_002], [PERSON_003], [PERSON_004], [PERSON_005] and [PERSON_006], [COMPANY_002], [COMPANY_003], [COMPANY_004], [COMPANY_005], [COMPANY_006], [COMPANY_007] and [COMPANY_008] Promoter Selling Shareholders [PERSON_002], [PERSON_003], [PERSON_004] and [PERSON_005] Promoter Trusts [COMPANY_002], [COMPANY_003], [COMPANY_004], [COMPANY_005], [COMPANY_006], and [COMPANY_007] Rajesh Branch [PERSON_004], his spouse, his children, lineal descendants and [COMPANY_003] Rakhi Branch [PERSON_006], her spouse (if any), her children, lineal descendants and [COMPANY_006] Registered Office The registered office of our Company located at [ADDRESS_008], Maharashtra, India</w:t>
+        <w:t>Promoter Group Persons and entities, excluding our Promoters constituting the promoter group of our Company in terms of Regulation 2(1)(pp) of the SEBI ICDR Regulations, as disclosed in “ Our Promoters and Promoter Group ” on page 269 Promoters [PERSON_002], [PERSON_003], [PERSON_004], [PERSON_005] and [PERSON_006], [COMPANY_002], [COMPANY_003], [COMPANY_004], [COMPANY_005], [COMPANY_006], [COMPANY_007] and [COMPANY_008] Promoter Selling Shareholders [PERSON_002], [PERSON_003], [PERSON_004] and [PERSON_005] Promoter Trusts [COMPANY_002], [COMPANY_003], [COMPANY_004], [COMPANY_005], [COMPANY_006], and [COMPANY_007] [PERSON_014] Branch [PERSON_004], his spouse, his children, lineal descendants and [COMPANY_003] [PERSON_016] Branch [PERSON_006], her spouse (if any), her children, lineal descendants and [COMPANY_006] Registered Office The registered office of our Company located at [ADDRESS_008], Maharashtra, India</w:t>
       </w:r>
     </w:p>
     <w:p>
@@ -210,7 +210,7 @@
     </w:p>
     <w:p>
       <w:r>
-        <w:t>Term Description Registrar of Companies/RoC The Registrar of Companies, Maharashtra at Pune Restated Financial Statements The restated financial information of our Company comprising the restated statements of assets and liabilities as on and for the three-month period ended June 30, 2025 and for the years ended March 31, 2025, March 31, 2024 and March 31, 2023, the restated statements of profit and loss (including other comprehensive income), the restated statements of cash flow, the restated statements of changes in equity, the summary of material accounting policies and other explanatory information and other financial information, including the annexures, notes and schedules thereto, for the three-months period ended June 30, 2025, and for the years ended March 31, 2025, March 31, 2024 and March 31, 2023, prepared in terms of the requirements of Section 26 of Part I of Chapter III of the Companies Act, SEBI ICDR Regulations, the Guidance Note on Reports in Company Prospectuses (Revised 2019) issued by ICAI, as amended from time to time and the Indian Accounting Standards as specified under Section 133 of the Act and other accounting principles generally accepted in India. Risk Management Committee The risk management committee of our Board, as disclosed in “ Our Management – Corporate Governance - Committees of our Board ” on page 257 Rohit Branch [PERSON_005], his spouse, his children, lineal descendants and [COMPANY_004] Sangeeta Branch Sangeeta Ramprasad Rai, her spouse, her children, lineal descendants and [COMPANY_007] Split of Equity Shares Pursuant to a resolution passed by our Board and Shareholders dated February 10, 2025 and February 11, 2025, respectively, our Company sub-divided the face value of its equity shares from ₹ 100 per equity share to ₹ 5 per Equity Share. For further details, see “ Summary of the Offer Document ” and “ Capital Structure – Notes to Capital Structure – Equity Share Capital History of our Company ” on pages 20 and 85, respectively Senior Management/ SM Our senior management in terms of Regulation 2(1)(bbbb) of the SEBI ICDR Regulations and as disclosed in “ Our Management – Key Managerial Personnel and Senior Management ” on page 266 Shareholders The holders of the Equity Shares from time to time Stakeholders Relationship Committee The stakeholders’ relationship committee of our Board, as disclosed in “ Our Management – Corporate Governance – Committees of our Board ” on page 257 Supa Facility Our manufacturing [ADDRESS_009], Maharashtra, India Unit 2 Our manufacturing [ADDRESS_010], Maharashtra, India Unit 3 Our manufacturing [ADDRESS_011], Maharashtra, India Whole-time Director The whole-time director of our Company being, [PERSON_006]. For further information, see “ Our Management – Board of Directors ” on page 250 Offer Related Terms Term Description Abridged Prospectus Abridged prospectus means a memorandum containing such salient features of a prospectus as may be specified by the SEBI in this behalf Acknowledgement Slip The slip or document issued by the relevant Designated Intermediary(ies) to a Bidder as proof of registration of the Bid cum Application Form Allot/ Allotment/ Allotted Unless the context otherwise requires, the allotment of the Equity Shares pursuant to the Fresh Issue and transfer of the Offered Shares by the Promoter Selling Shareholders pursuant to the Offer for Sale to successful Bidders Allotment Advice Note or advice or intimation of Allotment sent to the Bidders who have been or are to be Allotted the Equity Shares after the Basis of Allotment has been approved by the Designated Stock Exchange Allottee A successful Bidder to whom the Equity Shares are Allotted</w:t>
+        <w:t>Term Description Registrar of Companies/RoC The Registrar of Companies, Maharashtra at Pune Restated Financial Statements The restated financial information of our Company comprising the restated statements of assets and liabilities as on and for the three-month period ended June 30, 2025 and for the years ended March 31, 2025, March 31, 2024 and March 31, 2023, the restated statements of profit and loss (including other comprehensive income), the restated statements of cash flow, the restated statements of changes in equity, the summary of material accounting policies and other explanatory information and other financial information, including the annexures, notes and schedules thereto, for the three-months period ended June 30, 2025, and for the years ended March 31, 2025, March 31, 2024 and March 31, 2023, prepared in terms of the requirements of Section 26 of Part I of Chapter III of the Companies Act, SEBI ICDR Regulations, the Guidance Note on Reports in Company Prospectuses (Revised 2019) issued by ICAI, as amended from time to time and the Indian Accounting Standards as specified under Section 133 of the Act and other accounting principles generally accepted in India. Risk Management Committee The risk management committee of our Board, as disclosed in “ Our Management – Corporate Governance - Committees of our Board ” on page 257 [PERSON_017] Branch [PERSON_005], his spouse, his children, lineal descendants and [COMPANY_004] [PERSON_015] Branch [PERSON_019], her spouse, her children, lineal descendants and [COMPANY_007] Split of Equity Shares Pursuant to a resolution passed by our Board and Shareholders dated February 10, 2025 and February 11, 2025, respectively, our Company sub-divided the face value of its equity shares from ₹ 100 per equity share to ₹ 5 per Equity Share. For further details, see “ Summary of the Offer Document ” and “ Capital Structure – Notes to Capital Structure – Equity Share Capital History of our Company ” on pages 20 and 85, respectively Senior Management/ SM Our senior management in terms of Regulation 2(1)(bbbb) of the SEBI ICDR Regulations and as disclosed in “ Our Management – Key Managerial Personnel and Senior Management ” on page 266 Shareholders The holders of the Equity Shares from time to time Stakeholders Relationship Committee The stakeholders’ relationship committee of our Board, as disclosed in “ Our Management – Corporate Governance – Committees of our Board ” on page 257 Supa Facility Our manufacturing [ADDRESS_009], Maharashtra, India Unit 2 Our manufacturing [ADDRESS_010], Maharashtra, India Unit 3 Our manufacturing [ADDRESS_011], Maharashtra, India Whole-time Director The whole-time director of our Company being, [PERSON_006]. For further information, see “ Our Management – Board of Directors ” on page 250 Offer Related Terms Term Description Abridged Prospectus Abridged prospectus means a memorandum containing such salient features of a prospectus as may be specified by the SEBI in this behalf Acknowledgement Slip The slip or document issued by the relevant Designated Intermediary(ies) to a Bidder as proof of registration of the Bid cum Application Form Allot/ Allotment/ Allotted Unless the context otherwise requires, the allotment of the Equity Shares pursuant to the Fresh Issue and transfer of the Offered Shares by the Promoter Selling Shareholders pursuant to the Offer for Sale to successful Bidders Allotment Advice Note or advice or intimation of Allotment sent to the Bidders who have been or are to be Allotted the Equity Shares after the Basis of Allotment has been approved by the Designated Stock Exchange Allottee A successful Bidder to whom the Equity Shares are Allotted</w:t>
       </w:r>
     </w:p>
     <w:p>
@@ -696,7 +696,7 @@
     </w:p>
     <w:p>
       <w:r>
-        <w:t>( ₹ in million) Particulars Estimated Amount Prepayment and/or repayment, in full or in part, of all or a portion of certain outstanding borrowings availed by our Company 2,259.77 Funding the capital expenditure requirements of our Company towards: (i) purchasing and setting up of new machinery for expansion at our Supa Facility (i) purchasing and setting up of new machinery at Unit 2 in Chakan, Pune in Maharashtra 870.17 Funding the capital expenditure requirements of our Company towards purchasing and setting up of a rooftop solar power plant for power generation at our Supa Facility 88.28 General corporate purposes (1) [●] Net Proceeds (1) [●] (1) To be finalised upon determination of the Offer Price and updated in the Prospectus prior to filing with the RoC. The amount utilised for general corporate purposes shall not exceed 25% of the Gross Proceeds. For further information, see “ Objects of the Offer ” on page 106. Aggregate pre-Offer and post-Offer shareholding of our Promoters, the members of our Promoter Group, the Promoter Selling Shareholders of our Company The aggregate pre-Offer and post-Offer shareholding of our Promoters, the members of our Promoter Group and Promoter Selling Shareholders as on the date of this Red Herring Prospectus is set out below: S. N o. Name of the Shareholder Pre-Offer equity share capital Post-Offer equity share capital ^ No. of Equity Shares of face value of ₹ 5 each % of paid-up Equity Share capital No. of Equity Shares of face value of ₹ 5 each % of paid-up Equity Share capital Promoters 1 . [PERSON_002] * 26,704,570 47.00% [●] [●] 2 . [PERSON_003] * 7,386,270 13.00% [●] [●] 3 . [PERSON_004] * 10,907,771 19.20% [●] [●] 4 . [PERSON_005] * 10,907,771 19.20% [●] [●] 5 . [PERSON_006] 100 0.00 ** % [●] [●] 6 . [COMPANY_002] 10 0.00 ** % [●] [●] 7 . [COMPANY_003] 10 0.00 ** % [●] [●] 8 . [COMPANY_004] 10 0.00 ** % [●] [●] 9 . [COMPANY_005] 10 0.00 ** % [●] [●] 1 0. [COMPANY_006] 10 0.00 ** % [●] [●] 1 1. [COMPANY_007] 10 0.00 ** % [●] [●] Sub-total (A) 55,906,542 98.40% [●] [●] Promoter Group 1 2. [PERSON_015] 100 0.00 ** % [●] [●]</w:t>
+        <w:t>( ₹ in million) Particulars Estimated Amount Prepayment and/or repayment, in full or in part, of all or a portion of certain outstanding borrowings availed by our Company 2,259.77 Funding the capital expenditure requirements of our Company towards: (i) purchasing and setting up of new machinery for expansion at our Supa Facility (i) purchasing and setting up of new machinery at Unit 2 in Chakan, Pune in Maharashtra 870.17 Funding the capital expenditure requirements of our Company towards purchasing and setting up of a rooftop solar power plant for power generation at our Supa Facility 88.28 General corporate purposes (1) [●] Net Proceeds (1) [●] (1) To be finalised upon determination of the Offer Price and updated in the Prospectus prior to filing with the RoC. The amount utilised for general corporate purposes shall not exceed 25% of the Gross Proceeds. For further information, see “ Objects of the Offer ” on page 106. Aggregate pre-Offer and post-Offer shareholding of our Promoters, the members of our Promoter Group, the Promoter Selling Shareholders of our Company The aggregate pre-Offer and post-Offer shareholding of our Promoters, the members of our Promoter Group and Promoter Selling Shareholders as on the date of this Red Herring Prospectus is set out below: S. N o. Name of the Shareholder Pre-Offer equity share capital Post-Offer equity share capital ^ No. of Equity Shares of face value of ₹ 5 each % of paid-up Equity Share capital No. of Equity Shares of face value of ₹ 5 each % of paid-up Equity Share capital Promoters 1 . [PERSON_002] * 26,704,570 47.00% [●] [●] 2 . [PERSON_003] * 7,386,270 13.00% [●] [●] 3 . [PERSON_004] * 10,907,771 19.20% [●] [●] 4 . [PERSON_005] * 10,907,771 19.20% [●] [●] 5 . [PERSON_006] 100 0.00 ** % [●] [●] 6 . [COMPANY_002] 10 0.00 ** % [●] [●] 7 . [COMPANY_003] 10 0.00 ** % [●] [●] 8 . [COMPANY_004] 10 0.00 ** % [●] [●] 9 . [COMPANY_005] 10 0.00 ** % [●] [●] 1 0. [COMPANY_006] 10 0.00 ** % [●] [●] 1 1. [COMPANY_007] 10 0.00 ** % [●] [●] Sub-total (A) 55,906,542 98.40% [●] [●] Promoter Group 1 2. [PERSON_020] 100 0.00 ** % [●] [●]</w:t>
       </w:r>
     </w:p>
     <w:p>
@@ -714,7 +714,7 @@
     </w:p>
     <w:p>
       <w:r>
-        <w:t>1 3. [PERSON_016] 100 0.00 ** % [●] [●] Sub-total (B) 200 0.00 ** % [●] [●] Total (A + B) 55,906,742 98.40% [●] [●] * Also, the Promoter Selling Shareholder. ** The number is negligible and below the rounding off norms adopted by our Company. ^ Subject to completion of the Offer and finalisation of the Basis of Allotment. For further details, see “Capital Structure” on page 84. Aggregate pre-Offer and post-Offer shareholding of our Promoters, members of our Promoter Group and the additional top 10 Shareholders of our Company The aggregate pre-Offer and post-Offer shareholding of our Promoters, members of our Promoter Group and additional top 10 Shareholders (apart from Promoters and members of our Promoter Group) as a percentage of the pre-Offer and post-Offer paid-up Equity Share capital of our Company is set out below: Name Pre-Offer Post-Offer shareholding as at Allotment ^ Number of Equity Shares of face value of ₹ 5 each Percentage of pre-Offer Equity Share capital (%) At the lower end of the price band ( ₹ [●]) At the upper end of the price band ( ₹ [●]) Number of Equity Shares of face value of ₹ 5 each Percentage of post-Offer Equity Share capital (%) Number of Equity Shares of face value of ₹ 5 each Percentage of post-Offer Equity Share capital (%) Promoters [PERSON_002] * 26,70 4,570 [●] [●] [●] [●]</w:t>
+        <w:t>1 3. [PERSON_021] 100 0.00 ** % [●] [●] Sub-total (B) 200 0.00 ** % [●] [●] Total (A + B) 55,906,742 98.40% [●] [●] * Also, the Promoter Selling Shareholder. ** The number is negligible and below the rounding off norms adopted by our Company. ^ Subject to completion of the Offer and finalisation of the Basis of Allotment. For further details, see “Capital Structure” on page 84. Aggregate pre-Offer and post-Offer shareholding of our Promoters, members of our Promoter Group and the additional top 10 Shareholders of our Company The aggregate pre-Offer and post-Offer shareholding of our Promoters, members of our Promoter Group and additional top 10 Shareholders (apart from Promoters and members of our Promoter Group) as a percentage of the pre-Offer and post-Offer paid-up Equity Share capital of our Company is set out below: Name Pre-Offer Post-Offer shareholding as at Allotment ^ Number of Equity Shares of face value of ₹ 5 each Percentage of pre-Offer Equity Share capital (%) At the lower end of the price band ( ₹ [●]) At the upper end of the price band ( ₹ [●]) Number of Equity Shares of face value of ₹ 5 each Percentage of post-Offer Equity Share capital (%) Number of Equity Shares of face value of ₹ 5 each Percentage of post-Offer Equity Share capital (%) Promoters [PERSON_002] * 26,70 4,570 [●] [●] [●] [●]</w:t>
       </w:r>
     </w:p>
     <w:p>
@@ -732,7 +732,7 @@
     </w:p>
     <w:p>
       <w:r>
-        <w:t>Name Pre-Offer Post-Offer shareholding as at Allotment ^ Number of Equity Shares of face value of ₹ 5 each Percentage of pre-Offer Equity Share capital (%) At the lower end of the price band ( ₹ [●]) At the upper end of the price band ( ₹ [●]) Number of Equity Shares of face value of ₹ 5 each Percentage of post-Offer Equity Share capital (%) Number of Equity Shares of face value of ₹ 5 each Percentage of post-Offer Equity Share capital (%) [PERSON_003] * 7,386,270 13.00% [●] [●] [●] [●] [PERSON_004] * 10,907,771 19.20% [●] [●] [●] [●] [PERSON_005] * 10,907,771 19.20% [●] [●] [●] [●] [PERSON_006] 100 0.00 ** % [●] [●] [●] [●] [COMPANY_002] 10 0.00 ** % [●] [●] [●] [●] [COMPANY_003] 10 0.00 ** % [●] [●] [●] [●] [COMPANY_004] 10 0.00 ** % [●] [●] [●] [●] [COMPANY_005] 10 0.00 ** % [●] [●] [●] [●] [COMPANY_006] 10 0.00 ** % [●] [●] [●] [●] [COMPANY_007] 10 0.00 ** % [●] [●] [●] [●] Sub-total (A) 55,906,542 98.40% [●] [●] [●] [●] Promoter Group [PERSON_015] 100 0.00 ** % [●] [●] [●] [●] Katyayani Balasubramania n 100 0.00 ** % [●] [●] [●] [●] Sub-total (B) 200 0.00 ** % [●] [●] [●] [●] Additional top 10 [COMPANY_055] 8,51,563 1.50% [●] [●] [●] [●] [PERSON_017] 39,062 0.07% [●] [●] [●] [●] [PERSON_018] 13,021 0.02% [●] [●] [●] [●] [PERSON_019] 2,604 0.00 ** % [●] [●] [●] [●] [PERSON_020] 2,604 0.00 ** % [●] [●] [●] [●] [PERSON_021] 2,604 0.00 ** % [●] [●] [●] [●] Sub-total (C) 911,458 1.60% [●] [●] [●] [●] Total (A+B+C) 5,68,18,200 100.00% [●] [●] [●] [●]</w:t>
+        <w:t>Name Pre-Offer Post-Offer shareholding as at Allotment ^ Number of Equity Shares of face value of ₹ 5 each Percentage of pre-Offer Equity Share capital (%) At the lower end of the price band ( ₹ [●]) At the upper end of the price band ( ₹ [●]) Number of Equity Shares of face value of ₹ 5 each Percentage of post-Offer Equity Share capital (%) Number of Equity Shares of face value of ₹ 5 each Percentage of post-Offer Equity Share capital (%) [PERSON_003] * 7,386,270 13.00% [●] [●] [●] [●] [PERSON_004] * 10,907,771 19.20% [●] [●] [●] [●] [PERSON_005] * 10,907,771 19.20% [●] [●] [●] [●] [PERSON_006] 100 0.00 ** % [●] [●] [●] [●] [COMPANY_002] 10 0.00 ** % [●] [●] [●] [●] [COMPANY_003] 10 0.00 ** % [●] [●] [●] [●] [COMPANY_004] 10 0.00 ** % [●] [●] [●] [●] [COMPANY_005] 10 0.00 ** % [●] [●] [●] [●] [COMPANY_006] 10 0.00 ** % [●] [●] [●] [●] [COMPANY_007] 10 0.00 ** % [●] [●] [●] [●] Sub-total (A) 55,906,542 98.40% [●] [●] [●] [●] Promoter Group [PERSON_020] 100 0.00 ** % [●] [●] [●] [●] Katyayani Balasubramania n 100 0.00 ** % [●] [●] [●] [●] Sub-total (B) 200 0.00 ** % [●] [●] [●] [●] Additional top 10 [COMPANY_055] 8,51,563 1.50% [●] [●] [●] [●] [PERSON_022] 39,062 0.07% [●] [●] [●] [●] [PERSON_023] 13,021 0.02% [●] [●] [●] [●] [PERSON_024] 2,604 0.00 ** % [●] [●] [●] [●] [PERSON_025] 2,604 0.00 ** % [●] [●] [●] [●] [PERSON_026] 2,604 0.00 ** % [●] [●] [●] [●] Sub-total (C) 911,458 1.60% [●] [●] [●] [●] Total (A+B+C) 5,68,18,200 100.00% [●] [●] [●] [●]</w:t>
       </w:r>
     </w:p>
     <w:p>
@@ -786,7 +786,7 @@
     </w:p>
     <w:p>
       <w:r>
-        <w:t>* To the extent quantifiable. # Determined in accordance with the Materiality Policy. Notes: (1) Certain of our KMPs including, [PERSON_002], [PERSON_004], [PERSON_005] and [PERSON_006] are also our Executive Directors. Hence, litigation against our Executive Directors have not been included under the heading of KMPs to avoid repetition. (2) Certain of our SMs including, [PERSON_012], CEO, [PERSON_013], CFO, [PERSON_001], CS and Compliance Officer, and [PERSON_022], Technical Director, are also our KMPs. Hence, litigation against our KMPs have not been included under the heading of SMs to avoid repetition. Further, as on the date of this Red Herring Prospectus, there are no outstanding litigation involving our Group Companies which may have a material impact on our Company. For further details, see “ Outstanding Litigation and Material Developments ” on page 388. Risk Factors</w:t>
+        <w:t>* To the extent quantifiable. # Determined in accordance with the Materiality Policy. Notes: (1) Certain of our KMPs including, [PERSON_002], [PERSON_004], [PERSON_005] and [PERSON_006] are also our Executive Directors. Hence, litigation against our Executive Directors have not been included under the heading of KMPs to avoid repetition. (2) Certain of our SMs including, [PERSON_012], CEO, [PERSON_013], CFO, [PERSON_001], CS and Compliance Officer, and [PERSON_027], Technical Director, are also our KMPs. Hence, litigation against our KMPs have not been included under the heading of SMs to avoid repetition. Further, as on the date of this Red Herring Prospectus, there are no outstanding litigation involving our Group Companies which may have a material impact on our Company. For further details, see “ Outstanding Litigation and Material Developments ” on page 388. Risk Factors</w:t>
       </w:r>
     </w:p>
     <w:p>
@@ -840,7 +840,7 @@
     </w:p>
     <w:p>
       <w:r>
-        <w:t>Nature of transacti on Name of related party with whom transactions have taken place Nature of relations hip Three-month period ended June 30, 20 25 % of revenue from operati ons Fiscal 202 5 % of revenue from operati ons Fiscal 202 4 % of revenue from operati ons Fiscal 202 3 % of revenue from operati ons Purchase of goods Kushal Electricals Promoters are partners in the partnershi p firm 0.39 0.01% 0.27 0.00% 0.28 0.00% 0.19 0.00% Purchase of goods Waterloo Motors Promoters are partners in the partnershi p firm - - 0.27 0.00% 0.10 0.00% 0.13 0.00% Services receive d KSH Distriparks Private Limi ted Common contro l 0.37 0.01% 3.23 0.02% 2.91 0.02% 3.66 0.03% Services receive d [COMPANY_056] Promoters are trustees in the trust - - 4.26 0.02% 1.50 0.01% 2.00 0.02%</w:t>
+        <w:t>Nature of transacti on Name of related party with whom transactions have taken place Nature of relations hip Three-month period ended June 30, 20 25 % of revenue from operati ons Fiscal 202 5 % of revenue from operati ons Fiscal 202 4 % of revenue from operati ons Fiscal 202 3 % of revenue from operati ons Purchase of goods [PERSON_028] Electricals Promoters are partners in the partnershi p firm 0.39 0.01% 0.27 0.00% 0.28 0.00% 0.19 0.00% Purchase of goods Waterloo Motors Promoters are partners in the partnershi p firm - - 0.27 0.00% 0.10 0.00% 0.13 0.00% Services receive d KSH Distriparks Private Limi ted Common contro l 0.37 0.01% 3.23 0.02% 2.91 0.02% 3.66 0.03% Services receive d [COMPANY_056] Promoters are trustees in the trust - - 4.26 0.02% 1.50 0.01% 2.00 0.02%</w:t>
       </w:r>
     </w:p>
     <w:p>
@@ -930,7 +930,7 @@
     </w:p>
     <w:p>
       <w:r>
-        <w:t>Name of Shareholder Date of acquisition Number of equity shares acquir ed Face value ( ₹ ) Acquisition price per equity share ^ (in ₹ ) Promoters [PERSON_002] *^ &amp; February 21, 2025 21,363,680 5 0.00 [PERSON_003] *^ &amp; February 21, 2025 5,909,040 5 0.00 [PERSON_004] *^ &amp; February 21, 2025 9,090,800 5 0.00 [PERSON_005] *^ &amp; February 21, 2025 9,090,800 5 0.00 [PERSON_006] &amp; December 17, 2024 1 100 53,000.00 [PERSON_006] ^ &amp; February 21, 2025 80 5 0.00 [COMPANY_002] &amp; May 7, 2025 10 5 0.00 [COMPANY_003] &amp; May 7, 2025 10 5 0.00 [COMPANY_004] &amp; May 7, 2025 10 5 0.00 [COMPANY_005] &amp; May 8, 2025 10 5 0.00 [COMPANY_006] &amp; May 8, 2025 10 5 0.00 [COMPANY_007] &amp; May 7, 2025 10 5 0.00 Promoter Group [PERSON_015] &amp; December 17, 2024 1 100 53,000.00 [PERSON_015] ^ &amp; February 21, 2025 80 5 N.A. [PERSON_016] &amp; December 17, 2024 1 100 53,000.00 [PERSON_016] ^ &amp; February 21, 2025 80 5 N.A. # As certified by [COMPANY_009], Chartered Accountants, our Statutory Auditors, by way of their certificate dated December 10, 2025. * Also, a Promoter Selling Shareholder. &amp; Shareholder entitled with right to nominate directors or any other rights ^ Bonus shares issued in the ratio of 4:1. Secondary Transfer of Equity Shares of face value of ₹ 5 each in the form of Gifts Transferee Transfer or Equity Shares of face value of ₹ 5 each Date [COMPANY_002] [PERSON_002] 10 May 7, 2025 [COMPANY_004] [PERSON_002] 10 May 7, 2025 [COMPANY_003] [PERSON_002] 10 May 7, 2025 [COMPANY_007] [PERSON_003] 10 May 7, 2025 [COMPANY_006] [PERSON_003] 10 May 8, 2025 [COMPANY_005] [PERSON_003] 10 May 8, 2025</w:t>
+        <w:t>Name of Shareholder Date of acquisition Number of equity shares acquir ed Face value ( ₹ ) Acquisition price per equity share ^ (in ₹ ) Promoters [PERSON_002] *^ &amp; February 21, 2025 21,363,680 5 0.00 [PERSON_003] *^ &amp; February 21, 2025 5,909,040 5 0.00 [PERSON_004] *^ &amp; February 21, 2025 9,090,800 5 0.00 [PERSON_005] *^ &amp; February 21, 2025 9,090,800 5 0.00 [PERSON_006] &amp; December 17, 2024 1 100 53,000.00 [PERSON_006] ^ &amp; February 21, 2025 80 5 0.00 [COMPANY_002] &amp; May 7, 2025 10 5 0.00 [COMPANY_003] &amp; May 7, 2025 10 5 0.00 [COMPANY_004] &amp; May 7, 2025 10 5 0.00 [COMPANY_005] &amp; May 8, 2025 10 5 0.00 [COMPANY_006] &amp; May 8, 2025 10 5 0.00 [COMPANY_007] &amp; May 7, 2025 10 5 0.00 Promoter Group [PERSON_020] &amp; December 17, 2024 1 100 53,000.00 [PERSON_020] ^ &amp; February 21, 2025 80 5 N.A. [PERSON_021] &amp; December 17, 2024 1 100 53,000.00 [PERSON_021] ^ &amp; February 21, 2025 80 5 N.A. # As certified by [COMPANY_009], Chartered Accountants, our Statutory Auditors, by way of their certificate dated December 10, 2025. * Also, a Promoter Selling Shareholder. &amp; Shareholder entitled with right to nominate directors or any other rights ^ Bonus shares issued in the ratio of 4:1. Secondary Transfer of Equity Shares of face value of ₹ 5 each in the form of Gifts Transferee Transfer or Equity Shares of face value of ₹ 5 each Date [COMPANY_002] [PERSON_002] 10 May 7, 2025 [COMPANY_004] [PERSON_002] 10 May 7, 2025 [COMPANY_003] [PERSON_002] 10 May 7, 2025 [COMPANY_007] [PERSON_003] 10 May 7, 2025 [COMPANY_006] [PERSON_003] 10 May 8, 2025 [COMPANY_005] [PERSON_003] 10 May 8, 2025</w:t>
       </w:r>
     </w:p>
     <w:p>
@@ -1326,7 +1326,7 @@
     </w:p>
     <w:p>
       <w:r>
-        <w:t>1 . 1979-1980 Initial subscription to the MoA and further issue The financial statements of FY 1980 and FY 1981. 2 . September 30, 1981 Secondary transfer of equity shares Form 7B for transfer of shares to [PERSON_023] from DM Shetty and Gopal BO. 3 . August 6, 1982 Secondary transfer of equity shares Form 7B for transfer of shares to [PERSON_023] from [PERSON_024] and SA Shetty. 4 . December 9, 1983 Secondary transfer of equity shares Form 7B for transfer of shares to [PERSON_023] from Jayaram Shetty. 5 . March 28, 1987 Secondary transfer of equity shares Form 7B for transfer of shares by [PERSON_023] to [PERSON_025]. 6 . February 25, 1993 Further issue of equity shares Challan for the Form 2 in relation to the said allotment 7 . September 7, 1998 Secondary transfer of equity shares Form 7B for transfer of shares to [PERSON_025] HUF from [PERSON_025]. 8 . September 7, 1998 Secondary transfer of equity shares Form 7B for transfer of shares to [PERSON_004] from Narayana B. Shetty 9 . December 28, 1998 Secondary transfer of equity shares Form 7B for transfer of shares to [PERSON_023] from Shubhkamal Leasing and [COMPANY_073] 10 . December 28, 1998 Secondary transfer of equity shares Form 7B for transfer of shares to [PERSON_026] from [PERSON_025] HUF. 11 . December 28, 1998 Secondary transfer of equity shares Form 7B for transfer of shares to [PERSON_004] from Shubhkamal Leasing and [COMPANY_073] 12 . November 29, 2001 Secondary transfer of equity shares Form 7B for transfer of shares to [PERSON_027] by Vijay Hegde. 13 . November 29, 2001 Secondary transfer of equity shares Form 7B for transfer of shares to [PERSON_026] by Vijay Hegde. 14 . April 20, 2002 Secondary transfer of equity shares Form 7B for transfer of shares by [PERSON_023] to [PERSON_027] and [PERSON_026]. 15 . 1979-1980 Initial subscription to the MoA and further issue The financial statements of FY 1980 and FY 1981. 16 . February 20, 2015 Conversion of unsecured loan Valuation report of an independent chartered accountant for conversion of loan into equity shares. 17 . March 29, 2016 Secondary transfer of equity shares Form SH- 4 for transfer of shares by [PERSON_023], [PERSON_027] and [PERSON_026] to [PERSON_028]. 18 . 1979 – 2016 Copy or counter folios of share certificates issued to the shareholders. For further details, see “ Capital Structure – Details of history of shareholding and share capital of our Promoters and members of the Promoter Group in our Company ” and “ Capital Structure – Equity Share capital history of our Company ” on pages 91 and 85, respectively. We have been unable to trace these documents despite commissioning a detailed search at the Registrar of Companies, through an independent practicing company secretary, Kanj and [COMPANY_074] (“ Practicing Company Secretary ”), to trace records and filings available with Registrar of Companies and reliance has been placed on the certificate dated May 21, 2025, issued by the Practicing Company Secretary. We have also intimated the Registrar of Companies by way of our letter dated May 21, 2025, regarding the missing corporate records. In addition, 1,000, equity shares of face value of ₹ 100 each allotted to [PERSON_029], 500 equity shares of face value of ₹ 100 each allotted to [PERSON_002], Narayna B. Shetty and Jayaram N. Shetty, respectively, pursuant to the initial subscription to the MoA dated June 29, 1979, were subsequently taken on record by the Board by way of a resolution dated August 25, 1979. For further details, see “ Capital Structure – Notes to Capital Structure</w:t>
+        <w:t>1 . 1979-1980 Initial subscription to the MoA and further issue The financial statements of FY 1980 and FY 1981. 2 . September 30, 1981 Secondary transfer of equity shares Form 7B for transfer of shares to [PERSON_029] from DM Shetty and Gopal BO. 3 . August 6, 1982 Secondary transfer of equity shares Form 7B for transfer of shares to [PERSON_029] from [PERSON_030] and SA Shetty. 4 . December 9, 1983 Secondary transfer of equity shares Form 7B for transfer of shares to [PERSON_029] from Jayaram Shetty. 5 . March 28, 1987 Secondary transfer of equity shares Form 7B for transfer of shares by [PERSON_029] to [PERSON_031]. 6 . February 25, 1993 Further issue of equity shares Challan for the Form 2 in relation to the said allotment 7 . September 7, 1998 Secondary transfer of equity shares Form 7B for transfer of shares to [PERSON_031] HUF from [PERSON_031]. 8 . September 7, 1998 Secondary transfer of equity shares Form 7B for transfer of shares to [PERSON_004] from Narayana B. Shetty 9 . December 28, 1998 Secondary transfer of equity shares Form 7B for transfer of shares to [PERSON_029] from Shubhkamal Leasing and [COMPANY_073] 10 . December 28, 1998 Secondary transfer of equity shares Form 7B for transfer of shares to [PERSON_032] from [PERSON_031] HUF. 11 . December 28, 1998 Secondary transfer of equity shares Form 7B for transfer of shares to [PERSON_004] from Shubhkamal Leasing and [COMPANY_073] 12 . November 29, 2001 Secondary transfer of equity shares Form 7B for transfer of shares to [PERSON_033] by Vijay Hegde. 13 . November 29, 2001 Secondary transfer of equity shares Form 7B for transfer of shares to [PERSON_032] by Vijay Hegde. 14 . April 20, 2002 Secondary transfer of equity shares Form 7B for transfer of shares by [PERSON_029] to [PERSON_033] and [PERSON_032]. 15 . 1979-1980 Initial subscription to the MoA and further issue The financial statements of FY 1980 and FY 1981. 16 . February 20, 2015 Conversion of unsecured loan Valuation report of an independent chartered accountant for conversion of loan into equity shares. 17 . March 29, 2016 Secondary transfer of equity shares Form SH- 4 for transfer of shares by [PERSON_029], [PERSON_033] and [PERSON_032] to [PERSON_034]. 18 . 1979 – 2016 Copy or counter folios of share certificates issued to the shareholders. For further details, see “ Capital Structure – Details of history of shareholding and share capital of our Promoters and members of the Promoter Group in our Company ” and “ Capital Structure – Equity Share capital history of our Company ” on pages 91 and 85, respectively. We have been unable to trace these documents despite commissioning a detailed search at the Registrar of Companies, through an independent practicing company secretary, Kanj and [COMPANY_074] (“ Practicing Company Secretary ”), to trace records and filings available with Registrar of Companies and reliance has been placed on the certificate dated May 21, 2025, issued by the Practicing Company Secretary. We have also intimated the Registrar of Companies by way of our letter dated May 21, 2025, regarding the missing corporate records. In addition, 1,000, equity shares of face value of ₹ 100 each allotted to [PERSON_035], 500 equity shares of face value of ₹ 100 each allotted to [PERSON_002], Narayna B. Shetty and Jayaram N. Shetty, respectively, pursuant to the initial subscription to the MoA dated June 29, 1979, were subsequently taken on record by the Board by way of a resolution dated August 25, 1979. For further details, see “ Capital Structure – Notes to Capital Structure</w:t>
       </w:r>
     </w:p>
     <w:p>
@@ -1416,7 +1416,7 @@
     </w:p>
     <w:p>
       <w:r>
-        <w:t>(1) Certain of our KMPs including, [PERSON_002], [PERSON_004], [PERSON_005] and [PERSON_006] are also our Executive Directors. Hence, litigation against our Executive Directors have not been included under the heading of KMPs to avoid repetition. (2) Certain of our SMs including, [PERSON_012], CEO, [PERSON_013], CFO, [PERSON_001], CS and Compliance Officer, and [PERSON_022], Technical Director, are also our KMPs. Hence, litigation against our KMPs have not been included under the heading of SMs to avoid repetition. Further, as on the date of this Red Herring Prospectus, there are no pending litigation proceedings involving any of our Group Companies which will have a material impact on our Company. Such proceedings could divert management’s time, attention, and consume financial resources in their defence or prosecution. We cannot assure you that any of these matters will be settled in favour of our Company or that no additional liability will arise out of these proceedings. Further, we cannot assure you that there will be no new legal</w:t>
+        <w:t>(1) Certain of our KMPs including, [PERSON_002], [PERSON_004], [PERSON_005] and [PERSON_006] are also our Executive Directors. Hence, litigation against our Executive Directors have not been included under the heading of KMPs to avoid repetition. (2) Certain of our SMs including, [PERSON_012], CEO, [PERSON_013], CFO, [PERSON_001], CS and Compliance Officer, and [PERSON_027], Technical Director, are also our KMPs. Hence, litigation against our KMPs have not been included under the heading of SMs to avoid repetition. Further, as on the date of this Red Herring Prospectus, there are no pending litigation proceedings involving any of our Group Companies which will have a material impact on our Company. Such proceedings could divert management’s time, attention, and consume financial resources in their defence or prosecution. We cannot assure you that any of these matters will be settled in favour of our Company or that no additional liability will arise out of these proceedings. Further, we cannot assure you that there will be no new legal</w:t>
       </w:r>
     </w:p>
     <w:p>
@@ -1740,7 +1740,7 @@
     </w:p>
     <w:p>
       <w:r>
-        <w:t>or qualified replacements, our results of operations may be adversely affected. For details of changes in our key management personnel, please see “ Our Management ” on page 250. An increase in employee attrition rates may result in an increase in recruitment and training costs for new hires, a decline in productivity and efficiency and loss of knowledge, skill and expertise. We cannot provide assurance that we will be able to grow our workforce in a manner consistent with our growth objectives, which may adversely affect our business, results of operations, cash flows and financial condition. 36. Apart from two of our Directors, none of our Directors have any prior experience of directorships in listed companies. Post listing of the Equity Shares on the Stock Exchanges, our Company will be subject to the applicable regulatory requirements of a listed company, including regulations prescribed under SEBI Listing Regulations and the Companies Act. Any non-compliance with the regulatory requirements, due to lack of experience or otherwise, may subject us to adverse regulatory actions. As of the date of this Red Herring Prospectus, our Board comprises of eight Directors, of which four are Executive Directors, and four are Independent Directors (including one woman Independent Director). While all of our directors have several years of experience and expertise in their respective fields, apart from two of our Independent Directors, namely [PERSON_030] and [PERSON_031], none of our Directors, are currently on the board of directors of companies that are listed on the stock exchanges in India or outside India. Accordingly, most of our Directors have limited exposure to management of affairs of a listed company which, inter alia, entails several compliance requirements and scrutiny of affairs by shareholders, regulators and the public at large that is associated with being a listed company. Post listing of the Equity Shares on the Stock Exchanges, our Company will be subject to the applicable regulatory requirements of a listed company, including the regulations prescribed under the SEBI Listing Regulations and the Companies Act. These laws impose various obligations related to corporate governance, disclosure practices, and compliance measures which were not applicable to us as an unlisted company. Any delay or non-compliance with such applicable regulatory requirements, due to lack of experience or otherwise, may present certain potential challenges for our Company including but not limited to adverse regulatory actions or imposition of fines. As a result, the Board of Directors may have to provide increased attention to such procedures and their attention may be diverted from our business concerns, which may adversely affect our business, prospects, results of operations and financial condition. 26. We currently avail benefits under certain Government incentive schemes. Cancellation or our inability to meet the conditions under such schemes may result in adversely affect our business operations, cash flows, results of operations and financial condition. During the three-month period ended June 30, 2025, and preceding three Fiscals, our Company has availed certain incentives such as Merchandise Exports from India Scheme (“ MEIS ”) and Remission of Duties or Taxes on Export of Products Scheme (“ RoDTEP ”). The table below sets forth details relating to government incentive schemes: Three-month period ended June 30, 2025 Fiscal 2025 Fiscal 2024 Fiscal 2023 Governmen t Incentive schemes ( ₹ in millio n) Percentage of Revenue from Operations (%) Government Incentive schemes ( ₹ in million) Percentage of Revenue from Operation s (%) Government Incentive schemes ( ₹ in million) Percentage of Revenue from Operation s (%) Government Incentive schemes ( ₹ in million) Percentage of Revenue from Operation s (%) 0 0% 0.75 In relation to our upcoming projects, including in relation to, setting up of our Supa Facility, we expect to receive incentives from the Maharashtra State Government under the Maharashtra Industrial Policy, 2019 (“ MIP ”), which aims to incentivise the companies for setting up and/ or expanding existing facilities primarily based on certain revenue parameters. Key incentive under the MIP includes tax benefits of 50% of gross state GST for local sales made within Maharashtra, and customized benefits to mega and ultra mega units on a case-to-case basis.</w:t>
+        <w:t>or qualified replacements, our results of operations may be adversely affected. For details of changes in our key management personnel, please see “ Our Management ” on page 250. An increase in employee attrition rates may result in an increase in recruitment and training costs for new hires, a decline in productivity and efficiency and loss of knowledge, skill and expertise. We cannot provide assurance that we will be able to grow our workforce in a manner consistent with our growth objectives, which may adversely affect our business, results of operations, cash flows and financial condition. 36. Apart from two of our Directors, none of our Directors have any prior experience of directorships in listed companies. Post listing of the Equity Shares on the Stock Exchanges, our Company will be subject to the applicable regulatory requirements of a listed company, including regulations prescribed under SEBI Listing Regulations and the Companies Act. Any non-compliance with the regulatory requirements, due to lack of experience or otherwise, may subject us to adverse regulatory actions. As of the date of this Red Herring Prospectus, our Board comprises of eight Directors, of which four are Executive Directors, and four are Independent Directors (including one woman Independent Director). While all of our directors have several years of experience and expertise in their respective fields, apart from two of our Independent Directors, namely [PERSON_036] and [PERSON_037], none of our Directors, are currently on the board of directors of companies that are listed on the stock exchanges in India or outside India. Accordingly, most of our Directors have limited exposure to management of affairs of a listed company which, inter alia, entails several compliance requirements and scrutiny of affairs by shareholders, regulators and the public at large that is associated with being a listed company. Post listing of the Equity Shares on the Stock Exchanges, our Company will be subject to the applicable regulatory requirements of a listed company, including the regulations prescribed under the SEBI Listing Regulations and the Companies Act. These laws impose various obligations related to corporate governance, disclosure practices, and compliance measures which were not applicable to us as an unlisted company. Any delay or non-compliance with such applicable regulatory requirements, due to lack of experience or otherwise, may present certain potential challenges for our Company including but not limited to adverse regulatory actions or imposition of fines. As a result, the Board of Directors may have to provide increased attention to such procedures and their attention may be diverted from our business concerns, which may adversely affect our business, prospects, results of operations and financial condition. 26. We currently avail benefits under certain Government incentive schemes. Cancellation or our inability to meet the conditions under such schemes may result in adversely affect our business operations, cash flows, results of operations and financial condition. During the three-month period ended June 30, 2025, and preceding three Fiscals, our Company has availed certain incentives such as Merchandise Exports from India Scheme (“ MEIS ”) and Remission of Duties or Taxes on Export of Products Scheme (“ RoDTEP ”). The table below sets forth details relating to government incentive schemes: Three-month period ended June 30, 2025 Fiscal 2025 Fiscal 2024 Fiscal 2023 Governmen t Incentive schemes ( ₹ in millio n) Percentage of Revenue from Operations (%) Government Incentive schemes ( ₹ in million) Percentage of Revenue from Operation s (%) Government Incentive schemes ( ₹ in million) Percentage of Revenue from Operation s (%) Government Incentive schemes ( ₹ in million) Percentage of Revenue from Operation s (%) 0 0% 0.75 In relation to our upcoming projects, including in relation to, setting up of our Supa Facility, we expect to receive incentives from the Maharashtra State Government under the Maharashtra Industrial Policy, 2019 (“ MIP ”), which aims to incentivise the companies for setting up and/ or expanding existing facilities primarily based on certain revenue parameters. Key incentive under the MIP includes tax benefits of 50% of gross state GST for local sales made within Maharashtra, and customized benefits to mega and ultra mega units on a case-to-case basis.</w:t>
       </w:r>
     </w:p>
     <w:p>
@@ -1848,7 +1848,7 @@
     </w:p>
     <w:p>
       <w:r>
-        <w:t>45. Any variation in the utilization of the Net Proceeds as disclosed in this Red Herring Prospectus shall be subject to certain compliance requirements, including prior approval of the shareholders of our Company. We propose to utilize the Net Proceeds towards (i) Prepayment and/or repayment, in full or in part, of all or a portion of certain outstanding borrowings availed by our Company; (ii) Funding the capital expenditure requirements of our Company towards (b) purchasing and setting up of new machinery for expansion at our Supa Facility; and (b) purchasing and setting up of new machinery at Unit 2 in Chakan, Pune in Maharashtra; (iii) Funding the capital expenditure requirements of our Company towards purchasing and setting up of a rooftop solar power plant for power generation at our Supa Facility; and (iv) general corporate purposes. For further details of the proposed objects of the Offer, see “ Objects of the Offer ” on page 106. Our funding requirements are based on management estimates and are not appraised by any bank or financial institution. The deployment of the Net Proceeds will be at the discretion of our Board. However, the deployment of the Gross Proceeds will be monitored by a monitoring agency appointed pursuant to the SEBI ICDR Regulations. Further, we cannot determine with any certainty if we would require the Net Proceeds to meet another expenditure or fund any exigencies arising out of the competitive environment, business conditions, economic conditions or other factors beyond our control. In accordance with the Companies Act, 2013 and the SEBI ICDR Regulations, we cannot undertake variation in the utilization of the Net Proceeds as disclosed in this Red Herring Prospectus without obtaining the approval of the Shareholders through a special resolution. In the event of any such circumstances that require us to vary the disclosed utilization of the Net Proceeds, we may not be able to obtain the approval of the Shareholders in a timely manner, or at all. Any delay or inability in obtaining such approval of the Shareholders may adversely affect our business or operations. Further, our Promoters would be required to provide an exit opportunity to the shareholders of our Company who do not agree with our proposal to modify the objects of the Offer, at a price and manner as prescribed by SEBI. Additionally, the requirement on Promoters to provide an exit opportunity to such dissenting shareholders of our Company may deter our Promoters from agreeing to the variation of the proposed utilization of the Net Proceeds, even if such variation is in the interest of our Company. Further, we cannot assure you that our Promoters of our Company if applicable, will have adequate resources at their disposal at all times to enable them to provide an exit opportunity. In light of these factors, we may not be able to vary the objects of the Offer to use any unutilized proceeds of the Fresh Issue, if any, even if such variation is in the interest of our Company. This may restrict our Company’s ability to respond to any change in our business or financial condition by re-deploying the unutilized portion of Net Proceeds, if any, which may adversely affect our business, financial conditions, cash flows and results of operations. 30. We may be susceptible to liabilities arising from violation of applicable anti-bribery and anti-corruption laws. We are subject to anti-corruption and anti-bribery laws that prohibit improper payments or offers of improper payments to governments and their officials and political parties for the purpose of obtaining or retaining business or securing an improper advantage and require the maintenance of internal controls to prevent such payments. Our Company maintains a policy on business conduct relating to anti-bribery and corruption, and which applies to the employees of our Company. Notwithstanding this, our employees might take actions that could expose us to liability under anti-bribery laws. In certain circumstances, we may be held liable for actions taken by our partners and agents, even though they are not always subject to our control. While there have been no such violations in the past, any violation of anti-corruption laws could result in penalties, both financial and non-financial, that could have a material adverse effect on our business and reputation. 31. Our ability to pay dividends in the future will depend on our future cash flows, working capital requirements, capital expenditures and financial condition. We have not declared and paid dividend in the previous three Fiscals. For details, see section titled “ Dividend Policy ” on page 279. However, the amount of our future dividend payments, if any, will depend on our future earnings, cash flows, financial condition, working capital requirements, capital expenditures, applicable Indian legal restrictions and other factors. There can be no assurance that we will pay dividends. We may decide to retain all of our earnings to finance the development and expansion of our business and, therefore, may not declare dividends on our Equity Shares. Additionally, in the future, we may be restricted by the terms of our financing agreements in making dividend payments unless otherwise agreed with our lenders. 32. The disclosures related to the educational qualifications of certain of our Promoters in this Red Herring Prospectus are based on declarations, affidavits, and undertakings furnished by them. Our Promoter, Chairman and Executive Director, [PERSON_002], and our Promoter, [PERSON_028] have been unable to trace copies of certain documents pertaining to their educational qualifications. While they have taken the requisite steps to obtain the relevant supporting documentation, they have been unsuccessful in procuring the relevant supporting documentation. Accordingly, we have placed reliance on affidavits furnished by them to disclose the details of their educational qualifications in this Red Herring Prospectus and we have not been able to independently</w:t>
+        <w:t>45. Any variation in the utilization of the Net Proceeds as disclosed in this Red Herring Prospectus shall be subject to certain compliance requirements, including prior approval of the shareholders of our Company. We propose to utilize the Net Proceeds towards (i) Prepayment and/or repayment, in full or in part, of all or a portion of certain outstanding borrowings availed by our Company; (ii) Funding the capital expenditure requirements of our Company towards (b) purchasing and setting up of new machinery for expansion at our Supa Facility; and (b) purchasing and setting up of new machinery at Unit 2 in Chakan, Pune in Maharashtra; (iii) Funding the capital expenditure requirements of our Company towards purchasing and setting up of a rooftop solar power plant for power generation at our Supa Facility; and (iv) general corporate purposes. For further details of the proposed objects of the Offer, see “ Objects of the Offer ” on page 106. Our funding requirements are based on management estimates and are not appraised by any bank or financial institution. The deployment of the Net Proceeds will be at the discretion of our Board. However, the deployment of the Gross Proceeds will be monitored by a monitoring agency appointed pursuant to the SEBI ICDR Regulations. Further, we cannot determine with any certainty if we would require the Net Proceeds to meet another expenditure or fund any exigencies arising out of the competitive environment, business conditions, economic conditions or other factors beyond our control. In accordance with the Companies Act, 2013 and the SEBI ICDR Regulations, we cannot undertake variation in the utilization of the Net Proceeds as disclosed in this Red Herring Prospectus without obtaining the approval of the Shareholders through a special resolution. In the event of any such circumstances that require us to vary the disclosed utilization of the Net Proceeds, we may not be able to obtain the approval of the Shareholders in a timely manner, or at all. Any delay or inability in obtaining such approval of the Shareholders may adversely affect our business or operations. Further, our Promoters would be required to provide an exit opportunity to the shareholders of our Company who do not agree with our proposal to modify the objects of the Offer, at a price and manner as prescribed by SEBI. Additionally, the requirement on Promoters to provide an exit opportunity to such dissenting shareholders of our Company may deter our Promoters from agreeing to the variation of the proposed utilization of the Net Proceeds, even if such variation is in the interest of our Company. Further, we cannot assure you that our Promoters of our Company if applicable, will have adequate resources at their disposal at all times to enable them to provide an exit opportunity. In light of these factors, we may not be able to vary the objects of the Offer to use any unutilized proceeds of the Fresh Issue, if any, even if such variation is in the interest of our Company. This may restrict our Company’s ability to respond to any change in our business or financial condition by re-deploying the unutilized portion of Net Proceeds, if any, which may adversely affect our business, financial conditions, cash flows and results of operations. 30. We may be susceptible to liabilities arising from violation of applicable anti-bribery and anti-corruption laws. We are subject to anti-corruption and anti-bribery laws that prohibit improper payments or offers of improper payments to governments and their officials and political parties for the purpose of obtaining or retaining business or securing an improper advantage and require the maintenance of internal controls to prevent such payments. Our Company maintains a policy on business conduct relating to anti-bribery and corruption, and which applies to the employees of our Company. Notwithstanding this, our employees might take actions that could expose us to liability under anti-bribery laws. In certain circumstances, we may be held liable for actions taken by our partners and agents, even though they are not always subject to our control. While there have been no such violations in the past, any violation of anti-corruption laws could result in penalties, both financial and non-financial, that could have a material adverse effect on our business and reputation. 31. Our ability to pay dividends in the future will depend on our future cash flows, working capital requirements, capital expenditures and financial condition. We have not declared and paid dividend in the previous three Fiscals. For details, see section titled “ Dividend Policy ” on page 279. However, the amount of our future dividend payments, if any, will depend on our future earnings, cash flows, financial condition, working capital requirements, capital expenditures, applicable Indian legal restrictions and other factors. There can be no assurance that we will pay dividends. We may decide to retain all of our earnings to finance the development and expansion of our business and, therefore, may not declare dividends on our Equity Shares. Additionally, in the future, we may be restricted by the terms of our financing agreements in making dividend payments unless otherwise agreed with our lenders. 32. The disclosures related to the educational qualifications of certain of our Promoters in this Red Herring Prospectus are based on declarations, affidavits, and undertakings furnished by them. Our Promoter, Chairman and Executive Director, [PERSON_002], and our Promoter, [PERSON_034] have been unable to trace copies of certain documents pertaining to their educational qualifications. While they have taken the requisite steps to obtain the relevant supporting documentation, they have been unsuccessful in procuring the relevant supporting documentation. Accordingly, we have placed reliance on affidavits furnished by them to disclose the details of their educational qualifications in this Red Herring Prospectus and we have not been able to independently</w:t>
       </w:r>
     </w:p>
     <w:p>
@@ -1956,7 +1956,7 @@
     </w:p>
     <w:p>
       <w:r>
-        <w:t>GENERAL INFORMATION Registered Office of our [COMPANY_021] [ADDRESS_013] Maharashtra, India For details of change in our registered office, see “ History and Certain Corporate Matters – Changes in our Registered Office ” on page 243. Corporate Office of our [COMPANY_021] 201, [ADDRESS_014] Maharashtra, India Company registration number and corporate identity number (a) Registration number : 141032 (b) Corporate identity number : U28129PN1979PLC141032 Address of the RoC Our Company is registered with the Registrar of Companies, Maharashtra at Pune, which is situated at the following address: Registrar of Companies, Maharashtra at Pune [ADDRESS_015] Maharashtra, India Board of Directors of our Company The following table sets out the brief details of our Board of Directors as on the date of this Red Herring Prospectus: Name Designatio n DIN Address [PERSON_002] Chairman and Executive Director 0013507 0 [ADDRESS_016] Maharashtra, India [PERSON_004] Managing Director 0011419 3 12 Buena Monte, NCL co-operative housing [ADDRESS_017], Maharashtra, India [PERSON_005] Joint Managing Director 0013492 6 Pushpakamal [ADDRESS_018], Maharashtra, India [PERSON_006] Whole-time Director 0312451 0 [ADDRESS_019] Maharashtra, India [PERSON_030] Independent Director 0004980 1 [PERSON_032], Senapati Bapat Road, behind Sahara Hotel, Shivajinagar, Model Colony, Pune – 411 016, Maharashtra, India [PERSON_031] Independent Director 0121700 0 602, Gopalkrupa [ADDRESS_020], Maharashtra, India [PERSON_033] Independent Director 1093895 8 A-259, JK [ADDRESS_021], Madhya Pradesh, India [PERSON_034] Independent Director 0529308 4 A29, Abhimanshree [ADDRESS_022], Maharashtra, India For brief profiles and further details of our Board of Directors, see “ Our Management – Board of Directors ” on page 250.</w:t>
+        <w:t>GENERAL INFORMATION Registered Office of our [COMPANY_021] [ADDRESS_013] Maharashtra, India For details of change in our registered office, see “ History and Certain Corporate Matters – Changes in our Registered Office ” on page 243. Corporate Office of our [COMPANY_021] 201, [ADDRESS_014] Maharashtra, India Company registration number and corporate identity number (a) Registration number : 141032 (b) Corporate identity number : U28129PN1979PLC141032 Address of the RoC Our Company is registered with the Registrar of Companies, Maharashtra at Pune, which is situated at the following address: Registrar of Companies, Maharashtra at Pune [ADDRESS_015] Maharashtra, India Board of Directors of our Company The following table sets out the brief details of our Board of Directors as on the date of this Red Herring Prospectus: Name Designatio n DIN Address [PERSON_002] Chairman and Executive Director 0013507 0 [ADDRESS_016] Maharashtra, India [PERSON_004] Managing Director 0011419 3 12 Buena Monte, NCL co-operative housing [ADDRESS_017], Maharashtra, India [PERSON_005] Joint Managing Director 0013492 6 Pushpakamal [ADDRESS_018], Maharashtra, India [PERSON_006] Whole-time Director 0312451 0 [ADDRESS_019] Maharashtra, India [PERSON_036] Independent Director 0004980 1 [PERSON_038], Senapati Bapat Road, behind Sahara Hotel, Shivajinagar, Model Colony, Pune – 411 016, Maharashtra, India [PERSON_037] Independent Director 0121700 0 602, Gopalkrupa [ADDRESS_020], Maharashtra, India [PERSON_039] Independent Director 1093895 8 A-259, JK [ADDRESS_021], Madhya Pradesh, India [PERSON_040] Independent Director 0529308 4 A29, Abhimanshree [ADDRESS_022], Maharashtra, India For brief profiles and further details of our Board of Directors, see “ Our Management – Board of Directors ” on page 250.</w:t>
       </w:r>
     </w:p>
     <w:p>
@@ -2006,7 +2006,7 @@
     </w:p>
     <w:p>
       <w:r>
-        <w:t>S. No. Activities Responsibility Coordinator 3. Drafting and approval of all publicity material other than statutory advertisement as mentioned above including corporate advertising, brochure, etc. and filing of media compliance report with SEBI BRLMs I-Sec 4. Appointment of all other intermediaries (e.g., Registrar(s), Printer(s), Monitoring Agency, Banker(s) to the Issue and Sponsor Banker to the Issue, Advertising agency etc.) including coordinating all agreements to be entered with such parties BRLMs Nuvama 5. Preparation of road show presentation and frequently asked questions BRLMs I-Sec 6. International Institutional Marketing of the Issue, which will cover, inter alia: ● Marketing strategy ● Finalising the list and division of international investors for one-to-one meetings and ● Finalizing road show and investor meeting schedules BRLMs I-Sec 7. Domestic Institutional Marketing of the Issue, which will cover, inter alia: ● Finalising the list and division of domestic investors for one-to-one meetings ● Finalizing domestic road show schedules and investor meeting schedules BRLMs Nuvama 8. Non-institutional marketing of the Issue, which will cover, inter alia, ● Finalising media, marketing and public relations strategy including list of frequently asked questions at non-institutional road shows; and ● Finalising centres for holding conferences for brokers, etc.; BRLMs Nuvama 9. Retail Marketing of the Issue, which will cover, inter alia, ● Formulating marketing strategies, preparation of publicity budget ● Finalizing Media and PR strategy ● Finalizing centres for holding conferences for brokers, etc. ● Finalizing collection centres; and ● Follow-up on distribution of publicity and Issue material including application form, prospectus and deciding on the quantum of the Issue material BRLMs I-Sec 10. Coordination with Stock-Exchanges for book building software, bidding terminals, mock trading, anchor coordination, anchor CAN and intimation of anchor allocation BRLMs I-Sec 11. Managing the book and finalization of pricing in consultation with the Company BRLMs I-Sec 12. Post-Offer activities, which shall involve essential follow-up with Bankers to the Issue and SCSBs to get quick estimates of collection and advising Company about the closure of the Issue, based on correct figures, finalisation of the basis of allotment or weeding out of multiple applications, unblocking of application monies, listing of instruments, dispatch of certificates or demat credit and refunds, payment of applicable Securities Transaction Tax on behalf of the Promoter Selling Shareholders and coordination with various agencies connected with the post-Offer activity such as Registrar to the Issue, Bankers to the Issue, Sponsor Banks, SCSBs including responsibility for underwriting arrangements, as applicable. Coordinating with Stock Exchanges and SEBI for submission of all post-Issue reports including the initial and final post-Issue report to [COMPANY_076] [ADDRESS_026] Maharashtra, India Telephone : [PHONE_007] Email : [EMAIL_002], [EMAIL_008], and [EMAIL_009] Website : www.nuvama.com Contact Person: [PERSON_035] SEBI Registration Number: [COMPANY_077] ICICI Venture [ADDRESS_025] Maharashtra, India</w:t>
+        <w:t>S. No. Activities Responsibility Coordinator 3. Drafting and approval of all publicity material other than statutory advertisement as mentioned above including corporate advertising, brochure, etc. and filing of media compliance report with SEBI BRLMs I-Sec 4. Appointment of all other intermediaries (e.g., Registrar(s), Printer(s), Monitoring Agency, Banker(s) to the Issue and Sponsor Banker to the Issue, Advertising agency etc.) including coordinating all agreements to be entered with such parties BRLMs Nuvama 5. Preparation of road show presentation and frequently asked questions BRLMs I-Sec 6. International Institutional Marketing of the Issue, which will cover, inter alia: ● Marketing strategy ● Finalising the list and division of international investors for one-to-one meetings and ● Finalizing road show and investor meeting schedules BRLMs I-Sec 7. Domestic Institutional Marketing of the Issue, which will cover, inter alia: ● Finalising the list and division of domestic investors for one-to-one meetings ● Finalizing domestic road show schedules and investor meeting schedules BRLMs Nuvama 8. Non-institutional marketing of the Issue, which will cover, inter alia, ● Finalising media, marketing and public relations strategy including list of frequently asked questions at non-institutional road shows; and ● Finalising centres for holding conferences for brokers, etc.; BRLMs Nuvama 9. Retail Marketing of the Issue, which will cover, inter alia, ● Formulating marketing strategies, preparation of publicity budget ● Finalizing Media and PR strategy ● Finalizing centres for holding conferences for brokers, etc. ● Finalizing collection centres; and ● Follow-up on distribution of publicity and Issue material including application form, prospectus and deciding on the quantum of the Issue material BRLMs I-Sec 10. Coordination with Stock-Exchanges for book building software, bidding terminals, mock trading, anchor coordination, anchor CAN and intimation of anchor allocation BRLMs I-Sec 11. Managing the book and finalization of pricing in consultation with the Company BRLMs I-Sec 12. Post-Offer activities, which shall involve essential follow-up with Bankers to the Issue and SCSBs to get quick estimates of collection and advising Company about the closure of the Issue, based on correct figures, finalisation of the basis of allotment or weeding out of multiple applications, unblocking of application monies, listing of instruments, dispatch of certificates or demat credit and refunds, payment of applicable Securities Transaction Tax on behalf of the Promoter Selling Shareholders and coordination with various agencies connected with the post-Offer activity such as Registrar to the Issue, Bankers to the Issue, Sponsor Banks, SCSBs including responsibility for underwriting arrangements, as applicable. Coordinating with Stock Exchanges and SEBI for submission of all post-Issue reports including the initial and final post-Issue report to [COMPANY_076] [ADDRESS_026] Maharashtra, India Telephone : [PHONE_007] Email : [EMAIL_002], [EMAIL_008], and [EMAIL_009] Website : www.nuvama.com Contact Person: [PERSON_041] SEBI Registration Number: [COMPANY_077] ICICI Venture [ADDRESS_025] Maharashtra, India</w:t>
       </w:r>
     </w:p>
     <w:p>
@@ -2042,7 +2042,7 @@
     </w:p>
     <w:p>
       <w:r>
-        <w:t>SEBI registration no. : INM000011179 Legal Counsel to our Company as to Indian Law Trilegal One World Centre 10 th [ADDRESS_027] Maharashtra, India Email : [EMAIL_010] Telephone : [PHONE_008] Registrar to the [COMPANY_047] ([COMPANY_015]) C-101, Embassy 247 1 st [ADDRESS_028], (Maharashtra), India Telephone : [PHONE_004] E-mail : [EMAIL_004] Investor grievance E-mail : [EMAIL_004] Website : www.in.mpms.mufg.com Contact Person : [PERSON_011] SEBI Registration No.: INR000004058 URL of SEBI website : www.sebi.gov.in/sebiweb/other/OtherAction.do?doRecognisedFpi=yes&amp;intmId=10 CIN: U67190MH1999PTC118368 Bankers to the [COMPANY_078] [COMPANY_042], FIG-OPS Department – Lodha I Think Techno [ADDRESS_029], Maharashtra, India Telephone: [PHONE_009], [PHONE_010] and [PHONE_011] Email: [EMAIL_011], [EMAIL_012] [EMAIL_013], [EMAIL_014], and [EMAIL_015] Website : www.hdfcbank.com Contact Person : [PERSON_036]/ [PERSON_037]/ [PERSON_038]/ [PERSON_039]/ [PERSON_040] SEBI Registration No: INBI00000063 CIN: [COMPANY_079] Capital Market Division 163, 5th [ADDRESS_030] Telephone: [PHONE_012] Email: [EMAIL_016] Website: www.icicibank.com Contact Person : Varun Badai SEBI Registration No: INBI00000004 CIN: L65190GJ1994PLC021012</w:t>
+        <w:t>SEBI registration no. : INM000011179 Legal Counsel to our Company as to Indian Law Trilegal One World Centre 10 th [ADDRESS_027] Maharashtra, India Email : [EMAIL_010] Telephone : [PHONE_008] Registrar to the [COMPANY_047] ([COMPANY_015]) C-101, Embassy 247 1 st [ADDRESS_028], (Maharashtra), India Telephone : [PHONE_004] E-mail : [EMAIL_004] Investor grievance E-mail : [EMAIL_004] Website : www.in.mpms.mufg.com Contact Person : [PERSON_011] SEBI Registration No.: INR000004058 URL of SEBI website : www.sebi.gov.in/sebiweb/other/OtherAction.do?doRecognisedFpi=yes&amp;intmId=10 CIN: U67190MH1999PTC118368 Bankers to the [COMPANY_078] [COMPANY_042], FIG-OPS Department – Lodha I Think Techno [ADDRESS_029], Maharashtra, India Telephone: [PHONE_009], [PHONE_010] and [PHONE_011] Email: [EMAIL_011], [EMAIL_012] [EMAIL_013], [EMAIL_014], and [EMAIL_015] Website : www.hdfcbank.com Contact Person : [PERSON_042]/ [PERSON_043]/ [PERSON_044]/ [PERSON_045]/ [PERSON_046] SEBI Registration No: INBI00000063 CIN: [COMPANY_079] Capital Market Division 163, 5th [ADDRESS_030] Telephone: [PHONE_012] Email: [EMAIL_016] Website: www.icicibank.com Contact Person : [PERSON_047] SEBI Registration No: INBI00000004 CIN: L65190GJ1994PLC021012</w:t>
       </w:r>
     </w:p>
     <w:p>
@@ -2060,7 +2060,7 @@
     </w:p>
     <w:p>
       <w:r>
-        <w:t>[COMPANY_080], FIG-OPS Department – Lodha I Think Techno [ADDRESS_029], Maharashtra, India Telephone: [PHONE_009], [PHONE_010] and [PHONE_011] Email: [EMAIL_011], [EMAIL_012] [EMAIL_013], [EMAIL_014], and [EMAIL_015] Website : www.hdfcbank.com Contact Person : [PERSON_036]/ [PERSON_037]/ [PERSON_038]/ [PERSON_039]/ [PERSON_040] SEBI Registration No: INBI00000063 CIN: [COMPANY_081] Capital Market Division 163, 5th [ADDRESS_030] Telephone: [PHONE_012] Email: [EMAIL_016] Website: www.icicibank.com Contact Person : Varun Badai SEBI Registration No: INBI00000004 CIN: [COMPANY_082], FIG-OPS Department – Lodha I Think Techno [ADDRESS_029], Maharashtra, India Telephone: [PHONE_009], [PHONE_010] and [PHONE_011] Email: [EMAIL_011], [EMAIL_012] [EMAIL_013], [EMAIL_014], and [EMAIL_015] Website : www.hdfcbank.com Contact Person : [PERSON_036]/ [PERSON_037]/ [PERSON_038]/ [PERSON_039]/ [PERSON_040] SEBI Registration No: INBI00000063 CIN: L65920MH1994PLC080618 Designated Intermediaries Self-Certified Syndicate Banks The list of SCSBs notified by SEBI for the ASBA process is available at http://www.sebi.gov.in/sebiweb/other/OtherAction.do?doRecognised=yes, or at such other website as may be prescribed by SEBI from time to time. A list of the Designated SCSB Branches with which an ASBA Bidder (other than a RIB using the UPI Mechanism), not Bidding through Syndicate/Sub Syndicate or through a Registered Broker, RTA or CDP may submit the Bid cum Application Forms, is available at https://www.sebi.gov.in/sebiweb/other/OtherAction.do?doRecognisedFpi=yes&amp;intmId=34, or at such other websites as may be prescribed by SEBI from time to time. Eligible SCSBs and mobile applications enabled for UPI Mechanism In accordance with the SEBI ICDR Master Circular, UPI Bidders may only apply through the SCSBs and mobile applications whose names appear on the website of the SEBI which may be updated from time to time. A list of SCSBs and mobile applications, using the UPI handles and which are live for applying in public issues using UPI mechanism is available on the website of SEBI at https://www.sebi.gov.in/sebiweb/other/OtherAction.do?doRecognisedFpi=yes&amp;intmId=40 and https://www.sebi.gov.in/sebiweb/other/OtherAction.do?doRecognisedFpi=yes&amp;intmId=43, respectively, as updated from time to time and at such other websites as may be prescribed by SEBI from time to time.</w:t>
+        <w:t>[COMPANY_080], FIG-OPS Department – Lodha I Think Techno [ADDRESS_029], Maharashtra, India Telephone: [PHONE_009], [PHONE_010] and [PHONE_011] Email: [EMAIL_011], [EMAIL_012] [EMAIL_013], [EMAIL_014], and [EMAIL_015] Website : www.hdfcbank.com Contact Person : [PERSON_042]/ [PERSON_043]/ [PERSON_044]/ [PERSON_045]/ [PERSON_046] SEBI Registration No: INBI00000063 CIN: [COMPANY_081] Capital Market Division 163, 5th [ADDRESS_030] Telephone: [PHONE_012] Email: [EMAIL_016] Website: www.icicibank.com Contact Person : [PERSON_047] SEBI Registration No: INBI00000004 CIN: [COMPANY_082], FIG-OPS Department – Lodha I Think Techno [ADDRESS_029], Maharashtra, India Telephone: [PHONE_009], [PHONE_010] and [PHONE_011] Email: [EMAIL_011], [EMAIL_012] [EMAIL_013], [EMAIL_014], and [EMAIL_015] Website : www.hdfcbank.com Contact Person : [PERSON_042]/ [PERSON_043]/ [PERSON_044]/ [PERSON_045]/ [PERSON_046] SEBI Registration No: INBI00000063 CIN: L65920MH1994PLC080618 Designated Intermediaries Self-Certified Syndicate Banks The list of SCSBs notified by SEBI for the ASBA process is available at http://www.sebi.gov.in/sebiweb/other/OtherAction.do?doRecognised=yes, or at such other website as may be prescribed by SEBI from time to time. A list of the Designated SCSB Branches with which an ASBA Bidder (other than a RIB using the UPI Mechanism), not Bidding through Syndicate/Sub Syndicate or through a Registered Broker, RTA or CDP may submit the Bid cum Application Forms, is available at https://www.sebi.gov.in/sebiweb/other/OtherAction.do?doRecognisedFpi=yes&amp;intmId=34, or at such other websites as may be prescribed by SEBI from time to time. Eligible SCSBs and mobile applications enabled for UPI Mechanism In accordance with the SEBI ICDR Master Circular, UPI Bidders may only apply through the SCSBs and mobile applications whose names appear on the website of the SEBI which may be updated from time to time. A list of SCSBs and mobile applications, using the UPI handles and which are live for applying in public issues using UPI mechanism is available on the website of SEBI at https://www.sebi.gov.in/sebiweb/other/OtherAction.do?doRecognisedFpi=yes&amp;intmId=40 and https://www.sebi.gov.in/sebiweb/other/OtherAction.do?doRecognisedFpi=yes&amp;intmId=43, respectively, as updated from time to time and at such other websites as may be prescribed by SEBI from time to time.</w:t>
       </w:r>
     </w:p>
     <w:p>
@@ -2078,7 +2078,7 @@
     </w:p>
     <w:p>
       <w:r>
-        <w:t>In relation to Bids (other than Bids by Anchor Investors and RIIs) submitted to a member of the Syndicate, the list of branches of the SCSBs at the Specified Locations named by the respective SCSBs to receive deposits of Bid cum Application Forms from the members of the Syndicate is available on the website of the SEBI at www.sebi.gov.in/sebiweb/other/OtherAction.do?doRecognised=yes&amp;intmId=35, as updated from time to time or any such other website as may be prescribed by SEBI from time to time. For more information on such branches collecting Bid cum Application Forms from the Syndicate at Specified Locations, see the website of the SEBI at www.sebi.gov.in/sebiweb/other/OtherAction.do?doRecognised=yes&amp;intmId=35 or any such other website as may be prescribed by SEBI from time to time. Registered Brokers Bidders can submit ASBA Forms in the Offer using the stockbroker network of the stock exchange, i.e., through the Registered Brokers at the Broker Centres. The list of the Registered Brokers eligible to accept ASBA Forms, including details such as postal address, telephone number and e-mail address, is provided on the websites of the Stock Exchanges at www.bseindia.com and www.nseindia.com, as updated from time to time. Registrar and Share Transfer Agents The list of the RTAs eligible to accept ASBA Forms at the Designated RTA Locations, including details such as address, telephone number and e-mail address, is provided on the websites of the Stock Exchanges at www.bseindia.com/Static/Markets/PublicIssues/RtaDp.aspx? and www.nseindia.com/products/content/equities/ipos/asba_procedures.htm, respectively, as updated from time to time. Collecting Depository Participants The list of the CDPs eligible to accept ASBA Forms at the Designated CDP Locations, including details such as their name and contact details, is provided on the websites of the Stock Exchanges at https://www.bseindia.com/Static/PublicIssues/RtaDp.aspx and https://www.nseindia.com/products/content/equities/ipos/asba_procedures.htm, respectively, as updated from time to time. Experts Except as stated below, our Company has not obtained any expert opinions: Our Company has received the written consent dated November 27, 2025 from our Statutory Auditors, Kirtane &amp; Pandit, LLP, Chartered Accountants, to include their name as required under section 26 (5) of the Companies Act, 2013 read with SEBI ICDR Regulations, in this Red Herring Prospectus and as an “expert” as defined under section 2(38) of the Companies Act, 2013, to the extent and in their capacity as our Statutory Auditors, and in respect of their (i) examination report dated October 18, 2025 on the Restated Financial Statements; and (ii) the statement of special tax benefits available to the Company and its shareholders under the direct and indirect tax laws in India dated November 27, 2025, included in this Red Herring Prospectus and (iii) any other certificates as may be required for the purposes of the Offer, and such consent has not been withdrawn as on the date of this Red Herring Prospectus. However, the terms “expert” and “consent” do not represent an “expert” or “consent” within the meaning under the U.S. Securities Act. Our Company has received written consent dated November 27, 2025 from [PERSON_014], to include their name as required under section 26 of the Companies Act, 2013 read with SEBI ICDR Regulations, in this Red Herring Prospectus, and as an “expert” as defined under section 2(38) of the Companies Act, 2013 to the extent and in their capacity as an independent chartered engineer in respect of information certified by them, as included in this Red Herring Prospectus; and such consent has not been withdrawn as on the date of this Red Herring Prospectus. Our Company has received written consent dated December 10, 2025 from Kanj &amp; [COMPANY_083], independent practicing company secretary, to include their name as required under Section 26 of the Companies Act, 2013 in this Red Herring Prospectus and as an ‘expert’ as defined under Section 2(38) of Companies Act, 2013 in respect of the certificate issued in their capacity as a practicing company secretary to our Company, and such consent has not been withdrawn as on the date of this Red Herring Prospectus.</w:t>
+        <w:t>In relation to Bids (other than Bids by Anchor Investors and RIIs) submitted to a member of the Syndicate, the list of branches of the SCSBs at the Specified Locations named by the respective SCSBs to receive deposits of Bid cum Application Forms from the members of the Syndicate is available on the website of the SEBI at www.sebi.gov.in/sebiweb/other/OtherAction.do?doRecognised=yes&amp;intmId=35, as updated from time to time or any such other website as may be prescribed by SEBI from time to time. For more information on such branches collecting Bid cum Application Forms from the Syndicate at Specified Locations, see the website of the SEBI at www.sebi.gov.in/sebiweb/other/OtherAction.do?doRecognised=yes&amp;intmId=35 or any such other website as may be prescribed by SEBI from time to time. Registered Brokers Bidders can submit ASBA Forms in the Offer using the stockbroker network of the stock exchange, i.e., through the Registered Brokers at the Broker Centres. The list of the Registered Brokers eligible to accept ASBA Forms, including details such as postal address, telephone number and e-mail address, is provided on the websites of the Stock Exchanges at www.bseindia.com and www.nseindia.com, as updated from time to time. Registrar and Share Transfer Agents The list of the RTAs eligible to accept ASBA Forms at the Designated RTA Locations, including details such as address, telephone number and e-mail address, is provided on the websites of the Stock Exchanges at www.bseindia.com/Static/Markets/PublicIssues/RtaDp.aspx? and www.nseindia.com/products/content/equities/ipos/asba_procedures.htm, respectively, as updated from time to time. Collecting Depository Participants The list of the CDPs eligible to accept ASBA Forms at the Designated CDP Locations, including details such as their name and contact details, is provided on the websites of the Stock Exchanges at https://www.bseindia.com/Static/PublicIssues/RtaDp.aspx and https://www.nseindia.com/products/content/equities/ipos/asba_procedures.htm, respectively, as updated from time to time. Experts Except as stated below, our Company has not obtained any expert opinions: Our Company has received the written consent dated November 27, 2025 from our Statutory Auditors, Kirtane &amp; Pandit, LLP, Chartered Accountants, to include their name as required under section 26 (5) of the Companies Act, 2013 read with SEBI ICDR Regulations, in this Red Herring Prospectus and as an “expert” as defined under section 2(38) of the Companies Act, 2013, to the extent and in their capacity as our Statutory Auditors, and in respect of their (i) examination report dated October 18, 2025 on the Restated Financial Statements; and (ii) the statement of special tax benefits available to the Company and its shareholders under the direct and indirect tax laws in India dated November 27, 2025, included in this Red Herring Prospectus and (iii) any other certificates as may be required for the purposes of the Offer, and such consent has not been withdrawn as on the date of this Red Herring Prospectus. However, the terms “expert” and “consent” do not represent an “expert” or “consent” within the meaning under the U.S. Securities Act. Our Company has received written consent dated November 27, 2025 from [PERSON_018], to include their name as required under section 26 of the Companies Act, 2013 read with SEBI ICDR Regulations, in this Red Herring Prospectus, and as an “expert” as defined under section 2(38) of the Companies Act, 2013 to the extent and in their capacity as an independent chartered engineer in respect of information certified by them, as included in this Red Herring Prospectus; and such consent has not been withdrawn as on the date of this Red Herring Prospectus. Our Company has received written consent dated December 10, 2025 from Kanj &amp; [COMPANY_083], independent practicing company secretary, to include their name as required under Section 26 of the Companies Act, 2013 in this Red Herring Prospectus and as an ‘expert’ as defined under Section 2(38) of Companies Act, 2013 in respect of the certificate issued in their capacity as a practicing company secretary to our Company, and such consent has not been withdrawn as on the date of this Red Herring Prospectus.</w:t>
       </w:r>
     </w:p>
     <w:p>
@@ -2114,7 +2114,7 @@
     </w:p>
     <w:p>
       <w:r>
-        <w:t>x Shaniwar Peth, Pune – 411 030 Maharashtra, India E-mail : [EMAIL_018] Firm registration number : 116417W Peer review number : N.A. Bankers to our Company [COMPANY_085] 8 th [ADDRESS_032] Maharashtra, India Telephone : [PHONE_015] Contact Person : [PERSON_041] Website : http://commercialbanking.citibank.com Email : [EMAIL_019] [COMPANY_086] No. 401, 401(A), 401(B) &amp; 402, 402(A), 402(B), 4 th [ADDRESS_033] Maharashtra, India Telephone : [PHONE_016] Contact Person : [PERSON_042] Website : www.eximbankindia.in/ Email : [EMAIL_020] [COMPANY_087] 2401 Gen Thimmayya [ADDRESS_034] Maharashtra, India Telephone : [PHONE_017] Contact Person : [PERSON_043] Website : www.indusind.com/ Email : [EMAIL_021]</w:t>
+        <w:t>x Shaniwar Peth, Pune – 411 030 Maharashtra, India E-mail : [EMAIL_018] Firm registration number : 116417W Peer review number : N.A. Bankers to our Company [COMPANY_085] 8 th [ADDRESS_032] Maharashtra, India Telephone : [PHONE_015] Contact Person : [PERSON_048] Website : http://commercialbanking.citibank.com Email : [EMAIL_019] [COMPANY_086] No. 401, 401(A), 401(B) &amp; 402, 402(A), 402(B), 4 th [ADDRESS_033] Maharashtra, India Telephone : [PHONE_016] Contact Person : [PERSON_049] Website : www.eximbankindia.in/ Email : [EMAIL_020] [COMPANY_087] 2401 Gen Thimmayya [ADDRESS_034] Maharashtra, India Telephone : [PHONE_017] Contact Person : [PERSON_050] Website : www.indusind.com/ Email : [EMAIL_021]</w:t>
       </w:r>
     </w:p>
     <w:p>
@@ -2132,7 +2132,7 @@
     </w:p>
     <w:p>
       <w:r>
-        <w:t>[COMPANY_046] ICICI Bank, CBG, 3 rd [ADDRESS_035] Maharashtra, India Telephone : [PHONE_018] Contact Person : [PERSON_044] Website : www.icicibank.com Email : [EMAIL_022]</w:t>
+        <w:t>[COMPANY_046] ICICI Bank, CBG, 3 rd [ADDRESS_035] Maharashtra, India Telephone : [PHONE_018] Contact Person : [PERSON_051] Website : www.icicibank.com Email : [EMAIL_022]</w:t>
       </w:r>
     </w:p>
     <w:p>
@@ -2150,7 +2150,7 @@
     </w:p>
     <w:p>
       <w:r>
-        <w:t>[COMPANY_042] 5 th [ADDRESS_036] Maharashtra, India Telephone : [PHONE_019] Contact Person : [PERSON_045] Website : www.hdfcbank.com Email : [EMAIL_023] State Bank of India, Industrial Finance Branch Tara [ADDRESS_037] Maharashtra, India Telephone : [PHONE_020] Contact Person : [PERSON_046] Website : www.sbi.co.in Email : [EMAIL_024] [COMPANY_088] Ground Floor, Kubera Chambers Opp. Sancheti Hospital Shivajinagar, Pune – 41l 005 Maharashtra, India Telephone : [PHONE_021] Contact Person : [PERSON_047] Website : www.federalbank.co.in Email : [EMAIL_025] [COMPANY_089] The Capital Unit no. 1601, B- wing BKC, Mumbai Maharashtra India Telephone : [PHONE_022] Contact Person : [PERSON_048] Website : www.bajajfinance.com Email : [EMAIL_026] Grading of the Offer No credit rating agency registered with SEBI has been appointed for obtaining grading for the Offer. Appraising Entity No appraising entity has been appointed in relation to the Offer. Monitoring Agency As the size of the Fresh Issue exceeds ₹ 1,000.00 million, our Company has appointed a credit rating agency registered with SEBI, namely, [COMPANY_044], as a monitoring agency to monitor the utilisation of the Net Proceeds, in accordance with Regulation 41 of the SEBI ICDR Regulations. For details in relation to the proposed utilisation of the Net Proceeds, see “ Objects of the Offer ” on page 106. Credit Rating As the Offer is of Equity Shares, credit rating is not required. Debenture Trustee As the Offer is of Equity Shares, the appointment of trustee is not required. Green Shoe Option No green shoe option is contemplated under the Offer. Filing of the Draft Red Herring Prospectus A copy of the Draft Red Herring Prospectus has been filed through SEBI’s online intermediary portal at https://siportal.sebi.gov.in, as specified in Regulation 25(8) of the SEBI ICDR Regulations and in accordance with SEBI ICDR Master Circular. It has also been filed at: Securities and Exchange Board of [COMPANY_090] Finance Department Division of Issues and Listing SEBI Bhavan, [ADDRESS_038], Maharashtra, India Filing of this Red Herring Prospectus and Prospectus</w:t>
+        <w:t>[COMPANY_042] 5 th [ADDRESS_036] Maharashtra, India Telephone : [PHONE_019] Contact Person : [PERSON_052] Website : www.hdfcbank.com Email : [EMAIL_023] State Bank of India, Industrial Finance Branch Tara [ADDRESS_037] Maharashtra, India Telephone : [PHONE_020] Contact Person : [PERSON_053] Website : www.sbi.co.in Email : [EMAIL_024] [COMPANY_088] Ground Floor, Kubera Chambers Opp. Sancheti Hospital Shivajinagar, Pune – 41l 005 Maharashtra, India Telephone : [PHONE_021] Contact Person : [PERSON_054] Website : www.federalbank.co.in Email : [EMAIL_025] [COMPANY_089] The Capital Unit no. 1601, B- wing BKC, Mumbai Maharashtra India Telephone : [PHONE_022] Contact Person : [PERSON_055] Website : www.bajajfinance.com Email : [EMAIL_026] Grading of the Offer No credit rating agency registered with SEBI has been appointed for obtaining grading for the Offer. Appraising Entity No appraising entity has been appointed in relation to the Offer. Monitoring Agency As the size of the Fresh Issue exceeds ₹ 1,000.00 million, our Company has appointed a credit rating agency registered with SEBI, namely, [COMPANY_044], as a monitoring agency to monitor the utilisation of the Net Proceeds, in accordance with Regulation 41 of the SEBI ICDR Regulations. For details in relation to the proposed utilisation of the Net Proceeds, see “ Objects of the Offer ” on page 106. Credit Rating As the Offer is of Equity Shares, credit rating is not required. Debenture Trustee As the Offer is of Equity Shares, the appointment of trustee is not required. Green Shoe Option No green shoe option is contemplated under the Offer. Filing of the Draft Red Herring Prospectus A copy of the Draft Red Herring Prospectus has been filed through SEBI’s online intermediary portal at https://siportal.sebi.gov.in, as specified in Regulation 25(8) of the SEBI ICDR Regulations and in accordance with SEBI ICDR Master Circular. It has also been filed at: Securities and Exchange Board of [COMPANY_090] Finance Department Division of Issues and Listing SEBI Bhavan, [ADDRESS_038], Maharashtra, India Filing of this Red Herring Prospectus and Prospectus</w:t>
       </w:r>
     </w:p>
     <w:p>

</xml_diff>